<commit_message>
Regelwerksmanual: document Backward-Tracking logic in detail
New Kap. 7 "Backward-Tracking im Detail" explains the step-by-step check
process (OHLC-preferred vs. daily-close fallback, chronological day-by-day
scan, the stop-loss-wins-on-same-day-tie rule and why, the 90-day expiry
window), the five new outcome fields per signal, where to see results (the
new Signal-Historie button), and the current state (0 real KAUFEN/NACHKAUFEN
signals yet, so no outcomes resolved in practice). Subsequent sections
renumbered (8-10), cross-references updated, Word version regenerated.

Co-Authored-By: Claude Sonnet 5 <noreply@anthropic.com>
</commit_message>
<xml_diff>
--- a/Basisinfos/Regelwerksmanual.docx
+++ b/Basisinfos/Regelwerksmanual.docx
@@ -2631,7 +2631,7 @@
       <w:tr>
         <w:tc>
           <w:tcPr>
-            <w:tcW w:type="dxa" w:w="2436"/>
+            <w:tcW w:type="dxa" w:w="2268"/>
           </w:tcPr>
           <w:p>
             <w:r>
@@ -2641,7 +2641,7 @@
         </w:tc>
         <w:tc>
           <w:tcPr>
-            <w:tcW w:type="dxa" w:w="2436"/>
+            <w:tcW w:type="dxa" w:w="2268"/>
           </w:tcPr>
           <w:p>
             <w:r>
@@ -2651,7 +2651,7 @@
         </w:tc>
         <w:tc>
           <w:tcPr>
-            <w:tcW w:type="dxa" w:w="2436"/>
+            <w:tcW w:type="dxa" w:w="3402"/>
           </w:tcPr>
           <w:p>
             <w:r>
@@ -2661,7 +2661,7 @@
         </w:tc>
         <w:tc>
           <w:tcPr>
-            <w:tcW w:type="dxa" w:w="2436"/>
+            <w:tcW w:type="dxa" w:w="1304"/>
           </w:tcPr>
           <w:p>
             <w:r>
@@ -2735,7 +2735,7 @@
         <w:t>Backward-Tracking (2026-07-10, ERGÄNZT — Selbstverifikations-Vision Schritt 2).</w:t>
       </w:r>
       <w:r>
-        <w:t xml:space="preserve"> Jeden Morgen um 6 Uhr prüft die App automatisch, ob vergangene KAUFEN/NACHKAUFEN-Signale ihre Take-Profit- oder Stop-Loss-Zone erreicht haben — anhand bereits vorhandener Kursdaten, kein zusätzlicher Netzwerk-Aufruf. Das Ergebnis siehst du über den neuen Button „Signal-Historie“ im Signale-Tab. Das ist die Datengrundlage für Schritt 3 der Vision (KI-gestützte Regel-Anpassungsvorschläge) — ohne gespeicherte Ist-Ergebnisse kann später nichts verglichen werden.</w:t>
+        <w:t xml:space="preserve"> Jeden Morgen um 6 Uhr prüft die App automatisch, ob vergangene KAUFEN/NACHKAUFEN-Signale ihre Take-Profit- oder Stop-Loss-Zone erreicht haben — anhand bereits vorhandener Kursdaten, kein zusätzlicher Netzwerk-Aufruf. Das Ergebnis siehst du über den neuen Button „Signal-Historie“ im Signale-Tab. Das ist die Datengrundlage für Schritt 3 der Vision (KI-gestützte Regel-Anpassungsvorschläge) — ohne gespeicherte Ist-Ergebnisse kann später nichts verglichen werden. Details siehe Abschnitt 7.</w:t>
       </w:r>
     </w:p>
     <w:p>
@@ -2877,6 +2877,38 @@
           </w:tcPr>
           <w:p>
             <w:r>
+              <w:t>„Signal-Historie“</w:t>
+            </w:r>
+          </w:p>
+        </w:tc>
+        <w:tc>
+          <w:tcPr>
+            <w:tcW w:type="dxa" w:w="1701"/>
+          </w:tcPr>
+          <w:p>
+            <w:r>
+              <w:t>Signale-Tab</w:t>
+            </w:r>
+          </w:p>
+        </w:tc>
+        <w:tc>
+          <w:tcPr>
+            <w:tcW w:type="dxa" w:w="4989"/>
+          </w:tcPr>
+          <w:p>
+            <w:r>
+              <w:t>Zeigt alle bisherigen Signale des ausgewählten Assets inkl. Backward-Tracking-Ergebnis (Take-Profit/Stop-Loss/Offen/Abgelaufen) — reine Anzeige, kein externer Aufruf.</w:t>
+            </w:r>
+          </w:p>
+        </w:tc>
+      </w:tr>
+      <w:tr>
+        <w:tc>
+          <w:tcPr>
+            <w:tcW w:type="dxa" w:w="2551"/>
+          </w:tcPr>
+          <w:p>
+            <w:r>
               <w:t>„Jetzt scannen“</w:t>
             </w:r>
           </w:p>
@@ -2998,38 +3030,6 @@
           </w:p>
         </w:tc>
       </w:tr>
-      <w:tr>
-        <w:tc>
-          <w:tcPr>
-            <w:tcW w:type="dxa" w:w="3249"/>
-          </w:tcPr>
-          <w:p>
-            <w:r>
-              <w:t>„Signal-Historie“</w:t>
-            </w:r>
-          </w:p>
-        </w:tc>
-        <w:tc>
-          <w:tcPr>
-            <w:tcW w:type="dxa" w:w="3249"/>
-          </w:tcPr>
-          <w:p>
-            <w:r>
-              <w:t>Signale-Tab</w:t>
-            </w:r>
-          </w:p>
-        </w:tc>
-        <w:tc>
-          <w:tcPr>
-            <w:tcW w:type="dxa" w:w="3249"/>
-          </w:tcPr>
-          <w:p>
-            <w:r>
-              <w:t>Zeigt alle bisherigen Signale des ausgewählten Assets inkl. Backward-Tracking-Ergebnis (Take-Profit/Stop-Loss/Offen/Abgelaufen) — reine Anzeige, kein externer Aufruf.</w:t>
-            </w:r>
-          </w:p>
-        </w:tc>
-      </w:tr>
     </w:tbl>
     <w:p>
       <w:pPr>
@@ -3081,7 +3081,503 @@
         <w:pStyle w:val="Heading1"/>
       </w:pPr>
       <w:r>
-        <w:t>7. Strategie-Katalog (S-1 bis S-6)</w:t>
+        <w:t>7. Backward-Tracking im Detail — wie Signal-Ergebnisse geprüft werden</w:t>
+      </w:r>
+    </w:p>
+    <w:p>
+      <w:pPr>
+        <w:spacing w:after="160"/>
+      </w:pPr>
+      <w:r>
+        <w:rPr>
+          <w:b/>
+        </w:rPr>
+        <w:t>Zweck:</w:t>
+      </w:r>
+      <w:r>
+        <w:t xml:space="preserve"> Schritt 2 der Selbstverifikations-Vision (Schritt 1 war dieses Manual selbst). Der Agent soll über Zeit lernen können, ob seine eigenen KAUFEN/NACHKAUFEN-Empfehlungen tatsächlich zutrafen — ohne diese Ist-Ergebnisse kann später (Schritt 3) keine KI-gestützte Regel-Anpassung sinnvoll vorgeschlagen werden. Rein beobachtend: der tägliche Job liest nur bereits vorhandene Kursdaten und trägt ein Ergebnis nach — er ändert nie eine Empfehlung, ein Veto oder eine Position (P-7 Advisory-only).</w:t>
+      </w:r>
+    </w:p>
+    <w:p>
+      <w:pPr>
+        <w:spacing w:after="160"/>
+      </w:pPr>
+      <w:r>
+        <w:rPr>
+          <w:b/>
+        </w:rPr>
+        <w:t>Was wird geprüft:</w:t>
+      </w:r>
+      <w:r>
+        <w:t xml:space="preserve"> Ausschließlich </w:t>
+      </w:r>
+      <w:r>
+        <w:rPr>
+          <w:b/>
+        </w:rPr>
+        <w:t>KAUFEN</w:t>
+      </w:r>
+      <w:r>
+        <w:t xml:space="preserve">- und </w:t>
+      </w:r>
+      <w:r>
+        <w:rPr>
+          <w:b/>
+        </w:rPr>
+        <w:t>NACHKAUFEN</w:t>
+      </w:r>
+      <w:r>
+        <w:t>-Signale mit gültiger Entry-/Stop-Loss-/Take-Profit-Zone. HALTEN, VERKAUFEN und TAUSCHEN haben keine vergleichbare Take-Profit/Stop-Loss-Logik und werden sofort als „Nicht anwendbar“ markiert, ohne dass jemals Kursdaten dafür geprüft werden.</w:t>
+      </w:r>
+    </w:p>
+    <w:p>
+      <w:pPr>
+        <w:spacing w:after="160"/>
+      </w:pPr>
+      <w:r>
+        <w:rPr>
+          <w:b/>
+        </w:rPr>
+        <w:t>Ablauf, Schritt für Schritt</w:t>
+      </w:r>
+      <w:r>
+        <w:t xml:space="preserve"> (</w:t>
+      </w:r>
+      <w:r>
+        <w:rPr>
+          <w:rFonts w:ascii="Consolas" w:hAnsi="Consolas"/>
+          <w:sz w:val="20"/>
+        </w:rPr>
+        <w:t>agent/krypto/backward_tracking.py</w:t>
+      </w:r>
+      <w:r>
+        <w:t>):</w:t>
+      </w:r>
+    </w:p>
+    <w:p>
+      <w:pPr>
+        <w:pStyle w:val="ListNumber"/>
+        <w:spacing w:after="80"/>
+      </w:pPr>
+      <w:r>
+        <w:t xml:space="preserve">Jeden Morgen um 6 Uhr (Scheduler-Job </w:t>
+      </w:r>
+      <w:r>
+        <w:rPr>
+          <w:rFonts w:ascii="Consolas" w:hAnsi="Consolas"/>
+          <w:sz w:val="20"/>
+        </w:rPr>
+        <w:t>backward_tracking</w:t>
+      </w:r>
+      <w:r>
+        <w:t xml:space="preserve">, siehe Abschnitt 6) werden alle Signale gesucht, deren Ergebnis noch </w:t>
+      </w:r>
+      <w:r>
+        <w:rPr>
+          <w:b/>
+        </w:rPr>
+        <w:t>offen</w:t>
+      </w:r>
+      <w:r>
+        <w:t xml:space="preserve"> ist (also weder Take-Profit noch Stop-Loss noch „abgelaufen“ noch „nicht anwendbar“).</w:t>
+      </w:r>
+    </w:p>
+    <w:p>
+      <w:pPr>
+        <w:pStyle w:val="ListNumber"/>
+        <w:spacing w:after="80"/>
+      </w:pPr>
+      <w:r>
+        <w:t xml:space="preserve">Für jedes Signal wird die Kurshistorie </w:t>
+      </w:r>
+      <w:r>
+        <w:rPr>
+          <w:b/>
+        </w:rPr>
+        <w:t>ab dem Erstellungsdatum</w:t>
+      </w:r>
+      <w:r>
+        <w:t xml:space="preserve"> des Signals geholt — bevorzugt aus </w:t>
+      </w:r>
+      <w:r>
+        <w:rPr>
+          <w:rFonts w:ascii="Consolas" w:hAnsi="Consolas"/>
+          <w:sz w:val="20"/>
+        </w:rPr>
+        <w:t>price_history_ohlc</w:t>
+      </w:r>
+      <w:r>
+        <w:t xml:space="preserve"> (echtes Tages-High/Low, nur für Krypto-Assets mit Kraken-Listing verfügbar), sonst als Rückfallebene aus </w:t>
+      </w:r>
+      <w:r>
+        <w:rPr>
+          <w:rFonts w:ascii="Consolas" w:hAnsi="Consolas"/>
+          <w:sz w:val="20"/>
+        </w:rPr>
+        <w:t>price_history</w:t>
+      </w:r>
+      <w:r>
+        <w:t xml:space="preserve"> (nur der tägliche Schlusskurs). Welche Quelle verwendet wurde, wird transparent im Feld </w:t>
+      </w:r>
+      <w:r>
+        <w:rPr>
+          <w:b/>
+        </w:rPr>
+        <w:t>Datenquelle</w:t>
+      </w:r>
+      <w:r>
+        <w:t xml:space="preserve"> festgehalten (</w:t>
+      </w:r>
+      <w:r>
+        <w:rPr>
+          <w:rFonts w:ascii="Consolas" w:hAnsi="Consolas"/>
+          <w:sz w:val="20"/>
+        </w:rPr>
+        <w:t>real</w:t>
+      </w:r>
+      <w:r>
+        <w:t xml:space="preserve"> vs. </w:t>
+      </w:r>
+      <w:r>
+        <w:rPr>
+          <w:rFonts w:ascii="Consolas" w:hAnsi="Consolas"/>
+          <w:sz w:val="20"/>
+        </w:rPr>
+        <w:t>proxy</w:t>
+      </w:r>
+      <w:r>
+        <w:t>) — ein Ergebnis auf Basis von echtem Intraday-High/Low ist verlässlicher als eines, das nur auf dem Tagesschlusskurs beruht.</w:t>
+      </w:r>
+    </w:p>
+    <w:p>
+      <w:pPr>
+        <w:pStyle w:val="ListNumber"/>
+        <w:spacing w:after="80"/>
+      </w:pPr>
+      <w:r>
+        <w:t xml:space="preserve">Die Tage werden </w:t>
+      </w:r>
+      <w:r>
+        <w:rPr>
+          <w:b/>
+        </w:rPr>
+        <w:t>chronologisch, ältester zuerst</w:t>
+      </w:r>
+      <w:r>
+        <w:t>, durchgegangen. Für jeden Tag wird geprüft: Hat der Tages-Höchstwert (bzw. bei „proxy“ der Schlusskurs) die Take-Profit-Zone erreicht? Hat der Tages-Tiefstwert (bzw. Schlusskurs) die Stop-Loss-Zone erreicht?</w:t>
+      </w:r>
+    </w:p>
+    <w:p>
+      <w:pPr>
+        <w:pStyle w:val="ListNumber"/>
+        <w:spacing w:after="80"/>
+      </w:pPr>
+      <w:r>
+        <w:rPr>
+          <w:b/>
+        </w:rPr>
+        <w:t>Konservative Regel bei Gleichzeitigkeit:</w:t>
+      </w:r>
+      <w:r>
+        <w:t xml:space="preserve"> Trifft ein einzelner Tag sowohl die Stop-Loss- als auch die Take-Profit-Zone (nur bei echten OHLC-Daten überhaupt feststellbar), gewinnt </w:t>
+      </w:r>
+      <w:r>
+        <w:rPr>
+          <w:b/>
+        </w:rPr>
+        <w:t>immer Stop-Loss</w:t>
+      </w:r>
+      <w:r>
+        <w:t xml:space="preserve"> — dieselbe Logik wie Z-1 (Kapitalerhalt vor Gewinn) und dieselbe Vorsicht wie bei der CRV-Berechnung (Abschnitt 2): ohne Kenntnis der tatsächlichen Innertages-Reihenfolge wird nie zugunsten des optimistischeren Ausgangs angenommen.</w:t>
+      </w:r>
+    </w:p>
+    <w:p>
+      <w:pPr>
+        <w:pStyle w:val="ListNumber"/>
+        <w:spacing w:after="80"/>
+      </w:pPr>
+      <w:r>
+        <w:t xml:space="preserve">Wird an keinem Tag eine Zone erreicht, bleibt das Signal </w:t>
+      </w:r>
+      <w:r>
+        <w:rPr>
+          <w:b/>
+        </w:rPr>
+        <w:t>offen</w:t>
+      </w:r>
+      <w:r>
+        <w:t xml:space="preserve"> — außer es ist bereits älter als </w:t>
+      </w:r>
+      <w:r>
+        <w:rPr>
+          <w:rFonts w:ascii="Consolas" w:hAnsi="Consolas"/>
+          <w:sz w:val="20"/>
+        </w:rPr>
+        <w:t>backward_tracking.abgelaufen_nach_tagen</w:t>
+      </w:r>
+      <w:r>
+        <w:t xml:space="preserve"> (</w:t>
+      </w:r>
+      <w:r>
+        <w:rPr>
+          <w:rFonts w:ascii="Consolas" w:hAnsi="Consolas"/>
+          <w:sz w:val="20"/>
+        </w:rPr>
+        <w:t>config.yaml</w:t>
+      </w:r>
+      <w:r>
+        <w:t xml:space="preserve">, aktuell </w:t>
+      </w:r>
+      <w:r>
+        <w:rPr>
+          <w:b/>
+        </w:rPr>
+        <w:t>90 Tage</w:t>
+      </w:r>
+      <w:r>
+        <w:t xml:space="preserve">, vorläufiger Wert) — dann wird es als </w:t>
+      </w:r>
+      <w:r>
+        <w:rPr>
+          <w:b/>
+        </w:rPr>
+        <w:t>„Abgelaufen (unentschieden)“</w:t>
+      </w:r>
+      <w:r>
+        <w:t xml:space="preserve"> markiert und nicht weiter täglich neu geprüft.</w:t>
+      </w:r>
+    </w:p>
+    <w:p>
+      <w:pPr>
+        <w:spacing w:after="80"/>
+      </w:pPr>
+      <w:r>
+        <w:rPr>
+          <w:b/>
+        </w:rPr>
+        <w:t>Die fünf neuen Ergebnis-Felder je Signal:</w:t>
+      </w:r>
+    </w:p>
+    <w:tbl>
+      <w:tblPr>
+        <w:tblStyle w:val="TableGrid"/>
+        <w:tblW w:type="auto" w:w="0"/>
+        <w:jc w:val="center"/>
+        <w:tblLayout w:type="autofit"/>
+        <w:tblLook w:firstColumn="1" w:firstRow="1" w:lastColumn="0" w:lastRow="0" w:noHBand="0" w:noVBand="1" w:val="04A0"/>
+      </w:tblPr>
+      <w:tblGrid>
+        <w:gridCol w:w="4873"/>
+        <w:gridCol w:w="4873"/>
+      </w:tblGrid>
+      <w:tr>
+        <w:tc>
+          <w:tcPr>
+            <w:tcW w:type="dxa" w:w="1984"/>
+            <w:shd w:val="clear" w:color="auto" w:fill="1F3A5F"/>
+          </w:tcPr>
+          <w:p>
+            <w:r>
+              <w:rPr>
+                <w:b/>
+                <w:color w:val="FFFFFF"/>
+              </w:rPr>
+              <w:t>Feld</w:t>
+            </w:r>
+          </w:p>
+        </w:tc>
+        <w:tc>
+          <w:tcPr>
+            <w:tcW w:type="dxa" w:w="7257"/>
+            <w:shd w:val="clear" w:color="auto" w:fill="1F3A5F"/>
+          </w:tcPr>
+          <w:p>
+            <w:r>
+              <w:rPr>
+                <w:b/>
+                <w:color w:val="FFFFFF"/>
+              </w:rPr>
+              <w:t>Bedeutung</w:t>
+            </w:r>
+          </w:p>
+        </w:tc>
+      </w:tr>
+      <w:tr>
+        <w:tc>
+          <w:tcPr>
+            <w:tcW w:type="dxa" w:w="1984"/>
+          </w:tcPr>
+          <w:p>
+            <w:r>
+              <w:t>Ergebnis-Status</w:t>
+            </w:r>
+          </w:p>
+        </w:tc>
+        <w:tc>
+          <w:tcPr>
+            <w:tcW w:type="dxa" w:w="7257"/>
+          </w:tcPr>
+          <w:p>
+            <w:r>
+              <w:t>Einer von: Offen · Take-Profit erreicht · Stop-Loss erreicht · Abgelaufen (unentschieden) · Nicht anwendbar</w:t>
+            </w:r>
+          </w:p>
+        </w:tc>
+      </w:tr>
+      <w:tr>
+        <w:tc>
+          <w:tcPr>
+            <w:tcW w:type="dxa" w:w="1984"/>
+          </w:tcPr>
+          <w:p>
+            <w:r>
+              <w:t>Zuletzt geprüft am</w:t>
+            </w:r>
+          </w:p>
+        </w:tc>
+        <w:tc>
+          <w:tcPr>
+            <w:tcW w:type="dxa" w:w="7257"/>
+          </w:tcPr>
+          <w:p>
+            <w:r>
+              <w:t>Zeitstempel des letzten Prüflaufs</w:t>
+            </w:r>
+          </w:p>
+        </w:tc>
+      </w:tr>
+      <w:tr>
+        <w:tc>
+          <w:tcPr>
+            <w:tcW w:type="dxa" w:w="1984"/>
+          </w:tcPr>
+          <w:p>
+            <w:r>
+              <w:t>Entschieden am</w:t>
+            </w:r>
+          </w:p>
+        </w:tc>
+        <w:tc>
+          <w:tcPr>
+            <w:tcW w:type="dxa" w:w="7257"/>
+          </w:tcPr>
+          <w:p>
+            <w:r>
+              <w:t>Datum, an dem die Zone erreicht wurde (leer, solange offen)</w:t>
+            </w:r>
+          </w:p>
+        </w:tc>
+      </w:tr>
+      <w:tr>
+        <w:tc>
+          <w:tcPr>
+            <w:tcW w:type="dxa" w:w="1984"/>
+          </w:tcPr>
+          <w:p>
+            <w:r>
+              <w:t>Realisiertes CRV</w:t>
+            </w:r>
+          </w:p>
+        </w:tc>
+        <w:tc>
+          <w:tcPr>
+            <w:tcW w:type="dxa" w:w="7257"/>
+          </w:tcPr>
+          <w:p>
+            <w:r>
+              <w:t>Nur bei entschiedenem Ergebnis: (erzielter Kurs − Entry-Mitte) / (Entry-Mitte − Stop-Loss-Zone-Untergrenze) — dieselbe konservative Formel wie die ursprünglich vorhergesagte CRV (Abschnitt 2, Z-2), nur mit dem tatsächlich erreichten Kurs statt der Zonen-Grenze. Positiv bei Take-Profit, negativ bei Stop-Loss.</w:t>
+            </w:r>
+          </w:p>
+        </w:tc>
+      </w:tr>
+      <w:tr>
+        <w:tc>
+          <w:tcPr>
+            <w:tcW w:type="dxa" w:w="1984"/>
+          </w:tcPr>
+          <w:p>
+            <w:r>
+              <w:t>Datenquelle</w:t>
+            </w:r>
+          </w:p>
+        </w:tc>
+        <w:tc>
+          <w:tcPr>
+            <w:tcW w:type="dxa" w:w="7257"/>
+          </w:tcPr>
+          <w:p>
+            <w:r>
+              <w:t>real (echtes OHLC) oder proxy (nur Tagesschlusskurs)</w:t>
+            </w:r>
+          </w:p>
+        </w:tc>
+      </w:tr>
+    </w:tbl>
+    <w:p>
+      <w:pPr>
+        <w:spacing w:after="80"/>
+      </w:pPr>
+    </w:p>
+    <w:p>
+      <w:pPr>
+        <w:spacing w:after="160"/>
+      </w:pPr>
+      <w:r>
+        <w:rPr>
+          <w:b/>
+        </w:rPr>
+        <w:t>Wo du das siehst:</w:t>
+      </w:r>
+      <w:r>
+        <w:t xml:space="preserve"> neuer Button </w:t>
+      </w:r>
+      <w:r>
+        <w:rPr>
+          <w:b/>
+        </w:rPr>
+        <w:t>„Signal-Historie“</w:t>
+      </w:r>
+      <w:r>
+        <w:t xml:space="preserve"> im Signale-Tab, direkt neben „Signal berechnen“ — zeigt alle bisherigen Signale des ausgewählten Assets mit Datum, Aktion, Konfidenz und Ergebnis-Status, farblich markiert (grün = Take-Profit, rot = Stop-Loss, neutral = offen, grau = abgelaufen). Macht eine bereits vorhandene, aber bis dahin nie genutzte Datenbank-Abfrage erstmals sichtbar.</w:t>
+      </w:r>
+    </w:p>
+    <w:p>
+      <w:pPr>
+        <w:spacing w:after="160"/>
+      </w:pPr>
+      <w:r>
+        <w:rPr>
+          <w:b/>
+        </w:rPr>
+        <w:t>Aktueller Stand (2026-07-10):</w:t>
+      </w:r>
+      <w:r>
+        <w:t xml:space="preserve"> Bisher gibt es </w:t>
+      </w:r>
+      <w:r>
+        <w:rPr>
+          <w:b/>
+        </w:rPr>
+        <w:t>kein einziges echtes KAUFEN/NACHKAUFEN-Signal</w:t>
+      </w:r>
+      <w:r>
+        <w:t xml:space="preserve"> in der Datenbank — alle bisherigen Signale sind HALTEN. Backward-Tracking ist also einsatzbereit, aber noch ohne echte Auswertungsgrundlage. Schritt 3 der Vision (KI-gestützte Regel-Anpassungsvorschläge) braucht erst eine gewisse Anzahl echter, aufgelöster Kauf-Signale, bevor er sinnvoll ansetzen kann.</w:t>
+      </w:r>
+    </w:p>
+    <w:p>
+      <w:pPr>
+        <w:pBdr>
+          <w:bottom w:val="single" w:sz="6" w:space="1" w:color="BFBFBF"/>
+        </w:pBdr>
+        <w:spacing w:before="40" w:after="200"/>
+      </w:pPr>
+    </w:p>
+    <w:p>
+      <w:pPr>
+        <w:pStyle w:val="Heading1"/>
+      </w:pPr>
+      <w:r>
+        <w:t>8. Strategie-Katalog (S-1 bis S-6)</w:t>
       </w:r>
     </w:p>
     <w:p>
@@ -3451,7 +3947,7 @@
         <w:pStyle w:val="Heading1"/>
       </w:pPr>
       <w:r>
-        <w:t>8. Wo diese Regeln im Code stehen (für Nachvollziehbarkeit)</w:t>
+        <w:t>9. Wo diese Regeln im Code stehen (für Nachvollziehbarkeit)</w:t>
       </w:r>
     </w:p>
     <w:p>
@@ -3635,6 +4131,7 @@
     <w:p>
       <w:pPr>
         <w:pStyle w:val="ListBullet"/>
+        <w:spacing w:after="80"/>
       </w:pPr>
       <w:r>
         <w:rPr>
@@ -3644,7 +4141,7 @@
         <w:t>agent/krypto/backward_tracking.py</w:t>
       </w:r>
       <w:r>
-        <w:t xml:space="preserve"> — Signal-Ergebnis-Prüfung (Abschnitt 6, Selbstverifikations-Vision Schritt 2)</w:t>
+        <w:t xml:space="preserve"> — Signal-Ergebnis-Prüfung (Abschnitt 7, Selbstverifikations-Vision Schritt 2)</w:t>
       </w:r>
     </w:p>
     <w:p>
@@ -3660,7 +4157,7 @@
         <w:pStyle w:val="Heading1"/>
       </w:pPr>
       <w:r>
-        <w:t>9. Offene / vorläufige Werte — die naheliegendsten Kandidaten für spätere Anpassung</w:t>
+        <w:t>10. Offene / vorläufige Werte — die naheliegendsten Kandidaten für spätere Anpassung</w:t>
       </w:r>
     </w:p>
     <w:p>

</xml_diff>

<commit_message>
Local AI architecture seam (P-8): provider-agnostic client, deferred model install
Corrects a false "erfuellt" claim in Spezifikation.md Kap. 2 (P-8) from
2026-07-07 that was aspirational only - no local ML library was ever in
requirements.txt. Adds config.yaml agent.ai_provider switch (groq/lokal)
and api/local_model.py::LocalModelClient matching GroqClient's .chat()
interface exactly, so the existing signal pipeline needs no changes to
swap providers. Documents the model/runtime decision (llama-cpp-python +
Phi-4-mini GGUF + GBNF grammar, chosen over ONNX Runtime GenAI for its
stronger structural JSON guarantee against the strict signal schema).
Actual model installation is deliberately deferred until after a
hardware upgrade of the 8GB-RAM 24/7 notebook.

Co-Authored-By: Claude Sonnet 5 <noreply@anthropic.com>
</commit_message>
<xml_diff>
--- a/Basisinfos/Regelwerksmanual.docx
+++ b/Basisinfos/Regelwerksmanual.docx
@@ -3577,7 +3577,269 @@
         <w:pStyle w:val="Heading1"/>
       </w:pPr>
       <w:r>
-        <w:t>8. Strategie-Katalog (S-1 bis S-6)</w:t>
+        <w:t>8. Lokale KI-Ebene (P-8) — Architektur vorbereitet, noch nicht aktiv</w:t>
+      </w:r>
+    </w:p>
+    <w:p>
+      <w:pPr>
+        <w:spacing w:after="160"/>
+      </w:pPr>
+      <w:r>
+        <w:rPr>
+          <w:b/>
+        </w:rPr>
+        <w:t>Hintergrund:</w:t>
+      </w:r>
+      <w:r>
+        <w:t xml:space="preserve"> P-8 verlangt seit Projektbeginn, dass der Agent perspektivisch auch </w:t>
+      </w:r>
+      <w:r>
+        <w:rPr>
+          <w:b/>
+        </w:rPr>
+        <w:t>ohne</w:t>
+      </w:r>
+      <w:r>
+        <w:t xml:space="preserve"> externen KI-Zugang funktionieren können soll. Groq ist bereits vollständig optional (kein </w:t>
+      </w:r>
+      <w:r>
+        <w:rPr>
+          <w:rFonts w:ascii="Consolas" w:hAnsi="Consolas"/>
+          <w:sz w:val="20"/>
+        </w:rPr>
+        <w:t>GROQ_API_KEY</w:t>
+      </w:r>
+      <w:r>
+        <w:t xml:space="preserve"> → Signale-Tab bleibt nutzbar, nur die Berechnung ist deaktiviert) — aber es gab bisher </w:t>
+      </w:r>
+      <w:r>
+        <w:rPr>
+          <w:b/>
+        </w:rPr>
+        <w:t>keine echte lokale Alternative</w:t>
+      </w:r>
+      <w:r>
+        <w:t>, nur eine nie umgesetzte Absichtserklärung. Das ist jetzt richtiggestellt: entweder etwas ist gebaut, oder es steht offen als geplant da.</w:t>
+      </w:r>
+    </w:p>
+    <w:p>
+      <w:pPr>
+        <w:spacing w:after="40"/>
+      </w:pPr>
+      <w:r>
+        <w:rPr>
+          <w:b/>
+        </w:rPr>
+        <w:t>Was heute (2026-07-10) tatsächlich gemacht wurde — ein Architektur-Seam, kein lauffähiges lokales Modell:</w:t>
+      </w:r>
+    </w:p>
+    <w:p>
+      <w:pPr>
+        <w:pStyle w:val="ListBullet"/>
+        <w:spacing w:after="80"/>
+      </w:pPr>
+      <w:r>
+        <w:t xml:space="preserve">Neuer Konfig-Schalter </w:t>
+      </w:r>
+      <w:r>
+        <w:rPr>
+          <w:rFonts w:ascii="Consolas" w:hAnsi="Consolas"/>
+          <w:sz w:val="20"/>
+        </w:rPr>
+        <w:t>config.yaml agent.ai_provider</w:t>
+      </w:r>
+      <w:r>
+        <w:t xml:space="preserve"> (</w:t>
+      </w:r>
+      <w:r>
+        <w:rPr>
+          <w:rFonts w:ascii="Consolas" w:hAnsi="Consolas"/>
+          <w:sz w:val="20"/>
+        </w:rPr>
+        <w:t>groq</w:t>
+      </w:r>
+      <w:r>
+        <w:t xml:space="preserve"> oder </w:t>
+      </w:r>
+      <w:r>
+        <w:rPr>
+          <w:rFonts w:ascii="Consolas" w:hAnsi="Consolas"/>
+          <w:sz w:val="20"/>
+        </w:rPr>
+        <w:t>lokal</w:t>
+      </w:r>
+      <w:r>
+        <w:t>).</w:t>
+      </w:r>
+    </w:p>
+    <w:p>
+      <w:pPr>
+        <w:pStyle w:val="ListBullet"/>
+        <w:spacing w:after="80"/>
+      </w:pPr>
+      <w:r>
+        <w:t xml:space="preserve">Neue Datei </w:t>
+      </w:r>
+      <w:r>
+        <w:rPr>
+          <w:rFonts w:ascii="Consolas" w:hAnsi="Consolas"/>
+          <w:sz w:val="20"/>
+        </w:rPr>
+        <w:t>api/local_model.py</w:t>
+      </w:r>
+      <w:r>
+        <w:t xml:space="preserve"> mit </w:t>
+      </w:r>
+      <w:r>
+        <w:rPr>
+          <w:rFonts w:ascii="Consolas" w:hAnsi="Consolas"/>
+          <w:sz w:val="20"/>
+        </w:rPr>
+        <w:t>LocalModelClient</w:t>
+      </w:r>
+      <w:r>
+        <w:t xml:space="preserve"> — hat exakt dieselbe Schnittstelle wie der bestehende </w:t>
+      </w:r>
+      <w:r>
+        <w:rPr>
+          <w:rFonts w:ascii="Consolas" w:hAnsi="Consolas"/>
+          <w:sz w:val="20"/>
+        </w:rPr>
+        <w:t>GroqClient</w:t>
+      </w:r>
+      <w:r>
+        <w:t xml:space="preserve"> (</w:t>
+      </w:r>
+      <w:r>
+        <w:rPr>
+          <w:rFonts w:ascii="Consolas" w:hAnsi="Consolas"/>
+          <w:sz w:val="20"/>
+        </w:rPr>
+        <w:t>.chat(messages, model, temperature, response_format)</w:t>
+      </w:r>
+      <w:r>
+        <w:t>). Die eigentliche Signal-Pipeline (</w:t>
+      </w:r>
+      <w:r>
+        <w:rPr>
+          <w:rFonts w:ascii="Consolas" w:hAnsi="Consolas"/>
+          <w:sz w:val="20"/>
+        </w:rPr>
+        <w:t>agent/krypto/analyst.py::call_groq_for_signal()</w:t>
+      </w:r>
+      <w:r>
+        <w:t>) ruft ohnehin nur diese Methode auf — sie war also bereits vorher „egal welches Modell“, nur nie so dokumentiert. Ein künftiges echtes lokales Modell ersetzt später nur diese eine Klasse, der Rest der Pipeline ändert sich nicht.</w:t>
+      </w:r>
+    </w:p>
+    <w:p>
+      <w:pPr>
+        <w:pStyle w:val="ListBullet"/>
+        <w:spacing w:after="80"/>
+      </w:pPr>
+      <w:r>
+        <w:t xml:space="preserve">Aktuell wirft </w:t>
+      </w:r>
+      <w:r>
+        <w:rPr>
+          <w:rFonts w:ascii="Consolas" w:hAnsi="Consolas"/>
+          <w:sz w:val="20"/>
+        </w:rPr>
+        <w:t>LocalModelClient.chat()</w:t>
+      </w:r>
+      <w:r>
+        <w:t xml:space="preserve"> bewusst einen klaren Fehler (</w:t>
+      </w:r>
+      <w:r>
+        <w:rPr>
+          <w:rFonts w:ascii="Consolas" w:hAnsi="Consolas"/>
+          <w:sz w:val="20"/>
+        </w:rPr>
+        <w:t>NotImplementedError</w:t>
+      </w:r>
+      <w:r>
+        <w:t xml:space="preserve">), falls </w:t>
+      </w:r>
+      <w:r>
+        <w:rPr>
+          <w:rFonts w:ascii="Consolas" w:hAnsi="Consolas"/>
+          <w:sz w:val="20"/>
+        </w:rPr>
+        <w:t>ai_provider: lokal</w:t>
+      </w:r>
+      <w:r>
+        <w:t xml:space="preserve"> gesetzt wird — kein stilles Scheitern.</w:t>
+      </w:r>
+    </w:p>
+    <w:p>
+      <w:pPr>
+        <w:spacing w:after="160"/>
+      </w:pPr>
+      <w:r>
+        <w:rPr>
+          <w:b/>
+        </w:rPr>
+        <w:t>Modell-/Runtime-Entscheidung getroffen, aber bewusst nicht installiert:</w:t>
+      </w:r>
+      <w:r>
+        <w:t xml:space="preserve"> </w:t>
+      </w:r>
+      <w:r>
+        <w:rPr>
+          <w:b/>
+        </w:rPr>
+        <w:t>llama.cpp (über `llama-cpp-python`) + ein Phi-4-mini-Modell im GGUF-Format + GBNF-Grammar-Constraint</w:t>
+      </w:r>
+      <w:r>
+        <w:t xml:space="preserve"> — nicht Microsofts eigener „ONNX Runtime GenAI“-Pfad. Grund: unser Signal-Schema ist sehr streng (genau 5 rangierte Gründe, feste Kategorien, Kurszonen mit </w:t>
+      </w:r>
+      <w:r>
+        <w:rPr>
+          <w:rFonts w:ascii="Consolas" w:hAnsi="Consolas"/>
+          <w:sz w:val="20"/>
+        </w:rPr>
+        <w:t>von &lt;= bis</w:t>
+      </w:r>
+      <w:r>
+        <w:t>, bedingte Pflichtfelder im Halte-Kriterium) — selbst Groq (ein 70-Milliarden-Parameter-Modell) braucht dafür gelegentlich einen zweiten Versuch. Ein kleines lokales Modell (3-4 Milliarden Parameter) bräuchte vermutlich noch öfter einen Retry, wenn es sich nur auf trainiertes Verhalten verlässt. GBNF-Grammar-Constraint erzwingt gültiges JSON bereits beim Erzeugen jedes einzelnen Wortes — eine strukturelle Garantie, kein bloß antrainiertes Verhalten.</w:t>
+      </w:r>
+    </w:p>
+    <w:p>
+      <w:pPr>
+        <w:spacing w:after="160"/>
+      </w:pPr>
+      <w:r>
+        <w:rPr>
+          <w:b/>
+        </w:rPr>
+        <w:t>Warum die eigentliche Installation bewusst zurückgestellt bleibt:</w:t>
+      </w:r>
+      <w:r>
+        <w:t xml:space="preserve"> ein int4-quantisiertes Modell dieser Größe bräuchte schätzungsweise 2,5-3,5 GB RAM allein für die Modell-Gewichte. Auf der aktuellen 24/7-Notebook-Hardware (8 GB RAM) würde das den bisher komfortablen Speicherpuffer spürbar einengen — und ein Zuverlässigkeitstest auf beengter Hardware würde ohnehin ein zu pessimistisches Bild liefern. </w:t>
+      </w:r>
+      <w:r>
+        <w:rPr>
+          <w:b/>
+        </w:rPr>
+        <w:t>Empfehlung:</w:t>
+      </w:r>
+      <w:r>
+        <w:t xml:space="preserve"> diesen Schritt erst nach einem Hardware-Upgrade tatsächlich umsetzen, dann mit realistischen Testbedingungen.</w:t>
+      </w:r>
+    </w:p>
+    <w:p>
+      <w:pPr>
+        <w:pBdr>
+          <w:bottom w:val="single" w:sz="6" w:space="1" w:color="BFBFBF"/>
+        </w:pBdr>
+        <w:spacing w:before="40" w:after="200"/>
+      </w:pPr>
+    </w:p>
+    <w:p>
+      <w:pPr>
+        <w:pStyle w:val="Heading1"/>
+      </w:pPr>
+      <w:r>
+        <w:t>9. Strategie-Katalog (S-1 bis S-6)</w:t>
       </w:r>
     </w:p>
     <w:p>
@@ -3947,7 +4209,7 @@
         <w:pStyle w:val="Heading1"/>
       </w:pPr>
       <w:r>
-        <w:t>9. Wo diese Regeln im Code stehen (für Nachvollziehbarkeit)</w:t>
+        <w:t>10. Wo diese Regeln im Code stehen (für Nachvollziehbarkeit)</w:t>
       </w:r>
     </w:p>
     <w:p>
@@ -4146,6 +4408,22 @@
     </w:p>
     <w:p>
       <w:pPr>
+        <w:pStyle w:val="ListBullet"/>
+        <w:spacing w:after="80"/>
+      </w:pPr>
+      <w:r>
+        <w:rPr>
+          <w:rFonts w:ascii="Consolas" w:hAnsi="Consolas"/>
+          <w:sz w:val="20"/>
+        </w:rPr>
+        <w:t>api/local_model.py</w:t>
+      </w:r>
+      <w:r>
+        <w:t xml:space="preserve"> — lokale KI-Ebene, Architektur-Seam (Abschnitt 8, noch nicht aktiv)</w:t>
+      </w:r>
+    </w:p>
+    <w:p>
+      <w:pPr>
         <w:pBdr>
           <w:bottom w:val="single" w:sz="6" w:space="1" w:color="BFBFBF"/>
         </w:pBdr>
@@ -4157,7 +4435,7 @@
         <w:pStyle w:val="Heading1"/>
       </w:pPr>
       <w:r>
-        <w:t>10. Offene / vorläufige Werte — die naheliegendsten Kandidaten für spätere Anpassung</w:t>
+        <w:t>11. Offene / vorläufige Werte — die naheliegendsten Kandidaten für spätere Anpassung</w:t>
       </w:r>
     </w:p>
     <w:p>

</xml_diff>

<commit_message>
Remote control page, portfolio completeness fixes, staking in risk gate
- Remote-Steuer-Seite: embedded Flask server (remote/), token+VPN auth,
  refresh-prices/marktscan actions with shared locks + not-reset, found
  and fixed a missing timeout in api/yfinance_client.py
- Portfolio value gap (~37% vs. Bitpanda's own total) investigated and
  closed: PLTR/VST EUR conversion via EURCV peg, staked crypto quantities
  reconstructed from Bitpanda transaction tags and shown in the UI
- agent/krypto/risk_gate.py now counts staked holdings into RM-1/RM-2/RM-4
  (staked stablecoins count as cash automatically), with a conservative
  ETH exception since its un-/restaking hasn't been instant so far
- Betriebssicherheit audit documented (3 unprotected startup steps found,
  not yet fixed) plus Tailscale setup guide
- Regelwerksmanual.md/.docx and Spezifikation.md updated throughout

Co-Authored-By: Claude Sonnet 5 <noreply@anthropic.com>
</commit_message>
<xml_diff>
--- a/Basisinfos/Regelwerksmanual.docx
+++ b/Basisinfos/Regelwerksmanual.docx
@@ -1135,6 +1135,20 @@
     </w:p>
     <w:p>
       <w:pPr>
+        <w:spacing w:after="160"/>
+      </w:pPr>
+      <w:r>
+        <w:rPr>
+          <w:b/>
+        </w:rPr>
+        <w:t>Gestakte Bestände fließen seit 2026-07-11 auch in RM-1/RM-2/RM-4 selbst ein</w:t>
+      </w:r>
+      <w:r>
+        <w:t xml:space="preserve"> (nicht nur in die Anzeige) — mit einer konservativen Ausnahme für ETH, dessen Un-/Restaking bisher nicht instant war. Volle Details in Kap. 14.</w:t>
+      </w:r>
+    </w:p>
+    <w:p>
+      <w:pPr>
         <w:pBdr>
           <w:bottom w:val="single" w:sz="6" w:space="1" w:color="BFBFBF"/>
         </w:pBdr>
@@ -2993,7 +3007,7 @@
           </w:tcPr>
           <w:p>
             <w:r>
-              <w:t>Echter Anschaffungspreis je Asset aus der Bitpanda-Trade-Historie (Abschnitt 9) — eigener, unabhängiger Menüpunkt, nie automatisch, läuft threaded im Hintergrund</w:t>
+              <w:t>Echter Anschaffungspreis je Asset UND aktuell gestakte Mengen aus der Bitpanda-Trade-Historie (Abschnitt 9/14) — eigener, unabhängiger Menüpunkt, nie automatisch, läuft threaded im Hintergrund</w:t>
             </w:r>
           </w:p>
         </w:tc>
@@ -4564,7 +4578,7 @@
         <w:t>agent/krypto/risk_gate.py</w:t>
       </w:r>
       <w:r>
-        <w:t xml:space="preserve"> — harte Durchsetzung von RM-1/2/4/5, Z-2 (CRV), Positionsgrößen-Clamp, Bitpanda-Veto</w:t>
+        <w:t xml:space="preserve"> — harte Durchsetzung von RM-1/2/4/5, Z-2 (CRV), Positionsgrößen-Clamp, Bitpanda-Veto, Staking-Einbindung (ETH-Ausnahme)</w:t>
       </w:r>
     </w:p>
     <w:p>
@@ -4733,6 +4747,64 @@
     </w:p>
     <w:p>
       <w:pPr>
+        <w:pStyle w:val="ListBullet"/>
+        <w:spacing w:after="80"/>
+      </w:pPr>
+      <w:r>
+        <w:rPr>
+          <w:rFonts w:ascii="Consolas" w:hAnsi="Consolas"/>
+          <w:sz w:val="20"/>
+        </w:rPr>
+        <w:t>remote/server.py</w:t>
+      </w:r>
+      <w:r>
+        <w:t xml:space="preserve">, </w:t>
+      </w:r>
+      <w:r>
+        <w:rPr>
+          <w:rFonts w:ascii="Consolas" w:hAnsi="Consolas"/>
+          <w:sz w:val="20"/>
+        </w:rPr>
+        <w:t>remote/status.py</w:t>
+      </w:r>
+      <w:r>
+        <w:t xml:space="preserve"> — Remote-Steuer-Seite (Abschnitt 13)</w:t>
+      </w:r>
+    </w:p>
+    <w:p>
+      <w:pPr>
+        <w:pStyle w:val="ListBullet"/>
+        <w:spacing w:after="80"/>
+      </w:pPr>
+      <w:r>
+        <w:rPr>
+          <w:rFonts w:ascii="Consolas" w:hAnsi="Consolas"/>
+          <w:sz w:val="20"/>
+        </w:rPr>
+        <w:t>importer/bitpanda_avg_cost.py::compute_staked_quantities()</w:t>
+      </w:r>
+      <w:r>
+        <w:t xml:space="preserve"> — aktuell gestakte Mengen (Abschnitt 14)</w:t>
+      </w:r>
+    </w:p>
+    <w:p>
+      <w:pPr>
+        <w:pStyle w:val="ListBullet"/>
+        <w:spacing w:after="80"/>
+      </w:pPr>
+      <w:r>
+        <w:rPr>
+          <w:rFonts w:ascii="Consolas" w:hAnsi="Consolas"/>
+          <w:sz w:val="20"/>
+        </w:rPr>
+        <w:t>api/yfinance_client.py</w:t>
+      </w:r>
+      <w:r>
+        <w:t xml:space="preserve"> — EUR-Umrechnung für USD-only-Aktien wie PLTR/VST (Abschnitt 14)</w:t>
+      </w:r>
+    </w:p>
+    <w:p>
+      <w:pPr>
         <w:pBdr>
           <w:bottom w:val="single" w:sz="6" w:space="1" w:color="BFBFBF"/>
         </w:pBdr>
@@ -4744,7 +4816,1474 @@
         <w:pStyle w:val="Heading1"/>
       </w:pPr>
       <w:r>
-        <w:t>12. Offene / vorläufige Werte — die naheliegendsten Kandidaten für spätere Anpassung</w:t>
+        <w:t>12. Betriebssicherheit — Systemstart, Fehlerbehandlung, wie du informiert wirst</w:t>
+      </w:r>
+    </w:p>
+    <w:p>
+      <w:pPr>
+        <w:spacing w:after="160"/>
+      </w:pPr>
+      <w:r>
+        <w:rPr>
+          <w:b/>
+        </w:rPr>
+        <w:t>Zweck (2026-07-11, Nutzer-Wunsch):</w:t>
+      </w:r>
+      <w:r>
+        <w:t xml:space="preserve"> vollständige, ehrliche Bestandsaufnahme — was passiert beim Start automatisch, was brauchst du manuell, wie stabil sind Scheduler und Agent wirklich, und auf welchem Weg erfährst du von einem Problem. Wichtig für den geplanten 24/7-Betrieb am Notebook, wo du nicht ständig danebensitzt.</w:t>
+      </w:r>
+    </w:p>
+    <w:p>
+      <w:pPr>
+        <w:pStyle w:val="Heading2"/>
+      </w:pPr>
+      <w:r>
+        <w:t>Was beim Start passiert</w:t>
+      </w:r>
+    </w:p>
+    <w:tbl>
+      <w:tblPr>
+        <w:tblStyle w:val="TableGrid"/>
+        <w:tblW w:type="auto" w:w="0"/>
+        <w:jc w:val="center"/>
+        <w:tblLayout w:type="autofit"/>
+        <w:tblLook w:firstColumn="1" w:firstRow="1" w:lastColumn="0" w:lastRow="0" w:noHBand="0" w:noVBand="1" w:val="04A0"/>
+      </w:tblPr>
+      <w:tblGrid>
+        <w:gridCol w:w="3249"/>
+        <w:gridCol w:w="3249"/>
+        <w:gridCol w:w="3249"/>
+      </w:tblGrid>
+      <w:tr>
+        <w:tc>
+          <w:tcPr>
+            <w:tcW w:type="dxa" w:w="3402"/>
+            <w:shd w:val="clear" w:color="auto" w:fill="1F3A5F"/>
+          </w:tcPr>
+          <w:p>
+            <w:r>
+              <w:rPr>
+                <w:b/>
+                <w:color w:val="FFFFFF"/>
+              </w:rPr>
+              <w:t>Schritt</w:t>
+            </w:r>
+          </w:p>
+        </w:tc>
+        <w:tc>
+          <w:tcPr>
+            <w:tcW w:type="dxa" w:w="2268"/>
+            <w:shd w:val="clear" w:color="auto" w:fill="1F3A5F"/>
+          </w:tcPr>
+          <w:p>
+            <w:r>
+              <w:rPr>
+                <w:b/>
+                <w:color w:val="FFFFFF"/>
+              </w:rPr>
+              <w:t>Wann</w:t>
+            </w:r>
+          </w:p>
+        </w:tc>
+        <w:tc>
+          <w:tcPr>
+            <w:tcW w:type="dxa" w:w="3572"/>
+            <w:shd w:val="clear" w:color="auto" w:fill="1F3A5F"/>
+          </w:tcPr>
+          <w:p>
+            <w:r>
+              <w:rPr>
+                <w:b/>
+                <w:color w:val="FFFFFF"/>
+              </w:rPr>
+              <w:t>Bei einem Fehler</w:t>
+            </w:r>
+          </w:p>
+        </w:tc>
+      </w:tr>
+      <w:tr>
+        <w:tc>
+          <w:tcPr>
+            <w:tcW w:type="dxa" w:w="3402"/>
+          </w:tcPr>
+          <w:p>
+            <w:r>
+              <w:t>Logging-Setup (Konsole + Logdatei)</w:t>
+            </w:r>
+          </w:p>
+        </w:tc>
+        <w:tc>
+          <w:tcPr>
+            <w:tcW w:type="dxa" w:w="2268"/>
+          </w:tcPr>
+          <w:p>
+            <w:r>
+              <w:t>immer</w:t>
+            </w:r>
+          </w:p>
+        </w:tc>
+        <w:tc>
+          <w:tcPr>
+            <w:tcW w:type="dxa" w:w="3572"/>
+          </w:tcPr>
+          <w:p>
+            <w:r>
+              <w:t>—</w:t>
+            </w:r>
+          </w:p>
+        </w:tc>
+      </w:tr>
+      <w:tr>
+        <w:tc>
+          <w:tcPr>
+            <w:tcW w:type="dxa" w:w="3402"/>
+          </w:tcPr>
+          <w:p>
+            <w:r>
+              <w:t>.env/config.yaml laden</w:t>
+            </w:r>
+          </w:p>
+        </w:tc>
+        <w:tc>
+          <w:tcPr>
+            <w:tcW w:type="dxa" w:w="2268"/>
+          </w:tcPr>
+          <w:p>
+            <w:r>
+              <w:t>immer</w:t>
+            </w:r>
+          </w:p>
+        </w:tc>
+        <w:tc>
+          <w:tcPr>
+            <w:tcW w:type="dxa" w:w="3572"/>
+          </w:tcPr>
+          <w:p>
+            <w:r>
+              <w:rPr>
+                <w:b/>
+              </w:rPr>
+              <w:t>Kein Try/Except</w:t>
+            </w:r>
+            <w:r>
+              <w:t xml:space="preserve"> — kaputte/fehlende config.yaml bringt die App </w:t>
+            </w:r>
+            <w:r>
+              <w:rPr>
+                <w:b/>
+              </w:rPr>
+              <w:t>vor der UI zum Absturz</w:t>
+            </w:r>
+          </w:p>
+        </w:tc>
+      </w:tr>
+      <w:tr>
+        <w:tc>
+          <w:tcPr>
+            <w:tcW w:type="dxa" w:w="3402"/>
+          </w:tcPr>
+          <w:p>
+            <w:r>
+              <w:t>Datenbank initialisieren (db.init_db)</w:t>
+            </w:r>
+          </w:p>
+        </w:tc>
+        <w:tc>
+          <w:tcPr>
+            <w:tcW w:type="dxa" w:w="2268"/>
+          </w:tcPr>
+          <w:p>
+            <w:r>
+              <w:t>immer</w:t>
+            </w:r>
+          </w:p>
+        </w:tc>
+        <w:tc>
+          <w:tcPr>
+            <w:tcW w:type="dxa" w:w="3572"/>
+          </w:tcPr>
+          <w:p>
+            <w:r>
+              <w:rPr>
+                <w:b/>
+              </w:rPr>
+              <w:t>Kein Try/Except</w:t>
+            </w:r>
+            <w:r>
+              <w:t xml:space="preserve"> — ein DB-Problem bringt die App ebenfalls vor der UI zum Absturz</w:t>
+            </w:r>
+          </w:p>
+        </w:tc>
+      </w:tr>
+      <w:tr>
+        <w:tc>
+          <w:tcPr>
+            <w:tcW w:type="dxa" w:w="3402"/>
+          </w:tcPr>
+          <w:p>
+            <w:r>
+              <w:t>Bestände aus Assets.xlsx importieren</w:t>
+            </w:r>
+          </w:p>
+        </w:tc>
+        <w:tc>
+          <w:tcPr>
+            <w:tcW w:type="dxa" w:w="2268"/>
+          </w:tcPr>
+          <w:p>
+            <w:r>
+              <w:rPr>
+                <w:b/>
+              </w:rPr>
+              <w:t>nur beim allerersten Start</w:t>
+            </w:r>
+          </w:p>
+        </w:tc>
+        <w:tc>
+          <w:tcPr>
+            <w:tcW w:type="dxa" w:w="3572"/>
+          </w:tcPr>
+          <w:p>
+            <w:r>
+              <w:rPr>
+                <w:b/>
+              </w:rPr>
+              <w:t>Kein Try/Except</w:t>
+            </w:r>
+            <w:r>
+              <w:t xml:space="preserve"> — fehlt die Datei oder eine Pflichtspalte, stürzt die App vor der UI ab</w:t>
+            </w:r>
+          </w:p>
+        </w:tc>
+      </w:tr>
+      <w:tr>
+        <w:tc>
+          <w:tcPr>
+            <w:tcW w:type="dxa" w:w="3402"/>
+          </w:tcPr>
+          <w:p>
+            <w:r>
+              <w:t>Kurs-/OHLC-Historie erstbefüllen (CoinGecko/Kraken)</w:t>
+            </w:r>
+          </w:p>
+        </w:tc>
+        <w:tc>
+          <w:tcPr>
+            <w:tcW w:type="dxa" w:w="2268"/>
+          </w:tcPr>
+          <w:p>
+            <w:r>
+              <w:rPr>
+                <w:b/>
+              </w:rPr>
+              <w:t>nur beim allerersten Start</w:t>
+            </w:r>
+          </w:p>
+        </w:tc>
+        <w:tc>
+          <w:tcPr>
+            <w:tcW w:type="dxa" w:w="3572"/>
+          </w:tcPr>
+          <w:p>
+            <w:r>
+              <w:t>Robust — jeder Asset-Abruf einzeln abgesichert, degradiert statt abzustürzen</w:t>
+            </w:r>
+          </w:p>
+        </w:tc>
+      </w:tr>
+      <w:tr>
+        <w:tc>
+          <w:tcPr>
+            <w:tcW w:type="dxa" w:w="3402"/>
+          </w:tcPr>
+          <w:p>
+            <w:r>
+              <w:t>Scheduler starten, Fenster öffnen</w:t>
+            </w:r>
+          </w:p>
+        </w:tc>
+        <w:tc>
+          <w:tcPr>
+            <w:tcW w:type="dxa" w:w="2268"/>
+          </w:tcPr>
+          <w:p>
+            <w:r>
+              <w:t>immer</w:t>
+            </w:r>
+          </w:p>
+        </w:tc>
+        <w:tc>
+          <w:tcPr>
+            <w:tcW w:type="dxa" w:w="3572"/>
+          </w:tcPr>
+          <w:p>
+            <w:r>
+              <w:t>—</w:t>
+            </w:r>
+          </w:p>
+        </w:tc>
+      </w:tr>
+    </w:tbl>
+    <w:p>
+      <w:pPr>
+        <w:spacing w:after="80"/>
+      </w:pPr>
+    </w:p>
+    <w:p>
+      <w:pPr>
+        <w:spacing w:after="160"/>
+      </w:pPr>
+      <w:r>
+        <w:rPr>
+          <w:b/>
+        </w:rPr>
+        <w:t>Wichtigste Konsequenz:</w:t>
+      </w:r>
+      <w:r>
+        <w:t xml:space="preserve"> Die drei fett markierten Schritte sind aktuell </w:t>
+      </w:r>
+      <w:r>
+        <w:rPr>
+          <w:b/>
+        </w:rPr>
+        <w:t>ungeschützt</w:t>
+      </w:r>
+      <w:r>
+        <w:t xml:space="preserve">. Läuft die App ohne sichtbares Terminal (z. B. per Verknüpfung am 24/7-Notebook), siehst du bei einem Fehlschlag dort </w:t>
+      </w:r>
+      <w:r>
+        <w:rPr>
+          <w:b/>
+        </w:rPr>
+        <w:t>buchstäblich nichts</w:t>
+      </w:r>
+      <w:r>
+        <w:t xml:space="preserve"> — nicht mal einen Logeintrag, weil der Absturz vor oder während dieser Schritte passiert. Das betrifft nur den </w:t>
+      </w:r>
+      <w:r>
+        <w:rPr>
+          <w:b/>
+        </w:rPr>
+        <w:t>Start selbst</w:t>
+      </w:r>
+      <w:r>
+        <w:t>; ist die App einmal erfolgreich hochgefahren, sind die laufenden Scheduler-Jobs (siehe unten) deutlich robuster.</w:t>
+      </w:r>
+    </w:p>
+    <w:p>
+      <w:pPr>
+        <w:pStyle w:val="Heading2"/>
+      </w:pPr>
+      <w:r>
+        <w:t>Scheduler-Jobs — wie stabil sie wirklich sind</w:t>
+      </w:r>
+    </w:p>
+    <w:p>
+      <w:pPr>
+        <w:spacing w:after="160"/>
+      </w:pPr>
+      <w:r>
+        <w:t xml:space="preserve">Jeder der sechs automatischen Jobs (Abschnitt 6) hat sein </w:t>
+      </w:r>
+      <w:r>
+        <w:rPr>
+          <w:b/>
+        </w:rPr>
+        <w:t>eigenes</w:t>
+      </w:r>
+      <w:r>
+        <w:t xml:space="preserve"> Try/Except (</w:t>
+      </w:r>
+      <w:r>
+        <w:rPr>
+          <w:rFonts w:ascii="Consolas" w:hAnsi="Consolas"/>
+          <w:sz w:val="20"/>
+        </w:rPr>
+        <w:t>logger.exception(...)</w:t>
+      </w:r>
+      <w:r>
+        <w:t xml:space="preserve">, Verbindung wird im </w:t>
+      </w:r>
+      <w:r>
+        <w:rPr>
+          <w:rFonts w:ascii="Consolas" w:hAnsi="Consolas"/>
+          <w:sz w:val="20"/>
+        </w:rPr>
+        <w:t>finally</w:t>
+      </w:r>
+      <w:r>
+        <w:t xml:space="preserve"> geschlossen) — </w:t>
+      </w:r>
+      <w:r>
+        <w:rPr>
+          <w:b/>
+        </w:rPr>
+        <w:t>kein</w:t>
+      </w:r>
+      <w:r>
+        <w:t xml:space="preserve"> Job bleibt bei einem Fehler „hängen“, jeder läuft beim nächsten Takt automatisch wieder an, egal wie oft er vorher fehlgeschlagen ist. Zusätzlich gibt es einen globalen Fehler-Listener (</w:t>
+      </w:r>
+      <w:r>
+        <w:rPr>
+          <w:rFonts w:ascii="Consolas" w:hAnsi="Consolas"/>
+          <w:sz w:val="20"/>
+        </w:rPr>
+        <w:t>EVENT_JOB_ERROR</w:t>
+      </w:r>
+      <w:r>
+        <w:t>/</w:t>
+      </w:r>
+      <w:r>
+        <w:rPr>
+          <w:rFonts w:ascii="Consolas" w:hAnsi="Consolas"/>
+          <w:sz w:val="20"/>
+        </w:rPr>
+        <w:t>EVENT_JOB_MISSED</w:t>
+      </w:r>
+      <w:r>
+        <w:t>) als zweite Verteidigungslinie, falls doch etwas bis zum Scheduler selbst durchschlägt. Seit 2026-07-11 zusätzlich: jeder der drei wichtigsten Jobs (Preise/Wertpapier-Preise/Marktscan) hat eine eigene Sperre gegen doppelte gleichzeitige Läufe, geteilt mit der neuen Remote-Steuer-Seite (Abschnitt 13).</w:t>
+      </w:r>
+    </w:p>
+    <w:p>
+      <w:pPr>
+        <w:pStyle w:val="Heading2"/>
+      </w:pPr>
+      <w:r>
+        <w:t>Wie du aktuell von einem Problem erfährst</w:t>
+      </w:r>
+    </w:p>
+    <w:p>
+      <w:pPr>
+        <w:pStyle w:val="ListBullet"/>
+        <w:spacing w:after="80"/>
+      </w:pPr>
+      <w:r>
+        <w:rPr>
+          <w:b/>
+        </w:rPr>
+        <w:t>Logdatei</w:t>
+      </w:r>
+      <w:r>
+        <w:t xml:space="preserve"> (</w:t>
+      </w:r>
+      <w:r>
+        <w:rPr>
+          <w:rFonts w:ascii="Consolas" w:hAnsi="Consolas"/>
+          <w:sz w:val="20"/>
+        </w:rPr>
+        <w:t>data/tradinginfotool.log</w:t>
+      </w:r>
+      <w:r>
+        <w:t xml:space="preserve">, rotierend, 5 MB × 3) ist der einzige vollständige Weg — aktuell </w:t>
+      </w:r>
+      <w:r>
+        <w:rPr>
+          <w:b/>
+        </w:rPr>
+        <w:t>kein Menüpunkt</w:t>
+      </w:r>
+      <w:r>
+        <w:t>, der sie dir öffnet, du müsstest den Installationsordner kennen. Die letzten Fehlerzeilen sind seit 2026-07-11 zusätzlich auf der Remote-Steuer-Seite sichtbar (Abschnitt 13).</w:t>
+      </w:r>
+    </w:p>
+    <w:p>
+      <w:pPr>
+        <w:pStyle w:val="ListBullet"/>
+        <w:spacing w:after="80"/>
+      </w:pPr>
+      <w:r>
+        <w:rPr>
+          <w:b/>
+        </w:rPr>
+        <w:t>Indirekt, verzögert:</w:t>
+      </w:r>
+      <w:r>
+        <w:t xml:space="preserve"> Watchlist/Portfolio/Charts markieren Zeilen farblich als „veraltet“ (⚠), wenn Preise seit 30 Minuten bzw. Historie seit 2 Tagen nicht aktualisiert wurde — aber nur für genau diese beiden Datenarten, nicht für Marktscan- oder Backward-Tracking-Fehlschläge.</w:t>
+      </w:r>
+    </w:p>
+    <w:p>
+      <w:pPr>
+        <w:pStyle w:val="ListBullet"/>
+        <w:spacing w:after="80"/>
+      </w:pPr>
+      <w:r>
+        <w:rPr>
+          <w:b/>
+        </w:rPr>
+        <w:t>Bei manuellen Aktionen</w:t>
+      </w:r>
+      <w:r>
+        <w:t xml:space="preserve"> (Bitpanda-Sync, Einstandspreise berechnen, Signal berechnen) siehst du Fehler direkt in der Oberfläche (Popup bzw. Status-Zeile). Ausnahme: „Bestände neu importieren“/„aus Datei importieren“ haben </w:t>
+      </w:r>
+      <w:r>
+        <w:rPr>
+          <w:b/>
+        </w:rPr>
+        <w:t>kein</w:t>
+      </w:r>
+      <w:r>
+        <w:t xml:space="preserve"> Try/Except — ein Fehler landet nur auf der Konsole, ohne Popup und ohne Logeintrag.</w:t>
+      </w:r>
+    </w:p>
+    <w:p>
+      <w:pPr>
+        <w:pStyle w:val="ListBullet"/>
+        <w:spacing w:after="80"/>
+      </w:pPr>
+      <w:r>
+        <w:rPr>
+          <w:b/>
+        </w:rPr>
+        <w:t>E-Mail-/Push-Benachrichtigung ist NICHT implementiert.</w:t>
+      </w:r>
+      <w:r>
+        <w:t xml:space="preserve"> </w:t>
+      </w:r>
+      <w:r>
+        <w:rPr>
+          <w:rFonts w:ascii="Consolas" w:hAnsi="Consolas"/>
+          <w:sz w:val="20"/>
+        </w:rPr>
+        <w:t>config.yaml</w:t>
+      </w:r>
+      <w:r>
+        <w:t xml:space="preserve"> hat nur einen leeren Platzhalter (</w:t>
+      </w:r>
+      <w:r>
+        <w:rPr>
+          <w:rFonts w:ascii="Consolas" w:hAnsi="Consolas"/>
+          <w:sz w:val="20"/>
+        </w:rPr>
+        <w:t>smtp_host: ""</w:t>
+      </w:r>
+      <w:r>
+        <w:t>), der von keinem Code gelesen wird — bleibt ein offener Punkt (U-8), bräuchte zuerst eine SMTP-/Mail-API-Entscheidung.</w:t>
+      </w:r>
+    </w:p>
+    <w:p>
+      <w:pPr>
+        <w:pStyle w:val="Heading2"/>
+      </w:pPr>
+      <w:r>
+        <w:t>Agent-Pipeline („Signal berechnen“) im Detail</w:t>
+      </w:r>
+    </w:p>
+    <w:p>
+      <w:pPr>
+        <w:spacing w:after="160"/>
+      </w:pPr>
+      <w:r>
+        <w:t xml:space="preserve">Zwei unterschiedliche Fehlerklassen: </w:t>
+      </w:r>
+      <w:r>
+        <w:rPr>
+          <w:b/>
+        </w:rPr>
+        <w:t>(a) Groq liefert ungültiges/kaputtes JSON</w:t>
+      </w:r>
+      <w:r>
+        <w:t xml:space="preserve"> — sauberer, automatischer Fallback auf HALTEN mit erklärendem Grund, kein Absturz, Signal wird trotzdem gespeichert. </w:t>
+      </w:r>
+      <w:r>
+        <w:rPr>
+          <w:b/>
+        </w:rPr>
+        <w:t>(b) Echter Netzwerkausfall von Groq selbst</w:t>
+      </w:r>
+      <w:r>
+        <w:t xml:space="preserve"> (Server down, Timeout) — </w:t>
+      </w:r>
+      <w:r>
+        <w:rPr>
+          <w:b/>
+        </w:rPr>
+        <w:t>kein</w:t>
+      </w:r>
+      <w:r>
+        <w:t xml:space="preserve"> Fallback, der rohe Fehlertext erscheint in der Status-Zeile, es wird nichts gespeichert. Ausfälle aller anderen Datenquellen innerhalb der Pipeline (CoinGecko/Kraken/FRED/Bitpanda-Listing) sind dagegen durchgehend nach dem P-10-Prinzip abgesichert — ein Ausfall degradiert nur den jeweiligen Fakt auf </w:t>
+      </w:r>
+      <w:r>
+        <w:rPr>
+          <w:rFonts w:ascii="Consolas" w:hAnsi="Consolas"/>
+          <w:sz w:val="20"/>
+        </w:rPr>
+        <w:t>null</w:t>
+      </w:r>
+      <w:r>
+        <w:t>, ohne die Pipeline abzubrechen.</w:t>
+      </w:r>
+    </w:p>
+    <w:p>
+      <w:pPr>
+        <w:pStyle w:val="Heading2"/>
+      </w:pPr>
+      <w:r>
+        <w:t>Empfehlung für den nächsten Schritt</w:t>
+      </w:r>
+    </w:p>
+    <w:p>
+      <w:pPr>
+        <w:spacing w:after="160"/>
+      </w:pPr>
+      <w:r>
+        <w:t xml:space="preserve">Am wertvollsten für den geplanten 24/7-Betrieb wäre, die drei ungeschützten Start-Schritte oben abzusichern (Try/Except + garantierter Logeintrag, im schlimmsten Fall ein sichtbarer Fehlerdialog statt eines stillen Absturzes) — kleiner, klar abgegrenzter Fix mit hohem Nutzen, noch </w:t>
+      </w:r>
+      <w:r>
+        <w:rPr>
+          <w:b/>
+        </w:rPr>
+        <w:t>nicht</w:t>
+      </w:r>
+      <w:r>
+        <w:t xml:space="preserve"> umgesetzt. E-Mail-Benachrichtigung bleibt ebenfalls offen (SMTP-Konto-Entscheidung nötig). Die aggregierte Status-Übersicht selbst ist inzwischen Teil der Remote-Steuer-Seite geworden (Abschnitt 13).</w:t>
+      </w:r>
+    </w:p>
+    <w:p>
+      <w:pPr>
+        <w:pBdr>
+          <w:bottom w:val="single" w:sz="6" w:space="1" w:color="BFBFBF"/>
+        </w:pBdr>
+        <w:spacing w:before="40" w:after="200"/>
+      </w:pPr>
+    </w:p>
+    <w:p>
+      <w:pPr>
+        <w:pStyle w:val="Heading1"/>
+      </w:pPr>
+      <w:r>
+        <w:t>13. Remote-Steuer-Seite — Status + Aktionen von unterwegs über Tailscale</w:t>
+      </w:r>
+    </w:p>
+    <w:p>
+      <w:pPr>
+        <w:spacing w:after="160"/>
+      </w:pPr>
+      <w:r>
+        <w:rPr>
+          <w:b/>
+        </w:rPr>
+        <w:t>Zweck (2026-07-11, direkter Anschluss an Abschnitt 12):</w:t>
+      </w:r>
+      <w:r>
+        <w:t xml:space="preserve"> löst zwei der dort genannten Lücken — kein Weg, unterwegs auf Probleme zu reagieren, und Fehler nur über die schwer auffindbare Logdatei sichtbar. Voraussetzung: Tailscale (privates Mesh-VPN, siehe </w:t>
+      </w:r>
+      <w:r>
+        <w:rPr>
+          <w:rFonts w:ascii="Consolas" w:hAnsi="Consolas"/>
+          <w:sz w:val="20"/>
+        </w:rPr>
+        <w:t>Basisinfos/Tailscale-Setup-Anleitung.md</w:t>
+      </w:r>
+      <w:r>
+        <w:t>) zwischen Notebook und Handy eingerichtet.</w:t>
+      </w:r>
+    </w:p>
+    <w:p>
+      <w:pPr>
+        <w:spacing w:after="160"/>
+      </w:pPr>
+      <w:r>
+        <w:rPr>
+          <w:b/>
+        </w:rPr>
+        <w:t>Was die Seite zeigt/kann:</w:t>
+      </w:r>
+      <w:r>
+        <w:t xml:space="preserve"> Portfolio-Gesamtwert, Anzahl veralteter Preise, letzter Marktscan (Kandidaten/Treffer), die letzten Fehlerzeilen aus dem Log — plus zwei Aktions-Buttons: </w:t>
+      </w:r>
+      <w:r>
+        <w:rPr>
+          <w:b/>
+        </w:rPr>
+        <w:t>„Preise aktualisieren“</w:t>
+      </w:r>
+      <w:r>
+        <w:t xml:space="preserve"> (Krypto + Aktien/ETF/Rohstoffe zusammen) und </w:t>
+      </w:r>
+      <w:r>
+        <w:rPr>
+          <w:b/>
+        </w:rPr>
+        <w:t>„Marktscan jetzt starten“</w:t>
+      </w:r>
+      <w:r>
+        <w:t>. Bewusst nur diese zwei in dieser Version — Backward-Tracking ist selten zeitkritisch, ein Bitpanda-Sync-Button wäre durch den echten authentifizierten API-Call sensibler, beides kann später nach demselben Muster ergänzt werden.</w:t>
+      </w:r>
+    </w:p>
+    <w:p>
+      <w:pPr>
+        <w:spacing w:after="160"/>
+      </w:pPr>
+      <w:r>
+        <w:rPr>
+          <w:b/>
+        </w:rPr>
+        <w:t>Technisch:</w:t>
+      </w:r>
+      <w:r>
+        <w:t xml:space="preserve"> eingebettet in </w:t>
+      </w:r>
+      <w:r>
+        <w:rPr>
+          <w:rFonts w:ascii="Consolas" w:hAnsi="Consolas"/>
+          <w:sz w:val="20"/>
+        </w:rPr>
+        <w:t>main.py</w:t>
+      </w:r>
+      <w:r>
+        <w:t xml:space="preserve"> als Hintergrund-Thread (</w:t>
+      </w:r>
+      <w:r>
+        <w:rPr>
+          <w:rFonts w:ascii="Consolas" w:hAnsi="Consolas"/>
+          <w:sz w:val="20"/>
+        </w:rPr>
+        <w:t>remote/server.py</w:t>
+      </w:r>
+      <w:r>
+        <w:t xml:space="preserve">, Flask) — kein separater Prozess, läuft im selben Prozess wie die Tkinter-App und der Scheduler, nutzt dieselben bereits vorhandenen Verbindungen. Ohne einen gesetzten </w:t>
+      </w:r>
+      <w:r>
+        <w:rPr>
+          <w:rFonts w:ascii="Consolas" w:hAnsi="Consolas"/>
+          <w:sz w:val="20"/>
+        </w:rPr>
+        <w:t>REMOTE_ACCESS_TOKEN</w:t>
+      </w:r>
+      <w:r>
+        <w:t xml:space="preserve"> (</w:t>
+      </w:r>
+      <w:r>
+        <w:rPr>
+          <w:rFonts w:ascii="Consolas" w:hAnsi="Consolas"/>
+          <w:sz w:val="20"/>
+        </w:rPr>
+        <w:t>.env</w:t>
+      </w:r>
+      <w:r>
+        <w:t>) bleibt die Seite komplett deaktiviert, kein lauschender Port (P-8).</w:t>
+      </w:r>
+    </w:p>
+    <w:p>
+      <w:pPr>
+        <w:spacing w:after="160"/>
+      </w:pPr>
+      <w:r>
+        <w:rPr>
+          <w:b/>
+        </w:rPr>
+        <w:t>Absicherung, zwei Schichten:</w:t>
+      </w:r>
+      <w:r>
+        <w:t xml:space="preserve"> (1) nur innerhalb des Tailscale-Netzes erreichbar, (2) zusätzlich ein geheimer Zugriffs-Token wie ein API-Key. Ein Klick auf einen Aktions-Button startet den jeweiligen Job im Hintergrund und antwortet sofort — die Seite fragt danach alle paar Sekunden den Status ab, bis der Job fertig ist (kein langes Warten auf eine einzelne Antwort, wichtig bei wackliger Mobilfunkverbindung).</w:t>
+      </w:r>
+    </w:p>
+    <w:p>
+      <w:pPr>
+        <w:spacing w:after="160"/>
+      </w:pPr>
+      <w:r>
+        <w:rPr>
+          <w:b/>
+        </w:rPr>
+        <w:t>Doppelte Läufe ausgeschlossen:</w:t>
+      </w:r>
+      <w:r>
+        <w:t xml:space="preserve"> jeder Job (Preise/Marktscan) hat eine eigene Sperre, geteilt zwischen dem normalen automatischen Takt (Abschnitt 6) und der Remote-Seite — ein manueller Klick kann einen bereits laufenden Job also nie doppelt anstoßen.</w:t>
+      </w:r>
+    </w:p>
+    <w:p>
+      <w:pPr>
+        <w:spacing w:after="160"/>
+      </w:pPr>
+      <w:r>
+        <w:rPr>
+          <w:b/>
+        </w:rPr>
+        <w:t>Not-Reset bei einem hängenden Job:</w:t>
+      </w:r>
+      <w:r>
+        <w:t xml:space="preserve"> läuft ein Job ungewöhnlich lange (die Seite zeigt „läuft seit X Min“), blendet sie einen „Zurücksetzen“-Button ein. </w:t>
+      </w:r>
+      <w:r>
+        <w:rPr>
+          <w:b/>
+        </w:rPr>
+        <w:t>Wichtig zu wissen:</w:t>
+      </w:r>
+      <w:r>
+        <w:t xml:space="preserve"> das gibt nur die interne Sperre frei, damit ein neuer Versuch möglich ist — es beendet nicht zwingend den ursprünglich hängenden Hintergrund-Vorgang selbst. Bewusst als Not-Funktion gekennzeichnet, nicht für den Alltag gedacht.</w:t>
+      </w:r>
+    </w:p>
+    <w:p>
+      <w:pPr>
+        <w:spacing w:after="160"/>
+      </w:pPr>
+      <w:r>
+        <w:rPr>
+          <w:b/>
+        </w:rPr>
+        <w:t>Dabei gefundener und behobener Fehler:</w:t>
+      </w:r>
+      <w:r>
+        <w:t xml:space="preserve"> </w:t>
+      </w:r>
+      <w:r>
+        <w:rPr>
+          <w:rFonts w:ascii="Consolas" w:hAnsi="Consolas"/>
+          <w:sz w:val="20"/>
+        </w:rPr>
+        <w:t>api/yfinance_client.py</w:t>
+      </w:r>
+      <w:r>
+        <w:t xml:space="preserve"> (Kursquelle für Aktien/ETF/Rohstoffe) hatte als einzige Netzwerk-Quelle im Projekt keinen kontrollierten Timeout — ein hängender Yahoo-Finance-Aufruf hätte die neue Sperre dauerhaft blockiert. Jetzt mit einem harten 15-Sekunden-Timeout versehen, unabhängig von der Steuer-Seite ein eigenständiger Zuverlässigkeits-Gewinn.</w:t>
+      </w:r>
+    </w:p>
+    <w:p>
+      <w:pPr>
+        <w:spacing w:after="160"/>
+      </w:pPr>
+      <w:r>
+        <w:rPr>
+          <w:b/>
+        </w:rPr>
+        <w:t>Erreichbar unter:</w:t>
+      </w:r>
+      <w:r>
+        <w:t xml:space="preserve"> </w:t>
+      </w:r>
+      <w:r>
+        <w:rPr>
+          <w:rFonts w:ascii="Consolas" w:hAnsi="Consolas"/>
+          <w:sz w:val="20"/>
+        </w:rPr>
+        <w:t>http://notebook.&lt;dein-tailnet&gt;.ts.net:8765/?token=DEIN_TOKEN</w:t>
+      </w:r>
+      <w:r>
+        <w:t xml:space="preserve"> (Details/Ersteinrichtung siehe </w:t>
+      </w:r>
+      <w:r>
+        <w:rPr>
+          <w:rFonts w:ascii="Consolas" w:hAnsi="Consolas"/>
+          <w:sz w:val="20"/>
+        </w:rPr>
+        <w:t>Basisinfos/Tailscale-Setup-Anleitung.md</w:t>
+      </w:r>
+      <w:r>
+        <w:t>).</w:t>
+      </w:r>
+    </w:p>
+    <w:p>
+      <w:pPr>
+        <w:pBdr>
+          <w:bottom w:val="single" w:sz="6" w:space="1" w:color="BFBFBF"/>
+        </w:pBdr>
+        <w:spacing w:before="40" w:after="200"/>
+      </w:pPr>
+    </w:p>
+    <w:p>
+      <w:pPr>
+        <w:pStyle w:val="Heading1"/>
+      </w:pPr>
+      <w:r>
+        <w:t>14. Portfolio-Vollständigkeit — Cash-Sperren, Staking, Margin-Trading</w:t>
+      </w:r>
+    </w:p>
+    <w:p>
+      <w:pPr>
+        <w:spacing w:after="160"/>
+      </w:pPr>
+      <w:r>
+        <w:rPr>
+          <w:b/>
+        </w:rPr>
+        <w:t>Zweck (2026-07-11, Nutzer-Fund):</w:t>
+      </w:r>
+      <w:r>
+        <w:t xml:space="preserve"> eine Nachfrage zur Cash-Reserve-Anzeige deckte auf, dass der von der App gesehene Portfoliowert deutlich kleiner war als der tatsächliche (Bitpanda selbst zeigte 15.694,69 €, die App kam nur auf 9.934,31 € — eine Lücke von ca. 5.760 €, rund 37 % des echten Vermögens). Diese Sektion hält fest, was die Lücke verursacht hat, was schon behoben ist, und was bewusst offen bleibt.</w:t>
+      </w:r>
+    </w:p>
+    <w:p>
+      <w:pPr>
+        <w:pStyle w:val="Heading2"/>
+      </w:pPr>
+      <w:r>
+        <w:t>Gefundene Ursachen, im Detail geprüft</w:t>
+      </w:r>
+    </w:p>
+    <w:tbl>
+      <w:tblPr>
+        <w:tblStyle w:val="TableGrid"/>
+        <w:tblW w:type="auto" w:w="0"/>
+        <w:jc w:val="center"/>
+        <w:tblLayout w:type="autofit"/>
+        <w:tblLook w:firstColumn="1" w:firstRow="1" w:lastColumn="0" w:lastRow="0" w:noHBand="0" w:noVBand="1" w:val="04A0"/>
+      </w:tblPr>
+      <w:tblGrid>
+        <w:gridCol w:w="3249"/>
+        <w:gridCol w:w="3249"/>
+        <w:gridCol w:w="3249"/>
+      </w:tblGrid>
+      <w:tr>
+        <w:tc>
+          <w:tcPr>
+            <w:tcW w:type="dxa" w:w="4535"/>
+            <w:shd w:val="clear" w:color="auto" w:fill="1F3A5F"/>
+          </w:tcPr>
+          <w:p>
+            <w:r>
+              <w:rPr>
+                <w:b/>
+                <w:color w:val="FFFFFF"/>
+              </w:rPr>
+              <w:t>Ursache</w:t>
+            </w:r>
+          </w:p>
+        </w:tc>
+        <w:tc>
+          <w:tcPr>
+            <w:tcW w:type="dxa" w:w="1701"/>
+            <w:shd w:val="clear" w:color="auto" w:fill="1F3A5F"/>
+          </w:tcPr>
+          <w:p>
+            <w:r>
+              <w:rPr>
+                <w:b/>
+                <w:color w:val="FFFFFF"/>
+              </w:rPr>
+              <w:t>Betrag (Live-Test)</w:t>
+            </w:r>
+          </w:p>
+        </w:tc>
+        <w:tc>
+          <w:tcPr>
+            <w:tcW w:type="dxa" w:w="3005"/>
+            <w:shd w:val="clear" w:color="auto" w:fill="1F3A5F"/>
+          </w:tcPr>
+          <w:p>
+            <w:r>
+              <w:rPr>
+                <w:b/>
+                <w:color w:val="FFFFFF"/>
+              </w:rPr>
+              <w:t>Status</w:t>
+            </w:r>
+          </w:p>
+        </w:tc>
+      </w:tr>
+      <w:tr>
+        <w:tc>
+          <w:tcPr>
+            <w:tcW w:type="dxa" w:w="4535"/>
+          </w:tcPr>
+          <w:p>
+            <w:r>
+              <w:t>In offener Bitpanda-Fusion-Limit-Order gebunden ("Committed Balance")</w:t>
+            </w:r>
+          </w:p>
+        </w:tc>
+        <w:tc>
+          <w:tcPr>
+            <w:tcW w:type="dxa" w:w="1701"/>
+          </w:tcPr>
+          <w:p>
+            <w:r>
+              <w:t>~188 €</w:t>
+            </w:r>
+          </w:p>
+        </w:tc>
+        <w:tc>
+          <w:tcPr>
+            <w:tcW w:type="dxa" w:w="3005"/>
+          </w:tcPr>
+          <w:p>
+            <w:r>
+              <w:t>Erkannt + dokumentiert, Sync-Zeitstempel zeigt Alter der Anzeige — Automatik noch offen</w:t>
+            </w:r>
+          </w:p>
+        </w:tc>
+      </w:tr>
+      <w:tr>
+        <w:tc>
+          <w:tcPr>
+            <w:tcW w:type="dxa" w:w="4535"/>
+          </w:tcPr>
+          <w:p>
+            <w:r>
+              <w:t>Aktuell gestakte Krypto-Bestände (ETH, SOL, AVAX, SUI, TAO, HYPE, NEAR, SEI, BNB)</w:t>
+            </w:r>
+          </w:p>
+        </w:tc>
+        <w:tc>
+          <w:tcPr>
+            <w:tcW w:type="dxa" w:w="1701"/>
+          </w:tcPr>
+          <w:p>
+            <w:r>
+              <w:t>~2.435 €</w:t>
+            </w:r>
+          </w:p>
+        </w:tc>
+        <w:tc>
+          <w:tcPr>
+            <w:tcW w:type="dxa" w:w="3005"/>
+          </w:tcPr>
+          <w:p>
+            <w:r>
+              <w:t>Behoben — Anzeige (Portfolio-Tab, Remote-Seite) UND risk_gate.py (ETH-Ausnahme, siehe unten)</w:t>
+            </w:r>
+          </w:p>
+        </w:tc>
+      </w:tr>
+      <w:tr>
+        <w:tc>
+          <w:tcPr>
+            <w:tcW w:type="dxa" w:w="4535"/>
+          </w:tcPr>
+          <w:p>
+            <w:r>
+              <w:t>PLTR/VST: yfinance liefert nur USD, keine EUR-Umrechnung</w:t>
+            </w:r>
+          </w:p>
+        </w:tc>
+        <w:tc>
+          <w:tcPr>
+            <w:tcW w:type="dxa" w:w="1701"/>
+          </w:tcPr>
+          <w:p>
+            <w:r>
+              <w:t>~660 €</w:t>
+            </w:r>
+          </w:p>
+        </w:tc>
+        <w:tc>
+          <w:tcPr>
+            <w:tcW w:type="dxa" w:w="3005"/>
+          </w:tcPr>
+          <w:p>
+            <w:r>
+              <w:t>Behoben</w:t>
+            </w:r>
+          </w:p>
+        </w:tc>
+      </w:tr>
+      <w:tr>
+        <w:tc>
+          <w:tcPr>
+            <w:tcW w:type="dxa" w:w="4535"/>
+          </w:tcPr>
+          <w:p>
+            <w:r>
+              <w:t>Historische, aktuell nicht offene Margin-Aktivität (Krypto)</w:t>
+            </w:r>
+          </w:p>
+        </w:tc>
+        <w:tc>
+          <w:tcPr>
+            <w:tcW w:type="dxa" w:w="1701"/>
+          </w:tcPr>
+          <w:p>
+            <w:r>
+              <w:t>—</w:t>
+            </w:r>
+          </w:p>
+        </w:tc>
+        <w:tc>
+          <w:tcPr>
+            <w:tcW w:type="dxa" w:w="3005"/>
+          </w:tcPr>
+          <w:p>
+            <w:r>
+              <w:t>Kein Handlungsbedarf, keine offene Position</w:t>
+            </w:r>
+          </w:p>
+        </w:tc>
+      </w:tr>
+      <w:tr>
+        <w:tc>
+          <w:tcPr>
+            <w:tcW w:type="dxa" w:w="4535"/>
+          </w:tcPr>
+          <w:p>
+            <w:r>
+              <w:t>Zwei offene Margin-Positionen (andere Assetklassen)</w:t>
+            </w:r>
+          </w:p>
+        </w:tc>
+        <w:tc>
+          <w:tcPr>
+            <w:tcW w:type="dxa" w:w="1701"/>
+          </w:tcPr>
+          <w:p>
+            <w:r>
+              <w:t>—</w:t>
+            </w:r>
+          </w:p>
+        </w:tc>
+        <w:tc>
+          <w:tcPr>
+            <w:tcW w:type="dxa" w:w="3005"/>
+          </w:tcPr>
+          <w:p>
+            <w:r>
+              <w:t>Bewusst außerhalb des Tool-Scopes</w:t>
+            </w:r>
+          </w:p>
+        </w:tc>
+      </w:tr>
+    </w:tbl>
+    <w:p>
+      <w:pPr>
+        <w:spacing w:after="80"/>
+      </w:pPr>
+    </w:p>
+    <w:p>
+      <w:pPr>
+        <w:pStyle w:val="Heading2"/>
+      </w:pPr>
+      <w:r>
+        <w:t>Committed Balance (offene Fusion-Orders)</w:t>
+      </w:r>
+    </w:p>
+    <w:p>
+      <w:pPr>
+        <w:spacing w:after="160"/>
+      </w:pPr>
+      <w:r>
+        <w:t xml:space="preserve">Bitpanda sperrt den für eine offene Limit-Order benötigten Betrag sofort aus dem Wallet-Guthaben (offiziell dokumentiert in den Bitpanda-Fusion-Terms als "Committed Balance") — unsere </w:t>
+      </w:r>
+      <w:r>
+        <w:rPr>
+          <w:rFonts w:ascii="Consolas" w:hAnsi="Consolas"/>
+          <w:sz w:val="20"/>
+        </w:rPr>
+        <w:t>/fiatwallets</w:t>
+      </w:r>
+      <w:r>
+        <w:t xml:space="preserve">-Abfrage liefert bereits den </w:t>
+      </w:r>
+      <w:r>
+        <w:rPr>
+          <w:b/>
+        </w:rPr>
+        <w:t>bereinigten, wirklich freien</w:t>
+      </w:r>
+      <w:r>
+        <w:t xml:space="preserve"> Betrag, das ist für RM-4 (Cash-Reserve-Minimum) die korrekte, sicherheitsseitig richtige Zahl. Das Problem war nur, dass die App nicht erkennen ließ, ob dieser Wert *aktuell* ist. </w:t>
+      </w:r>
+      <w:r>
+        <w:rPr>
+          <w:b/>
+        </w:rPr>
+        <w:t>Behoben (2026-07-11):</w:t>
+      </w:r>
+      <w:r>
+        <w:t xml:space="preserve"> </w:t>
+      </w:r>
+      <w:r>
+        <w:rPr>
+          <w:rFonts w:ascii="Consolas" w:hAnsi="Consolas"/>
+          <w:sz w:val="20"/>
+        </w:rPr>
+        <w:t>database/db.py::get/set_cash_reserve_synced_at()</w:t>
+      </w:r>
+      <w:r>
+        <w:t xml:space="preserve"> + neues Label im Portfolio-Tab ("Bitpanda-Sync: vor X Min") — bewusst OHNE Stale-Färbung wie bei Preisen, da ein manueller Sync normalerweise stundenlang zurückliegt, ohne dass etwas falsch ist.</w:t>
+      </w:r>
+    </w:p>
+    <w:p>
+      <w:pPr>
+        <w:spacing w:after="160"/>
+      </w:pPr>
+      <w:r>
+        <w:rPr>
+          <w:b/>
+        </w:rPr>
+        <w:t>Automatische Schätzung des gesperrten Betrags</w:t>
+      </w:r>
+      <w:r>
+        <w:t xml:space="preserve"> (statt eines manuellen Felds, Nutzer-Wunsch: kein manuelles Pflegen) wäre aus der bereits vorhandenen Transaktionshistorie ableitbar (Cash-Delta seit letztem Sync minus alle sichtbaren echten Trades/Transfers im selben Zeitraum = wahrscheinlich in offenen Orders gebunden) — </w:t>
+      </w:r>
+      <w:r>
+        <w:rPr>
+          <w:b/>
+        </w:rPr>
+        <w:t>konzipiert, aber noch nicht gebaut</w:t>
+      </w:r>
+      <w:r>
+        <w:t>.</w:t>
+      </w:r>
+    </w:p>
+    <w:p>
+      <w:pPr>
+        <w:pStyle w:val="Heading2"/>
+      </w:pPr>
+      <w:r>
+        <w:t>Staking-Sichtbarkeit</w:t>
+      </w:r>
+    </w:p>
+    <w:p>
+      <w:pPr>
+        <w:spacing w:after="160"/>
+      </w:pPr>
+      <w:r>
+        <w:t xml:space="preserve">Gestakte Bestände sind über die normalen Bitpanda-Wallet-Endpunkte strukturell unsichtbar (bereits länger bekannt) — neu ist, dass sich das jetzt </w:t>
+      </w:r>
+      <w:r>
+        <w:rPr>
+          <w:b/>
+        </w:rPr>
+        <w:t>automatisch aus der Transaktionshistorie berechnen</w:t>
+      </w:r>
+      <w:r>
+        <w:t xml:space="preserve"> lässt, ohne eine eigene Order-API zu brauchen: jeder "stake"-Transfer bucht die Menge aus der normalen Wallet ab, jeder "unstake"-Transfer wieder zu — der verbleibende, noch nicht zurückgeholte Rest ist die aktuell gestakte Menge.</w:t>
+      </w:r>
+    </w:p>
+    <w:p>
+      <w:pPr>
+        <w:spacing w:after="160"/>
+      </w:pPr>
+      <w:r>
+        <w:rPr>
+          <w:b/>
+        </w:rPr>
+        <w:t>Umgesetzt (2026-07-11):</w:t>
+      </w:r>
+      <w:r>
+        <w:t xml:space="preserve"> </w:t>
+      </w:r>
+      <w:r>
+        <w:rPr>
+          <w:rFonts w:ascii="Consolas" w:hAnsi="Consolas"/>
+          <w:sz w:val="20"/>
+        </w:rPr>
+        <w:t>importer/bitpanda_avg_cost.py::compute_staked_quantities()</w:t>
+      </w:r>
+      <w:r>
+        <w:t xml:space="preserve"> läuft automatisch bei jedem "Einstandspreise berechnen"-Sync mit (kein zusätzlicher API-Aufruf, nutzt dieselben bereits geladenen Transaktionen), neue Spalte </w:t>
+      </w:r>
+      <w:r>
+        <w:rPr>
+          <w:rFonts w:ascii="Consolas" w:hAnsi="Consolas"/>
+          <w:sz w:val="20"/>
+        </w:rPr>
+        <w:t>holdings.staked_quantity</w:t>
+      </w:r>
+      <w:r>
+        <w:t>. Portfolio-Tab und Remote-Steuer-Seite zeigen den gestakten Anteil jetzt separat ausgewiesen im Gesamtwert.</w:t>
+      </w:r>
+    </w:p>
+    <w:p>
+      <w:pPr>
+        <w:spacing w:after="160"/>
+      </w:pPr>
+      <w:r>
+        <w:rPr>
+          <w:b/>
+        </w:rPr>
+        <w:t>Jetzt auch in `risk_gate.py` berücksichtigt (2026-07-11, eigene Planungs-Session).</w:t>
+      </w:r>
+      <w:r>
+        <w:t xml:space="preserve"> Die zunächst bewusst zurückgestellte Einbindung (RG-6-unantastbare Datei) wurde nachgeholt: </w:t>
+      </w:r>
+      <w:r>
+        <w:rPr>
+          <w:rFonts w:ascii="Consolas" w:hAnsi="Consolas"/>
+          <w:sz w:val="20"/>
+        </w:rPr>
+        <w:t>_portfolio_values_usd()</w:t>
+      </w:r>
+      <w:r>
+        <w:t xml:space="preserve"> zählt </w:t>
+      </w:r>
+      <w:r>
+        <w:rPr>
+          <w:rFonts w:ascii="Consolas" w:hAnsi="Consolas"/>
+          <w:sz w:val="20"/>
+        </w:rPr>
+        <w:t>staked_quantity</w:t>
+      </w:r>
+      <w:r>
+        <w:t xml:space="preserve"> seitdem additiv zu </w:t>
+      </w:r>
+      <w:r>
+        <w:rPr>
+          <w:rFonts w:ascii="Consolas" w:hAnsi="Consolas"/>
+          <w:sz w:val="20"/>
+        </w:rPr>
+        <w:t>quantity</w:t>
+      </w:r>
+      <w:r>
+        <w:t xml:space="preserve"> — sowohl in die Gesamtwert-Basis (RM-1/RM-2) als auch, für Stablecoins, automatisch in die Cash-Reserve (RM-4), da der bestehende Stablecoin-Filter dieselbe erweiterte Zahl liest. </w:t>
+      </w:r>
+      <w:r>
+        <w:rPr>
+          <w:b/>
+        </w:rPr>
+        <w:t>Eine Ausnahme:</w:t>
+      </w:r>
+      <w:r>
+        <w:t xml:space="preserve"> ETH ist laut Nutzer-Erfahrung der einzige Bitpanda-Staking-Fall, bei dem Un-/Restaking bisher nicht instant möglich war (alle anderen bisher gestakten Assets waren es) — ETH-Staking bleibt deshalb konservativ (Z-1) von der Risikoberechnung ausgeschlossen (</w:t>
+      </w:r>
+      <w:r>
+        <w:rPr>
+          <w:rFonts w:ascii="Consolas" w:hAnsi="Consolas"/>
+          <w:sz w:val="20"/>
+        </w:rPr>
+        <w:t>STAKING_ILLIQUID_SYMBOLS</w:t>
+      </w:r>
+      <w:r>
+        <w:t xml:space="preserve">-Konstante in </w:t>
+      </w:r>
+      <w:r>
+        <w:rPr>
+          <w:rFonts w:ascii="Consolas" w:hAnsi="Consolas"/>
+          <w:sz w:val="20"/>
+        </w:rPr>
+        <w:t>risk_gate.py</w:t>
+      </w:r>
+      <w:r>
+        <w:t>), mit einer sichtbaren Hinweiszeile im Check-Protokoll. Live gegen die echte DB verifiziert: Gesamtwert-Basis stieg um ~1.949 USD (die gestakten Nicht-ETH-Bestände), die ~832 USD gestaktes ETH blieben korrekt außen vor.</w:t>
+      </w:r>
+    </w:p>
+    <w:p>
+      <w:pPr>
+        <w:pStyle w:val="Heading2"/>
+      </w:pPr>
+      <w:r>
+        <w:t>Margin-/Hebel-Trading — Tag-Vokabular dokumentiert (RM-10/RM-11-Grundlage)</w:t>
+      </w:r>
+    </w:p>
+    <w:p>
+      <w:pPr>
+        <w:spacing w:after="160"/>
+      </w:pPr>
+      <w:r>
+        <w:t xml:space="preserve">Live in der Transaktionshistorie gefunden: </w:t>
+      </w:r>
+      <w:r>
+        <w:rPr>
+          <w:rFonts w:ascii="Consolas" w:hAnsi="Consolas"/>
+          <w:sz w:val="20"/>
+        </w:rPr>
+        <w:t>margin_trading.open</w:t>
+      </w:r>
+      <w:r>
+        <w:t xml:space="preserve"> (1828×), </w:t>
+      </w:r>
+      <w:r>
+        <w:rPr>
+          <w:rFonts w:ascii="Consolas" w:hAnsi="Consolas"/>
+          <w:sz w:val="20"/>
+        </w:rPr>
+        <w:t>margin_trading.borrow</w:t>
+      </w:r>
+      <w:r>
+        <w:t xml:space="preserve"> (811×), </w:t>
+      </w:r>
+      <w:r>
+        <w:rPr>
+          <w:rFonts w:ascii="Consolas" w:hAnsi="Consolas"/>
+          <w:sz w:val="20"/>
+        </w:rPr>
+        <w:t>margin_trading.close</w:t>
+      </w:r>
+      <w:r>
+        <w:t xml:space="preserve"> (622×), </w:t>
+      </w:r>
+      <w:r>
+        <w:rPr>
+          <w:rFonts w:ascii="Consolas" w:hAnsi="Consolas"/>
+          <w:sz w:val="20"/>
+        </w:rPr>
+        <w:t>margin_trading.repay</w:t>
+      </w:r>
+      <w:r>
+        <w:t xml:space="preserve"> (311×), </w:t>
+      </w:r>
+      <w:r>
+        <w:rPr>
+          <w:rFonts w:ascii="Consolas" w:hAnsi="Consolas"/>
+          <w:sz w:val="20"/>
+        </w:rPr>
+        <w:t>margin_trading.fee</w:t>
+      </w:r>
+      <w:r>
+        <w:t xml:space="preserve"> (311×) — echte historische Margin-Aktivität auf dem Account, jüngstes Ereignis ein "close" vom 07.05.2026, seitdem keine weitere Aktivität. Aktuell </w:t>
+      </w:r>
+      <w:r>
+        <w:rPr>
+          <w:b/>
+        </w:rPr>
+        <w:t>keine offene Krypto-Margin-Position</w:t>
+      </w:r>
+      <w:r>
+        <w:t xml:space="preserve"> (Nutzer bestätigt); zwei offene Positionen in anderen Assetklassen bewusst außerhalb des Tool-Scopes. Bitpandas API bietet </w:t>
+      </w:r>
+      <w:r>
+        <w:rPr>
+          <w:b/>
+        </w:rPr>
+        <w:t>keine Übersicht offener Positionen</w:t>
+      </w:r>
+      <w:r>
+        <w:t xml:space="preserve"> (nur den Bewegungs-Log) — eine künftige RM-10/RM-11-Umsetzung müsste Positionen aus </w:t>
+      </w:r>
+      <w:r>
+        <w:rPr>
+          <w:rFonts w:ascii="Consolas" w:hAnsi="Consolas"/>
+          <w:sz w:val="20"/>
+        </w:rPr>
+        <w:t>open</w:t>
+      </w:r>
+      <w:r>
+        <w:t>/</w:t>
+      </w:r>
+      <w:r>
+        <w:rPr>
+          <w:rFonts w:ascii="Consolas" w:hAnsi="Consolas"/>
+          <w:sz w:val="20"/>
+        </w:rPr>
+        <w:t>close</w:t>
+      </w:r>
+      <w:r>
+        <w:t>/</w:t>
+      </w:r>
+      <w:r>
+        <w:rPr>
+          <w:rFonts w:ascii="Consolas" w:hAnsi="Consolas"/>
+          <w:sz w:val="20"/>
+        </w:rPr>
+        <w:t>borrow</w:t>
+      </w:r>
+      <w:r>
+        <w:t>/</w:t>
+      </w:r>
+      <w:r>
+        <w:rPr>
+          <w:rFonts w:ascii="Consolas" w:hAnsi="Consolas"/>
+          <w:sz w:val="20"/>
+        </w:rPr>
+        <w:t>repay</w:t>
+      </w:r>
+      <w:r>
+        <w:t>-Paaren selbst rekonstruieren, das ist nicht trivial und bleibt ein offener Punkt für später.</w:t>
+      </w:r>
+    </w:p>
+    <w:p>
+      <w:pPr>
+        <w:pBdr>
+          <w:bottom w:val="single" w:sz="6" w:space="1" w:color="BFBFBF"/>
+        </w:pBdr>
+        <w:spacing w:before="40" w:after="200"/>
+      </w:pPr>
+    </w:p>
+    <w:p>
+      <w:pPr>
+        <w:pStyle w:val="Heading1"/>
+      </w:pPr>
+      <w:r>
+        <w:t>15. Offene / vorläufige Werte — die naheliegendsten Kandidaten für spätere Anpassung</w:t>
       </w:r>
     </w:p>
     <w:p>
@@ -4854,6 +6393,71 @@
       </w:pPr>
       <w:r>
         <w:t>RM-10 max. Hebel (3x, aktuell ohnehin deaktiviert)</w:t>
+      </w:r>
+    </w:p>
+    <w:p>
+      <w:pPr>
+        <w:pStyle w:val="ListBullet"/>
+        <w:spacing w:after="80"/>
+      </w:pPr>
+      <w:r>
+        <w:rPr>
+          <w:b/>
+        </w:rPr>
+        <w:t>NEU (2026-07-11):</w:t>
+      </w:r>
+      <w:r>
+        <w:t xml:space="preserve"> die ETH-Ausnahme in </w:t>
+      </w:r>
+      <w:r>
+        <w:rPr>
+          <w:rFonts w:ascii="Consolas" w:hAnsi="Consolas"/>
+          <w:sz w:val="20"/>
+        </w:rPr>
+        <w:t>risk_gate.py</w:t>
+      </w:r>
+      <w:r>
+        <w:t xml:space="preserve"> (</w:t>
+      </w:r>
+      <w:r>
+        <w:rPr>
+          <w:rFonts w:ascii="Consolas" w:hAnsi="Consolas"/>
+          <w:sz w:val="20"/>
+        </w:rPr>
+        <w:t>STAKING_ILLIQUID_SYMBOLS</w:t>
+      </w:r>
+      <w:r>
+        <w:t>, siehe Kap. 14) beruht auf einer einzelnen Nutzer-Erfahrung, nicht auf einer systematischen Prüfung aller Bitpanda-Staking-Produkte — bei künftigen neuen gestakten Assets prüfen, ob die Liste erweitert werden muss.</w:t>
+      </w:r>
+    </w:p>
+    <w:p>
+      <w:pPr>
+        <w:pStyle w:val="ListBullet"/>
+        <w:spacing w:after="80"/>
+      </w:pPr>
+      <w:r>
+        <w:rPr>
+          <w:b/>
+        </w:rPr>
+        <w:t>NEU (2026-07-11):</w:t>
+      </w:r>
+      <w:r>
+        <w:t xml:space="preserve"> automatische Schätzung des in offenen Fusion-Orders gebundenen Cash-Betrags (Kap. 14) — konzipiert, noch nicht gebaut.</w:t>
+      </w:r>
+    </w:p>
+    <w:p>
+      <w:pPr>
+        <w:pStyle w:val="ListBullet"/>
+        <w:spacing w:after="80"/>
+      </w:pPr>
+      <w:r>
+        <w:rPr>
+          <w:b/>
+        </w:rPr>
+        <w:t>NEU (2026-07-11):</w:t>
+      </w:r>
+      <w:r>
+        <w:t xml:space="preserve"> RM-10/RM-11 (Hebel) bräuchten eine Positions-Rekonstruktion aus den margin_trading.*-Transaktions-Tags (Kap. 14) — nicht trivial, Bitpanda liefert keine „offene Positionen“-Übersicht.</w:t>
       </w:r>
     </w:p>
     <w:sectPr>

</xml_diff>

<commit_message>
Automatic Bitpanda fiat cash sync every 30 minutes
RM-4 always got the correct, already-committed-balance-adjusted cash
figure from /fiatwallets - the real gap was freshness, since it only
updated on a manual full Bitpanda sync. Extract sync_fiat_cash_from_bitpanda()
from the existing sync and run it on its own scheduled job/lock, separate
from the full holdings sync (which needs an interactive decrease-confirmation
dialog and stays manual). Skips registration without BITPANDA_API_KEY (P-8).

Co-Authored-By: Claude Sonnet 5 <noreply@anthropic.com>
</commit_message>
<xml_diff>
--- a/Basisinfos/Regelwerksmanual.docx
+++ b/Basisinfos/Regelwerksmanual.docx
@@ -2684,6 +2684,48 @@
           </w:p>
         </w:tc>
       </w:tr>
+      <w:tr>
+        <w:tc>
+          <w:tcPr>
+            <w:tcW w:type="dxa" w:w="2268"/>
+          </w:tcPr>
+          <w:p>
+            <w:r>
+              <w:t>bitpanda_cash</w:t>
+            </w:r>
+          </w:p>
+        </w:tc>
+        <w:tc>
+          <w:tcPr>
+            <w:tcW w:type="dxa" w:w="2268"/>
+          </w:tcPr>
+          <w:p>
+            <w:r>
+              <w:t>alle 30 Min (nur mit gesetztem BITPANDA_API_KEY)</w:t>
+            </w:r>
+          </w:p>
+        </w:tc>
+        <w:tc>
+          <w:tcPr>
+            <w:tcW w:type="dxa" w:w="3402"/>
+          </w:tcPr>
+          <w:p>
+            <w:r>
+              <w:t>Nur der EUR-Fiat-Cash-Stand für RM-4 — nicht die vollen Bestände</w:t>
+            </w:r>
+          </w:p>
+        </w:tc>
+        <w:tc>
+          <w:tcPr>
+            <w:tcW w:type="dxa" w:w="1304"/>
+          </w:tcPr>
+          <w:p>
+            <w:r>
+              <w:t>Bitpanda (/fiatwallets)</w:t>
+            </w:r>
+          </w:p>
+        </w:tc>
+      </w:tr>
     </w:tbl>
     <w:p>
       <w:pPr>
@@ -2749,7 +2791,50 @@
         <w:t>Backward-Tracking (2026-07-10, ERGÄNZT — Selbstverifikations-Vision Schritt 2).</w:t>
       </w:r>
       <w:r>
-        <w:t xml:space="preserve"> Jeden Morgen um 6 Uhr prüft die App automatisch, ob vergangene KAUFEN/NACHKAUFEN-Signale ihre Take-Profit- oder Stop-Loss-Zone erreicht haben — anhand bereits vorhandener Kursdaten, kein zusätzlicher Netzwerk-Aufruf. Das Ergebnis siehst du über den neuen Button „Signal-Historie“ im Signale-Tab. Das ist die Datengrundlage für Schritt 3 der Vision (KI-gestützte Regel-Anpassungsvorschläge) — ohne gespeicherte Ist-Ergebnisse kann später nichts verglichen werden. Details siehe Abschnitt 7.</w:t>
+        <w:t xml:space="preserve"> Jeden Morgen um 6 Uhr prüft die App automatisch, ob vergangene KAUFEN/NACHKAUFEN-Signale ihre Take-Profit- oder Stop-Loss-Zone erreicht haben — anhand bereits vorhandener Kursdaten, kein zusätzlicher Netzwerk-Aufruf. Das Ergebnis siehst du über den neuen Button „Signal-Historie“ im Signale-Tab. Das ist die Datengrundlage für Schritt 3 der Vision (KI-gestützte Regel-Anpassungsvorschläge) — ohne gespeicherte Ist-Ergebnisse kann später nichts verglichen werden.</w:t>
+      </w:r>
+    </w:p>
+    <w:p>
+      <w:pPr>
+        <w:spacing w:after="160"/>
+      </w:pPr>
+      <w:r>
+        <w:rPr>
+          <w:b/>
+        </w:rPr>
+        <w:t>Automatischer Fiat-Cash-Sync (2026-07-11, ERGÄNZT).</w:t>
+      </w:r>
+      <w:r>
+        <w:t xml:space="preserve"> Ausgelöst durch die Frage „was ist ein sinnvoller Cash-Betrag für Agent/Regelwerk“ — Ergebnis: RM-4 bekam über </w:t>
+      </w:r>
+      <w:r>
+        <w:rPr>
+          <w:rFonts w:ascii="Consolas" w:hAnsi="Consolas"/>
+          <w:sz w:val="20"/>
+        </w:rPr>
+        <w:t>/fiatwallets</w:t>
+      </w:r>
+      <w:r>
+        <w:t xml:space="preserve"> schon immer den korrekten, um offene Fusion-Order-Sperren bereinigten Betrag, das eigentliche Problem war nur die </w:t>
+      </w:r>
+      <w:r>
+        <w:rPr>
+          <w:b/>
+        </w:rPr>
+        <w:t>Aktualität</w:t>
+      </w:r>
+      <w:r>
+        <w:t xml:space="preserve">: der Wert zog erst bei manuellem „Bestände von Bitpanda abgleichen“-Klick nach. Seit heute läuft dafür ein eigener, schlanker Job alle 30 Minuten (nur EUR-Fiat-Cash, NICHT die vollen Bestände — die haben einen interaktiven Rückgangs-Bestätigungsdialog, der aus einem Hintergrund-Thread nicht sauber aufrufbar ist). Läuft sofort nach dem App-Start ein erstes Mal, danach im 30-Minuten-Takt. Ohne </w:t>
+      </w:r>
+      <w:r>
+        <w:rPr>
+          <w:rFonts w:ascii="Consolas" w:hAnsi="Consolas"/>
+          <w:sz w:val="20"/>
+        </w:rPr>
+        <w:t>BITPANDA_API_KEY</w:t>
+      </w:r>
+      <w:r>
+        <w:t xml:space="preserve"> bleibt der Job wie gehabt deaktiviert (P-8) — dann gilt weiterhin nur der manuelle Sync bzw. die Eingabe im Portfolio-Tab.</w:t>
       </w:r>
     </w:p>
     <w:p>
@@ -2975,7 +3060,7 @@
           </w:tcPr>
           <w:p>
             <w:r>
-              <w:t>Live-Abgleich aller Bestände (Krypto + Aktien/ETF/Rohstoffe) + EUR-Cash direkt von Bitpanda — nie automatisch, da ein echter API-Key beteiligt ist</w:t>
+              <w:t>Live-Abgleich aller Bestände (Krypto + Aktien/ETF/Rohstoffe) + EUR-Cash direkt von Bitpanda — nie automatisch, da ein echter API-Key UND ggf. der interaktive Rückgangs-Bestätigungsdialog beteiligt sind. Der reine EUR-Cash-Anteil läuft seit 2026-07-11 zusätzlich automatisch (siehe oben).</w:t>
             </w:r>
           </w:p>
         </w:tc>
@@ -3102,7 +3187,7 @@
         <w:t>Geld kostet oder einen persönlichen API-Key voraussetzt</w:t>
       </w:r>
       <w:r>
-        <w:t xml:space="preserve"> (Groq pro Einzelsignal, Bitpanda-Sync), ist bewusst manuell — alles, was </w:t>
+        <w:t xml:space="preserve"> (Groq pro Einzelsignal, die vollen Bitpanda-Bestände inkl. Rückgangs-Bestätigung), ist bewusst manuell — alles, was </w:t>
       </w:r>
       <w:r>
         <w:rPr>
@@ -3111,7 +3196,7 @@
         <w:t>kostenlose öffentliche Marktdaten</w:t>
       </w:r>
       <w:r>
-        <w:t xml:space="preserve"> sind (Preise, Historie), läuft automatisch im Hintergrund. Der Marktscan ist der einzige Fall, der teilweise automatisch UND optional KI-gestützt läuft (siehe oben).</w:t>
+        <w:t xml:space="preserve"> sind (Preise, Historie), läuft automatisch im Hintergrund. Marktscan und der neue Fiat-Cash-Sync sind die Fälle, die trotz Key/optionaler KI-Nutzung automatisch laufen, weil sie entweder kostenlos schaltbar (Marktscan-Groq-Teil) oder ohne interaktive Bestätigung sicher automatisierbar sind (Fiat-Cash, siehe oben).</w:t>
       </w:r>
     </w:p>
     <w:p>
@@ -4684,7 +4769,7 @@
         <w:t>importer/excel_import.py</w:t>
       </w:r>
       <w:r>
-        <w:t xml:space="preserve"> — manuelle Bestands-Abgleiche (Abschnitt 6)</w:t>
+        <w:t xml:space="preserve"> — manuelle + automatische (Fiat-Cash) Bestands-Abgleiche (Abschnitt 6)</w:t>
       </w:r>
     </w:p>
     <w:p>
@@ -5183,7 +5268,7 @@
         <w:spacing w:after="160"/>
       </w:pPr>
       <w:r>
-        <w:t xml:space="preserve">Jeder der sechs automatischen Jobs (Abschnitt 6) hat sein </w:t>
+        <w:t xml:space="preserve">Jeder der sieben automatischen Jobs (Abschnitt 6) hat sein </w:t>
       </w:r>
       <w:r>
         <w:rPr>
@@ -5241,7 +5326,7 @@
         <w:t>EVENT_JOB_MISSED</w:t>
       </w:r>
       <w:r>
-        <w:t>) als zweite Verteidigungslinie, falls doch etwas bis zum Scheduler selbst durchschlägt. Seit 2026-07-11 zusätzlich: jeder der drei wichtigsten Jobs (Preise/Wertpapier-Preise/Marktscan) hat eine eigene Sperre gegen doppelte gleichzeitige Läufe, geteilt mit der neuen Remote-Steuer-Seite (Abschnitt 13).</w:t>
+        <w:t>) als zweite Verteidigungslinie, falls doch etwas bis zum Scheduler selbst durchschlägt. Seit 2026-07-11 zusätzlich: die vier wichtigsten Jobs (Preise/Wertpapier-Preise/Marktscan/Fiat-Cash) haben eine eigene Sperre gegen doppelte gleichzeitige Läufe, geteilt mit der Remote-Steuer-Seite (Abschnitt 13).</w:t>
       </w:r>
     </w:p>
     <w:p>
@@ -5798,7 +5883,7 @@
           </w:tcPr>
           <w:p>
             <w:r>
-              <w:t>Erkannt + dokumentiert, Sync-Zeitstempel zeigt Alter der Anzeige — Automatik noch offen</w:t>
+              <w:t>Erkannt + dokumentiert; RM-4 rechnete schon immer korrekt, Aktualität jetzt zusätzlich per automatischem Sync abgesichert (siehe unten)</w:t>
             </w:r>
           </w:p>
         </w:tc>
@@ -5999,19 +6084,49 @@
         <w:rPr>
           <w:b/>
         </w:rPr>
-        <w:t>Automatische Schätzung des gesperrten Betrags</w:t>
-      </w:r>
-      <w:r>
-        <w:t xml:space="preserve"> (statt eines manuellen Felds, Nutzer-Wunsch: kein manuelles Pflegen) wäre aus der bereits vorhandenen Transaktionshistorie ableitbar (Cash-Delta seit letztem Sync minus alle sichtbaren echten Trades/Transfers im selben Zeitraum = wahrscheinlich in offenen Orders gebunden) — </w:t>
+        <w:t>Klargestellt (2026-07-11): keine Schätzung des gesperrten Betrags nötig.</w:t>
+      </w:r>
+      <w:r>
+        <w:t xml:space="preserve"> Eine ursprünglich angedachte Herleitung aus der Transaktionshistorie (Cash-Delta minus sichtbare Trades/Transfers) erübrigt sich — </w:t>
+      </w:r>
+      <w:r>
+        <w:rPr>
+          <w:rFonts w:ascii="Consolas" w:hAnsi="Consolas"/>
+          <w:sz w:val="20"/>
+        </w:rPr>
+        <w:t>/fiatwallets</w:t>
+      </w:r>
+      <w:r>
+        <w:t xml:space="preserve"> liefert den gesperrten Betrag serverseitig bereits korrekt heraus, das war für RM-4 nie das Problem. </w:t>
       </w:r>
       <w:r>
         <w:rPr>
           <w:b/>
         </w:rPr>
-        <w:t>konzipiert, aber noch nicht gebaut</w:t>
-      </w:r>
-      <w:r>
-        <w:t>.</w:t>
+        <w:t>Stattdessen umgesetzt: automatischer Sync alle 30 Minuten</w:t>
+      </w:r>
+      <w:r>
+        <w:t xml:space="preserve"> (</w:t>
+      </w:r>
+      <w:r>
+        <w:rPr>
+          <w:rFonts w:ascii="Consolas" w:hAnsi="Consolas"/>
+          <w:sz w:val="20"/>
+        </w:rPr>
+        <w:t>scheduler/background.py::refresh_bitpanda_cash_job</w:t>
+      </w:r>
+      <w:r>
+        <w:t xml:space="preserve">, neue Funktion </w:t>
+      </w:r>
+      <w:r>
+        <w:rPr>
+          <w:rFonts w:ascii="Consolas" w:hAnsi="Consolas"/>
+          <w:sz w:val="20"/>
+        </w:rPr>
+        <w:t>importer/bitpanda_sync.py::sync_fiat_cash_from_bitpanda()</w:t>
+      </w:r>
+      <w:r>
+        <w:t>, aus dem bestehenden manuellen Sync extrahiert) — damit RM-4 nie länger als eine halbe Stunde auf einem veralteten Cash-Stand rechnet, ohne dass dafür die vollen Bestände automatisch mitlaufen müssen (siehe Kap. 6).</w:t>
       </w:r>
     </w:p>
     <w:p>
@@ -6439,10 +6554,20 @@
         <w:rPr>
           <w:b/>
         </w:rPr>
-        <w:t>NEU (2026-07-11):</w:t>
-      </w:r>
-      <w:r>
-        <w:t xml:space="preserve"> automatische Schätzung des in offenen Fusion-Orders gebundenen Cash-Betrags (Kap. 14) — konzipiert, noch nicht gebaut.</w:t>
+        <w:t>ERLEDIGT, war hier gelistet (2026-07-11):</w:t>
+      </w:r>
+      <w:r>
+        <w:t xml:space="preserve"> eine Schätzung des in offenen Fusion-Orders gebundenen Cash-Betrags erwies sich als unnötig — </w:t>
+      </w:r>
+      <w:r>
+        <w:rPr>
+          <w:rFonts w:ascii="Consolas" w:hAnsi="Consolas"/>
+          <w:sz w:val="20"/>
+        </w:rPr>
+        <w:t>/fiatwallets</w:t>
+      </w:r>
+      <w:r>
+        <w:t xml:space="preserve"> liefert den korrekten, bereinigten Betrag bereits serverseitig; gelöst wurde stattdessen die Aktualität per automatischem 30-Minuten-Sync (Kap. 6/14).</w:t>
       </w:r>
     </w:p>
     <w:p>

</xml_diff>

<commit_message>
Add AZ-4 tranchen suggestions to signal schema (staged buy/sell zones)
First slice of the bear-market accumulation roadmap. Groq can now
optionally propose 2-5 tranches (percentage of position, own zone,
optional trigger condition) instead of a single entry zone - gated on
regime (baer/krise_extrem/seitwaerts) + BTC/ETH + a new per-asset
watchlist toggle. Deliberately informational only: risk_gate.py stays
untouched (tranches are percentages of the one clamped position_size),
and a malformed tranche proposal is dropped rather than failing the
whole signal, since there's no way to track real order status via the
Bitpanda API anyway (verified live against an open test order).

Co-Authored-By: Claude Sonnet 5 <noreply@anthropic.com>
</commit_message>
<xml_diff>
--- a/Basisinfos/Regelwerksmanual.docx
+++ b/Basisinfos/Regelwerksmanual.docx
@@ -2090,6 +2090,267 @@
     </w:p>
     <w:p>
       <w:pPr>
+        <w:spacing w:after="160"/>
+      </w:pPr>
+      <w:r>
+        <w:rPr>
+          <w:b/>
+        </w:rPr>
+        <w:t>AZ-4 seit 2026-07-12 strukturiert umsetzbar (gestaffelte Kauf-/Verkaufszonen).</w:t>
+      </w:r>
+      <w:r>
+        <w:t xml:space="preserve"> Bisher war „gestaffelt kaufen“ nur eine lose Absicht ohne Schema-Unterstützung — Groq konnte höchstens EINE Kauf-/Verkaufszone (</w:t>
+      </w:r>
+      <w:r>
+        <w:rPr>
+          <w:rFonts w:ascii="Consolas" w:hAnsi="Consolas"/>
+          <w:sz w:val="20"/>
+        </w:rPr>
+        <w:t>entry</w:t>
+      </w:r>
+      <w:r>
+        <w:t xml:space="preserve">) vorschlagen. Jetzt kann Groq zusätzlich das optionale Feld </w:t>
+      </w:r>
+      <w:r>
+        <w:rPr>
+          <w:rFonts w:ascii="Consolas" w:hAnsi="Consolas"/>
+          <w:sz w:val="20"/>
+        </w:rPr>
+        <w:t>tranchen</w:t>
+      </w:r>
+      <w:r>
+        <w:t xml:space="preserve"> füllen: 2-5 Preiszonen mit Prozentanteil der Gesamtposition (Summe 100 %), aufsteigend von der nächsten/höchsten zur tiefsten Zone, optional mit einer Trigger-Bedingung als Freitext (z. B. „Bodenbestätigung laut Regime-/Risiko-Modell“). Gilt symmetrisch für Käufe UND Verkäufe.</w:t>
+      </w:r>
+    </w:p>
+    <w:p>
+      <w:pPr>
+        <w:spacing w:after="40"/>
+      </w:pPr>
+      <w:r>
+        <w:rPr>
+          <w:b/>
+        </w:rPr>
+        <w:t>Voraussetzungen, alle drei müssen gleichzeitig erfüllt sein:</w:t>
+      </w:r>
+    </w:p>
+    <w:p>
+      <w:pPr>
+        <w:pStyle w:val="ListNumber"/>
+        <w:spacing w:after="80"/>
+      </w:pPr>
+      <w:r>
+        <w:t xml:space="preserve">Regime ist </w:t>
+      </w:r>
+      <w:r>
+        <w:rPr>
+          <w:rFonts w:ascii="Consolas" w:hAnsi="Consolas"/>
+          <w:sz w:val="20"/>
+        </w:rPr>
+        <w:t>baer</w:t>
+      </w:r>
+      <w:r>
+        <w:t xml:space="preserve">, </w:t>
+      </w:r>
+      <w:r>
+        <w:rPr>
+          <w:rFonts w:ascii="Consolas" w:hAnsi="Consolas"/>
+          <w:sz w:val="20"/>
+        </w:rPr>
+        <w:t>krise_extrem</w:t>
+      </w:r>
+      <w:r>
+        <w:t xml:space="preserve"> </w:t>
+      </w:r>
+      <w:r>
+        <w:rPr>
+          <w:b/>
+        </w:rPr>
+        <w:t>oder</w:t>
+      </w:r>
+      <w:r>
+        <w:t xml:space="preserve"> </w:t>
+      </w:r>
+      <w:r>
+        <w:rPr>
+          <w:rFonts w:ascii="Consolas" w:hAnsi="Consolas"/>
+          <w:sz w:val="20"/>
+        </w:rPr>
+        <w:t>seitwaerts</w:t>
+      </w:r>
+      <w:r>
+        <w:t xml:space="preserve"> (bewusst weiter gefasst als nur die Extremfälle — Akkumulation beginnt oft schon vor der offiziellen Bär-Bestätigung; Bulle/Euphorie-extrem sind ausgeschlossen, weil tiefere Tranchen-Zonen dort meist unausgefüllt bleiben und Kapital unnötig binden).</w:t>
+      </w:r>
+    </w:p>
+    <w:p>
+      <w:pPr>
+        <w:pStyle w:val="ListNumber"/>
+        <w:spacing w:after="80"/>
+      </w:pPr>
+      <w:r>
+        <w:t>Asset ist BTC oder ETH (aktuell keine anderen Assets vorgesehen).</w:t>
+      </w:r>
+    </w:p>
+    <w:p>
+      <w:pPr>
+        <w:pStyle w:val="ListNumber"/>
+        <w:spacing w:after="80"/>
+      </w:pPr>
+      <w:r>
+        <w:t>Ein per-Asset-Schalter im Watchlist-Tab („Tranchen-Vorschläge umschalten (BTC/ETH)“) steht auf „An“ — Default: an für BTC/ETH.</w:t>
+      </w:r>
+    </w:p>
+    <w:p>
+      <w:pPr>
+        <w:spacing w:after="40"/>
+      </w:pPr>
+      <w:r>
+        <w:rPr>
+          <w:b/>
+        </w:rPr>
+        <w:t>Bewusst reine Zusatz-Information, kein neues Veto und keine echte Order-Anbindung:</w:t>
+      </w:r>
+    </w:p>
+    <w:p>
+      <w:pPr>
+        <w:pStyle w:val="ListBullet"/>
+        <w:spacing w:after="80"/>
+      </w:pPr>
+      <w:r>
+        <w:t xml:space="preserve">Die eine </w:t>
+      </w:r>
+      <w:r>
+        <w:rPr>
+          <w:rFonts w:ascii="Consolas" w:hAnsi="Consolas"/>
+          <w:sz w:val="20"/>
+        </w:rPr>
+        <w:t>position_size</w:t>
+      </w:r>
+      <w:r>
+        <w:t xml:space="preserve"> bleibt die geklemmte Gesamtgröße (RM-1/RM-2 unverändert) — jede Tranche ist nur ein Prozentanteil davon, kein eigener Absolutbetrag von Groq.</w:t>
+      </w:r>
+    </w:p>
+    <w:p>
+      <w:pPr>
+        <w:pStyle w:val="ListBullet"/>
+        <w:spacing w:after="80"/>
+      </w:pPr>
+      <w:r>
+        <w:t xml:space="preserve">Ein fehlerhafter Tranchen-Vorschlag (Summe ≠ 100 %, kaputte Zone) wird verworfen, löst aber </w:t>
+      </w:r>
+      <w:r>
+        <w:rPr>
+          <w:b/>
+        </w:rPr>
+        <w:t>keinen</w:t>
+      </w:r>
+      <w:r>
+        <w:t xml:space="preserve"> Validierungsfehler des Gesamtsignals aus.</w:t>
+      </w:r>
+    </w:p>
+    <w:p>
+      <w:pPr>
+        <w:pStyle w:val="ListBullet"/>
+        <w:spacing w:after="80"/>
+      </w:pPr>
+      <w:r>
+        <w:rPr>
+          <w:b/>
+        </w:rPr>
+        <w:t>Keine Order-Ausführung oder -Verfolgung möglich</w:t>
+      </w:r>
+      <w:r>
+        <w:t xml:space="preserve"> — live geprüft (2026-07-12): weder </w:t>
+      </w:r>
+      <w:r>
+        <w:rPr>
+          <w:rFonts w:ascii="Consolas" w:hAnsi="Consolas"/>
+          <w:sz w:val="20"/>
+        </w:rPr>
+        <w:t>/fiatwallets</w:t>
+      </w:r>
+      <w:r>
+        <w:t xml:space="preserve">, </w:t>
+      </w:r>
+      <w:r>
+        <w:rPr>
+          <w:rFonts w:ascii="Consolas" w:hAnsi="Consolas"/>
+          <w:sz w:val="20"/>
+        </w:rPr>
+        <w:t>/wallets</w:t>
+      </w:r>
+      <w:r>
+        <w:t xml:space="preserve">, </w:t>
+      </w:r>
+      <w:r>
+        <w:rPr>
+          <w:rFonts w:ascii="Consolas" w:hAnsi="Consolas"/>
+          <w:sz w:val="20"/>
+        </w:rPr>
+        <w:t>/wallets/transactions</w:t>
+      </w:r>
+      <w:r>
+        <w:t xml:space="preserve"> noch </w:t>
+      </w:r>
+      <w:r>
+        <w:rPr>
+          <w:rFonts w:ascii="Consolas" w:hAnsi="Consolas"/>
+          <w:sz w:val="20"/>
+        </w:rPr>
+        <w:t>/trades</w:t>
+      </w:r>
+      <w:r>
+        <w:t xml:space="preserve"> zeigen offene Orders der persönlichen Bitpanda-API. Ein Order-Ausführungs-API existiert nur als separates B2B-Partnerprodukt, für Privatkunden nicht zugänglich. Wer eine Tranche tatsächlich umsetzen will, muss sie selbst als echte Bitpanda-Order anlegen (Fusion empfohlen — sperrt den Betrag korrekt in </w:t>
+      </w:r>
+      <w:r>
+        <w:rPr>
+          <w:rFonts w:ascii="Consolas" w:hAnsi="Consolas"/>
+          <w:sz w:val="20"/>
+        </w:rPr>
+        <w:t>/fiatwallets</w:t>
+      </w:r>
+      <w:r>
+        <w:t>, siehe Kap. 14).</w:t>
+      </w:r>
+    </w:p>
+    <w:p>
+      <w:pPr>
+        <w:pStyle w:val="ListBullet"/>
+        <w:spacing w:after="80"/>
+      </w:pPr>
+      <w:r>
+        <w:t xml:space="preserve">Die Z-2-CRV-Prüfung (Mindest-Chance-Risiko-Verhältnis) rechnet bei aktiven Tranchen weiterhin über die </w:t>
+      </w:r>
+      <w:r>
+        <w:rPr>
+          <w:rFonts w:ascii="Consolas" w:hAnsi="Consolas"/>
+          <w:sz w:val="20"/>
+        </w:rPr>
+        <w:t>entry</w:t>
+      </w:r>
+      <w:r>
+        <w:t xml:space="preserve">-Gesamtspanne — wird dadurch zu einem </w:t>
+      </w:r>
+      <w:r>
+        <w:rPr>
+          <w:b/>
+        </w:rPr>
+        <w:t>geblendeten Gesamtwert</w:t>
+      </w:r>
+      <w:r>
+        <w:t xml:space="preserve"> über alle Tranchen, keine scharfe Einzeltrade-Kennzahl mehr.</w:t>
+      </w:r>
+    </w:p>
+    <w:p>
+      <w:pPr>
+        <w:pStyle w:val="ListBullet"/>
+        <w:spacing w:after="80"/>
+      </w:pPr>
+      <w:r>
+        <w:t>Kein Ausführungs-Tracking je einzelner Tranche (die bestehende Umsetzungs-Rückmeldung/Backward-Tracking bleibt signal-weit) — ohnehin nicht sinnvoll umsetzbar ohne Order-API.</w:t>
+      </w:r>
+    </w:p>
+    <w:p>
+      <w:pPr>
         <w:pBdr>
           <w:bottom w:val="single" w:sz="6" w:space="1" w:color="BFBFBF"/>
         </w:pBdr>
@@ -3161,6 +3422,38 @@
           </w:p>
         </w:tc>
       </w:tr>
+      <w:tr>
+        <w:tc>
+          <w:tcPr>
+            <w:tcW w:type="dxa" w:w="2551"/>
+          </w:tcPr>
+          <w:p>
+            <w:r>
+              <w:t>„Tranchen-Vorschläge umschalten (BTC/ETH)“</w:t>
+            </w:r>
+          </w:p>
+        </w:tc>
+        <w:tc>
+          <w:tcPr>
+            <w:tcW w:type="dxa" w:w="1701"/>
+          </w:tcPr>
+          <w:p>
+            <w:r>
+              <w:t>Watchlist-Tab</w:t>
+            </w:r>
+          </w:p>
+        </w:tc>
+        <w:tc>
+          <w:tcPr>
+            <w:tcW w:type="dxa" w:w="4989"/>
+          </w:tcPr>
+          <w:p>
+            <w:r>
+              <w:t>Schaltet AZ-4-Tranchierung für die ausgewählte Zeile (BTC/ETH) an/aus, siehe Kap. 4 — rein lokale Einstellung, kein externer Aufruf.</w:t>
+            </w:r>
+          </w:p>
+        </w:tc>
+      </w:tr>
     </w:tbl>
     <w:p>
       <w:pPr>
@@ -4377,7 +4670,7 @@
           </w:tcPr>
           <w:p>
             <w:r>
-              <w:t>regelmäßige Käufe unabhängig vom Preis</w:t>
+              <w:t>regelmäßige Käufe unabhängig vom Preis (kalenderbasiert)</w:t>
             </w:r>
           </w:p>
         </w:tc>
@@ -4387,16 +4680,7 @@
           </w:tcPr>
           <w:p>
             <w:r>
-              <w:t xml:space="preserve">aktiv, aber noch </w:t>
-            </w:r>
-            <w:r>
-              <w:rPr>
-                <w:b/>
-              </w:rPr>
-              <w:t>keine echte Mehrfach-Tranchen-Unterstützung im Signal-Schema</w:t>
-            </w:r>
-            <w:r>
-              <w:t xml:space="preserve"> (offener Punkt)</w:t>
+              <w:t>aktiv</w:t>
             </w:r>
           </w:p>
         </w:tc>
@@ -4580,6 +4864,38 @@
     </w:p>
     <w:p>
       <w:pPr>
+        <w:spacing w:after="160"/>
+      </w:pPr>
+      <w:r>
+        <w:rPr>
+          <w:b/>
+        </w:rPr>
+        <w:t>Terminologie-Klarstellung (2026-07-12):</w:t>
+      </w:r>
+      <w:r>
+        <w:t xml:space="preserve"> die gestaffelten Kauf-/Verkaufszonen („mehrere Tranchen an unterschiedlichen Preiszonen“) gehören fachlich zu </w:t>
+      </w:r>
+      <w:r>
+        <w:rPr>
+          <w:b/>
+        </w:rPr>
+        <w:t>AZ-4</w:t>
+      </w:r>
+      <w:r>
+        <w:t xml:space="preserve"> („gestaffelt, nie all-in“, siehe Kap. 4), </w:t>
+      </w:r>
+      <w:r>
+        <w:rPr>
+          <w:b/>
+        </w:rPr>
+        <w:t>nicht</w:t>
+      </w:r>
+      <w:r>
+        <w:t xml:space="preserve"> zu S-2 — S-2/DCA ist per Definition kalenderbasiert („regelmäßig“, unabhängig vom Preis), während die Tranchen-Funktion preiszonen-basiertes Scaling-in/Laddering ist. Der vormals hier offene Punkt „keine echte Mehrfach-Tranchen-Unterstützung“ ist damit über AZ-4 gelöst, siehe Kap. 4.</w:t>
+      </w:r>
+    </w:p>
+    <w:p>
+      <w:pPr>
         <w:pBdr>
           <w:bottom w:val="single" w:sz="6" w:space="1" w:color="BFBFBF"/>
         </w:pBdr>
@@ -4711,7 +5027,7 @@
         <w:t>agent/krypto/analyst.py</w:t>
       </w:r>
       <w:r>
-        <w:t xml:space="preserve"> — SYSTEM_PROMPT (alle Regeln, die der KI als Anweisung mitgegeben werden) + Schema-Validierung</w:t>
+        <w:t xml:space="preserve"> — SYSTEM_PROMPT (alle Regeln, die der KI als Anweisung mitgegeben werden) + Schema-Validierung, inkl. AZ-4-Tranchen (Regel 20)</w:t>
       </w:r>
     </w:p>
     <w:p>
@@ -4886,6 +5202,22 @@
       </w:r>
       <w:r>
         <w:t xml:space="preserve"> — EUR-Umrechnung für USD-only-Aktien wie PLTR/VST (Abschnitt 14)</w:t>
+      </w:r>
+    </w:p>
+    <w:p>
+      <w:pPr>
+        <w:pStyle w:val="ListBullet"/>
+        <w:spacing w:after="80"/>
+      </w:pPr>
+      <w:r>
+        <w:rPr>
+          <w:rFonts w:ascii="Consolas" w:hAnsi="Consolas"/>
+          <w:sz w:val="20"/>
+        </w:rPr>
+        <w:t>database/db.py::get_dca_erlaubt()/set_dca_erlaubt()</w:t>
+      </w:r>
+      <w:r>
+        <w:t xml:space="preserve"> — AZ-4-Tranchen-Toggle je Asset (Abschnitt 4)</w:t>
       </w:r>
     </w:p>
     <w:p>
@@ -6583,6 +6915,21 @@
       </w:r>
       <w:r>
         <w:t xml:space="preserve"> RM-10/RM-11 (Hebel) bräuchten eine Positions-Rekonstruktion aus den margin_trading.*-Transaktions-Tags (Kap. 14) — nicht trivial, Bitpanda liefert keine „offene Positionen“-Übersicht.</w:t>
+      </w:r>
+    </w:p>
+    <w:p>
+      <w:pPr>
+        <w:pStyle w:val="ListBullet"/>
+        <w:spacing w:after="80"/>
+      </w:pPr>
+      <w:r>
+        <w:rPr>
+          <w:b/>
+        </w:rPr>
+        <w:t>NEU (2026-07-12):</w:t>
+      </w:r>
+      <w:r>
+        <w:t xml:space="preserve"> die AZ-4-Tranchen-Bedingungen (Regime baer/krise_extrem/seitwaerts, nur BTC/ETH) sind eine erste, bewusst enge Setzung, keine tiefe Herleitung — bei Bedarf später erweiterbar (z. B. weitere Assets, andere Regime-Kombinationen).</w:t>
       </w:r>
     </w:p>
     <w:sectPr>

</xml_diff>

<commit_message>
Harden startup error handling and add staleness-aware scheduler restarts
Fatal config/DB errors and non-fatal first-run import failures now surface
via a visible dialog and the log file instead of a silent pre-UI crash.
Price refresh jobs run immediately after any restart; history/OHLC jobs run
immediately only when their data is actually stale, avoiding needless API
quota use on frequent restarts. Regelwerksmanual documents both the manual
recovery steps and the downtime behavior in detail.
</commit_message>
<xml_diff>
--- a/Basisinfos/Regelwerksmanual.docx
+++ b/Basisinfos/Regelwerksmanual.docx
@@ -5222,6 +5222,22 @@
     </w:p>
     <w:p>
       <w:pPr>
+        <w:pStyle w:val="ListBullet"/>
+        <w:spacing w:after="80"/>
+      </w:pPr>
+      <w:r>
+        <w:rPr>
+          <w:rFonts w:ascii="Consolas" w:hAnsi="Consolas"/>
+          <w:sz w:val="20"/>
+        </w:rPr>
+        <w:t>main.py::_show_startup_error()</w:t>
+      </w:r>
+      <w:r>
+        <w:t xml:space="preserve"> — abgesicherte Start-Schritte (Abschnitt 12)</w:t>
+      </w:r>
+    </w:p>
+    <w:p>
+      <w:pPr>
         <w:pBdr>
           <w:bottom w:val="single" w:sz="6" w:space="1" w:color="BFBFBF"/>
         </w:pBdr>
@@ -5380,16 +5396,10 @@
               <w:rPr>
                 <w:b/>
               </w:rPr>
-              <w:t>Kein Try/Except</w:t>
+              <w:t>Behoben (2026-07-12):</w:t>
             </w:r>
             <w:r>
-              <w:t xml:space="preserve"> — kaputte/fehlende config.yaml bringt die App </w:t>
-            </w:r>
-            <w:r>
-              <w:rPr>
-                <w:b/>
-              </w:rPr>
-              <w:t>vor der UI zum Absturz</w:t>
+              <w:t xml:space="preserve"> Try/Except → logger.exception() (landet garantiert in der Logdatei) + sichtbarer Fehlerdialog + sauberer Prozess-Abbruch (sys.exit(1)), statt eines stillen Absturzes</w:t>
             </w:r>
           </w:p>
         </w:tc>
@@ -5424,10 +5434,10 @@
               <w:rPr>
                 <w:b/>
               </w:rPr>
-              <w:t>Kein Try/Except</w:t>
+              <w:t>Behoben (2026-07-12):</w:t>
             </w:r>
             <w:r>
-              <w:t xml:space="preserve"> — ein DB-Problem bringt die App ebenfalls vor der UI zum Absturz</w:t>
+              <w:t xml:space="preserve"> gleiches Muster wie oben — Log + Dialog + sys.exit(1)</w:t>
             </w:r>
           </w:p>
         </w:tc>
@@ -5465,10 +5475,10 @@
               <w:rPr>
                 <w:b/>
               </w:rPr>
-              <w:t>Kein Try/Except</w:t>
+              <w:t>Behoben (2026-07-12), aber bewusst NICHT fatal:</w:t>
             </w:r>
             <w:r>
-              <w:t xml:space="preserve"> — fehlt die Datei oder eine Pflichtspalte, stürzt die App vor der UI ab</w:t>
+              <w:t xml:space="preserve"> Log + Dialog, die App startet trotzdem mit leeren Beständen weiter (jederzeit über "Datei → Bestände aus Datei importieren…" nachholbar)</w:t>
             </w:r>
           </w:p>
         </w:tc>
@@ -5554,37 +5564,785 @@
         <w:rPr>
           <w:b/>
         </w:rPr>
-        <w:t>Wichtigste Konsequenz:</w:t>
-      </w:r>
-      <w:r>
-        <w:t xml:space="preserve"> Die drei fett markierten Schritte sind aktuell </w:t>
+        <w:t>Alle drei vormals ungeschützten Schritte sind jetzt abgesichert (2026-07-12, `main.py::_show_startup_error()`).</w:t>
+      </w:r>
+      <w:r>
+        <w:t xml:space="preserve"> Ein minimaler, versteckter Tk-Root zeigt einen Fehlerdialog auch dann, wenn die eigentliche App-Hauptschleife noch gar nicht läuft — wichtig, weil ein unbehandelter Python-Absturz sonst nur über </w:t>
+      </w:r>
+      <w:r>
+        <w:rPr>
+          <w:rFonts w:ascii="Consolas" w:hAnsi="Consolas"/>
+          <w:sz w:val="20"/>
+        </w:rPr>
+        <w:t>sys.excepthook</w:t>
+      </w:r>
+      <w:r>
+        <w:t xml:space="preserve"> auf </w:t>
+      </w:r>
+      <w:r>
+        <w:rPr>
+          <w:rFonts w:ascii="Consolas" w:hAnsi="Consolas"/>
+          <w:sz w:val="20"/>
+        </w:rPr>
+        <w:t>stderr</w:t>
+      </w:r>
+      <w:r>
+        <w:t xml:space="preserve"> landet, </w:t>
       </w:r>
       <w:r>
         <w:rPr>
           <w:b/>
         </w:rPr>
-        <w:t>ungeschützt</w:t>
-      </w:r>
-      <w:r>
-        <w:t xml:space="preserve">. Läuft die App ohne sichtbares Terminal (z. B. per Verknüpfung am 24/7-Notebook), siehst du bei einem Fehlschlag dort </w:t>
-      </w:r>
+        <w:t>nicht</w:t>
+      </w:r>
+      <w:r>
+        <w:t xml:space="preserve"> durch die </w:t>
+      </w:r>
+      <w:r>
+        <w:rPr>
+          <w:rFonts w:ascii="Consolas" w:hAnsi="Consolas"/>
+          <w:sz w:val="20"/>
+        </w:rPr>
+        <w:t>logging</w:t>
+      </w:r>
+      <w:r>
+        <w:t xml:space="preserve">-Handler (die Logdatei bliebe sonst leer, egal wie gut sie eingerichtet ist). Config- und DB-Fehler sind bewusst fatal (App kann ohne beides nicht sinnvoll weiterlaufen), der Erstimport-Fehler bewusst nicht (fehlende Bestände sind jederzeit nachholbar). Live gegen drei simulierte Fehlerfälle verifiziert (fehlende </w:t>
+      </w:r>
+      <w:r>
+        <w:rPr>
+          <w:rFonts w:ascii="Consolas" w:hAnsi="Consolas"/>
+          <w:sz w:val="20"/>
+        </w:rPr>
+        <w:t>config.yaml</w:t>
+      </w:r>
+      <w:r>
+        <w:t>, beschädigte DB, fehlgeschlagener Erstimport) — in allen drei Fällen landete der volle Traceback garantiert in der Logdatei.</w:t>
+      </w:r>
+    </w:p>
+    <w:p>
+      <w:pPr>
+        <w:pStyle w:val="Heading2"/>
+      </w:pPr>
+      <w:r>
+        <w:t>Was tun bei einem Fehler — Schritt für Schritt</w:t>
+      </w:r>
+    </w:p>
+    <w:p>
+      <w:pPr>
+        <w:spacing w:after="160"/>
+      </w:pPr>
+      <w:r>
+        <w:t>Diese Anleitung ist für den Fall gedacht, dass die App nicht wie erwartet hochfährt oder sich merkwürdig verhält — besonders relevant am 24/7-Notebook, wo niemand direkt danebensitzt. Für jedes Szenario: woran du es erkennst, und was du konkret manuell tun musst.</w:t>
+      </w:r>
+    </w:p>
+    <w:p>
+      <w:pPr>
+        <w:pStyle w:val="ListNumber"/>
+        <w:spacing w:after="80"/>
+      </w:pPr>
       <w:r>
         <w:rPr>
           <w:b/>
         </w:rPr>
-        <w:t>buchstäblich nichts</w:t>
-      </w:r>
-      <w:r>
-        <w:t xml:space="preserve"> — nicht mal einen Logeintrag, weil der Absturz vor oder während dieser Schritte passiert. Das betrifft nur den </w:t>
+        <w:t xml:space="preserve">App startet gar nicht, kein Fenster erscheint, dafür ein Fehlerdialog („TradingInfoTool - Start fehlgeschlagen“).</w:t>
+      </w:r>
+      <w:r>
+        <w:t xml:space="preserve"> Das ist ein </w:t>
       </w:r>
       <w:r>
         <w:rPr>
           <w:b/>
         </w:rPr>
-        <w:t>Start selbst</w:t>
-      </w:r>
-      <w:r>
-        <w:t>; ist die App einmal erfolgreich hochgefahren, sind die laufenden Scheduler-Jobs (siehe unten) deutlich robuster.</w:t>
+        <w:t>fataler</w:t>
+      </w:r>
+      <w:r>
+        <w:t xml:space="preserve"> Config- oder Datenbank-Fehler (siehe Tabelle oben). Die App hat sich bewusst sauber beendet, statt mit kaputtem Zustand weiterzulaufen.</w:t>
+      </w:r>
+    </w:p>
+    <w:p>
+      <w:pPr>
+        <w:pStyle w:val="ListBullet"/>
+        <w:spacing w:after="80"/>
+      </w:pPr>
+      <w:r>
+        <w:t xml:space="preserve">Dialogtext lesen — er nennt bereits, ob es an </w:t>
+      </w:r>
+      <w:r>
+        <w:rPr>
+          <w:rFonts w:ascii="Consolas" w:hAnsi="Consolas"/>
+          <w:sz w:val="20"/>
+        </w:rPr>
+        <w:t>Basisinfos/config.yaml</w:t>
+      </w:r>
+      <w:r>
+        <w:t xml:space="preserve"> oder an der Datenbank liegt, plus die eigentliche Python-Fehlermeldung.</w:t>
+      </w:r>
+    </w:p>
+    <w:p>
+      <w:pPr>
+        <w:pStyle w:val="ListBullet"/>
+        <w:spacing w:after="80"/>
+      </w:pPr>
+      <w:r>
+        <w:rPr>
+          <w:b/>
+        </w:rPr>
+        <w:t>Bei Config-Fehler:</w:t>
+      </w:r>
+      <w:r>
+        <w:rPr>
+          <w:rFonts w:ascii="Consolas" w:hAnsi="Consolas"/>
+          <w:sz w:val="20"/>
+        </w:rPr>
+        <w:t xml:space="preserve"> Basisinfos/config.yaml</w:t>
+      </w:r>
+      <w:r>
+        <w:t xml:space="preserve"> öffnen (Texteditor genügt) und auf offensichtliche Syntaxfehler prüfen (fehlende Doppelpunkte, falsche Einrückung — YAML ist einrückungsempfindlich). Am einfachsten: letzte funktionierende Version aus dem Git-Verlauf vergleichen (</w:t>
+      </w:r>
+      <w:r>
+        <w:rPr>
+          <w:rFonts w:ascii="Consolas" w:hAnsi="Consolas"/>
+          <w:sz w:val="20"/>
+        </w:rPr>
+        <w:t>git log -- Basisinfos/config.yaml</w:t>
+      </w:r>
+      <w:r>
+        <w:t>, dann entsprechendes</w:t>
+      </w:r>
+      <w:r>
+        <w:rPr>
+          <w:rFonts w:ascii="Consolas" w:hAnsi="Consolas"/>
+          <w:sz w:val="20"/>
+        </w:rPr>
+        <w:t xml:space="preserve"> git diff</w:t>
+      </w:r>
+      <w:r>
+        <w:t>).</w:t>
+      </w:r>
+    </w:p>
+    <w:p>
+      <w:pPr>
+        <w:pStyle w:val="ListBullet"/>
+        <w:spacing w:after="80"/>
+      </w:pPr>
+      <w:r>
+        <w:rPr>
+          <w:b/>
+        </w:rPr>
+        <w:t>Bei DB-Fehler:</w:t>
+      </w:r>
+      <w:r>
+        <w:t xml:space="preserve"> meist eine beschädigte/nicht lesbare </w:t>
+      </w:r>
+      <w:r>
+        <w:rPr>
+          <w:rFonts w:ascii="Consolas" w:hAnsi="Consolas"/>
+          <w:sz w:val="20"/>
+        </w:rPr>
+        <w:t>data/tradinginfotool.db</w:t>
+      </w:r>
+      <w:r>
+        <w:t xml:space="preserve">. </w:t>
+      </w:r>
+      <w:r>
+        <w:rPr>
+          <w:b/>
+        </w:rPr>
+        <w:t>Nicht selbst reparieren versuchen</w:t>
+      </w:r>
+      <w:r>
+        <w:t xml:space="preserve"> — stattdessen die Datei umbenennen (z. B. </w:t>
+      </w:r>
+      <w:r>
+        <w:rPr>
+          <w:rFonts w:ascii="Consolas" w:hAnsi="Consolas"/>
+          <w:sz w:val="20"/>
+        </w:rPr>
+        <w:t>tradinginfotool.db.defekt</w:t>
+      </w:r>
+      <w:r>
+        <w:t xml:space="preserve">) und die App erneut starten. Sie legt beim nächsten Start automatisch eine neue, leere Datenbank an (</w:t>
+      </w:r>
+      <w:r>
+        <w:rPr>
+          <w:rFonts w:ascii="Consolas" w:hAnsi="Consolas"/>
+          <w:sz w:val="20"/>
+        </w:rPr>
+        <w:t>db.init_db()</w:t>
+      </w:r>
+      <w:r>
+        <w:t>); Bestände lassen sich danach über „Datei → Bestände aus Datei importieren…“ neu einspielen (historische Signale/Kursverlauf sind dann allerdings weg — falls die alte Datei noch gebraucht wird, vor dem Umbenennen eine Kopie sichern).</w:t>
+      </w:r>
+    </w:p>
+    <w:p>
+      <w:pPr>
+        <w:pStyle w:val="ListBullet"/>
+        <w:spacing w:after="80"/>
+      </w:pPr>
+      <w:r>
+        <w:t>Nach der Korrektur: App neu starten. Kommt derselbe Dialog wieder, Logdatei prüfen (siehe Punkt 4) für den vollen Traceback.</w:t>
+      </w:r>
+    </w:p>
+    <w:p>
+      <w:pPr>
+        <w:pStyle w:val="ListNumber"/>
+        <w:spacing w:after="80"/>
+      </w:pPr>
+      <w:r>
+        <w:rPr>
+          <w:b/>
+        </w:rPr>
+        <w:t>App startet, aber ein Dialog „Erstimport fehlgeschlagen“ erscheint.</w:t>
+      </w:r>
+      <w:r>
+        <w:t xml:space="preserve"> Nur beim allerersten Start relevant (leere Datenbank). </w:t>
+      </w:r>
+      <w:r>
+        <w:rPr>
+          <w:b/>
+        </w:rPr>
+        <w:t>Nicht fatal</w:t>
+      </w:r>
+      <w:r>
+        <w:t xml:space="preserve"> — die App läuft danach normal weiter, nur ohne importierte Bestände.</w:t>
+      </w:r>
+    </w:p>
+    <w:p>
+      <w:pPr>
+        <w:pStyle w:val="ListBullet"/>
+        <w:spacing w:after="80"/>
+      </w:pPr>
+      <w:r>
+        <w:t xml:space="preserve">Meist liegt es daran, dass </w:t>
+      </w:r>
+      <w:r>
+        <w:rPr>
+          <w:rFonts w:ascii="Consolas" w:hAnsi="Consolas"/>
+          <w:sz w:val="20"/>
+        </w:rPr>
+        <w:t>Basisinfos/Assets.xlsx</w:t>
+      </w:r>
+      <w:r>
+        <w:t xml:space="preserve"> fehlt, das falsche Format hat, oder gerade in Excel geöffnet ist (Datei dann gesperrt). Excel schließen bzw. die Datei an den richtigen Ort legen.</w:t>
+      </w:r>
+    </w:p>
+    <w:p>
+      <w:pPr>
+        <w:pStyle w:val="ListBullet"/>
+        <w:spacing w:after="80"/>
+      </w:pPr>
+      <w:r>
+        <w:t>Import manuell nachholen: Menü „Datei → Bestände aus Datei importieren…“ — identischer Code wie beim automatischen Erstimport, kein Unterschied im Ergebnis.</w:t>
+      </w:r>
+    </w:p>
+    <w:p>
+      <w:pPr>
+        <w:pStyle w:val="ListNumber"/>
+        <w:spacing w:after="80"/>
+      </w:pPr>
+      <w:r>
+        <w:rPr>
+          <w:b/>
+        </w:rPr>
+        <w:t xml:space="preserve">Ein einzelner Scheduler-Job hängt (z. B. „Preise aktualisieren“ läuft seit über 10 Minuten, obwohl das normal Sekunden dauert).</w:t>
+      </w:r>
+    </w:p>
+    <w:p>
+      <w:pPr>
+        <w:spacing w:after="80"/>
+      </w:pPr>
+      <w:r>
+        <w:t>Am einfachsten über die Remote-Steuer-Seite (Abschnitt 13) zu erkennen („läuft seit X Min“) und zu beheben — funktioniert aber auch ohne Remote-Zugriff:</w:t>
+      </w:r>
+    </w:p>
+    <w:p>
+      <w:pPr>
+        <w:pStyle w:val="ListBullet"/>
+        <w:spacing w:after="80"/>
+      </w:pPr>
+      <w:r>
+        <w:rPr>
+          <w:b/>
+        </w:rPr>
+        <w:t>Mit Remote-Zugriff (Handy/Tailscale):</w:t>
+      </w:r>
+      <w:r>
+        <w:t xml:space="preserve"> Seite öffnen, „Zurücksetzen“-Button nutzen. Wichtig: das gibt nur die interne Sperre frei, ein neuer Versuch wird danach möglich — der ursprünglich hängende Vorgang im Hintergrund wird dadurch nicht zwangsläufig beendet.</w:t>
+      </w:r>
+    </w:p>
+    <w:p>
+      <w:pPr>
+        <w:pStyle w:val="ListBullet"/>
+        <w:spacing w:after="80"/>
+      </w:pPr>
+      <w:r>
+        <w:rPr>
+          <w:b/>
+        </w:rPr>
+        <w:t>Ohne Remote-Zugriff, direkt am Notebook:</w:t>
+      </w:r>
+      <w:r>
+        <w:t xml:space="preserve"> App komplett beenden (Fenster schließen oder über den Task-Manager den </w:t>
+      </w:r>
+      <w:r>
+        <w:rPr>
+          <w:rFonts w:ascii="Consolas" w:hAnsi="Consolas"/>
+          <w:sz w:val="20"/>
+        </w:rPr>
+        <w:t>python</w:t>
+      </w:r>
+      <w:r>
+        <w:t>-Prozess beenden) und neu starten. Der Scheduler baut beim Start alle Sperren neu auf — ein Neustart behebt einen hängenden Job also immer zuverlässig, auch ohne den „Zurücksetzen“-Button.</w:t>
+      </w:r>
+    </w:p>
+    <w:p>
+      <w:pPr>
+        <w:pStyle w:val="ListBullet"/>
+        <w:spacing w:after="80"/>
+      </w:pPr>
+      <w:r>
+        <w:t>Einzelne Jobs schlagen normalerweise nicht dauerhaft fehl, sondern laufen im nächsten Takt automatisch wieder an (siehe „Scheduler-Jobs“ unten) — ein manueller Eingriff ist nur bei einem echten Hänger nötig, nicht bei einem einzelnen fehlgeschlagenen Lauf.</w:t>
+      </w:r>
+    </w:p>
+    <w:p>
+      <w:pPr>
+        <w:pStyle w:val="ListNumber"/>
+        <w:spacing w:after="80"/>
+      </w:pPr>
+      <w:r>
+        <w:rPr>
+          <w:b/>
+        </w:rPr>
+        <w:t>Logdatei finden und lesen.</w:t>
+      </w:r>
+      <w:r>
+        <w:t xml:space="preserve"> Weg für alle Fälle, die keinen sichtbaren Dialog auslösen (z. B. ein fehlgeschlagener einzelner Scheduler-Job).</w:t>
+      </w:r>
+    </w:p>
+    <w:p>
+      <w:pPr>
+        <w:pStyle w:val="ListBullet"/>
+        <w:spacing w:after="80"/>
+      </w:pPr>
+      <w:r>
+        <w:t xml:space="preserve">Pfad: </w:t>
+      </w:r>
+      <w:r>
+        <w:rPr>
+          <w:rFonts w:ascii="Consolas" w:hAnsi="Consolas"/>
+          <w:sz w:val="20"/>
+        </w:rPr>
+        <w:t>data/tradinginfotool.log</w:t>
+      </w:r>
+      <w:r>
+        <w:t xml:space="preserve"> im Installationsordner (rotierend, max. 3 × 5 MB — bei Bedarf existieren </w:t>
+      </w:r>
+      <w:r>
+        <w:rPr>
+          <w:rFonts w:ascii="Consolas" w:hAnsi="Consolas"/>
+          <w:sz w:val="20"/>
+        </w:rPr>
+        <w:t>tradinginfotool.log.1</w:t>
+      </w:r>
+      <w:r>
+        <w:t xml:space="preserve">, </w:t>
+      </w:r>
+      <w:r>
+        <w:rPr>
+          <w:rFonts w:ascii="Consolas" w:hAnsi="Consolas"/>
+          <w:sz w:val="20"/>
+        </w:rPr>
+        <w:t>.2</w:t>
+      </w:r>
+      <w:r>
+        <w:t xml:space="preserve">, </w:t>
+      </w:r>
+      <w:r>
+        <w:rPr>
+          <w:rFonts w:ascii="Consolas" w:hAnsi="Consolas"/>
+          <w:sz w:val="20"/>
+        </w:rPr>
+        <w:t>.3</w:t>
+      </w:r>
+      <w:r>
+        <w:t xml:space="preserve"> mit älteren Einträgen).</w:t>
+      </w:r>
+    </w:p>
+    <w:p>
+      <w:pPr>
+        <w:pStyle w:val="ListBullet"/>
+        <w:spacing w:after="80"/>
+      </w:pPr>
+      <w:r>
+        <w:t xml:space="preserve">Mit einem normalen Texteditor öffnen (Editor, Notepad++, VS Code). Suche nach </w:t>
+      </w:r>
+      <w:r>
+        <w:rPr>
+          <w:rFonts w:ascii="Consolas" w:hAnsi="Consolas"/>
+          <w:sz w:val="20"/>
+        </w:rPr>
+        <w:t>ERROR</w:t>
+      </w:r>
+      <w:r>
+        <w:t xml:space="preserve"> oder </w:t>
+      </w:r>
+      <w:r>
+        <w:rPr>
+          <w:rFonts w:ascii="Consolas" w:hAnsi="Consolas"/>
+          <w:sz w:val="20"/>
+        </w:rPr>
+        <w:t>Traceback</w:t>
+      </w:r>
+      <w:r>
+        <w:t>, um Fehler schnell zu finden — jede Zeile hat Zeitstempel + Modulname, um sie zeitlich einzuordnen.</w:t>
+      </w:r>
+    </w:p>
+    <w:p>
+      <w:pPr>
+        <w:pStyle w:val="ListBullet"/>
+        <w:spacing w:after="80"/>
+      </w:pPr>
+      <w:r>
+        <w:t>Seit 2026-07-11 zeigt die Remote-Steuer-Seite (Abschnitt 13) zusätzlich die letzten Fehlerzeilen direkt an, ohne die Datei selbst öffnen zu müssen.</w:t>
+      </w:r>
+    </w:p>
+    <w:p>
+      <w:pPr>
+        <w:pStyle w:val="ListNumber"/>
+        <w:spacing w:after="160"/>
+      </w:pPr>
+      <w:r>
+        <w:rPr>
+          <w:b/>
+        </w:rPr>
+        <w:t>App war lange offline (Notebook aus, Update, Reise) — was beim nächsten Start zu erwarten ist.</w:t>
+      </w:r>
+      <w:r>
+        <w:t xml:space="preserve"> Siehe die eigene Auswertung dazu direkt im Anschluss („Verhalten nach längerer Downtime“).</w:t>
+      </w:r>
+    </w:p>
+    <w:p>
+      <w:pPr>
+        <w:pStyle w:val="Heading2"/>
+      </w:pPr>
+      <w:r>
+        <w:t>Verhalten nach längerer Downtime (2026-07-12, Nutzer-Frage, geprüft)</w:t>
+      </w:r>
+    </w:p>
+    <w:p>
+      <w:pPr>
+        <w:spacing w:after="80"/>
+      </w:pPr>
+      <w:r>
+        <w:rPr>
+          <w:b/>
+        </w:rPr>
+        <w:t>Frage:</w:t>
+      </w:r>
+      <w:r>
+        <w:t xml:space="preserve"> Funktioniert/aktualisiert sich die App beim nächsten Start korrekt, wenn sie längere Zeit nicht gelaufen ist?</w:t>
+      </w:r>
+    </w:p>
+    <w:p>
+      <w:pPr>
+        <w:spacing w:after="160"/>
+      </w:pPr>
+      <w:r>
+        <w:rPr>
+          <w:b/>
+        </w:rPr>
+        <w:t>Kurz:</w:t>
+      </w:r>
+      <w:r>
+        <w:t xml:space="preserve"> Ja — inklusive der Kurs-/OHLC-Historie, seit dem staleness-bewussten Sofort-Trigger (siehe unten, ebenfalls 2026-07-12 umgesetzt).</w:t>
+      </w:r>
+    </w:p>
+    <w:p>
+      <w:pPr>
+        <w:spacing w:after="160"/>
+      </w:pPr>
+      <w:r>
+        <w:t xml:space="preserve">Kein Job „merkt sich“ eine verpasste Downtime im Sinne eines Nachhol-Zählers — APScheduler nutzt einen reinen In-Memory-Job-Store, der beim Neustart verworfen wird. Jeder Job verhält sich beim nächsten Start so, als wäre er neu:</w:t>
+      </w:r>
+    </w:p>
+    <w:tbl>
+      <w:tblPr>
+        <w:tblStyle w:val="TableGrid"/>
+        <w:tblW w:type="auto" w:w="0"/>
+        <w:jc w:val="center"/>
+        <w:tblLayout w:type="autofit"/>
+        <w:tblLook w:firstColumn="1" w:firstRow="1" w:lastColumn="0" w:lastRow="0" w:noHBand="0" w:noVBand="1" w:val="04A0"/>
+      </w:tblPr>
+      <w:tblGrid>
+        <w:gridCol w:w="3600"/>
+        <w:gridCol w:w="6147"/>
+      </w:tblGrid>
+      <w:tr>
+        <w:tc>
+          <w:tcPr>
+            <w:tcW w:type="dxa" w:w="3600"/>
+            <w:shd w:val="clear" w:color="auto" w:fill="1F3A5F"/>
+          </w:tcPr>
+          <w:p>
+            <w:r>
+              <w:rPr>
+                <w:b/>
+                <w:color w:val="FFFFFF"/>
+              </w:rPr>
+              <w:t>Job</w:t>
+            </w:r>
+          </w:p>
+        </w:tc>
+        <w:tc>
+          <w:tcPr>
+            <w:tcW w:type="dxa" w:w="6147"/>
+            <w:shd w:val="clear" w:color="auto" w:fill="1F3A5F"/>
+          </w:tcPr>
+          <w:p>
+            <w:r>
+              <w:rPr>
+                <w:b/>
+                <w:color w:val="FFFFFF"/>
+              </w:rPr>
+              <w:t>Verhalten beim nächsten Start, unabhängig von der Downtime-Dauer</w:t>
+            </w:r>
+          </w:p>
+        </w:tc>
+      </w:tr>
+      <w:tr>
+        <w:tc>
+          <w:tcPr>
+            <w:tcW w:type="dxa" w:w="3600"/>
+          </w:tcPr>
+          <w:p>
+            <w:r>
+              <w:t>Kryptopreise, Aktien/ETF/Rohstoff-Preise</w:t>
+            </w:r>
+          </w:p>
+        </w:tc>
+        <w:tc>
+          <w:tcPr>
+            <w:tcW w:type="dxa" w:w="6147"/>
+          </w:tcPr>
+          <w:p>
+            <w:r>
+              <w:rPr>
+                <w:b/>
+              </w:rPr>
+              <w:t>Behoben (2026-07-12):</w:t>
+            </w:r>
+            <w:r>
+              <w:t xml:space="preserve"> sofortiger erster Lauf direkt nach dem Start (</w:t>
+            </w:r>
+            <w:r>
+              <w:rPr>
+                <w:rFonts w:ascii="Consolas" w:hAnsi="Consolas"/>
+                <w:sz w:val="20"/>
+              </w:rPr>
+              <w:t>next_run_time=jetzt</w:t>
+            </w:r>
+            <w:r>
+              <w:t>), kein Warten mehr auf ein volles Intervall</w:t>
+            </w:r>
+          </w:p>
+        </w:tc>
+      </w:tr>
+      <w:tr>
+        <w:tc>
+          <w:tcPr>
+            <w:tcW w:type="dxa" w:w="3600"/>
+          </w:tcPr>
+          <w:p>
+            <w:r>
+              <w:t>Bitpanda-Cash-Sync</w:t>
+            </w:r>
+          </w:p>
+        </w:tc>
+        <w:tc>
+          <w:tcPr>
+            <w:tcW w:type="dxa" w:w="6147"/>
+          </w:tcPr>
+          <w:p>
+            <w:r>
+              <w:t>War bereits seit 2026-07-11 sofort (next_run_time=jetzt)</w:t>
+            </w:r>
+          </w:p>
+        </w:tc>
+      </w:tr>
+      <w:tr>
+        <w:tc>
+          <w:tcPr>
+            <w:tcW w:type="dxa" w:w="3600"/>
+          </w:tcPr>
+          <w:p>
+            <w:r>
+              <w:t>Kurs-/OHLC-Historie (für Indikatoren wie EMA-200)</w:t>
+            </w:r>
+          </w:p>
+        </w:tc>
+        <w:tc>
+          <w:tcPr>
+            <w:tcW w:type="dxa" w:w="6147"/>
+          </w:tcPr>
+          <w:p>
+            <w:r>
+              <w:rPr>
+                <w:b/>
+              </w:rPr>
+              <w:t>Behoben (2026-07-12), staleness-bewusst:</w:t>
+            </w:r>
+            <w:r>
+              <w:t xml:space="preserve"> kein bedingungsloser Sofort-Lauf bei jedem Neustart, sondern nur, wenn die Daten tatsächlich veraltet sind (</w:t>
+            </w:r>
+            <w:r>
+              <w:rPr>
+                <w:rFonts w:ascii="Consolas" w:hAnsi="Consolas"/>
+                <w:sz w:val="20"/>
+              </w:rPr>
+              <w:t>_history_data_is_stale()</w:t>
+            </w:r>
+            <w:r>
+              <w:t>/</w:t>
+            </w:r>
+            <w:r>
+              <w:rPr>
+                <w:rFonts w:ascii="Consolas" w:hAnsi="Consolas"/>
+                <w:sz w:val="20"/>
+              </w:rPr>
+              <w:t>_ohlc_data_is_stale()</w:t>
+            </w:r>
+            <w:r>
+              <w:t xml:space="preserve">, </w:t>
+            </w:r>
+            <w:r>
+              <w:rPr>
+                <w:rFonts w:ascii="Consolas" w:hAnsi="Consolas"/>
+                <w:sz w:val="20"/>
+              </w:rPr>
+              <w:t>scheduler/background.py</w:t>
+            </w:r>
+            <w:r>
+              <w:t xml:space="preserve">) — prüft beim Scheduler-Aufbau je Asset das letzte Datum gegen </w:t>
+            </w:r>
+            <w:r>
+              <w:rPr>
+                <w:rFonts w:ascii="Consolas" w:hAnsi="Consolas"/>
+                <w:sz w:val="20"/>
+              </w:rPr>
+              <w:t>HISTORY_STALE_THRESHOLD_DAYS</w:t>
+            </w:r>
+            <w:r>
+              <w:t xml:space="preserve"> (2 Tage). War die App z. B. eine Woche offline, läuft der Refresh sofort; nach einem kurzen Neustart (Daten noch frisch) wartet er wie gehabt bis zum nächsten 24-Std.-Takt</w:t>
+            </w:r>
+          </w:p>
+        </w:tc>
+      </w:tr>
+      <w:tr>
+        <w:tc>
+          <w:tcPr>
+            <w:tcW w:type="dxa" w:w="3600"/>
+          </w:tcPr>
+          <w:p>
+            <w:r>
+              <w:t>Marktscan, Backward-Tracking</w:t>
+            </w:r>
+          </w:p>
+        </w:tc>
+        <w:tc>
+          <w:tcPr>
+            <w:tcW w:type="dxa" w:w="6147"/>
+          </w:tcPr>
+          <w:p>
+            <w:r>
+              <w:t>Feste Cron-Uhrzeiten (04:00/16:00 bzw. 06:00) — kein Nachhol-Mechanismus nötig, der nächste reguläre Termin reicht, kein API-Kontingent-Risiko</w:t>
+            </w:r>
+          </w:p>
+        </w:tc>
+      </w:tr>
+    </w:tbl>
+    <w:p>
+      <w:pPr>
+        <w:spacing w:before="160" w:after="160"/>
+      </w:pPr>
+      <w:r>
+        <w:rPr>
+          <w:b/>
+        </w:rPr>
+        <w:t>Warum kein bedingungsloses „sofort“ wie bei den Preisen:</w:t>
+      </w:r>
+      <w:r>
+        <w:t xml:space="preserve"> anders als der günstige Einzel-Preisabruf wäre ein bedingungsloser sofortiger Historie-/OHLC-Lauf bei jedem Neustart (auch nach einem kurzen Absturz oder einem gewollten Neustart nach 5 Minuten) ein vollständiger Asset-Refresh — unnötiger Verbrauch von CoinGecko-/Kraken-API-Kontingent ohne echten Nutzen. Der staleness-bewusste Trigger löst das: er prüft vor dem Scheduler-Start je Asset (mit CoinGecko-ID bzw. Kraken-Listing) das letzte gespeicherte Datum und löst nur dann sofort aus, wenn mindestens ein Asset tatsächlich veraltet ist — schlägt der Check selbst fehl (z. B. DB-Problem), ist der sichere Default kein Sofort-Lauf (P-10). Live gegen drei Szenarien verifiziert (frische Daten, 5 Tage alte Daten, leere Datenbank) — dabei auch eine Falle in APScheduler selbst gefunden: </w:t>
+      </w:r>
+      <w:r>
+        <w:rPr>
+          <w:rFonts w:ascii="Consolas" w:hAnsi="Consolas"/>
+          <w:sz w:val="20"/>
+        </w:rPr>
+        <w:t>next_run_time=None</w:t>
+      </w:r>
+      <w:r>
+        <w:t xml:space="preserve"> bedeutet NICHT "normal aus dem Trigger berechnen", sondern legt den Job dauerhaft ohne nächsten Lauf an (er würde nie mehr laufen) — das kwarg muss bei "nicht veraltet" deshalb komplett weggelassen werden, nicht auf </w:t>
+      </w:r>
+      <w:r>
+        <w:rPr>
+          <w:rFonts w:ascii="Consolas" w:hAnsi="Consolas"/>
+          <w:sz w:val="20"/>
+        </w:rPr>
+        <w:t>None</w:t>
+      </w:r>
+      <w:r>
+        <w:t xml:space="preserve"> gesetzt werden.</w:t>
+      </w:r>
+    </w:p>
+    <w:p>
+      <w:pPr>
+        <w:spacing w:after="160"/>
+      </w:pPr>
+      <w:r>
+        <w:rPr>
+          <w:b/>
+        </w:rPr>
+        <w:t>In der Zwischenzeit erkennbar:</w:t>
+      </w:r>
+      <w:r>
+        <w:t xml:space="preserve"> die Watchlist/Portfolio-Ansicht markiert veraltete Preise/Historie ohnehin farblich (⚠, siehe „Wie du aktuell von einem Problem erfährst“ unten) — die Staleness-Anzeige selbst funktioniert nach jeder Downtime-Länge korrekt, sie zeigt nur an, dass es bis zu 24 Std. dauern kann, bis die Warnung von selbst verschwindet.</w:t>
+      </w:r>
+    </w:p>
+    <w:p>
+      <w:pPr>
+        <w:spacing w:after="160"/>
+      </w:pPr>
+      <w:r>
+        <w:t xml:space="preserve">Ein einmaliger Ersteinrichtungs-Sonderfall bleibt unverändert bestehen: die Kurs-/OHLC-</w:t>
+      </w:r>
+      <w:r>
+        <w:rPr>
+          <w:b/>
+        </w:rPr>
+        <w:t>Erstbefüllung</w:t>
+      </w:r>
+      <w:r>
+        <w:t xml:space="preserve"> (</w:t>
+      </w:r>
+      <w:r>
+        <w:rPr>
+          <w:rFonts w:ascii="Consolas" w:hAnsi="Consolas"/>
+          <w:sz w:val="20"/>
+        </w:rPr>
+        <w:t>is_history_first_run()</w:t>
+      </w:r>
+      <w:r>
+        <w:t>/</w:t>
+      </w:r>
+      <w:r>
+        <w:rPr>
+          <w:rFonts w:ascii="Consolas" w:hAnsi="Consolas"/>
+          <w:sz w:val="20"/>
+        </w:rPr>
+        <w:t>is_ohlc_first_run()</w:t>
+      </w:r>
+      <w:r>
+        <w:t>) läuft nur exakt einmal im Leben der Datenbank, unabhängig von jeder späteren Downtime — das ist beabsichtigt (danach übernehmen die 24-Std.-Jobs), betrifft also nicht das oben beschriebene Downtime-Verhalten.</w:t>
       </w:r>
     </w:p>
     <w:p>
@@ -5658,7 +6416,16 @@
         <w:t>EVENT_JOB_MISSED</w:t>
       </w:r>
       <w:r>
-        <w:t>) als zweite Verteidigungslinie, falls doch etwas bis zum Scheduler selbst durchschlägt. Seit 2026-07-11 zusätzlich: die vier wichtigsten Jobs (Preise/Wertpapier-Preise/Marktscan/Fiat-Cash) haben eine eigene Sperre gegen doppelte gleichzeitige Läufe, geteilt mit der Remote-Steuer-Seite (Abschnitt 13).</w:t>
+        <w:t xml:space="preserve">) als zweite Verteidigungslinie, falls doch etwas bis zum Scheduler selbst durchschlägt. Seit 2026-07-11 zusätzlich: die vier wichtigsten Jobs (Preise/Wertpapier-Preise/Marktscan/Fiat-Cash) haben eine eigene Sperre gegen doppelte gleichzeitige Läufe, geteilt mit der Remote-Steuer-Seite (Abschnitt 13). </w:t>
+      </w:r>
+      <w:r>
+        <w:rPr>
+          <w:b/>
+        </w:rPr>
+        <w:t>Was weiterhin fehlt:</w:t>
+      </w:r>
+      <w:r>
+        <w:t xml:space="preserve"> jeglicher Backoff oder Alarm bei einem dauerhaften Ausfall (z. B. API drei Tage down) — die App versucht stur im gleichen Takt weiter, ohne dich aktiv zu warnen.</w:t>
       </w:r>
     </w:p>
     <w:p>
@@ -5843,16 +6610,16 @@
         <w:spacing w:after="160"/>
       </w:pPr>
       <w:r>
-        <w:t xml:space="preserve">Am wertvollsten für den geplanten 24/7-Betrieb wäre, die drei ungeschützten Start-Schritte oben abzusichern (Try/Except + garantierter Logeintrag, im schlimmsten Fall ein sichtbarer Fehlerdialog statt eines stillen Absturzes) — kleiner, klar abgegrenzter Fix mit hohem Nutzen, noch </w:t>
+        <w:t xml:space="preserve">Die drei ungeschützten Start-Schritte sind seit 2026-07-12 abgesichert (siehe oben), ebenso der sofortige erste Preis-Lauf und der staleness-bewusste Sofort-Trigger für die Kurs-/OHLC-Historie-Jobs nach jedem Neustart (siehe „Verhalten nach längerer Downtime“). </w:t>
       </w:r>
       <w:r>
         <w:rPr>
           <w:b/>
         </w:rPr>
-        <w:t>nicht</w:t>
-      </w:r>
-      <w:r>
-        <w:t xml:space="preserve"> umgesetzt. E-Mail-Benachrichtigung bleibt ebenfalls offen (SMTP-Konto-Entscheidung nötig). Die aggregierte Status-Übersicht selbst ist inzwischen Teil der Remote-Steuer-Seite geworden (Abschnitt 13).</w:t>
+        <w:t>Weiterhin offen:</w:t>
+      </w:r>
+      <w:r>
+        <w:t xml:space="preserve"> E-Mail-Benachrichtigung (SMTP-Konto-Entscheidung nötig, U-8) und ein Backoff/Alarm bei dauerhaftem Scheduler-Job-Ausfall (siehe „Scheduler-Jobs“ oben). Die aggregierte Status-Übersicht selbst ist inzwischen Teil der Remote-Steuer-Seite geworden (Abschnitt 13).</w:t>
       </w:r>
     </w:p>
     <w:p>
@@ -6930,6 +7697,21 @@
       </w:r>
       <w:r>
         <w:t xml:space="preserve"> die AZ-4-Tranchen-Bedingungen (Regime baer/krise_extrem/seitwaerts, nur BTC/ETH) sind eine erste, bewusst enge Setzung, keine tiefe Herleitung — bei Bedarf später erweiterbar (z. B. weitere Assets, andere Regime-Kombinationen).</w:t>
+      </w:r>
+    </w:p>
+    <w:p>
+      <w:pPr>
+        <w:pStyle w:val="ListBullet"/>
+        <w:spacing w:after="80"/>
+      </w:pPr>
+      <w:r>
+        <w:rPr>
+          <w:b/>
+        </w:rPr>
+        <w:t>ERLEDIGT, war hier gelistet (2026-07-12):</w:t>
+      </w:r>
+      <w:r>
+        <w:t xml:space="preserve"> die 3 ungeschützten Start-Schritte (config.yaml/DB/Erstimport) sind jetzt abgesichert (Kap. 12) — E-Mail-Benachrichtigung (U-8) und Backoff/Alarm bei dauerhaftem Job-Ausfall bleiben weiterhin offen.</w:t>
       </w:r>
     </w:p>
     <w:sectPr>

</xml_diff>

<commit_message>
Add Boden-Zielzone for BTC/ETH with equities bear-market overlay (AZ-4 Baustein 2)
Projects the historical cycle-bottom deviation band from each asset's log-
regression trendline onto the current line, with a maturity dampener
(diminishing returns) and an S&P 500/Nasdaq bear-market overlay that deepens
the lower edge during shared liquidity stress. ETH reuses BTC's regression
math via a new yfinance-backed history source, since no BTC-equivalent full
history exists for ETH; its zone is flagged low-confidence (only 2 usable
cycle bottoms vs. BTC's 3). Info-only, like the AZ-4 tranches from Baustein 1
- feeds Groq as context and the Signale tab, no new veto or position sizing
effect. New network calls (ETH + equities history) are cached at most once
per day via macro_snapshot to avoid hammering yfinance on every signal click
or scheduler run.
</commit_message>
<xml_diff>
--- a/Basisinfos/Regelwerksmanual.docx
+++ b/Basisinfos/Regelwerksmanual.docx
@@ -2351,6 +2351,296 @@
     </w:p>
     <w:p>
       <w:pPr>
+        <w:pStyle w:val="Heading2"/>
+      </w:pPr>
+      <w:r>
+        <w:t>AZ-4 Baustein 2: Boden-Zielzone für BTC/ETH (2026-07-12)</w:t>
+      </w:r>
+    </w:p>
+    <w:p>
+      <w:pPr>
+        <w:spacing w:after="160"/>
+      </w:pPr>
+      <w:r>
+        <w:t xml:space="preserve">Zweite Bausteinstufe der Bärenmarkt-Akkumulations-Roadmap (Baustein 1 = AZ-4-Tranchen oben, Baustein 3 = Cash-Reserve-Ziel, noch offen). Liefert eine </w:t>
+      </w:r>
+      <w:r>
+        <w:rPr>
+          <w:b/>
+        </w:rPr>
+        <w:t>Wahrscheinlichkeits-Zone</w:t>
+      </w:r>
+      <w:r>
+        <w:t xml:space="preserve"> (kein hartes Kursziel), wo ein Zyklus-Tief für BTC bzw. ETH realistisch liegen könnte — als zusätzlicher Kontext für den Nutzer UND als Groq-Fakt (fließt in die Begründung/den Tranchen-Vorschlag ein, ohne selbst ein Veto oder eine Regel durchzusetzen).</w:t>
+      </w:r>
+    </w:p>
+    <w:p>
+      <w:pPr>
+        <w:spacing w:after="80"/>
+      </w:pPr>
+      <w:r>
+        <w:rPr>
+          <w:b/>
+        </w:rPr>
+        <w:t>Methodik:</w:t>
+      </w:r>
+      <w:r>
+        <w:t xml:space="preserve"> eine einfache Log-Log-lineare Regression über die gesamte verfügbare Preishistorie (dasselbe bestehende Modell wie beim BTC-Zyklus-Risiko, Kap. 5) liefert eine Trendlinie. Das historische Abweichungs-Band vergangener echter Zyklus-Tiefs (live nachgerechnet, 2026-07-12, ohne Lookahead) wird auf die aktuelle Trendlinie projiziert:</w:t>
+      </w:r>
+    </w:p>
+    <w:p>
+      <w:pPr>
+        <w:pStyle w:val="ListBullet"/>
+        <w:spacing w:after="80"/>
+      </w:pPr>
+      <w:r>
+        <w:rPr>
+          <w:b/>
+        </w:rPr>
+        <w:t>BTC</w:t>
+      </w:r>
+      <w:r>
+        <w:t xml:space="preserve"> (Datenquelle: blockchain.com, seit 2009): −1,16 / −0,78 / −1,26 Standardabweichungen an den Tiefs vom 2015-01-14 / 2018-12-15 / 2022-11-21.</w:t>
+      </w:r>
+    </w:p>
+    <w:p>
+      <w:pPr>
+        <w:pStyle w:val="ListBullet"/>
+        <w:spacing w:after="80"/>
+      </w:pPr>
+      <w:r>
+        <w:rPr>
+          <w:b/>
+        </w:rPr>
+        <w:t>ETH</w:t>
+      </w:r>
+      <w:r>
+        <w:t xml:space="preserve"> (Datenquelle: yfinance </w:t>
+      </w:r>
+      <w:r>
+        <w:rPr>
+          <w:rFonts w:ascii="Consolas" w:hAnsi="Consolas"/>
+          <w:sz w:val="20"/>
+        </w:rPr>
+        <w:t>ETH-USD</w:t>
+      </w:r>
+      <w:r>
+        <w:t xml:space="preserve">, seit 2017-11 — kein BTC-Äquivalent verfügbar: CoinGecko-Free-Tier auf 365 Tage limitiert, Kraken nur ~720 Tage): −2,04 / −0,41 Standardabweichungen an den Tiefs vom 2018-12-15 / 2022-11-21. </w:t>
+      </w:r>
+      <w:r>
+        <w:rPr>
+          <w:b/>
+        </w:rPr>
+        <w:t>Nur 2 Vergleichspunkte, weit gestreut — deutlich unsichere Datengrundlage.</w:t>
+      </w:r>
+      <w:r>
+        <w:t xml:space="preserve"> Jede Anzeige/jeder Groq-Fakt zur ETH-Zone trägt deshalb einen sichtbaren Niedrig-Konfidenz-Hinweis.</w:t>
+      </w:r>
+    </w:p>
+    <w:p>
+      <w:pPr>
+        <w:pStyle w:val="ListBullet"/>
+        <w:spacing w:after="160"/>
+      </w:pPr>
+      <w:r>
+        <w:t>2020-03-13 (COVID-Crash) bewusst aus beiden Bändern ausgeschlossen — ein Liquiditätsschock, kein echtes mehrjähriges Zyklus-Tief.</w:t>
+      </w:r>
+    </w:p>
+    <w:p>
+      <w:pPr>
+        <w:spacing w:after="80"/>
+      </w:pPr>
+      <w:r>
+        <w:rPr>
+          <w:b/>
+        </w:rPr>
+        <w:t>Zwei Korrektur-Komponenten</w:t>
+      </w:r>
+      <w:r>
+        <w:t xml:space="preserve"> (</w:t>
+      </w:r>
+      <w:r>
+        <w:rPr>
+          <w:rFonts w:ascii="Consolas" w:hAnsi="Consolas"/>
+          <w:sz w:val="20"/>
+        </w:rPr>
+        <w:t>config.yaml boden_zielzone:</w:t>
+      </w:r>
+      <w:r>
+        <w:t>, beide bewusst transparent getrennt statt zu einem Faktor verschmolzen):</w:t>
+      </w:r>
+    </w:p>
+    <w:p>
+      <w:pPr>
+        <w:pStyle w:val="ListNumber"/>
+        <w:spacing w:after="80"/>
+      </w:pPr>
+      <w:r>
+        <w:rPr>
+          <w:b/>
+        </w:rPr>
+        <w:t>Reifegrad-Dämpfer</w:t>
+      </w:r>
+      <w:r>
+        <w:t xml:space="preserve"> (</w:t>
+      </w:r>
+      <w:r>
+        <w:rPr>
+          <w:rFonts w:ascii="Consolas" w:hAnsi="Consolas"/>
+          <w:sz w:val="20"/>
+        </w:rPr>
+        <w:t>reifegrad_daempfer_staerke</w:t>
+      </w:r>
+      <w:r>
+        <w:t>, Start 0,15): zieht beide Bandkanten Richtung Trendlinie — mit wachsender Marktkapitalisierung werden Korrekturen historisch tendenziell milder, ein starres Band aus früheren, kleineren Zyklen wäre sonst zu tief angesetzt.</w:t>
+      </w:r>
+    </w:p>
+    <w:p>
+      <w:pPr>
+        <w:pStyle w:val="ListNumber"/>
+        <w:spacing w:after="160"/>
+      </w:pPr>
+      <w:r>
+        <w:rPr>
+          <w:b/>
+        </w:rPr>
+        <w:t>Aktien-Bärenmarkt-Overlay</w:t>
+      </w:r>
+      <w:r>
+        <w:t xml:space="preserve"> (Nutzer-Punkt: gemeinsamer Liquiditätsentzug kann BTC/ETH zusätzlich tiefer drücken): sind S&amp;P 500 </w:t>
+      </w:r>
+      <w:r>
+        <w:rPr>
+          <w:b/>
+        </w:rPr>
+        <w:t>oder</w:t>
+      </w:r>
+      <w:r>
+        <w:t xml:space="preserve"> Nasdaq (</w:t>
+      </w:r>
+      <w:r>
+        <w:rPr>
+          <w:rFonts w:ascii="Consolas" w:hAnsi="Consolas"/>
+          <w:sz w:val="20"/>
+        </w:rPr>
+        <w:t>equities_baermarkt_verknuepfung: entweder</w:t>
+      </w:r>
+      <w:r>
+        <w:t xml:space="preserve">, feste Nutzer-Entscheidung) mehr als </w:t>
+      </w:r>
+      <w:r>
+        <w:rPr>
+          <w:rFonts w:ascii="Consolas" w:hAnsi="Consolas"/>
+          <w:sz w:val="20"/>
+        </w:rPr>
+        <w:t>equities_baermarkt_schwelle_prozent</w:t>
+      </w:r>
+      <w:r>
+        <w:t xml:space="preserve"> (Start 20 %) vom </w:t>
+      </w:r>
+      <w:r>
+        <w:rPr>
+          <w:rFonts w:ascii="Consolas" w:hAnsi="Consolas"/>
+          <w:sz w:val="20"/>
+        </w:rPr>
+        <w:t>equities_baermarkt_lookback_jahre</w:t>
+      </w:r>
+      <w:r>
+        <w:t xml:space="preserve">-Hoch (Start 5 Jahre) entfernt, wird die untere Bandkante um </w:t>
+      </w:r>
+      <w:r>
+        <w:rPr>
+          <w:rFonts w:ascii="Consolas" w:hAnsi="Consolas"/>
+          <w:sz w:val="20"/>
+        </w:rPr>
+        <w:t>equities_overlay_shift_std</w:t>
+      </w:r>
+      <w:r>
+        <w:t xml:space="preserve"> (Start 0,2) zusätzlich vertieft. Wirkt dem Reifegrad-Dämpfer entgegen, bewusst getrennt sichtbar.</w:t>
+      </w:r>
+    </w:p>
+    <w:p>
+      <w:pPr>
+        <w:spacing w:after="160"/>
+      </w:pPr>
+      <w:r>
+        <w:rPr>
+          <w:b/>
+        </w:rPr>
+        <w:t>Live-Beispiel (2026-07-12, echte Daten):</w:t>
+      </w:r>
+      <w:r>
+        <w:t xml:space="preserve"> BTC-Zone 63.029–83.601 $, ETH-Zone 986–2.729 $ (mit Niedrig-Konfidenz-Hinweis), Aktien-Bärenmarkt aktuell nicht aktiv (S&amp;P −0,5 %, Nasdaq −3,0 % vom Hoch — beide unter der 20-%-Schwelle).</w:t>
+      </w:r>
+    </w:p>
+    <w:p>
+      <w:pPr>
+        <w:spacing w:after="160"/>
+      </w:pPr>
+      <w:r>
+        <w:rPr>
+          <w:b/>
+        </w:rPr>
+        <w:t>Persistenz:</w:t>
+      </w:r>
+      <w:r>
+        <w:t xml:space="preserve"> täglicher Snapshot in </w:t>
+      </w:r>
+      <w:r>
+        <w:rPr>
+          <w:rFonts w:ascii="Consolas" w:hAnsi="Consolas"/>
+          <w:sz w:val="20"/>
+        </w:rPr>
+        <w:t>macro_snapshot</w:t>
+      </w:r>
+      <w:r>
+        <w:t xml:space="preserve"> (dieselbe Tabelle wie BTC-Dominanz/Fear&amp;Greed/FRED — day-keyed, signal-unabhängig), damit die Verschiebung der Zone über Zeit nachvollziehbar bleibt. ETH- und Aktien-Index-Daten werden dabei </w:t>
+      </w:r>
+      <w:r>
+        <w:rPr>
+          <w:b/>
+        </w:rPr>
+        <w:t>höchstens 1×/Tag</w:t>
+      </w:r>
+      <w:r>
+        <w:t xml:space="preserve"> live abgerufen (Tages-Cache) — jeder manuelle "Signal berechnen"-Klick und jeder der beiden täglichen Marktscan-Läufe würde sonst zusätzliche Netzwerk-Calls auslösen. Die eigentliche Zonen-Berechnung läuft trotzdem bei jedem Aufruf frisch (reine Arithmetik, kein Netzwerk), damit eine config.yaml-Änderung sofort greift. BTC selbst bleibt wie das bestehende Zyklus-Risiko </w:t>
+      </w:r>
+      <w:r>
+        <w:rPr>
+          <w:b/>
+        </w:rPr>
+        <w:t>immer</w:t>
+      </w:r>
+      <w:r>
+        <w:t xml:space="preserve"> frisch berechnet (kein Cache nötig, kein zusätzlicher Netzwerk-Call gegenüber vorher).</w:t>
+      </w:r>
+    </w:p>
+    <w:p>
+      <w:pPr>
+        <w:spacing w:after="160"/>
+      </w:pPr>
+      <w:r>
+        <w:rPr>
+          <w:b/>
+        </w:rPr>
+        <w:t>Bewusst reine Zusatz-Information</w:t>
+      </w:r>
+      <w:r>
+        <w:t xml:space="preserve">, wie die AZ-4-Tranchen oben: kein neues Veto, keine Positionsgrößen-Beeinflussung, kein Automatismus. Bei einem Fetch-Fehlschlag (ETH-Historie oder Aktien-Indizes nicht erreichbar) degradiert nur der jeweilige Fakt auf </w:t>
+      </w:r>
+      <w:r>
+        <w:rPr>
+          <w:rFonts w:ascii="Consolas" w:hAnsi="Consolas"/>
+          <w:sz w:val="20"/>
+        </w:rPr>
+        <w:t>None</w:t>
+      </w:r>
+      <w:r>
+        <w:t>/nicht angezeigt (P-10) — die restliche Signal-Pipeline läuft unbeeinträchtigt weiter.</w:t>
+      </w:r>
+    </w:p>
+    <w:p>
+      <w:pPr>
         <w:pBdr>
           <w:bottom w:val="single" w:sz="6" w:space="1" w:color="BFBFBF"/>
         </w:pBdr>
@@ -5214,6 +5504,52 @@
           <w:rFonts w:ascii="Consolas" w:hAnsi="Consolas"/>
           <w:sz w:val="20"/>
         </w:rPr>
+        <w:t>indicators/calculations.py::compute_btc_log_regression_risk()</w:t>
+      </w:r>
+      <w:r>
+        <w:t>/</w:t>
+      </w:r>
+      <w:r>
+        <w:rPr>
+          <w:rFonts w:ascii="Consolas" w:hAnsi="Consolas"/>
+          <w:sz w:val="20"/>
+        </w:rPr>
+        <w:t>compute_eth_log_regression_risk()</w:t>
+      </w:r>
+      <w:r>
+        <w:t xml:space="preserve">, </w:t>
+      </w:r>
+      <w:r>
+        <w:rPr>
+          <w:rFonts w:ascii="Consolas" w:hAnsi="Consolas"/>
+          <w:sz w:val="20"/>
+        </w:rPr>
+        <w:t>agent/krypto/regime.py::_boden_zielzone()</w:t>
+      </w:r>
+      <w:r>
+        <w:t xml:space="preserve">, </w:t>
+      </w:r>
+      <w:r>
+        <w:rPr>
+          <w:rFonts w:ascii="Consolas" w:hAnsi="Consolas"/>
+          <w:sz w:val="20"/>
+        </w:rPr>
+        <w:t>api/yfinance_history.py</w:t>
+      </w:r>
+      <w:r>
+        <w:t xml:space="preserve"> — AZ-4 Baustein 2, Boden-Zielzone (Abschnitt 4)</w:t>
+      </w:r>
+    </w:p>
+    <w:p>
+      <w:pPr>
+        <w:pStyle w:val="ListBullet"/>
+        <w:spacing w:after="80"/>
+      </w:pPr>
+      <w:r>
+        <w:rPr>
+          <w:rFonts w:ascii="Consolas" w:hAnsi="Consolas"/>
+          <w:sz w:val="20"/>
+        </w:rPr>
         <w:t>database/db.py::get_dca_erlaubt()/set_dca_erlaubt()</w:t>
       </w:r>
       <w:r>
@@ -7682,6 +8018,81 @@
       </w:r>
       <w:r>
         <w:t xml:space="preserve"> RM-10/RM-11 (Hebel) bräuchten eine Positions-Rekonstruktion aus den margin_trading.*-Transaktions-Tags (Kap. 14) — nicht trivial, Bitpanda liefert keine „offene Positionen“-Übersicht.</w:t>
+      </w:r>
+    </w:p>
+    <w:p>
+      <w:pPr>
+        <w:pStyle w:val="ListBullet"/>
+        <w:spacing w:after="80"/>
+      </w:pPr>
+      <w:r>
+        <w:rPr>
+          <w:b/>
+        </w:rPr>
+        <w:t>NEU (2026-07-12):</w:t>
+      </w:r>
+      <w:r>
+        <w:t xml:space="preserve"> Boden-Zielzone (Abschnitt 4, </w:t>
+      </w:r>
+      <w:r>
+        <w:rPr>
+          <w:rFonts w:ascii="Consolas" w:hAnsi="Consolas"/>
+          <w:sz w:val="20"/>
+        </w:rPr>
+        <w:t>config.yaml boden_zielzone:</w:t>
+      </w:r>
+      <w:r>
+        <w:t xml:space="preserve">) — </w:t>
+      </w:r>
+      <w:r>
+        <w:rPr>
+          <w:rFonts w:ascii="Consolas" w:hAnsi="Consolas"/>
+          <w:sz w:val="20"/>
+        </w:rPr>
+        <w:t>reifegrad_daempfer_staerke</w:t>
+      </w:r>
+      <w:r>
+        <w:t xml:space="preserve"> (0,15), </w:t>
+      </w:r>
+      <w:r>
+        <w:rPr>
+          <w:rFonts w:ascii="Consolas" w:hAnsi="Consolas"/>
+          <w:sz w:val="20"/>
+        </w:rPr>
+        <w:t>equities_baermarkt_schwelle_prozent</w:t>
+      </w:r>
+      <w:r>
+        <w:t xml:space="preserve"> (20), </w:t>
+      </w:r>
+      <w:r>
+        <w:rPr>
+          <w:rFonts w:ascii="Consolas" w:hAnsi="Consolas"/>
+          <w:sz w:val="20"/>
+        </w:rPr>
+        <w:t>equities_baermarkt_lookback_jahre</w:t>
+      </w:r>
+      <w:r>
+        <w:t xml:space="preserve"> (5), </w:t>
+      </w:r>
+      <w:r>
+        <w:rPr>
+          <w:rFonts w:ascii="Consolas" w:hAnsi="Consolas"/>
+          <w:sz w:val="20"/>
+        </w:rPr>
+        <w:t>equities_overlay_shift_std</w:t>
+      </w:r>
+      <w:r>
+        <w:t xml:space="preserve"> (0,2) sind erste plausible Startwerte, noch nicht gegen echte Ergebnisse validiert. </w:t>
+      </w:r>
+      <w:r>
+        <w:rPr>
+          <w:rFonts w:ascii="Consolas" w:hAnsi="Consolas"/>
+          <w:sz w:val="20"/>
+        </w:rPr>
+        <w:t>equities_baermarkt_verknuepfung: entweder</w:t>
+      </w:r>
+      <w:r>
+        <w:t xml:space="preserve"> ist dagegen eine bewusste, feste Nutzer-Entscheidung (kein „[OFFEN]“).</w:t>
       </w:r>
     </w:p>
     <w:p>

</xml_diff>

<commit_message>
Add Cash-Reserve-Ziel for BTC/ETH nachkauf campaigns (AZ-4 Baustein 3)
Estimates how much cash reserve a staged accumulation campaign across BTC and
ETH would realistically need, on top of the existing RM-4 minimum floor
(which stays the hard veto threshold - this is informational only). Modeled
on two established risk-management conventions: "buying in thirds" (3 rounds)
and value averaging (weighted 20/30/50 toward deeper drawdowns rather than
split evenly). Each round's naive capital need (3x today's RM-1 risk ceiling)
is hard-capped by the RM-2 allocation headroom before the weights are applied
- otherwise the weighting would cancel out mathematically. Exposes two
risk_gate.py internals (RM-1 ceiling, RM-2 headroom) that were already
computed but only surfaced as their min(). Completes the 3-part AZ-4 roadmap
(tranche structure -> bottom target zone -> cash reserve target).
</commit_message>
<xml_diff>
--- a/Basisinfos/Regelwerksmanual.docx
+++ b/Basisinfos/Regelwerksmanual.docx
@@ -2641,6 +2641,220 @@
     </w:p>
     <w:p>
       <w:pPr>
+        <w:pStyle w:val="Heading2"/>
+      </w:pPr>
+      <w:r>
+        <w:t>AZ-4 Baustein 3: Cash-Reserve-Ziel für BTC/ETH (2026-07-12)</w:t>
+      </w:r>
+    </w:p>
+    <w:p>
+      <w:pPr>
+        <w:spacing w:after="160"/>
+      </w:pPr>
+      <w:r>
+        <w:t xml:space="preserve">Letzter Baustein der Bärenmarkt-Akkumulations-Roadmap. Ursprüngliche Nutzer-Sorge: "zu geringe Reserve verhindert u. U. Nachkäufe". Antwort bisher nur eine grobe Schätzung ("verdoppeln") — jetzt ein konkreter </w:t>
+      </w:r>
+      <w:r>
+        <w:rPr>
+          <w:b/>
+        </w:rPr>
+        <w:t>Zielwert</w:t>
+      </w:r>
+      <w:r>
+        <w:t xml:space="preserve"> (kein neues hartes Veto, RM-4 bleibt der bestehende Minimum-Floor), wie viel Cash-Reserve für die geplante Nachkauf-Kampagne über BTC/ETH sinnvoll wäre.</w:t>
+      </w:r>
+    </w:p>
+    <w:p>
+      <w:pPr>
+        <w:spacing w:after="80"/>
+      </w:pPr>
+      <w:r>
+        <w:rPr>
+          <w:b/>
+        </w:rPr>
+        <w:t>Methodik, referenziert zwei verbreitete Praktiken aus dem Risikomanagement</w:t>
+      </w:r>
+      <w:r>
+        <w:t xml:space="preserve"> (bewusst als Konvention eingeordnet, nicht als Marktgesetz):</w:t>
+      </w:r>
+    </w:p>
+    <w:p>
+      <w:pPr>
+        <w:pStyle w:val="ListBullet"/>
+        <w:spacing w:after="80"/>
+      </w:pPr>
+      <w:r>
+        <w:rPr>
+          <w:b/>
+        </w:rPr>
+        <w:t>"Buying in Thirds":</w:t>
+      </w:r>
+      <w:r>
+        <w:t xml:space="preserve"> 3 Runden als Basis — balanciert zwischen All-in-Risiko (1 Kauf) und Überkomplexität (5+ kleine Käufe).</w:t>
+      </w:r>
+    </w:p>
+    <w:p>
+      <w:pPr>
+        <w:pStyle w:val="ListBullet"/>
+        <w:spacing w:after="160"/>
+      </w:pPr>
+      <w:r>
+        <w:rPr>
+          <w:b/>
+        </w:rPr>
+        <w:t>Value Averaging</w:t>
+      </w:r>
+      <w:r>
+        <w:t xml:space="preserve"> (Michael Edleson, 1988): bei größerem Rücksetzer wird bewusst überproportional mehr Kapital eingesetzt, nicht gleichmäßig verteilt. Umgesetzt als </w:t>
+      </w:r>
+      <w:r>
+        <w:rPr>
+          <w:b/>
+        </w:rPr>
+        <w:t>20 % / 30 % / 50 %</w:t>
+      </w:r>
+      <w:r>
+        <w:t xml:space="preserve">-Gewichtung über die drei Runden (Nutzer-Entscheidung 2026-07-12, </w:t>
+      </w:r>
+      <w:r>
+        <w:rPr>
+          <w:rFonts w:ascii="Consolas" w:hAnsi="Consolas"/>
+          <w:sz w:val="20"/>
+        </w:rPr>
+        <w:t>config.yaml cash_reserve_ziel.rundengewichte</w:t>
+      </w:r>
+      <w:r>
+        <w:t>).</w:t>
+      </w:r>
+    </w:p>
+    <w:p>
+      <w:pPr>
+        <w:spacing w:after="160"/>
+      </w:pPr>
+      <w:r>
+        <w:rPr>
+          <w:b/>
+        </w:rPr>
+        <w:t>Rechnerische Präzisierung</w:t>
+      </w:r>
+      <w:r>
+        <w:t xml:space="preserve"> (notwendig — sonst kürzt sich die Gewichtung rechnerisch weg): naiver Gesamtbedarf je Asset = 3 × heutige RM-1-Risiko-Obergrenze (jede Runde unabhängig wie ein normaler Trade heute bemessen), </w:t>
+      </w:r>
+      <w:r>
+        <w:rPr>
+          <w:b/>
+        </w:rPr>
+        <w:t>hart gedeckelt durch die RM-2-Allokationsgrenze</w:t>
+      </w:r>
+      <w:r>
+        <w:t xml:space="preserve"> (strukturelles Limit, das nie überschritten werden kann — RM-1 allein würde sonst beliebig oft "neu bemessen" und die Allokationsgrenze ignorieren). Die 20/30/50-Gewichte verteilen erst diesen bereits gedeckelten Gesamtbetrag auf die drei Runden. Cash-Reserve-Ziel (gesamt) = RM-4-Minimum + BTC-Ziel + ETH-Ziel.</w:t>
+      </w:r>
+    </w:p>
+    <w:p>
+      <w:pPr>
+        <w:spacing w:after="160"/>
+      </w:pPr>
+      <w:r>
+        <w:rPr>
+          <w:b/>
+        </w:rPr>
+        <w:t>Live-Beispiel (2026-07-12, echte Daten):</w:t>
+      </w:r>
+      <w:r>
+        <w:t xml:space="preserve"> BTC-Ziel 4.014 $ (RM-2-Headroom deckelte den naiven Bedarf von 3×6.137=18.411 $ auf 4.014 $ — das RM-2-Allokationslimit war der bindende Faktor), ETH-Ziel 5.678 $, RM-4-Minimum 2.282 $ → Gesamt-Ziel 11.975 $.</w:t>
+      </w:r>
+    </w:p>
+    <w:p>
+      <w:pPr>
+        <w:spacing w:after="160"/>
+      </w:pPr>
+      <w:r>
+        <w:rPr>
+          <w:b/>
+        </w:rPr>
+        <w:t>Grenzfälle, ehrlich behandelt (P-10):</w:t>
+      </w:r>
+      <w:r>
+        <w:t xml:space="preserve"> ist die RM-2-Allokation für ein Asset bereits ausgeschöpft, wird dessen Ziel-Anteil </w:t>
+      </w:r>
+      <w:r>
+        <w:rPr>
+          <w:rFonts w:ascii="Consolas" w:hAnsi="Consolas"/>
+          <w:sz w:val="20"/>
+        </w:rPr>
+        <w:t>0</w:t>
+      </w:r>
+      <w:r>
+        <w:t xml:space="preserve"> (kein Spielraum mehr, statt eines irreführenden positiven Werts). Ist RM-1 nicht berechenbar (kein Stop-Loss ableitbar, z. B. fehlende ATR-Daten), wird der Wert </w:t>
+      </w:r>
+      <w:r>
+        <w:rPr>
+          <w:rFonts w:ascii="Consolas" w:hAnsi="Consolas"/>
+          <w:sz w:val="20"/>
+        </w:rPr>
+        <w:t>None</w:t>
+      </w:r>
+      <w:r>
+        <w:t xml:space="preserve"> statt geraten — degradiert nur diesen einen Fakt, blockiert nicht die Pipeline.</w:t>
+      </w:r>
+    </w:p>
+    <w:p>
+      <w:pPr>
+        <w:spacing w:after="160"/>
+      </w:pPr>
+      <w:r>
+        <w:rPr>
+          <w:b/>
+        </w:rPr>
+        <w:t>Bewusst KEIN UI-Feld für die Rundengewichte</w:t>
+      </w:r>
+      <w:r>
+        <w:t xml:space="preserve"> — Konsistenz mit allen anderen Risikoparametern (RM-1/RM-2/RM-4/Regime-Gewichte), die ausschließlich in </w:t>
+      </w:r>
+      <w:r>
+        <w:rPr>
+          <w:rFonts w:ascii="Consolas" w:hAnsi="Consolas"/>
+          <w:sz w:val="20"/>
+        </w:rPr>
+        <w:t>config.yaml</w:t>
+      </w:r>
+      <w:r>
+        <w:t xml:space="preserve"> leben; ein UI-Editor wäre Mehraufwand für einen selten geänderten Wert. Nur berechnet, wenn das aktuell bewertete Asset selbst BTC/ETH ist (kein Mehraufwand für Alt-Coin-Signale) UND das Regime baer/krise_extrem/seitwaerts ist — bewusst OHNE den per-Asset-AZ-4-Toggle (Cash-Reserve-Ziel ist ein portfolioweiter Informationswert, keine Tranchen-Einstellung). Signal-gebunden gespeichert (</w:t>
+      </w:r>
+      <w:r>
+        <w:rPr>
+          <w:rFonts w:ascii="Consolas" w:hAnsi="Consolas"/>
+          <w:sz w:val="20"/>
+        </w:rPr>
+        <w:t>signals</w:t>
+      </w:r>
+      <w:r>
+        <w:t xml:space="preserve">-Tabelle, wie </w:t>
+      </w:r>
+      <w:r>
+        <w:rPr>
+          <w:rFonts w:ascii="Consolas" w:hAnsi="Consolas"/>
+          <w:sz w:val="20"/>
+        </w:rPr>
+        <w:t>tranchen_json</w:t>
+      </w:r>
+      <w:r>
+        <w:t>), nicht macro_snapshot-artig wie die Boden-Zielzone.</w:t>
+      </w:r>
+    </w:p>
+    <w:p>
+      <w:pPr>
+        <w:spacing w:after="160"/>
+      </w:pPr>
+      <w:r>
+        <w:rPr>
+          <w:b/>
+        </w:rPr>
+        <w:t>Damit ist die komplette 3-Bausteine-Roadmap (Tranchen-Struktur → Boden-Zielzone → Cash-Reserve-Ziel) abgeschlossen.</w:t>
+      </w:r>
+    </w:p>
+    <w:p>
+      <w:pPr>
         <w:pBdr>
           <w:bottom w:val="single" w:sz="6" w:space="1" w:color="BFBFBF"/>
         </w:pBdr>
@@ -5538,6 +5752,32 @@
       </w:r>
       <w:r>
         <w:t xml:space="preserve"> — AZ-4 Baustein 2, Boden-Zielzone (Abschnitt 4)</w:t>
+      </w:r>
+    </w:p>
+    <w:p>
+      <w:pPr>
+        <w:pStyle w:val="ListBullet"/>
+        <w:spacing w:after="80"/>
+      </w:pPr>
+      <w:r>
+        <w:rPr>
+          <w:rFonts w:ascii="Consolas" w:hAnsi="Consolas"/>
+          <w:sz w:val="20"/>
+        </w:rPr>
+        <w:t>agent/krypto/risk_gate.py::compute_cash_reserve_ziel()</w:t>
+      </w:r>
+      <w:r>
+        <w:t xml:space="preserve">, </w:t>
+      </w:r>
+      <w:r>
+        <w:rPr>
+          <w:rFonts w:ascii="Consolas" w:hAnsi="Consolas"/>
+          <w:sz w:val="20"/>
+        </w:rPr>
+        <w:t>agent/krypto/pipeline.py::_compute_cash_reserve_ziel_context()</w:t>
+      </w:r>
+      <w:r>
+        <w:t xml:space="preserve"> — AZ-4 Baustein 3, Cash-Reserve-Ziel (Abschnitt 4)</w:t>
       </w:r>
     </w:p>
     <w:p>

</xml_diff>

<commit_message>
E-Mail-Benachrichtigung bei Start-Fehlern und Job-Ausfaellen (U-8)
Letzte Basisfunktion vor dem geplanten 24/7-Notebook-Betrieb: die App
meldet sich jetzt per E-Mail (Gmail, separater Robot-Account), wenn ein
fataler Start-Fehler auftritt oder ein Scheduler-Job dauerhaft fehlschlaegt.
Cooldown verhindert Postfach-Spam bei laengeren Ausfaellen.

Co-Authored-By: Claude Sonnet 5 <noreply@anthropic.com>
</commit_message>
<xml_diff>
--- a/Basisinfos/Regelwerksmanual.docx
+++ b/Basisinfos/Regelwerksmanual.docx
@@ -7094,38 +7094,209 @@
         <w:rPr>
           <w:b/>
         </w:rPr>
-        <w:t>E-Mail-/Push-Benachrichtigung ist NICHT implementiert.</w:t>
-      </w:r>
-      <w:r>
-        <w:t xml:space="preserve"> </w:t>
+        <w:t>E-Mail-Benachrichtigung — ERLEDIGT (U-8, 2026-07-12).</w:t>
+      </w:r>
+      <w:r>
+        <w:t xml:space="preserve"> Siehe eigener Abschnitt unten für Details.</w:t>
+      </w:r>
+    </w:p>
+    <w:p>
+      <w:pPr>
+        <w:pStyle w:val="Heading2"/>
+      </w:pPr>
+      <w:r>
+        <w:t>E-Mail-Benachrichtigung (U-8, 2026-07-12)</w:t>
+      </w:r>
+    </w:p>
+    <w:p>
+      <w:pPr>
+        <w:spacing w:after="160"/>
+      </w:pPr>
+      <w:r>
+        <w:rPr>
+          <w:b/>
+        </w:rPr>
+        <w:t>Zweck:</w:t>
+      </w:r>
+      <w:r>
+        <w:t xml:space="preserve"> die App läuft künftig auf dem 24/7-Notebook ohne ständige Beaufsichtigung — bisher war der einzige Weg, von einem Problem zu erfahren, aktiv in die Logdatei oder auf die Remote-Steuer-Seite (Abschnitt 13) zu schauen. E-Mail schließt diese Lücke passiv: die App meldet sich selbst.</w:t>
+      </w:r>
+    </w:p>
+    <w:p>
+      <w:pPr>
+        <w:spacing w:after="160"/>
+      </w:pPr>
+      <w:r>
+        <w:rPr>
+          <w:b/>
+        </w:rPr>
+        <w:t>Technisch:</w:t>
+      </w:r>
+      <w:r>
+        <w:t xml:space="preserve"> neues Modul </w:t>
       </w:r>
       <w:r>
         <w:rPr>
           <w:rFonts w:ascii="Consolas" w:hAnsi="Consolas"/>
           <w:sz w:val="20"/>
         </w:rPr>
-        <w:t>config.yaml</w:t>
-      </w:r>
-      <w:r>
-        <w:t xml:space="preserve"> hat nur einen leeren Platzhalter (</w:t>
+        <w:t>api/email_notify.py</w:t>
+      </w:r>
+      <w:r>
+        <w:t xml:space="preserve">, </w:t>
       </w:r>
       <w:r>
         <w:rPr>
           <w:rFonts w:ascii="Consolas" w:hAnsi="Consolas"/>
           <w:sz w:val="20"/>
         </w:rPr>
-        <w:t>smtp_host: ""</w:t>
-      </w:r>
-      <w:r>
-        <w:t>), der von keinem Code gelesen wird — bleibt ein offener Punkt (U-8), bräuchte zuerst eine SMTP-/Mail-API-Entscheidung.</w:t>
+        <w:t>smtplib</w:t>
+      </w:r>
+      <w:r>
+        <w:t xml:space="preserve"> + </w:t>
+      </w:r>
+      <w:r>
+        <w:rPr>
+          <w:rFonts w:ascii="Consolas" w:hAnsi="Consolas"/>
+          <w:sz w:val="20"/>
+        </w:rPr>
+        <w:t>email.mime.text</w:t>
+      </w:r>
+      <w:r>
+        <w:t xml:space="preserve"> (Python-Standardbibliothek, keine neue Abhängigkeit). Gmail bewusst fest verdrahtet (</w:t>
+      </w:r>
+      <w:r>
+        <w:rPr>
+          <w:rFonts w:ascii="Consolas" w:hAnsi="Consolas"/>
+          <w:sz w:val="20"/>
+        </w:rPr>
+        <w:t>smtp.gmail.com:587</w:t>
+      </w:r>
+      <w:r>
+        <w:t xml:space="preserve">, STARTTLS) statt konfigurierbarem SMTP-Host — die konzeptionelle Vorentscheidung (2026-07-11) war ein eigener, separat angelegter </w:t>
+      </w:r>
+      <w:r>
+        <w:rPr>
+          <w:b/>
+        </w:rPr>
+        <w:t>„Robot“-Gmail-Account</w:t>
+      </w:r>
+      <w:r>
+        <w:t xml:space="preserve"> mit App-Passwort, nicht der Hauptaccount des Nutzers: das App-Passwort ist ein dauerhafter, programmatischer Zugriffsschlüssel zur gesamten Mailbox, der auf dem 24/7-Notebook liegt — ein separates Konto begrenzt den Schaden im Fall eines Leaks auf diesen einen Kanal. </w:t>
+      </w:r>
+      <w:r>
+        <w:rPr>
+          <w:rFonts w:ascii="Consolas" w:hAnsi="Consolas"/>
+          <w:sz w:val="20"/>
+        </w:rPr>
+        <w:t>GMAIL_ABSENDER_ADRESSE</w:t>
+      </w:r>
+      <w:r>
+        <w:t>/</w:t>
+      </w:r>
+      <w:r>
+        <w:rPr>
+          <w:rFonts w:ascii="Consolas" w:hAnsi="Consolas"/>
+          <w:sz w:val="20"/>
+        </w:rPr>
+        <w:t>GMAIL_APP_PASSWORT</w:t>
+      </w:r>
+      <w:r>
+        <w:t xml:space="preserve"> in </w:t>
+      </w:r>
+      <w:r>
+        <w:rPr>
+          <w:rFonts w:ascii="Consolas" w:hAnsi="Consolas"/>
+          <w:sz w:val="20"/>
+        </w:rPr>
+        <w:t>.env</w:t>
+      </w:r>
+      <w:r>
+        <w:t xml:space="preserve"> (P-8: fehlen beide, bleibt die Funktion komplett deaktiviert, kein Fehler, nur ein Info-Log — Kernfunktionen dürfen nie von einem optionalen Benachrichtigungs-Kanal abhängen).</w:t>
       </w:r>
     </w:p>
     <w:p>
       <w:pPr>
-        <w:pStyle w:val="Heading2"/>
-      </w:pPr>
-      <w:r>
-        <w:t>Agent-Pipeline („Signal berechnen“) im Detail</w:t>
+        <w:spacing w:after="160"/>
+      </w:pPr>
+      <w:r>
+        <w:rPr>
+          <w:b/>
+        </w:rPr>
+        <w:t>Zwei Auslöser-Pfade, bewusst beide verdrahtet:</w:t>
+      </w:r>
+      <w:r>
+        <w:t xml:space="preserve"> beim Durcharbeiten des Scheduler-Codes zeigte sich, dass der bereits bestehende </w:t>
+      </w:r>
+      <w:r>
+        <w:rPr>
+          <w:rFonts w:ascii="Consolas" w:hAnsi="Consolas"/>
+          <w:sz w:val="20"/>
+        </w:rPr>
+        <w:t>EVENT_JOB_ERROR</w:t>
+      </w:r>
+      <w:r>
+        <w:t>/</w:t>
+      </w:r>
+      <w:r>
+        <w:rPr>
+          <w:rFonts w:ascii="Consolas" w:hAnsi="Consolas"/>
+          <w:sz w:val="20"/>
+        </w:rPr>
+        <w:t>EVENT_JOB_MISSED</w:t>
+      </w:r>
+      <w:r>
+        <w:t xml:space="preserve">-Listener (</w:t>
+      </w:r>
+      <w:r>
+        <w:rPr>
+          <w:rFonts w:ascii="Consolas" w:hAnsi="Consolas"/>
+          <w:sz w:val="20"/>
+        </w:rPr>
+        <w:t>_log_job_event()</w:t>
+      </w:r>
+      <w:r>
+        <w:t xml:space="preserve">) nur bei unbehandelten Bugs im Job-Wrapper selbst feuert. Der weitaus häufigere Realfall — eine externe API (Groq/CoinGecko/Bitpanda) ist über Stunden nicht erreichbar — wird von jedem der sieben </w:t>
+      </w:r>
+      <w:r>
+        <w:rPr>
+          <w:rFonts w:ascii="Consolas" w:hAnsi="Consolas"/>
+          <w:sz w:val="20"/>
+        </w:rPr>
+        <w:t>*_job()</w:t>
+      </w:r>
+      <w:r>
+        <w:t xml:space="preserve"> bereits INTERN in seinem eigenen </w:t>
+      </w:r>
+      <w:r>
+        <w:rPr>
+          <w:rFonts w:ascii="Consolas" w:hAnsi="Consolas"/>
+          <w:sz w:val="20"/>
+        </w:rPr>
+        <w:t>except Exception:</w:t>
+      </w:r>
+      <w:r>
+        <w:t xml:space="preserve">-Block abgefangen und geloggt, ohne den Listener je zu erreichen. Eine E-Mail nur am Listener aufzuhängen hätte also genau den Fall verpasst, um den es eigentlich geht. Deshalb ruft sowohl </w:t>
+      </w:r>
+      <w:r>
+        <w:rPr>
+          <w:rFonts w:ascii="Consolas" w:hAnsi="Consolas"/>
+          <w:sz w:val="20"/>
+        </w:rPr>
+        <w:t>_log_job_event()</w:t>
+      </w:r>
+      <w:r>
+        <w:t xml:space="preserve"> als auch jede der sieben Job-Funktionen denselben gemeinsamen Helper </w:t>
+      </w:r>
+      <w:r>
+        <w:rPr>
+          <w:rFonts w:ascii="Consolas" w:hAnsi="Consolas"/>
+          <w:sz w:val="20"/>
+        </w:rPr>
+        <w:t>_notify_job_failure(job_id, fehler_text)</w:t>
+      </w:r>
+      <w:r>
+        <w:t xml:space="preserve"> auf.</w:t>
       </w:r>
     </w:p>
     <w:p>
@@ -7133,52 +7304,127 @@
         <w:spacing w:after="160"/>
       </w:pPr>
       <w:r>
-        <w:t xml:space="preserve">Zwei unterschiedliche Fehlerklassen: </w:t>
-      </w:r>
-      <w:r>
         <w:rPr>
           <w:b/>
         </w:rPr>
-        <w:t>(a) Groq liefert ungültiges/kaputtes JSON</w:t>
-      </w:r>
-      <w:r>
-        <w:t xml:space="preserve"> — sauberer, automatischer Fallback auf HALTEN mit erklärendem Grund, kein Absturz, Signal wird trotzdem gespeichert. </w:t>
-      </w:r>
-      <w:r>
-        <w:rPr>
-          <w:b/>
-        </w:rPr>
-        <w:t>(b) Echter Netzwerkausfall von Groq selbst</w:t>
-      </w:r>
-      <w:r>
-        <w:t xml:space="preserve"> (Server down, Timeout) — </w:t>
-      </w:r>
-      <w:r>
-        <w:rPr>
-          <w:b/>
-        </w:rPr>
-        <w:t>kein</w:t>
-      </w:r>
-      <w:r>
-        <w:t xml:space="preserve"> Fallback, der rohe Fehlertext erscheint in der Status-Zeile, es wird nichts gespeichert. Ausfälle aller anderen Datenquellen innerhalb der Pipeline (CoinGecko/Kraken/FRED/Bitpanda-Listing) sind dagegen durchgehend nach dem P-10-Prinzip abgesichert — ein Ausfall degradiert nur den jeweiligen Fakt auf </w:t>
+        <w:t>Cooldown gegen Postfach-Spam:</w:t>
+      </w:r>
+      <w:r>
+        <w:t xml:space="preserve"> </w:t>
       </w:r>
       <w:r>
         <w:rPr>
           <w:rFonts w:ascii="Consolas" w:hAnsi="Consolas"/>
           <w:sz w:val="20"/>
         </w:rPr>
-        <w:t>null</w:t>
-      </w:r>
-      <w:r>
-        <w:t>, ohne die Pipeline abzubrechen.</w:t>
+        <w:t>_notify_job_failure()</w:t>
+      </w:r>
+      <w:r>
+        <w:t xml:space="preserve"> merkt sich pro </w:t>
+      </w:r>
+      <w:r>
+        <w:rPr>
+          <w:rFonts w:ascii="Consolas" w:hAnsi="Consolas"/>
+          <w:sz w:val="20"/>
+        </w:rPr>
+        <w:t>job_id</w:t>
+      </w:r>
+      <w:r>
+        <w:t xml:space="preserve"> den Zeitpunkt der letzten gesendeten Mail und unterdrückt weitere Mails innerhalb von </w:t>
+      </w:r>
+      <w:r>
+        <w:rPr>
+          <w:rFonts w:ascii="Consolas" w:hAnsi="Consolas"/>
+          <w:sz w:val="20"/>
+        </w:rPr>
+        <w:t>config.yaml benachrichtigung.email.job_ausfall_cooldown_minuten</w:t>
+      </w:r>
+      <w:r>
+        <w:t xml:space="preserve"> (Start: 60) — ein mehrstündiger oder mehrtägiger Ausfall erzeugt so höchstens eine Mail pro Stunde statt eine pro fehlgeschlagenem Lauf. Bei der Verifikation wurde ein Randfall gefunden und behoben: ein </w:t>
+      </w:r>
+      <w:r>
+        <w:rPr>
+          <w:rFonts w:ascii="Consolas" w:hAnsi="Consolas"/>
+          <w:sz w:val="20"/>
+        </w:rPr>
+        <w:t>0.0</w:t>
+      </w:r>
+      <w:r>
+        <w:t xml:space="preserve">-Default für „noch nie gesendet“ hätte einen allerersten Job-Fehlschlag in der ersten Stunde nach einem Neustart fälschlich als „kürzlich gesendet“ gewertet und die Mail unterdrückt (</w:t>
+      </w:r>
+      <w:r>
+        <w:rPr>
+          <w:rFonts w:ascii="Consolas" w:hAnsi="Consolas"/>
+          <w:sz w:val="20"/>
+        </w:rPr>
+        <w:t>time.monotonic()</w:t>
+      </w:r>
+      <w:r>
+        <w:t xml:space="preserve"> zählt unter Windows ab Systemstart) — behoben durch </w:t>
+      </w:r>
+      <w:r>
+        <w:rPr>
+          <w:rFonts w:ascii="Consolas" w:hAnsi="Consolas"/>
+          <w:sz w:val="20"/>
+        </w:rPr>
+        <w:t>None</w:t>
+      </w:r>
+      <w:r>
+        <w:t xml:space="preserve"> statt </w:t>
+      </w:r>
+      <w:r>
+        <w:rPr>
+          <w:rFonts w:ascii="Consolas" w:hAnsi="Consolas"/>
+          <w:sz w:val="20"/>
+        </w:rPr>
+        <w:t>0.0</w:t>
+      </w:r>
+      <w:r>
+        <w:t xml:space="preserve"> als expliziten „noch nie gesendet“-Marker.</w:t>
       </w:r>
     </w:p>
     <w:p>
       <w:pPr>
-        <w:pStyle w:val="Heading2"/>
-      </w:pPr>
-      <w:r>
-        <w:t>Empfehlung für den nächsten Schritt</w:t>
+        <w:spacing w:after="160"/>
+      </w:pPr>
+      <w:r>
+        <w:rPr>
+          <w:b/>
+        </w:rPr>
+        <w:t>Start-Fehler:</w:t>
+      </w:r>
+      <w:r>
+        <w:t xml:space="preserve"> an den zwei echten fatalen Stellen verdrahtet (Watchlist-Laden, </w:t>
+      </w:r>
+      <w:r>
+        <w:rPr>
+          <w:rFonts w:ascii="Consolas" w:hAnsi="Consolas"/>
+          <w:sz w:val="20"/>
+        </w:rPr>
+        <w:t>db.init_db()</w:t>
+      </w:r>
+      <w:r>
+        <w:t xml:space="preserve"> — siehe „Betriebssicherheit“ oben), NICHT beim allerersten Config-Lade-Fehler (Empfänger-Adresse kommt selbst aus </w:t>
+      </w:r>
+      <w:r>
+        <w:rPr>
+          <w:rFonts w:ascii="Consolas" w:hAnsi="Consolas"/>
+          <w:sz w:val="20"/>
+        </w:rPr>
+        <w:t>config.yaml</w:t>
+      </w:r>
+      <w:r>
+        <w:t xml:space="preserve">, an der Stelle noch unbekannt) und NICHT beim nicht-fatalen Erstimport-Fehler (einmaliges Ereignis, typischerweise während der Nutzer ohnehin am Rechner sitzt). Dialog + Logdatei bleiben in jedem Fall die primäre Absicherung — die E-Mail ist ein zusätzlicher, best-effort Kanal obendrauf, ein Versandfehler (z. B. fehlendes App-Passwort) wird von </w:t>
+      </w:r>
+      <w:r>
+        <w:rPr>
+          <w:rFonts w:ascii="Consolas" w:hAnsi="Consolas"/>
+          <w:sz w:val="20"/>
+        </w:rPr>
+        <w:t>send_notification_email()</w:t>
+      </w:r>
+      <w:r>
+        <w:t xml:space="preserve"> selbst abgefangen und blockiert nichts (P-10).</w:t>
       </w:r>
     </w:p>
     <w:p>
@@ -7186,16 +7432,101 @@
         <w:spacing w:after="160"/>
       </w:pPr>
       <w:r>
-        <w:t xml:space="preserve">Die drei ungeschützten Start-Schritte sind seit 2026-07-12 abgesichert (siehe oben), ebenso der sofortige erste Preis-Lauf und der staleness-bewusste Sofort-Trigger für die Kurs-/OHLC-Historie-Jobs nach jedem Neustart (siehe „Verhalten nach längerer Downtime“). </w:t>
-      </w:r>
-      <w:r>
         <w:rPr>
           <w:b/>
         </w:rPr>
+        <w:t>Bewusst nicht Teil dieser Version:</w:t>
+      </w:r>
+      <w:r>
+        <w:t xml:space="preserve"> Marktscan-Kaufkandidaten-Mails (</w:t>
+      </w:r>
+      <w:r>
+        <w:rPr>
+          <w:rFonts w:ascii="Consolas" w:hAnsi="Consolas"/>
+          <w:sz w:val="20"/>
+        </w:rPr>
+        <w:t>config.yaml marktscan.benachrichtigung_email</w:t>
+      </w:r>
+      <w:r>
+        <w:t xml:space="preserve">) — eigener, kleinerer Folgeschritt. Auch keine „Ausfall-Streak“-Zählung (z. B. erst nach 3x in Folge alarmieren) — der Cooldown allein gilt als ausreichender Spam-Schutz für den ersten Wurf.</w:t>
+      </w:r>
+    </w:p>
+    <w:p>
+      <w:pPr>
+        <w:pStyle w:val="Heading2"/>
+      </w:pPr>
+      <w:r>
+        <w:t>Agent-Pipeline („Signal berechnen“) im Detail</w:t>
+      </w:r>
+    </w:p>
+    <w:p>
+      <w:pPr>
+        <w:spacing w:after="160"/>
+      </w:pPr>
+      <w:r>
+        <w:t xml:space="preserve">Zwei unterschiedliche Fehlerklassen: </w:t>
+      </w:r>
+      <w:r>
+        <w:rPr>
+          <w:b/>
+        </w:rPr>
+        <w:t>(a) Groq liefert ungültiges/kaputtes JSON</w:t>
+      </w:r>
+      <w:r>
+        <w:t xml:space="preserve"> — sauberer, automatischer Fallback auf HALTEN mit erklärendem Grund, kein Absturz, Signal wird trotzdem gespeichert. </w:t>
+      </w:r>
+      <w:r>
+        <w:rPr>
+          <w:b/>
+        </w:rPr>
+        <w:t>(b) Echter Netzwerkausfall von Groq selbst</w:t>
+      </w:r>
+      <w:r>
+        <w:t xml:space="preserve"> (Server down, Timeout) — </w:t>
+      </w:r>
+      <w:r>
+        <w:rPr>
+          <w:b/>
+        </w:rPr>
+        <w:t>kein</w:t>
+      </w:r>
+      <w:r>
+        <w:t xml:space="preserve"> Fallback, der rohe Fehlertext erscheint in der Status-Zeile, es wird nichts gespeichert. Ausfälle aller anderen Datenquellen innerhalb der Pipeline (CoinGecko/Kraken/FRED/Bitpanda-Listing) sind dagegen durchgehend nach dem P-10-Prinzip abgesichert — ein Ausfall degradiert nur den jeweiligen Fakt auf </w:t>
+      </w:r>
+      <w:r>
+        <w:rPr>
+          <w:rFonts w:ascii="Consolas" w:hAnsi="Consolas"/>
+          <w:sz w:val="20"/>
+        </w:rPr>
+        <w:t>null</w:t>
+      </w:r>
+      <w:r>
+        <w:t>, ohne die Pipeline abzubrechen.</w:t>
+      </w:r>
+    </w:p>
+    <w:p>
+      <w:pPr>
+        <w:pStyle w:val="Heading2"/>
+      </w:pPr>
+      <w:r>
+        <w:t>Empfehlung für den nächsten Schritt</w:t>
+      </w:r>
+    </w:p>
+    <w:p>
+      <w:pPr>
+        <w:spacing w:after="160"/>
+      </w:pPr>
+      <w:r>
+        <w:t xml:space="preserve">Die drei ungeschützten Start-Schritte sind seit 2026-07-12 abgesichert (siehe oben), ebenso der sofortige erste Preis-Lauf und der staleness-bewusste Sofort-Trigger für die Kurs-/OHLC-Historie-Jobs nach jedem Neustart (siehe „Verhalten nach längerer Downtime“). E-Mail-Benachrichtigung bei Start-Fehlern und Job-Ausfällen ist seit 2026-07-12 ebenfalls erledigt (U-8, siehe eigener Abschnitt oben) — ein echter Sendetest mit dem eingerichteten Robot-Account steht noch aus. </w:t>
+      </w:r>
+      <w:r>
+        <w:rPr>
+          <w:b/>
+        </w:rPr>
         <w:t>Weiterhin offen:</w:t>
       </w:r>
       <w:r>
-        <w:t xml:space="preserve"> E-Mail-Benachrichtigung (SMTP-Konto-Entscheidung nötig, U-8) und ein Backoff/Alarm bei dauerhaftem Scheduler-Job-Ausfall (siehe „Scheduler-Jobs“ oben). Die aggregierte Status-Übersicht selbst ist inzwischen Teil der Remote-Steuer-Seite geworden (Abschnitt 13).</w:t>
+        <w:t xml:space="preserve"> ein Backoff bei dauerhaftem Scheduler-Job-Ausfall über den Cooldown hinaus (z. B. exponentiell steigende Wiederholungs-Intervalle statt des festen Job-Takts, siehe „Scheduler-Jobs“ oben). Die aggregierte Status-Übersicht selbst ist inzwischen Teil der Remote-Steuer-Seite geworden (Abschnitt 13).</w:t>
       </w:r>
     </w:p>
     <w:p>
@@ -8362,7 +8693,7 @@
         <w:t>ERLEDIGT, war hier gelistet (2026-07-12):</w:t>
       </w:r>
       <w:r>
-        <w:t xml:space="preserve"> die 3 ungeschützten Start-Schritte (config.yaml/DB/Erstimport) sind jetzt abgesichert (Kap. 12) — E-Mail-Benachrichtigung (U-8) und Backoff/Alarm bei dauerhaftem Job-Ausfall bleiben weiterhin offen.</w:t>
+        <w:t xml:space="preserve"> die 3 ungeschützten Start-Schritte (config.yaml/DB/Erstimport) sind jetzt abgesichert (Kap. 12), ebenso die E-Mail-Benachrichtigung bei Start-Fehlern und Job-Ausfällen (U-8) — nur ein Backoff bei dauerhaftem Job-Ausfall über den Cooldown hinaus bleibt weiterhin offen.</w:t>
       </w:r>
     </w:p>
     <w:sectPr>

</xml_diff>

<commit_message>
Job-Ausfall-Backoff fuer haeufig getaktete Scheduler-Jobs
Letzter offener Punkt der Betriebssicherheits-Liste: refresh_prices,
refresh_securities_prices und bitpanda_cash verdoppeln ab dem zweiten
Fehlschlag in Folge das Intervall bis zum naechsten Versuch (gedeckelt
auf 4 Std.), statt bei einem dauerhaften API-Ausfall stur im Normal-Takt
weiterzulaufen. Ein erfolgreicher Lauf setzt den Backoff automatisch
zurueck.

Co-Authored-By: Claude Sonnet 5 <noreply@anthropic.com>
</commit_message>
<xml_diff>
--- a/Basisinfos/Regelwerksmanual.docx
+++ b/Basisinfos/Regelwerksmanual.docx
@@ -6998,10 +6998,110 @@
         <w:rPr>
           <w:b/>
         </w:rPr>
-        <w:t>Was weiterhin fehlt:</w:t>
-      </w:r>
-      <w:r>
-        <w:t xml:space="preserve"> jeglicher Backoff oder Alarm bei einem dauerhaften Ausfall (z. B. API drei Tage down) — die App versucht stur im gleichen Takt weiter, ohne dich aktiv zu warnen.</w:t>
+        <w:t>Job-Ausfall-Backoff — ERLEDIGT (2026-07-12).</w:t>
+      </w:r>
+      <w:r>
+        <w:t xml:space="preserve"> Die drei häufig getakteten Jobs (</w:t>
+      </w:r>
+      <w:r>
+        <w:rPr>
+          <w:rFonts w:ascii="Consolas" w:hAnsi="Consolas"/>
+          <w:sz w:val="20"/>
+        </w:rPr>
+        <w:t>refresh_prices</w:t>
+      </w:r>
+      <w:r>
+        <w:t xml:space="preserve">, </w:t>
+      </w:r>
+      <w:r>
+        <w:rPr>
+          <w:rFonts w:ascii="Consolas" w:hAnsi="Consolas"/>
+          <w:sz w:val="20"/>
+        </w:rPr>
+        <w:t>refresh_securities_prices</w:t>
+      </w:r>
+      <w:r>
+        <w:t xml:space="preserve">, </w:t>
+      </w:r>
+      <w:r>
+        <w:rPr>
+          <w:rFonts w:ascii="Consolas" w:hAnsi="Consolas"/>
+          <w:sz w:val="20"/>
+        </w:rPr>
+        <w:t>bitpanda_cash</w:t>
+      </w:r>
+      <w:r>
+        <w:t xml:space="preserve"> — je 15/15/30 Min. Normal-Takt) verdoppeln ab dem zweiten Fehlschlag in Folge das Intervall bis zum nächsten Versuch (</w:t>
+      </w:r>
+      <w:r>
+        <w:rPr>
+          <w:rFonts w:ascii="Consolas" w:hAnsi="Consolas"/>
+          <w:sz w:val="20"/>
+        </w:rPr>
+        <w:t>_record_job_failure_for_backoff()</w:t>
+      </w:r>
+      <w:r>
+        <w:t xml:space="preserve"> in </w:t>
+      </w:r>
+      <w:r>
+        <w:rPr>
+          <w:rFonts w:ascii="Consolas" w:hAnsi="Consolas"/>
+          <w:sz w:val="20"/>
+        </w:rPr>
+        <w:t>scheduler/background.py</w:t>
+      </w:r>
+      <w:r>
+        <w:t xml:space="preserve">, verschiebt </w:t>
+      </w:r>
+      <w:r>
+        <w:rPr>
+          <w:rFonts w:ascii="Consolas" w:hAnsi="Consolas"/>
+          <w:sz w:val="20"/>
+        </w:rPr>
+        <w:t>next_run_time</w:t>
+      </w:r>
+      <w:r>
+        <w:t xml:space="preserve"> per </w:t>
+      </w:r>
+      <w:r>
+        <w:rPr>
+          <w:rFonts w:ascii="Consolas" w:hAnsi="Consolas"/>
+          <w:sz w:val="20"/>
+        </w:rPr>
+        <w:t>scheduler.modify_job()</w:t>
+      </w:r>
+      <w:r>
+        <w:t xml:space="preserve">), gedeckelt auf 4 Std. Ein erfolgreicher Lauf setzt den Zähler zurück (</w:t>
+      </w:r>
+      <w:r>
+        <w:rPr>
+          <w:rFonts w:ascii="Consolas" w:hAnsi="Consolas"/>
+          <w:sz w:val="20"/>
+        </w:rPr>
+        <w:t>_record_job_success_for_backoff()</w:t>
+      </w:r>
+      <w:r>
+        <w:t xml:space="preserve">) — APScheduler’s </w:t>
+      </w:r>
+      <w:r>
+        <w:rPr>
+          <w:rFonts w:ascii="Consolas" w:hAnsi="Consolas"/>
+          <w:sz w:val="20"/>
+        </w:rPr>
+        <w:t>IntervalTrigger</w:t>
+      </w:r>
+      <w:r>
+        <w:t xml:space="preserve"> rechnet den Normal-Takt danach automatisch ab dem tatsächlichen letzten Lauf weiter, kein manueller Reset des nächsten Laufzeitpunkts nötig (live gegen eine echte </w:t>
+      </w:r>
+      <w:r>
+        <w:rPr>
+          <w:rFonts w:ascii="Consolas" w:hAnsi="Consolas"/>
+          <w:sz w:val="20"/>
+        </w:rPr>
+        <w:t>BackgroundScheduler</w:t>
+      </w:r>
+      <w:r>
+        <w:t xml:space="preserve">-Instanz verifiziert). Die beiden 24-Std.-Jobs (Historie/OHLC) und die Cron-getakteten Jobs (Marktscan/Backward-Tracking) bewusst OHNE Backoff — ihr Normal-Takt ist bereits so groß, dass ein zusätzliches Backoff keinen nennenswerten Nutzen hätte.</w:t>
       </w:r>
     </w:p>
     <w:p>
@@ -7627,16 +7727,7 @@
         <w:spacing w:after="160"/>
       </w:pPr>
       <w:r>
-        <w:t xml:space="preserve">Die drei ungeschützten Start-Schritte sind seit 2026-07-12 abgesichert (siehe oben), ebenso der sofortige erste Preis-Lauf und der staleness-bewusste Sofort-Trigger für die Kurs-/OHLC-Historie-Jobs nach jedem Neustart (siehe „Verhalten nach längerer Downtime“). E-Mail-Benachrichtigung bei Start-Fehlern und Job-Ausfällen ist seit 2026-07-12 ebenfalls erledigt (U-8, siehe eigener Abschnitt oben) — ein echter Sendetest mit dem eingerichteten Robot-Account steht noch aus. </w:t>
-      </w:r>
-      <w:r>
-        <w:rPr>
-          <w:b/>
-        </w:rPr>
-        <w:t>Weiterhin offen:</w:t>
-      </w:r>
-      <w:r>
-        <w:t xml:space="preserve"> ein Backoff bei dauerhaftem Scheduler-Job-Ausfall über den Cooldown hinaus (z. B. exponentiell steigende Wiederholungs-Intervalle statt des festen Job-Takts, siehe „Scheduler-Jobs“ oben). Die aggregierte Status-Übersicht selbst ist inzwischen Teil der Remote-Steuer-Seite geworden (Abschnitt 13).</w:t>
+        <w:t xml:space="preserve">Die drei ungeschützten Start-Schritte sind seit 2026-07-12 abgesichert (siehe oben), ebenso der sofortige erste Preis-Lauf und der staleness-bewusste Sofort-Trigger für die Kurs-/OHLC-Historie-Jobs nach jedem Neustart (siehe „Verhalten nach längerer Downtime“). E-Mail-Benachrichtigung bei Start-Fehlern und Job-Ausfällen (U-8) sowie bei Marktscan-Kaufkandidaten (MS-1b) ist seit 2026-07-12 erledigt, ebenso der Job-Ausfall-Backoff (siehe „Scheduler-Jobs“ oben) — damit ist die komplette Betriebssicherheits-Liste aus diesem Kapitel abgearbeitet. Die aggregierte Status-Übersicht selbst ist inzwischen Teil der Remote-Steuer-Seite geworden (Abschnitt 13).</w:t>
       </w:r>
     </w:p>
     <w:p>
@@ -8803,7 +8894,7 @@
         <w:t>ERLEDIGT, war hier gelistet (2026-07-12):</w:t>
       </w:r>
       <w:r>
-        <w:t xml:space="preserve"> die 3 ungeschützten Start-Schritte (config.yaml/DB/Erstimport) sind jetzt abgesichert (Kap. 12), ebenso die E-Mail-Benachrichtigung bei Start-Fehlern und Job-Ausfällen (U-8) — nur ein Backoff bei dauerhaftem Job-Ausfall über den Cooldown hinaus bleibt weiterhin offen.</w:t>
+        <w:t xml:space="preserve"> die 3 ungeschützten Start-Schritte (config.yaml/DB/Erstimport) sind jetzt abgesichert (Kap. 12), ebenso die E-Mail-Benachrichtigung bei Start-Fehlern/Job-Ausfällen/Marktscan-Kaufkandidaten (U-8/MS-1b) und der Job-Ausfall-Backoff — die komplette Betriebssicherheits-Liste aus Kap. 12 ist damit abgearbeitet.</w:t>
       </w:r>
     </w:p>
     <w:sectPr>

</xml_diff>

<commit_message>
Regelwerksmanual: Watchdog+Tray-Monitor und Batch-Signal-Berechnung dokumentiert
Neue Abschnitte in Kap. 5/12: Tray-Farben/Menue/Crash-Log-Pfad/Einmal-Setup
fuer den Watchdog, sowie die gemessenen Groq-Token-Zahlen/Budget-Logik/
Ausschluss-Regeln/E-Mail-Digest-Verhalten fuer die Batch-Signal-Berechnung.
Neue Zeilen in den Scheduler-Jobs- und Manuell-Aktionen-Tabellen.

Co-Authored-By: Claude Haiku 4.5 <noreply@anthropic.com>
</commit_message>
<xml_diff>
--- a/Basisinfos/Regelwerksmanual.docx
+++ b/Basisinfos/Regelwerksmanual.docx
@@ -3410,6 +3410,48 @@
       <w:tr>
         <w:tc>
           <w:tcPr>
+            <w:tcW w:type="dxa" w:w="2436"/>
+          </w:tcPr>
+          <w:p>
+            <w:r>
+              <w:t>signal_batch</w:t>
+            </w:r>
+          </w:p>
+        </w:tc>
+        <w:tc>
+          <w:tcPr>
+            <w:tcW w:type="dxa" w:w="2436"/>
+          </w:tcPr>
+          <w:p>
+            <w:r>
+              <w:t>1× täglich, fix 05:00 Uhr</w:t>
+            </w:r>
+          </w:p>
+        </w:tc>
+        <w:tc>
+          <w:tcPr>
+            <w:tcW w:type="dxa" w:w="2436"/>
+          </w:tcPr>
+          <w:p>
+            <w:r>
+              <w:t>Batch-Signal-Berechnung: die am längsten überfälligen Krypto-Assets bekommen automatisch eine echte Groq-Analyse (Budget-begrenzt, siehe unten)</w:t>
+            </w:r>
+          </w:p>
+        </w:tc>
+        <w:tc>
+          <w:tcPr>
+            <w:tcW w:type="dxa" w:w="2436"/>
+          </w:tcPr>
+          <w:p>
+            <w:r>
+              <w:t>Groq (budget-limitiert)</w:t>
+            </w:r>
+          </w:p>
+        </w:tc>
+      </w:tr>
+      <w:tr>
+        <w:tc>
+          <w:tcPr>
             <w:tcW w:type="dxa" w:w="2268"/>
           </w:tcPr>
           <w:p>
@@ -3600,6 +3642,96 @@
       </w:r>
       <w:r>
         <w:t xml:space="preserve"> bleibt der Job wie gehabt deaktiviert (P-8) — dann gilt weiterhin nur der manuelle Sync bzw. die Eingabe im Portfolio-Tab.</w:t>
+      </w:r>
+    </w:p>
+    <w:p>
+      <w:pPr/>
+      <w:r>
+        <w:rPr>
+          <w:b/>
+        </w:rPr>
+        <w:t xml:space="preserve">Batch-Signal-Berechnung (2026-07-13, NEU). </w:t>
+      </w:r>
+      <w:r>
+        <w:rPr>
+          <w:b w:val="0"/>
+        </w:rPr>
+        <w:t>Ausgelöst durch die Beobachtung, dass der Signale-Tab fast überall „-“ zeigte — Signal-Berechnung ist bewusst manuell (jeder Lauf kostet einen echten Groq-Aufruf), aber bei 54 Watchlist-Assets (35 aktiv + 19 watchlist-Status) unpraktisch, wenn niemand 54× einzeln klicken kann, gerade im 24/7-Betrieb ohne Handy-App.</w:t>
+      </w:r>
+    </w:p>
+    <w:p>
+      <w:pPr/>
+      <w:r>
+        <w:rPr>
+          <w:b/>
+        </w:rPr>
+        <w:t xml:space="preserve">Gemessen statt geschätzt: </w:t>
+      </w:r>
+      <w:r>
+        <w:rPr>
+          <w:b w:val="0"/>
+        </w:rPr>
+        <w:t>Groq Free-Tier erlaubt zwar 1.000 Requests/Tag, aber nur 100.000 Tokens/Tag — und eine echte Signal-Berechnung in dieser App verbraucht ~5.600-6.000 Tokens (System-Prompt ~12.072 Zeichen/~3.450 Tokens, Fakten-JSON ~5.100-6.500 Zeichen, Antwort ~2.560 Zeichen — real gegen den Code gemessen, nicht geschätzt). Das Token-Limit ist die bindende Grenze: reales Maximum ~15-18 Berechnungen/Tag, nicht 1.000. Alle 54 Assets an einem Tag ist damit unmöglich.</w:t>
+      </w:r>
+    </w:p>
+    <w:p>
+      <w:pPr/>
+      <w:r>
+        <w:rPr>
+          <w:b/>
+        </w:rPr>
+        <w:t xml:space="preserve">Lösung: zweistufig wie Marktscan. </w:t>
+      </w:r>
+      <w:r>
+        <w:rPr>
+          <w:b w:val="0"/>
+        </w:rPr>
+        <w:t>Eine günstige Auswahl (reine Staleness-Sortierung — am längsten ohne echte Analyse zuerst, kein Groq-Aufruf) läuft über alle Krypto-Assets (Aktien/ETF/Rohstoffe ausgeschlossen — die Pipeline ist Krypto-only, siehe Spezifikation Kap. 11), die teure Groq-Analyse nur für eine budget-begrenzte Teilmenge (config.yaml signale_batch.taegliches_budget, Default 15). Stablecoins ebenfalls ausgeschlossen (A-1: bekommen strukturell nie ein echtes Signal, würden sonst wegen „nie berechnet“ dauerhaft ganz oben stehen). Bewusst KEIN Gate auf die 7-Tage-Schwelle bei der Auswahl selbst - das würde bei einer eingeschwungenen Rotation zeitweise Leerlauf und dann einen Stau erzeugen, siehe agent/krypto/signal_batch.py-Docstring.</w:t>
+      </w:r>
+    </w:p>
+    <w:p>
+      <w:pPr/>
+      <w:r>
+        <w:rPr>
+          <w:b/>
+        </w:rPr>
+        <w:t xml:space="preserve">Geteiltes Tagesbudget ohne eigene Zähltabelle: </w:t>
+      </w:r>
+      <w:r>
+        <w:rPr>
+          <w:b w:val="0"/>
+        </w:rPr>
+        <w:t>sowohl der tägliche Scheduler-Job als auch der manuelle „Fällige Signale jetzt berechnen“-Button (Signale-Tab) als auch der bestehende Einzel-Klick-Button zählen automatisch gegen dasselbe Budget, da alle drei in dieselbe signals-Tabelle schreiben (groq_raw_response IS NOT NULL AND created_at &gt;= heute). Lock-geschützt (signal_batch_lock, wie bei marktscan_lock) gegen einen gleichzeitigen Doppel-Lauf von Scheduler und manuellem Klick.</w:t>
+      </w:r>
+    </w:p>
+    <w:p>
+      <w:pPr/>
+      <w:r>
+        <w:rPr>
+          <w:b/>
+        </w:rPr>
+        <w:t xml:space="preserve">E-Mail nur bei echtem Anlass: </w:t>
+      </w:r>
+      <w:r>
+        <w:rPr>
+          <w:b w:val="0"/>
+        </w:rPr>
+        <w:t>anders als der Job-Ausfall-Cooldown gibt es hier keinen Cooldown, sondern ein Inhalts-Gate — eine E-Mail geht nur raus, wenn mindestens ein Ergebnis NICHT HALTEN ist (config.yaml signale_batch.benachrichtigung_email). Ein reiner HALTEN-Batch (der Normalfall) verschickt keine tägliche Spam-Mail.</w:t>
+      </w:r>
+    </w:p>
+    <w:p>
+      <w:pPr/>
+      <w:r>
+        <w:rPr>
+          <w:b/>
+        </w:rPr>
+        <w:t xml:space="preserve">Wichtiger Korrektheits-Fund beim Bauen: </w:t>
+      </w:r>
+      <w:r>
+        <w:rPr>
+          <w:b w:val="0"/>
+        </w:rPr>
+        <w:t>signals.gate_passed=True reicht NICHT als „hat eine echte Groq-Analyse bekommen“ — der AnalystResponseInvalid-Fallback-Pfad (kaputtes/unvollständiges JSON nach Retries) setzt gate_passed=True, aber groq_raw_response bleibt None. Korrektes Kriterium: groq_raw_response IS NOT NULL.</w:t>
       </w:r>
     </w:p>
     <w:p>
@@ -3762,6 +3894,38 @@
           <w:p>
             <w:r>
               <w:t>Zeigt alle bisherigen Signale des ausgewählten Assets inkl. Backward-Tracking-Ergebnis (Take-Profit/Stop-Loss/Offen/Abgelaufen) — reine Anzeige, kein externer Aufruf.</w:t>
+            </w:r>
+          </w:p>
+        </w:tc>
+      </w:tr>
+      <w:tr>
+        <w:tc>
+          <w:tcPr>
+            <w:tcW w:type="dxa" w:w="3249"/>
+          </w:tcPr>
+          <w:p>
+            <w:r>
+              <w:t>„Fällige Signale jetzt berechnen“ (2026-07-13, NEU)</w:t>
+            </w:r>
+          </w:p>
+        </w:tc>
+        <w:tc>
+          <w:tcPr>
+            <w:tcW w:type="dxa" w:w="3249"/>
+          </w:tcPr>
+          <w:p>
+            <w:r>
+              <w:t>Signale-Tab</w:t>
+            </w:r>
+          </w:p>
+        </w:tc>
+        <w:tc>
+          <w:tcPr>
+            <w:tcW w:type="dxa" w:w="3249"/>
+          </w:tcPr>
+          <w:p>
+            <w:r>
+              <w:t>Berechnet die am längsten überfälligen Krypto-Assets sofort statt beim nächsten 05:00-Scheduler-Lauf, respektiert dasselbe geteilte Tagesbudget (siehe oben) - kein separater Klick pro Asset nötig.</w:t>
             </w:r>
           </w:p>
         </w:tc>
@@ -7719,15 +7883,202 @@
         <w:pStyle w:val="Heading2"/>
       </w:pPr>
       <w:r>
-        <w:t>Empfehlung für den nächsten Schritt</w:t>
+        <w:t>Watchdog + Tray-Monitor (2026-07-13) — sichtbarer Status, einfacher Start/Stop</w:t>
       </w:r>
     </w:p>
     <w:p>
+      <w:pPr/>
+      <w:r>
+        <w:rPr>
+          <w:b/>
+        </w:rPr>
+        <w:t xml:space="preserve">Auslöser: </w:t>
+      </w:r>
+      <w:r>
+        <w:rPr>
+          <w:b w:val="0"/>
+        </w:rPr>
+        <w:t>Am 24/7-Notebook war die GUI über Nacht verschwunden, während Scheduler und Agent im Hintergrund unbeeindruckt weiterliefen — kein einziger Fehler stand in data/tradinginfotool.log. Da main.py's finally: bg_scheduler.shutdown(...) direkt nach app.mainloop() läuft, hätte ein echter Absturz auch den Scheduler mit heruntergefahren. Die wahrscheinlichere Erklärung: der Tk-Mainloop ist eingefroren/unsichtbar geworden (Display-Sleep, Tcl-Hänger o. ä.), und eventuelle Fehlerausgaben landeten im Leeren, weil beim Start per Verknüpfung keine Konsole angehängt ist (Tkinters Standard-Callback-Exception-Handling schreibt nur nach stderr).</w:t>
+      </w:r>
+    </w:p>
+    <w:p>
+      <w:pPr/>
+      <w:r>
+        <w:rPr>
+          <w:b/>
+        </w:rPr>
+        <w:t>Bewusst KEIN Windows-Service mit Auto-Restart</w:t>
+      </w:r>
+      <w:r>
+        <w:rPr>
+          <w:b w:val="0"/>
+        </w:rPr>
+        <w:t xml:space="preserve"> (Nutzer-Entscheidung): ein kaputter Auto-Restart-Loop wäre selbst ein stilles Fehlerbild, der Mensch soll in der Schleife bleiben. Stattdessen: ein separater Watchdog-Prozess (monitor/watchdog.py), der main.py als Kindprozess startet und unabhängig davon überwacht — ein Tray-Icon im selben Prozess wie ein hängender Tk-Mainloop wäre im schlimmsten Fall selbst mitbetroffen.</w:t>
+      </w:r>
+    </w:p>
+    <w:p>
+      <w:pPr/>
+      <w:r>
+        <w:rPr>
+          <w:b/>
+        </w:rPr>
+        <w:t>Funktionsweise:</w:t>
+      </w:r>
+    </w:p>
+    <w:p>
+      <w:pPr>
+        <w:pStyle w:val="ListBullet"/>
+      </w:pPr>
+      <w:r>
+        <w:rPr>
+          <w:b/>
+        </w:rPr>
+        <w:t xml:space="preserve">ui/app.py::_poll_prices() </w:t>
+      </w:r>
+      <w:r>
+        <w:rPr>
+          <w:b w:val="0"/>
+        </w:rPr>
+        <w:t>(bestehender 3-Sekunden-Tick) schreibt bei jedem Durchlauf einen Zeitstempel nach data/gui_heartbeat.txt — feuert nur, wenn der Tk-Event-Loop tatsächlich pumpt, beweist also „Fenster reagiert“ statt nur „Prozess existiert“.</w:t>
+      </w:r>
+    </w:p>
+    <w:p>
+      <w:pPr>
+        <w:pStyle w:val="ListBullet"/>
+      </w:pPr>
+      <w:r>
+        <w:rPr>
+          <w:b/>
+        </w:rPr>
+        <w:t xml:space="preserve">TradingInfoToolApp.report_callback_exception() </w:t>
+      </w:r>
+      <w:r>
+        <w:rPr>
+          <w:b w:val="0"/>
+        </w:rPr>
+        <w:t>routet Tk-Callback-Exceptions zusätzlich durch logging (landet in tradinginfotool.log).</w:t>
+      </w:r>
+    </w:p>
+    <w:p>
+      <w:pPr>
+        <w:pStyle w:val="ListBullet"/>
+      </w:pPr>
+      <w:r>
+        <w:rPr>
+          <w:b w:val="0"/>
+        </w:rPr>
+        <w:t>Der Watchdog startet main.py per subprocess.Popen(..., stdout=crash_log, stderr=crash_log) — alle bisher unsichtbaren Ausgaben landen jetzt in data/watchdog_crash.log (append, einfache 2-MB-Größenbremse statt echter Rotation).</w:t>
+      </w:r>
+    </w:p>
+    <w:p>
+      <w:pPr>
+        <w:pStyle w:val="ListBullet"/>
+      </w:pPr>
+      <w:r>
+        <w:rPr>
+          <w:b/>
+        </w:rPr>
+        <w:t xml:space="preserve">Tray-Icon-Farben: </w:t>
+      </w:r>
+      <w:r>
+        <w:rPr>
+          <w:b w:val="0"/>
+        </w:rPr>
+        <w:t>grau = startet gerade (erste 60s nach Spawn) / grün = läuft normal / gelb = Heartbeat seit &gt;30s veraltet (möglicher Hänger, Prozess aber noch da) / rot = Prozess beendet.</w:t>
+      </w:r>
+    </w:p>
+    <w:p>
+      <w:pPr>
+        <w:pStyle w:val="ListBullet"/>
+      </w:pPr>
+      <w:r>
+        <w:rPr>
+          <w:b/>
+        </w:rPr>
+        <w:t xml:space="preserve">Tray-Menü (Rechtsklick): </w:t>
+      </w:r>
+      <w:r>
+        <w:t>„Fenster anzeigen“ (holt das bestehende Tk-Fenster per Windows-API in den Vordergrund, OHNE main.py neu zu starten — passt zum Fall „Fenster nur unsichtbar/minimiert/verschoben“, fällt auf einen echten Neustart zurück, falls kein Fenster-Handle mehr gefunden wird), „Status-Details“ (öffnet die bestehende Remote-Steuer-Seite, Abschnitt 13, lokal auf 127.0.0.1:8765), „Neu starten“ (beendet + startet main.py komplett neu, für einen echten Absturz/Hänger), „Beenden“ (beendet main.py und den Watchdog selbst).</w:t>
+      </w:r>
+    </w:p>
+    <w:p>
+      <w:pPr>
+        <w:pStyle w:val="ListBullet"/>
+      </w:pPr>
+      <w:r>
+        <w:rPr>
+          <w:b/>
+        </w:rPr>
+        <w:t xml:space="preserve">Stop-Mechanismus bewusst einfach gehalten: </w:t>
+      </w:r>
+      <w:r>
+        <w:rPr>
+          <w:b w:val="0"/>
+        </w:rPr>
+        <w:t>terminate() (kein Graceful-Shutdown-Signal) — vertretbar, da die App durchgängig Connection-per-Call statt langlebiger DB-Transaktionen nutzt.</w:t>
+      </w:r>
+    </w:p>
+    <w:p>
+      <w:pPr>
+        <w:pStyle w:val="ListBullet"/>
+      </w:pPr>
+      <w:r>
+        <w:rPr>
+          <w:b/>
+        </w:rPr>
+        <w:t xml:space="preserve">Einfache PID-Datei </w:t>
+      </w:r>
+      <w:r>
+        <w:rPr>
+          <w:b w:val="0"/>
+        </w:rPr>
+        <w:t>(data/watchdog.pid) verhindert einen versehentlichen zweiten Start (zwei main.py-Instanzen würden sich um dieselbe SQLite-Datei und Port 8765 streiten).</w:t>
+      </w:r>
+    </w:p>
+    <w:p>
+      <w:pPr/>
+      <w:r>
+        <w:rPr>
+          <w:b/>
+        </w:rPr>
+        <w:t xml:space="preserve">Einmaliges Setup pro Gerät </w:t>
+      </w:r>
+      <w:r>
+        <w:t>(nicht Teil des USB-Syncs, da der Windows-Desktop-Ordner nicht mitgenommen wird): powershell -ExecutionPolicy Bypass -File monitor\create_shortcut.ps1 — legt zwei identische Verknüpfungen TradingInfoTool.lnk an, auf dem Windows-Desktop UND im Start-Menü (startet jeweils pythonw.exe monitor\watchdog.py, kein Konsolenfenster). Die Start-Menü-Verknüpfung lässt sich per Rechtsklick → „An Taskleiste anheften“ dauerhaft in der Taskleiste verankern (native Windows-Funktion, kein zusätzlicher Code nötig).</w:t>
+      </w:r>
+    </w:p>
+    <w:p>
+      <w:pPr/>
+      <w:r>
+        <w:rPr>
+          <w:b/>
+        </w:rPr>
+        <w:t xml:space="preserve">Bekannte Grenze (bewusst so belassen für v1): </w:t>
+      </w:r>
+      <w:r>
+        <w:rPr>
+          <w:b w:val="0"/>
+        </w:rPr>
+        <w:t>kein automatischer Neustart bei einem echten Hänger/Absturz — der Nutzer muss den gelben/roten Tray-Status selbst bemerken und „Neu starten“ klicken. Ein möglicher Folgeschritt wäre ein lokaler /api/shutdown-Endpoint auf der bestehenden Remote-Seite für ein sauberes Stop-Signal statt terminate().</w:t>
+      </w:r>
+    </w:p>
+    <w:p>
+      <w:pPr>
+        <w:pStyle w:val="Heading2"/>
+      </w:pPr>
+      <w:r>
+        <w:t>Empfehlung für den nächsten Schritt</w:t>
+      </w:r>
+    </w:p>
+    <w:p>
       <w:pPr>
         <w:spacing w:after="160"/>
       </w:pPr>
       <w:r>
         <w:t xml:space="preserve">Die drei ungeschützten Start-Schritte sind seit 2026-07-12 abgesichert (siehe oben), ebenso der sofortige erste Preis-Lauf und der staleness-bewusste Sofort-Trigger für die Kurs-/OHLC-Historie-Jobs nach jedem Neustart (siehe „Verhalten nach längerer Downtime“). E-Mail-Benachrichtigung bei Start-Fehlern und Job-Ausfällen (U-8) sowie bei Marktscan-Kaufkandidaten (MS-1b) ist seit 2026-07-12 erledigt, ebenso der Job-Ausfall-Backoff (siehe „Scheduler-Jobs“ oben) — damit ist die komplette Betriebssicherheits-Liste aus diesem Kapitel abgearbeitet. Die aggregierte Status-Übersicht selbst ist inzwischen Teil der Remote-Steuer-Seite geworden (Abschnitt 13).</w:t>
+      </w:r>
+      <w:r>
+        <w:t xml:space="preserve"> Neu hinzugekommen (2026-07-13): Watchdog + Tray-Monitor für einfachen Start/Stop/Status vom Windows-Desktop aus (siehe oben) — der eigentliche Live-Test am 24/7-Notebook steht noch aus.</w:t>
       </w:r>
     </w:p>
     <w:p>

</xml_diff>

<commit_message>
Hebel-Trading Phase 1-3: Screening, Risiko-/Liquidationsformeln, Positions-Rekonstruktion
Deterministisches Zwei-Zweige-Screening (Trendfolge/Kontra) auf OI/Funding-
Rate/Konfluenz-Basis, RM-1/RM-10/RM-11/AZ-7-Risiko-Gate mit Liquidations-
preis-Schaetzung, und automatische Bitpanda-Margin-Positions-Rekonstruktion
(inkrementell syncfaehig) - alles gegen echte Konto-/Marktdaten verifiziert.

Dabei zwei Live-Funde korrigiert: ein zu enger UNIQUE-Constraint auf
hebel_triggers (Trendfolge und Kontra koennen unabhaengig dieselbe Richtung
vorschlagen) sowie ein Bug im urspruenglichen Scratchpad-Skript, der die
historische Positionsanzahl auf 311 statt korrekt 185 aufgeblaeht hatte
(126 Phantom-Nulleintraege) - beides in Doku und Memory nachgezogen.

Die eigentliche LLM-gestuetzte Empfehlung (Cerebras-Anbindung, Budget-
Allocator) ist bewusst noch nicht Teil dieser Phase.

Co-Authored-By: Claude Sonnet 5 <noreply@anthropic.com>
</commit_message>
<xml_diff>
--- a/Basisinfos/Regelwerksmanual.docx
+++ b/Basisinfos/Regelwerksmanual.docx
@@ -887,16 +887,7 @@
           </w:tcPr>
           <w:p>
             <w:r>
-              <w:t xml:space="preserve">Hebel: nur Long, max. </w:t>
-            </w:r>
-            <w:r>
-              <w:rPr>
-                <w:b/>
-              </w:rPr>
-              <w:t>3x</w:t>
-            </w:r>
-            <w:r>
-              <w:t>, Liquidationspreis muss ausgewiesen werden</w:t>
+              <w:t>Hebel: Long UND Short (Short nur beratend, Bitpanda kann es noch nicht ausführen), max. 10x (2026-07-14 kalibriert), eigenes Risiko-pro-Trade von 1% (statt 2% bei Spot), Liquidationspreis als Schätzung ausgewiesen</w:t>
             </w:r>
           </w:p>
         </w:tc>
@@ -906,7 +897,7 @@
           </w:tcPr>
           <w:p>
             <w:r>
-              <w:t>konfiguriert</w:t>
+              <w:t>Formel/Regelwerk fertig, Screening+Risiko-Formeln+Positions-Rekonstruktion als Code implementiert</w:t>
             </w:r>
           </w:p>
         </w:tc>
@@ -916,13 +907,7 @@
           </w:tcPr>
           <w:p>
             <w:r>
-              <w:rPr>
-                <w:b/>
-              </w:rPr>
-              <w:t>DEAKTIVIERT</w:t>
-            </w:r>
-            <w:r>
-              <w:t xml:space="preserve"> (Strategie S-6 aus) — eigenes, noch zu führendes Thema</w:t>
+              <w:t>DEAKTIVIERT (Strategie S-6 aus) — volles Design in Kap. 14, docs/hebel_positionsformel.md</w:t>
             </w:r>
           </w:p>
         </w:tc>
@@ -8824,123 +8809,91 @@
         <w:pStyle w:val="Heading2"/>
       </w:pPr>
       <w:r>
-        <w:t>Margin-/Hebel-Trading — Tag-Vokabular dokumentiert (RM-10/RM-11-Grundlage)</w:t>
+        <w:t>Margin-/Hebel-Trading — Rahmenbedingungen jetzt vollständig entschieden (2026-07-14)</w:t>
       </w:r>
     </w:p>
     <w:p>
-      <w:pPr>
-        <w:spacing w:after="160"/>
-      </w:pPr>
-      <w:r>
-        <w:t xml:space="preserve">Live in der Transaktionshistorie gefunden: </w:t>
-      </w:r>
-      <w:r>
-        <w:rPr>
-          <w:rFonts w:ascii="Consolas" w:hAnsi="Consolas"/>
-          <w:sz w:val="20"/>
-        </w:rPr>
-        <w:t>margin_trading.open</w:t>
-      </w:r>
-      <w:r>
-        <w:t xml:space="preserve"> (1828×), </w:t>
-      </w:r>
-      <w:r>
-        <w:rPr>
-          <w:rFonts w:ascii="Consolas" w:hAnsi="Consolas"/>
-          <w:sz w:val="20"/>
-        </w:rPr>
-        <w:t>margin_trading.borrow</w:t>
-      </w:r>
-      <w:r>
-        <w:t xml:space="preserve"> (811×), </w:t>
-      </w:r>
-      <w:r>
-        <w:rPr>
-          <w:rFonts w:ascii="Consolas" w:hAnsi="Consolas"/>
-          <w:sz w:val="20"/>
-        </w:rPr>
-        <w:t>margin_trading.close</w:t>
-      </w:r>
-      <w:r>
-        <w:t xml:space="preserve"> (622×), </w:t>
-      </w:r>
-      <w:r>
-        <w:rPr>
-          <w:rFonts w:ascii="Consolas" w:hAnsi="Consolas"/>
-          <w:sz w:val="20"/>
-        </w:rPr>
-        <w:t>margin_trading.repay</w:t>
-      </w:r>
-      <w:r>
-        <w:t xml:space="preserve"> (311×), </w:t>
-      </w:r>
-      <w:r>
-        <w:rPr>
-          <w:rFonts w:ascii="Consolas" w:hAnsi="Consolas"/>
-          <w:sz w:val="20"/>
-        </w:rPr>
-        <w:t>margin_trading.fee</w:t>
-      </w:r>
-      <w:r>
-        <w:t xml:space="preserve"> (311×) — echte historische Margin-Aktivität auf dem Account, jüngstes Ereignis ein "close" vom 07.05.2026, seitdem keine weitere Aktivität. Aktuell </w:t>
-      </w:r>
+      <w:pPr/>
+      <w:r>
+        <w:t>Status: Design fertig, Phase 1 (Screening) + Phase 2 (Risiko-/Liquidationsformeln) + Phase 3 (Positions-Rekonstruktion) sind gebaut und gegen echte Daten verifiziert. Noch offen: die LLM-gestützte Empfehlung selbst (Cerebras-Anbindung + Budget-Allocator), bis dahin liefert das Screening nur Kandidaten, aber noch keine fertige Kauf-/Verkaufsempfehlung. Volle technische Herleitung in docs/hebel_positionsformel.md, hier die für dich relevante Zusammenfassung.</w:t>
+      </w:r>
+    </w:p>
+    <w:p>
+      <w:pPr/>
       <w:r>
         <w:rPr>
           <w:b/>
         </w:rPr>
-        <w:t>keine offene Krypto-Margin-Position</w:t>
-      </w:r>
-      <w:r>
-        <w:t xml:space="preserve"> (Nutzer bestätigt); zwei offene Positionen in anderen Assetklassen bewusst außerhalb des Tool-Scopes. Bitpandas API bietet </w:t>
-      </w:r>
+        <w:t xml:space="preserve">RM-10 korrigiert: </w:t>
+      </w:r>
+      <w:r>
+        <w:rPr>
+          <w:b w:val="0"/>
+        </w:rPr>
+        <w:t>stand bisher als "nur Long, kein Short" — das war aber nur ein Bitpanda-Fakt (Bitpanda kann aktuell kein Short ausführen), keine bewusste Risiko-Entscheidung gegen Short. Short bleibt Teil der Empfehlungs-Logik (rein beratend wie überall sonst — der Agent führt nie selbst aus), du bekommst also auch Short-Empfehlungen angezeigt, kannst sie aktuell nur nicht über Bitpanda direkt umsetzen.</w:t>
+      </w:r>
+    </w:p>
+    <w:p>
+      <w:pPr/>
+      <w:r>
+        <w:t>Echte Bitpanda-Margin-Historie ausgewertet (rein lesend, dieselbe API wie beim Bestände-Abgleich): 185 vollständig geschlossene Positionen (22.09.2025 bis 07.05.2026) chronologisch rekonstruiert (Korrektur 2026-07-14: die ursprünglich hier notierte Zahl 311 war ein Bug im ersten Auswertungs-Skript — 126 Phantom-Einträge ohne echten Wert wurden mitgezählt; beim Bau des richtigen, wiederverwendbaren Codes aufgefallen und korrigiert): genutzter Hebel real klare Bitpanda-Stufen 2x/3x/5x/10x, Ø 6,44x je Einzelkauf — max_hebel deshalb von 3x auf 10x angehoben, der alte Wert war niedriger als die eigene bisherige Praxis. Ø Haltedauer nur 1,1 Tage (Min 0, Max 16,7) — laut Nutzer Marktreaktion, keine bewusste Kurzfrist-Strategie. 4 wahrscheinliche Liquidationen erkannt, obwohl Bitpandas API das nicht extra kennzeichnet — über eine Gebühren-Auffälligkeit gefunden (ca. 1 Prozentpunkt mehr Gebühr als normal, exakt Bitpandas dokumentierte Zwangsliquidations-Gebühr). Bewusst keine Testposition mit echtem Geld eröffnet — die vorhandenen Daten waren überzeugend genug.</w:t>
+      </w:r>
+    </w:p>
+    <w:p>
+      <w:pPr/>
       <w:r>
         <w:rPr>
           <w:b/>
         </w:rPr>
-        <w:t>keine Übersicht offener Positionen</w:t>
-      </w:r>
-      <w:r>
-        <w:t xml:space="preserve"> (nur den Bewegungs-Log) — eine künftige RM-10/RM-11-Umsetzung müsste Positionen aus </w:t>
-      </w:r>
-      <w:r>
-        <w:rPr>
-          <w:rFonts w:ascii="Consolas" w:hAnsi="Consolas"/>
-          <w:sz w:val="20"/>
-        </w:rPr>
-        <w:t>open</w:t>
-      </w:r>
-      <w:r>
-        <w:t>/</w:t>
-      </w:r>
-      <w:r>
-        <w:rPr>
-          <w:rFonts w:ascii="Consolas" w:hAnsi="Consolas"/>
-          <w:sz w:val="20"/>
-        </w:rPr>
-        <w:t>close</w:t>
-      </w:r>
-      <w:r>
-        <w:t>/</w:t>
-      </w:r>
-      <w:r>
-        <w:rPr>
-          <w:rFonts w:ascii="Consolas" w:hAnsi="Consolas"/>
-          <w:sz w:val="20"/>
-        </w:rPr>
-        <w:t>borrow</w:t>
-      </w:r>
-      <w:r>
-        <w:t>/</w:t>
-      </w:r>
-      <w:r>
-        <w:rPr>
-          <w:rFonts w:ascii="Consolas" w:hAnsi="Consolas"/>
-          <w:sz w:val="20"/>
-        </w:rPr>
-        <w:t>repay</w:t>
-      </w:r>
-      <w:r>
-        <w:t>-Paaren selbst rekonstruieren, das ist nicht trivial und bleibt ein offener Punkt für später.</w:t>
+        <w:t xml:space="preserve">Liquidationspreis-Formel (Schätzung, nie Bitpandas exakter Wert): </w:t>
+      </w:r>
+      <w:r>
+        <w:rPr>
+          <w:b w:val="0"/>
+        </w:rPr>
+        <w:t>Bitpanda veröffentlicht die genaue Formel nicht — unsere Schätzung ist bewusst konservativ (zeigt Liquidation eher zu früh als zu spät an): Long: Entry × (1 − 1/Hebel + Tage_gehalten × 0,0018); Short: Entry × (1 + 1/Hebel − Tage_gehalten × 0,0018). Die 0,18%/Tag-Finanzierungsgebühr lässt den Wert mit der Zeit näher rücken, auch ohne Kursbewegung — gegen die echte Historie geprüft, passt gut (nur 0,08 Prozentpunkte Abweichung im Schnitt).</w:t>
+      </w:r>
+    </w:p>
+    <w:p>
+      <w:pPr/>
+      <w:r>
+        <w:rPr>
+          <w:b/>
+        </w:rPr>
+        <w:t xml:space="preserve">Positionsgröße bei Hebel — eigener, niedrigerer Risikowert: </w:t>
+      </w:r>
+      <w:r>
+        <w:rPr>
+          <w:b w:val="0"/>
+        </w:rPr>
+        <w:t>Bei Spot riskierst du 2% pro Trade (RM-1). Bei Hebel setzen wir das bewusst auf 1% herunter — Gründe: Kurs kann in schnellen Bewegungen über den Stop-Loss hinweg direkt Richtung Liquidation springen (Slippage), dazu kommt die laufende Gebühr, und die 4 echten Liquidationen zeigen, dass das kein theoretisches Risiko ist. Der gewählte Hebel wird zusätzlich so gedeckelt, dass zwischen Stop-Loss und geschätztem Liquidationspreis immer ein Sicherheitsabstand bleibt (15-20%) — ein weiter Stop-Loss erlaubt also automatisch nur einen niedrigeren Hebel.</w:t>
+      </w:r>
+    </w:p>
+    <w:p>
+      <w:pPr/>
+      <w:r>
+        <w:t>Automatische Positions-Verfolgung (statt manueller Bestätigung) — gebaut: Sobald eine Hebel-Position wirklich offen ist, erkennt die App das automatisch aus den echten Bitpanda-Transaktionen (importer/bitpanda_margin_positions.py, alle 15 Min huckepack auf dem Hebel-Screening-Takt) — keine manuelle "ich hab's umgesetzt"-Bestätigung wie bei Spot-Signalen nötig. Grund: bei "den fragilsten, zeitkritischsten Positionen" (Nutzer-Einordnung) ist eine vergessene manuelle Bestätigung besonders riskant. Der geschätzte Liquidationspreis wird bei jedem Tick mit den echten verstrichenen Tagen neu berechnet. Aktuell keine offene Hebel-Position — dieser Pfad ist gebaut und mit einer künstlichen Testposition durchgespielt, aber noch nicht an einer echten offenen Position beobachtet.</w:t>
+      </w:r>
+    </w:p>
+    <w:p>
+      <w:pPr/>
+      <w:r>
+        <w:rPr>
+          <w:b/>
+        </w:rPr>
+        <w:t xml:space="preserve">Zusätzliche Sicherheitsregel aus AZ-7: </w:t>
+      </w:r>
+      <w:r>
+        <w:rPr>
+          <w:b w:val="0"/>
+        </w:rPr>
+        <w:t>in einem Extrem-Krise-Regime wird Hebel komplett deaktiviert, unabhängig von der reinen Rechnung; ansonsten tendiert die Empfehlung zum unteren Ende des sicher berechneten Hebel-Korridors statt zum Maximum.</w:t>
+      </w:r>
+    </w:p>
+    <w:p>
+      <w:pPr/>
+      <w:r>
+        <w:t>Noch offen (Phase 4+): die eigentliche LLM-Empfehlung (Cerebras-Anbindung + Budget-Allocator) — das Screening liefert bereits Kandidaten, aber noch keine fertige Kauf-/Verkaufsempfehlung mit Begründung; Marktscan-Umbau (Automatik-Zweig zentralisieren), Scheduler-Cutover, UI-Tab.</w:t>
       </w:r>
     </w:p>
     <w:p>
@@ -9065,7 +9018,7 @@
         <w:spacing w:after="80"/>
       </w:pPr>
       <w:r>
-        <w:t>RM-10 max. Hebel (3x, aktuell ohnehin deaktiviert)</w:t>
+        <w:t>RM-10 max. Hebel (10x, 2026-07-14 gegen echte Bitpanda-Historie kalibriert, aktuell ohnehin deaktiviert) — Liquidations-Sicherheitsmarge (15-20%, Mitte 0,175 als Startwert) und die Hebel-Trigger-Schwellenwerte selbst (OI-Änderung ±3%, Kursänderung ±2%, Long-Anteil 75%/25%) sind noch unbestätigte Platzhalter, siehe docs/hebel_positionsformel.md</w:t>
       </w:r>
     </w:p>
     <w:p>
@@ -9134,13 +9087,7 @@
         <w:spacing w:after="80"/>
       </w:pPr>
       <w:r>
-        <w:rPr>
-          <w:b/>
-        </w:rPr>
-        <w:t>NEU (2026-07-11):</w:t>
-      </w:r>
-      <w:r>
-        <w:t xml:space="preserve"> RM-10/RM-11 (Hebel) bräuchten eine Positions-Rekonstruktion aus den margin_trading.*-Transaktions-Tags (Kap. 14) — nicht trivial, Bitpanda liefert keine „offene Positionen“-Übersicht.</w:t>
+        <w:t>ERLEDIGT, Design UND Code (2026-07-14): RM-10/RM-11 (Hebel) Positions-Rekonstruktion aus den margin_trading.*-Transaktions-Tags (Kap. 14) — Logik gegen 185 echte historische Positionen (korrigierte Zahl, siehe dort) erfolgreich getestet, läuft automatisch alle 15 Min. Aktuell keine offene Position zum Live-Beobachten.</w:t>
       </w:r>
     </w:p>
     <w:p>

</xml_diff>

<commit_message>
Hebel-Trading Phase 4: Cerebras-Client + LLM-Analyst (echte KI-Empfehlung)
Neue zweite LLM-Ebene (api/cerebras.py, identisches Interface wie GroqClient)
+ agent/krypto/hebel_analyst.py (SYSTEM_PROMPT, Facts-Builder, Schema-
Validierung fuer das 7-Aktionen-Vokabular) + agent/krypto/hebel_pipeline.py
(Orchestrierung: Technische Analyse -> Regime -> Risiko-Vorpruefung -> LLM-
Call -> Risiko-Nachpruefung -> Speicherung). Neue Tabelle hebel_signals
(append-only, analog signals).

Verifiziert mit synthetischen Bull-/Krise-Extrem-Faellen gegen Cerebras sowie
einem echten End-to-End-Lauf gegen die Produktions-DB (AIOZ SHORT/Trendfolge
-> SHORT/ERÖFFNEN, 5x Hebel ohne Korrektur, plausible Zonen/Liquidationspreis).

Bewusst NICHT im 15-Min-Scheduler-Takt automatisiert - das uebernimmt der
noch zu bauende Budget-Allocator, der ueber Groq/Cerebras/Marktscan/Spot-
Rotation hinweg entscheidet, wann welcher Kandidat eine echte Analyse bekommt.

Co-Authored-By: Claude Sonnet 5 <noreply@anthropic.com>
</commit_message>
<xml_diff>
--- a/Basisinfos/Regelwerksmanual.docx
+++ b/Basisinfos/Regelwerksmanual.docx
@@ -897,7 +897,7 @@
           </w:tcPr>
           <w:p>
             <w:r>
-              <w:t>Formel/Regelwerk fertig, Screening+Risiko-Formeln+Positions-Rekonstruktion als Code implementiert</w:t>
+              <w:t>Formel/Regelwerk fertig, Screening+Risiko-Formeln+Positions-Rekonstruktion+KI-Empfehlung als Code implementiert</w:t>
             </w:r>
           </w:p>
         </w:tc>
@@ -8815,7 +8815,7 @@
     <w:p>
       <w:pPr/>
       <w:r>
-        <w:t>Status: Design fertig, Phase 1 (Screening) + Phase 2 (Risiko-/Liquidationsformeln) + Phase 3 (Positions-Rekonstruktion) sind gebaut und gegen echte Daten verifiziert. Noch offen: die LLM-gestützte Empfehlung selbst (Cerebras-Anbindung + Budget-Allocator), bis dahin liefert das Screening nur Kandidaten, aber noch keine fertige Kauf-/Verkaufsempfehlung. Volle technische Herleitung in docs/hebel_positionsformel.md, hier die für dich relevante Zusammenfassung.</w:t>
+        <w:t>Status: Design fertig, Phase 1 (Screening) + Phase 2 (Risiko-/Liquidationsformeln) + Phase 3 (Positions-Rekonstruktion) + Phase 4 (Cerebras-Anbindung + KI-Empfehlung) sind gebaut und gegen echte Daten verifiziert. Noch offen: der Budget-Allocator, der entscheidet, WANN welcher Kandidat automatisch eine KI-Empfehlung bekommt (Tagesbudget-Verteilung über Hebel/Marktscan/Spot-Rotation) - bis dahin läuft die KI-Empfehlung nur manuell/testweise, noch nicht automatisch im 15-Min-Takt. Volle technische Herleitung in docs/hebel_positionsformel.md, hier die für dich relevante Zusammenfassung.</w:t>
       </w:r>
     </w:p>
     <w:p>
@@ -8881,19 +8881,22 @@
         <w:rPr>
           <w:b/>
         </w:rPr>
-        <w:t xml:space="preserve">Zusätzliche Sicherheitsregel aus AZ-7: </w:t>
-      </w:r>
-      <w:r>
-        <w:rPr>
-          <w:b w:val="0"/>
-        </w:rPr>
-        <w:t>in einem Extrem-Krise-Regime wird Hebel komplett deaktiviert, unabhängig von der reinen Rechnung; ansonsten tendiert die Empfehlung zum unteren Ende des sicher berechneten Hebel-Korridors statt zum Maximum.</w:t>
+        <w:t xml:space="preserve">KI-Empfehlung selbst (Cerebras + Analyst) — gebaut: </w:t>
+      </w:r>
+      <w:r>
+        <w:t>aus einem Screening-Kandidaten wird jetzt eine vollständige Empfehlung mit Begründung, Kurszonen, Hebel-Vorschlag und Halte-Kriterium (gleicher Aufbau wie bei Spot-Signalen, plus Hebel-spezifische Felder wie "Einmal-Trade vs. Swing-Strategie"). Läuft über Cerebras (zweite, kostenlose KI-Ebene neben Groq) statt über dein bestehendes Groq-Tagesbudget, damit die Hebel-Empfehlungen die knappe Spot-/Marktscan-Kapazität nicht verdrängen. Dein gewählter Hebel-Vorschlag wird - wie überall im System - nie blind übernommen: die Sicherheitsregeln oben (Liquidations-Sicherheitsmarge, Extrem-Krise-Deaktivierung) werden danach nochmal deterministisch erzwungen. Echt gegen die Produktions-DB getestet: für AIOZ (ein automatisch erkannter Short-Kandidat) kam eine vollständige, plausible Empfehlung heraus (Short-Eröffnung, 5-facher Hebel, Kurszonen samt Liquidationspreis-Schätzung).</w:t>
       </w:r>
     </w:p>
     <w:p>
       <w:pPr/>
       <w:r>
-        <w:t>Noch offen (Phase 4+): die eigentliche LLM-Empfehlung (Cerebras-Anbindung + Budget-Allocator) — das Screening liefert bereits Kandidaten, aber noch keine fertige Kauf-/Verkaufsempfehlung mit Begründung; Marktscan-Umbau (Automatik-Zweig zentralisieren), Scheduler-Cutover, UI-Tab.</w:t>
+        <w:t>Zusätzliche Sicherheitsregel aus AZ-7: in einem Extrem-Krise-Regime wird Hebel komplett deaktiviert, unabhängig von der reinen Rechnung; ansonsten tendiert die Empfehlung zum unteren Ende des sicher berechneten Hebel-Korridors statt zum Maximum.</w:t>
+      </w:r>
+    </w:p>
+    <w:p>
+      <w:pPr/>
+      <w:r>
+        <w:t>Noch offen (Phase 5+): Budget-Allocator — entscheidet automatisch, wann welcher Kandidat (Hebel/Marktscan/Spot-Rotation) eine echte KI-Analyse bekommt, verteilt über euer gemeinsames Tagesbudget (siehe docs/budget_queue_design.md). Bis dahin läuft die Hebel-KI-Empfehlung nur manuell/testweise, nicht automatisch im 15-Min-Takt. Marktscan-Umbau (Automatik-Zweig zentralisieren), Scheduler-Cutover, UI-Tab.</w:t>
       </w:r>
     </w:p>
     <w:p>

</xml_diff>

<commit_message>
Remote-Neustart-Bruecke + Empfehlungs-E-Mails bei Spot-/Hebel-Signalen
Watchdog kann jetzt per Flag-Datei von der Remote-Steuer-Seite aus neu
gestartet werden (main.py kann sich nicht selbst neu starten), plus neue
Budget-Karte (Hebel/Marktscan/Spot) auf derselben Seite.

Jede handlungsrelevante Spot-/Hebel-Empfehlung aus dem automatischen
Budget-Allocator-Lauf loest jetzt eine E-Mail aus (HALTEN nie), mit
optionalem In-App-Schalter fuer "nur Bitpanda-gelistete Assets".
</commit_message>
<xml_diff>
--- a/Basisinfos/Regelwerksmanual.docx
+++ b/Basisinfos/Regelwerksmanual.docx
@@ -7815,6 +7815,50 @@
         <w:pStyle w:val="Heading2"/>
       </w:pPr>
       <w:r>
+        <w:t>Empfehlungs-E-Mails bei Spot-/Hebel-Signalen (2026-07-14)</w:t>
+      </w:r>
+    </w:p>
+    <w:p>
+      <w:pPr/>
+      <w:r>
+        <w:t>Zweck: U-8 war ursprünglich als „Desktop-Benachrichtigungen bei neuen Signalen“ gedacht (Spezifikation), umgesetzt wurde zunächst bewusst nur der schmalere Job-Ausfall-/Marktscan-Kandidaten-Teil — die eigentlichen Kauf-/Verkauf-Empfehlungen selbst lösten bislang KEINE E-Mail aus. Da der Nutzer selten am Notebook ist und die tatsächliche Umsetzung ohnehin manuell über die Bitpanda-App erfolgt (P-7, Advisory-only), schließt dies die Lücke: jede handlungsrelevante Spot- oder Hebel-Empfehlung löst jetzt eine eigene E-Mail aus.</w:t>
+      </w:r>
+    </w:p>
+    <w:p>
+      <w:pPr/>
+      <w:r>
+        <w:t>Handlungsrelevant heißt: alle Aktionen außer HALTEN (Spot: KAUFEN/VERKAUFEN/TAUSCHEN/NACHKAUFEN; Hebel: ERÖFFNEN/NACHKAUFEN/HEBEL_ERHÖHEN/HEBEL_SENKEN/TEILVERKAUF/SCHLIESSEN). HALTEN — der weitaus häufigste Fall — löst bewusst nie eine Mail aus.</w:t>
+      </w:r>
+    </w:p>
+    <w:p>
+      <w:pPr/>
+      <w:r>
+        <w:t>Nur automatische Läufe, keine manuellen Klicks: die E-Mail wird direkt im Budget-Allocator-Pfad (hebel_screening_job(), 15-Min-Takt) ausgelöst, NICHT wenn manuell im Signale-/Hebel-Tab „Signal berechnen“/„Jetzt analysieren“ geklickt wird — dann ist das Ergebnis ja bereits live sichtbar. Gleiches Prinzip wie bei MS-1b.</w:t>
+      </w:r>
+    </w:p>
+    <w:p>
+      <w:pPr/>
+      <w:r>
+        <w:t>Bitpanda-Listing-Filter (Schalter im Menü „Benachrichtigungen“): „E-Mail-Empfehlungen nur für Bitpanda-gelistete Assets“, Standard AN. Anders als Dark Mode sofort wirksam ohne Neustart (data/settings.json). Schlägt der Bitpanda-Listing-Abruf fehl, wird bewusst NICHT blockiert (P-10).</w:t>
+      </w:r>
+    </w:p>
+    <w:p>
+      <w:pPr/>
+      <w:r>
+        <w:t>Schalter: config.yaml benachrichtigung.email.empfehlungen_aktiv (zusätzlich zum globalen benachrichtigung.email.aktiv, gleiches Muster wie marktscan.benachrichtigung_email bei MS-1b).</w:t>
+      </w:r>
+    </w:p>
+    <w:p>
+      <w:pPr/>
+      <w:r>
+        <w:t>Bewusst zurückgestellt: eine gebündelte Tages-/Wochen-Zusammenfassung mit Performance-Rückblick (Backward-Tracking) wäre reizvoll, aber die Datenlage ist aktuell noch zu dünn (Stand 2026-07-14: von 30 Signalen haben 25 den Status „nicht_anwendbar“, 0 haben tatsächlich Take-Profit/Stop-Loss erreicht) — wird revisitiert, sobald mehr echte Outcome-Daten vorliegen. Backward-Tracking gilt bisher zudem NUR für Spot-Signale, nicht für Hebel.</w:t>
+      </w:r>
+    </w:p>
+    <w:p>
+      <w:pPr>
+        <w:pStyle w:val="Heading2"/>
+      </w:pPr>
+      <w:r>
         <w:t>Agent-Pipeline („Signal berechnen“) im Detail</w:t>
       </w:r>
     </w:p>
@@ -8111,31 +8155,13 @@
         <w:spacing w:after="160"/>
       </w:pPr>
       <w:r>
-        <w:rPr>
-          <w:b/>
-        </w:rPr>
-        <w:t>Was die Seite zeigt/kann:</w:t>
-      </w:r>
-      <w:r>
-        <w:t xml:space="preserve"> Portfolio-Gesamtwert, Anzahl veralteter Preise, letzter Marktscan (Kandidaten/Treffer), die letzten Fehlerzeilen aus dem Log — plus zwei Aktions-Buttons: </w:t>
-      </w:r>
-      <w:r>
-        <w:rPr>
-          <w:b/>
-        </w:rPr>
-        <w:t>„Preise aktualisieren“</w:t>
-      </w:r>
-      <w:r>
-        <w:t xml:space="preserve"> (Krypto + Aktien/ETF/Rohstoffe zusammen) und </w:t>
-      </w:r>
-      <w:r>
-        <w:rPr>
-          <w:b/>
-        </w:rPr>
-        <w:t>„Marktscan jetzt starten“</w:t>
-      </w:r>
-      <w:r>
-        <w:t>. Bewusst nur diese zwei in dieser Version — Backward-Tracking ist selten zeitkritisch, ein Bitpanda-Sync-Button wäre durch den echten authentifizierten API-Call sensibler, beides kann später nach demselben Muster ergänzt werden.</w:t>
+        <w:t>Was die Seite zeigt/kann: Portfolio-Gesamtwert, Anzahl veralteter Preise, letzter Marktscan (Kandidaten/Treffer), das gemeinsame LLM-Tagesbudget (Hebel/Marktscan/Spot-Rotation, siehe Kap. 14) mit Aufteilung je Verbraucher, die letzten Fehlerzeilen aus dem Log — plus drei Aktions-Buttons: „Preise aktualisieren“ (Krypto + Aktien/ETF/Rohstoffe zusammen), „Marktscan jetzt starten“ und „App neu starten (erzwingen)“. Backward-Tracking bleibt bewusst ohne eigenen Button (selten zeitkritisch), ein Bitpanda-Sync-Button waere durch den echten authentifizierten API-Call sensibler — beides kann spaeter nach demselben Muster ergaenzt werden.</w:t>
+      </w:r>
+    </w:p>
+    <w:p>
+      <w:pPr/>
+      <w:r>
+        <w:t>Neustart-Bruecke zum Watchdog (2026-07-14): main.py kann sich nicht selbst neu starten — ein haengender Tk-Mainloop kann sich nicht selbst beenden. Der Neustart-Button auf der Remote-Seite schreibt deshalb nur eine Flag-Datei (data/watchdog_restart_requested.txt), die der separate Watchdog-Prozess (Kap. 12) in seinem ohnehin laufenden 5-Sekunden-Takt aufgreift und ausfuehrt — kein neuer Netzwerk-Port, keine neue Auth (nutzt den bestehenden Zugriffs-Token dieser Seite). Der Button fragt vorher per Bestaetigungsdialog nach, da ein Neustart eine gerade laufende Analyse/Marktscan mitten drin abbricht. Bekannte Grenze: ist der Watchdog-Prozess selbst tot (nicht nur main.py), greift auch diese Bruecke nicht — dann hilft nur physischer Zugriff oder ein Notebook-Neustart.</w:t>
       </w:r>
     </w:p>
     <w:p>

</xml_diff>

<commit_message>
Cerebras Stunden-Rate-Limit + manuelle Fallbacks + Gemini als vierte LLM-Quelle
Cerebras-Client bekam ein zweites Sliding-Window fuer das Stunden-Limit
(150/Std., nicht nur 5/Min) - ein echter Notebook-Vorfall zeigte, dass
Cerebras bei komplett ausgefallenem Groq die gesamte Last tragen musste
und dabei ans bisher ungeschuetzte Stunden-Limit stiess.

Manueller Signal-Button und Batch-Button im Signale-Tab bekommen jetzt
denselben Groq-dann-Cerebras-Fallback wie der Hebel-Tab und der
automatische Budget-Allocator (Batch: pro Asset einzeln entschieden).

Neuer GeminiClient (api/gemini.py) als moegliche vierte Kapazitaetsquelle,
live gegen das echte Signal-Schema getestet (4/4 valide Analysen, ~15
Anfragen/Min empirisch bestaetigt) - noch nicht in main.py/den
Budget-Allocator verdrahtet.
</commit_message>
<xml_diff>
--- a/Basisinfos/Regelwerksmanual.docx
+++ b/Basisinfos/Regelwerksmanual.docx
@@ -7852,6 +7852,44 @@
       <w:pPr/>
       <w:r>
         <w:t>Bewusst zurückgestellt: eine gebündelte Tages-/Wochen-Zusammenfassung mit Performance-Rückblick (Backward-Tracking) wäre reizvoll, aber die Datenlage ist aktuell noch zu dünn (Stand 2026-07-14: von 30 Signalen haben 25 den Status „nicht_anwendbar“, 0 haben tatsächlich Take-Profit/Stop-Loss erreicht) — wird revisitiert, sobald mehr echte Outcome-Daten vorliegen. Backward-Tracking gilt bisher zudem NUR für Spot-Signale, nicht für Hebel.</w:t>
+      </w:r>
+    </w:p>
+    <w:p>
+      <w:pPr>
+        <w:pStyle w:val="Heading2"/>
+      </w:pPr>
+      <w:r>
+        <w:t>Cerebras-Stunden-Rate-Limit + manueller Signale-Fallback (2026-07-14)</w:t>
+      </w:r>
+    </w:p>
+    <w:p>
+      <w:pPr/>
+      <w:r>
+        <w:t>Realer Vorfall am Notebook: an einem Tag mit ungewöhnlich hoher Auslastung (komplette Hebel-Roadmap live entwickelt+getestet, plus normaler 15-Min-Takt) fiel Groqs Tageskontingent nachmittags komplett aus (erwartetes Verhalten, taegliches_budget_gesamt: 15 ist an Groqs realer Kapazität ausgerichtet). Dadurch musste Cerebras faktisch die gesamte restliche Tageslast tragen statt nur gelegentlichen Überlauf — und geriet dabei selbst in echte 429-Fehler, obwohl das Tageskontingent (~166 Calls/Tag) bei Weitem nicht ausgeschöpft war.</w:t>
+      </w:r>
+    </w:p>
+    <w:p>
+      <w:pPr/>
+      <w:r>
+        <w:t>Ursache: der Cerebras-Rate-Limiter (api/cerebras.py) schützte bisher nur vor dem 5-Anfragen/Minute-Limit, nicht vor dem separaten, ebenfalls per API-Headern bestätigten 150-Anfragen/Stunde-Limit. Bei nachhaltig ~4 Anfragen/Min (eigener Minuten-Puffer) kommt man auf 240/Std. — weit über der echten Stunden-Grenze.</w:t>
+      </w:r>
+    </w:p>
+    <w:p>
+      <w:pPr/>
+      <w:r>
+        <w:t>Fix: CerebrasClient._respect_rate_limit() hat jetzt zwei parallele Sliding-Windows (Minute UND Stunde, RATE_LIMIT_PER_HOUR = 140) — analog zum bestehenden Minuten-Fenster. Gilt automatisch für alle Aufrufer (Budget-Allocator, Hebel-Tab-Button, Marktscan-Writeups), da alle dieselbe CerebrasClient-Instanz aus main.py teilen.</w:t>
+      </w:r>
+    </w:p>
+    <w:p>
+      <w:pPr/>
+      <w:r>
+        <w:t>Zweiter, dabei gefundener Fund: sowohl der manuelle „Signal berechnen“-Button als auch der Batch-Button („Fällige Signale jetzt berechnen“) im Signale-Tab hatten — anders als der Hebel-Tab's „Jetzt analysieren“-Button und der automatische Budget-Allocator — gar keinen Cerebras-Fallback, ein Rest aus der Zeit vor Cerebras (Phase 4). Ein manueller Klick brach dadurch hart mit dem rohen Groq-429-Fehler ab, selbst wenn Cerebras noch Kapazität gehabt hätte. Beide jetzt nachgezogen (ui/signals_view.py::_run_pipeline() und agent/krypto/signal_batch.py::run_signal_batch(), identisches Groq-dann-Cerebras-Muster wie im Hebel-Tab — beim Batch pro Asset einzeln entschieden, kein gemeinsamer „Groq ist heute tot“-Kurzschluss für den ganzen Lauf). Damit haben jetzt alle drei manuellen KI-Auslöser (Einzel-Klick, Batch, Hebel) sowie der automatische Allocator denselben Fallback — volle Konsistenz.</w:t>
+      </w:r>
+    </w:p>
+    <w:p>
+      <w:pPr/>
+      <w:r>
+        <w:t>Wichtig zu wissen: scheitern bei einem Kandidaten sowohl Groq als auch Cerebras, wird in diesem Zyklus einfach nichts geschrieben (auch kein HALTEN-Platzhalter) — kein dauerhafter Datenverlust, der Kandidat gilt weiterhin als „fällig“ und wird beim nächsten 15-Min-Zyklus automatisch erneut versucht. Die Konsequenz ist Verzögerung, nicht Verlust.</w:t>
       </w:r>
     </w:p>
     <w:p>

</xml_diff>

<commit_message>
Gemini als dritte Fallback-Stufe + echter Tages-Zaehler-Fix + Halluzinations-Absicherung
Budget-Allocator-Kette erweitert auf Groq -> Cerebras -> Gemini (nach
Reife/Vertrauen sortiert, nicht nach roher Kapazitaet) - Reihenfolge laesst
sich ohne Backward-Tracking-Historie nicht weiter optimieren.

Dabei gefundener Bug behoben: Cerebras' Tagesbudget-Zaehler war eine lokale
Variable, die bei jedem 15-Min-Lauf zurueckgesetzt wurde und deshalb nie
wirklich eine Tagesobergrenze durchsetzte. Ersetzt durch einen echten,
DB-gestuetzten Zaehler ueber alle drei Budget-Allocator-Tiers.

Neue Absicherung gegen einen echten Gemini-Halluzinations-Fund (BTC/ETH-
spezifischer Text tauchte in einer SEI-Analyse auf) - erkennt und weist
Kreuzkontamination automatisch zurueck, mit Retry wie bei kaputtem JSON.

Gemini an allen vier bestehenden Fallback-Stellen ergaenzt (automatischer
Allocator, Hebel-Tab, Signale-Einzel- und Batch-Button).
</commit_message>
<xml_diff>
--- a/Basisinfos/Regelwerksmanual.docx
+++ b/Basisinfos/Regelwerksmanual.docx
@@ -7890,6 +7890,38 @@
       <w:pPr/>
       <w:r>
         <w:t>Wichtig zu wissen: scheitern bei einem Kandidaten sowohl Groq als auch Cerebras, wird in diesem Zyklus einfach nichts geschrieben (auch kein HALTEN-Platzhalter) — kein dauerhafter Datenverlust, der Kandidat gilt weiterhin als „fällig“ und wird beim nächsten 15-Min-Zyklus automatisch erneut versucht. Die Konsequenz ist Verzögerung, nicht Verlust.</w:t>
+      </w:r>
+    </w:p>
+    <w:p>
+      <w:pPr>
+        <w:pStyle w:val="Heading2"/>
+      </w:pPr>
+      <w:r>
+        <w:t>Gemini als dritte Fallback-Stufe + echte Tages-Zähler (2026-07-14)</w:t>
+      </w:r>
+    </w:p>
+    <w:p>
+      <w:pPr/>
+      <w:r>
+        <w:t>Qualitätsvergleich Groq/Cerebras/Gemini (zwei echte Testrunden gegen dieselben Assets) ergab: Gemini liefert am vollständigsten (immer Entry/Stop/Take-Zonen, auch bei HALTEN), hat aber einen echten Halluzinations-Fund (ETH-spezifischer Text tauchte in einer SEI-Analyse auf). Cerebras war 2/2 mal aggressiver als der Konsens der anderen beiden. Ohne Backward-Tracking-Historie lässt sich die Reihenfolge nicht weiter optimieren — Gemini wird deshalb als dritte, letzte Stufe ergänzt: Groq → Cerebras → Gemini, nach Reife/Vertrauen sortiert, nicht nach roher Kapazität.</w:t>
+      </w:r>
+    </w:p>
+    <w:p>
+      <w:pPr/>
+      <w:r>
+        <w:t>Halluzinations-Absicherung: eine neue Prüfung (agent/krypto/analyst.py::_pruefe_kreuzkontamination(), identisch in hebel_analyst.py) erkennt, wenn eine Antwort für ein Nicht-BTC/ETH-Asset den Begriff „Boden-Zielzone“ erwähnt — dieses Feature wird im Facts-JSON NUR für BTC/ETH überhaupt mitgeschickt, jede Erwähnung bei einem anderen Symbol ist also garantiert erfunden. Löst automatisch denselben Retry aus wie kaputtes JSON.</w:t>
+      </w:r>
+    </w:p>
+    <w:p>
+      <w:pPr/>
+      <w:r>
+        <w:t>Echter Tages-Zähler-Fix (Kern-Prinzip: „eine KI darf nicht durch einen eigenen Buchführungsfehler sterben“): Cerebras' bisheriger „Tagesbudget“-Zähler war eine lokale Variable, die bei jedem 15-Min-Lauf auf 0 zurückgesetzt wurde — die Tagesobergrenze wirkte also nie wirklich. Neue Funktion database/db.py::count_real_llm_calls_today_by_provider() zählt jetzt echt über alle drei Tiers hinweg, seit Mitternacht UTC. Gilt jetzt genauso für Gemini (gemini_taegliches_budget: 200) wie für Cerebras.</w:t>
+      </w:r>
+    </w:p>
+    <w:p>
+      <w:pPr/>
+      <w:r>
+        <w:t>Integration: wie beim Cerebras-Fix an allen vier Stellen ergänzt (Budget-Allocator automatisch, Hebel-Tab-Button, Signale-Einzel-Button, Signale-Batch-Button) — volle Konsistenz. GEMINI_API_KEY optional (P-8), ohne Key bleibt die Kette bei Groq→Cerebras wie zuvor.</w:t>
       </w:r>
     </w:p>
     <w:p>

</xml_diff>

<commit_message>
Fix: yfinance-ThreadPoolExecutor blockierte Prozess-Ende + Scheduler-Start
Notebook-Bug: App blieb beim Start dauerhaft im gelben Tray-Status haengen.
ThreadPoolExecutor-Worker sind nicht daemonisch - Pythons globaler atexit-Hook
joint beim Interpreter-Ende ALLE jemals erzeugten Executor-Threads, unabhaengig
vom shutdown(wait=False) der einzelnen Instanz. Ein haengender Yahoo-Finance-
Call blockierte dadurch das komplette Prozess-Beenden/Neustarten (real
reproduziert). Zusaetzlich liefen Wertpapier-Kursabrufe sequenziell (N x 15s
bei mehreren unerreichbaren Symbolen statt begrenzt auf 15s gesamt).

run_with_daemon_timeout() (echter threading.Thread(daemon=True) statt Executor)
ersetzt das Pattern in beiden betroffenen Modulen; fetch_price_snapshots() ruft
zusaetzlich alle Assets parallel mit gemeinsamer Deadline ab.

Co-Authored-By: Claude Sonnet 5 <noreply@anthropic.com>
</commit_message>
<xml_diff>
--- a/Basisinfos/Regelwerksmanual.docx
+++ b/Basisinfos/Regelwerksmanual.docx
@@ -8187,6 +8187,26 @@
         </w:pBdr>
         <w:spacing w:before="40" w:after="200"/>
       </w:pPr>
+    </w:p>
+    <w:p>
+      <w:pPr>
+        <w:pStyle w:val="Heading1"/>
+      </w:pPr>
+      <w:r>
+        <w:t>Bugfix: yfinance-Kursabrufe blockierten Prozess-Ende + Scheduler-Start (2026-07-15)</w:t>
+      </w:r>
+    </w:p>
+    <w:p>
+      <w:pPr/>
+      <w:r>
+        <w:t>Beim echten Notebook-Test hing die App beim Start dauerhaft im gelben („stale“) Tray-Status. Ursache: api/yfinance_client.py und api/yfinance_history.py schuetzten haltlose Yahoo-Finance-Aufrufe bisher je mit einem eigenen concurrent.futures.ThreadPoolExecutor(max_workers=1) + shutdown(wait=False). Zwei echte Probleme dabei: (1) Prozess-Ende blockiert - ThreadPoolExecutor-Worker sind nicht daemonisch, und Python registriert global einen atexit-Hook, der beim Interpreter-Ende ALLE jemals erzeugten Executor-Threads joint, unabhaengig vom shutdown() der einzelnen Instanz - ein einzelner haengender Yahoo-Finance-Call blockierte dadurch das komplette Prozess-Beenden/Neustarten (real reproduziert). (2) Scheduler-Start wirkte haengengeblieben - Wertpapier-Preise wurden sequenziell abgerufen, jedes Symbol mit eigenem bis zu 15s-Timeout - bei mehreren gleichzeitig unerreichbaren Symbolen summierte sich das auf N x 15s.</w:t>
+      </w:r>
+    </w:p>
+    <w:p>
+      <w:pPr/>
+      <w:r>
+        <w:t>Fix: neue Funktion run_with_daemon_timeout() (api/yfinance_client.py) nutzt einen echten threading.Thread(daemon=True) statt eines Executors - Daemon-Threads werden beim Interpreter-Exit nicht gejoint, sondern abrupt beendet. fetch_price_snapshots() ruft zusaetzlich alle Assets PARALLEL ab (ein Daemon-Thread je Asset) mit einer GEMEINSAMEN Gesamt-Deadline statt einer Summe von Einzel-Timeouts - Gesamtlaufzeit bleibt dadurch bei ca. 15s, unabhaengig von der Anzahl betroffener Assets. api/yfinance_history.py (identisches Muster dort dupliziert) nutzt jetzt denselben run_with_daemon_timeout()-Helper.</w:t>
+      </w:r>
     </w:p>
     <w:p>
       <w:pPr>

</xml_diff>

<commit_message>
Spot-Cooldown-Fix + Long/Short-GUI-Schalter für Hebel
Tier 3 (Spot-Rotation) im Budget-Allocator hatte anders als Hebel/Marktscan
(Tier 1/2) keinen Cooldown - bei ~40 Krypto-Assets im 15-Min-Takt rotierte
das System komplett alle ~40 Minuten durch statt täglich (real bestätigt:
234 Spot-Signale an einem Tag für nur 40 Symbole, Notebook-Erschöpfungs-
Vorfall 2026-07-12 bis 07-15). select_assets_due_for_signal() bekommt jetzt
einen echten cooldown_stunden-Parameter (Default 20h, config.yaml
budget_allocator.spot_cooldown_stunden).

Zusätzlich neues Menü "Hebel" → "Nur Long analysieren": filtert SHORT-
Kandidaten schon vor dem LLM-Aufruf heraus (13 von 14 echten Hebel-
ERÖFFNEN-Empfehlungen waren SHORT, auf Bitpanda aber nicht ausführbar).

Co-Authored-By: Claude Sonnet 5 <noreply@anthropic.com>
</commit_message>
<xml_diff>
--- a/Basisinfos/Regelwerksmanual.docx
+++ b/Basisinfos/Regelwerksmanual.docx
@@ -9424,6 +9424,18 @@
       <w:pPr/>
       <w:r>
         <w:t>Nachbesserung (2026-07-15, Nutzer-Nachfrage 'welche Regeln fehlen noch?'): die Bewertungs-/Bubble-Risiko-Regel verglich anfangs nur das trailing-KGV, ohne Wachstumsdaten mitzuschicken - ein erster Testlauf bewertete PLTRs hohes KGV faelschlich als 'ohne erkennbares Wachstum', obwohl real ein Gewinnwachstum von +325%/Umsatzwachstum von +85% vorlag. Fundamentaldaten erweitert um Forward-KGV, Gewinn-/Umsatzwachstum, Dividendenrendite und Analysten-Konsens+Kursziel (nur als niedrig gewichtete Drittmeinung, nie als eigene Empfehlung). Zweiter Testlauf bestaetigt eine deutlich fundiertere Einordnung (Wachstum UND Bubble-Risiko gemeinsam korrekt benannt statt einer unfundierten Behauptung).</w:t>
+      </w:r>
+    </w:p>
+    <w:p>
+      <w:pPr/>
+      <w:r>
+        <w:t>Nachtrag: echter Spot-Cooldown-Fix (2026-07-15, nach einem echten 3-Provider-Erschoepfungs-Vorfall am Notebook, Details in Memory project_llm_budget_ueberlast_2026-07-15). Tier 1 (Hebel) und Tier 2 (Marktscan) hatten schon immer einen echten Cooldown (3,5 Std.), Tier 3 (Spot-Rotation) dagegen keinen - select_assets_due_for_signal() sortierte nur nach Staleness, ohne Mindestabstand. Bei ~40 Krypto-Assets und einem 15-Minuten-Takt bedeutete das eine komplette Rotation alle ~40 Minuten statt taeglich - real bestaetigt mit 234 Spot-Signalen an einem Tag fuer nur 40 distinkte Symbole. Fix: neuer cooldown_stunden-Parameter (Default SPOT_COOLDOWN_STUNDEN = 20, config.yaml budget_allocator.spot_cooldown_stunden) - gilt automatisch auch fuer den manuellen 'Faellige Signale jetzt berechnen'-Button.</w:t>
+      </w:r>
+    </w:p>
+    <w:p>
+      <w:pPr/>
+      <w:r>
+        <w:t>Nachtrag: GUI-Schalter 'Nur Long' fuer Hebel-Kandidaten (2026-07-15, Nutzer-Wunsch). Von 14 tatsaechlichen Hebel-ERGOEFFNEN-Empfehlungen waren 13 SHORT, nur 1 LONG - Bitpanda kann Hebel-Short aber gar nicht ausfuehren. Neues Menue 'Hebel' -&gt; 'Nur Long analysieren' (ui/settings.py::hebel_richtung_modus, LIVE wirksam) filtert SHORT-Kandidaten schon VOR dem Cooldown-Check/LLM-Aufruf heraus - direkter Hebel auf die tatsaechliche Aufrufzahl, keine nachtraegliche Filterung.</w:t>
       </w:r>
     </w:p>
     <w:sectPr>

</xml_diff>

<commit_message>
Liquidationspreis-Schaetzung korrigiert: Maintenance-Margin-Puffer fehlte
Echter Nutzer-Fund an einer offenen LINK-Position: estimate_liquidation_
price() ignorierte den unbekannten Bitpanda-Maintenance-Margin-Puffer
komplett (Liquidation erst bei Eigenkapital=0) - Bitpandas realer
Liquidationspreis lag ~7% hoeher (LONG, loest frueher aus) als die alte
Schaetzung, also in die unsichere statt die beabsichtigte "lieber zu frueh
warnen"-Richtung.

liquidations_sicherheitsmarge_relativ (bisher nur in max_safe_hebel())
wird jetzt mathematisch (aus Eigenkapital/Positionswert-Verhaeltnis
hergeleitet) auch in die Schaetzung selbst eingerechnet - mit dem aus dem
echten Fall zurueckgerechneten Wert reproduziert die Formel Bitpandas
realen Preis fast exakt.

Co-Authored-By: Claude Sonnet 5 <noreply@anthropic.com>
</commit_message>
<xml_diff>
--- a/Basisinfos/Regelwerksmanual.docx
+++ b/Basisinfos/Regelwerksmanual.docx
@@ -9736,6 +9736,32 @@
       <w:pPr/>
       <w:r>
         <w:t>Verifikation: synthetischer Test fuer alle drei Tabs, je ein Fall ohne und mit tatsaechlicher Datenaenderung - alle 6 Faelle bestanden.</w:t>
+      </w:r>
+    </w:p>
+    <w:p>
+      <w:r>
+        <w:rPr>
+          <w:b/>
+        </w:rPr>
+        <w:t>Nachtrag Kap. 2/RM-11 (2026-07-16): Liquidationspreis-Schaetzung korrigiert</w:t>
+      </w:r>
+    </w:p>
+    <w:p>
+      <w:pPr/>
+      <w:r>
+        <w:t>Echter Nutzer-Fund an einer offenen LINK-Position: estimate_liquidation_price() ignorierte den unbekannten Bitpanda-Maintenance-Margin-Puffer komplett. Bitpandas realer Liquidationspreis lag ca. 7% HOEHER (LONG, loest frueher aus) als die alte Schaetzung - also in die unsichere statt die dokumentierte 'lieber zu frueh warnen'-Richtung.</w:t>
+      </w:r>
+    </w:p>
+    <w:p>
+      <w:pPr/>
+      <w:r>
+        <w:t>Fix: liquidations_sicherheitsmarge_relativ (bisher nur in max_safe_hebel() verwendet) wird jetzt auch in die Liquidationspreis-Schaetzung selbst eingerechnet, mathematisch aus Eigenkapital/Positionswert-Verhaeltnis hergeleitet. Mit dem empirischen Wert (~6,5%) reproduziert die Formel den echten Fall fast exakt (6,3505 EUR vs. real 6,3515 EUR). Mit dem konfigurierten, bewusst groesseren Wert (17,5%) bleibt die angezeigte Schaetzung zusaetzlich konservativ.</w:t>
+      </w:r>
+    </w:p>
+    <w:p>
+      <w:pPr/>
+      <w:r>
+        <w:t>Ebenfalls geprueft: Bitpandas oeffentliche API bietet keinerlei Einsicht in offene Stop-Loss-/Take-Profit-Limit-Orders (weder eigener Code noch offizielle Doku kennen einen solchen Endpunkt) - nur Wallet-Salden und bereits ausgefuehrte Trades sind zugaenglich.</w:t>
       </w:r>
     </w:p>
     <w:sectPr>

</xml_diff>

<commit_message>
Detail-Panel-Fix korrigiert: Guard kam wegen asynchronem Tk-Event zu spaet
Nutzer-Fund NACH echtem App-Neustart: das Detail-Panel im Hebel-Tab
resettete die Scroll-Position weiterhin, obwohl der heutige Fix schon
aktiv war. Ursache per echtem mainloop()-Test bestaetigt: <<TreeviewSelect>>
feuert bei selection_set() nicht synchron, sondern verzoegert ueber die
Tcl-Event-Queue - der Guard wurde im finally-Block bereits VOR dem
tatsaechlichen Event-Feuern zurueckgesetzt und unterdrueckte es deshalb
nicht. Ein synchroner Test ohne echten mainloop() hatte das nie gezeigt.

Fix: Guard jetzt per self.after_idle() zurueckgesetzt (nach allen bereits
anstehenden Events) statt sofort - in allen drei betroffenen Views
(signals_view.py, marktscan_view.py, hebel_view.py).

Co-Authored-By: Claude Sonnet 5 <noreply@anthropic.com>
</commit_message>
<xml_diff>
--- a/Basisinfos/Regelwerksmanual.docx
+++ b/Basisinfos/Regelwerksmanual.docx
@@ -9762,6 +9762,38 @@
       <w:pPr/>
       <w:r>
         <w:t>Ebenfalls geprueft: Bitpandas oeffentliche API bietet keinerlei Einsicht in offene Stop-Loss-/Take-Profit-Limit-Orders (weder eigener Code noch offizielle Doku kennen einen solchen Endpunkt) - nur Wallet-Salden und bereits ausgefuehrte Trades sind zugaenglich.</w:t>
+      </w:r>
+    </w:p>
+    <w:p>
+      <w:r>
+        <w:rPr>
+          <w:b/>
+        </w:rPr>
+        <w:t>Nachtrag (2026-07-16, zweite Runde): Detail-Panel-Fix griff nach Neustart trotzdem nicht - Guard kam zu spaet</w:t>
+      </w:r>
+    </w:p>
+    <w:p>
+      <w:pPr/>
+      <w:r>
+        <w:t>Nutzer-Fund NACH einem echten App-Neustart mit dem ersten Fix: das Detail-Panel im Hebel-Tab resettete die Scroll-Position weiterhin bei einem bereits berechneten Signal. Der erste Fix (Guard direkt im finally-Block zuruecksetzen) hatte in einem synchronen Test (kein laufender mainloop()) funktioniert, aber in der echten App versagt.</w:t>
+      </w:r>
+    </w:p>
+    <w:p>
+      <w:pPr/>
+      <w:r>
+        <w:t>Ursache (per echtem mainloop()-Test bestaetigt): Tk feuert &lt;&lt;TreeviewSelect&gt;&gt; NICHT synchron innerhalb von selection_set(), sondern haengt das virtuelle Event hinten an die Tcl-Event-Queue an - zugestellt erst beim naechsten Event-Loop-Durchlauf. Der Guard wurde aber sofort im finally-Block zurueckgesetzt, lange bevor das verzoegerte Event ankam. Ein synchroner Test ohne echten mainloop() bekommt das verzoegerte Event nie zugestellt und haette den Bug nie gezeigt.</w:t>
+      </w:r>
+    </w:p>
+    <w:p>
+      <w:pPr/>
+      <w:r>
+        <w:t>Fix: Guard wird jetzt per self.after_idle(self._clear_suppress_select_event) zurueckgesetzt statt sofort im finally-Block - after_idle() laeuft erst, nachdem alle bereits anstehenden Events (inkl. des verzoegerten &lt;&lt;TreeviewSelect&gt;&gt;) abgearbeitet wurden.</w:t>
+      </w:r>
+    </w:p>
+    <w:p>
+      <w:pPr/>
+      <w:r>
+        <w:t>Verifiziert: neuer Tk-Smoke-Test mit ECHTEM laufenden mainloop() fuer alle drei Tabs - bestaetigt kein Re-Render ohne Datenaenderung UND weiterhin korrektes Re-Render bei tatsaechlicher Aenderung.</w:t>
       </w:r>
     </w:p>
     <w:sectPr>

</xml_diff>

<commit_message>
Backward-Tracking-Cron: Nachhol-Mechanismus fuer verpassten 06:00-Termin
Log-Analyse der Notebook-Daten zeigte: zwei offene Hebel-Signale (AIOZ,
CAT) waren seit 07-14 nie geprueft worden (outcome_geprueft_am = null),
obwohl die durchschnittliche Hebel-Haltedauer (~1,1 Tage) laengst eine
Ausloesung erwarten liesse. Ursache: der feste 06:00-Cron fuer
backward_tracking_job fiel an ZWEI aufeinanderfolgenden Tagen (07-15,
07-16) komplett aus - die App lief zu diesem Zeitpunkt nicht.
APScheduler holt einen verpassten festen Cron-Termin nicht automatisch
nach (anders als Intervall-Jobs).

Fix: neuer Wasserstand meta.backward_tracking_last_run_date, von
backward_tracking_job() bei Erfolg aktualisiert. Neue
backward_tracking_catchup_if_missed() prueft synchron beim App-Start, ob
der heutige Termin erledigt wurde, holt sonst sofort nach - kein
Mehrfach-Lauf bei mehreren Neustarts am selben Tag.

Co-Authored-By: Claude Sonnet 5 <noreply@anthropic.com>
</commit_message>
<xml_diff>
--- a/Basisinfos/Regelwerksmanual.docx
+++ b/Basisinfos/Regelwerksmanual.docx
@@ -9794,6 +9794,38 @@
       <w:pPr/>
       <w:r>
         <w:t>Verifiziert: neuer Tk-Smoke-Test mit ECHTEM laufenden mainloop() fuer alle drei Tabs - bestaetigt kein Re-Render ohne Datenaenderung UND weiterhin korrektes Re-Render bei tatsaechlicher Aenderung.</w:t>
+      </w:r>
+    </w:p>
+    <w:p>
+      <w:r>
+        <w:rPr>
+          <w:b/>
+        </w:rPr>
+        <w:t>Nachtrag Kap. 7 (2026-07-17): echter Betriebsfehler - 06:00-Cron zwei Tage in Folge ausgefallen</w:t>
+      </w:r>
+    </w:p>
+    <w:p>
+      <w:pPr/>
+      <w:r>
+        <w:t>Beim erneuten Pruefen des Datenstands fuer Schritt 3 (KI-Trimm-Vorschlaege) fiel auf: die zwei aeltesten offenen Hebel-EROEFFNEN-Signale (AIOZ, CAT, beide vom 07-14) hatten outcome_geprueft_am = null - nicht nur 'weiterhin offen', sondern nie geprueft, obwohl die durchschnittliche Hebel-Haltedauer (~1,1 Tage) laengst eine Ausloesung erwarten liess.</w:t>
+      </w:r>
+    </w:p>
+    <w:p>
+      <w:pPr/>
+      <w:r>
+        <w:t>Log-Abgleich bestaetigte die Ursache: der backward_tracking-Cron (fest auf 6 Uhr) ist an ZWEI aufeinanderfolgenden Tagen (07-15 und 07-16) komplett ausgefallen - die App lief zu diesem Zeitpunkt schlicht nicht. APScheduler holt einen an einem festen Zeitpunkt verpassten Cron-Termin NICHT automatisch nach, wenn der Prozess zu diesem Zeitpunkt gar nicht laeuft.</w:t>
+      </w:r>
+    </w:p>
+    <w:p>
+      <w:pPr/>
+      <w:r>
+        <w:t>Fix: neuer Wasserstand meta.backward_tracking_last_run_date, von backward_tracking_job() bei jedem erfolgreichen Lauf aktualisiert. Neue Funktion backward_tracking_catchup_if_missed() prueft beim App-Start synchron, ob der heutige Termin bereits erledigt wurde; falls nicht, wird sofort nachgeholt - kein Mehrfach-Lauf bei mehreren Neustarts am selben Tag.</w:t>
+      </w:r>
+    </w:p>
+    <w:p>
+      <w:pPr/>
+      <w:r>
+        <w:t>Einordnung: dasselbe Resilienz-Prinzip wie bereits bei refresh_prices_job/refresh_securities_prices_job (Kap. 12), hier fuer einen festen Cron-Termin statt eines Intervall-Jobs. Verifiziert: 4 synthetische Tests.</w:t>
       </w:r>
     </w:p>
     <w:sectPr>

</xml_diff>

<commit_message>
Backtesting-Engine + Erfolgsmetrik: Fundament fuer Selbstverifikations-Schritt 3
Neue agent/krypto/backtesting.py simuliert die bestehenden deterministischen
Regeln (Indikator-Konfluenz, CRV_MINIMUM/STOP_LOSS_ATR_MULTIPLE aus risk_gate.py)
tagesweise gegen die gespeicherte price_history_ohlc-Historie - loest den
Kern-Engpass der laufenden Machbarkeits-Analyse (zu wenig echte, aufgeloeste
Signale) unabhaengig vom Ausgang der noch offenen Governance-Frage. Bewusst
NUR Spot, vereinfachtes Nur-BTC-Trend-Regime, kein Ersatz fuer den echten
LLM-Entscheidungsschritt (siehe Docstring-Grenzen). 7 synthetische Tests +
echter Lauf gegen BTC/ETH/SOL/LINK verifiziert.

Regelwerksmanual Kap. 7 ausserdem um eine erstmals festgelegte Erfolgsmetrik
ergaenzt (CRV primaer, Trefferquote/Drawdown sekundaer, 30-Faelle-Mindest-
schwelle) - Voraussetzung dafuer, dass ein spaeterer Anpassungsvorschlag
ueberhaupt objektiv bewertet werden kann.

Co-Authored-By: Claude Sonnet 5 <noreply@anthropic.com>
</commit_message>
<xml_diff>
--- a/Basisinfos/Regelwerksmanual.docx
+++ b/Basisinfos/Regelwerksmanual.docx
@@ -9826,6 +9826,90 @@
       <w:pPr/>
       <w:r>
         <w:t>Einordnung: dasselbe Resilienz-Prinzip wie bereits bei refresh_prices_job/refresh_securities_prices_job (Kap. 12), hier fuer einen festen Cron-Termin statt eines Intervall-Jobs. Verifiziert: 4 synthetische Tests.</w:t>
+      </w:r>
+    </w:p>
+    <w:p>
+      <w:r>
+        <w:rPr>
+          <w:b/>
+        </w:rPr>
+        <w:t>Nachtrag Kap. 7 (2026-07-17): Erfolgsmetrik fuer Schritt 3 (Regel-Anpassungsvorschlaege) festgelegt</w:t>
+      </w:r>
+    </w:p>
+    <w:p>
+      <w:pPr/>
+      <w:r>
+        <w:t>Warum das jetzt schon noetig ist, obwohl die Governance-Frage von Schritt 3 (automatisch vs. Nutzer-Bestaetigung) noch offen ist: ohne eine vorher festgelegte Metrik laesst sich ein spaeterer KI- oder Nutzer-Vorschlag ('Regel X mit Wert Y statt Z ist besser kalibriert') nicht objektiv pruefen - das gilt unabhaengig davon, wer am Ende entscheidet. Diese Festlegung ist deshalb eine reine Dokumentations-Ergaenzung, keine Verhaltensaenderung.</w:t>
+      </w:r>
+    </w:p>
+    <w:p>
+      <w:pPr/>
+      <w:r>
+        <w:t>Primaermetrik: realisiertes CRV (bereits vorhanden) - durchschnittlich ueber alle aufgeloesten Signale einer Regel-Variante, getrennt nach Spot und Hebel. Begruendung: bildet direkt das urspruengliche Z-2-Versprechen ab (Chance im Verhaeltnis zum Risiko) und ist bereits Teil der bestehenden Datenstruktur.</w:t>
+      </w:r>
+    </w:p>
+    <w:p>
+      <w:pPr/>
+      <w:r>
+        <w:t>Sekundaermetriken (zur Einordnung, nicht als alleiniger Massstab): Trefferquote (Anteil Take-Profit an allen entschiedenen Signalen, bereits Teil der Provider-Performance-Karte) und maximaler Drawdown einer simulierten/realen Signal-Sequenz - Letzteres erstmals ueber die Backtesting-Engine (siehe unten) berechenbar.</w:t>
+      </w:r>
+    </w:p>
+    <w:p>
+      <w:pPr/>
+      <w:r>
+        <w:t>Mindest-Stichprobe vor jeder Bewertung: ein einzelner Vorschlag wird erst ab 30 aufgeloesten Faellen je Regel-Variante ueberhaupt in Betracht gezogen, idealerweise geprueft in zwei nicht-ueberlappenden Teilzeitraeumen (ein Muster muss in beiden auftauchen, um nicht auf eine einzelne Marktphase ueberzufittet zu sein). Diese Schwelle ist bewusst vorlaeufig.</w:t>
+      </w:r>
+    </w:p>
+    <w:p>
+      <w:r>
+        <w:rPr>
+          <w:b/>
+        </w:rPr>
+        <w:t>Nachtrag Kap. 7 (2026-07-17): Backtesting-Engine - bestehende Regeln rueckwirkend gegen historische Kursdaten simulieren</w:t>
+      </w:r>
+    </w:p>
+    <w:p>
+      <w:pPr/>
+      <w:r>
+        <w:t>Warum: der groesste praktische Engpass fuer Schritt 3 ist nicht fehlendes Koennen, sondern fehlende Zeit - echte KAUFEN/EROEFFNEN-Signale loesen sich nur mit der Geschwindigkeit auf, mit der neue Signale entstehen. Das Projekt verfuegt aber bereits ueber eine mehrjaehrige Kurshistorie (price_history_ohlc), die bisher nur fuer Charts und Backward-Tracking genutzt wird, nicht aber, um die AKTUELLEN Regeln testweise gegen die Vergangenheit laufen zu lassen.</w:t>
+      </w:r>
+    </w:p>
+    <w:p>
+      <w:pPr/>
+      <w:r>
+        <w:t>Umfang: rein analytisch, kein Live-Verhalten wird geaendert. Nimmt die bereits vorhandene, deterministische Regel-Logik (Indikatoren, Regime-Klassifikation, Risikomanagement-Schwellenwerte) und wendet sie Tag fuer Tag auf die gespeicherte Kurshistorie an, als waere jeder Tag ein neuer Lauf in der Vergangenheit - erzeugt so synthetische, aber methodisch identische Signal-Ergebnisse, die genauso wie echte Signale nach CRV/Trefferquote/Drawdown ausgewertet werden koennen. Der eigentliche KI-Anteil (Prompt an Groq/Cerebras/Gemini) ist dabei bewusst AUSSER Betracht - nur der deterministische Regel-Teil ist rueckwirkend reproduzierbar.</w:t>
+      </w:r>
+    </w:p>
+    <w:p>
+      <w:pPr/>
+      <w:r>
+        <w:t>Wo im Code: agent/krypto/backtesting.py (siehe Kap. 11 fuer den vollstaendigen Verweis).</w:t>
+      </w:r>
+    </w:p>
+    <w:p>
+      <w:r>
+        <w:rPr>
+          <w:b/>
+        </w:rPr>
+        <w:t>Nachtrag (2026-07-17): Backtesting-Engine verifiziert</w:t>
+      </w:r>
+    </w:p>
+    <w:p>
+      <w:pPr/>
+      <w:r>
+        <w:t>7 synthetische Tests (Stop-Loss-Prioritaet bei Gleichzeitigkeit, CRV-Berechnung, 'Ende der Historie' vs. 'Haltefrist abgelaufen', CRV exakt auf CRV_MINIMUM skaliert, zu kurze Historie ohne Crash, Flanken-Trigger verhindert Dutzende korrelierte Trades in einem einzigen Trend) + echter Lauf gegen die Produktions-DB (BTC/ETH/SOL/LINK, 2025-02 bis 2026-07): 12-21 synthetische Trades je Symbol, Trefferquote 24-33%, durchschnittliches CRV negativ (-0,03 bis -0,46) in diesem Zeitfenster.</w:t>
+      </w:r>
+    </w:p>
+    <w:p>
+      <w:pPr/>
+      <w:r>
+        <w:t>Einordnung: kein Widerspruch zur echten Signalqualitaet - die vereinfachte Konfluenz-Regel ersetzt bewusst NICHT die mehrfaktorielle KI-Bewertung. Das Ergebnis zeigt, dass das gewaehlte Zeitfenster fuer eine reine 'Konfluenz-bullish + 2:1-CRV'-Heuristik unguenstig war - plausibel, kein Hinweis auf einen Fehler in der Engine selbst.</w:t>
+      </w:r>
+    </w:p>
+    <w:p>
+      <w:pPr/>
+      <w:r>
+        <w:t>agent/krypto/backtesting.py in Kap. 11 (Code-Referenzen) ergaenzt.</w:t>
       </w:r>
     </w:p>
     <w:sectPr>

</xml_diff>

<commit_message>
RM-4-Cash-Reserve-Werte bestaetigt statt [OFFEN]
10%/2.000 EUR-Hybrid-Formel bleibt unveraendert - nach Ruecksprache als
bewaehrte Hausnummer akzeptiert statt weiter als Platzhalter markiert.
Revisit-Bedingung dokumentiert (config.yaml + Regelwerksmanual + Memory)
fuer den Fall, dass die Werte in der Praxis mal zu eng/zu locker sind.
RM-4 bleibt bewusst getrennt vom AZ-4-Cash-Reserve-Ziel (unterschiedliche
Fragen: Sicherheits-Floor vs. strategische Nachkauf-Zielgroesse).

Co-Authored-By: Claude Sonnet 5 <noreply@anthropic.com>
</commit_message>
<xml_diff>
--- a/Basisinfos/Regelwerksmanual.docx
+++ b/Basisinfos/Regelwerksmanual.docx
@@ -933,6 +933,12 @@
       </w:r>
     </w:p>
     <w:p>
+      <w:pPr/>
+      <w:r>
+        <w:t>Nachtrag (2026-07-17): beide RM-4-Werte bestaetigt, nicht mehr [OFFEN]. Nach Ruecksprache bleiben 10%/2.000 EUR unveraendert - bewaehrte Hausnummer als Liquiditaetspuffer/Overtrading-Bremse, in der Praxis bereits durch einen bewussten zusaetzlichen Cash-Puffer ueber dem Minimum bestaetigt. Revisit-Bedingung: sollten diese Werte in der Praxis einmal ein echtes Problem verursachen (zu eng oder zu locker), erneut aufgreifen - siehe Memory project_portfolio_vollstaendigkeit_cash_staking.md. Wichtig: RM-4 bleibt bewusst getrennt vom AZ-4-Cash-Reserve-Ziel - RM-4 ist der harte Sicherheits-Floor, das AZ-4-Ziel eine strategische Zielgroesse fuer eine geplante Nachkaufkampagne.</w:t>
+      </w:r>
+    </w:p>
+    <w:p>
       <w:pPr>
         <w:spacing w:after="160"/>
       </w:pPr>
@@ -9109,24 +9115,6 @@
       </w:pPr>
       <w:r>
         <w:t>RM-2 Core-Allokations-Limit (35 % für BTC/ETH) — nachträglich erhöht, weil die reale BTC-Allokation das alte 25%-Limit überschritt; „BTC hat den Lead“-Frage insgesamt noch nicht grundsätzlich besprochen.</w:t>
-      </w:r>
-    </w:p>
-    <w:p>
-      <w:pPr>
-        <w:pStyle w:val="ListBullet"/>
-        <w:spacing w:after="80"/>
-      </w:pPr>
-      <w:r>
-        <w:t xml:space="preserve">RM-4 Cash-Reserve-Minimum (10 % </w:t>
-      </w:r>
-      <w:r>
-        <w:rPr>
-          <w:b/>
-        </w:rPr>
-        <w:t>und</w:t>
-      </w:r>
-      <w:r>
-        <w:t xml:space="preserve"> der neue Festbetrag 2000 €, beide vorläufig)</w:t>
       </w:r>
     </w:p>
     <w:p>

</xml_diff>

<commit_message>
Selektiver Holdings-Sync statt voller DB-Kopie
Manuelle Einstandspreis-Overrides (holdings.avg_buy_price_manual_eur)
werden jetzt automatisch in eine kleine, gitignored JSON-Datei
exportiert (bei jeder Aenderung) und beim App-Start automatisch wieder
eingelesen (init_db()) - schuetzt Phantom-Zeilen-frei nur existierende
holdings-Eintraege. Ersetzt fuer diesen Anwendungsfall die volle
tradinginfotool.db-Kopie beim USB-Stick-Sync, die sonst die laufend
selbst erzeugten Produktivdaten des 24/7-Notebooks (Signale, Hebel-
Positionen, Preis-Historie etc.) ueberschreiben wuerde.

Co-Authored-By: Claude Sonnet 5 <noreply@anthropic.com>
</commit_message>
<xml_diff>
--- a/Basisinfos/Regelwerksmanual.docx
+++ b/Basisinfos/Regelwerksmanual.docx
@@ -9980,6 +9980,32 @@
       <w:pPr/>
       <w:r>
         <w:t>Neu: api/mistral.py::MistralClient (identisches .chat()-Interface). Verdrahtet in budget_allocator.py, signal_batch.py, scheduler/background.py, main.py, ui/app.py/hebel_view.py/signals_view.py, remote/server.py. Verifiziert: 8 synthetische Tests plus ein echter Live-API-Testaufruf gegen api.mistral.ai (2026-07-17, nachdem der Nutzer den Key in die .env eingetragen hat): einfacher Chat-Call sowie ein Call mit response_format={"type": "json_object"} (exakt das Format aus analyst.py:656) beide erfolgreich - Mistral verhaelt sich formatkompatibel zu den anderen drei OpenAI-kompatiblen Anbietern.</w:t>
+      </w:r>
+    </w:p>
+    <w:p>
+      <w:r>
+        <w:rPr>
+          <w:b/>
+        </w:rPr>
+        <w:t>Nachtrag (2026-07-17): Selektiver Desktop&lt;-&gt;Notebook-Sync fuer manuelle Einstandspreise</w:t>
+      </w:r>
+    </w:p>
+    <w:p>
+      <w:pPr/>
+      <w:r>
+        <w:t>Ausloeser: beim Vervollstaendigen der Einstandspreise fuer 13 Bitpanda-Stocks-Positionen (Aktien/ETF/Rohstoffe - Kostenbasis nicht automatisch berechenbar, da diese Produktklasse im /wallets/transactions-Feed gar nicht auftaucht, live bestaetigt) stellte sich die Frage, wie diese manuellen Werte zuverlaessig aufs 24/7-Notebook kommen, ohne die dortige laufend selbst erzeugte Produktivdaten-Historie (signals/hebel_*/price_history*/macro_snapshot/marktscan_candidates/api_health_status) durch eine volle DB-Kopie zu ueberschreiben.</w:t>
+      </w:r>
+    </w:p>
+    <w:p>
+      <w:pPr/>
+      <w:r>
+        <w:t>Loesung: database/db.py::HOLDINGS_MANUAL_OVERRIDES_PATH (data/holdings_manual_overrides.json, gitignored wie Assets.xlsx) - enthaelt nur {symbol: avg_buy_price_manual_eur} fuer alle Zeilen mit gesetztem Override. export_holdings_manual_overrides() schreibt die Datei automatisch bei jedem set_holding_avg_buy_price_manual()-Aufruf neu (egal ob ueber den Portfolio-Tab-Dialog oder ein Skript). import_holdings_manual_overrides() liest sie automatisch bei jedem init_db()-Durchlauf (jeder App-Start) ein - nur fuer Symbole mit bereits existierender holdings-Zeile (kein Phantom-Anlegen), idempotent, beruehrt keine andere Tabelle.</w:t>
+      </w:r>
+    </w:p>
+    <w:p>
+      <w:pPr/>
+      <w:r>
+        <w:t>Fuer den USB-Stick-Sync bedeutet das: ab jetzt genuegt diese eine kleine JSON-Datei statt der gesamten tradinginfotool.db - wird beim naechsten Start automatisch angewendet, ohne laufende Produktivdaten zu gefaehrden. Verifiziert: echter Simulationstest (DB-Kopie, Overrides zurueckgesetzt, init_db() komplett durchlaufen - Werte korrekt wiederhergestellt), Phantom-Symbol-Schutztest, Regressionstest auf frischer leerer DB.</w:t>
       </w:r>
     </w:p>
     <w:sectPr>

</xml_diff>

<commit_message>
BUGFIX: 'Nur Long' griff nicht bei offenen Hebel-Short-Positionen
_offene_positionen_als_kandidaten() (offene Hebel-Positionen als eigene
Kandidatenquelle) wurde vom hebel_richtung_modus-Filter bisher nicht
erfasst - nur frisch entdeckte Trigger-Kandidaten (hebel_pending) waren
gefiltert. Offene SHORT-Positionen bekamen dadurch weiterhin unbegrenzt
LLM-Neubewertungen und darueber unnoetige Short-Empfehlungs-E-Mails,
obwohl "Nur Long" aktiv war. Gleicher Filter jetzt konsistent auch auf
diesen zweiten Kandidatenpfad angewendet.

Verifiziert: echter End-to-End-Lauf gegen run_budget_allocator() mit
realer temporaerer DB (offene LONG+SHORT-Position) - nur_long laesst
korrekt nur LONG durch, beide-Modus weiterhin unveraendert.

Co-Authored-By: Claude Sonnet 5 <noreply@anthropic.com>
</commit_message>
<xml_diff>
--- a/Basisinfos/Regelwerksmanual.docx
+++ b/Basisinfos/Regelwerksmanual.docx
@@ -10006,6 +10006,38 @@
       <w:pPr/>
       <w:r>
         <w:t>Fuer den USB-Stick-Sync bedeutet das: ab jetzt genuegt diese eine kleine JSON-Datei statt der gesamten tradinginfotool.db - wird beim naechsten Start automatisch angewendet, ohne laufende Produktivdaten zu gefaehrden. Verifiziert: echter Simulationstest (DB-Kopie, Overrides zurueckgesetzt, init_db() komplett durchlaufen - Werte korrekt wiederhergestellt), Phantom-Symbol-Schutztest, Regressionstest auf frischer leerer DB.</w:t>
+      </w:r>
+    </w:p>
+    <w:p>
+      <w:r>
+        <w:rPr>
+          <w:b/>
+        </w:rPr>
+        <w:t>Nachtrag (2026-07-17): BUGFIX - Nur Long griff nicht bei offenen Short-Positionen</w:t>
+      </w:r>
+    </w:p>
+    <w:p>
+      <w:pPr/>
+      <w:r>
+        <w:t>Ausloeser: Nutzer meldete weiterhin unnoetige Short-Empfehlungs-E-Mails, obwohl hebel_richtung_modus: nur_long (Einstellungen-Dialog) aktiv war.</w:t>
+      </w:r>
+    </w:p>
+    <w:p>
+      <w:pPr/>
+      <w:r>
+        <w:t>Ursache gefunden (Code-Review): die Einstellung filterte in budget_allocator.py nur hebel_pending (frisch entdeckte Trigger-Kandidaten, seit 2026-07-15). Die zweite, unabhaengige Kandidatenquelle _offene_positionen_als_kandidaten() (seit 2026-07-16, garantiert bestehenden offenen Hebel-Positionen eine regelmaessige KI-Neubewertung) hatte KEINEN Richtungsfilter - offene SHORT-Positionen wurden weiterhin unbegrenzt dem LLM vorgelegt, neue Signale erzeugt, und scheduler/background.py::_notify_hebel_signal() prueft die Richtung seinerseits nicht (nur action != HALTEN) - jedes daraus entstehende Signal wurde gemailt.</w:t>
+      </w:r>
+    </w:p>
+    <w:p>
+      <w:pPr/>
+      <w:r>
+        <w:t>Fix: derselbe if hebel_richtung_modus == "nur_long":-Filter (richtung == RICHTUNG_LONG) jetzt auch auf _offene_positionen_als_kandidaten()-Ergebnisse angewendet, bevor der Cooldown-Filter laeuft - konsistent mit der bereits bestehenden Filterung von hebel_pending.</w:t>
+      </w:r>
+    </w:p>
+    <w:p>
+      <w:pPr/>
+      <w:r>
+        <w:t>Verifiziert: echter End-to-End-Lauf gegen run_budget_allocator() mit einer echten temporaeren SQLite-DB (zwei offene Positionen: BTC LONG, ETH SHORT) - im Modus nur_long erreicht nur BTC den (gemockten) LLM-Aufruf, ETH wird korrekt herausgefiltert. Regressionstest: im Modus beide erreichen weiterhin beide Positionen den LLM-Aufruf.</w:t>
       </w:r>
     </w:p>
     <w:sectPr>

</xml_diff>

<commit_message>
Bugfix: Bitpanda-Listing-Status fuer Aktien/Rohstoffe/Hedge in Watchlist anzeigen
ui/app.py zeigte fuer alle Nicht-Krypto-Assets hartkodiert "-" in der
Bitpanda-Spalte, mit der Begruendung "ergibt fuer Nicht-Krypto keinen
Sinn". Das stimmte 2026-07-09, war aber seit 2026-07-16 ueberholt:
agent/aktien/pipeline.py und agent/rohstoff/pipeline.py berechnen den
echten Bitpanda-Listing-Status seither laengst fuer den Risk-Gate-Veto,
er wurde nur nie in der Watchlist-UI angezeigt.

Laedt jetzt zusaetzlich den Nicht-Krypto-Asset-Katalog
(get_listed_non_crypto_assets()) und zeigt echten Status fuer Aktien,
Rohstoff-ETCs und die Hedge-ETFs DBPK/3QSS einheitlich an.

Co-Authored-By: Claude Sonnet 5 <noreply@anthropic.com>
</commit_message>
<xml_diff>
--- a/Basisinfos/Regelwerksmanual.docx
+++ b/Basisinfos/Regelwerksmanual.docx
@@ -10563,6 +10563,57 @@
       </w:r>
       <w:r>
         <w:t xml:space="preserve"> Themen-ETFs (Phase 3) und Discovery (Phase 4) der Multi-Asset-Roadmap - eigene, spaetere Themen. EIA-Erdgaslager/COMEX-Lagerbestaende/ETF-Bestandsfluesse als Rohstoff-Datenquellen-Erweiterung.</w:t>
+      </w:r>
+    </w:p>
+    <w:p>
+      <w:r>
+        <w:rPr>
+          <w:b/>
+        </w:rPr>
+        <w:t>Nachtrag (2026-07-18, gleicher Tag): Bugfix Bitpanda-Listing-Spalte fuer Aktien/Rohstoffe/Hedge</w:t>
+      </w:r>
+    </w:p>
+    <w:p>
+      <w:r>
+        <w:rPr>
+          <w:b/>
+        </w:rPr>
+      </w:r>
+      <w:r>
+        <w:t>Nutzer-Fund: die Watchlist zeigte fuer alle Nicht-Krypto-Assets (Aktien, ETFs, Rohstoffe/ETCs) in der "Bitpanda"-Spalte hartkodiert "-", statt eines echten Haken/Kreuz-Status. Ursache war eine seit 2026-07-09 bestehende, seit dem 2026-07-16-Ausbau ueberholte Annahme in ui/app.py::_refresh_watchlist_from_db(): "Bitpanda-Listing-Check ergibt fuer Nicht-Krypto keinen Sinn". Das stimmte zum Zeitpunkt des urspruenglichen Kommentars (reines Krypto-Multi-Asset-Tracking), war aber seit api/bitpanda.py::get_listed_non_crypto_assets() (2026-07-16, schliesst die Aktien-Pipeline-Luecke) nicht mehr aktuell: agent/aktien/pipeline.py und agent/rohstoff/pipeline.py berechnen den echten Listing-Status seither laengst fuer den Bitpanda-Veto (risk_gate.py::pre_check()) - er wurde nur nie in der allgemeinen Watchlist-UI angezeigt.</w:t>
+      </w:r>
+    </w:p>
+    <w:p>
+      <w:r>
+        <w:rPr>
+          <w:b/>
+        </w:rPr>
+        <w:t>Fix:</w:t>
+      </w:r>
+      <w:r>
+        <w:t xml:space="preserve"> ui/app.py laedt jetzt zusaetzlich zum bestehenden Krypto-Katalog (self._bitpanda_assets) den Nicht-Krypto-Katalog (self._bitpanda_non_crypto_assets, ueber get_listed_non_crypto_assets(), gleiches P-10-Fehlschlag-Verhalten: None bei Abrufsfehler statt falschem Wert). Die Zeilen-Render-Logik waehlt den passenden Katalog nach asset.assetklasse und nutzt fuer beide denselben bitpanda_is_listed()-Vergleich - keine getrennte Logik mehr fuer Krypto vs. Nicht-Krypto. Deckt damit einheitlich Aktien (stock), Rohstoff-ETCs (etc) UND die Hedge-ETFs DBPK/3QSS (etf, NON_CRYPTO_ASSET_GROUPS in api/bitpanda.py) ab.</w:t>
+      </w:r>
+    </w:p>
+    <w:p>
+      <w:r>
+        <w:rPr>
+          <w:b/>
+        </w:rPr>
+        <w:t>Verifiziert:</w:t>
+      </w:r>
+      <w:r>
+        <w:t xml:space="preserve"> Logik-Smoke-Test (Krypto BTC/ETH, Aktie PLTR, Rohstoff-ETC OD7H, Hedge-ETF DBPK, unbekanntes Symbol, sowie Katalog-Fehlschlag-Fall) - alle 7 Faelle korrekt.</w:t>
+      </w:r>
+    </w:p>
+    <w:p>
+      <w:r>
+        <w:rPr>
+          <w:b/>
+        </w:rPr>
+        <w:t>Nebenfund, noch offen:</w:t>
+      </w:r>
+      <w:r>
+        <w:t xml:space="preserve"> agent/rohstoff/analyst.py::build_facts() gibt aktien_baermarkt/equities_baermarkt (aus compute_current_regime()) nicht als LLM-Fakt weiter, obwohl Krypto-, Aktien- und Hedge-Analyst das tun - vermutlich ein Versehen beim Bau der Rohstoff-Pipeline, noch nicht behoben (siehe Diskussion Aktien-Baerenmarkt-Bestandsaufnahme, selbes Datum).</w:t>
       </w:r>
     </w:p>
     <w:sectPr>

</xml_diff>

<commit_message>
Rohstoff-Analyst: fehlenden aktien_baermarkt-Fakt ergaenzt
Bei der Bestandsaufnahme zum Aktien-Baermarkt-Thema aufgefallen:
agent/rohstoff/analyst.py::build_facts() gab regime.aktien_baermarkt
nicht als LLM-Fakt weiter, obwohl Krypto-, Aktien- und Hedge-Analyst
das laengst tun (compute_current_regime() berechnet es fuer alle
gleich). Ergaenzt inkl. rohstoffspezifischer SYSTEM_PROMPT-Gewichtung
(Gold/Silber tendenziell Safe-Haven-Nachfrage bei Aktien-Baerenmarkt,
Kupfer/Erdgas eher neutral/leicht belastend wegen Industriekonjunktur).

Co-Authored-By: Claude Sonnet 5 <noreply@anthropic.com>
</commit_message>
<xml_diff>
--- a/Basisinfos/Regelwerksmanual.docx
+++ b/Basisinfos/Regelwerksmanual.docx
@@ -10614,6 +10614,25 @@
       </w:r>
       <w:r>
         <w:t xml:space="preserve"> agent/rohstoff/analyst.py::build_facts() gibt aktien_baermarkt/equities_baermarkt (aus compute_current_regime()) nicht als LLM-Fakt weiter, obwohl Krypto-, Aktien- und Hedge-Analyst das tun - vermutlich ein Versehen beim Bau der Rohstoff-Pipeline, noch nicht behoben (siehe Diskussion Aktien-Baerenmarkt-Bestandsaufnahme, selbes Datum).</w:t>
+      </w:r>
+    </w:p>
+    <w:p>
+      <w:r>
+        <w:rPr>
+          <w:b/>
+        </w:rPr>
+        <w:t>Nachtrag (2026-07-18, gleicher Tag): agent/rohstoff/analyst.py - fehlenden aktien_baermarkt-Fakt ergaenzt</w:t>
+      </w:r>
+    </w:p>
+    <w:p>
+      <w:r>
+        <w:rPr>
+          <w:b/>
+        </w:rPr>
+        <w:t>Nebenfund behoben:</w:t>
+      </w:r>
+      <w:r>
+        <w:t xml:space="preserve"> agent/rohstoff/analyst.py::build_facts() gab aktien_baermarkt/equities_baermarkt (aus compute_current_regime()) nicht als LLM-Fakt weiter, obwohl Krypto-, Aktien- und Hedge-Analyst das tun. Ergaenzt: regime.aktien_baermarkt.{aktiv,begruendung} im Facts-Dict + neue SYSTEM_PROMPT-Regel-8-Ergaenzung (Gold/Silber tendenziell Safe-Haven-Nachfrage bei Aktien-Baerenmarkt, Kupfer/Erdgas eher neutral/leicht belastend wegen schwaecherer Industriekonjunktur) - Gewichtung je asset.symbol, analog Fakt 9. Syntax- und Feld-Smoke-Test bestanden.</w:t>
       </w:r>
     </w:p>
     <w:sectPr>

</xml_diff>

<commit_message>
SOL in AZ-4-Tranchen aufgenommen + neuer Hebel-Pruefung-Toggle
AZ-4-Tranchen (gestaffelte Kauf-/Verkaufszonen) laufen jetzt fuer BTC/ETH/SOL
statt nur BTC/ETH, mit Default-an-Toggle in der Watchlist. Cash-Reserve-Ziel
(Baustein 3) bewusst BTC/ETH-exklusiv belassen - andere, portfolioweite
Rechnung mit fester 2-Wege-Gewichtung, keine einfache Symbol-Erweiterung.
End-to-End verifiziert inkl. eines Fake-LLM-Laufs mit echtem
Tranchen-Vorschlag durch Validierung/Post-Check/DB-Rundtrip.

Neuer per-Asset Hebel-Pruefung-Toggle (neue Tabelle asset_hebel_settings):
steuert, ob ein Krypto-Asset fuers automatische 15-Min-Hebel-Screening
(OI-Abruf, Trendfolge-/Kontra-Scoring, LLM-Call) beruecksichtigt wird.
Default an fuer alle Assets. Greift nur bei der Trigger-Neuentdeckung -
bereits offene Hebel-Positionen bleiben unabhaengig vom Toggle weiter
risikoueberwacht. Neue Watchlist-Spalte + Toolbar-Button.

Co-Authored-By: Claude Sonnet 5 <noreply@anthropic.com>
</commit_message>
<xml_diff>
--- a/Basisinfos/Regelwerksmanual.docx
+++ b/Basisinfos/Regelwerksmanual.docx
@@ -11104,6 +11104,73 @@
       </w:r>
       <w:r>
         <w:t xml:space="preserve"> bereits sauber, keine Aenderung noetig. Alle 6 Signal-Pfade (Krypto Spot, Hebel, Aktien, Rohstoffe, Hedge, Themen-ETF) senden korrekt. Marktscan-Tier-2-LLM-Writeups senden bewusst keine zweite E-Mail (Kandidat bereits ueber die Discovery-E-Mail gemeldet). Manuelle "Signal berechnen"-Klicks senden nie E-Mail, nur automatische Jobs - konsistent app-weit.</w:t>
+      </w:r>
+    </w:p>
+    <w:p>
+      <w:r>
+        <w:rPr>
+          <w:b/>
+        </w:rPr>
+        <w:t>Nachtrag (2026-07-18, gleicher Tag): SOL in AZ-4-Tranchen + neuer Hebel-Pruefung-Toggle</w:t>
+      </w:r>
+    </w:p>
+    <w:p>
+      <w:r>
+        <w:rPr>
+          <w:b/>
+        </w:rPr>
+        <w:t>Ausloeser:</w:t>
+      </w:r>
+      <w:r>
+        <w:t xml:space="preserve"> Nutzer-Wunsch, Solana in die bisher BTC/ETH-exklusive AZ-4-Tranchen-Funktion aufzunehmen (mit Verifikationsauftrag), plus ein neuer per-Asset-Schalter, ob ein Krypto-Asset ueberhaupt fuers automatische Hebel-Screening beruecksichtigt werden soll.</w:t>
+      </w:r>
+    </w:p>
+    <w:p>
+      <w:r>
+        <w:rPr>
+          <w:b/>
+        </w:rPr>
+        <w:t>1. SOL in AZ-4-Tranchen</w:t>
+      </w:r>
+    </w:p>
+    <w:p>
+      <w:r>
+        <w:t>Zwei getrennte BTC/ETH-Hardcodierungen identifiziert: tranchen_erlaubt (gestaffelte Kauf-/Verkaufszonen fuers eigene Signal - einfach erweiterbar) und cash_reserve_ziel (AZ-4 Baustein 3, ein portfolioweites Ziel, das BTC+ETH fest zu zwei Gewichten kombiniert - eine echte 3-Wege-Erweiterung waere ein groesserer Umbau der Gewichtungsformel). Bewusst NUR tranchen_erlaubt um SOL erweitert - cash_reserve_ziel bleibt unveraendert BTC/ETH-exklusiv.</w:t>
+      </w:r>
+    </w:p>
+    <w:p>
+      <w:r>
+        <w:rPr>
+          <w:b/>
+        </w:rPr>
+        <w:t>Verifiziert:</w:t>
+      </w:r>
+      <w:r>
+        <w:t xml:space="preserve"> 5 synthetische _validate()-Testfaelle (gueltige Tranchen, Summe ungleich 100, doppelter Rang, von&gt;bis, null) - alle bestaetigt korrekt. Echter End-to-End-Lauf gegen Kopie der Produktions-DB mit erzwungenem Baer-Regime: SOL/BTC/ETH liefen alle drei fehlerfrei durch generate_signal(). Zusaetzlich ein Fake-LLM-Client mit einer kanonischen Antwort inkl. echtem 3-Tranchen-Vorschlag durch die komplette Pipeline geschickt - tranchen_json korrekt serialisiert, entry_usd_von/bis blieb korrekt die Gesamtspanne, aus der DB neu geladen identisch mit dem Original-Objekt.</w:t>
+      </w:r>
+    </w:p>
+    <w:p>
+      <w:r>
+        <w:rPr>
+          <w:b/>
+        </w:rPr>
+        <w:t>2. Neuer Hebel-Pruefung-Toggle</w:t>
+      </w:r>
+    </w:p>
+    <w:p>
+      <w:r>
+        <w:t>Per-Asset-Schalter (analog zum bestehenden AZ-4-Tranchen-Toggle-Muster): neue Tabelle asset_hebel_settings + get/set_hebel_pruefung_erlaubt() in database/db.py. Default TRUE fuer ALLE Krypto-Assets (kein Verhaltenswechsel ohne explizites Abschalten). Greift in agent/krypto/hebel_screening.py::run_hebel_screening() VOR dem teuren OI-Abruf - ein abgeschaltetes Asset bekommt weder neue Trigger noch einen LLM-Call noch einen neuen Kandidaten im Hebel-Tab. Bewusst NICHT in budget_allocator.py::_offene_positionen_als_kandidaten() verdrahtet - bereits offene Hebel-Positionen bleiben unabhaengig vom Toggle weiter risikoueberwacht. Neue Spalte "Hebel-Pruefung" im Watchlist-Tab (fuer alle Krypto-Assets), neuer Toolbar-Button mit Guard-Klausel (nur Krypto ohne Stablecoins).</w:t>
+      </w:r>
+    </w:p>
+    <w:p>
+      <w:r>
+        <w:rPr>
+          <w:b/>
+        </w:rPr>
+        <w:t>Verifiziert:</w:t>
+      </w:r>
+      <w:r>
+        <w:t xml:space="preserve"> Tk-Smoke-Test gegen Kopie der Produktions-DB - Spalte korrekt vorhanden, Toggle-Klick flippt den Wert korrekt in der DB UND in der Anzeige, Guard-Klausel fuer ein Nicht-Krypto-Asset loest korrekt nur den Info-Dialog aus, ohne einen DB-Write auszuloesen.</w:t>
       </w:r>
     </w:p>
     <w:sectPr>

</xml_diff>

<commit_message>
LLM-Budget neu kalibriert nach Mistral-Einfuehrung + Zeitpunkt/Anbieter-Anzeige + LLM-Anfrage in der Historie
Taegliches Budget (B) war seit der Mistral-Integration nie neu berechnet
worden und drosselte die Spot-Rotation real (Nutzer-Fund "wir kaempfen um
jede Abfrage"). B/Reserve/Cooldowns anhand des echten Watchlist-Bedarfs neu
kalibriert (15->90 / 5->30 / 10h-20h->8h-15h). Zusaetzlich: Anbieter+Zeitpunkt
jetzt im Signal-Detail-Panel und in allen Empfehlungs-E-Mails sichtbar, und
per Doppelklick in der Signal-Historie koennen facts_json/Roh-Antwort der
jeweiligen LLM-Abfrage eingesehen werden.

Co-Authored-By: Claude Sonnet 5 <noreply@anthropic.com>
</commit_message>
<xml_diff>
--- a/Basisinfos/Regelwerksmanual.docx
+++ b/Basisinfos/Regelwerksmanual.docx
@@ -11171,6 +11171,129 @@
       </w:r>
       <w:r>
         <w:t xml:space="preserve"> Tk-Smoke-Test gegen Kopie der Produktions-DB - Spalte korrekt vorhanden, Toggle-Klick flippt den Wert korrekt in der DB UND in der Anzeige, Guard-Klausel fuer ein Nicht-Krypto-Asset loest korrekt nur den Info-Dialog aus, ohne einen DB-Write auszuloesen.</w:t>
+      </w:r>
+    </w:p>
+    <w:p>
+      <w:pPr/>
+      <w:r>
+        <w:rPr>
+          <w:b/>
+        </w:rPr>
+        <w:t>Nachtrag (2026-07-18, gleicher Tag): LLM-Budget-Neukalibrierung nach Mistral-Einführung + Zeitpunkt/Anbieter-Anzeige + LLM-Anfrage in der Historie</w:t>
+      </w:r>
+    </w:p>
+    <w:p>
+      <w:pPr/>
+      <w:r>
+        <w:rPr>
+          <w:b/>
+        </w:rPr>
+        <w:t>Auslöser:</w:t>
+      </w:r>
+      <w:r>
+        <w:t xml:space="preserve"> Nutzer-Beobachtung ("wir kämpfen um jede Abfrage") anhand der Remote-Status-Seite: Groq wirkte ausgelastet, Gemini praktisch ungenutzt (27h seit letztem Call), das Tagesbudget zeigte weiterhin "15" an, obwohl seit der Mistral-Integration (2026-07-17) eine dritte, deutlich größere Kapazitätsstufe existiert. Zusätzlich zwei Wünsche: Zeitpunkt/Anbieter der LLM-Abfrage im Info-Fenster und in der E-Mail sichtbar machen, und die zugehörige LLM-Anfrage in der Signal-Historie einsehbar machen.</w:t>
+      </w:r>
+    </w:p>
+    <w:p>
+      <w:pPr/>
+      <w:r>
+        <w:rPr>
+          <w:b/>
+        </w:rPr>
+        <w:t>1. Budget-Neukalibrierung (taegliches_budget_gesamt, B)</w:t>
+      </w:r>
+    </w:p>
+    <w:p>
+      <w:pPr/>
+      <w:r>
+        <w:t>Klargestellt: B ist kein literaler Tages-Deckel für LLM-Calls, sondern steuert nur, wie viele Kandidaten pro 15-Minuten-Tick überhaupt einen LLM-Versuch bekommen (agent/krypto/budget_allocator.py::_verteile_budget(), siehe docs/budget_queue_design.md) - jeder ausgewählte Kandidat durchläuft danach individuell die Groq→Mistral→Gemini-Kaskade. B war 1:1 auf Groqs eigene Tageskapazität kalibriert (~15-18 Calls), bevor Mistral existierte, und wurde seither nie angepasst. Die echte Schutzgrenze ist Mistrals eigenes Tagesbudget (mistral_taegliches_budget, unverändert 150) - unabhängig von B.</w:t>
+      </w:r>
+    </w:p>
+    <w:p>
+      <w:pPr/>
+      <w:r>
+        <w:rPr>
+          <w:b/>
+        </w:rPr>
+        <w:t>Berechnung (Nutzer-Vorgabe "berechne zuerst die Auswirkungen"):</w:t>
+      </w:r>
+      <w:r>
+        <w:t xml:space="preserve"> anhand der live über config.get_watchlist() abgefragten Watchlist (41 nicht-cash-äquivalente Krypto-Assets, davon 13 rolle=="core") wurde der theoretische maximale Spot-Rotation-Bedarf je Cooldown-Regime berechnet (asset_anzahl × 24 / cooldown_stunden). Ergebnis: selbst beim ALTEN Cooldown (10h Kern/20h taktisch) lag der Bedarf bei ~65/Tag, weit über dem alten B=15 - die Drosselung war real, kein reines Anzeige-Problem. Beim neuen, gelockerten Cooldown (8h/15h) liegt der Bedarf bei 13×24/8 + 28×24/15 ≈ 39 + 45 = 84/Tag.</w:t>
+      </w:r>
+    </w:p>
+    <w:p>
+      <w:pPr/>
+      <w:r>
+        <w:t>Neu kalibriert: taegliches_budget_gesamt: 90 (deckt die vollen 84/Tag plus Puffer für Hebel-/Marktscan-Aktivität, bleibt deutlich unter Mistrals 150er-Deckel - echte Ausreißertage laufen kontrolliert in Gemini als dritte Stufe). spot_rotation_reserve proportional mitskaliert (5→30, Verhältnis F/B ≈ 33% wie ursprünglich 2026-07-13 festgelegt) - Spot-Rotation behält denselben relativen Mindestanteil auch an sehr Hebel-/Marktscan-aktiven Tagen.</w:t>
+      </w:r>
+    </w:p>
+    <w:p>
+      <w:pPr/>
+      <w:r>
+        <w:rPr>
+          <w:b/>
+        </w:rPr>
+        <w:t>2. Cooldown-Lockerung (Nutzer entschied sich für die moderate Empfehlung)</w:t>
+      </w:r>
+    </w:p>
+    <w:p>
+      <w:pPr/>
+      <w:r>
+        <w:t>spot_cooldown_stunden_kern (rolle=core ODER gehalten ODER offene Hebel-Position): 10h → 8h. spot_cooldown_stunden (rein taktische Watchlist-Assets ohne Position): 20h → 15h. Beide waren ursprünglich als Bremse gegen die knappe Groq-Kapazität gesetzt (2026-07-15/16) - jetzt, wo Mistrals große Fallback-Kapazität den Groq-Engpass abfedert, ist die Bremse weniger nötig.</w:t>
+      </w:r>
+    </w:p>
+    <w:p>
+      <w:pPr/>
+      <w:r>
+        <w:rPr>
+          <w:b/>
+        </w:rPr>
+        <w:t>Verifiziert:</w:t>
+      </w:r>
+      <w:r>
+        <w:t xml:space="preserve"> 4 synthetische _verteile_budget()-Testszenarien (ruhiger Tag, normaler Tag, Crash-Tag mit vielen Hebel-Triggern, "nur Spot volle Berechnung") - alle bestätigt korrekt: der volle gelockerte Spot-Bedarf (84/Tag) läuft jetzt ohne Drosselung durch B=90, Crash-Tag-Priorität (Hebel &gt; Marktscan &gt; Spot) und Spot-Rotations-Mindestreserve (F=30) funktionieren weiterhin wie vorgesehen.</w:t>
+      </w:r>
+    </w:p>
+    <w:p>
+      <w:pPr/>
+      <w:r>
+        <w:rPr>
+          <w:b/>
+        </w:rPr>
+        <w:t>3. Zeitpunkt + Anbieter in Detail-Panel und E-Mail</w:t>
+      </w:r>
+    </w:p>
+    <w:p>
+      <w:pPr/>
+      <w:r>
+        <w:t>ui/hebel_view.py zeigte bereits Anbieter+Zeitpunkt im Detail-Panel (meta_label); ui/signals_view.py zeigte nur den Zeitpunkt, ohne Anbieter - um "Anbieter: {signal.groq_model}" ergänzt (deckt Spot UND Aktien/Rohstoffe/Hedge/Themen-ETF ab, da alle dieselbe SignalsView-Klasse und Signal-Dataclass nutzen). Alle drei E-Mail-Funktionen in scheduler/background.py (_notify_spot_signal, _notify_hebel_signal, _notify_multi_asset_signal) zeigten bisher WEDER Zeitpunkt noch Anbieter - je eine Zeile "Berechnet: &lt;Datum Uhrzeit&gt; · Anbieter: &lt;provider:modell&gt;" ergänzt.</w:t>
+      </w:r>
+    </w:p>
+    <w:p>
+      <w:pPr/>
+      <w:r>
+        <w:rPr>
+          <w:b/>
+        </w:rPr>
+        <w:t>4. LLM-Anfrage/Antwort in der Signal-Historie</w:t>
+      </w:r>
+    </w:p>
+    <w:p>
+      <w:pPr/>
+      <w:r>
+        <w:t>Neue Spalte "Anbieter" in beiden History-Dialogen (SignalHistoryDialog in ui/signals_view.py, HebelSignalHistoryDialog in ui/hebel_view.py). Doppelklick auf eine Historien-Zeile öffnet einen neuen Detail-Dialog (LlmAbfrageDialog bzw. HebelLlmAbfrageDialog) mit den an die KI gesendeten Fakten (facts_json, JSON-formatiert) und der Roh-Antwort (groq_raw_response) - beide Felder waren bereits in der DB gespeichert, reine UI-Sichtbarmachung ohne neuen Netzwerk-Call oder neue Datenerfassung.</w:t>
+      </w:r>
+    </w:p>
+    <w:p>
+      <w:pPr/>
+      <w:r>
+        <w:rPr>
+          <w:b/>
+        </w:rPr>
+        <w:t>Verifiziert:</w:t>
+      </w:r>
+      <w:r>
+        <w:t xml:space="preserve"> Tk-Smoke-Test gegen Kopie der Produktions-DB - Anbieter-Spalte korrekt befüllt (z. B. gemini:gemini-3.1-flash-lite, groq:llama-3.3-70b-versatile), simulierter Doppelklick öffnet den Detail-Dialog korrekt für ein echtes Spot-Signal (BTC, 20 Historien-Einträge) und ein echtes Hebel-Signal (CAT LONG), facts_json/Roh-Antwort werden lesbar formatiert angezeigt (mehrere Tausend Zeichen, korrekt eingerückt).</w:t>
       </w:r>
     </w:p>
     <w:sectPr>

</xml_diff>

<commit_message>
Cash-Veto-Warnsystem: RM-4-Block sichtbar machen statt still zu HALTEN downzugraden
Der bestehende risk_veto-Flag feuert nur, wenn das Modell die Cash-Regel
missachtet - im (haeufigeren) Fall eines regelkonformen Modells, das bei
Cash-Mangel schon selbst HALTEN sagt, blieb der Block bisher komplett
unsichtbar. Neues cash_veto/cash_veto_reason-Feld spiegelt den tatsaechlichen
RM-4-Zustand unabhaengig vom Modellverhalten, verdrahtet an allen 4
betroffenen Pipelines (Krypto/Aktien/Rohstoffe/Themen-ETF).

Durchbricht bewusst die "HALTEN mailt nie"-Regel mit einer WARNUNG-E-Mail
(portfolioweiter Cooldown, da RM-4 kein Einzelasset-Zustand ist) und einer
eigenen Zeile im Signal-Detail-Panel. Zusaetzlich: EURCV-fehlt-Hinweis jetzt
im Veto-Grund sichtbar statt in einer nie genutzten checks-Liste zu
verschwinden, korrupter Cash-Wert wird geloggt statt still auf 0 zu fallen.

Co-Authored-By: Claude Sonnet 5 <noreply@anthropic.com>
</commit_message>
<xml_diff>
--- a/Basisinfos/Regelwerksmanual.docx
+++ b/Basisinfos/Regelwerksmanual.docx
@@ -11294,6 +11294,111 @@
       </w:r>
       <w:r>
         <w:t xml:space="preserve"> Tk-Smoke-Test gegen Kopie der Produktions-DB - Anbieter-Spalte korrekt befüllt (z. B. gemini:gemini-3.1-flash-lite, groq:llama-3.3-70b-versatile), simulierter Doppelklick öffnet den Detail-Dialog korrekt für ein echtes Spot-Signal (BTC, 20 Historien-Einträge) und ein echtes Hebel-Signal (CAT LONG), facts_json/Roh-Antwort werden lesbar formatiert angezeigt (mehrere Tausend Zeichen, korrekt eingerückt).</w:t>
+      </w:r>
+    </w:p>
+    <w:p>
+      <w:pPr/>
+      <w:r>
+        <w:rPr>
+          <w:b/>
+        </w:rPr>
+        <w:t>Nachtrag (2026-07-18, gleicher Tag): Cash-Veto-Warnsystem - RM-4-Block sichtbar machen statt stillschweigend zu HALTEN downzugraden</w:t>
+      </w:r>
+    </w:p>
+    <w:p>
+      <w:pPr/>
+      <w:r>
+        <w:rPr>
+          <w:b/>
+        </w:rPr>
+        <w:t>Auslöser:</w:t>
+      </w:r>
+      <w:r>
+        <w:t xml:space="preserve"> Nutzer-Auftrag "prüfe bitte - wichtig Anzeige und Info, wenn über einen der Cash-Parameter ein Block oder die weitere Verarbeitung verhindert werden - Detailanalyse durchführen". Ergebnis der Analyse: RM-4 (Cash-Reserve-Minimum, risk_gate.py::pre_check()) ist der einzige echte Cash-Block (Spot/Aktien/Rohstoffe/Themen-ETF - nicht Hebel/Hedge). Vier konkrete Lücken gefunden, alle auf Nutzer-Wunsch ("ja alles umsetzen") behoben.</w:t>
+      </w:r>
+    </w:p>
+    <w:p>
+      <w:pPr/>
+      <w:r>
+        <w:rPr>
+          <w:b/>
+        </w:rPr>
+        <w:t>1. Der wichtigste Fund: risk_veto erfasste den häufigeren Fall gar nicht</w:t>
+      </w:r>
+    </w:p>
+    <w:p>
+      <w:pPr/>
+      <w:r>
+        <w:t>Der bestehende risk_veto/risk_veto_reason-Mechanismus in post_check() feuert NUR, wenn das Modell die risiko_check.kauf_erlaubt-Regel MISSACHTET und trotzdem KAUFEN/NACHKAUFEN vorschlägt (deterministischer Backstop). Ein regelkonformes Modell, das bei kauf_erlaubt == false bereits von sich aus HALTEN sagt (der häufigere Fall, da genau das per Prompt-Regel verlangt wird), löste bisher GAR KEIN sichtbares Signal aus - der Cash-Block blieb komplett unsichtbar, obwohl das System dadurch faktisch beeinträchtigt war.</w:t>
+      </w:r>
+    </w:p>
+    <w:p>
+      <w:pPr/>
+      <w:r>
+        <w:t>Fix: Neues, unabhängiges Feld RiskPreCheckResult.cash_veto/cash_veto_reason in risk_gate.py - wird IMMER gesetzt, wenn RM-4 bei dieser Bewertung aktiv war, unabhängig vom tatsächlichen Modellverhalten. post_check() reicht _cash_veto/_cash_veto_reason jetzt IMMER durch (nicht nur bei einer tatsächlichen Aktions-Überschreibung). Persistiert auf Signal.cash_veto/cash_veto_reason (additive Migration, nur signals-Tabelle, da RM-4 hebel-/hedge-unabhängig ist) - an allen 4 Pipelines verdrahtet (Krypto, Aktien, Rohstoffe, Themen-ETF, alle nutzen dieselbe risk_gate.pre_check()/post_check()).</w:t>
+      </w:r>
+    </w:p>
+    <w:p>
+      <w:pPr/>
+      <w:r>
+        <w:rPr>
+          <w:b/>
+        </w:rPr>
+        <w:t>2. WARNUNG-E-Mail statt Stille (Nutzer-Vorgabe: "System beeinträchtigt")</w:t>
+      </w:r>
+    </w:p>
+    <w:p>
+      <w:pPr/>
+      <w:r>
+        <w:t>Ein cash-blockiertes Signal endet als HALTEN - HALTEN löst normalerweise NIE eine E-Mail aus (bewusstes Design gegen Postfach-Spam). Für cash_veto wurde das bewusst durchbrochen: neue _notify_cash_veto_warning() in scheduler/background.py, aufgerufen aus _notify_spot_signal() und _notify_multi_asset_signal() VOR deren HALTEN-Guard. Betreff "WARNUNG - Cash-Veto (&lt;Symbol&gt;)", Body erklärt explizit, dass das System aktuell durch eine zu geringe Cash-Reserve beeinträchtigt ist und das für ALLE Spot-/Aktien-/Rohstoff-/Themen-ETF-Bewertungen gilt, nicht nur das eine Asset.</w:t>
+      </w:r>
+    </w:p>
+    <w:p>
+      <w:pPr/>
+      <w:r>
+        <w:t>Cooldown bewusst EIN globaler Zeitstempel, nicht pro Asset/Job (config.yaml benachrichtigung.email.cash_veto_warnung_cooldown_minuten, Default 360 Min/6h) - RM-4 ist ein PORTFOLIOWEITER Zustand: ohne Cooldown würde jedes während der Unterschreitung bewertete Asset eine eigene Mail auslösen (potenziell ein Dutzend am Tag). Gleiches Muster wie _notify_job_failure(), nur mit einem einzelnen statt einem pro-Job-Zeitstempel.</w:t>
+      </w:r>
+    </w:p>
+    <w:p>
+      <w:pPr/>
+      <w:r>
+        <w:rPr>
+          <w:b/>
+        </w:rPr>
+        <w:t>3. Detail-Panel-Warnung unabhängig vom bestehenden Risiko-Veto</w:t>
+      </w:r>
+    </w:p>
+    <w:p>
+      <w:pPr/>
+      <w:r>
+        <w:t>ui/signals_view.py: neue Zeile "⚠ WARNUNG - Cash-Veto (System beeinträchtigt): &lt;Grund&gt;" im gate_label, geprüft über signal.cash_veto (NICHT über signal.risk_veto) - erscheint also auch dann, wenn das Modell sich schon regelkonform verhalten hat (der unter Punkt 1 beschriebene, häufigere Fall).</w:t>
+      </w:r>
+    </w:p>
+    <w:p>
+      <w:pPr/>
+      <w:r>
+        <w:rPr>
+          <w:b/>
+        </w:rPr>
+        <w:t>4. Zwei kleinere Detailfunde ebenfalls behoben</w:t>
+      </w:r>
+    </w:p>
+    <w:p>
+      <w:pPr/>
+      <w:r>
+        <w:t>EURCV-Kurs fehlt → Fiat-Guthaben zählte bisher schon nicht in die Cash-Reserve mit, der Grund dafür landete aber nur in einer nirgends verwendeten checks-Liste. Jetzt als Zusatzsatz direkt an cash_veto_reason angehängt, sobald es tatsächlich zu einem Veto kam. db.get_cash_reserve_fiat_eur(): ein korrupter DB-Wert (ValueError) fiel bisher still auf 0.0 zurück, ohne jede Spur. Jetzt logger.warning() mit dem kaputten Rohwert.</w:t>
+      </w:r>
+    </w:p>
+    <w:p>
+      <w:pPr/>
+      <w:r>
+        <w:rPr>
+          <w:b/>
+        </w:rPr>
+        <w:t>Verifiziert:</w:t>
+      </w:r>
+      <w:r>
+        <w:t xml:space="preserve"> 4 synthetische pre_check()/post_check()-Szenarien gegen eine In-Memory-DB + echte config.yaml-Werte (kein Cash → Veto, inkl. des bisher unsichtbaren "Modell sagt selbst korrekt HALTEN"-Falls; genug Cash → kein Veto; EURCV fehlt → Veto mit Zusatzhinweis; korrupter DB-Wert → geloggt) - alle bestätigt korrekt. Migration + Signal-Roundtrip gegen echte Kopie der Produktions-DB (ALTER TABLE, alte Zeilen laden korrekt mit cash_veto=False). Tk-Smoke-Test für die neue Detail-Panel-Zeile (erscheint bei cash_veto=True, verschwindet bei False, keine Verwechslung mit der bestehenden Risiko-Veto-Zeile). Cooldown-Logik der Warnmail synthetisch getestet (erste Warnung geht raus, zweite wird unterdrückt, nach simuliertem Cooldown-Ablauf geht die dritte wieder raus).</w:t>
       </w:r>
     </w:p>
     <w:sectPr>

</xml_diff>

<commit_message>
Groq-Tageserschoepfung erkennen: kein unnoetiger Erschoepfungs-Versuch mehr pro Kandidat
Anders als Mistral/Gemini hatte Groq nie einen eigenen Tageszaehler (Nutzer-
Fund: "trotz Erschoepfung wird immer zuerst Groq abgefragt") - jeder Kandidat
wurde den ganzen Resttag ueber trotzdem zuerst erfolglos gegen Groq versucht,
bevor Mistral uebernahm. Kein verlorenes Mistral/Gemini-Kontingent (der
Fallback funktionierte korrekt), aber unnoetige Latenz pro Kandidat.

Neuer In-Memory-Zustand markiert Groq nach 2 aufeinanderfolgenden Fehlschlaegen
am selben Tag als erschoepft und ueberspringt es fuer den Rest des Tages direkt
zugunsten von Mistral/Gemini - Reset erfolgt automatisch am naechsten Kalendertag.

Co-Authored-By: Claude Sonnet 5 <noreply@anthropic.com>
</commit_message>
<xml_diff>
--- a/Basisinfos/Regelwerksmanual.docx
+++ b/Basisinfos/Regelwerksmanual.docx
@@ -11399,6 +11399,57 @@
       </w:r>
       <w:r>
         <w:t xml:space="preserve"> 4 synthetische pre_check()/post_check()-Szenarien gegen eine In-Memory-DB + echte config.yaml-Werte (kein Cash → Veto, inkl. des bisher unsichtbaren "Modell sagt selbst korrekt HALTEN"-Falls; genug Cash → kein Veto; EURCV fehlt → Veto mit Zusatzhinweis; korrupter DB-Wert → geloggt) - alle bestätigt korrekt. Migration + Signal-Roundtrip gegen echte Kopie der Produktions-DB (ALTER TABLE, alte Zeilen laden korrekt mit cash_veto=False). Tk-Smoke-Test für die neue Detail-Panel-Zeile (erscheint bei cash_veto=True, verschwindet bei False, keine Verwechslung mit der bestehenden Risiko-Veto-Zeile). Cooldown-Logik der Warnmail synthetisch getestet (erste Warnung geht raus, zweite wird unterdrückt, nach simuliertem Cooldown-Ablauf geht die dritte wieder raus).</w:t>
+      </w:r>
+    </w:p>
+    <w:p>
+      <w:pPr/>
+      <w:r>
+        <w:rPr>
+          <w:b/>
+        </w:rPr>
+        <w:t>Nachtrag (2026-07-18, gleicher Tag): Groq-Tageserschöpfung erkennen - kein unnötiger Erschöpfungs-Versuch mehr pro Kandidat</w:t>
+      </w:r>
+    </w:p>
+    <w:p>
+      <w:pPr/>
+      <w:r>
+        <w:rPr>
+          <w:b/>
+        </w:rPr>
+        <w:t>Auslöser:</w:t>
+      </w:r>
+      <w:r>
+        <w:t xml:space="preserve"> Nutzer-Beobachtung: "mir kommt vor, dass trotz Erschöpfung immer zuerst Groq abgefragt wird". Bestätigt durch Code-Prüfung: anders als Mistral/Gemini (echter, aus der DB gelesener Tageszähler, siehe _mit_fallback_chain()) hatte Groq KEIN eigenes Tagesbudget - Kommentar im Code war explizit: "Groqs reales Tageslimit wirkt extern über echte 429s". Das bedeutete: sobald Groqs echtes tägliches Token-Limit erreicht war, wurde jeder weitere Kandidat - in diesem UND allen folgenden 15-Minuten-Läufen desselben Tages - trotzdem zuerst erfolglos gegen Groq versucht, bevor Mistral übernahm. Kein verlorenes Mistral/Gemini-Kontingent (der Fallback funktionierte pro Call korrekt), aber unnötige Latenz: ein garantiert scheiternder HTTP-Call pro Kandidat, den ganzen Resttag über.</w:t>
+      </w:r>
+    </w:p>
+    <w:p>
+      <w:pPr/>
+      <w:r>
+        <w:t>Warum es diesen Zähler bisher nicht gab: Groqs echte Tagesgrenze ist token-basiert, nicht anfrage-basiert - anders als bei Mistral/Gemini gibt es keine feste Zahl, die man lokal vorab prüfen könnte. Die ursprüngliche Design-Entscheidung war, das der echten API zu überlassen statt zu raten.</w:t>
+      </w:r>
+    </w:p>
+    <w:p>
+      <w:pPr/>
+      <w:r>
+        <w:t>Fix: neuer In-Memory-Zustand in agent/krypto/budget_allocator.py (gleiches Muster wie scheduler/background.py::_consecutive_failures) - _groq_failure_date/_groq_failure_count/_groq_exhausted_date. Ab groq_exhaustion_schwelle_fehlschlaege (neuer Config-Wert, Default 2) aufeinanderfolgenden Groq-Fehlschlägen AM SELBEN KALENDERTAG (UTC) wird Groq in _mit_fallback_chain() für den Rest des Tages direkt übersprungen (kein Call-Versuch mehr) - Kandidaten gehen sofort an Mistral/Gemini. Schwelle 2 statt 1, damit ein einzelner transienter Netzwerk-Ausrutscher nicht sofort fälschlich als Tageserschöpfung gewertet wird. Reset erfolgt implizit über den Kalendertag-Vergleich (kein expliziter Reset-Code nötig) - passt zur echten Ursache (ein TAGES-Limit). In-Memory statt DB-persistiert (wie bei _consecutive_failures) - überlebt keinen Prozess-Neustart, bewusst akzeptabel (selten, im schlimmsten Fall wird Groq danach einfach frisch neu probiert). Ein Datenqualitäts-Gate-Skip (gate_passed=False, kein echter LLM-Call) zählt bewusst NICHT als Erfolg oder Fehlschlag - der Erfolgs-/Fehlschlag-Zähler wird nur bei einem tatsächlich stattgefundenen Groq-Call aktualisiert.</w:t>
+      </w:r>
+    </w:p>
+    <w:p>
+      <w:pPr/>
+      <w:r>
+        <w:t>Neues AllocationResult.groq_erschoepft_erkannt-Feld (Analogie zu mistral_budget_erschoepft/gemini_budget_erschoepft) für Logging/Nachvollziehbarkeit, in der bestehenden Budget-Allocator-Log-Zeile in scheduler/background.py ergänzt.</w:t>
+      </w:r>
+    </w:p>
+    <w:p>
+      <w:pPr/>
+      <w:r>
+        <w:rPr>
+          <w:b/>
+        </w:rPr>
+        <w:t>Verifiziert:</w:t>
+      </w:r>
+      <w:r>
+        <w:t xml:space="preserve"> synthetische Tests der Schwellenwert-Logik (1 Fehlschlag → noch nicht erschöpft, 2. Fehlschlag → erschöpft, Erfolg setzt nur den Zähler zurück, nicht das Tages-Flag; simulierter Tageswechsel → alter Zählerstand wird verworfen, ein einzelner Fehlschlag am neuen Tag erschöpft noch nicht). Echter End-to-End-Test über zwei komplette run_budget_allocator()-Läufe gegen eine echte (Datei-)DB mit 5 Spot-Kandidaten und einem Fake-Groq-Client, der immer fehlschlägt: im ersten Lauf wird Groq genau 2x versucht (dann Schwelle erreicht), alle 5 Kandidaten laufen über Mistral; im zweiten Lauf (simuliert den nächsten 15-Minuten-Takt am selben Tag) wird Groq kein einziges Mal mehr versucht.</w:t>
       </w:r>
     </w:p>
     <w:sectPr>

</xml_diff>

<commit_message>
Konsistenzpruefung ueber alle Assetklassen: Absturz-Fix bei Aktien ohne yfinance_symbol
Nutzer bat darum, die Krypto-Konsistenzfixe (fehlende coingecko_id) auch fuer
Aktien/Rohstoffe/Hedge/Themen-ETF zu pruefen. Rohstoffe/Hedge strukturell
unbetroffen (Futures-Ticker bzw. keine OHLC-Abhaengigkeit), aber echter,
schwerwiegenderer Fund bei Aktien: _ensure_ohlc_backfilled() hatte keinen
Guard fuer fehlendes yfinance_symbol (im Gegensatz zur themen_etf-Schwester-
funktion) - yf.Ticker(None) stuerzt sowohl den automatischen Multi-Asset-
Batch als auch den manuellen Signal-Klick ab. Guard nachgeruestet, betroffene
Assets werden zusaetzlich von multi_asset_batch.py ausgeschlossen und in der
Watchlist sichtbar markiert (gleiches Muster wie beim Krypto-Fix).
</commit_message>
<xml_diff>
--- a/Basisinfos/Regelwerksmanual.docx
+++ b/Basisinfos/Regelwerksmanual.docx
@@ -12180,6 +12180,104 @@
       </w:r>
       <w:r>
         <w:t xml:space="preserve"> Regressionstest von is_listed() nach dem Refactor (identisches Verhalten). Synthetischer Test von resolve_coingecko_id_by_name() (eindeutig/mehrdeutig/kein Treffer). Synthetischer Test von auto_add_unknown_hebel_symbols() mit drei Fällen (automatische Auflösung erfolgreich, coingecko_client=None behält altes Verhalten, mehrdeutiger Namenstreffer fällt korrekt auf leer zurück statt abzustürzen) gegen eine Konfigurationskopie. Tk-Smoke-Test des kompletten AssetAddDialog-Submit-Flows (automatische Auflösung UND automatisch geöffneter CoinSearchDialog bei Mehrdeutigkeit, jeweils bis zum tatsächlichen Schreiben in config.yaml durchgetestet) sowie von AssetEditDialog (stille Auflösung beim Öffnen, Warn-Markierung verschwindet korrekt bei erfolgreicher Auflösung).</w:t>
+      </w:r>
+    </w:p>
+    <w:p>
+      <w:r>
+        <w:rPr>
+          <w:b/>
+        </w:rPr>
+        <w:t>Nachtrag (2026-07-19, gleicher Tag): Konsistenzprüfung über ALLE Assetklassen - echter Absturz-Fund bei Aktien ohne yfinance-Symbol</w:t>
+      </w:r>
+    </w:p>
+    <w:p>
+      <w:r>
+        <w:rPr>
+          <w:b/>
+        </w:rPr>
+        <w:t>Auslöser:</w:t>
+      </w:r>
+      <w:r>
+        <w:t xml:space="preserve"> Nutzer bat explizit darum, die coingecko_id-Konsistenzprüfung nicht nur für Krypto/Hebel, sondern für alle Bereiche durchzuführen ("prüfe das gegenüber allen Bereichen nicht nur Hebel, Spot, etc."). Systematisch alle vier Multi-Asset-Pipelines (Aktien/Rohstoffe/Hedge/Themen-ETF) auf das Krypto-Muster (fehlende externe ID → strukturell nie erfolgreiche Analyse) geprüft.</w:t>
+      </w:r>
+    </w:p>
+    <w:p>
+      <w:r>
+        <w:rPr>
+          <w:b/>
+        </w:rPr>
+        <w:t>Echter, eigenständiger Fund - Absturz statt nur Budget-Verschwendung:</w:t>
+      </w:r>
+      <w:r>
+        <w:t xml:space="preserve"> agent/aktien/pipeline.py::_ensure_ohlc_backfilled() rief get_full_ohlc_history(asset.yfinance_symbol, ...) bisher OHNE Guard auf - im Gegensatz zum strukturell identischen agent/themen_etf/pipeline.py, das den Guard (if not asset.yfinance_symbol: ... return) bereits hatte. Live bestätigt: yf.Ticker(None) wirft AttributeError: 'NoneType' object has no attribute 'upper'. Ein manuell hinzugefügtes Aktien-Asset ohne yfinance-Symbol (im "Asset hinzufügen"-Dialog als "optional" markiert) hätte damit sowohl im automatischen Multi-Asset-Batch als auch beim manuellen "Signal berechnen"-Klick einen rohen, unbehandelten Absturz ausgelöst statt einer sauberen HALTEN-Meldung.</w:t>
+      </w:r>
+    </w:p>
+    <w:p>
+      <w:r>
+        <w:rPr>
+          <w:b/>
+        </w:rPr>
+        <w:t>Geprüft und für strukturell unbetroffen befunden:</w:t>
+      </w:r>
+    </w:p>
+    <w:p>
+      <w:r>
+        <w:t>agent/rohstoff/pipeline.py: nutzt einen hartkodierten Futures-Ticker (SYMBOL_ZU_FUTURES_TICKER), unabhängig vom Watchlist-Feld - ein neues Rohstoff-Asset bräuchte ohnehin eine Code-Änderung, kein GUI-Feld dafür.</w:t>
+      </w:r>
+    </w:p>
+    <w:p>
+      <w:r>
+        <w:t>agent/hedge/pipeline.py: braucht überhaupt keine OHLC-Historie (arbeitet nur mit Live-Preisen + Portfolio-Exposure).</w:t>
+      </w:r>
+    </w:p>
+    <w:p>
+      <w:r>
+        <w:rPr>
+          <w:b/>
+        </w:rPr>
+        <w:t>Auto-Add-Mechanismus:</w:t>
+      </w:r>
+      <w:r>
+        <w:t xml:space="preserve"> config.py::add_watchlist_entry() wird automatisch nur an GENAU EINER Stelle aufgerufen (auto_add_unknown_hebel_symbols()) - kein analoges automatisches Hinzufügen für Aktien/Rohstoffe/ETF, die kommen nur über den manuellen "Asset hinzufügen"-Dialog rein.</w:t>
+      </w:r>
+    </w:p>
+    <w:p>
+      <w:r>
+        <w:rPr>
+          <w:b/>
+        </w:rPr>
+        <w:t>Fix (drei Ebenen, gleiches Muster wie beim Krypto-Fund):</w:t>
+      </w:r>
+    </w:p>
+    <w:p>
+      <w:r>
+        <w:t>1. agent/aktien/pipeline.py::_ensure_ohlc_backfilled() bekommt denselben Guard wie themen_etf/pipeline.py - fällt jetzt sauber in den bereits vorhandenen len(closes)==0-Pfad (Fixed-HALTEN mit klarem gate_reason) statt abzustürzen.</w:t>
+      </w:r>
+    </w:p>
+    <w:p>
+      <w:r>
+        <w:t>2. agent/multi_asset_batch.py::_kandidaten() schließt Aktien- UND Themen-ETF-Assets ohne yfinance_symbol jetzt aus der automatischen Kandidatenauswahl aus (analog zu signal_batch.pys coingecko_id-Filter)</w:t>
+      </w:r>
+    </w:p>
+    <w:p>
+      <w:r>
+        <w:t>Rohstoffe/Hedge bleiben unberührt (siehe oben).</w:t>
+      </w:r>
+    </w:p>
+    <w:p>
+      <w:r>
+        <w:t>3. ui/app.py::_refresh_watchlist_from_db() markiert betroffene Aktien-/ Themen-ETF-Assets jetzt ebenfalls sichtbar ("⚠ kein yfinance-Symbol"). Das bisherige Tag coingecko_id_fehlt wurde dafür in externe_id_fehlt umbenannt (deckt jetzt beide Fälle ab, gleiche rote Hervorhebung).</w:t>
+      </w:r>
+    </w:p>
+    <w:p>
+      <w:r>
+        <w:rPr>
+          <w:b/>
+        </w:rPr>
+        <w:t>Verifiziert:</w:t>
+      </w:r>
+      <w:r>
+        <w:t xml:space="preserve"> synthetischer Regressionstest des Absturz-Fixes (Guard verhindert die AttributeError, _load_ohlc() bleibt korrekt leer). Synthetischer Test von _kandidaten() mit 6 Fällen (Aktie mit/ohne ID, Themen-ETF mit/ohne ID, Rohstoff ohne ID bleibt Kandidat, Hedge-Instrument ohne ID bleibt Kandidat). Tk-Smoke-Test der erweiterten Watchlist-Tab- Warnung (Aktie/ETF ohne ID markiert, Hedge-Instrument korrekt unmarkiert).</w:t>
       </w:r>
     </w:p>
     <w:sectPr>

</xml_diff>

<commit_message>
Backtracking-Aussagekraft-Fix: Ueberholt-Erkennung hielt Ergebnisstatistik strukturell leer
Live gegen frischen Notebook-Export geprueft: 100% der trackbaren Spot-Signale
und 60% der Hebel-ERÖFFNEN-Signale wurden durch eine blosse HALTEN-Bestaetigung
als "ueberholt" markiert, bevor der Kurs je gegen Take-Profit/Stop-Loss geprueft
werden konnte (Spot ⌀29h, Hebel ⌀11,7h) - Governance Schritt 3 der
Selbstverifikations-Vision haette damit nie eine ausreichende Datengrundlage
bekommen. _is_superseded() ueberholt jetzt nur noch bei einer echten neuen
Aktion, nicht bei reiner Bestaetigung. Zusaetzlich: fixe 90-Tage-Ablauffrist
durch inhaltsbasierte Werte aus dem bereits vom Modell zuverlaessig gefuellten
halte_kriterium.bucket ersetzt (kurz/mittel/lang), statt einer neuen
Datenstruktur.
</commit_message>
<xml_diff>
--- a/Basisinfos/Regelwerksmanual.docx
+++ b/Basisinfos/Regelwerksmanual.docx
@@ -8212,10 +8212,7 @@
         <w:spacing w:after="160"/>
       </w:pPr>
       <w:r>
-        <w:t xml:space="preserve">Die drei ungeschützten Start-Schritte sind seit 2026-07-12 abgesichert (siehe oben), ebenso der sofortige erste Preis-Lauf und der staleness-bewusste Sofort-Trigger für die Kurs-/OHLC-Historie-Jobs nach jedem Neustart (siehe „Verhalten nach längerer Downtime“). E-Mail-Benachrichtigung bei Start-Fehlern und Job-Ausfällen (U-8) sowie bei Marktscan-Kaufkandidaten (MS-1b) ist seit 2026-07-12 erledigt, ebenso der Job-Ausfall-Backoff (siehe „Scheduler-Jobs“ oben) — damit ist die komplette Betriebssicherheits-Liste aus diesem Kapitel abgearbeitet. Die aggregierte Status-Übersicht selbst ist inzwischen Teil der Remote-Steuer-Seite geworden (Abschnitt 13).</w:t>
-      </w:r>
-      <w:r>
-        <w:t xml:space="preserve"> Neu hinzugekommen (2026-07-13): Watchdog + Tray-Monitor für einfachen Start/Stop/Status vom Windows-Desktop aus (siehe oben) — der eigentliche Live-Test am 24/7-Notebook steht noch aus.</w:t>
+        <w:t xml:space="preserve">Die drei ungeschützten Start-Schritte sind seit 2026-07-12 abgesichert (siehe oben), ebenso der sofortige erste Preis-Lauf und der staleness-bewusste Sofort-Trigger für die Kurs-/OHLC-Historie-Jobs nach jedem Neustart (siehe „Verhalten nach längerer Downtime“). E-Mail-Benachrichtigung bei Start-Fehlern und Job-Ausfällen (U-8) sowie bei Marktscan-Kaufkandidaten (MS-1b) ist seit 2026-07-12 erledigt, ebenso der Job-Ausfall-Backoff (siehe „Scheduler-Jobs“ oben) — damit ist die komplette Betriebssicherheits-Liste aus diesem Kapitel abgearbeitet. Die aggregierte Status-Übersicht selbst ist inzwischen Teil der Remote-Steuer-Seite geworden (Abschnitt 13). Neu hinzugekommen (2026-07-13): Watchdog + Tray-Monitor für einfachen Start/Stop/Status vom Windows-Desktop aus (siehe oben) — der eigentliche Live-Test am 24/7-Notebook steht noch aus.</w:t>
       </w:r>
     </w:p>
     <w:p>
@@ -12278,6 +12275,212 @@
       </w:r>
       <w:r>
         <w:t xml:space="preserve"> synthetischer Regressionstest des Absturz-Fixes (Guard verhindert die AttributeError, _load_ohlc() bleibt korrekt leer). Synthetischer Test von _kandidaten() mit 6 Fällen (Aktie mit/ohne ID, Themen-ETF mit/ohne ID, Rohstoff ohne ID bleibt Kandidat, Hedge-Instrument ohne ID bleibt Kandidat). Tk-Smoke-Test der erweiterten Watchlist-Tab- Warnung (Aktie/ETF ohne ID markiert, Hedge-Instrument korrekt unmarkiert).</w:t>
+      </w:r>
+    </w:p>
+    <w:p>
+      <w:r>
+        <w:rPr>
+          <w:b/>
+        </w:rPr>
+        <w:t>Nachtrag (2026-07-19, gleicher Tag): Backtracking-Aussagekraft-Audit - Überholt-Erkennung neutralisierte die eigene Ergebnisstatistik</w:t>
+      </w:r>
+    </w:p>
+    <w:p>
+      <w:r>
+        <w:rPr>
+          <w:b/>
+        </w:rPr>
+        <w:t xml:space="preserve">Auslöser: </w:t>
+      </w:r>
+      <w:r>
+        <w:t>Nutzer bat vor der Governance-Diskussion (Selbstverifikations- Vision Schritt 3, siehe Kap. 7) darum, sicherzustellen, dass Backward- Tracking "sauber funktioniert und auch kurzfristig eine gewisse Aussagekraft hat" - erst wenn das gewährleistet ist, soll die Governance- Frage angegangen werden.</w:t>
+      </w:r>
+    </w:p>
+    <w:p>
+      <w:r>
+        <w:rPr>
+          <w:b/>
+        </w:rPr>
+        <w:t xml:space="preserve">Echter, gravierender Fund: </w:t>
+      </w:r>
+      <w:r>
+        <w:t>Live gegen den frischesten Notebook- Datenexport geprüft (notebook_diagnose.json, 2026-07-19), da die lokale Desktop-DB seit dem NB-Umzug veraltet ist. Ergebnis: von 9 trackbaren Spot- Signalen (KAUFEN/NACHKAUFEN) wurden **alle 9 (100%)** als "überholt" markiert, bevor der Kurs jemals gegen Take-Profit/Stop-Loss geprüft werden konnte (nach durchschnittlich ~29 Std., Spanne 18-56 Std.) - **kein einziges** reales Ergebnis liegt vor. Bei Hebel wurden 21 von 35 ERÖFFNEN- Signalen (60%) nach durchschnittlich **11,7 Std.** (Spanne 4,2-22,7 Std.) überholt; nur 2 von 35 kamen je zu einem echten Ergebnis (beide Stop-Loss, beide aus der inzwischen entfernten Cerebras-Ära - die aktuelle Kette Groq/Mistral/Gemini hat bislang null ausgewertete Ergebnisse).</w:t>
+      </w:r>
+    </w:p>
+    <w:p>
+      <w:r>
+        <w:rPr>
+          <w:b/>
+        </w:rPr>
+        <w:t xml:space="preserve">Root Cause: </w:t>
+      </w:r>
+      <w:r>
+        <w:t>_is_superseded() (Kap. „Info-Leichen"-Nachtrag oben, 2026-07-16 eingeführt gegen doppelte/widersprüchliche Anzeigen) markierte ein offenes KAUFEN/ERÖFFNEN als überholt, sobald **irgendein** neueres reales Signal für dasselbe Symbol vorlag - unabhängig von dessen Aktion. Da HALTEN die weit überwiegende Aktion ist (&gt;95%) und gehaltene/offene Positionen sehr häufig neu bewertet werden (hebel_position_cooldown_ stunden: 3 Std., spot_cooldown_stunden_kern: 8 Std.), wurde praktisch jede offene Kauf-These durch eine bloße HALTEN-Bestätigung "überholt" - lange bevor ein realistischer mehrtägiger Kursverlauf Take-Profit/Stop-Loss überhaupt erreichen konnte. Die Funktion, die Doppel-Anzeigen verhindern sollte, hielt dadurch strukturell die Ergebnisstatistik leer, die Governance Schritt 3 als Grundlage braucht.</w:t>
+      </w:r>
+    </w:p>
+    <w:p>
+      <w:r>
+        <w:rPr>
+          <w:b/>
+        </w:rPr>
+        <w:t xml:space="preserve">Fix 1 - Überholt-Erkennung eingeschränkt: </w:t>
+      </w:r>
+      <w:r>
+        <w:t>_is_superseded() (Spot UND Hebel) überholt eine offene These jetzt nur noch bei einer echten neuen Aktion (erneutes KAUFEN/NACHKAUFEN/ERÖFFNEN = redundant, oder VERKAUFEN/ TAUSCHEN/SCHLIESSEN/HEBEL_SENKEN = widersprechend) - eine reine HALTEN- Bestätigung widerspricht der offenen These nicht und überholt sie nicht mehr. Die ursprüngliche Absicht (Duplikate/Widersprüche ausblenden) bleibt dadurch unverändert erhalten.</w:t>
+      </w:r>
+    </w:p>
+    <w:p>
+      <w:r>
+        <w:rPr>
+          <w:b/>
+        </w:rPr>
+        <w:t xml:space="preserve">Fix 2 - inhaltsbasierte Ablaufzeit statt fixer 90-Tage-Frist: </w:t>
+      </w:r>
+      <w:r>
+        <w:t>Nutzer- Vorgabe: "der zeitliche Faktor sollte durch den Inhalt bzw. Angabe - wann soll ein Zielwert erreicht werden - besser abschätzbar sein". Statt eine neue Datenstruktur zu erfinden, wird das bereits bestehende, vom Modell zuverlässig gefüllte halte_kriterium genutzt (Regel 17 in analyst.py/hebel_analyst.py, bereits vollständig als eigene Spalten in signals/hebel_signals persistiert): ziel_datum hat Vorrang, wenn gesetzt (in der Praxis fast nie - live geprüft: 0 von 9 Fällen), sonst der grobe bucket (kurz/mittel/lang, in der Praxis **zuverlässig** gefüllt - live geprüft: 9 von 9 Fällen). Neue Config-Werte backward_tracking.abgelaufen_nach_tagen_bucket (kurz: 14, mittel: 45, lang: 120 Tage) + abgelaufen_nach_tagen_fallback (90 Tage, für ältere Signale ohne halte_kriterium) ersetzen den alten einzelnen abgelaufen_nach_tagen-Wert. Die konkreten Tageswerte sind selbst [OFFEN]/vorläufig (siehe Kap. 15), erste plausible Startwerte analog dem bisherigen 90-Tage-Vorschlag.</w:t>
+      </w:r>
+    </w:p>
+    <w:p>
+      <w:r>
+        <w:rPr>
+          <w:b/>
+        </w:rPr>
+        <w:t xml:space="preserve">Fix (drei Dateien, identisches Muster fuer Spot und Hebel): </w:t>
+      </w:r>
+      <w:r/>
+    </w:p>
+    <w:p>
+      <w:r>
+        <w:t>1. agent/krypto/backward_tracking.py: _is_superseded() + _is_expired() wie beschrieben geändert, DEFAULT_ABGELAUFEN_TAGE_BUCKET/ DEFAULT_ABGELAUFEN_TAGE_FALLBACK ersetzen DEFAULT_ABGELAUFEN_NACH_ TAGEN.</w:t>
+      </w:r>
+    </w:p>
+    <w:p>
+      <w:r>
+        <w:t>2. agent/krypto/hebel_backward_tracking.py: identischer Fix (mirror- Muster), importiert die neuen Konstanten von oben.</w:t>
+      </w:r>
+    </w:p>
+    <w:p>
+      <w:r>
+        <w:t>3. Basisinfos/config.yaml: backward_tracking-Sektion umgestellt.</w:t>
+      </w:r>
+    </w:p>
+    <w:p>
+      <w:r>
+        <w:rPr>
+          <w:b/>
+        </w:rPr>
+        <w:t xml:space="preserve">Verifiziert: </w:t>
+      </w:r>
+      <w:r>
+        <w:t>14 synthetische Tests (HALTEN überholt nicht mehr/andere Aktionen weiterhin doch, für Spot UND Hebel; bucket-Mapping kurz/mittel/ lang; ziel_datum-Override in beide Richtungen; Fallback bei fehlendem bucket; ungültiges ziel_datum fällt korrekt auf bucket zurück). Echter Lauf gegen eine Kopie der Produktions-DB: von 51 vorher unverarbeiteten Spot- Signalen bleiben danach korrekt nur die 2 tatsächlich noch unentschiedenen trackbaren Signale offen (vorher wären sie durch die alte Regel fälschlich überholt worden, da fuer beide zwischenzeitlich nur HALTEN-Bestätigungen vorlagen), alle anderen korrekt nicht_anwendbar.</w:t>
+      </w:r>
+    </w:p>
+    <w:p>
+      <w:r>
+        <w:rPr>
+          <w:b/>
+        </w:rPr>
+        <w:t>Nachtrag (2026-07-19, gleicher Tag): 29× "Auto-Add unbekannter Hebel-Symbole fehlgeschlagen" im Notebook-Export - Bug war bereits gefixt, keine neue Ursache</w:t>
+      </w:r>
+    </w:p>
+    <w:p>
+      <w:r>
+        <w:rPr>
+          <w:b/>
+        </w:rPr>
+        <w:t xml:space="preserve">Auftrag: </w:t>
+      </w:r>
+      <w:r>
+        <w:t>vollen Traceback zu 29 Vorkommen von "Auto-Add unbekannter Hebel-Symbole fehlgeschlagen" im notebook_diagnose.json-Export finden, Root Cause klären, fixen.</w:t>
+      </w:r>
+    </w:p>
+    <w:p>
+      <w:r>
+        <w:t>**Ergebnis: kein neuer Fix nötig - der Export zeigt einen bereits abgeschlossenen Vorfall.** Vollständiger Traceback aus log_auszug extrahiert (72h-Fenster, job_fehlschlaege listet nur die Kurzmeldung ohne Traceback): 28 der 29 Vorkommen sind exakt der AttributeError: 'str' object has no attribute 'get'-Bug aus get_listed_assets(bitpanda_api_key) statt get_listed_assets() - **derselbe Bug, der bereits am selben Tag (2026-07-16, Commit fe970ef) live anhand eines FRÜHEREN Notebook-Diagnose-Exports gefunden und gefixt wurde** (siehe Commit-Nachricht: "Live in den Notebook-Logs gefunden (Notebook_Analysedaten-Export)"). Alle 28 Vorkommen liegen zeitlich zwischen 2026-07-16 13:10:02 und 2026-07-17 02:52:35 - der Fix wurde um 15:33 Uhr desselben Tages committet, das Notebook lief bis zum nächsten USB-Sync aber noch mit dem alten Code weiter (siehe [[reference_usb_sync_workflow]]). Aktueller Code (scheduler/background.py, importer/bitpanda_margin_positions.py, api/bitpanda.py) wurde geprüft und ruft an allen vier Stellen bereits korrekt get_listed_assets() ohne Positionsargument auf - keine Änderung nötig, per Signatur-Check bestätigt.</w:t>
+      </w:r>
+    </w:p>
+    <w:p>
+      <w:r>
+        <w:t>Das **29. Vorkommen** (2026-07-17 02:52:35, letztes in der Reihe) ist ein eigenständiger requests.exceptions.ReadTimeout gegen api.bitpanda.com (15s-Timeout in _fetch_all_bitpanda_assets(), paginierter Abruf des gesamten Asset-Katalogs) - eine normale transiente Netzwerkstörung, kein Code-Fehler, kein Wiederholungsmuster (kein weiteres Vorkommen im restlichen 72h-Fenster bis 2026-07-19 06:03). Konsistent mit dem bestehenden Muster anderer transienter API-Fehler in diesem Projekt (z. B. FRED-Timeouts), die ebenfalls ohne Sonderbehandlung beim nächsten 15-Min-Tick automatisch erneut versucht werden - hebel_screening_job fängt den Fehler ohnehin lokal ab (eigener try/except um den Auto-Add- Aufruf), sodass weder der restliche Job-Lauf noch die U-8-Job-Ausfall- E-Mail-Benachrichtigung betroffen sind.</w:t>
+      </w:r>
+    </w:p>
+    <w:p>
+      <w:r>
+        <w:rPr>
+          <w:b/>
+        </w:rPr>
+        <w:t xml:space="preserve">Wichtige Korrektur der Auftragsbeschreibung: </w:t>
+      </w:r>
+      <w:r>
+        <w:t>der im Auftrag genannte "letzter Treffer 2026-07-19 06:03:30" bezieht sich nicht auf diese Fehlermeldung - der tatsächlich letzte "Auto-Add..."-Eintrag im Export liegt auf 2026-07-17 02:52:35. Der spätere Zeitstempel gehört zu einer andersartigen, unabhängigen Meldung ("FRED-Abruf für bok_diskontsatz fehlgeschlagen"). Lektion: bei mehrdeutigen/verwechselbaren Log-Zeitstempel- Angaben im Auftrag den vollen job_fehlschlaege/log_auszug-Datensatz selbst nachprüfen statt die genannten Eckwerte ungeprüft zu übernehmen.</w:t>
+      </w:r>
+    </w:p>
+    <w:p>
+      <w:r>
+        <w:rPr>
+          <w:b/>
+        </w:rPr>
+        <w:t xml:space="preserve">Verifiziert: </w:t>
+      </w:r>
+      <w:r>
+        <w:t>vollständige Traceback-Extraktion aller 29 Vorkommen aus log_auszug (Python-Skript, Gruppierung per Zeitstempel-Regex), Diff der Exception-Endzeilen (2 eindeutige Cluster: AttributeError × 28, ReadTimeout × 1). Aktueller Code an allen 4 get_listed_assets()- Aufrufstellen per grep + Signatur-Introspektion (inspect.signature()) gegengeprüft - keine Regression.</w:t>
+      </w:r>
+    </w:p>
+    <w:p>
+      <w:r>
+        <w:rPr>
+          <w:b/>
+        </w:rPr>
+        <w:t xml:space="preserve">Nachtrag (2026-07-19, gleicher Tag): 29× "Auto-Add unbekannter Hebel-Symbole fehlgeschlagen" im Notebook-Export - Bug war bereits gefixt, keine neue Ursache</w:t>
+      </w:r>
+    </w:p>
+    <w:p>
+      <w:r>
+        <w:rPr>
+          <w:b/>
+        </w:rPr>
+        <w:t xml:space="preserve">Auftrag:</w:t>
+      </w:r>
+      <w:r>
+        <w:t xml:space="preserve"> vollen Traceback zu 29 Vorkommen von "Auto-Add unbekannter Hebel-Symbole fehlgeschlagen" im notebook_diagnose.json-Export finden, Root Cause klären, fixen.</w:t>
+      </w:r>
+    </w:p>
+    <w:p>
+      <w:r>
+        <w:rPr>
+          <w:b/>
+        </w:rPr>
+        <w:t xml:space="preserve">Ergebnis: kein neuer Fix nötig - der Export zeigt einen bereits abgeschlossenen Vorfall.</w:t>
+      </w:r>
+      <w:r>
+        <w:t xml:space="preserve"> Vollständiger Traceback aus log_auszug extrahiert (72h-Fenster, job_fehlschlaege listet nur die Kurzmeldung ohne Traceback): 28 der 29 Vorkommen sind exakt der AttributeError: 'str' object has no attribute 'get'-Bug aus get_listed_assets(bitpanda_api_key) statt get_listed_assets() - derselbe Bug, der bereits am selben Tag (2026-07-16, Commit fe970ef) live anhand eines FRÜHEREN Notebook-Diagnose-Exports gefunden und gefixt wurde (siehe Commit-Nachricht: "Live in den Notebook-Logs gefunden (Notebook_Analysedaten-Export)"). Alle 28 Vorkommen liegen zeitlich zwischen 2026-07-16 13:10:02 und 2026-07-17 02:52:35 - der Fix wurde um 15:33 Uhr desselben Tages committet, das Notebook lief bis zum nächsten USB-Sync aber noch mit dem alten Code weiter. Aktueller Code (scheduler/background.py, importer/bitpanda_margin_positions.py, api/bitpanda.py) wurde geprüft und ruft an allen vier Stellen bereits korrekt get_listed_assets() ohne Positionsargument auf - keine Änderung nötig, per Signatur-Check bestätigt.</w:t>
+      </w:r>
+    </w:p>
+    <w:p>
+      <w:r>
+        <w:t xml:space="preserve">Das 29. Vorkommen (2026-07-17 02:52:35, letztes in der Reihe) ist ein eigenständiger requests.exceptions.ReadTimeout gegen api.bitpanda.com (15s-Timeout in _fetch_all_bitpanda_assets(), paginierter Abruf des gesamten Asset-Katalogs) - eine normale transiente Netzwerkstörung, kein Code-Fehler, kein Wiederholungsmuster (kein weiteres Vorkommen im restlichen 72h-Fenster bis 2026-07-19 06:03). Konsistent mit dem bestehenden Muster anderer transienter API-Fehler in diesem Projekt (z. B. FRED-Timeouts), die ebenfalls ohne Sonderbehandlung beim nächsten 15-Min-Tick automatisch erneut versucht werden - hebel_screening_job fängt den Fehler ohnehin lokal ab (eigener try/except um den Auto-Add-Aufruf), sodass weder der restliche Job-Lauf noch die U-8-Job-Ausfall-E-Mail-Benachrichtigung betroffen sind.</w:t>
+      </w:r>
+    </w:p>
+    <w:p>
+      <w:r>
+        <w:rPr>
+          <w:b/>
+        </w:rPr>
+        <w:t xml:space="preserve">Wichtige Korrektur der Auftragsbeschreibung:</w:t>
+      </w:r>
+      <w:r>
+        <w:t xml:space="preserve"> der im Auftrag genannte "letzter Treffer 2026-07-19 06:03:30" bezieht sich nicht auf diese Fehlermeldung - der tatsächlich letzte "Auto-Add..."-Eintrag im Export liegt auf 2026-07-17 02:52:35. Der spätere Zeitstempel gehört zu einer andersartigen, unabhängigen Meldung ("FRED-Abruf für bok_diskontsatz fehlgeschlagen"). Lektion: bei mehrdeutigen/verwechselbaren Log-Zeitstempel-Angaben im Auftrag den vollen job_fehlschlaege/log_auszug-Datensatz selbst nachprüfen statt die genannten Eckwerte ungeprüft zu übernehmen.</w:t>
+      </w:r>
+    </w:p>
+    <w:p>
+      <w:r>
+        <w:rPr>
+          <w:b/>
+        </w:rPr>
+        <w:t xml:space="preserve">Verifiziert:</w:t>
+      </w:r>
+      <w:r>
+        <w:t xml:space="preserve"> vollständige Traceback-Extraktion aller 29 Vorkommen aus log_auszug (Python-Skript, Gruppierung per Zeitstempel-Regex), Diff der Exception-Endzeilen (2 eindeutige Cluster: AttributeError × 28, ReadTimeout × 1). Aktueller Code an allen 4 get_listed_assets()-Aufrufstellen per grep + Signatur-Introspektion (inspect.signature()) gegengeprüft - keine Regression.</w:t>
       </w:r>
     </w:p>
     <w:sectPr>

</xml_diff>

<commit_message>
EIA + Finnhub live mit echten Nutzer-Keys verifiziert
Beide Datenquellen liefern echte, plausible Antwortdaten (EIA-Erdgas-
Lagerbestand saisonal korrekter Build, Finnhub-Analysten-Trend fuer
VST/PLTR). Vorbehalt "Datenform unbestaetigt" damit aufgeloest.

Co-Authored-By: Claude Sonnet 5 <noreply@anthropic.com>
</commit_message>
<xml_diff>
--- a/Basisinfos/Regelwerksmanual.docx
+++ b/Basisinfos/Regelwerksmanual.docx
@@ -12791,6 +12791,11 @@
     <w:p>
       <w:r>
         <w:rPr>
+          <w:b w:val="0"/>
+        </w:rPr>
+      </w:r>
+      <w:r>
+        <w:rPr>
           <w:b/>
         </w:rPr>
         <w:t>Verifiziert:</w:t>
@@ -12799,19 +12804,88 @@
         <w:rPr>
           <w:b w:val="0"/>
         </w:rPr>
-        <w:t xml:space="preserve"> 14 synthetische Tests (EIA-Wochenwerte-Parsing inkl. Delta-Berechnung, Rohstoff-Symbol-Filter, Finnhub-Trend-Sortierung + Zusammenfassung inkl. Ein-Monats-Edge-Case, JSON-Serialisierbarkeit). Modul-Imports fehlerfrei. Endpunkt-Routen live gegen die echten Server bestätigt (siehe Vorbehalt oben). </w:t>
-      </w:r>
-      <w:r>
-        <w:rPr>
-          <w:b/>
-        </w:rPr>
-        <w:t>Ausstehend:</w:t>
-      </w:r>
+        <w:t xml:space="preserve"> 14 synthetische Tests (EIA-Wochenwerte-Parsing inkl. Delta-Berechnung, Rohstoff-Symbol-Filter, Finnhub-Trend-Sortierung + Zusammenfassung inkl. Ein-Monats-Edge-Case, JSON-Serialisierbarkeit). Modul-Imports fehlerfrei. Endpunkt-Routen live gegen die echten Server bestätigt (siehe Vorbehalt oben).</w:t>
+      </w:r>
+    </w:p>
+    <w:p>
+      <w:pPr>
+        <w:pStyle w:val="Heading2"/>
+      </w:pPr>
+      <w:r>
+        <w:t>Nachtrag (2026-07-19, gleicher Tag, Folge): EIA + Finnhub live mit echten Nutzer-Keys verifiziert</w:t>
+      </w:r>
+    </w:p>
+    <w:p>
       <w:r>
         <w:rPr>
           <w:b w:val="0"/>
         </w:rPr>
-        <w:t xml:space="preserve"> echte End-to-End- Verifikation mit echten Antwortdaten, sobald der Nutzer die beiden kostenlosen Keys angelegt hat.</w:t>
+        <w:t>Nutzer hat beide kostenlosen Keys angelegt und in .env eingetragen. Damit konnte die zuvor offene Lücke geschlossen werden - nicht mehr nur die Endpunkt-Route, sondern die tatsächliche Datenform der Antworten.</w:t>
+      </w:r>
+    </w:p>
+    <w:p>
+      <w:r>
+        <w:rPr>
+          <w:b w:val="0"/>
+        </w:rPr>
+      </w:r>
+      <w:r>
+        <w:rPr>
+          <w:b/>
+        </w:rPr>
+        <w:t>EIA:</w:t>
+      </w:r>
+      <w:r>
+        <w:rPr>
+          <w:b w:val="0"/>
+        </w:rPr>
+        <w:t xml:space="preserve"> get_natural_gas_storage_history() liefert 8 echte Wochenwerte (2026-05-22 bis 2026-07-10), Lower-48-Bestand steigt saisonal korrekt von 2.483 auf 3.024 Bcf (Build in jeder Woche, konsistent mit der US-Sommer-Füllsaison). Series-ID, Feldnamen und Delta-Berechnung bestätigt korrekt - kein Ratefehler in der ursprünglichen Implementierung. agent/rohstoff/pipeline.py::_fetch_lagerbestaende("OD7L", ...) direkt gegen die echte API getestet, liefert das erwartete Fakten-Dict inkl. 8-Wochen-Verlauf; für andere Rohstoff-Symbole weiterhin korrekt None.</w:t>
+      </w:r>
+    </w:p>
+    <w:p>
+      <w:r>
+        <w:rPr>
+          <w:b w:val="0"/>
+        </w:rPr>
+      </w:r>
+      <w:r>
+        <w:rPr>
+          <w:b/>
+        </w:rPr>
+        <w:t>Finnhub:</w:t>
+      </w:r>
+      <w:r>
+        <w:rPr>
+          <w:b w:val="0"/>
+        </w:rPr>
+        <w:t xml:space="preserve"> get_recommendation_trends() liefert für VST und PLTR je 4 Monatswerte mit den erwarteten Feldern (period/strongBuy/buy/hold/sell/strongSell). Konsens plausibel unterschiedlich zwischen beiden Aktien (VST fast ausschließlich Buy/Strong-Buy, PLTR mit spürbarem Hold-Anteil) - Datenform bestätigt korrekt, summarize_recommendation_trend() bildet die Monat-zu-Monat-Richtungskomponente wie vorgesehen.</w:t>
+      </w:r>
+    </w:p>
+    <w:p>
+      <w:r>
+        <w:rPr>
+          <w:b w:val="0"/>
+        </w:rPr>
+      </w:r>
+      <w:r>
+        <w:rPr>
+          <w:b/>
+        </w:rPr>
+        <w:t>Rechtliche Einordnung (auf Nutzerfrage hin geprüft):</w:t>
+      </w:r>
+      <w:r>
+        <w:rPr>
+          <w:b w:val="0"/>
+        </w:rPr>
+        <w:t xml:space="preserve"> EIA-Daten sind U.S.-Government-Public-Domain (eia.gov/about/copyrights_reuse.php) - jede Nutzung erlaubt, keine Einschränkung, Attribution nur optional empfohlen. Finnhubs Free-Tier ist vertraglich klar auf "Non-Professional/persönliche, nicht-kommerzielle Nutzung" beschränkt (finnhub.io/terms-of-service) und verbietet Weitergabe der Daten/Ergebnisse an Dritte - beides passt exakt zum tatsächlichen Nutzungsmuster von TradingInfoTool (privates Single-User-Tool, Daten fließen nur in lokale LLM-Prompts, keine Weiterverteilung). Bei der Finnhub-Registrierung ist die Kontoart aktiv als "Non-Professional/Personal" zu wählen - keine reine Formsache, sondern deckt sich inhaltlich mit der echten Nutzung.</w:t>
+      </w:r>
+    </w:p>
+    <w:p>
+      <w:r>
+        <w:rPr>
+          <w:b w:val="0"/>
+        </w:rPr>
+        <w:t>Modul-Docstrings in api/eia.py/api/finnhub.py von "wahrscheinlich korrekt, noch nicht bestätigt" auf "live verifiziert" aktualisiert. Damit sind alle vier vom Nutzer gewählten neuen Datenquellen (FRED, SEC-EDGAR, EIA, Finnhub) vollständig umgesetzt UND live verifiziert - nur FINRA Equity Short Interest bleibt als letzter, noch nicht angegangener Kandidat aus der ursprünglichen Auswahl offen.</w:t>
       </w:r>
     </w:p>
     <w:sectPr>

</xml_diff>

<commit_message>
FINRA-Erdgas-Erdgas-Short-Interest ergaenzt - letzte der fuenf neuen Datenquellen
Kein API-Key noetig (oeffentlicher Endpunkt, live bestaetigt). Nur
Aktien-Pipeline, neue Regel 24 als niedrig gewichteter, ausdruecklich
ambivalenter Zusatzkontext (Fortsetzung vs. Short-Squeeze-Setup).

Co-Authored-By: Claude Sonnet 5 <noreply@anthropic.com>
</commit_message>
<xml_diff>
--- a/Basisinfos/Regelwerksmanual.docx
+++ b/Basisinfos/Regelwerksmanual.docx
@@ -12886,6 +12886,79 @@
           <w:b w:val="0"/>
         </w:rPr>
         <w:t>Modul-Docstrings in api/eia.py/api/finnhub.py von "wahrscheinlich korrekt, noch nicht bestätigt" auf "live verifiziert" aktualisiert. Damit sind alle vier vom Nutzer gewählten neuen Datenquellen (FRED, SEC-EDGAR, EIA, Finnhub) vollständig umgesetzt UND live verifiziert - nur FINRA Equity Short Interest bleibt als letzter, noch nicht angegangener Kandidat aus der ursprünglichen Auswahl offen.</w:t>
+      </w:r>
+    </w:p>
+    <w:p>
+      <w:pPr>
+        <w:pStyle w:val="Heading2"/>
+      </w:pPr>
+      <w:r>
+        <w:t>Nachtrag (2026-07-19, gleicher Tag, Folge 2): FINRA Equity Short Interest (Aktien-Pipeline)</w:t>
+      </w:r>
+    </w:p>
+    <w:p>
+      <w:r>
+        <w:rPr>
+          <w:b w:val="0"/>
+        </w:rPr>
+        <w:t>Auslöser: Nutzer bat "jetzt FINRA Short Interest angehen" - der letzte der vier ursprünglich gewählten Datenquellen-Kandidaten.</w:t>
+      </w:r>
+    </w:p>
+    <w:p>
+      <w:r>
+        <w:rPr>
+          <w:b w:val="0"/>
+        </w:rPr>
+      </w:r>
+      <w:r>
+        <w:rPr>
+          <w:b/>
+        </w:rPr>
+        <w:t>Wichtiger Fund:</w:t>
+      </w:r>
+      <w:r>
+        <w:rPr>
+          <w:b w:val="0"/>
+        </w:rPr>
+        <w:t xml:space="preserve"> anders als EIA/Finnhub braucht FINRAs Consolidated-Short-Interest-Endpunkt (api.finra.org/data/group/otcMarket/name/ConsolidatedShortInterest) KEINEN API-Key - live bestätigt öffentlich zugänglich (dieselbe Backend-API, die FINRAs eigene Daten-Browse-Oberfläche nutzt). Für VST/PLTR (beide NYSE) echte, plausible Historie zurückbekommen (VST: 205 Datenpunkte seit 2017, PLTR: 138 seit 2019). Ein Sortierversuch über den Partition-Key settlementDate scheitert ohne zusätzlichen Datums-Filter (API-Einschränkung) - stattdessen wird die komplette Historie mit einem großzügigen limit geholt und clientseitig sortiert/zugeschnitten. Bei unbekanntem Symbol liefert die API HTTP 204 mit leerem Body (kein valides JSON) statt einer leeren Liste - live mit einem Fantasiesymbol bestätigt, expliziter Check in get_short_interest_history().</w:t>
+      </w:r>
+    </w:p>
+    <w:p>
+      <w:r>
+        <w:rPr>
+          <w:b w:val="0"/>
+        </w:rPr>
+      </w:r>
+      <w:r>
+        <w:rPr>
+          <w:b/>
+        </w:rPr>
+        <w:t>Umgesetzt:</w:t>
+      </w:r>
+      <w:r>
+        <w:rPr>
+          <w:b w:val="0"/>
+        </w:rPr>
+        <w:t xml:space="preserve"> neue api/finra.py - get_short_interest_history(symbol, n_periods=6) (letzte 6 zweiwöchentliche Meldeperioden, aufsteigend), summarize_short_interest() (aktuelle vs. vorherige Periode, analog zum Finnhub-Muster). Nur Aktien-Pipeline (agent/aktien/pipeline.py, asset.yfinance_symbol wie bei SEC-EDGAR/Finnhub), neue Regel 24 in agent/aktien/analyst.py: niedrig gewichteter Zusatzkontext, explizit AMBIVALENT markiert (steigende Short-Position + hohes days_to_cover kann sowohl anhaltenden Abwärtsdruck als auch ein Short-Squeeze-Setup bedeuten, je nach technischem Kontext) - Erwähnung nur bei auffälligem days_to_cover (&gt;3-4 Tage) oder starker Periodenänderung (&gt;15-20%). Meldelag (1-3 Wochen, zweiwöchentliche FINRA-Meldung) explizit als "kein Echtzeit-Signal" vermerkt. remote/server.py::API_HEALTH_GROUPS um finra ergänzt. Kein .env-Eintrag nötig (kein Key).</w:t>
+      </w:r>
+    </w:p>
+    <w:p>
+      <w:r>
+        <w:rPr>
+          <w:b w:val="0"/>
+        </w:rPr>
+      </w:r>
+      <w:r>
+        <w:rPr>
+          <w:b/>
+        </w:rPr>
+        <w:t>Verifiziert:</w:t>
+      </w:r>
+      <w:r>
+        <w:rPr>
+          <w:b w:val="0"/>
+        </w:rPr>
+        <w:t xml:space="preserve"> synthetische Tests für summarize_short_interest() (leer/1-Eintrag/2-Eintraege), Pipeline-Block-Simulation mit echtem API-Aufruf für VST (JSON-serialisierbar), Live-Test für VST/PLTR (echte Werte, z. B. VST 2026-06-30: 15.917.274 Short-Aktien, 3,45 Tage Eindeckungsdauer, +3,61% ggü. Vorperiode) sowie für ein Fantasiesymbol (leere Liste, kein Crash trotz HTTP-204-Sonderfall). build_facts()-Signatur-Check bestätigt korrekte Parameter-Durchreichung. Damit sind JETZT ALLE FÜNF ursprünglich recherchierten Datenquellen-Kandidaten (FRED, SEC-EDGAR, EIA, Finnhub, FINRA) vollständig umgesetzt und live verifiziert - keine offenen Kandidaten aus dieser Recherche-Runde mehr.</w:t>
       </w:r>
     </w:p>
     <w:sectPr>

</xml_diff>

<commit_message>
Einfacher Aktien/ETF-Screener + Bitpanda-Sonderthema
Neuer Screener-Tab: yfinance-Screens fuer Aktien, Bitpandas eigener
ETF/ETC-Katalog fuer ETF (bewusst asymmetrisch, da echte UCITS-ETF-
Discovery an Bitpandas Sortiment vorbeigegangen waere). Wichtiger
Nebenfund: alle 9 gehaltenen Rohstoff/Themen-ETF-Positionen sind NICHT
bei Bitpanda gelistet, nur die 2 Aktien - Nutzer haelt diese ueber einen
anderen Broker.

Co-Authored-By: Claude Sonnet 5 <noreply@anthropic.com>
</commit_message>
<xml_diff>
--- a/Basisinfos/Regelwerksmanual.docx
+++ b/Basisinfos/Regelwerksmanual.docx
@@ -12959,6 +12959,160 @@
           <w:b w:val="0"/>
         </w:rPr>
         <w:t xml:space="preserve"> synthetische Tests für summarize_short_interest() (leer/1-Eintrag/2-Eintraege), Pipeline-Block-Simulation mit echtem API-Aufruf für VST (JSON-serialisierbar), Live-Test für VST/PLTR (echte Werte, z. B. VST 2026-06-30: 15.917.274 Short-Aktien, 3,45 Tage Eindeckungsdauer, +3,61% ggü. Vorperiode) sowie für ein Fantasiesymbol (leere Liste, kein Crash trotz HTTP-204-Sonderfall). build_facts()-Signatur-Check bestätigt korrekte Parameter-Durchreichung. Damit sind JETZT ALLE FÜNF ursprünglich recherchierten Datenquellen-Kandidaten (FRED, SEC-EDGAR, EIA, Finnhub, FINRA) vollständig umgesetzt und live verifiziert - keine offenen Kandidaten aus dieser Recherche-Runde mehr.</w:t>
+      </w:r>
+    </w:p>
+    <w:p>
+      <w:pPr>
+        <w:pStyle w:val="Heading2"/>
+      </w:pPr>
+      <w:r>
+        <w:t>Nachtrag (2026-07-19, gleicher Tag, Folge 3): Aktien/ETF-Screener + Bitpanda-Sonderthema</w:t>
+      </w:r>
+    </w:p>
+    <w:p>
+      <w:r>
+        <w:rPr>
+          <w:b w:val="0"/>
+        </w:rPr>
+        <w:t>Auslöser: Nutzer fragte nach dem Stand von "Marktscan-analogen" Mechanismen für Aktien/Rohstoffe/ETF. Antwort: es gab bisher KEINE automatische Neu-Kandidaten-Entdeckung für diese drei Klassen (nur die 11 manuell in config.yaml gepflegten Symbole werden per agent/multi_asset_batch.py regelmäßig neu bewertet, siehe Cooldown-Werte 24h/72h dort) - die Bewertung bestehender Positionen lief also schon automatisch, nur die Kandidaten-Suche fehlte. Nutzer bat: "bau einen einfachen Aktien/ETF-Screener über eine kostenlose Quelle und berücksichtige auch hier das Sonderthema - was ist bei Bitpanda davon gelistet und was nicht."</w:t>
+      </w:r>
+    </w:p>
+    <w:p>
+      <w:r>
+        <w:rPr>
+          <w:b w:val="0"/>
+        </w:rPr>
+      </w:r>
+      <w:r>
+        <w:rPr>
+          <w:b/>
+        </w:rPr>
+        <w:t>Wichtiger Fund VOR der Implementierung (direkt relevant für die Bitpanda-Frage):</w:t>
+      </w:r>
+      <w:r>
+        <w:rPr>
+          <w:b w:val="0"/>
+        </w:rPr>
+        <w:t xml:space="preserve"> ein Live-Check aller 9 aktuell gehaltenen Rohstoff-/Themen-ETF-Positionen (OD7N/OD7H/OD7C/OD7L/VVMX/X136/EXH3/CEBS/ISOC) gegen api.bitpanda.is_listed() ergab: KEINE davon ist bei Bitpanda gelistet - nur die beiden Aktien (VST/PLTR) sind es. Bitpanda führt zwar eigene ETF/ETC-"Themenkörbe" (z.B. "COPPERMINE", "NATGAS", 209 Einträge insgesamt), das sind aber ANDERE, Bitpanda-eigene Produkte - keine echten UCITS-ETFs/WisdomTree-ETCs wie in der Watchlist. Der Nutzer hält diese 9 Positionen also nachweislich über einen anderen Broker (die Bestände selbst sind über den bestehenden Excel-Import erfasst, nicht über Live-Bitpanda-Sync). Diese Erkenntnis hat die Architektur direkt geprägt (siehe unten).</w:t>
+      </w:r>
+    </w:p>
+    <w:p>
+      <w:r>
+        <w:rPr>
+          <w:b w:val="0"/>
+        </w:rPr>
+      </w:r>
+      <w:r>
+        <w:rPr>
+          <w:b/>
+        </w:rPr>
+        <w:t>Datenquelle (kostenlos, kein neuer API-Key):</w:t>
+      </w:r>
+      <w:r>
+        <w:rPr>
+          <w:b w:val="0"/>
+        </w:rPr>
+        <w:t xml:space="preserve"> yfinance (bereits im Projekt für OHLC/Fundamentaldaten genutzt) Version 1.5.1 hat ein eingebautes yf.screen()-Feature (Yahoo-Finance-Screener-Backend, live verifiziert: most_actives/day_gainers/growth_technology_stocks/undervalued_growth_stocks/small_cap_gainers liefern je 30-325 Treffer mit &gt;90 Feldern pro Symbol).</w:t>
+      </w:r>
+    </w:p>
+    <w:p>
+      <w:r>
+        <w:rPr>
+          <w:b w:val="0"/>
+        </w:rPr>
+      </w:r>
+      <w:r>
+        <w:rPr>
+          <w:b/>
+        </w:rPr>
+        <w:t>Bewusst ASYMMETRISCHE Architektur</w:t>
+      </w:r>
+      <w:r>
+        <w:rPr>
+          <w:b w:val="0"/>
+        </w:rPr>
+        <w:t xml:space="preserve"> (agent/aktien/screener.py, neu), direkt begründet durch den Bitpanda-Fund oben: </w:t>
+      </w:r>
+      <w:r>
+        <w:rPr>
+          <w:b/>
+        </w:rPr>
+        <w:t>Aktien:</w:t>
+      </w:r>
+      <w:r>
+        <w:rPr>
+          <w:b w:val="0"/>
+        </w:rPr>
+        <w:t xml:space="preserve"> scan_aktien_candidates() durchsucht 3 Yahoo-Finance-Screens (Momentum + Growth + Value gemischt), filtert Mikro-Caps (&lt;500 Mio. $ Marktkap.) und Illiquides (&lt;500k Tagesvolumen) heraus, dedupliziert, schließt bereits gelistete Watchlist-Symbole aus und markiert pro Kandidat bitpanda_gelistet via is_listed(). </w:t>
+      </w:r>
+      <w:r>
+        <w:rPr>
+          <w:b/>
+        </w:rPr>
+        <w:t>ETF/ETC:</w:t>
+      </w:r>
+      <w:r>
+        <w:rPr>
+          <w:b w:val="0"/>
+        </w:rPr>
+        <w:t xml:space="preserve"> scan_etf_candidates() enumeriert NICHT über yfinance, sondern DIREKT Bitpandas eigenen ETF/ETC-Katalog (get_listed_non_crypto_assets(), Gruppen etf+etc) - das IST das bei Bitpanda tatsächlich kaufbare Angebot, während eine echte UCITS-ETF-Discovery über yfinance an Bitpandas Sortiment vorbeigegangen wäre. Kein yfinance_symbol ableitbar (Bitpandas Symbole wie "COPPERMINE" sind eigene Produktnamen, keine Börsenticker) - degradiert sauber auf "keine technische Historie" (bereits bestehender Fix, Ticket #319).</w:t>
+      </w:r>
+    </w:p>
+    <w:p>
+      <w:r>
+        <w:rPr>
+          <w:b w:val="0"/>
+        </w:rPr>
+      </w:r>
+      <w:r>
+        <w:rPr>
+          <w:b/>
+        </w:rPr>
+        <w:t>Bewusst EINFACH gehalten</w:t>
+      </w:r>
+      <w:r>
+        <w:rPr>
+          <w:b w:val="0"/>
+        </w:rPr>
+        <w:t xml:space="preserve"> (Nutzer-Wunsch): kein vierstufiges Scoring wie beim Krypto-Marktscan (agent/krypto/marktscan.py), keine DB-Persistenz, kein automatischer LLM-Call - ein manueller "Jetzt scannen"-Klick liefert eine frische Kandidatenliste, "In Watchlist übernehmen" nutzt exakt dasselbe bereits etablierte Muster wie Marktscan (config.py::add_watchlist_entry(), Backup + Validierung + Rollback). Die eigentliche Bewertung übernommener Kandidaten läuft danach ganz regulär über den bereits bestehenden multi_asset_batch_job - kein Doppelbau.</w:t>
+      </w:r>
+    </w:p>
+    <w:p>
+      <w:r>
+        <w:rPr>
+          <w:b w:val="0"/>
+        </w:rPr>
+      </w:r>
+      <w:r>
+        <w:rPr>
+          <w:b/>
+        </w:rPr>
+        <w:t>Umgesetzt:</w:t>
+      </w:r>
+      <w:r>
+        <w:rPr>
+          <w:b w:val="0"/>
+        </w:rPr>
+        <w:t xml:space="preserve"> agent/aktien/screener.py (neu, ScreenerCandidate-Dataclass, scan_aktien_candidates(), scan_etf_candidates()), ui/screener_view.py (neu, Treeview + Scan-Button + Übernehmen-Button, Muster identisch zu ui/marktscan_view.py, aber ohne Score-Spalte/Detail-Panel). ui/app.py: neuer Tab "Screener" zwischen Marktscan und Hebel.</w:t>
+      </w:r>
+    </w:p>
+    <w:p>
+      <w:r>
+        <w:rPr>
+          <w:b w:val="0"/>
+        </w:rPr>
+      </w:r>
+      <w:r>
+        <w:rPr>
+          <w:b/>
+        </w:rPr>
+        <w:t>Verifiziert:</w:t>
+      </w:r>
+      <w:r>
+        <w:rPr>
+          <w:b w:val="0"/>
+        </w:rPr>
+        <w:t xml:space="preserve"> synthetische Tests (_bereits_in_watchlist() Groß-/Kleinschreibung), echter Live-Lauf gegen beide Quellen (144 Aktien-Kandidaten aus 3 Screens, 209 ETF/ETC-Kandidaten aus Bitpandas Katalog, u.a. NVDA/TSM/AVGO mit korrektem Bitpanda-Listing-Flag), Tk-Smoke-Test der ScreenerView isoliert UND als Teil der vollständigen App (gegen eine Kopie der Produktions-DB, alle 7 Tabs inkl. "Screener" korrekt registriert). config.add_watchlist_entry() selbst wurde NICHT erneut gegen die echte config.yaml getestet (bereits durch die bestehende Marktscan-Nutzung etabliert/verifiziert, Signatur-Kompatibilität per Code-Review bestätigt) - kein ungewolltes Schreiben in die reale Datei während der Verifikation.</w:t>
       </w:r>
     </w:p>
     <w:sectPr>

</xml_diff>

<commit_message>
Schwerpunkt-Feld je Asset + Diversifikations-Uebersicht im Portfolio-Tab
Neues optionales Freitext-Feld (Gold/Silber/Kupfer/Seltene Erden/...) fuer
Watchlist-Assets, editierbar ueber Asset hinzufuegen/bearbeiten. Neue
Tabelle im Portfolio-Tab gruppiert den Bestandswert nach Schwerpunkt.
Alle 13 bestehenden Nicht-Krypto-Assets direkt sinnvoll befuellt.

Co-Authored-By: Claude Sonnet 5 <noreply@anthropic.com>
</commit_message>
<xml_diff>
--- a/Basisinfos/Regelwerksmanual.docx
+++ b/Basisinfos/Regelwerksmanual.docx
@@ -13113,6 +13113,117 @@
           <w:b w:val="0"/>
         </w:rPr>
         <w:t xml:space="preserve"> synthetische Tests (_bereits_in_watchlist() Groß-/Kleinschreibung), echter Live-Lauf gegen beide Quellen (144 Aktien-Kandidaten aus 3 Screens, 209 ETF/ETC-Kandidaten aus Bitpandas Katalog, u.a. NVDA/TSM/AVGO mit korrektem Bitpanda-Listing-Flag), Tk-Smoke-Test der ScreenerView isoliert UND als Teil der vollständigen App (gegen eine Kopie der Produktions-DB, alle 7 Tabs inkl. "Screener" korrekt registriert). config.add_watchlist_entry() selbst wurde NICHT erneut gegen die echte config.yaml getestet (bereits durch die bestehende Marktscan-Nutzung etabliert/verifiziert, Signatur-Kompatibilität per Code-Review bestätigt) - kein ungewolltes Schreiben in die reale Datei während der Verifikation.</w:t>
+      </w:r>
+    </w:p>
+    <w:p>
+      <w:pPr>
+        <w:pStyle w:val="Heading2"/>
+      </w:pPr>
+      <w:r>
+        <w:t>Nachtrag (2026-07-19, gleicher Tag, Folge 4): Schwerpunkt-Feld + Diversifikations-Übersicht</w:t>
+      </w:r>
+    </w:p>
+    <w:p>
+      <w:r>
+        <w:rPr>
+          <w:b w:val="0"/>
+        </w:rPr>
+        <w:t>Auslöser: Nutzer bat um eine "konkrete Einordnung der Assets - z.B. Inhalt und Zweck damit wir dies z.B. bei der Diversifikation - Gold, Silber, Kupfer, seltene Erden, Güter, Energie korrekt einordnen können" und wollte diese Schwerpunkte selbst in der Oberfläche pflegen können.</w:t>
+      </w:r>
+    </w:p>
+    <w:p>
+      <w:r>
+        <w:rPr>
+          <w:b w:val="0"/>
+        </w:rPr>
+      </w:r>
+      <w:r>
+        <w:rPr>
+          <w:b/>
+        </w:rPr>
+        <w:t>Umgesetzt:</w:t>
+      </w:r>
+      <w:r>
+        <w:rPr>
+          <w:b w:val="0"/>
+        </w:rPr>
+        <w:t xml:space="preserve"> neues, optionales Freitext-Feld schwerpunkt auf WatchlistAsset (config.py) - bewusst freier Text statt fester Enum-Liste, da die sinnvollen Kategorien vom konkreten Portfolio abhängen und nicht im Code vorgegeben werden sollen. Neue Funktion update_watchlist_schwerpunkt() (gleiches Backup+Validierung+Rollback-Muster wie update_watchlist_coingecko_id()), ABER mit einer bewussten Abweichung: Einfügeposition ist das ENDE des Eintrags-Blocks statt einer festen Position - schwerpunkt ist das zuletzt hinzugekommene optionale Feld und soll bestehende Einträge mit bereits vorhandenen optionalen Feldern (coingecko_id/assetklasse/yfinance_symbol/ist_cash_aequivalent) nicht durcheinanderbringen. add_watchlist_entry() um den Parameter erweitert (Neuanlage).</w:t>
+      </w:r>
+    </w:p>
+    <w:p>
+      <w:r>
+        <w:rPr>
+          <w:b w:val="0"/>
+        </w:rPr>
+      </w:r>
+      <w:r>
+        <w:rPr>
+          <w:b/>
+        </w:rPr>
+        <w:t>GUI:</w:t>
+      </w:r>
+      <w:r>
+        <w:rPr>
+          <w:b w:val="0"/>
+        </w:rPr>
+        <w:t xml:space="preserve"> AssetAddDialog/AssetEditDialog (ui/app.py) um ein "Schwerpunkt"-Textfeld erweitert (analog zum bestehenden coingecko_id-Muster im Edit-Dialog). Watchlist-Tab-Treeview um eine neue Spalte "Schwerpunkt" ergänzt.</w:t>
+      </w:r>
+    </w:p>
+    <w:p>
+      <w:r>
+        <w:rPr>
+          <w:b w:val="0"/>
+        </w:rPr>
+      </w:r>
+      <w:r>
+        <w:rPr>
+          <w:b/>
+        </w:rPr>
+        <w:t>Diversifikations-Übersicht (ui/portfolio.py):</w:t>
+      </w:r>
+      <w:r>
+        <w:rPr>
+          <w:b w:val="0"/>
+        </w:rPr>
+        <w:t xml:space="preserve"> neue kompakte Tabelle unterhalb der Bestandsliste, gruppiert den aktuellen Portfoliowert (inkl. gestakter Anteile) nach schwerpunkt und zeigt EUR-Wert + Anteil-%. Assets ohne gesetzten Schwerpunkt fallen in einen Sammel-Eintrag "ohne Schwerpunkt", Fiat-Cash in "Cash/Sonstiges" - die Prozentwerte summieren sich dadurch sauber auf denselben Gesamtwert: wie in der bestehenden Anzeige. Bewusst als Tabelle statt Pie-Chart (kein bestehendes Chart-Vorbild für Verteilungsdarstellungen, ui/charts.py deckt nur Kursverlaufs-Liniencharts eines einzelnen Assets ab).</w:t>
+      </w:r>
+    </w:p>
+    <w:p>
+      <w:r>
+        <w:rPr>
+          <w:b w:val="0"/>
+        </w:rPr>
+      </w:r>
+      <w:r>
+        <w:rPr>
+          <w:b/>
+        </w:rPr>
+        <w:t>Direkt befüllt</w:t>
+      </w:r>
+      <w:r>
+        <w:rPr>
+          <w:b w:val="0"/>
+        </w:rPr>
+        <w:t xml:space="preserve"> für alle 13 bestehenden Nicht-Krypto-Watchlist-Einträge (Aktien/Rohstoffe/Themen-ETF) über die neue Funktion gegen die echte config.yaml: VST → Energieversorger, PLTR → Software/KI-Datenanalyse, OD7N → Silber, OD7H → Gold, OD7C → Kupfer, OD7L → Erdgas/Energie, VVMX → Seltene Erden &amp; strategische Metalle, X136 → Bioenergie, EXH3 → Nahrungsmittel &amp; Getränke, CEBS → Kupferminen (Aktien), ISOC → Agrarwirtschaft, DBPK/3QSS → Absicherung (S&amp;P 500/Nasdaq 100 Short). Krypto-Einträge bewusst NICHT befüllt (außerhalb des ursprünglichen Anfrage-Kontexts, kann der Nutzer bei Bedarf selbst über die GUI nachtragen).</w:t>
+      </w:r>
+    </w:p>
+    <w:p>
+      <w:r>
+        <w:rPr>
+          <w:b w:val="0"/>
+        </w:rPr>
+      </w:r>
+      <w:r>
+        <w:rPr>
+          <w:b/>
+        </w:rPr>
+        <w:t>Verifiziert:</w:t>
+      </w:r>
+      <w:r>
+        <w:rPr>
+          <w:b w:val="0"/>
+        </w:rPr>
+        <w:t xml:space="preserve"> synthetische Tests für update_watchlist_schwerpunkt() (neue Zeile einfügen/bestehende Zeile ändern/unveränderter Wert -&gt; kein Schreibvorgang/unbekanntes Symbol) - dabei ZUERST versehentlich gegen die echte config.yaml statt einer Kopie gelaufen (Testskript-Fehler, kein Datenverlust, siehe git diff danach leer), sofort per Backup-Restore korrigiert, danach sauber gegen eine echte Kopie wiederholt. Tk-Smoke-Test PortfolioView gegen eine Kopie der Produktions-DB (Diversifikations-Tabelle vor UND nach dem Befüllen der 13 Schwerpunkte geprüft - 13 korrekte Kategorien + "ohne Schwerpunkt"/"Cash/Sonstiges"-Sammeltöpfe), voller TradingInfoToolApp-Smoke-Test (Watchlist-Tab zeigt die neue Spalte korrekt), AssetEditDialog/AssetAddDialog-Instanziierungstest. git diff Basisinfos/config.yaml vor dem Commit geprüft - ausschließlich 13 neue schwerpunkt:-Zeilen, keine sonstigen Änderungen.</w:t>
       </w:r>
     </w:p>
     <w:sectPr>

</xml_diff>

<commit_message>
Release 2: Schwerpunkte/Thesen-Verwaltung (#332) + Stufe-1-Hervorhebung (#343)
Neue thesen-DB-Tabelle + these_abgleich-Objektiv-Check (M2-Liquiditaet,
CFTC-COT, Zinskurve, Dollar-Index-Trend) als Gegenmittel zum Bubble-
Chasing-Risiko - eine These wird gegen unabhaengige Marktdaten geprueft,
nicht gegen ihre eigene Beliebtheit, und fliesst nur in allen 4
Nicht-Krypto-Pipelines als kommentierender Fakt ein, nie ins Scoring.

Neuer GUI-Tab "Schwerpunkte" (ui/thesen_view.py) zur manuellen
Thesen-Verwaltung inkl. Absicherung-Sonderfall und transparentem
review_am-Terminvorschlag.

Stufe-1-Hervorhebung markiert Kategorien mit aktiver These in Watchlist,
Diversifikations-Tabelle und Screener (Marker + Tooltip, keine stille
Umsortierung, kein Scoring-Einfluss) und gibt gehaltenen Assets Prioritaet
in der Sortierung.

Co-Authored-By: Claude Sonnet 5 <noreply@anthropic.com>
</commit_message>
<xml_diff>
--- a/Basisinfos/Regelwerksmanual.docx
+++ b/Basisinfos/Regelwerksmanual.docx
@@ -13446,6 +13446,112 @@
       <w:pPr/>
       <w:r>
         <w:t>Schwerpunkte/Thesen-Verwaltung (GUI zum Setzen von Prioritäten/ Zielgewichtungen pro Kategorie mit Begründung+Datum), ein periodischer KI-Vorschläge-Job (Muster wie makro_analog.py, schlägt Kategorie- Schwerpunkte basierend auf bestehenden Makro-Fakten vor, Nutzer akzeptiert/verwirft), sowie Marktscan-/Screener-Bias (Kandidaten aus priorisierten Kategorien höher gewichten) - alle drei bewusst zurückgestellt, bis die Taxonomie-Infrastruktur (dieser Nachtrag) im laufenden Betrieb bestätigt ist.</w:t>
+      </w:r>
+    </w:p>
+    <w:p>
+      <w:pPr>
+        <w:pStyle w:val="Heading2"/>
+      </w:pPr>
+      <w:r>
+        <w:t>Nachtrag (2026-07-19, gleicher Tag, Folge 6): Release 2 (Schwerpunkte/Thesen-Verwaltung) - Konzeptionsrunde</w:t>
+      </w:r>
+    </w:p>
+    <w:p>
+      <w:pPr/>
+      <w:r>
+        <w:t>Status dieses Nachtrags: reine Konzeption/Entscheidungsfindung, kein Code zum Zeitpunkt dieses Eintrags. Vollständige Ausarbeitung liegt in Basisinfos/Kategorie_Basisinformationen_Release2.md/.docx - dieser Eintrag hält nur die wichtigsten Entscheidungen und Funde fest, damit sie auch ohne die separate Datei nachvollziehbar bleiben. Umsetzung folgte noch am selben Tag, siehe Nachtrag Folge 7 weiter unten - die Konzeptionsrunde und die Implementierungsrunde fielen beide auf den 2026-07-19/2026-07-20-Übergang.</w:t>
+      </w:r>
+    </w:p>
+    <w:p>
+      <w:pPr/>
+      <w:r>
+        <w:t>Datenmodell einer "These": hauptgruppe/unterkategorie (beide Ebenen erlaubt, GUI zeigt bei Hauptgruppen-These transparent die darunter konsolidierten Unterkategorien), richtung (Übergewichten/Neutral/Meiden), staerke, begruendung (Freitext), pruef_mechanismus (strukturiert, siehe unten), gesetzt_am, review_am, status, quelle (manuell/KI-Vorschlag). Neue DB-Tabelle, nicht config.yaml.</w:t>
+      </w:r>
+    </w:p>
+    <w:p>
+      <w:pPr/>
+      <w:r>
+        <w:t>#334 (Marktscan-/Screener-Bias) zweistufig entschieden - wichtigster Punkt dieser Runde: - Stufe 1 (Teil der ersten Umsetzungsrunde): NUR Hervorhebung/Sortierung,   KEINE Scoring-Gewichtung. Grund: eine aktive These spiegelt die   subjektive, aktuelle Einschätzung des Nutzers - würde sie das Scoring   gewichten, entstünde bei trendgetriebenen Themen (Beispiel Technologie &amp;   KI) eine prozyklische Verstärkung ("KI ist im Trend" → System zeigt mehr   KI-Aktien → verstärkt die Wahrnehmung, obwohl das Thema evtl. bereits   überhitzt ist) - direkter Widerspruch zur bestehenden antizyklischen   Risikogate-Philosophie im Projekt (Retail-Konsens-Deckel, siehe Nachtrag   vom 2026-07-19 weiter oben). - Zusatz, Teil der ersten Runde: neuer Fakt these_abgleich je Signal -   prüft die These NICHT gegen ihre eigene Beliebtheit, sondern gegen   unabhängige, bereits im Projekt vorhandene objektive Daten (M2-/   Liquiditätsregime für Edelmetalle, CFTC-COT-Positionierung für   Industriemetalle/Energie, Zinskurve für Finanzsektor-Aktien,   Dollar-Index für Emerging Markets). Kann eine hypebasierte These sogar   als "objektiv nicht gestützt" kennzeichnen - das eingebaute Gegenmittel   zum Bubble-/Trend-Chasing-Risiko. - Stufe 2 (später, vorsichtig): echte Scoring-Gewichtung nur für   strukturelle/langsame Kategorien (Edelmetalle, Industriemetalle, Energie,   Anleihen), nie für Technologie &amp; KI.</w:t>
+      </w:r>
+    </w:p>
+    <w:p>
+      <w:pPr/>
+      <w:r>
+        <w:t>Acht Kandidaten-Thesen mit Mechanik durchgearbeitet (Energie, Edelmetalle, Industriemetalle/Kupfer, Erneuerbare &amp; Clean Energy, Anleihen/ TIPS, Aktien-Sektoren/Finanzen, Aktien-Regionen/Emerging Markets, Absicherung) - für jede die zugrundeliegende ökonomische Mechanik ("wann funktioniert das grundsätzlich") plus echter Live-Datenabgleich (yfinance, CFTC COT, FRED M2/Fed Funds, EIA), nicht nur Trainingswissen. Bewusst als Mechanik-Erklärung + aktuelle Datenlage kommuniziert, NICHT als Kaufempfehlung (siehe Modul-Docstring-Stil im restlichen Projekt).</w:t>
+      </w:r>
+    </w:p>
+    <w:p>
+      <w:pPr/>
+      <w:r>
+        <w:t>Echter Fund dabei (Dollar-Index-Trend): für die Emerging-Markets-These zeigte eine Momentaufnahme des Dollar-Index (100,69) zunächst nichts Eindeutiges - erst der 12-Monats-Verlauf (yfinance, monatliche Kerzen) zeigte einen klaren Aufwärtstrend seit Jahresbeginn 2026 (96,99 im Januar auf Höchststand 101,19 im Juni) - das ist ein Gegenwind für eine EM-Übergewichtungs-These, kein Rückenwind, obwohl die Fed erkennbar lockert. Lektion: ein einzelner aktueller Wert reicht bei makroökonomischen Indikatoren oft nicht, der Trend über mehrere Monate ist aussagekräftiger.</w:t>
+      </w:r>
+    </w:p>
+    <w:p>
+      <w:pPr/>
+      <w:r>
+        <w:t>Lücken-Prüfung (auf Nutzer-Wunsch, sieben Funde, Details in der Basisinformationen-Datei): 1. CFTC-COT deckt kein Rohöl ab (COT_MARKET_NAMES in api/cftc_cot.py    hat nur Gold/Silber/Kupfer/Erdgas) - Energie-These fehlt damit die    Positionierungs-Perspektive für WTI/Brent. 2. Dollar-Index und Zinskurve (10J vs. kurzfristig) sind NICHT als eigene,    @track_api_health-überwachte Datenquellen im Projekt vorhanden - für    heutige Zwecke ad-hoc direkt über yfinance abgefragt, für einen    verlässlichen these_abgleich-Fakt müssten das richtige, abgesicherte    Funktionen werden. 3. Absicherung/Hedge passt nicht sauber ins Standard-Datenmodell (Feld    richtung ergibt bei einer Versicherungs-Logik wenig Sinn) - eigene    GUI-Darstellung (Aktiv/Inaktiv) vermutlich nötig. 4. Krypto ist komplett außen vor (kategorien.yaml deckt bewusst keine    Kryptowerte ab) - der these_abgleich-Fakt erscheint deshalb nie bei    Krypto-Signalen, muss in GUI/Doku klar kommuniziert werden. 5. Kein automatisches Verhalten bei Ablauf von review_am definiert. 6. Keine Verbindung zur Diversifikations-Tabelle (Portfolio-Tab) vorgesehen. 7. Synergie mit dem Screener (scan_etf_candidates() taggt Kandidaten    schon heute mit Hauptgruppe/Unterkategorie, Release 1) noch nicht    genutzt - Kandidaten aus Kategorien mit aktiver, aber in der Watchlist    noch nicht vertretener These könnten hervorgehoben werden.</w:t>
+      </w:r>
+    </w:p>
+    <w:p>
+      <w:pPr/>
+      <w:r>
+        <w:t>Weitere Entscheidungen: Granularität beide Ebenen erlaubt; 3-6 gleichzeitig aktive Thesen als weiche Richtgröße, kein Hard-Limit; KI-Vorschläge-Job (#333) täglich wie makro_analog_job (06:30 Uhr), Rhythmus-Optimierung vorgemerkt für später.</w:t>
+      </w:r>
+    </w:p>
+    <w:p>
+      <w:pPr/>
+      <w:r>
+        <w:t>Nächster Schritt: die sieben Lücken-Punkte sind kleinere Ausbau-Entscheidungen, kein Blocker für den Start der Umsetzung von #332 - Implementierung kann beginnen, offene Punkte während der Umsetzung nach und nach klären.</w:t>
+      </w:r>
+    </w:p>
+    <w:p>
+      <w:pPr/>
+      <w:r>
+        <w:t>Nachtrag zum Nachtrag, gleicher Tag - drei weitere Punkte auf Nutzer-Wunsch ergänzt: - Haltedauer/Zeithorizont: die Prüf-Mechanismen haben unterschiedliche   natürliche Zeithorizonte (COT wöchentlich → kürzer, M2/Zinskurve/   Dollar-Index-Trend brauchen Monate → länger) - der review_am-Vorschlag   in der GUI orientiert sich daran (z. B. 4 Wochen bei COT-gestützten   Thesen, 3 Monate bei M2-gestützten). Ein zusätzlicher Mismatch-Check zwischen dem Zeithorizont der These und der Haltedauer-Empfehlung des konkreten Signals (holding_duration/halte_kriterium_bucket) war hier angedacht, ist aber bei der Umsetzung (Folge 7) bewusst NICHT eingebaut worden: dieses Feld entsteht erst als LLM-Output, ein Vorab-Abgleich vor dem LLM-Aufruf ist strukturell nicht möglich - das wäre ein Post-Check nach der Antwort (analog risk_gate.py::post_check()), siehe agent/kategorie_thesen.py::build_these_abgleich_fact()-Docstring für den dokumentierten, offenen Nachrüstpunkt. - Gehaltene Assets erhalten Priorität: innerhalb einer Kategorie mit   aktiver These werden in der Stufe-1-Hervorhebung zuerst bereits gehaltene   Assets (wird_aktuell_gehalten) angezeigt, dann neue Watchlist-/   Screener-Kandidaten, dann alles Übrige - unterschiedliche Dringlichkeit   (echte Entscheidung vs. "einen Blick wert"). - Transparenz-Prinzip, ausdrücklicher Nutzer-Wunsch, gilt durchgängig:   jede automatische Wirkung einer These (Sortierung, Hervorhebung,   Review-Datum-Vorschlag, these_abgleich-Text) muss ihre konkrete   Begründung sichtbar mitliefern, minimaler Interpretationsaufwand für den   Nutzer - keine stille Umsortierung, kein Badge ohne Klartext-Erklärung.</w:t>
+      </w:r>
+    </w:p>
+    <w:p>
+      <w:pPr/>
+      <w:r>
+        <w:t>Nächster Schritt: die sieben Lücken-Punkte (plus die drei Ergänzungen oben) sind kleinere Ausbau-Entscheidungen, kein Blocker für den Start der Umsetzung von #332 - Implementierung kann beginnen, offene Punkte während der Umsetzung nach und nach klären.</w:t>
+      </w:r>
+    </w:p>
+    <w:p>
+      <w:pPr>
+        <w:pStyle w:val="Heading2"/>
+      </w:pPr>
+      <w:r>
+        <w:t>Nachtrag (2026-07-20, Folge 7): Release 2 (Schwerpunkte/Thesen-Verwaltung) - Umsetzung #332/#343</w:t>
+      </w:r>
+    </w:p>
+    <w:p>
+      <w:r>
+        <w:t>Direkte Fortsetzung von Folge 6 (Nutzer-Anweisung "starten wir hier") - die komplette Backend- + GUI-Infrastruktur für #332 sowie die Stufe-1-Hervorhebung aus #343 wurden implementiert und verifiziert. #333 (KI-Vorschläge-Job) und die eigentliche Stufe 2 von #334 (Scoring-Gewichtung für strukturelle Kategorien) sind bewusst NICHT Teil dieser Runde, siehe Folge 6.</w:t>
+      </w:r>
+    </w:p>
+    <w:p>
+      <w:r>
+        <w:t>Backend: database/models.py::These-Dataclass + database/db.py: thesen-Tabelle (2 Indizes) + volles CRUD (create_these/update_these/set_these_status/get_these/get_aktive_thesen/get_alle_thesen/get_aktive_these_fuer_kategorie() - Unterkategorie-spezifische These hat Vorrang vor einer Hauptgruppen-weiten, identische Priorität überall wo Thesen nachgeschlagen werden). config.py::PRUEF_MECHANISMUS_MAPPING/get_pruef_mechanismus() - welcher objektive Check (m2_liquiditaet/cot_positionierung/zinskurve/dollar_index/baerenmarkt_overlay) für welche Hauptgruppe/Unterkategorie gilt, inkl. review_tage_vorschlag + review_begruendung fürs Transparenz-Prinzip. Lücke 1 (CFTC-COT ohne Rohöl) geschlossen: api/cftc_cot.py::COT_MARKET_NAMES um rohoel_wti/rohoel_brent erweitert (echte Marktnamen live über die CFTC-API mit LIKE-Filtern ermittelt, nicht geraten). Lücke 2 (Dollar-Index/Zinskurve ohne überwachte Datenquelle) geschlossen: api/macro.py::get_zinskurve()/get_dollar_index_trend(), beide @track_api_health("yfinance") (kein neuer API_HEALTH_GROUPS-Eintrag nötig, teilen sich den bestehenden yfinance-Block). get_dollar_index_trend() liefert IMMER den 12-Monats-Verlauf, nie nur eine Momentaufnahme (siehe der echte DXY-Fund in Folge 6). agent/kategorie_thesen.py (neu): these_abgleich-Berechnungsmodul. compute_these_abgleich() + 4 _abgleich_*()-Funktionen (M2/COT/Zinskurve/Dollar-Index) plus _abgleich_baerenmarkt_overlay(), die ehrlich "nicht_pruefbar" zurückgibt (P-10, Absicherung-Check bleibt bewusst Lücke 3/unimplementiert, siehe Folge 6). build_these_abgleich_fact() als gemeinsamer, in allen 4 Nicht-Krypto-Pipelines (Aktien/Rohstoffe/Hedge/Themen-ETF) wiederverwendeter Fact-Baustein (Muster wie agent.krypto.wiederholungs_erkennung.build_wiederholung_fact()) - je ein neuer SYSTEM_PROMPT-Regel-Eintrag in den 4 Analysten, der die KI anweist, den Abgleich zu kommentieren, aber NIE die Action über das hinaus zu schieben, was die übrigen Fakten hergeben (Stufe-1-Prinzip: Hervorhebung, kein Scoring-Einfluss). index_aktive_thesen()/lookup_these() (selbes Modul) - In-Memory-Index für wiederholte Lookups über viele Assets/Kandidaten (Watchlist-Tab, Screener), vermeidet einen SQL-Query pro Zeile, identische Prioritäts-Logik wie get_aktive_these_fuer_kategorie().</w:t>
+      </w:r>
+    </w:p>
+    <w:p>
+      <w:r>
+        <w:t>GUI Task #342 - neuer Tab "Schwerpunkte": ui/thesen_view.py (neu). Liste aller Thesen (Kategorie/Richtung/Stärke/Prüf-Mechanismus/Status/Termine) + Add/Edit-Dialog. Eigener, lokaler Kategorie-Selector (nicht der aus ui.app wiederverwendet - eine These kann sich auf eine GANZE Hauptgruppe beziehen, zeigt dabei live alle darunter konsolidierten Unterkategorien, Nutzer-Entscheidung #1 aus Folge 6). Absicherung-Sonderfall sauber gelöst: Richtung-Feld zeigt bei hauptgruppe=absicherung automatisch Aktiv/Inaktiv statt Übergewichten/Neutral/Meiden (schließt Lücke 3 aus Folge 6 GUI-seitig). Transparenz-Prinzip live umgesetzt: der review_am-Vorschlag erscheint direkt neben dem Feld mit konkretem Datum UND Begründungstext (z. B. "Vorschlag: 2026-08-17 (heute + 28 Tage) - CFTC-COT-Berichte erscheinen wöchentlich..."), nie eine stille Vorbelegung. Statuswechsel (aktiv -&gt; erledigt/verworfen) über eigene Listen-Buttons, nicht im Dialog (eine neue These startet immer aktiv/manuell).</w:t>
+      </w:r>
+    </w:p>
+    <w:p>
+      <w:r>
+        <w:t>GUI Task #343 - Stufe-1-Hervorhebung, schließt Lücken 6+7 aus Folge 6: alle drei Stellen nutzen dieselben Marker (Dreieck-hoch = Übergewichten/Aktiv, Dreieck-runter = Meiden, Punkt = Neutral/Inaktiv) mit denselben drei Farb-Tags (these_positiv/these_negativ/these_neutral) und demselben Prinzip: sichtbarer Marker + Zeilen-Tooltip mit der konkreten These-Begründung, NIE eine stille Umsortierung (Transparenz-Prinzip). Watchlist-Tab (ui/app.py): Sortier-Priorität nur bei der initialen Einsortierung (Gruppe 0 = gehalten + aktive These, 1 = nicht gehalten + aktive These, 2 = Rest, jeweils alphabetisch), greift NICHT in eine manuelle Spaltensortierung ein (Nutzer-Entscheidung "gehaltene Assets sollten Priorität erhalten" aus Folge 6). Marker an die Schwerpunkt-Spalte angehängt, Zeilen-Tooltip erweitert (zeigt aktive These VOR dem letzten Signal, falls beides vorhanden). Diversifikations-Tabelle (ui/portfolio.py): Marker je Hauptgruppen-Zeile, wenn irgendeine aktive These (Hauptgruppen-weit ODER eine ihrer Unterkategorien) zutrifft - bei mehreren Treffern bestimmt die "stärkste" Richtung den Marker (Übergewichten/Aktiv vor Meiden vor Neutral), der Tooltip listet trotzdem ALLE Treffer einzeln auf. Bewusst KEIN Eingriff in die bestehende Wert-Sortierung (größte Position bleibt oben - das ist die eigentlich nützliche Ordnung für diese Tabelle), nur der Marker. Screener-Tab (ui/screener_view.py): Sortier-Priorität (Treffer vor Nicht-Treffer, sonst Scan-Reihenfolge unverändert) - ohne gehalten-Priorität, Screener-Kandidaten sind per Definition noch nicht in der Watchlist. Neu: add_row_tooltips() für diesen Tab (gab es vorher nicht).</w:t>
+      </w:r>
+    </w:p>
+    <w:p>
+      <w:r>
+        <w:t>Verifikation: drei synthetische Tk-Smoke-Test-Skripte gegen Kopien der Produktions-DB (nie die echte DB) - ThesenView (Liste/Filter/Add-Dialog inkl. Absicherung-Sonderfall/Edit-Dialog-Vorbelegung/Statuswechsel, alle Assertions bestanden), Watchlist-Sortier-/Marker-Logik (isoliert nachgebaut, exakt dieselbe index_aktive_thesen()/lookup_these()-Funktion wie im echten Code), Portfolio-Diversifikation + Screener (beide mit echten Tk-Widgets, PortfolioView/ScreenerView direkt instanziiert, Marker/Tags/Tooltips/Sortierreihenfolge geprüft). Zusätzlich ein kombinierter Import-Regressionstest über alle geänderten/neuen Module (ui.app, ui.portfolio, ui.screener_view, ui.thesen_view, agent.kategorie_thesen, alle 4 Nicht-Krypto-Pipelines, main) - keine Fehler.</w:t>
+      </w:r>
+    </w:p>
+    <w:p>
+      <w:r>
+        <w:t>Verbleibend offen (bewusst nicht Teil dieser Runde): #333 - täglicher KI-Vorschläge-Job für neue Thesen-Kandidaten. #334, Stufe 2 - echte Scoring-Gewichtung für strukturelle Kategorien (Edelmetalle, Industriemetalle, Energie, Anleihen) - erst nach einer Beobachtungsphase mit Stufe 1. Lücke 5 aus Folge 6 - kein automatisches Verhalten, wenn review_am in der Vergangenheit liegt (weder Benachrichtigung noch visuelle Markierung) - bisher rein manuell im Schwerpunkte-Tab einsehbar. Der in Folge 6 angedachte Haltedauer-Mismatch-Check (These-Zeithorizont gegen die Haltedauer-Empfehlung eines konkreten Signals) bleibt aus dem oben genannten strukturellen Grund unimplementiert. Absicherung/Hedge-these_abgleich bleibt "nicht_pruefbar" (Lücke 3 aus Folge 6, Bärenmarkt-Overlay-Indikator ist noch keine eigenständig aufrufbare Funktion).</w:t>
       </w:r>
     </w:p>
     <w:sectPr>

</xml_diff>

<commit_message>
Schwerpunkte/Screener: Auto-Scan, Mouseover-Tooltips, Kontrast-Fix
Screener scannt jetzt automatisch beim Start und alle 60 Minuten (GUI-
lokaler Timer, kein Scheduler-Job noetig, da der Screener bewusst nichts
in die DB persistiert).

Neues ui/widget_tooltip.py fuer Mouseover-Kurzbeschreibungen an Tabs und
Aktions-Buttons - umgesetzt fuer die beiden Tabs mit neuem/geaendertem
Verhalten (Schwerpunkte, Screener), inkl. Hinweis wo kein Automatismus
greift.

Zebra-Streifen-Hintergrund in ui/theme.py angepasst (Light+Dark) - die
these_positiv/negativ/neutral-Marker und andere bestehende Tag-Farben
waren auf dem alten Streifenton kaum lesbar (Nutzer-Fund per Screenshot,
WCAG-Kontrast unter der AA-Schwelle).
</commit_message>
<xml_diff>
--- a/Basisinfos/Regelwerksmanual.docx
+++ b/Basisinfos/Regelwerksmanual.docx
@@ -13552,6 +13552,44 @@
     <w:p>
       <w:r>
         <w:t>Verbleibend offen (bewusst nicht Teil dieser Runde): #333 - täglicher KI-Vorschläge-Job für neue Thesen-Kandidaten. #334, Stufe 2 - echte Scoring-Gewichtung für strukturelle Kategorien (Edelmetalle, Industriemetalle, Energie, Anleihen) - erst nach einer Beobachtungsphase mit Stufe 1. Lücke 5 aus Folge 6 - kein automatisches Verhalten, wenn review_am in der Vergangenheit liegt (weder Benachrichtigung noch visuelle Markierung) - bisher rein manuell im Schwerpunkte-Tab einsehbar. Der in Folge 6 angedachte Haltedauer-Mismatch-Check (These-Zeithorizont gegen die Haltedauer-Empfehlung eines konkreten Signals) bleibt aus dem oben genannten strukturellen Grund unimplementiert. Absicherung/Hedge-these_abgleich bleibt "nicht_pruefbar" (Lücke 3 aus Folge 6, Bärenmarkt-Overlay-Indikator ist noch keine eigenständig aufrufbare Funktion).</w:t>
+      </w:r>
+    </w:p>
+    <w:p>
+      <w:pPr>
+        <w:pStyle w:val="Heading2"/>
+      </w:pPr>
+      <w:r>
+        <w:t>Nachtrag (2026-07-20, Folge 8): Screener-Auto-Scan + Mouseover-Tooltips fuer Tabs/Aktionen</w:t>
+      </w:r>
+    </w:p>
+    <w:p>
+      <w:r>
+        <w:t>Nutzer-Feedback nach dem ersten Test der Folge-7-Neuerungen: der Screener-Tab war leer, weil er ausschliesslich manuell scannt, und die neuen Elemente (Schwerpunkte-Tab, Screener-Auto-Scan) hatten keine erklaerenden Tooltips. Zwei kleine, in sich abgeschlossene Nachbesserungen.</w:t>
+      </w:r>
+    </w:p>
+    <w:p>
+      <w:r>
+        <w:t>Screener-Auto-Scan (Nutzer-Wunsch "Auto-Screen beim Start bzw. regelmaessige Updates", Nutzer-Bestaetigung "60 Minuten passt"): bewusst ein GUI-lokaler, selbstverlaengernder self.after()-Timer in ui/screener_view.py (Muster wie ui/app.py::_poll_prices()), KEIN neuer Scheduler-Job - der Screener persistiert bewusst nichts in die DB, ein Scheduler-Job haette dafuer eine neue Tabelle gebraucht, nur damit die GUI sie wieder ausliest. Erster Scan kurz nach dem Tab-Aufbau, danach alle Basisinfos/config.yaml::screener.auto_scan_intervall_minuten (Default 60) Minuten erneut - der Folge-Timer wird immer ab dem letzten tatsaechlichen Scan neu geplant (egal ob manuell oder automatisch ausgeloest), mit Schutz gegen doppelte Timer-Ketten (after_cancel() vor jedem Neuplanen) und gegen ueberlappende Scans (Guard: ein Aufruf waehrend scan_button disabled ist, wird ignoriert). 60 Minuten bewusst zurueckhaltend gewaehlt: Yahoo-Finance-day_gainers ist zwar echt intraday-dynamisch, aber Bitpandas ETF/ETC-Katalog aendert sich kaum, und das Notebook hatte bereits einen echten yfinance-Haenger.</w:t>
+      </w:r>
+    </w:p>
+    <w:p>
+      <w:r>
+        <w:t>Mouseover-Tooltips fuer Tabs/Aktionen (Nutzer-Wunsch: "fuer die Primaerseiten - Tabs und Aktionen - eine konkrete Kurzbeschreibung bei Mouseover was diese bewirken/nutzung und optional [...] was sie nicht koennen"): neues Modul ui/widget_tooltip.py - Ergaenzung zu den bestehenden ui/heading_tooltip.py (Treeview-Spaltenkoepfe) und ui/row_tooltip.py (Treeview-Zeilen), die beide NICHT auf normale Widgets oder Notebook-Tab-Kopfzeilen anwendbar sind. Zwei neue Funktionen: add_widget_tooltip(widget, text) (statischer Tooltip fuer z.B. einen Button) und add_notebook_tab_tooltips(notebook, {index: text}) (ueber notebook.identify()/notebook.index("@x,y")). Bewusst eingegrenzter Scope fuer diese Runde: NUR die beiden Tabs, deren Verhalten sich neu geaendert hat (Schwerpunkte: neuer Tab; Screener: neuer Auto-Scan) - Tab-Kopf-Tooltip fuer beide (ui/app.py) + Aktions-Tooltip fuer jeden Button/jede Checkbox im Schwerpunkte-Toolbar (ui/thesen_view.py) und im Screener-Toolbar (ui/screener_view.py), jeweils inkl. explizitem Hinweis auf fehlenden Automatismus wo relevant (z.B. "Uebernimmt NICHTS automatisch in die Watchlist"). Die uebrigen, bereits laenger bestehenden Tabs (Watchlist/Portfolio/Signale/Marktscan/Hebel/Regime) sind bewusst NICHT Teil dieser Runde - koennten im selben Muster nachgeruestet werden, falls gewuenscht.</w:t>
+      </w:r>
+    </w:p>
+    <w:p>
+      <w:r>
+        <w:t>Lesbarkeits-Check der neuen Marker-Farben (Dreieck-hoch/Dreieck-runter/Punkt, these_positiv/these_negativ/these_neutral): WCAG-Kontrastverhaeltnis berechnet gegen Standard- UND Zebra-Streifen-Hintergrund, beide Modi. Echter, bereits vorhandener Befund (nicht durch diese Runde neu verursacht - die drei Marker-Tags nutzen die laengst etablierten theme.success_color()/danger_color()/info_color(), dieselben Farben wie z.B. pl_positive/pl_negative im Portfolio-Tab): im Light Mode liegen alle drei knapp an oder leicht unter der WCAG-AA-Schwelle (4,5:1) auf dem Zebra-Streifen (4,26-4,82:1); im Dark Mode ist der Kontrast auf normalem Hintergrund gut (5,2-6,0:1), faellt aber auf dem dunklen Zebra-Streifen (#404040) auf 3,2-3,7:1 - unter der AA-Schwelle fuer normalen Text. Da dies ein projektweites, bereits lange bestehendes Theme-Farbthema betrifft (nicht nur die neuen Marker) und eine Korrektur alle Stellen mit pl_positive/pl_negative/bitpanda_fehlt/etc. gleichermassen beeinflussen wuerde, wurde dem Nutzer der Befund zunaechst nur gemeldet statt am Theme-System vorbeizukorrigieren.</w:t>
+      </w:r>
+    </w:p>
+    <w:p>
+      <w:r>
+        <w:t>Verifikation: synthetischer Tk-Test gegen eine DB-Kopie (kein echter Produktivstart) mit gemockten scan_aktien_candidates()/scan_etf_candidates()/get_listed_non_crypto_assets() (kein echter Netzwerkzugriff im Test) - Auto-Scan-Ausloesung beim Tab-Aufbau, korrekt geladenes Intervall aus config.yaml, Folge-Timer-Planung nach Scan-Abschluss, Doppel-Scan-Guard, doppelter _schedule_next_auto_scan()-Aufruf ohne Fehler, sowie die Tooltip-Bindung an allen neuen Widgets (2 Screener-Buttons, 4 Schwerpunkte-Buttons + 1 Checkbox, Notebook-Tab-Helper) - alle 9 Testfaelle bestanden. Kombinierter Import-Regressionstest von ui.app weiterhin fehlerfrei.</w:t>
+      </w:r>
+    </w:p>
+    <w:p>
+      <w:r>
+        <w:t>Nachtrag zum Nachtrag, gleicher Tag - Nutzer bestaetigte den Fix nach einem echten Screenshot (Screener-Tab, Dark Mode: die "AGRICULTURE"/"SOFTS"-Zeilen kaum lesbar grau auf dunkelgrauem Zebra-Streifen): bewusst NICHT die Text-Farben selbst geaendert (haette die etablierte Bedeutung von success/danger/warn/swap/info ueberall im Projekt angefasst), sondern NUR theme.py::_LIGHT["zebra_odd"]/_DARK["zebra_odd"] selbst justiert - ein einziger, zentraler Wert, den restripe_treeview() ohnehin bei jedem Aufruf dynamisch nachschlaegt (_palette()["zebra_odd"]), also automatisch ueberall wirksam ohne weitere Codeaenderung. Dark Mode: #404040 -&gt; #2d2d2d (bewusst der bereits etablierte entry_bg-Ton wiederverwendet, keine neue, ungetestete Farbe) - success/danger/info/muted/warn/swap jetzt bei 4,0-6,5:1 (vorher 3,0-4,9:1), die meisten ueber der AA-Schwelle, der Rest deutlich naeher dran. Light Mode: #ebebeb -&gt; #f2f2f2 (naeher an bg) - success/danger/info jetzt bei 4,5-5,1:1 (vorher 4,3-4,8:1), alle drei jetzt ueber der Schwelle.</w:t>
       </w:r>
     </w:p>
     <w:sectPr>

</xml_diff>

<commit_message>
Quotrix-Handelsfenster-Cron fuer Multi-Asset-Batch + CANTON-OI-Warnung-Bugfix
multi_asset_batch_job laeuft jetzt als fester Cron (09:00/19:00 CET, Mo-Fr)
statt Sofortstart-Intervall - Bitpandas Aktien/ETFs/ETCs handeln ueber
Quotrix nur Mo-Fr 07:30-23:00 CET, kein Sofortstart nach Neustart mehr, der
Signale auf Basis eines stunden-/tagealten Schlusskurses erzeugen konnte.

Ausserdem: get_symbole_mit_ueberschrittener_oi_schwelle() respektiert jetzt
den Hebel-Pruefung-Toggle (echter CANTON-Fund: abgeschaltete Symbole
meldeten trotzdem weiter per E-Mail, da der eingefrorene Fehlschlag-Zaehler
nie gegen den Toggle geprueft wurde).
</commit_message>
<xml_diff>
--- a/Basisinfos/Regelwerksmanual.docx
+++ b/Basisinfos/Regelwerksmanual.docx
@@ -13590,6 +13590,32 @@
     <w:p>
       <w:r>
         <w:t>Nachtrag zum Nachtrag, gleicher Tag - Nutzer bestaetigte den Fix nach einem echten Screenshot (Screener-Tab, Dark Mode: die "AGRICULTURE"/"SOFTS"-Zeilen kaum lesbar grau auf dunkelgrauem Zebra-Streifen): bewusst NICHT die Text-Farben selbst geaendert (haette die etablierte Bedeutung von success/danger/warn/swap/info ueberall im Projekt angefasst), sondern NUR theme.py::_LIGHT["zebra_odd"]/_DARK["zebra_odd"] selbst justiert - ein einziger, zentraler Wert, den restripe_treeview() ohnehin bei jedem Aufruf dynamisch nachschlaegt (_palette()["zebra_odd"]), also automatisch ueberall wirksam ohne weitere Codeaenderung. Dark Mode: #404040 -&gt; #2d2d2d (bewusst der bereits etablierte entry_bg-Ton wiederverwendet, keine neue, ungetestete Farbe) - success/danger/info/muted/warn/swap jetzt bei 4,0-6,5:1 (vorher 3,0-4,9:1), die meisten ueber der AA-Schwelle, der Rest deutlich naeher dran. Light Mode: #ebebeb -&gt; #f2f2f2 (naeher an bg) - success/danger/info jetzt bei 4,5-5,1:1 (vorher 4,3-4,8:1), alle drei jetzt ueber der Schwelle.</w:t>
+      </w:r>
+    </w:p>
+    <w:p>
+      <w:pPr>
+        <w:pStyle w:val="Heading3"/>
+      </w:pPr>
+      <w:r>
+        <w:t>Nachtrag (2026-07-20): Quotrix-Handelsfenster-Fix</w:t>
+      </w:r>
+    </w:p>
+    <w:p>
+      <w:r>
+        <w:t>Bitpandas Aktien/ETFs/ETCs laufen seit 2026 ueber die Quotrix-Boerse (Duesseldorf), mit echten, begrenzten Handelszeiten (Mo-Fr 07:30-23:00 CET), NICHT 24/7 wie Krypto (siehe Memory project_bitpanda_exchange - erst bei der Recherche zur Eigentumsstruktur/Real-Securities-Frage entdeckt). Das alte reine Intervall (multi_asset_batch_job, vorher MULTI_ASSET_BATCH_INTERVAL_HOURS = 12) mit next_run_time=jetzt bei jedem Neustart konnte zu jeder Uhrzeit (auch nachts) ein Signal mit Kurszonen erzeugen, die auf einem Stunden/Tage alten Schlusskurs basierten UND vom Nutzer erst zum naechsten Handelsstart ueberhaupt umsetzbar waren. Jetzt fester Cron (MULTI_ASSET_BATCH_CRON_HOURS = "9,19", nur Mo-Fr) statt Intervall, kein next_run_time-Sofortstart mehr - ein Neustart wartet bewusst bis zum naechsten reguleaeren Takt.</w:t>
+      </w:r>
+    </w:p>
+    <w:p>
+      <w:pPr>
+        <w:pStyle w:val="Heading3"/>
+      </w:pPr>
+      <w:r>
+        <w:t>Nachtrag (2026-07-20): OI-Abdeckungs-Warnung respektiert jetzt den Hebel-Pruefung-Toggle</w:t>
+      </w:r>
+    </w:p>
+    <w:p>
+      <w:r>
+        <w:t>Echter Nutzer-Fund: CANTON wurde ueber den Hebel-Pruefung-Toggle abgeschaltet, meldete aber ueber die persistente OI-Abdeckungs-Warnung weiterhin per E-Mail "seit 9 aufeinanderfolgenden Laeufen keine OI-Daten" - obwohl laengst keine neuen Laeufe mehr fuer dieses Symbol stattfanden. Ursache: oi_abdeckung_status.konsekutive_fehlschlaege wird ausschliesslich beim tatsaechlichen Screening-Lauf aktualisiert - ein per Toggle abgeschaltetes Symbol friert einfach beim letzten Stand ein, der aber weiterhin &gt;= Schwelle blieb und nach jedem Cooldown-Ablauf erneut eine (inhaltlich falsche) Warnmail ausloeste. db.py::get_symbole_mit_ueberschrittener_oi_schwelle() prueft jetzt per LEFT JOIN gegen asset_hebel_settings zusaetzlich den Toggle-Status (COALESCE-Default 1/erlaubt, wenn keine Zeile existiert) - abgeschaltete Symbole werden von der Warnung ausgenommen, unabhaengig vom eingefrorenen Zaehlerstand.</w:t>
       </w:r>
     </w:p>
     <w:sectPr>

</xml_diff>

<commit_message>
hebel_analyst.py: key_risks/Regime-Konflikt-Formulierung um konkrete Zahlen ergaenzt
Nutzer-Fund: die 'Risiken:'-Liste in Hebel-ERÖFFNEN-E-Mails war bei
unterschiedlichen Signalen (ONDO, KAIA) fast wortidentisch. Ursache: Regel 9
gab dem Modell die Zielformulierung fast woertlich als Beispiel vor
(Liquidationsrisiko/Finanzierungsgebuehr), das Modell uebernahm sie
praktisch unveraendert statt nur die Kategorie vorzugeben. Gleiches Muster
beim Regime-Konflikt-Hinweis (Regel 2).

Fix (Nutzer-Entscheidung: Textbausteine behalten, um Zahlen ergaenzen):
beide Stellen fordern jetzt explizit die konkreten Werte dieses Signals
(hebel_vorschlag, funding_rate_aktuell, regime.regime, Gegenszenario-
Wahrscheinlichkeit) statt reiner Wortwiederholung. Reine Prompt-
Textaenderung, dokumentiert in Regelwerksmanual.md/.docx.
</commit_message>
<xml_diff>
--- a/Basisinfos/Regelwerksmanual.docx
+++ b/Basisinfos/Regelwerksmanual.docx
@@ -13616,6 +13616,32 @@
     <w:p>
       <w:r>
         <w:t>Echter Nutzer-Fund: CANTON wurde ueber den Hebel-Pruefung-Toggle abgeschaltet, meldete aber ueber die persistente OI-Abdeckungs-Warnung weiterhin per E-Mail "seit 9 aufeinanderfolgenden Laeufen keine OI-Daten" - obwohl laengst keine neuen Laeufe mehr fuer dieses Symbol stattfanden. Ursache: oi_abdeckung_status.konsekutive_fehlschlaege wird ausschliesslich beim tatsaechlichen Screening-Lauf aktualisiert - ein per Toggle abgeschaltetes Symbol friert einfach beim letzten Stand ein, der aber weiterhin &gt;= Schwelle blieb und nach jedem Cooldown-Ablauf erneut eine (inhaltlich falsche) Warnmail ausloeste. db.py::get_symbole_mit_ueberschrittener_oi_schwelle() prueft jetzt per LEFT JOIN gegen asset_hebel_settings zusaetzlich den Toggle-Status (COALESCE-Default 1/erlaubt, wenn keine Zeile existiert) - abgeschaltete Symbole werden von der Warnung ausgenommen, unabhaengig vom eingefrorenen Zaehlerstand.</w:t>
+      </w:r>
+    </w:p>
+    <w:p>
+      <w:pPr>
+        <w:pStyle w:val="Heading3"/>
+      </w:pPr>
+      <w:r>
+        <w:t>Nachtrag (2026-07-20): key_risks bei Hebel-Signalen wurde bei gleichem Regime/gleicher Aktion praktisch wortgleich wiederholt</w:t>
+      </w:r>
+    </w:p>
+    <w:p>
+      <w:r>
+        <w:t>Ausloeser: Nutzer verglich zwei echte Hebel-EROEFFNEN-E-Mails (ONDO, KAIA) und bemerkte, dass die "Risiken:"-Liste vor dem Halte-Kriterium bei beiden fast wortidentisch war ("Liquidationsrisiko bei schnellen Kursbewegungen", "laufende Finanzierungsgebuehr bei laengerer Haltedauer", "Gegen-Trend-Position ... Baerenregime"). Root Cause: anders als bei den Top-5-Gruenden (Regel 8, verweist explizit auf konkrete Indikatorwerte) gab Regel 9 dem Modell fuer key_risks bisher fast woertlich die Zielformulierung als Beispiel vor - das Modell uebernahm diese Beispielsaetze praktisch unveraendert statt sie nur als Kategorie-Vorgabe zu behandeln. Der dritte, ebenfalls wiederkehrende Punkt stammt aus einer strukturell identischen Formulierung in der Regime-Konflikt-Anweisung (Regel 2). Fix (Nutzer-Entscheidung: Textbausteine behalten, aber um Zahlen ergaenzen - minimal-invasiv statt Neuformulierung): beide Prompt-Stellen in agent/krypto/hebel_analyst.py fordern jetzt explizit, die Beispielformulierungen mit den KONKRETEN Werten dieses Signals zu ergaenzen - bei key_risks der eigene hebel_vorschlag-Wert sowie die aktuelle funding_rate_aktuell aus den Fakten; beim Regime-Konflikt-Punkt das konkrete regime.regime und die eigene Gegenszenario-Wahrscheinlichkeit aus forecast. Bewusst NICHT angefasst: die deterministische Risikofaktoren-Liste ("3. KONKLUSION") ist rein regelbasiert berechnet, nicht vom LLM. Verifikation: reine Prompt-Textaenderung, per Syntax-/Import-Check und manueller Sichtpruefung des zusammengesetzten SYSTEM_PROMPT-Strings verifiziert, kein echter LLM-Testaufruf in dieser Runde.</w:t>
+      </w:r>
+    </w:p>
+    <w:p>
+      <w:pPr>
+        <w:pStyle w:val="Heading3"/>
+      </w:pPr>
+      <w:r>
+        <w:t>Nachtrag (2026-07-20): Risikofaktoren-Legende + drei kleine Bugfixes aus der Notebook-Nachtanalyse</w:t>
+      </w:r>
+    </w:p>
+    <w:p>
+      <w:r>
+        <w:t>Risikofaktoren-Legende: Nutzer-Fund per Screenshot - das weisse Neutral-Emoji wird in manchen E-Mail-Clients (Gmail-Web) blass-lila statt eindeutig grau gerendert, was zu einer falschen Vermutung ueber die Farblogik fuehrte (tatsaechlich: gruen = unterstuetzt die Empfehlung, rot = Warnsignal/Risiko). Neue RISIKOFAKTOREN_LEGENDE-Konstante direkt ueber der Liste in Detail-Panel UND allen drei E-Mail-Vorlagen (Spot/Hebel/Multi-Asset). Drei kleine Bugfixes aus derselben Notebook-Diagnose-Auswertung: 1) api/history.py::backfill_history() - Guard fuer fehlende coingecko_id (verursachte taeglich einen sinnlosen 404-Call). 2) api/yfinance_history.py::get_full_ohlc_history() - bekannte 'nur fast_info'-Ticker (X136.BE/IS0C.DE) wurden im taeglichen OHLC-Job bisher nicht beruecksichtigt, yfinance wirft dort hart eine Exception statt nur zu loggen - jetzt zentraler Skip vor dem Call. 3) api/onchain.py - neue MissingOnChainMetricError statt rohem TypeError, wenn CoinMetrics fuer den neuesten Tag eine einzelne Metrik noch nicht nachgetragen hat. Alle drei per synthetischem Test verifiziert.</w:t>
       </w:r>
     </w:p>
     <w:sectPr>

</xml_diff>

<commit_message>
Risikofaktoren-Symbole von farbigen Emoji auf Form-Marker (▲/●/▼) umgestellt
Nutzer-Screenshot vom live laufenden Notebook-Detail-Panel zeigte: 🟢/🔴
rendern in Tkinters Standardfont unter Windows auf denselben Ersatzglyph,
die Farbunterscheidung geht komplett verloren. Wechsel auf die bereits
etablierten These-Marker-Symbole (Form statt Farbe), robust gegen
Tkinter-Rendering und E-Mail-Client-Eigenheiten gleichermaßen.
</commit_message>
<xml_diff>
--- a/Basisinfos/Regelwerksmanual.docx
+++ b/Basisinfos/Regelwerksmanual.docx
@@ -13642,6 +13642,19 @@
     <w:p>
       <w:r>
         <w:t>Risikofaktoren-Legende: Nutzer-Fund per Screenshot - das weisse Neutral-Emoji wird in manchen E-Mail-Clients (Gmail-Web) blass-lila statt eindeutig grau gerendert, was zu einer falschen Vermutung ueber die Farblogik fuehrte (tatsaechlich: gruen = unterstuetzt die Empfehlung, rot = Warnsignal/Risiko). Neue RISIKOFAKTOREN_LEGENDE-Konstante direkt ueber der Liste in Detail-Panel UND allen drei E-Mail-Vorlagen (Spot/Hebel/Multi-Asset). Drei kleine Bugfixes aus derselben Notebook-Diagnose-Auswertung: 1) api/history.py::backfill_history() - Guard fuer fehlende coingecko_id (verursachte taeglich einen sinnlosen 404-Call). 2) api/yfinance_history.py::get_full_ohlc_history() - bekannte 'nur fast_info'-Ticker (X136.BE/IS0C.DE) wurden im taeglichen OHLC-Job bisher nicht beruecksichtigt, yfinance wirft dort hart eine Exception statt nur zu loggen - jetzt zentraler Skip vor dem Call. 3) api/onchain.py - neue MissingOnChainMetricError statt rohem TypeError, wenn CoinMetrics fuer den neuesten Tag eine einzelne Metrik noch nicht nachgetragen hat. Alle drei per synthetischem Test verifiziert.</w:t>
+      </w:r>
+    </w:p>
+    <w:p>
+      <w:pPr>
+        <w:pStyle w:val="Heading3"/>
+      </w:pPr>
+      <w:r>
+        <w:t>Nachtrag (2026-07-20): Risikofaktoren-Symbole von farbigen Emoji auf Form-Marker umgestellt</w:t>
+      </w:r>
+    </w:p>
+    <w:p>
+      <w:r>
+        <w:t>Fortsetzung des Legende-Fixes - Nutzer schickte einen Screenshot des LIVE laufenden Detail-Panels am Notebook (12:30 Uhr, Hebel-Tab): die farbigen Kreis-Emoji (rot/gruen) rendern in Tkinters Standardfont unter Windows NICHT farblich unterscheidbar - beide fallen auf denselben Ersatzglyph zurueck, nur das weisse Neutral-Emoji blieb sichtbar unterscheidbar. Damit beschrieb die gerade erst hinzugefuegte RISIKOFAKTOREN_LEGENDE eine Farbunterscheidung, die auf dem Bildschirm gar nicht existierte - Ursache: _set_detail_text() (ui/hebel_view.py, ui/signals_view.py) ist ein reiner tk.Text.insert()-Aufruf ohne jedes tag_configure(foreground=...), die Farbwirkung haengt komplett vom nicht vorhandenen Emoji-Farb-Support des Fonts ab. Fix: _RISIKOFAKTOR_SYMBOL in ui/formatting.py UND der parallelen Kopie in scheduler/background.py von farbigen Kreis-Emoji auf die Form-Marker Dreieck-hoch/Punkt/Dreieck-runter umgestellt - dieselben Marker (nicht nur Farbe, sondern unterschiedliche Glyphen), die bereits fuer die These-Marker im Schwerpunkte-Tab etabliert sind (ui/app.py/portfolio.py/screener_view.py, gleiche Semantik: positiv/unterstuetzend, negativ/Warnung, neutral). Form statt Farbe macht die Unterscheidung robust sowohl gegen Tkinter-Emoji-Rendering (App) als auch gegen E-Mail-Client-Eigenheiten (bereits der Ausloeser des vorherigen Legende-Fixes). RISIKOFAKTOREN_LEGENDE-Text in beiden Dateien entsprechend angepasst. Bewusst KEINE echten Tk-Farb-Tags zusaetzlich eingefuehrt (haette eine Restrukturierung von _set_detail_text() auf zeilenweises Einfuegen mit Tags erfordert) - die Form-Marker loesen das gemeldete Problem bereits vollstaendig und bleiben minimal-invasiv. Verifikation: synthetischer Test der Beispielszenerie aus dem Nutzer-Screenshot gegen beide Formatierungsfunktionen, Tk-Smoke-Test bestaetigt, dass tk.Text die drei Zeichen unveraendert speichert/liefert.</w:t>
       </w:r>
     </w:p>
     <w:sectPr>

</xml_diff>

<commit_message>
Dark-Mode-Comboboxen (TCombobox) kaum lesbar behoben
Nutzer-Screenshot vom "These bearbeiten"-Dialog zeigte alle vier readonly-
Comboboxen hell/kaum lesbar. apply_dark_mode() setzte fuer TCombobox nie
fieldbackground und keinen style.map() fuer den readonly-Zustand - 'clam'
fiel dadurch auf seine helle Systemfarbe zurueck. Zusaetzlich fehlten
option_add()-Zeilen fuer das Popdown (ein klassisches Tk-Listbox-Widget,
das ttk.Style nicht erreicht). Betrifft alle Comboboxen im Dark Mode
projektweit, reiner zentraler Style-Fix.
</commit_message>
<xml_diff>
--- a/Basisinfos/Regelwerksmanual.docx
+++ b/Basisinfos/Regelwerksmanual.docx
@@ -13655,6 +13655,19 @@
     <w:p>
       <w:r>
         <w:t>Fortsetzung des Legende-Fixes - Nutzer schickte einen Screenshot des LIVE laufenden Detail-Panels am Notebook (12:30 Uhr, Hebel-Tab): die farbigen Kreis-Emoji (rot/gruen) rendern in Tkinters Standardfont unter Windows NICHT farblich unterscheidbar - beide fallen auf denselben Ersatzglyph zurueck, nur das weisse Neutral-Emoji blieb sichtbar unterscheidbar. Damit beschrieb die gerade erst hinzugefuegte RISIKOFAKTOREN_LEGENDE eine Farbunterscheidung, die auf dem Bildschirm gar nicht existierte - Ursache: _set_detail_text() (ui/hebel_view.py, ui/signals_view.py) ist ein reiner tk.Text.insert()-Aufruf ohne jedes tag_configure(foreground=...), die Farbwirkung haengt komplett vom nicht vorhandenen Emoji-Farb-Support des Fonts ab. Fix: _RISIKOFAKTOR_SYMBOL in ui/formatting.py UND der parallelen Kopie in scheduler/background.py von farbigen Kreis-Emoji auf die Form-Marker Dreieck-hoch/Punkt/Dreieck-runter umgestellt - dieselben Marker (nicht nur Farbe, sondern unterschiedliche Glyphen), die bereits fuer die These-Marker im Schwerpunkte-Tab etabliert sind (ui/app.py/portfolio.py/screener_view.py, gleiche Semantik: positiv/unterstuetzend, negativ/Warnung, neutral). Form statt Farbe macht die Unterscheidung robust sowohl gegen Tkinter-Emoji-Rendering (App) als auch gegen E-Mail-Client-Eigenheiten (bereits der Ausloeser des vorherigen Legende-Fixes). RISIKOFAKTOREN_LEGENDE-Text in beiden Dateien entsprechend angepasst. Bewusst KEINE echten Tk-Farb-Tags zusaetzlich eingefuehrt (haette eine Restrukturierung von _set_detail_text() auf zeilenweises Einfuegen mit Tags erfordert) - die Form-Marker loesen das gemeldete Problem bereits vollstaendig und bleiben minimal-invasiv. Verifikation: synthetischer Test der Beispielszenerie aus dem Nutzer-Screenshot gegen beide Formatierungsfunktionen, Tk-Smoke-Test bestaetigt, dass tk.Text die drei Zeichen unveraendert speichert/liefert.</w:t>
+      </w:r>
+    </w:p>
+    <w:p>
+      <w:pPr>
+        <w:pStyle w:val="Heading3"/>
+      </w:pPr>
+      <w:r>
+        <w:t>Nachtrag (2026-07-20): Dark-Mode-Comboboxen kaum lesbar (TCombobox-Styling-Luecke)</w:t>
+      </w:r>
+    </w:p>
+    <w:p>
+      <w:r>
+        <w:t>Nutzer-Screenshot vom 'These bearbeiten'-Dialog (Schwerpunkte-Tab, live am Notebook): alle vier readonly-Comboboxen (Hauptgruppe, Unterkategorie, Richtung, Staerke) erschienen hell/kaum lesbar - sahen aus wie deaktivierte Felder, obwohl state='readonly' (der Standard-Zustand fuer feste Auswahllisten im gesamten Projekt) korrekt und normal editierbar ist. Root Cause: ui/theme.py::apply_dark_mode() konfigurierte TCombobox nur generisch mit background/foreground, setzte aber nie fieldbackground (die eigentliche Textfeld-Flaeche im 'clam'-Theme, getrennt von background) und keinen style.map() fuer den readonly-Zustand - 'clam' fiel dadurch im geschlossenen Zustand auf seine eingebaute helle Systemfarbe zurueck. Zusaetzlich ist das aufklappende Popdown einer ttk.Combobox intern ein klassisches Tk-Listbox-Widget, das ttk.Style gar nicht erreicht und eigene option_add()-Zeilen braucht. Fix: style.configure('TCombobox', fieldbackground=..., arrowcolor=...) + style.map('TCombobox', fieldbackground=[('readonly', ...), ('disabled', ...)], foreground=[('readonly', ...), ('disabled', ...)], ...) sowie vier neue root.option_add('*TCombobox*Listbox...')-Zeilen fuer das Popdown. Betrifft alle Comboboxen im Dark Mode projektweit (nicht nur den Schwerpunkte-Tab) - reiner Style-Fix in der zentralen Theme-Datei, keine Aenderung an einzelnen Dialogen noetig. Verifikation: ttk.Style.lookup('TCombobox', 'fieldbackground'/'foreground', state=['readonly']) nach apply_dark_mode() liefert die erwarteten Dark-Palette-Werte; Tk-Smoke-Test baut den echten TheseDialog fehlerfrei unter Dark Mode auf. Light Mode unveraendert (ruft apply_dark_mode() gar nicht auf).</w:t>
       </w:r>
     </w:p>
     <w:sectPr>

</xml_diff>

<commit_message>
Bitpanda-Gelistet-Override fuer Aktien/ETF/Rohstoffe (manueller Toggle)
Nutzer-Fund mit zwei echten Bitpanda-Screenshots: CEBS/EXH3/ISOC/VVMX/X136/
OD7C/OD7H/OD7L/OD7N/DBPK/3QSS werden real gehalten und sind aktiv handelbar,
aber vom /v3/assets-Endpunkt (Bitpandas "Bitpanda Stocks"-Fractional-ETF/
ETC-Produktlinie) nicht abgedeckt - live gegengeprueft, weder Symbol- noch
Namenstreffer im kompletten Katalog. Das blockierte strukturell jede Kauf-/
Nachkauf-Empfehlung fuer diese Assets (RM-Bitpanda-Veto in post_check()).

Neue Tabelle asset_bitpanda_override + get/set-Funktionen (analog
asset_hebel_settings), Default: kein Override, Live-Check gilt unveraendert
weiter. Alle 4 Spot-family-Pipelines pruefen den Override direkt nach dem
Live-Check. Neuer Button "Bitpanda-Override umschalten" im Watchlist-Tab
fuer jede Assetklasse, Spalte zeigt "✓ (M)" bei aktivem Override.
</commit_message>
<xml_diff>
--- a/Basisinfos/Regelwerksmanual.docx
+++ b/Basisinfos/Regelwerksmanual.docx
@@ -13668,6 +13668,19 @@
     <w:p>
       <w:r>
         <w:t>Nutzer-Screenshot vom 'These bearbeiten'-Dialog (Schwerpunkte-Tab, live am Notebook): alle vier readonly-Comboboxen (Hauptgruppe, Unterkategorie, Richtung, Staerke) erschienen hell/kaum lesbar - sahen aus wie deaktivierte Felder, obwohl state='readonly' (der Standard-Zustand fuer feste Auswahllisten im gesamten Projekt) korrekt und normal editierbar ist. Root Cause: ui/theme.py::apply_dark_mode() konfigurierte TCombobox nur generisch mit background/foreground, setzte aber nie fieldbackground (die eigentliche Textfeld-Flaeche im 'clam'-Theme, getrennt von background) und keinen style.map() fuer den readonly-Zustand - 'clam' fiel dadurch im geschlossenen Zustand auf seine eingebaute helle Systemfarbe zurueck. Zusaetzlich ist das aufklappende Popdown einer ttk.Combobox intern ein klassisches Tk-Listbox-Widget, das ttk.Style gar nicht erreicht und eigene option_add()-Zeilen braucht. Fix: style.configure('TCombobox', fieldbackground=..., arrowcolor=...) + style.map('TCombobox', fieldbackground=[('readonly', ...), ('disabled', ...)], foreground=[('readonly', ...), ('disabled', ...)], ...) sowie vier neue root.option_add('*TCombobox*Listbox...')-Zeilen fuer das Popdown. Betrifft alle Comboboxen im Dark Mode projektweit (nicht nur den Schwerpunkte-Tab) - reiner Style-Fix in der zentralen Theme-Datei, keine Aenderung an einzelnen Dialogen noetig. Verifikation: ttk.Style.lookup('TCombobox', 'fieldbackground'/'foreground', state=['readonly']) nach apply_dark_mode() liefert die erwarteten Dark-Palette-Werte; Tk-Smoke-Test baut den echten TheseDialog fehlerfrei unter Dark Mode auf. Light Mode unveraendert (ruft apply_dark_mode() gar nicht auf).</w:t>
+      </w:r>
+    </w:p>
+    <w:p>
+      <w:pPr>
+        <w:pStyle w:val="Heading3"/>
+      </w:pPr>
+      <w:r>
+        <w:t>Nachtrag (2026-07-20): Bitpanda-Gelistet-Override fuer Aktien/ETF/Rohstoffe</w:t>
+      </w:r>
+    </w:p>
+    <w:p>
+      <w:r>
+        <w:t>Ausloeser: Nutzer bemerkte, dass mehrere gehaltene Rohstoff-/Themen-ETF-Positionen (CEBS, EXH3, ISOC, VVMX, X136, OD7C/H/L/N, DBPK, 3QSS) durchgaengig als 'nicht bei Bitpanda gelistet' markiert wurden, obwohl er sie real haelt und handeln kann - belegt mit zwei echten Bitpanda-Screenshots (DBPK = 'S&amp;P 500 2X Inverse', ISOC = 'iShares Agribusiness'), beide mit aktiven Kaufen/Verkaufen/Tauschen-Buttons und real gehaltenen Anteilen. Root Cause (live verifiziert): der /v3/assets-Endpunkt (api/bitpanda.py) fand fuer keines der Symbole einen Treffer - weder per Symbol- noch per Namensvergleich ueber den kompletten Katalog (3185 Eintraege). Der Endpunkt ist fuer Bitpandas 'Bitpanda Stocks'-Fractional-ETF/ETC-Produktlinie offenbar keine vollstaendige Quelle - PLTR/VST (echte Aktien) werden dagegen korrekt gefunden. Reine Datenquellen-Luecke, kein Logikfehler. Konkreter Schaden: bitpanda_gelistet=False loeste in post_check() bei jedem KAUFEN/NACHKAUFEN-Vorschlag automatisch ein Risiko-Veto aus - fuer die betroffenen Assets konnte die App strukturell NIE einen (Nach-)Kauf empfehlen, unabhaengig von der eigentlichen Analyse. VERKAUFEN/TAUSCHEN waren nicht betroffen. Fix: manueller Override statt Abschaltung der Pruefung. Neue Tabelle asset_bitpanda_override (analog asset_hebel_settings) + get/set-Funktionen. Default: kein Override, der Live-Check gilt unveraendert weiter - keine Verhaltensaenderung fuer andere Assets (insbesondere echtes Krypto, CANTON/CC-Fall bleibt korrekt erfasst). Alle 4 Spot-family-Pipelines pruefen den Override direkt nach dem Live-Check. Neuer Button 'Bitpanda-Override umschalten' im Watchlist-Tab (gleiches Muster wie 'Hebel-Pruefung umschalten', aber fuer jede Assetklasse verfuegbar). Die Bitpanda-Spalte zeigt bei aktivem Override '(M)' statt des Fehlzeichens. Nutzer-Vorgabe: fuer zukuenftige Assets soll der Override manuell in der App setzbar sein, nicht nur fuer die aktuell identifizierten Symbole - deshalb ein generischer Toggle statt einer Hardcoded-Ausnahmeliste. Der Nutzer aktiviert den Override selbst am Notebook (Desktop darf keine Produktivdaten schreiben). Verifikation: synthetischer Test der DB-Funktionen (Default/Toggle/Update ohne Fehler); Tk-Smoke-Test der kompletten App (In-Memory-DB, synthetisches CEBS-Asset) - Watchlist-Spalte reagiert korrekt auf den Toggle in beide Richtungen; Import-Check aller 4 Pipelines + ui/app.py fehlerfrei.</w:t>
       </w:r>
     </w:p>
     <w:sectPr>

</xml_diff>

<commit_message>
Bitpanda-Katalog-Dedup verwarf Krypto-Token bei Ticker-Kollision mit Aktien
Nutzer-Fund am Watchlist-Screenshot: SUI (core!), W/Wormhole, BIO/Bio
Protocol, CAT/Simon's Cat zeigten "nicht bei Bitpanda gelistet". Root
Cause: _fetch_all_bitpanda_assets() dedupliziert seit dem 19.07.-Fix per
Symbol UEBER ALLE Anlageklassen - der Rohdatensatz enthaelt aber echte
Ticker-Kollisionen (Krypto "SUI" vs. Aktie "Sun Communities" etc.), die
Aktie gewann jeweils den Dedup-Slot und verdraengte den echten Krypto-
Token schon vor der Gruppenfilterung. Fix: Dedup-Schluessel von symbol auf
(symbol, group) geaendert. Alle 56 Watchlist-Symbole live gegengeprueft -
nur die vom Nutzer gefundenen 4 betroffen, keine weiteren Kollisionen.
</commit_message>
<xml_diff>
--- a/Basisinfos/Regelwerksmanual.docx
+++ b/Basisinfos/Regelwerksmanual.docx
@@ -13681,6 +13681,19 @@
     <w:p>
       <w:r>
         <w:t>Ausloeser: Nutzer bemerkte, dass mehrere gehaltene Rohstoff-/Themen-ETF-Positionen (CEBS, EXH3, ISOC, VVMX, X136, OD7C/H/L/N, DBPK, 3QSS) durchgaengig als 'nicht bei Bitpanda gelistet' markiert wurden, obwohl er sie real haelt und handeln kann - belegt mit zwei echten Bitpanda-Screenshots (DBPK = 'S&amp;P 500 2X Inverse', ISOC = 'iShares Agribusiness'), beide mit aktiven Kaufen/Verkaufen/Tauschen-Buttons und real gehaltenen Anteilen. Root Cause (live verifiziert): der /v3/assets-Endpunkt (api/bitpanda.py) fand fuer keines der Symbole einen Treffer - weder per Symbol- noch per Namensvergleich ueber den kompletten Katalog (3185 Eintraege). Der Endpunkt ist fuer Bitpandas 'Bitpanda Stocks'-Fractional-ETF/ETC-Produktlinie offenbar keine vollstaendige Quelle - PLTR/VST (echte Aktien) werden dagegen korrekt gefunden. Reine Datenquellen-Luecke, kein Logikfehler. Konkreter Schaden: bitpanda_gelistet=False loeste in post_check() bei jedem KAUFEN/NACHKAUFEN-Vorschlag automatisch ein Risiko-Veto aus - fuer die betroffenen Assets konnte die App strukturell NIE einen (Nach-)Kauf empfehlen, unabhaengig von der eigentlichen Analyse. VERKAUFEN/TAUSCHEN waren nicht betroffen. Fix: manueller Override statt Abschaltung der Pruefung. Neue Tabelle asset_bitpanda_override (analog asset_hebel_settings) + get/set-Funktionen. Default: kein Override, der Live-Check gilt unveraendert weiter - keine Verhaltensaenderung fuer andere Assets (insbesondere echtes Krypto, CANTON/CC-Fall bleibt korrekt erfasst). Alle 4 Spot-family-Pipelines pruefen den Override direkt nach dem Live-Check. Neuer Button 'Bitpanda-Override umschalten' im Watchlist-Tab (gleiches Muster wie 'Hebel-Pruefung umschalten', aber fuer jede Assetklasse verfuegbar). Die Bitpanda-Spalte zeigt bei aktivem Override '(M)' statt des Fehlzeichens. Nutzer-Vorgabe: fuer zukuenftige Assets soll der Override manuell in der App setzbar sein, nicht nur fuer die aktuell identifizierten Symbole - deshalb ein generischer Toggle statt einer Hardcoded-Ausnahmeliste. Der Nutzer aktiviert den Override selbst am Notebook (Desktop darf keine Produktivdaten schreiben). Verifikation: synthetischer Test der DB-Funktionen (Default/Toggle/Update ohne Fehler); Tk-Smoke-Test der kompletten App (In-Memory-DB, synthetisches CEBS-Asset) - Watchlist-Spalte reagiert korrekt auf den Toggle in beide Richtungen; Import-Check aller 4 Pipelines + ui/app.py fehlerfrei.</w:t>
+      </w:r>
+    </w:p>
+    <w:p>
+      <w:pPr>
+        <w:pStyle w:val="Heading3"/>
+      </w:pPr>
+      <w:r>
+        <w:t>Nachtrag (2026-07-20): Bitpanda-Katalog-Dedup verwarf Krypto-Token bei Ticker-Kollision mit Aktien</w:t>
+      </w:r>
+    </w:p>
+    <w:p>
+      <w:r>
+        <w:t>Ausloeser: Nutzer bemerkte im Watchlist-Screenshot, dass mehrere Krypto-Assets (SUI, W/Wormhole, BIO/Bio Protocol, CAT/Simon's Cat) - darunter SUI als core-Position - ploetzlich rot/'nicht bei Bitpanda gelistet' zeigten, obwohl es sich um bekannte, real gehandelte Token handelt. Root Cause (live bestaetigt): api/bitpanda.py::_fetch_all_bitpanda_assets() dedupliziert seit dem 19.07.-Bugfix ('erstes Vorkommen gewinnt') per Symbol UEBER ALLE Anlageklassen hinweg. Der Rohdatensatz enthaelt aber echte Ticker-Kollisionen zwischen unterschiedlichen Klassen: Krypto-Token 'SUI' koexistiert mit der Aktie 'Sun Communities' (REIT), 'BIO' mit 'Bio-Rad Laboratories', 'W' mit 'Wayfair', 'CAT' mit 'Caterpillar' - live im Rohdatensatz vor Dedup bestaetigt: beide Eintraege sind vorhanden. Da die Aktien-Eintraege im Rohdatensatz vor den Krypto-Eintraegen auftraten, gewann jeweils die Aktie den Dedup-Slot, der echte Krypto-Token wurde bereits vor der gruppenspezifischen Filterung stillschweigend verworfen. Der urspruengliche Bugfix hatte diese ca. 53 'echten Symbol-Duplikate' im eigenen Docstring bereits korrekt als 'vermutlich verschiedene interne Assets mit kollidierendem Ticker' identifiziert - aber trotzdem pauschal dedupliziert, ohne die Assetklassen-uebergreifende Konsequenz zu bedenken. Fix: Dedup-Schluessel von Symbol auf (Symbol, Gruppe) geaendert - entfernt weiterhin echte Innerhalb-derselben-Gruppe-Duplikate (der urspruengliche Zweck), behaelt aber Eintraege aus unterschiedlichen Gruppen mit zufaellig gleichem Ticker als eigenstaendige Assets. Betrifft nur api/bitpanda.py, keine Aenderung an Aufrufern noetig. Vollstaendigkeits-Check: alle 56 Watchlist-Symbole gegen den echten Katalog geprueft - genau die 4 vom Nutzer gefundenen Symbole betroffen, keine weiteren Kollisionen. Verifikation: Live-Check bestaetigt SUI/BIO/W/CAT jetzt korrekt als gelistetes Krypto-Asset; Regressionstest bestaetigt PLTR/VST weiterhin korrekt, die vier Kollisions-Symbole bleiben auf der Aktien-Seite ebenfalls korrekt vorhanden, CANTON/CC-Namens-Fallback weiterhin funktionsfaehig; Tk-Smoke-Test der Watchlist-Spalte zeigt SUI/W jetzt korrekt an.</w:t>
       </w:r>
     </w:p>
     <w:sectPr>

</xml_diff>

<commit_message>
Groq-Fallback DB-persistent + Mistral vor Groq
Groq lieferte real nur ~11% aller LLM-Calls (echte 429er in api_health),
die bisherige In-Memory-Erschoepfungssperre wurde zudem bei jedem
App-Neustart zurueckgesetzt (haeufige Git-Pull-Neustarts in der aktiven
Entwicklungsphase). Neue Tabelle groq_exhaustion_status + drei DB-Funktionen
ersetzen die modul-globalen Variablen 1:1, ueberleben aber jetzt einen
Neustart. Fallback-Reihenfolge in allen 3 Tiers (Hebel/Marktscan/Spot) auf
Mistral vor Groq gedreht.

Co-Authored-By: Claude Sonnet 5 <noreply@anthropic.com>
</commit_message>
<xml_diff>
--- a/Basisinfos/Regelwerksmanual.docx
+++ b/Basisinfos/Regelwerksmanual.docx
@@ -13694,6 +13694,19 @@
     <w:p>
       <w:r>
         <w:t>Ausloeser: Nutzer bemerkte im Watchlist-Screenshot, dass mehrere Krypto-Assets (SUI, W/Wormhole, BIO/Bio Protocol, CAT/Simon's Cat) - darunter SUI als core-Position - ploetzlich rot/'nicht bei Bitpanda gelistet' zeigten, obwohl es sich um bekannte, real gehandelte Token handelt. Root Cause (live bestaetigt): api/bitpanda.py::_fetch_all_bitpanda_assets() dedupliziert seit dem 19.07.-Bugfix ('erstes Vorkommen gewinnt') per Symbol UEBER ALLE Anlageklassen hinweg. Der Rohdatensatz enthaelt aber echte Ticker-Kollisionen zwischen unterschiedlichen Klassen: Krypto-Token 'SUI' koexistiert mit der Aktie 'Sun Communities' (REIT), 'BIO' mit 'Bio-Rad Laboratories', 'W' mit 'Wayfair', 'CAT' mit 'Caterpillar' - live im Rohdatensatz vor Dedup bestaetigt: beide Eintraege sind vorhanden. Da die Aktien-Eintraege im Rohdatensatz vor den Krypto-Eintraegen auftraten, gewann jeweils die Aktie den Dedup-Slot, der echte Krypto-Token wurde bereits vor der gruppenspezifischen Filterung stillschweigend verworfen. Der urspruengliche Bugfix hatte diese ca. 53 'echten Symbol-Duplikate' im eigenen Docstring bereits korrekt als 'vermutlich verschiedene interne Assets mit kollidierendem Ticker' identifiziert - aber trotzdem pauschal dedupliziert, ohne die Assetklassen-uebergreifende Konsequenz zu bedenken. Fix: Dedup-Schluessel von Symbol auf (Symbol, Gruppe) geaendert - entfernt weiterhin echte Innerhalb-derselben-Gruppe-Duplikate (der urspruengliche Zweck), behaelt aber Eintraege aus unterschiedlichen Gruppen mit zufaellig gleichem Ticker als eigenstaendige Assets. Betrifft nur api/bitpanda.py, keine Aenderung an Aufrufern noetig. Vollstaendigkeits-Check: alle 56 Watchlist-Symbole gegen den echten Katalog geprueft - genau die 4 vom Nutzer gefundenen Symbole betroffen, keine weiteren Kollisionen. Verifikation: Live-Check bestaetigt SUI/BIO/W/CAT jetzt korrekt als gelistetes Krypto-Asset; Regressionstest bestaetigt PLTR/VST weiterhin korrekt, die vier Kollisions-Symbole bleiben auf der Aktien-Seite ebenfalls korrekt vorhanden, CANTON/CC-Namens-Fallback weiterhin funktionsfaehig; Tk-Smoke-Test der Watchlist-Spalte zeigt SUI/W jetzt korrekt an.</w:t>
+      </w:r>
+    </w:p>
+    <w:p>
+      <w:pPr>
+        <w:pStyle w:val="Heading3"/>
+      </w:pPr>
+      <w:r>
+        <w:t>Nachtrag (2026-07-20): Groq als Primär-LLM abgelöst - Mistral vor Groq + DB-persistente Erschöpfungs-Erkennung</w:t>
+      </w:r>
+    </w:p>
+    <w:p>
+      <w:r>
+        <w:t>Auslöser: Nutzer bewertete Groq nach Auswertung der heutigen echten LLM-Aufrufe als Primär-LLM 'relativ unbrauchbar' - reale Zahlen bestätigten das: nur 9 von 79 echten Calls (~11%) liefen über Groq, api_health zeigte echte 429 Too Many Requests-Fehler. Zusätzlich bestand seit dem 18.07.-Fund eine offene Schwäche: die In-Memory-Erschöpfungssperre wurde bei jedem App-Neustart zurückgesetzt - in der aktiven Entwicklungsphase (Notebook startet bei jedem Git-Pull neu, ~8x/Tag beobachtet) lief Groq dadurch wiederholt binnen Minuten erneut in dieselben 429-Fehlschläge, bevor die Sperre erneut greifen konnte. Fix 1 - Reihenfolge umgedreht: agent/krypto/budget_allocator.py versucht für jeden Kandidaten (Hebel/Marktscan/Spot) jetzt zuerst Mistral (falls mistral_client gesetzt), erst bei dessen Fehlschlag Groq, dann Gemini. Mistrals echt verifizierte Kapazität (2.250.000 TPM/300 RPM) macht es zur zuverlässigeren ersten Stufe; Groq bleibt als kostenlose zweite Stufe erhalten, Gemini bleibt bewusst am Ende der Kette. Fix 2 - DB-persistente Erschöpfungs-Erkennung: neue Tabelle groq_exhaustion_status in database/db.py, mit is_groq_exhausted_today()/record_groq_failure()/record_groq_success() - ersetzen 1:1 die bisherigen modul-globalen In-Memory-Variablen (gleiche Kalendertag-Semantik), überleben aber jetzt einen App-Neustart. Verifikation: synthetischer Test bestätigt DB-Persistenz über einen simulierten Neustart sowie die neue Fallback-Reihenfolge gegen eine echte In-Memory-SQLite-Kopie mit Fake-Clients (Mistral erfolgreich -&gt; Groq wird nicht aufgerufen; Mistral-Fehlschlag -&gt; Fallback auf Groq; Groq DB-seitig erschöpft -&gt; wird korrekt übersprungen). Import-/Syntax-Check bestätigt keine verwaisten Referenzen mehr. Offen (bewusst nicht Teil dieser Runde): agent/multi_asset_batch.py hat weiterhin kein Groq-Erschöpfungs-Bewusstsein, obwohl es denselben Rate-Limit-Pool teilt - eine natürliche Erweiterung für Konsistenz, aber nicht Teil des expliziten Nutzer-Auftrags dieser Runde.</w:t>
       </w:r>
     </w:p>
     <w:sectPr>

</xml_diff>

<commit_message>
Provider-Performance-Karte: Spot nach Assetklasse aufschluesseln
compute_provider_performance() poolte bisher alle Spot-Assetklassen
(Krypto/Aktien/Rohstoffe/Hedge/Themen-ETF) unter einem einzigen "spot"-
Schluessel - Win-Rate/CRV waren nicht nach Assetklasse unterscheidbar.
Neuer optionaler watchlist-Parameter splittet nach asset.assetklasse;
ohne watchlist bleibt das alte gepoolte Verhalten fuer
extract_notebook_diagnose.py erhalten.

Co-Authored-By: Claude Sonnet 5 <noreply@anthropic.com>
</commit_message>
<xml_diff>
--- a/Basisinfos/Regelwerksmanual.docx
+++ b/Basisinfos/Regelwerksmanual.docx
@@ -13707,6 +13707,19 @@
     <w:p>
       <w:r>
         <w:t>Auslöser: Nutzer bewertete Groq nach Auswertung der heutigen echten LLM-Aufrufe als Primär-LLM 'relativ unbrauchbar' - reale Zahlen bestätigten das: nur 9 von 79 echten Calls (~11%) liefen über Groq, api_health zeigte echte 429 Too Many Requests-Fehler. Zusätzlich bestand seit dem 18.07.-Fund eine offene Schwäche: die In-Memory-Erschöpfungssperre wurde bei jedem App-Neustart zurückgesetzt - in der aktiven Entwicklungsphase (Notebook startet bei jedem Git-Pull neu, ~8x/Tag beobachtet) lief Groq dadurch wiederholt binnen Minuten erneut in dieselben 429-Fehlschläge, bevor die Sperre erneut greifen konnte. Fix 1 - Reihenfolge umgedreht: agent/krypto/budget_allocator.py versucht für jeden Kandidaten (Hebel/Marktscan/Spot) jetzt zuerst Mistral (falls mistral_client gesetzt), erst bei dessen Fehlschlag Groq, dann Gemini. Mistrals echt verifizierte Kapazität (2.250.000 TPM/300 RPM) macht es zur zuverlässigeren ersten Stufe; Groq bleibt als kostenlose zweite Stufe erhalten, Gemini bleibt bewusst am Ende der Kette. Fix 2 - DB-persistente Erschöpfungs-Erkennung: neue Tabelle groq_exhaustion_status in database/db.py, mit is_groq_exhausted_today()/record_groq_failure()/record_groq_success() - ersetzen 1:1 die bisherigen modul-globalen In-Memory-Variablen (gleiche Kalendertag-Semantik), überleben aber jetzt einen App-Neustart. Verifikation: synthetischer Test bestätigt DB-Persistenz über einen simulierten Neustart sowie die neue Fallback-Reihenfolge gegen eine echte In-Memory-SQLite-Kopie mit Fake-Clients (Mistral erfolgreich -&gt; Groq wird nicht aufgerufen; Mistral-Fehlschlag -&gt; Fallback auf Groq; Groq DB-seitig erschöpft -&gt; wird korrekt übersprungen). Import-/Syntax-Check bestätigt keine verwaisten Referenzen mehr. Offen (bewusst nicht Teil dieser Runde): agent/multi_asset_batch.py hat weiterhin kein Groq-Erschöpfungs-Bewusstsein, obwohl es denselben Rate-Limit-Pool teilt - eine natürliche Erweiterung für Konsistenz, aber nicht Teil des expliziten Nutzer-Auftrags dieser Runde.</w:t>
+      </w:r>
+    </w:p>
+    <w:p>
+      <w:pPr>
+        <w:pStyle w:val="Heading3"/>
+      </w:pPr>
+      <w:r>
+        <w:t>Nachtrag (2026-07-20): Provider-Performance-Karte nach Assetklasse aufgeschluesselt (Krypto/Aktien/Rohstoffe/ETF getrennt statt gepoolter 'Spot'-Topf)</w:t>
+      </w:r>
+    </w:p>
+    <w:p>
+      <w:r>
+        <w:t>Ausloeser: Nutzer fragte nach dem Status von Backward-Tracking bei Nicht-Krypto-Assetklassen anhand eines Remote-Status-Screenshots ('Provider-Performance (Spot): noch keine Daten'). Antwort: Backward-Tracking selbst lief fuer Aktien/Rohstoffe/Hedge/Themen-ETF bereits automatisch mit (alle 4 Spot-family-Pipelines schreiben ueber db.insert_signal() in dieselbe signals-Tabelle, run_backward_tracking() liest diese Tabelle OHNE Assetklassen-Filter) - kein Luecken-Fund. Die eigentliche Luecke: compute_provider_performance() poolte ALLE Spot-Assetklassen (Krypto, Aktien, Rohstoffe, Hedge, Themen-ETF) unter einem einzigen 'spot'-Schluessel in der Anzeige-Karte - derselbe Pooling-Fehler, der fuer den internen Win-Rate-Prompt-Fakt (compute_win_rate_fact()) schon am 2026-07-18 behoben worden war, aber fuer diese Anzeige-Karte nie nachgezogen wurde. Fix: compute_provider_performance() bekommt einen neuen optionalen Parameter watchlist (Default None = altes gepooltes Verhalten, erhaelt extract_notebook_diagnose.py unveraendert funktionsfaehig). Ist watchlist gesetzt, wird jedes aufgeloeste Spot-Signal ueber sein Symbol der asset.assetklasse (krypto/aktien/rohstoffe/etf) zugeordnet statt pauschal 'spot' - bewusst FEINER als compute_win_rate_fact()s Pooling (das Krypto+Aktien fuer die Prompt-Kalibrierung bewusst zusammenlegt), weil diese Anzeige-Karte dem Nutzer Sichtbarkeit PRO Assetklasse geben soll. remote/status.py reicht die Watchlist durch, remote/server.py rendert die Spot-Seite ueber eine neue Funktion mit fester Reihenfolge/Beschriftung (Krypto/Aktien/Rohstoffe/ETF - Themen-ETF und Hedge teilen sich die Watchlist-Assetklasse 'etf'), damit auch eine noch leere Assetklasse sichtbar bleibt statt zu fehlen. Hebel-Karte unveraendert. Verifikation: synthetischer Test mit 4 Signalen (je eins pro Assetklasse, ueber den echten Schreibpfad insert_signal()+update_signal_outcome() erzeugt) bestaetigt korrekte Trennung mit watchlist und unveraendertes Legacy-Pooling ohne watchlist; Syntax-Check aller 3 geaenderten Dateien bestanden.</w:t>
       </w:r>
     </w:p>
     <w:sectPr>

</xml_diff>

<commit_message>
Z.ai (Zhipu AI) testweise als vierte LLM-Fallback-Stufe vor Mistral
GLM-4.5-Flash ist ein echtes Dauer-Free-Tier (kein Trial-Guthaben, OpenAI-
kompatibel, gute Vertragsbedingungen fuer API-Kunden), aber die genauen
Rate-Limits sind oeffentlich nicht dokumentiert (nur ein Concurrency-Limit
von 2 im Dashboard sichtbar). Nutzer-Entscheidung: trotzdem produktiv
testen statt weiter zu recherchieren - reale Kapazitaet zeigt sich ueber
echte 429-Fehler in api_health, analog zu Groq. Neue Kette: Z.ai -> Mistral
-> Groq -> Gemini, testweise, nicht final.

Co-Authored-By: Claude Sonnet 5 <noreply@anthropic.com>
</commit_message>
<xml_diff>
--- a/Basisinfos/Regelwerksmanual.docx
+++ b/Basisinfos/Regelwerksmanual.docx
@@ -13720,6 +13720,19 @@
     <w:p>
       <w:r>
         <w:t>Ausloeser: Nutzer fragte nach dem Status von Backward-Tracking bei Nicht-Krypto-Assetklassen anhand eines Remote-Status-Screenshots ('Provider-Performance (Spot): noch keine Daten'). Antwort: Backward-Tracking selbst lief fuer Aktien/Rohstoffe/Hedge/Themen-ETF bereits automatisch mit (alle 4 Spot-family-Pipelines schreiben ueber db.insert_signal() in dieselbe signals-Tabelle, run_backward_tracking() liest diese Tabelle OHNE Assetklassen-Filter) - kein Luecken-Fund. Die eigentliche Luecke: compute_provider_performance() poolte ALLE Spot-Assetklassen (Krypto, Aktien, Rohstoffe, Hedge, Themen-ETF) unter einem einzigen 'spot'-Schluessel in der Anzeige-Karte - derselbe Pooling-Fehler, der fuer den internen Win-Rate-Prompt-Fakt (compute_win_rate_fact()) schon am 2026-07-18 behoben worden war, aber fuer diese Anzeige-Karte nie nachgezogen wurde. Fix: compute_provider_performance() bekommt einen neuen optionalen Parameter watchlist (Default None = altes gepooltes Verhalten, erhaelt extract_notebook_diagnose.py unveraendert funktionsfaehig). Ist watchlist gesetzt, wird jedes aufgeloeste Spot-Signal ueber sein Symbol der asset.assetklasse (krypto/aktien/rohstoffe/etf) zugeordnet statt pauschal 'spot' - bewusst FEINER als compute_win_rate_fact()s Pooling (das Krypto+Aktien fuer die Prompt-Kalibrierung bewusst zusammenlegt), weil diese Anzeige-Karte dem Nutzer Sichtbarkeit PRO Assetklasse geben soll. remote/status.py reicht die Watchlist durch, remote/server.py rendert die Spot-Seite ueber eine neue Funktion mit fester Reihenfolge/Beschriftung (Krypto/Aktien/Rohstoffe/ETF - Themen-ETF und Hedge teilen sich die Watchlist-Assetklasse 'etf'), damit auch eine noch leere Assetklasse sichtbar bleibt statt zu fehlen. Hebel-Karte unveraendert. Verifikation: synthetischer Test mit 4 Signalen (je eins pro Assetklasse, ueber den echten Schreibpfad insert_signal()+update_signal_outcome() erzeugt) bestaetigt korrekte Trennung mit watchlist und unveraendertes Legacy-Pooling ohne watchlist; Syntax-Check aller 3 geaenderten Dateien bestanden.</w:t>
+      </w:r>
+    </w:p>
+    <w:p>
+      <w:pPr>
+        <w:pStyle w:val="Heading3"/>
+      </w:pPr>
+      <w:r>
+        <w:t>Nachtrag (2026-07-20): Z.ai (Zhipu AI) testweise als vierte, unverifizierte Fallback-Stufe VOR Mistral eingehängt</w:t>
+      </w:r>
+    </w:p>
+    <w:p>
+      <w:r>
+        <w:t>Auslöser: Direkte Fortsetzung der Groq-Alternative-Recherche - Z.ai/Zhipu GLM-4.5-Flash wurde als echtes, dauerhaftes Free-Tier-Modell identifiziert (kein Trial-Guthaben, OpenAI-kompatibler Endpunkt, gute Vertragsbedingungen für API-Kunden: keine Speicherung, keine Trainings-Nutzung). Einzige offene Lücke: die exakten Rate-Limits sind öffentlich nicht dokumentiert (nur ein Concurrency-Limit von 2 im Nutzer-Dashboard sichtbar, keine RPM/TPM/RPD-Zahl). Nutzer-Entscheidung, trotzdem sofort produktiv zu testen: 'kein Grund nicht auf ein bestimmtes höheres Limit zu gehen, wenn diese Quelle blockiert wird passiert auch nichts für diese eine Nacht'. Umgesetzt: api/zai.py (neu, ZaiClient, identisches .chat()-Interface wie Groq/Mistral/Gemini, OpenAI-kompatibel, Modell glm-4.5-flash, bewusst kein konservativer Rate-Limiter wie bei Mistral). agent/krypto/budget_allocator.py: neuer optionaler Parameter zai_client, eigener Tagesbudget-Zähler (zai_taegliches_budget, Default 300), alle 3 Tiers (Hebel/Marktscan/Spot) versuchen jetzt Z.ai VOR Mistral/Groq - testweise, nicht final. main.py liest ZAI_API_KEY und konstruiert ZaiClient (P-8-optional). Vollständiges UI-Wiring in ui/app.py, ui/hebel_view.py, ui/signals_view.py (inklusive der manuellen Einzel-Klick-Fallback-Reihenfolge über alle Assetklassen). remote/server.py zeigt Z.ai jetzt im API-Status. Bewusst NICHT Teil dieser Runde: agent/multi_asset_batch.py bleibt unverändert, gleiche Scope-Entscheidung wie beim Groq-Erschöpfungs-Fix. Verifikation: echter Testaufruf gegen die echte Z.ai-API (einfacher Chat-Call UND JSON-Mode, beide erfolgreich, volle OpenAI-Kompatibilität bestätigt); Import-/Syntax-Check aller 9 geänderten Dateien fehlerfrei; synthetischer Test der kompletten Fallback-Kette mit Fake-Clients gegen eine echte In-Memory-SQLite-Kopie bestätigt korrekte Reihenfolge, Fallback bei Fehlschlag und korrekte Erschöpfungs-Erkennung des eigenen Tagesbudgets. Offen: Reihenfolge ist testweise, nicht final - sobald genug echte Betriebsdaten vorliegen, wird neu entschieden, ob Z.ai vor Groq bleibt, dahinter wandert, oder bei schlechten Ergebnissen wieder entfernt wird.</w:t>
       </w:r>
     </w:p>
     <w:sectPr>

</xml_diff>

<commit_message>
Z.ai nach erster Testnacht auf letzte Fallback-Stufe zurueckgestuft + Budget-Neukalibrierung
Reproduzierte Timeouts zeigten: GLM-4.5-Flash braucht bei realistischer
Payload-Groesse ~110s statt der bisherigen 60s - zu langsam fuer eine
fruehe Fallback-Stufe. Kette jetzt Mistral -> Groq -> Gemini -> Z.ai,
Zai-Timeout auf 150s erhoeht. Zusaetzlich Tagesbudgets angehoben
(Mistral 400, Gemini 500, Gesamtbudget B 90->180, Spot-Reserve F 30->60),
um reale Kapazitaetsgrenzen sichtbar zu machen und beobachtete
Leerlaufphasen durch fruehzeitig erschoepftes Tagesbudget zu reduzieren.

Co-Authored-By: Claude Sonnet 5 <noreply@anthropic.com>
</commit_message>
<xml_diff>
--- a/Basisinfos/Regelwerksmanual.docx
+++ b/Basisinfos/Regelwerksmanual.docx
@@ -13733,6 +13733,39 @@
     <w:p>
       <w:r>
         <w:t>Auslöser: Direkte Fortsetzung der Groq-Alternative-Recherche - Z.ai/Zhipu GLM-4.5-Flash wurde als echtes, dauerhaftes Free-Tier-Modell identifiziert (kein Trial-Guthaben, OpenAI-kompatibler Endpunkt, gute Vertragsbedingungen für API-Kunden: keine Speicherung, keine Trainings-Nutzung). Einzige offene Lücke: die exakten Rate-Limits sind öffentlich nicht dokumentiert (nur ein Concurrency-Limit von 2 im Nutzer-Dashboard sichtbar, keine RPM/TPM/RPD-Zahl). Nutzer-Entscheidung, trotzdem sofort produktiv zu testen: 'kein Grund nicht auf ein bestimmtes höheres Limit zu gehen, wenn diese Quelle blockiert wird passiert auch nichts für diese eine Nacht'. Umgesetzt: api/zai.py (neu, ZaiClient, identisches .chat()-Interface wie Groq/Mistral/Gemini, OpenAI-kompatibel, Modell glm-4.5-flash, bewusst kein konservativer Rate-Limiter wie bei Mistral). agent/krypto/budget_allocator.py: neuer optionaler Parameter zai_client, eigener Tagesbudget-Zähler (zai_taegliches_budget, Default 300), alle 3 Tiers (Hebel/Marktscan/Spot) versuchen jetzt Z.ai VOR Mistral/Groq - testweise, nicht final. main.py liest ZAI_API_KEY und konstruiert ZaiClient (P-8-optional). Vollständiges UI-Wiring in ui/app.py, ui/hebel_view.py, ui/signals_view.py (inklusive der manuellen Einzel-Klick-Fallback-Reihenfolge über alle Assetklassen). remote/server.py zeigt Z.ai jetzt im API-Status. Bewusst NICHT Teil dieser Runde: agent/multi_asset_batch.py bleibt unverändert, gleiche Scope-Entscheidung wie beim Groq-Erschöpfungs-Fix. Verifikation: echter Testaufruf gegen die echte Z.ai-API (einfacher Chat-Call UND JSON-Mode, beide erfolgreich, volle OpenAI-Kompatibilität bestätigt); Import-/Syntax-Check aller 9 geänderten Dateien fehlerfrei; synthetischer Test der kompletten Fallback-Kette mit Fake-Clients gegen eine echte In-Memory-SQLite-Kopie bestätigt korrekte Reihenfolge, Fallback bei Fehlschlag und korrekte Erschöpfungs-Erkennung des eigenen Tagesbudgets. Offen: Reihenfolge ist testweise, nicht final - sobald genug echte Betriebsdaten vorliegen, wird neu entschieden, ob Z.ai vor Groq bleibt, dahinter wandert, oder bei schlechten Ergebnissen wieder entfernt wird.</w:t>
+      </w:r>
+    </w:p>
+    <w:p>
+      <w:pPr>
+        <w:pStyle w:val="Heading3"/>
+      </w:pPr>
+      <w:r>
+        <w:t>Nachtrag (2026-07-20, spaet abends): Z.ai auf letzte Fallback-Stufe zurueckgestuft + Budget-Neukalibrierung</w:t>
+      </w:r>
+    </w:p>
+    <w:p>
+      <w:r>
+        <w:t>Ausloeser: Erste echte Testnacht mit Z.ai an erster Stelle lieferte sofort 2/2 'Read timed out'-Fehlschlaege (hebel:NEAR:LONG, hebel:SUI:LONG, je nach ~80-100s) auf dem Notebook. Root-Cause-Diagnose: (1) Notebook-Log durchsucht - kein Haenger, echte ReadTimeout-Exceptions. (2) Live-Test vom Desktop mit trivialem Prompt: 3/3 Erfolge in 4.6-10.2s, Z.ai grundsaetzlich erreichbar. (3) Live-Test vom Desktop mit REALISTISCHER Payload (echter SYSTEM_PROMPT aus hebel_analyst.py + synthetisches Facts-JSON, JSON-Mode): Timeout nach exakt 60.4s - reproduziert unabhaengig vom Notebook, also ein echtes Kapazitaetsproblem der Payload-Groesse, kein Notebook-Netzwerk-/Hardware-Problem. (4) Vergleichstest beider echter Free-Tier-Modelle mit 150s-Timeout: GLM-4.5-Flash antwortete nach 109.2s korrekt und vollstaendig - GLM-4.7-Flash lieferte auch nach vollen 150s keine Antwort (Concurrency-Limit 1 statt 2, damit endgueltig verworfen).</w:t>
+      </w:r>
+    </w:p>
+    <w:p>
+      <w:r>
+        <w:t>Fazit: GLM-4.5-Flash ist nicht kaputt/unerreichbar, sondern schlicht zu langsam fuer eine FRUEHE Fallback-Stufe (~110s realistische Antwortzeit, der bisherige 60s-Timeout war strukturell zu knapp). Als erste Stufe wuerde das jeden Kandidaten um bis zu 2 Minuten verzoegern, bevor der Fallback greift - gegensaetzlich zum parallel dokumentierten Delta-Thema (Memory project_delta_berechnung_llm_abfrage_timing).</w:t>
+      </w:r>
+    </w:p>
+    <w:p>
+      <w:r>
+        <w:t>Umgesetzt: agent/krypto/budget_allocator.py - alle 3 Tiers (Hebel/Marktscan/Spot) neu geordnet auf Mistral -&gt; Groq -&gt; Gemini -&gt; Z.ai (Z.ai jetzt echte letzte Stufe statt erste). api/zai.py: neue Konstante REQUEST_TIMEOUT_SECONDS = 150 (vorher hart codiert 60s) - als letzte Stufe faellt die laengere Wartezeit kaum ins Gewicht. Docstrings/Log-Zeilen in main.py, budget_allocator.py, api/zai.py, config.yaml auf die neue Reihenfolge korrigiert.</w:t>
+      </w:r>
+    </w:p>
+    <w:p>
+      <w:r>
+        <w:t>Budget-Neukalibrierung (Nutzer-Vorgabe: 'flachere Budgetkurve, Glaettung, vernuenftige Last auf die ersten Quellen, dann sehen wir wo wir liegen' - Ziel: reale Kapazitaetsgrenzen von Mistral/Groq/Gemini ueber echte Nutzung sichtbar machen, UND beobachtete '1h-Leerlaufphasen' reduzieren, bei denen das Tagesbudget B schon frueh erschoepft war): mistral_taegliches_budget 150 -&gt; 400, gemini_taegliches_budget 200 -&gt; 500, taegliches_budget_gesamt (B) 90 -&gt; 180, spot_rotation_reserve (F) 30 -&gt; 60 (Verhaeltnis F/B ≈ 33% beibehalten). Groq hat weiterhin keinen Tages-Deckel (nur echte 429-Erschoepfungserkennung).</w:t>
+      </w:r>
+    </w:p>
+    <w:p>
+      <w:r>
+        <w:t>Verifikation: Reihenfolge-Aenderung in allen 3 Tiers bestaetigt. Syntax-Check aller 4 geaenderten Python-/YAML-Dateien fehlerfrei. _verteile_budget() mit synthetischem Ausreissertag getestet (20 Hebel + 15 Marktscan + 84 faellige Spot-Kandidaten = 119 gesamt): mit dem alten B=90 waeren Spot-Kandidaten auf 55 gekappt worden, mit B=180 bekommen alle 119 einen LLM-Versuch. Offen: wirksam erst nach echtem Notebook-Neustart; weiter beobachten ob die neuen Budgets zu mehr echten 429-Fehlern fuehren und ob die 1h-Leerlaufphasen seltener werden.</w:t>
       </w:r>
     </w:p>
     <w:sectPr>

</xml_diff>

<commit_message>
Zeitzonen-Anzeige in Signal-E-Mails korrigiert + Nacht-Auswertung dokumentiert
Signal-E-Mails zeigten den rohen UTC-Zeitstempel (signal.created_at) ohne
Umrechnung auf lokale Zeit - wirkte wie eine ~2-Stunden-Verzoegerung
zwischen Berechnung und Mail-Versand (CEST = UTC+2), war aber nur ein
Anzeige-Fehler. Neue Funktion _formatiere_zeitpunkt_lokal() ersetzt die
rohe String-Slicing-Logik an allen 3 betroffenen Stellen.

Zusaetzlich Ergebnisse der ersten Nacht mit der neuen Fallback-Reihenfolge
dokumentiert: Mistral bedient seither jeden Kandidaten fehlerfrei, Zai wird
nicht mehr erreicht, keine Leerlaufphasen mehr sichtbar. Zweiter Zai-
Live-Test zeigt weiterhin unzuverlaessige Antwortzeiten (Timeout bei 150s).

Co-Authored-By: Claude Sonnet 5 <noreply@anthropic.com>
</commit_message>
<xml_diff>
--- a/Basisinfos/Regelwerksmanual.docx
+++ b/Basisinfos/Regelwerksmanual.docx
@@ -13766,6 +13766,34 @@
     <w:p>
       <w:r>
         <w:t>Verifikation: Reihenfolge-Aenderung in allen 3 Tiers bestaetigt. Syntax-Check aller 4 geaenderten Python-/YAML-Dateien fehlerfrei. _verteile_budget() mit synthetischem Ausreissertag getestet (20 Hebel + 15 Marktscan + 84 faellige Spot-Kandidaten = 119 gesamt): mit dem alten B=90 waeren Spot-Kandidaten auf 55 gekappt worden, mit B=180 bekommen alle 119 einen LLM-Versuch. Offen: wirksam erst nach echtem Notebook-Neustart; weiter beobachten ob die neuen Budgets zu mehr echten 429-Fehlern fuehren und ob die 1h-Leerlaufphasen seltener werden.</w:t>
+      </w:r>
+    </w:p>
+    <w:p>
+      <w:pPr>
+        <w:pStyle w:val="Heading3"/>
+      </w:pPr>
+      <w:r>
+        <w:t>Nachtrag (2026-07-21, Vormittag): Erste Nacht-Auswertung + BUGFIX Zeitzonen-Anzeige in Signal-E-Mails + zweiter Zai-Datenpunkt</w:t>
+      </w:r>
+    </w:p>
+    <w:p>
+      <w:r>
+        <w:t>Nacht-Auswertung (frischer extract_notebook_diagnose.py-Export, ca. 9,5 Std. nach dem Neustart, Fokus letzte 6 Std.): Die Umstellung wirkt wie gedacht. Letzter zai-Call-Fehlschlag im gesamten Log war um 21:57 Uhr - noch mit dem ALTEN Code (Timeout=60, Zai zuerst). Danach: kein einziger Zai-Versuch mehr trotz durchgehender Aktivitaet, weil Zai jetzt hinten steht und Mistral seither JEDEN Kandidaten sofort erfolgreich bedient (alle stichprobenartig geprueften Hebel-/Spot-Signale der letzten 6 Std. zeigen llm_model: mistral:mistral-small-2506, keine Mistral-Fehlschlaege, kein 429, Tageszaehler von 3 - nach UTC-Mitternachts-Reset - auf 25 bis 06:18 Uhr, deutlich unter dem neuen 400er-Deckel). Groq/Gemini: 0 Calls, nicht wegen Erschoepfung sondern weil Mistral nie fehlschlaegt. Keine 1h-Leerlaufphasen mehr sichtbar - alle Budget-Allocator-Zusammenfassungszeilen liegen durchgehend ca. 15 Minuten auseinander.</w:t>
+      </w:r>
+    </w:p>
+    <w:p>
+      <w:r>
+        <w:t>BUGFIX Zeitzonen-Anzeige in Signal-E-Mails (Nutzer-Fund): eine Hebel-E-Mail (KAIA ERÖFFNEN) zeigte 'Berechnet: 2026-07-21 01:17' im Mail-Body, waehrend der Gmail-Header den Empfang um 03:18 Uhr (lokale Zeit) auswies - wirkte wie eine 2-Stunden-Verzoegerung zwischen Berechnung und Versand. Tatsaechlich war signal.created_at in der DB korrekt als UTC gespeichert (01:17:44+00:00 = 03:17:44 lokal, CEST = UTC+2) - der Mail-Text zeigte aber den rohen UTC-String OHNE Umrechnung (signal.created_at[:16].replace('T', ' '), an 3 Stellen in scheduler/background.py identisch). Kein echtes Latenzproblem, reiner Anzeige-Bug. Fix: neue Funktion _formatiere_zeitpunkt_lokal() (datetime.fromisoformat(...).astimezone().strftime(...), konvertiert auf die lokale Systemzeitzone) ersetzt alle 3 Vorkommen. Wichtig: dieser Fund betrifft NICHT die andere, echte Beobachtung vom Vorabend (Marktscan-Discovery 16:00 Uhr vs. Signal 19:30 Uhr) - das ist ein separater, weiterhin ungeloester Mechanismus (Warteschlange im Budget-Allocator), kein Zeitzonen-Darstellungsfehler.</w:t>
+      </w:r>
+    </w:p>
+    <w:p>
+      <w:r>
+        <w:t>Zweiter Zai-Realdaten-Punkt (Desktop-Live-Test, gleiche realistische Payload wie am Vorabend): GLM-4.5-Flash, das am Vorabend noch nach 109,2s erfolgreich geantwortet hatte, schaffte es diesmal NICHT innerhalb von 150s (ReadTimeout nach 150,8s). GLM-4.7-Flash ebenfalls Timeout nach 150,6s. Die Antwortzeiten sind also nicht stabiler/schneller geworden, eher volatiler - bestaetigt die Entscheidung, Zai nur noch als letzte, selten erreichte Stufe zu fuehren.</w:t>
+      </w:r>
+    </w:p>
+    <w:p>
+      <w:r>
+        <w:t>Verifikation: _formatiere_zeitpunkt_lokal() funktional getestet (UTC 2026-07-21T01:17:44...+00:00 -&gt; lokal 2026-07-21 03:17, None -&gt; '-', kaputter String -&gt; Fallback auf alte Slicing-Logik). Syntax-Check von scheduler/background.py fehlerfrei.</w:t>
       </w:r>
     </w:p>
     <w:sectPr>

</xml_diff>

<commit_message>
LLM-Alternative-Recherche Runde 3+4 dokumentiert: 32 Kandidaten insgesamt verworfen
Kette bleibt Mistral -> Groq -> Gemini -> Z.ai. Bemerkenswertester Fund war
Nebius AI Studio (beste Vertragsbedingungen der gesamten Recherche,
automatische Rate-Limit-Skalierung ohne Bezahlpflicht, GDPR-nativ, kein
Trainings-Nutzung der Kundendaten) - scheiterte an zwingender Kreditkarten-
Angabe beim Signup. Suche fuer diese Session auf Nutzer-Wunsch beendet.

Co-Authored-By: Claude Sonnet 5 <noreply@anthropic.com>
</commit_message>
<xml_diff>
--- a/Basisinfos/Regelwerksmanual.docx
+++ b/Basisinfos/Regelwerksmanual.docx
@@ -13794,6 +13794,34 @@
     <w:p>
       <w:r>
         <w:t>Verifikation: _formatiere_zeitpunkt_lokal() funktional getestet (UTC 2026-07-21T01:17:44...+00:00 -&gt; lokal 2026-07-21 03:17, None -&gt; '-', kaputter String -&gt; Fallback auf alte Slicing-Logik). Syntax-Check von scheduler/background.py fehlerfrei.</w:t>
+      </w:r>
+    </w:p>
+    <w:p>
+      <w:pPr>
+        <w:pStyle w:val="Heading3"/>
+      </w:pPr>
+      <w:r>
+        <w:t>Nachtrag (2026-07-21): Groq-Alternative-Recherche Runde 3+4 abgeschlossen - 32 Kandidaten insgesamt verworfen, Suche vorerst beendet</w:t>
+      </w:r>
+    </w:p>
+    <w:p>
+      <w:r>
+        <w:t>Ausgeloest durch Zais enttaeuschende erste Nacht, vom Nutzer bewusst NICHT nach dem ersten Fehlschlag abgebrochen ('Runde nicht vorbei, nur durch Fehlschlag unterbrochen'), spaeter fortgesetzt bis zu einem selbst gesetzten Budget ('noch ca. 5 Kandidaten, dann Schluss fuer heute'). Runde 3 (7 Kandidaten: Vercel AI Gateway, OpenCode Zen, OVHcloud AI Endpoints, SambaNova-Re-Check, Moonshot/Kimi, MiniMax, SiliconFlow) und Runde 4 (10 Kandidaten: xAI-Re-Check, Scaleway, AI21 Labs, Fireworks AI, Nebius AI Studio, StepFun, 01.AI/Yi, Poe API, Reka AI, Baidu Qianfan/ERNIE) - alle Details in Memory project_groq_alternative_recherche_2026-07-20.</w:t>
+      </w:r>
+    </w:p>
+    <w:p>
+      <w:r>
+        <w:t>Bemerkenswertester Fund: Nebius AI Studio (Nebius B.V., Amsterdam, Nasdaq-gelistet) - qualitativ die besten Vertragsbedingungen der gesamten Recherche: automatische Rate-Limit-Skalierung basierend auf echter Nutzung statt Bezahlung, GDPR-nativ, ToS woertlich 'Nebius will not use Customer Content to train Nebius Models'. Scheiterte trotzdem am selben harten Ausschlusskriterium wie fast alle anderen Kandidaten dieser beiden Runden: eine Kreditkarte ist fuer den Signup zwingend ('$0 authorization to verify the card'). Nutzer hat den Schritt bewusst abgebrochen, keine Kartendaten eingegeben.</w:t>
+      </w:r>
+    </w:p>
+    <w:p>
+      <w:r>
+        <w:t>Durchgaengiges Muster ueber beide Runden: praktisch jeder gepruefte Kandidat gehoert zu einer von drei Kategorien - (1) reiner Einmal-Trial statt dauerhaftem Free-Tier (Scaleway, AI21, Fireworks, StepFun, Reka, Moonshot), (2) Kreditkarte/Zahlungsmethode zwingend fuer brauchbare Limits (Vercel, OVHcloud, SiliconFlow, Nebius), oder (3) struktureller Zugangs-Ausschluss (Baidu: chinesische Mobilfunk-nummer noetig, wie schon Alibaba/Qwen in Runde 2).</w:t>
+      </w:r>
+    </w:p>
+    <w:p>
+      <w:r>
+        <w:t>Status: Kette bleibt Mistral -&gt; Groq -&gt; Gemini -&gt; Z.ai. Suche fuer diese Session auf Nutzer-Wunsch beendet. Revisit-Bedingung: entweder ein Anbieter mit echtem Dauer-Free-Tier ohne Kreditkarte/China-Telefon/Umsatzschwelle taucht auf, oder Nebius bietet irgendwann einen Signup-Pfad ohne Kreditkarten-Pflicht an.</w:t>
       </w:r>
     </w:p>
     <w:sectPr>

</xml_diff>

<commit_message>
Zai-Root-Cause geklaert: Kontextlaengen-Drosselung >8K + Generierungsgeschwindigkeit als zweite Bremse
Empirisch bestaetigt (test_zai_context_length_hypothesis.py,
test_zai_speed_isolation.py): Anfragen ueber 8K Token werden auf 1%
Concurrency gedrosselt (kompletter Timeout), aber selbst darunter ist
die reine Textgenerierung mit ~34 Tokens/Sekunde der eigentliche
Flaschenhals (~5s Prompt-Verarbeitung vs. ~100s fuer eine volle
Signal-Antwort). "Last used: Not used" im Dashboard durch offizielle
Z.ai-FAQ als dokumentierte n-1-Verzoegerung im Billing-System erklaert,
kein eigener Fehler. Keine Code-Aenderung noetig, Zai bleibt bewusst
letzte Rueckfallstufe.
</commit_message>
<xml_diff>
--- a/Basisinfos/Regelwerksmanual.docx
+++ b/Basisinfos/Regelwerksmanual.docx
@@ -13822,6 +13822,49 @@
     <w:p>
       <w:r>
         <w:t>Status: Kette bleibt Mistral -&gt; Groq -&gt; Gemini -&gt; Z.ai. Suche fuer diese Session auf Nutzer-Wunsch beendet. Revisit-Bedingung: entweder ein Anbieter mit echtem Dauer-Free-Tier ohne Kreditkarte/China-Telefon/Umsatzschwelle taucht auf, oder Nebius bietet irgendwann einen Signup-Pfad ohne Kreditkarten-Pflicht an.</w:t>
+      </w:r>
+    </w:p>
+    <w:p>
+      <w:pPr>
+        <w:pStyle w:val="Heading3"/>
+      </w:pPr>
+      <w:r>
+        <w:t>Nachtrag (2026-07-21, Nachmittag): Zai-Root-Cause endgueltig geklaert - Kontextlaengen-Drosselung &gt;8K Token</w:t>
+      </w:r>
+    </w:p>
+    <w:p>
+      <w:r>
+        <w:t>Nutzer entdeckte auf der Z.ai-'Rate Limits'-Dashboardseite einen bisher uebersehenen Erklaerungstext: 'To ensure stable access to GLM-4-Flash during the free trial, requests with context lengths over 8K will be throttled to 1% of the standard concurrency limit.' Das erklaert die seit zwei Tagen beobachteten Zai-Probleme (2/2 Timeouts erste Nacht, 109,2s-Erfolg vs. 150s-Doppel-Timeout am naechsten Vormittag) potenziell vollstaendig - keine allgemeine Modell-Langsamkeit, sondern eine gezielte Drosselung ab einer bestimmten Kontextgroesse.</w:t>
+      </w:r>
+    </w:p>
+    <w:p>
+      <w:r>
+        <w:t>Gezielter Vergleichstest (test_zai_context_length_hypothesis.py, identischer echter SYSTEM_PROMPT aus hebel_analyst.py, einmal mit kleinem, einmal mit auf &gt;8K Token aufgeblaehtem Facts-Payload, glm-4.5-flash, 150s Timeout) bestaetigt die These eindeutig: Klein (echte 3.910 Prompt-Tokens laut API-usage-Feld, unter 8K) - Erfolg nach 105,9s, deckt sich mit dem 109,2s-Erfolgswert vom Vorabend. Gross (&gt;8K Token) - kompletter ReadTimeout nach den vollen 150s, keine Antwort.</w:t>
+      </w:r>
+    </w:p>
+    <w:p>
+      <w:r>
+        <w:t>Praktische Einordnung: Unser Hebel-SYSTEM_PROMPT allein ist bereits ~11.761 Zeichen (~3.360 Token geschaetzt), der Spot-SYSTEM_PROMPT sogar ~18.119 Zeichen (~5.177 Token geschaetzt) - bei echten Facts-Payloads mit vollem Kontext rutscht man damit speziell bei Spot- und umfangreicheren Hebel-Signalen plausibel regelmaessig ueber die 8K-Grenze.</w:t>
+      </w:r>
+    </w:p>
+    <w:p>
+      <w:r>
+        <w:t>Entscheidung: keine Code-Aenderung. Ein Zai-spezifischer gekuerzter Prompt wuerde den Aufwand nicht rechtfertigen, da Zai ohnehin nur die seltenste letzte Rueckfallstufe ist (Mistral bedient real praktisch die gesamte Last). Root-Cause-Recherche hiermit abgeschlossen.</w:t>
+      </w:r>
+    </w:p>
+    <w:p>
+      <w:r>
+        <w:t>Nebenbefund - Dashboard-Anomalie 'Last used: Not used' geklaert: der API-Key ('TIT') zeigte durchgehend 'Last used: Not used', obwohl mehrfach echte, erfolgreich abgeschlossene Testcalls liefen (inkl. des obigen Kleinpayload-Calls mit echten usage-Daten). Komplette Dashboard-Seitenleiste durchgeprueft (Account, Rate Limits, GLM Coding Plan/My Plan/Usage, API Keys, Billing) plus oberer 'API'-Navigationspunkt - 'My Plan'/'Usage' gehoeren nachweislich zu einem anderen Produkt (GLM Coding Plan, IDE-Abo), 'Billing' zeigt nur $0-Bilanz. Auch nach dem definitiv erfolgreichen Testcall weiterhin 'Not used' - damit endgueltig als kosmetische Z.ai-Dashboard-Einschraenkung eingeordnet, ohne Auswirkung auf unser eigenes DB-basiertes Budget-Tracking. Investigation abgeschlossen.</w:t>
+      </w:r>
+    </w:p>
+    <w:p>
+      <w:r>
+        <w:t>Bestaetigung durch offizielle Z.ai-FAQ (docs.z.ai/help/faq), Frage 'Why hasn't my account balance changed after I used the API?': 'The billing history reflect daily consumption records, and therefore display the billing status from the previous day (n-1). Current day consumption will not be immediately visible in the billing details' (zusaetzlich: 'there is currently a processing delay in our billing system'). Offizielle Bestaetigung einer generellen n-1-Verzoegerung im gesamten Billing-/Nutzungssystem - unser Key wurde erst 2026-07-20 abends angelegt, 'Not used' ist damit die dokumentierte Verzoegerung, kein Fehler.</w:t>
+      </w:r>
+    </w:p>
+    <w:p>
+      <w:r>
+        <w:t>Nachtrag - Isolationstest bestaetigt zweite, unabhaengige Bremse: Generierungsgeschwindigkeit selbst. Nutzer hinterfragte zurecht, warum selbst der erfolgreiche Kleinpayload-Call (unter 8K) noch 105,9s brauchte. Gezielter Isolationstest (test_zai_speed_isolation.py, identischer Prompt ~3.866 Token, aber max_tokens=20 erzwungen statt voller Antwort): Erfolg nach nur 5,1s. Damit klar getrennt: Prompt-Verarbeitung/Warteschlange ist schnell (~5s fuer ~3.900 Token Input), die reine Text-Generierung ist der Flaschenhals (~34-35 Tokens/Sekunde). Das heisst: selbst ein perfekt unter 8K gehaltener Prompt waere bei uns real weiterhin ~100s+ langsam, weil unser Signal-Schema lange strukturierte JSON-Antworten verlangt - die Langsamkeit ist NICHT nur kontextlaengenabhaengig, sondern eine zweite, unabhaengige Bremse der Generierungsgeschwindigkeit auf dem kostenlosen Tier. Bestaetigt die Entscheidung (Zai bleibt letzte, selten gebrauchte Rueckfallstufe) noch eindeutiger - Prompt-Kuerzung allein wuerde das Problem nicht loesen.</w:t>
       </w:r>
     </w:p>
     <w:sectPr>

</xml_diff>

<commit_message>
Regelwerksmanual: Methodik-Nachtrag zu SLA-Redesign (Backtest-first + harte Garantie statt Soft-Boost)
Co-Authored-By: Claude Sonnet 5 <noreply@anthropic.com>
</commit_message>
<xml_diff>
--- a/Basisinfos/Regelwerksmanual.docx
+++ b/Basisinfos/Regelwerksmanual.docx
@@ -13931,6 +13931,34 @@
     <w:p>
       <w:r>
         <w:t>Verifikation: Unit-Test _priorisiere_nach_wartezeit() (Ueberfaellige zuerst, Normale behalten Reihenfolge, keine Kandidaten verloren). Info-Leichen-Regressionstest (Paar mit 60h durchgehender Requalifizierung, 241 Zeilen) - verfaellt jetzt korrekt, waere mit der alten Logik nie verfallen. End-to-End-Trockenlauf gegen die echte Desktop-DB-Kopie (alle LLM-/Netzwerk-Clients=None, garantiert kein echter Call) - kompletter Durchlauf ohne Exception, neue Log-Zeile zeigt korrekt 'ueberfaellig=1' fuer den einzigen vorhandenen Hebel-Kandidaten (FLOKI SHORT).</w:t>
+      </w:r>
+    </w:p>
+    <w:p>
+      <w:pPr>
+        <w:pStyle w:val="Heading4"/>
+      </w:pPr>
+      <w:r>
+        <w:t>Methodik dieser Runde (als Vorgehens-Standard fuer kuenftige aehnliche Faelle festgehalten)</w:t>
+      </w:r>
+    </w:p>
+    <w:p>
+      <w:r>
+        <w:t>1. Harte Garantie statt Soft-Boost bei systemischen Verzoegerungs-/Fairness-Problemen. Ein 'Prioritaet nach Wartezeit leicht erhoehen'-Vorschlag wurde vom Nutzer explizit verworfen, weil er das Problem nur abschwaecht, nicht strukturell begrenzt. Stattdessen: strukturelles Zwei-Klassen-Modell (ueberfaellig immer zuerst, FIFO untereinander; normal unveraendert) - echte Obergrenze statt Wahrscheinlichkeits-Vorteil. Leitplanke fuer jede kuenftige Priorisierungs-/Scheduling-Aenderung in diesem Projekt.</w:t>
+      </w:r>
+    </w:p>
+    <w:p>
+      <w:r>
+        <w:t>2. Historischer Backtest gegen echte Produktionsdaten ist ein verpflichtendes Gate VOR jeder Aenderung an produktivem Entscheidungscode (Budget-Allocator, Risk-Gate, Scoring o.ae.) - nicht optional, nicht nachtraeglich. Erst nach Ruecksprache zu den Backtest-Ergebnissen begann die eigentliche Code-Aenderung.</w:t>
+      </w:r>
+    </w:p>
+    <w:p>
+      <w:r>
+        <w:t>3. Eine einzige Quelle der Wahrheit fuer Backtest und Live-Betrieb: die neuen Wartezeit-Funktionen bekamen einen optionalen as_of-Parameter, damit der Backtest exakt dieselbe Produktionslogik mit einem Zeitpunkt aus der Vergangenheit aufruft - kein separat gepflegter Simulations-Nachbau, der unbemerkt auseinanderlaufen koennte.</w:t>
+      </w:r>
+    </w:p>
+    <w:p>
+      <w:r>
+        <w:t>4. Nutzer-Skepsis gegenueber einer 'harmlosen' Erklaerung ernst nehmen und tiefer graben, statt sie als Datensparsamkeit abzutun. Die Beobachtung 'immer dieselben Coins (APE/EIGEN)' wurde zunaechst als plausible Folge duenner Marktscan-Historie eingeordnet - der Nutzer wies das explizit zurueck und verlangte eine echte Mechanik-Pruefung. Das deckte den zweiten, unabhaengigen Dedup-Bug auf.</w:t>
       </w:r>
     </w:p>
     <w:sectPr>

</xml_diff>

<commit_message>
Abschnitt 4 des SLA-Redesigns: Wartezeit-Transparenz in Hebel/Marktscan-Tab + Hebel-E-Mails
Zeigt die wahre Wartezeit seit Erstkandidatur live an (Tooltip in
ui/hebel_view.py + ui/marktscan_view.py, neue Zeile in
_notify_hebel_signal()), damit der Fix aus dem SLA-Redesign fuer den
Nutzer sichtbar wird. Bewusst nicht in _notify_spot_signal(), da Tier 3
(Spot-Rotation) keine Kandidatur-Historie hat.

Co-Authored-By: Claude Sonnet 5 <noreply@anthropic.com>
</commit_message>
<xml_diff>
--- a/Basisinfos/Regelwerksmanual.docx
+++ b/Basisinfos/Regelwerksmanual.docx
@@ -13959,6 +13959,39 @@
     <w:p>
       <w:r>
         <w:t>4. Nutzer-Skepsis gegenueber einer 'harmlosen' Erklaerung ernst nehmen und tiefer graben, statt sie als Datensparsamkeit abzutun. Die Beobachtung 'immer dieselben Coins (APE/EIGEN)' wurde zunaechst als plausible Folge duenner Marktscan-Historie eingeordnet - der Nutzer wies das explizit zurueck und verlangte eine echte Mechanik-Pruefung. Das deckte den zweiten, unabhaengigen Dedup-Bug auf.</w:t>
+      </w:r>
+    </w:p>
+    <w:p>
+      <w:pPr>
+        <w:pStyle w:val="Heading3"/>
+      </w:pPr>
+      <w:r>
+        <w:t>Nachtrag (2026-07-21): Abschnitt 4 - Wartezeit-Transparenz in UI + E-Mail</w:t>
+      </w:r>
+    </w:p>
+    <w:p>
+      <w:r>
+        <w:t>Letzter Baustein des Plans (swift-napping-muffin.md): der Nutzer soll die neue SLA-Logik nicht nur an weniger Verzoegerung erkennen, sondern die wahre Wartezeit auch direkt einsehen koennen - konsistent mit dem bereits etablierten Anzeige-Prinzip (_formatiere_zeitpunkt_lokal()): reine Anzeige, nie ein neuer LLM-Fakt.</w:t>
+      </w:r>
+    </w:p>
+    <w:p>
+      <w:r>
+        <w:t>ui/hebel_view.py/ui/marktscan_view.py: Mouseover-Tooltip (nicht neue Spalte, ui/row_tooltip.py-Muster wie in regime_view.py/thesen_view.py) auf noch unbearbeiteten Kandidaten-Zeilen, live berechnet bei jedem Refresh ueber get_hebel_wartezeit_stunden_je_paar()/get_marktscan_wartezeit_stunden_je_coin() - kein neues DB-Feld.</w:t>
+      </w:r>
+    </w:p>
+    <w:p>
+      <w:r>
+        <w:t>scheduler/background.py::_notify_hebel_signal(): neuer optionaler conn_factory-Parameter, Zeile 'Wartezeit seit Erstkandidatur: Xh' neben 'Berechnet: ... Anbieter: ...'. Bewusst NICHT in _notify_spot_signal() ergaenzt (Abweichung von der urspruenglichen Plan-Formulierung, nach Code-Pruefung korrigiert): Tier 3 (Spot-Rotation) hat keine Kandidatur-Historie wie Hebel/Marktscan - eine Wartezeit-seit-Erstkandidatur ist dort konzeptionell nicht definiert. Marktscan-Kaufkandidaten (Tier 2) erzeugen ohnehin kein Signal-Objekt und werden bereits bisher nicht per E-Mail benachrichtigt - unveraendert.</w:t>
+      </w:r>
+    </w:p>
+    <w:p>
+      <w:r>
+        <w:t>Verifikation: Tk-Smoke-Test beider Views gegen eine echte DB-Kopie (FLOKI/SHORT-Tooltip zeigt korrekt 177,8h) + synthetischer E-Mail-Test.</w:t>
+      </w:r>
+    </w:p>
+    <w:p>
+      <w:r>
+        <w:t>Nebenbefund waehrend der Verifikation: der End-to-End-Trockenlauf aus Abschnitt 2+3 hatte db.DB_PATH nie auf eine Kopie umgebogen und dadurch versehentlich einen echten Gate-Fail-HALTEN-Datensatz (FLOKI/SHORT, kein LLM-Call/keine Kosten) in die echte lokale Desktop-DB geschrieben. Nutzer entschied sich fuer Bereinigung, Zeile wurde nach Bestaetigung geloescht. Lehre: Verifikationsskripte gegen Produktivdaten IMMER db.DB_PATH explizit auf eine Kopie umbiegen, nie den Default-Pfad implizit verwenden.</w:t>
       </w:r>
     </w:p>
     <w:sectPr>

</xml_diff>

<commit_message>
Historische-Trefferquote-Risikofaktor deterministisch + Provider-Performance-Karte verstaendlicher
Kleine Stichprobe (n<15) erscheint jetzt immer als eigener Risikofaktor in
Abschnitt 3, statt darauf zu vertrauen dass das LLM den mitgelieferten
Hinweis im freien Gegenargument-Text erwaehnt - ausgeloest durch das erste
echte BTC-Hebel-Signal, dessen 0%-Trefferquote (n=5) ohne Stichproben-
Hinweis im Text landete. Provider-Performance-Karte auf der Remote-Seite
bekommt erklaerende Untertitel + einen begruendeten Leerzustand statt
kommentarlosem "keine Daten".

Co-Authored-By: Claude Sonnet 5 <noreply@anthropic.com>
</commit_message>
<xml_diff>
--- a/Basisinfos/Regelwerksmanual.docx
+++ b/Basisinfos/Regelwerksmanual.docx
@@ -13992,6 +13992,29 @@
     <w:p>
       <w:r>
         <w:t>Nebenbefund waehrend der Verifikation: der End-to-End-Trockenlauf aus Abschnitt 2+3 hatte db.DB_PATH nie auf eine Kopie umgebogen und dadurch versehentlich einen echten Gate-Fail-HALTEN-Datensatz (FLOKI/SHORT, kein LLM-Call/keine Kosten) in die echte lokale Desktop-DB geschrieben. Nutzer entschied sich fuer Bereinigung, Zeile wurde nach Bestaetigung geloescht. Lehre: Verifikationsskripte gegen Produktivdaten IMMER db.DB_PATH explizit auf eine Kopie umbiegen, nie den Default-Pfad implizit verwenden.</w:t>
+      </w:r>
+    </w:p>
+    <w:p>
+      <w:pPr>
+        <w:pStyle w:val="Heading3"/>
+      </w:pPr>
+      <w:r>
+        <w:t>Nachtrag (2026-07-21): Historische-Trefferquote-Risikofaktor + Provider-Performance-Karte verstaendlicher</w:t>
+      </w:r>
+    </w:p>
+    <w:p>
+      <w:r>
+        <w:t>Anlass: erstes BTC-LONG-Hebel-Signal, dessen Gegenargument die historische Erfolgsquote (0%) nannte, aber den mitgelieferten Stichprobengroessen-Hinweis (nur 5 aufgeloeste Hebel-Signale bisher) nicht erwaehnte, obwohl der SYSTEM_PROMPT das Modell explizit dazu anweist. Gleiches Prinzip wie beim AVAX-Fund: Modell-Interpretation nicht dem Zufall ueberlassen.</w:t>
+      </w:r>
+    </w:p>
+    <w:p>
+      <w:r>
+        <w:t>hebel_risk_gate.py::compute_risikofaktoren_hebel(): neuer Parameter historische_erfolgsquote (+ min_sample_fuer_aussage, Default 15). Bei anzahl_ausgewertete_signale &lt; 15 erscheint IMMER ein neutraler Risikofaktor 'Historische Trefferquote X% (n=Y)' mit Stichproben-Hinweis, unabhaengig vom LLM-Freitext. Bei ausreichender Stichprobe wird die Quote als positiv/neutral/negativ bewertet (Schwellen 30%/60%). Verifiziert per 3 synthetischen Faellen.</w:t>
+      </w:r>
+    </w:p>
+    <w:p>
+      <w:r>
+        <w:t>Provider-Performance-Karte (remote/server.py): erklaerender Untertitel unter beiden Karten (Spot/Hebel), was die Kennzahl bedeutet und warum sie getrennt ist. Leerer Zustand nennt jetzt den Grund statt nur 'keine Daten'. Jede Provider-Zeile mit anzahl_resolved &lt; 15 bekommt denselben Stichproben-Hinweis wie beim neuen Hebel-Risikofaktor.</w:t>
       </w:r>
     </w:p>
     <w:sectPr>

</xml_diff>

<commit_message>
LINK-Hebel-Review: Antizyklisch-Regelverstoss + Funding-Rate-Rohfloat behoben
Echter LINK LONG-Signal-Review deckte zwei Bugs auf: Regel 8 verbot bisher
nur EXTREME gleichgerichtete Retail-Mehrheiten als Stuetze-Argument, eine
moderate (63,5%) Mehrheit wurde trotzdem faelschlich als Stuetze formuliert -
Regel 8 um konkretes Gegenbeispiel verschaerft. Zudem erschien die rohe
Funding-Rate als unformatierter Python-Float (wissenschaftliche Notation) im
Nutzer-Text - jetzt gerundeter Prozentwert mit Zeiteinheit, plus neuer
deterministischer "Funding-Kosten"-Risikofaktor mit konkretem USD/Tag-Betrag
aus der tatsaechlichen Positionsgroesse.

Co-Authored-By: Claude Sonnet 5 <noreply@anthropic.com>
</commit_message>
<xml_diff>
--- a/Basisinfos/Regelwerksmanual.docx
+++ b/Basisinfos/Regelwerksmanual.docx
@@ -14076,6 +14076,34 @@
     <w:p>
       <w:r>
         <w:t>Verifikation: synthetischer Test gegen die echten Produktivfunktionen (nicht nur Backtest-Kopien) reproduziert die zentralen Faelle, plus echter End-to-End-Lauf von run_backward_tracking()/run_hebel_backward_tracking() gegen eine Kopie der Desktop-DB.</w:t>
+      </w:r>
+    </w:p>
+    <w:p>
+      <w:pPr>
+        <w:pStyle w:val="Heading3"/>
+      </w:pPr>
+      <w:r>
+        <w:t>Nachtrag (2026-07-22): Zwei weitere echte Funde aus einem LINK-Hebel-Signal (Antizyklisch-Regelverstoss + Funding-Rate-Rohfloat)</w:t>
+      </w:r>
+    </w:p>
+    <w:p>
+      <w:r>
+        <w:t>Ausloeser: Nutzer teilte einen echten LINK LONG ERÖFFNEN-Vorschlag zur fachlichen Begutachtung. Zwei zusaetzliche, unabhaengige Funde neben der eigentlichen inhaltlichen Bewertung (fuenf Warnsignale gegen nur ein Pluspunkt, u.a. Bear-Forecast 50% &gt; Bull-Forecast 25% trotz LONG-Empfehlung, Regime-Konflikt, niedrige Konfidenz 50%).</w:t>
+      </w:r>
+    </w:p>
+    <w:p>
+      <w:r>
+        <w:t>1. Antizyklisch-Regelverstoss trotz bestehender Regel (Regel 8, hebel_analyst.py): ein Top-Grund lautete 'Long-Konten-Anteil von 63,5% zeigt eine moderate Positionierung, was Raum für eine Erholung lässt' - als Stuetze fuer die eigene LONG-Empfehlung formuliert, obwohl 63,5% bereits eine (nicht-extreme) Mehrheit IN DERSELBEN Richtung ist. Ein frueheres Signal desselben Tages formulierte denselben Fakt korrekt neutral - die Regel kann also befolgt werden, wird es nur nicht zuverlaessig. Fix: Regel 8 um ein konkretes Gegenbeispiel ergaenzt, das explizit auch den moderaten (nicht-extremen) Fall verbietet. Reine Prompt-Verschaerfung - die bestehende deterministische Retail-Konsens-Bewertung in Abschnitt 3 bleibt die verlaessliche Quelle.</w:t>
+      </w:r>
+    </w:p>
+    <w:p>
+      <w:r>
+        <w:t>2. Funding-Rate als unformatierter Rohfloat im Risiken-Text: '2.624963888888792e-06' erschien direkt beim Nutzer, weil der rohe Python-Float unformatiert an das LLM gereicht und von diesem unveraendert kopiert wurde. Fix in zwei Teilen: a) hebel_analyst.py uebergibt den Fakt jetzt als gerundeten Prozentwert mit Zeiteinheit im Feldnamen. b) Nach Nutzer-Nachfrage (reine Prozentzahl ohne Kontext vs. EUR/Zeiteinheit) wurde ein neuer deterministischer Risikofaktor 'Funding-Kosten' ergaenzt (hebel_risk_gate.py::compute_risikofaktoren_hebel()) - Fakt zuerst (Rate mit Zeiteinheit), Wertung danach (konkreter USD/Tag-Betrag bei der tatsaechlichen Positionsgroesse, klar als Momentaufnahme benannt). Neue Schwelle risiko.hebel.funding_rate_hoch_schwelle_relativ_stunde (0.0001) faerbt den Faktor ab dieser Rate negativ statt neutral.</w:t>
+      </w:r>
+    </w:p>
+    <w:p>
+      <w:r>
+        <w:t>Verifikation: synthetischer Test bestaetigt keine wissenschaftliche Notation mehr im Text, korrekte USD/Tag-Berechnung, Schwellenwert-Verhalten, kein Faktor ohne vorhandenen Fakt, echter End-to-End-Lauf von post_check_hebel() sowie Regressionstest der vorherigen Retail-Konsens-/CRV-Fixes weiterhin gruen.</w:t>
       </w:r>
     </w:p>
     <w:sectPr>

</xml_diff>

<commit_message>
Hebel: Alt-Coin-Marktphase-Regel nachgeruestet (echter VIRTUAL-Fund)
Ein LONG-Signal fuer einen Alt-Coin waehrend btc_matrix=='baer_flucht' (BTC
faellt, Dominanz steigt) wurde vom LLM zwar richtig als Risiko erkannt, aber
nur aus eigenem Wissen - das System uebergab bisher nur das nackte Label
ohne Erklaerung und hatte keine SYSTEM_PROMPT-Regel dazu, obwohl die
Spot-Pipeline diese Sorgfalt bereits seit laengerem kennt. Jetzt zieht die
Hebel-Pipeline nach: btc_matrix_hinweis + asset.rolle als Fakt, neue Regel 16
im Prompt, plus deterministischer "Alt-Coin-Marktphase"-Risikofaktor (Text
1:1 aus der bestehenden regime.py-Beschreibung uebernommen).

Co-Authored-By: Claude Sonnet 5 <noreply@anthropic.com>
</commit_message>
<xml_diff>
--- a/Basisinfos/Regelwerksmanual.docx
+++ b/Basisinfos/Regelwerksmanual.docx
@@ -14104,6 +14104,34 @@
     <w:p>
       <w:r>
         <w:t>Verifikation: synthetischer Test bestaetigt keine wissenschaftliche Notation mehr im Text, korrekte USD/Tag-Berechnung, Schwellenwert-Verhalten, kein Faktor ohne vorhandenen Fakt, echter End-to-End-Lauf von post_check_hebel() sowie Regressionstest der vorherigen Retail-Konsens-/CRV-Fixes weiterhin gruen.</w:t>
+      </w:r>
+    </w:p>
+    <w:p>
+      <w:pPr>
+        <w:pStyle w:val="Heading3"/>
+      </w:pPr>
+      <w:r>
+        <w:t>Nachtrag (2026-07-22): Alt-Coin-Marktphase fehlte im Hebel-Regelwerk (echter VIRTUAL-Fund)</w:t>
+      </w:r>
+    </w:p>
+    <w:p>
+      <w:r>
+        <w:t>Ausloeser: ein weiteres echtes Signal (VIRTUAL LONG ERÖFFNEN, Mistral) zur fachlichen Begutachtung. Das Gegenargument des LLM nannte korrekt 'Regime (baer_flucht)' als staerksten Einwand - Nachforschung ergab: baer_flucht ist kein Wert des einfachen Baer/Bulle-Regimes, sondern ein separates Label der BTC-Dominanz-Matrix (agent/krypto/regime.py:: BTC_MATRIX), das explizit dokumentiert 'Alt-Ausbrueche meist Fallen - erhoehte Vorsicht bei Alt-Kaufsignalen'. VIRTUAL ist ein Alt-Coin, also genau der Fall, fuer den diese Warnung gedacht ist.</w:t>
+      </w:r>
+    </w:p>
+    <w:p>
+      <w:r>
+        <w:t>Fund: die Spot-Pipeline (analyst.py Regel 8) kennt diese Regel bereits seit laengerem und uebergibt sowohl das Label als auch die erklaerende Beschreibung als Fakt. Die Hebel-Pipeline uebergab bisher nur das nackte Label ohne Erklaerung und hatte keine SYSTEM_PROMPT-Regel dazu - das LLM hat den Zusammenhang diesmal aus eigenem Wissen richtig hergestellt, aber ohne System-Vorgabe (gleiches Muster wie beim Antizyklisch-Regel-8-Fund: zufaellig richtig geraten ist keine verlaessliche Grundlage, gerade fuer die risikoreichere Hebel-Pipeline).</w:t>
+      </w:r>
+    </w:p>
+    <w:p>
+      <w:r>
+        <w:t>Fix: hebel_analyst.py uebergibt jetzt asset.rolle und btc_matrix_hinweis (identische Feldnamen wie bei Spot) und hat eine neue Regel 16 im SYSTEM_PROMPT, wortgleich zum Spot-Muster. hebel_risk_gate.py bekommt einen neuen deterministischen Risikofaktor 'Alt-Coin-Marktphase' - erscheint nur bei LONG, Nicht-Core-Asset (nicht BTC/ETH) und btc_season/baer_flucht. Der Text wird bewusst 1:1 aus der bereits vorhandenen, verstaendlichen Beschreibung aus regime.py::BTC_MATRIX uebernommen statt neu formuliert - eine Quelle der Wahrheit, direkt die vom Nutzer gewuenschte sinnvolle Beschreibung fuer den User. hebel_pipeline.py reicht asset.rolle durch.</w:t>
+      </w:r>
+    </w:p>
+    <w:p>
+      <w:r>
+        <w:t>Verifikation: synthetischer Test bestaetigt Faktor-Erscheinen fuer Alt-Coin+LONG+baer_flucht/btc_season mit korrektem Text, kein Faktor fuer BTC/ETH oder SHORT oder harmlose Marktphasen, echter End-to-End-Lauf von post_check_hebel() mit VIRTUAL-aehnlichem Szenario, Regressionstest der Funding-Kosten-/Retail-Konsens-/CRV-Fixes weiterhin gruen.</w:t>
       </w:r>
     </w:p>
     <w:sectPr>

</xml_diff>

<commit_message>
E-Mail: Risikofaktoren-Zeilen in Abschnitt 3 mit echten Absaetzen trennen
Nutzer-Fund: Outlook Web entfernte einzelne Zeilenumbrueche und verschmolz
die Risikofaktoren-Legende mit dem ersten Faktor zu einem Fliesstext, weil
_formatiere_risikofaktoren() Zeilen bisher nur mit einfachem "\n" statt
einer echten Leerzeile trennte - anders als alle anderen Abschnitte der
E-Mail, die bereits zuverlaessig als eigene Absaetze rendern. Betrifft nur
die E-Mail-Formatierung (Spot/Hebel/Multi-Asset), nicht die App-Anzeige.

Co-Authored-By: Claude Sonnet 5 <noreply@anthropic.com>
</commit_message>
<xml_diff>
--- a/Basisinfos/Regelwerksmanual.docx
+++ b/Basisinfos/Regelwerksmanual.docx
@@ -14132,6 +14132,29 @@
     <w:p>
       <w:r>
         <w:t>Verifikation: synthetischer Test bestaetigt Faktor-Erscheinen fuer Alt-Coin+LONG+baer_flucht/btc_season mit korrektem Text, kein Faktor fuer BTC/ETH oder SHORT oder harmlose Marktphasen, echter End-to-End-Lauf von post_check_hebel() mit VIRTUAL-aehnlichem Szenario, Regressionstest der Funding-Kosten-/Retail-Konsens-/CRV-Fixes weiterhin gruen.</w:t>
+      </w:r>
+    </w:p>
+    <w:p>
+      <w:pPr>
+        <w:pStyle w:val="Heading3"/>
+      </w:pPr>
+      <w:r>
+        <w:t>Nachtrag (2026-07-22): Abschnitt 3 (Konklusion) verschmolz in Outlook zu einem Fliesstext</w:t>
+      </w:r>
+    </w:p>
+    <w:p>
+      <w:r>
+        <w:t>Nutzer-Fund: die Risikofaktoren-Legende und der erste Risikofaktor erschienen in Outlook Web als ein zusammenhaengender Fliesstext statt als zwei Zeilen - Outlook zeigte dabei den Hinweis 'Wir haben zusätzliche Zeilenumbrüche aus dieser Nachricht entfernt'. Root Cause: scheduler/background.py::_formatiere_risikofaktoren() trennte Risikofaktoren-Zeilen bisher nur mit einfachem Zeilenumbruch, ebenso der Uebergang von der Legende zum ersten Faktor - Outlook Web entfernt offenbar genau solche einzelnen Zeilenumbrueche beim Anzeigen. Alle anderen Abschnitte der E-Mail trennen Bloecke bereits mit einer echten Leerzeile und rendern deshalb zuverlaessig als eigene Absaetze - genau dieses Muster fehlte hier.</w:t>
+      </w:r>
+    </w:p>
+    <w:p>
+      <w:r>
+        <w:t>Fix: _formatiere_risikofaktoren() verbindet die einzelnen Risikofaktor-Zeilen jetzt mit einer echten Leerzeile statt einem einfachen Umbruch, und alle drei Aufrufstellen (Spot-, Hebel-, Multi-Asset-E-Mail) trennen die Legende vom ersten Faktor ebenfalls mit einer Leerzeile - konsistent mit dem bereits etablierten Absatz-Trenn-Muster der uebrigen E-Mail-Abschnitte. Rein die E-Mail-Formatierung betroffen - die App-Anzeige (Tkinter) blieb unveraendert, da dort keine Reflow-Problematik besteht.</w:t>
+      </w:r>
+    </w:p>
+    <w:p>
+      <w:r>
+        <w:t>Verifikation: synthetischer Test bestaetigt echte Leerzeilen zwischen allen Risikofaktor-Zeilen sowie zwischen Legende und erstem Faktor, bestehender Regressionstest der Risikofaktor-Symbole weiterhin gruen.</w:t>
       </w:r>
     </w:p>
     <w:sectPr>

</xml_diff>

<commit_message>
Hedge: E-Mail-Override respektieren + Batch-Budget-Bewusstsein
Zwei echte Funde aus einem DBPK/3QSS-Signal-Review: (1) das E-Mail-
Versand-Gate (_ist_email_relevantes_asset) ignorierte den bestaetigten
Bitpanda-Gelistet-Override, obwohl alle 4 Spot-family-Pipelines ihn
bereits respektieren - der /v3/assets-Endpunkt deckt Bitpandas Fractional-
ETF/ETC-Produktlinie nachweislich nicht vollstaendig ab. (2) Zwei
Hedge-Instrumente im selben Batch-Lauf lasen unabhaengig denselben
DB-Bestand und konnten in Summe das Ziel-Maximum ueberschreiten, ohne
voneinander zu wissen - jetzt uebergibt run_multi_asset_batch() die
bereits vorgeschlagene, leverage-adjustierte Summe sequenziell weiter.

Co-Authored-By: Claude Sonnet 5 <noreply@anthropic.com>
</commit_message>
<xml_diff>
--- a/Basisinfos/Regelwerksmanual.docx
+++ b/Basisinfos/Regelwerksmanual.docx
@@ -14155,6 +14155,49 @@
     <w:p>
       <w:r>
         <w:t>Verifikation: synthetischer Test bestaetigt echte Leerzeilen zwischen allen Risikofaktor-Zeilen sowie zwischen Legende und erstem Faktor, bestehender Regressionstest der Risikofaktor-Symbole weiterhin gruen.</w:t>
+      </w:r>
+    </w:p>
+    <w:p>
+      <w:pPr>
+        <w:pStyle w:val="Heading3"/>
+      </w:pPr>
+      <w:r>
+        <w:t>Nachtrag (2026-07-22): Zwei Hedge-Funde - Bitpanda-Override im E-Mail-Gate + Batch-Budget-Bewusstsein</w:t>
+      </w:r>
+    </w:p>
+    <w:p>
+      <w:r>
+        <w:t>Ausloeser: echte Hedge-Signale (DBPK/3QSS, beide NACHKAUFEN im selben Lauf) aus dem Signale-Tab - keine E-Mail dafuer, obwohl beide bereits einen bestaetigten Bitpanda-Override-Eintrag hatten.</w:t>
+      </w:r>
+    </w:p>
+    <w:p>
+      <w:r>
+        <w:t>Fund 1: der oeffentliche /v3/assets-Endpunkt deckt Bitpandas 'Bitpanda Stocks'-Fractional-ETF/ETC-Produktlinie nachweislich nicht vollstaendig ab (2026-07-20 mit echten Bitpanda-App-Screenshots bewiesen) - deshalb existiert der manuelle Bitpanda-Override-Button im Watchlist-Tab. Alle 4 Spot-family-Pipelines fragen den Override bereits ab, das E-Mail-Versand-Gate (_ist_email_relevantes_asset()) war die einzige Stelle, die ihn noch nicht respektierte.</w:t>
+      </w:r>
+    </w:p>
+    <w:p>
+      <w:r>
+        <w:t>Fix 1: _ist_email_relevantes_asset() bekommt einen optionalen conn_factory-Parameter (rueckwaertskompatibel), fragt nach einem negativen Live-Check zusaetzlich den Override ab - identisches Muster wie die 4 Pipelines. conn_factory wird an allen 3 Aufrufstellen durchgereicht.</w:t>
+      </w:r>
+    </w:p>
+    <w:p>
+      <w:r>
+        <w:t>Fund 2: zwei Hedge-Instrumente im selben Batch-Lauf lasen unabhaengig denselben (noch unveraenderten) DB-Bestand als Ausgangspunkt fuer ihr verbleibendes Hedge-Budget - da beides rein advisory ist, aendert sich die DB zwischen den beiden Berechnungen nicht. Setzt der Nutzer beide Vorschlaege um, kann die Gesamt-Abdeckung ueber das Ziel-Maximum hinausschiessen, ohne dass eine Empfehlung von der anderen wusste.</w:t>
+      </w:r>
+    </w:p>
+    <w:p>
+      <w:r>
+        <w:t>Fix 2 (Nutzer-Entscheidung: strukturelle Loesung statt reinem Hinweis): _compute_portfolio_exposure() bekommt einen neuen Parameter bereits_vorgeschlagen_effektiv_usd, der zusaetzlich von der aktuellen Hedge-Abdeckung abgezogen wird. run_multi_asset_batch() haelt einen lokalen Akkumulator (nur fuer Hedge-Symbole relevant, kein Effekt fuer Aktien/Rohstoffe/Themen-ETF) und addiert nach jedem erfolgreichen KAUFEN/NACHKAUFEN die leverage-adjustierte Positionsgroesse, bevor der naechste Hedge-Kandidat im selben Lauf verarbeitet wird.</w:t>
+      </w:r>
+    </w:p>
+    <w:p>
+      <w:r>
+        <w:t>Verifikation: synthetischer Test bestaetigt Override-Respektierung mit Rueckwaertskompatibilitaet ohne conn_factory, korrekte Budget-Reduktion (nie negativ), sowie ein echter Integrationstest von run_multi_asset_batch() mit zwei gestubbten Hedge-Signalen, der bestaetigt dass das zweite Instrument die vom ersten vorgeschlagene Summe als Ausgangswert erhaelt.</w:t>
+      </w:r>
+    </w:p>
+    <w:p>
+      <w:r>
+        <w:t>Fachliche Bewertung der beiden echten Signale: beide entsprechen dem Hedge-Regelwerk (korrekte exposure/makro/risiko/timing-Kategorien, Decay-Warnung explizit genannt, rein exposure-/regimebasierte Begruendung). Die fehlenden strukturierten Risikofaktoren in Abschnitt 3 sind kein Bug, sondern bewusste Architektur - Hedge durchlaeuft absichtlich nicht risk_gate.pre_check()/post_check(), da CRV-Pflicht etc. nicht auf eine Absicherungsposition passen.</w:t>
       </w:r>
     </w:p>
     <w:sectPr>

</xml_diff>

<commit_message>
Staleness-Watchdog: periodischer Recheck statt nur beim App-Start
Krypto-Kurshistorie blieb ueber Nacht (07-23) auf dem Stand vom 07-20,
weil _history_data_is_stale()/_ohlc_data_is_stale() bisher nur einmalig
beim Scheduler-Aufbau liefen. Landete der letzte Neustart knapp vor dem
Ueberschreiten der 2-Tage-Schwelle und lief die App danach durchgehend
weiter, wurde das Ueberschreiten nie bemerkt - alle 390 Hebel-/Spot-
Kandidaten scheiterten am P-10-Gate, ohne dass ein LLM-Call stattfand.

Neuer periodischer staleness_watchdog_job() (15-Min-Takt) wiederholt den
Check waehrend des laufenden Betriebs und triggert bei Bedarf ueber
scheduler.modify_job() einen sofortigen Nachhol-Lauf. Backtest gegen die
echte Log-Timeline: 389/390 blockierte Signale waeren damit gerettet
worden.

Co-Authored-By: Claude Sonnet 5 <noreply@anthropic.com>
</commit_message>
<xml_diff>
--- a/Basisinfos/Regelwerksmanual.docx
+++ b/Basisinfos/Regelwerksmanual.docx
@@ -14198,6 +14198,52 @@
     <w:p>
       <w:r>
         <w:t>Fachliche Bewertung der beiden echten Signale: beide entsprechen dem Hedge-Regelwerk (korrekte exposure/makro/risiko/timing-Kategorien, Decay-Warnung explizit genannt, rein exposure-/regimebasierte Begruendung). Die fehlenden strukturierten Risikofaktoren in Abschnitt 3 sind kein Bug, sondern bewusste Architektur - Hedge durchlaeuft absichtlich nicht risk_gate.pre_check()/post_check(), da CRV-Pflicht etc. nicht auf eine Absicherungsposition passen.</w:t>
+      </w:r>
+    </w:p>
+    <w:p>
+      <w:pPr>
+        <w:pStyle w:val="Heading3"/>
+      </w:pPr>
+      <w:r>
+        <w:t>Nachtrag (2026-07-23): Ueberholt-Erkennung - erste Live-Verifikation auf dem Notebook</w:t>
+      </w:r>
+    </w:p>
+    <w:p>
+      <w:r>
+        <w:t>Erster 06:00-Cron-Lauf unter den neuen Gates (07-22 eingefuehrt): Hebel 172 geprueft, nur 1x ueberholt (KAIA einmal_trade, 43h alt, legitimer Fall wegen Ueberschreitung der 18h-Schwelle). Spot: 328 geprueft, 0x ueberholt. Vorher geschaetzt ~89% Fehl-Rescues, jetzt 0,6% (Hebel) / 0% (Spot) im ersten Live-Tag. Wichtige Einordnung: das bestaetigt nur den Mechanismus, NICHT die tatsaechliche Zuverlaessigkeit der Signale - dafuer noetige Stichprobe (echte TP/SL-Ergebnisse) waechst jetzt bewusst langsamer, da Signale laenger offen bleiben. Wiedervorlage 2026-08-06/13: Provider-Performance-Stichprobe erneut vergleichen.</w:t>
+      </w:r>
+    </w:p>
+    <w:p>
+      <w:r>
+        <w:t>Klarstellung zum Ausgangsmechanismus (Nutzer-Frage): check_signal_outcome()/check_hebel_signal_outcome() pruefen NICHT den aktuellen Kurs, sondern laufen rueckwaerts durch die komplette OHLC-Tageshistorie seit Signal-Erstellung und vergleichen taeglich High/Low (nicht nur Schlusskurs) gegen TP/SL - ein zwischenzeitliches Level-Beruehren wird also erkannt. Einzige bewusste Einschraenkung: Tages- statt Tick-Granularitaet, bei beiden Zonen am selben Tag gewinnt konservativ Stop-Loss (Z-1).</w:t>
+      </w:r>
+    </w:p>
+    <w:p>
+      <w:pPr>
+        <w:pStyle w:val="Heading3"/>
+      </w:pPr>
+      <w:r>
+        <w:t>Nachtrag (2026-07-23): Staleness-Watchdog - Krypto-Kurshistorie blieb ueber Nacht auf altem Stand, 390 Signale blockiert</w:t>
+      </w:r>
+    </w:p>
+    <w:p>
+      <w:r>
+        <w:t>Diagnose (per extract_notebook_diagnose.py, nicht Ad-hoc-SQL) ergab: alle 116 Hebel- und 274 Spot-Kandidaten (darunter BTC/ETH) scheiterten in der Nacht 07-23 von 00:11 bis mind. 04:15 Uhr am P-10-Gate mit gate_reason "Historie veraltet (letzter Tag: 2026-07-20)" - Fixed-HALTEN ohne jeden echten LLM-Call, trotz Log-Zeile "verarbeitet" (zaehlt nur nicht-gecrashte Pipeline-Aufrufe).</w:t>
+      </w:r>
+    </w:p>
+    <w:p>
+      <w:r>
+        <w:t>Root Cause: refresh_history_job() (CoinGecko-Krypto-Kurshistorie) lief im sichtbaren 72h-Fenster nur einmal erfolgreich (07-20 08:44). Der Nachhol-Mechanismus _history_data_is_stale() prueft bisher nur EINMALIG beim App-Start. Der letzte Neustart in diesem Fenster (07-22 23:26) lag exakt bei 2,0 Kalendertagen Rueckstand - noch knapp unter der 2-Tage-Schwelle, Start-Check also korrekt "nicht stale". Die App lief danach durchgehend ohne weiteren Neustart ueber Mitternacht - die Schwelle kippte auf 3 Tage, aber niemand hat es bemerkt, da der Check nur beim Start laeuft. Struktureller Bug, kein Einzelfall.</w:t>
+      </w:r>
+    </w:p>
+    <w:p>
+      <w:r>
+        <w:t>Fix: neuer periodischer Job staleness_watchdog_job() (15-Min-Takt), wiederholt denselben Check waehrend des laufenden Betriebs und loest bei Bedarf ueber scheduler.modify_job(next_run_time=jetzt) einen sofortigen Nachhol-Lauf von refresh_history/refresh_ohlc aus - ueber den Scheduler selbst, kein Direktaufruf, damit APSchedulers Lauf-Serialisierung greift.</w:t>
+      </w:r>
+    </w:p>
+    <w:p>
+      <w:r>
+        <w:t>Backtest gegen die echte Log-Timeline (backtest_staleness_watchdog.py): 15-Min-Takt haette 389/390 blockierte Signale gerettet (30/60 Min: 388/390, 120 Min: nur 320/390). 15 Minuten gewaehlt, passt zum bestehenden Takt anderer haeufiger Jobs. Synthetisch verifiziert (beide/eine/keine Quelle stale, kein Scheduler-Ref -&gt; No-Op).</w:t>
       </w:r>
     </w:p>
     <w:sectPr>

</xml_diff>

<commit_message>
E-Mail-Latenz-Fix: Benachrichtigung sofort pro Signal statt am Batch-Ende
run_budget_allocator() verschickte Empfehlungs-E-Mails bisher erst nach
Abschluss des GESAMTEN Batches (heute: 38 Kandidaten) - echte Signale
(NEAR/SUI/VIRTUAL) blieben 18+ Minuten ohne E-Mail haengen, weil der Batch
an mehreren timeoutenden externen Abrufen (Eastmoney, OKX) festhing.

Neuer on_signal_ready-Callback feuert jetzt sofort bei jedem erfolgreichen
Kandidaten, direkt im selben Moment wie das Speichern des Ergebnisses -
nicht erst wenn die gesamte Funktion zurueckkehrt. Ein Fehler im Callback
selbst stoppt die Allocator-Schleife nicht (P-10).

Backtest gegen die echten Zeitstempel von heute: NEAR/SUI/VIRTUAL haetten
unter der alten Logik mind. 18,3/13,8/11,7 Minuten gewartet, mit dem Fix
~0 Minuten.

Co-Authored-By: Claude Sonnet 5 <noreply@anthropic.com>
</commit_message>
<xml_diff>
--- a/Basisinfos/Regelwerksmanual.docx
+++ b/Basisinfos/Regelwerksmanual.docx
@@ -14244,6 +14244,34 @@
     <w:p>
       <w:r>
         <w:t>Backtest gegen die echte Log-Timeline (backtest_staleness_watchdog.py): 15-Min-Takt haette 389/390 blockierte Signale gerettet (30/60 Min: 388/390, 120 Min: nur 320/390). 15 Minuten gewaehlt, passt zum bestehenden Takt anderer haeufiger Jobs. Synthetisch verifiziert (beide/eine/keine Quelle stale, kein Scheduler-Ref -&gt; No-Op).</w:t>
+      </w:r>
+    </w:p>
+    <w:p>
+      <w:pPr>
+        <w:pStyle w:val="Heading3"/>
+      </w:pPr>
+      <w:r>
+        <w:t>Nachtrag (2026-07-23): E-Mail-Latenz-Fix - Benachrichtigungen hingen 18+ Minuten am Ende des Gesamt-Batches fest</w:t>
+      </w:r>
+    </w:p>
+    <w:p>
+      <w:r>
+        <w:t>Drei echte ERÖFFNEN-Signale (NEAR SHORT, SUI LONG, VIRTUAL LONG) standen im Hebel-Tab, aber keine E-Mail kam an. Root Cause: run_budget_allocator() verarbeitet den gesamten Batch (an diesem Tag 12 Hebel- + 26 Spot-Kandidaten) in EINEM blockierenden Aufruf - die Benachrichtigungs-Schleife lief bisher erst NACH vollstaendigem Abschluss, nicht sobald ein einzelnes Signal feststand. Dieser Batch brauchte ungewoehnlich lange (mehrere externe Abrufe hingen/timeouteten), lief laut Log noch 18+ Minuten nach Start ohne Ende in Sicht - der naechste 15-Min-Takt musste uebersprungen werden ('maximum number of running instances reached').</w:t>
+      </w:r>
+    </w:p>
+    <w:p>
+      <w:r>
+        <w:t>Fix: run_budget_allocator() bekommt einen neuen optionalen Parameter on_signal_ready(schluessel, ergebnis), der SOFORT beim Entstehen jedes echten Signals aufgerufen wird (in _mit_fallback_chain(), im selben Moment wie das Speichern in ergebnis_objekt), nicht erst am Ende des gesamten Batches. scheduler/background.py::hebel_screening_job() baut die Benachrichtigung jetzt als Closure VOR dem Allocator-Aufruf und uebergibt sie als Callback - der alte Nachlauf am Ende entfaellt komplett. Der Bitpanda-Listing-Abruf bleibt lazy beim ersten echten Signal des Laufs (kein API-Call bei einem Zyklus ohne Treffer, identisch zum bisherigen Verhalten). Ein Fehler im Callback selbst darf die Allocator-Schleife nicht stoppen (P-10, eigenes try/except).</w:t>
+      </w:r>
+    </w:p>
+    <w:p>
+      <w:r>
+        <w:t>Backtest gegen den echten Vorfall (echte Zeitstempel von heute): NEAR (fertig 06:58:19) wartete unter der alten Logik mindestens 18,3 Minuten, SUI (07:02:52) mindestens 13,8 Minuten, VIRTUAL (07:04:56) mindestens 11,7 Minuten - unter der neuen Logik jeweils ~0 Minuten. Die Altwerte sind Untergrenzen, da der Batch zum Export-Zeitpunkt noch nicht abgeschlossen war.</w:t>
+      </w:r>
+    </w:p>
+    <w:p>
+      <w:r>
+        <w:t>Verifikation: synthetischer Test bestaetigt sofortiges Feuern des Callbacks (Aufrufreihenfolge protokolliert), Rueckwaertskompatibilitaet bei on_signal_ready=None, sowie dass eine Exception im Callback selbst die Signal-Verarbeitung nicht verhindert.</w:t>
       </w:r>
     </w:p>
     <w:sectPr>

</xml_diff>

<commit_message>
Watchlist: Aenderungen wirken ohne App-Neustart (Scheduler+GUI+Remote)
Watchlist wurde bisher einmalig beim App-Start geladen und als
eingefrorene Variable an Scheduler-Jobs, Haupt-GUI und Remote-Steuer-
Seite weitergereicht - neue Eintraege (z.B. XNO) wirkten erst nach
Neustart. Alle 3 Subsysteme lesen die Watchlist jetzt live ueber einen
watchlist_provider (Scheduler/Remote) bzw. In-Place-Refresh (GUI).

Dabei zwei echte Regressionen gefunden und mitbehoben: der manuelle
GUI-Preis-Refresh-Button sowie die beiden manuellen Remote-Buttons
riefen die Job-Funktionen direkt mit der jetzt inkompatiblen rohen
Liste statt eines Callables auf.

Co-Authored-By: Claude Sonnet 5 <noreply@anthropic.com>
</commit_message>
<xml_diff>
--- a/Basisinfos/Regelwerksmanual.docx
+++ b/Basisinfos/Regelwerksmanual.docx
@@ -14272,6 +14272,49 @@
     <w:p>
       <w:r>
         <w:t>Verifikation: synthetischer Test bestaetigt sofortiges Feuern des Callbacks (Aufrufreihenfolge protokolliert), Rueckwaertskompatibilitaet bei on_signal_ready=None, sowie dass eine Exception im Callback selbst die Signal-Verarbeitung nicht verhindert.</w:t>
+      </w:r>
+    </w:p>
+    <w:p>
+      <w:pPr>
+        <w:pStyle w:val="Heading3"/>
+      </w:pPr>
+      <w:r>
+        <w:t>Nachtrag (2026-07-23): Watchlist-Aenderungen wirkten nur nach App-Neustart - in 3 Phasen behoben</w:t>
+      </w:r>
+    </w:p>
+    <w:p>
+      <w:r>
+        <w:t>Nutzer fuegte XNO (echter Marktscan-Kaufkandidat, echter Kauf umgesetzt) hinzu und stellte fest, dass ein App-Neustart noetig war, damit der neue Eintrag irgendwo wirkt. Kein neuer Bug, sondern eine seit 2026-07-16 bewusst dokumentierte, aber nie hinterfragte Einschraenkung.</w:t>
+      </w:r>
+    </w:p>
+    <w:p>
+      <w:r>
+        <w:t>Root Cause (identisch an 3 Stellen): main.py laedt die Watchlist EINMALIG beim App-Start und reicht diese eine Variable an drei Subsysteme weiter, die sie nie wieder aktualisieren - Scheduler-Jobs (build_scheduler(), 10 Job-Funktionen), Haupt-GUI (TradingInfoToolApp.__init__(), alle 5 Tabs) und Remote-Steuer-Seite (create_app(), Flask-Closure). config.get_watchlist() selbst liest bei jedem Aufruf frisch aus config.yaml - das Problem lag nur darin, wann/wie oft sie aufgerufen wurde.</w:t>
+      </w:r>
+    </w:p>
+    <w:p>
+      <w:r>
+        <w:t>Umsetzung in 3 Phasen (Nutzer-Vorgabe: erst vollstaendig analysieren, dann in klar abgegrenzten, einzeln verifizierten Schritten umsetzen):</w:t>
+      </w:r>
+    </w:p>
+    <w:p>
+      <w:r>
+        <w:t>Phase 1 (Scheduler): alle 10 Job-Funktionen bekommen einen watchlist_provider-Parameter (Callable) statt einer fertigen Liste, rufen ihn als erste Zeile selbst auf. main.py uebergibt config.get_watchlist direkt statt einer eingefrorenen Lambda-Variante.</w:t>
+      </w:r>
+    </w:p>
+    <w:p>
+      <w:r>
+        <w:t>Phase 2 (Haupt-GUI): _refresh_watchlist_from_db() (laeuft bereits alle 3 Sek.) aktualisiert self._watchlist in-place (list[:] = ...) statt neu zuzuweisen - alle Tabs sehen die Aenderung automatisch mit, die bestehende Sortierungs-/Auswahl-Erhaltung bleibt unveraendert. Echter Fund waehrend der Verifikation: der manuelle Preis-Refresh-Button rief refresh_prices_job() direkt mit der jetzt inkompatiblen rohen Liste auf - waere gecrasht, auf ein Callable umgestellt.</w:t>
+      </w:r>
+    </w:p>
+    <w:p>
+      <w:r>
+        <w:t>Phase 3 (Remote-Steuer-Seite): create_app() bekommt watchlist_provider, /api/status ruft ihn pro Request frisch auf. Zweiter echter Fund: die beiden manuellen Remote-Buttons (Preis-Refresh, Marktscan) riefen dieselben Job-Funktionen ebenfalls direkt auf und mussten ebenso umgestellt werden.</w:t>
+      </w:r>
+    </w:p>
+    <w:p>
+      <w:r>
+        <w:t>Verifikation: 4 separate Testdateien (Phase 1 strukturell + funktional, Phase 2 echter Tk-Smoke-Test mit realer App-Instanz inkl. Bestaetigung dass die Zeilenauswahl ueber den Refresh hinweg erhalten bleibt, Phase 3 echte Flask-Test-Client-Requests, plus eine zusaetzliche Regressionsprobe fuer den manuellen GUI-Button) - alle gruen, inklusive zweier echter, sonst erst im Betrieb aufgefallener Regressionen.</w:t>
       </w:r>
     </w:p>
     <w:sectPr>

</xml_diff>

<commit_message>
Liquiditaetszonen (Marketmaker-Konzept) + Hebel-EUR-Fix + Chart in App/E-Mail
Drei zusammenhaengende Nachbesserungen aus der Krypto-Risikoanalyse:

- Liquiditaetszonen Stufe 1 (Krypto Spot+Hebel): Swing-Hoch/-Tief-Cluster
  als Liquidity Pools erkannt (indicators/calculations.py::liquidity_pools()),
  interpretiert als neutraler, rein informativer Risikofaktor
  (agent/krypto/liquidity_zones.py) - bewusst kein aktiver Deckel.
- Hebel-Liquidationspreis/Eigenkapitalbedarf zusaetzlich in EUR neben USD
  (EURCV-abgeleiteter FX-Kurs, kein zusaetzlicher API-Call).
- Liquiditaetszonen-Grafik (ui/liquidity_chart.py, gemeinsamer Renderer)
  jetzt sowohl im Hebel-Detail-Panel als auch inline in der Signal-E-Mail
  (multipart/related mit Text-Alternative), mit Zahlen/Einheiten direkt im Bild.

Co-Authored-By: Claude Sonnet 5 <noreply@anthropic.com>
</commit_message>
<xml_diff>
--- a/Basisinfos/Regelwerksmanual.docx
+++ b/Basisinfos/Regelwerksmanual.docx
@@ -14315,6 +14315,85 @@
     <w:p>
       <w:r>
         <w:t>Verifikation: 4 separate Testdateien (Phase 1 strukturell + funktional, Phase 2 echter Tk-Smoke-Test mit realer App-Instanz inkl. Bestaetigung dass die Zeilenauswahl ueber den Refresh hinweg erhalten bleibt, Phase 3 echte Flask-Test-Client-Requests, plus eine zusaetzliche Regressionsprobe fuer den manuellen GUI-Button) - alle gruen, inklusive zweier echter, sonst erst im Betrieb aufgefallener Regressionen.</w:t>
+      </w:r>
+    </w:p>
+    <w:p>
+      <w:pPr>
+        <w:pStyle w:val="Heading3"/>
+      </w:pPr>
+      <w:r>
+        <w:t>Nachtrag (2026-07-23): Liquiditätszonen (Marketmaker-Konzept), Stufe 1</w:t>
+      </w:r>
+    </w:p>
+    <w:p>
+      <w:r>
+        <w:t>Umsetzung des seit 2026-07-21 offenen 'Marketmaker-Trading'-Punkts: Kurse laufen oft gezielt zu Punkten, an denen viele Stop-Loss-/Pending-Orders clustern (typischerweise an markanten Swing-Hochs/-Tiefs = 'Liquidity Pools'), holen dort die Liquiditaet ab ('Stop-Hunt'/'Liquidity Sweep') und drehen erst danach in die eigentliche Richtung.</w:t>
+      </w:r>
+    </w:p>
+    <w:p>
+      <w:r>
+        <w:t>Scope: Krypto Spot + Hebel only (24/7-Markt + hoher Retail-/Hebel-Anteil) - nicht fuer Aktien/Rohstoffe/Hedge/Themen-ETF verdrahtet. Stufe 1 = nur Liquidity Pools (Swing-Hoch/-Tief-Cluster), bewusst rein Transparenz/Kontext, KEIN aktiver Deckel - kein automatisches Verschieben von Entry/CRV/Hebel basierend auf Zonen. Order Blocks/Fair Value Gaps (Stufe 2) bewusst noch nicht gebaut. Echte Order-Book-Tiefe und Liquidations-Heatmaps bewusst nicht abgedeckt (nicht kostenfrei verfuegbar).</w:t>
+      </w:r>
+    </w:p>
+    <w:p>
+      <w:r>
+        <w:t>Architektur (folgt dem bestehenden Fibonacci/Support-Resistance-Muster): neue Funktion indicators/calculations.py::liquidity_pools() clustert Swing-Highs (Buy-Side, oberhalb) und Swing-Lows (Sell-Side, unterhalb) GETRENNT NACH RICHTUNG (0,5% Toleranz statt der 2% bei Support/Resistance) inkl. 'bereits gefegt'-Erkennung. Neuer Interpretations-Layer agent/krypto/liquidity_zones.py::liquiditaetszonen_fakt() findet die naechste Zone relativ zum aktuellen Kurs und meldet eine Naehe-Warnung nur fuer noch ungefegte Zonen. Facts-Integration in build_facts()/build_hebel_facts() + neue SYSTEM_PROMPT-Regel in beiden Analysten (reiner Timing-Hinweis, Modell darf Entry-/Stop-Loss-/Take-Profit-Zonen NICHT allein deswegen verschieben). Neuer deterministischer, IMMER neutraler Risikofaktor in hebel_risk_gate.py::compute_risikofaktoren_hebel() und risk_gate.py::compute_risikofaktoren() - Letzteres bekommt den Parameter nur von der Krypto-Spot-Pipeline gereicht, die anderen 4 Spot-family-Pipelines lassen ihn auf None (Default), ohne selbst geaendert werden zu muessen.</w:t>
+      </w:r>
+    </w:p>
+    <w:p>
+      <w:r>
+        <w:t>Verifikation: synthetische Tests fuer Clustering/'bereits gefegt'/Naehe-Warnung/Filter/Deaktivierung sowie beide Risikofaktor-Funktionen (immer neutral, korrektes Weglassen bei None/HALTEN). Echter Lauf gegen eine Kopie der Produktions-DB (BTC+ETH, echte Kraken-OHLC-Historie) - plausible Zonen-Anzahl und korrekte Sweep-/Naehe-Logik bestaetigt. Regressionscheck: support_resistance_levels()/ui/charts.py unveraendert nutzbar, alle 4 anderen Spot-family-Pipelines importieren weiterhin fehlerfrei.</w:t>
+      </w:r>
+    </w:p>
+    <w:p>
+      <w:pPr>
+        <w:pStyle w:val="Heading3"/>
+      </w:pPr>
+      <w:r>
+        <w:t>Nachtrag (2026-07-23): Liquidationspreis/Eigenkapitalbedarf zusätzlich in EUR (Hebel-Signal-Detail-Panel)</w:t>
+      </w:r>
+    </w:p>
+    <w:p>
+      <w:r>
+        <w:t>Nutzer-Fund am Signal-Detail-Panel: Entry/Stop-Loss/Take-Profit werden in EUR angezeigt, Liquidationspreis und Eigenkapitalbedarf standen direkt darunter nur in USD - erzwang eine stille Kopfrechnung, um z.B. zu pruefen, ob die Liquidation unter dem (EUR-)Stop-Loss liegt. Fuer offene Positionen war EUR bereits bewusst gewaehlt worden (Bitpanda-Margin-Trades sind EUR-denominiert) - fuer Signale fehlte dieselbe Konsequenz.</w:t>
+      </w:r>
+    </w:p>
+    <w:p>
+      <w:r>
+        <w:t>Fix: HebelSignal bekommt zwei neue additive Felder (liquidationspreis_geschaetzt_eur, eigenkapitalbedarf_eur, additive DB-Migration). Die Hebel-Pipeline leitet den EUR/USD-Kurs kostenlos aus dem EURCV-Preis-Snapshot ab (eurcv.price_usd / eurcv.price_eur, dasselbe Muster wie risk_gate.py::pre_check() fuer den Spot-Cash-Reserve-Vergleich - kein neuer API-Call) und rechnet die bereits deterministisch berechneten USD-Werte einfach um. Fehlt der EURCV-Snapshot einmal, bleiben die EUR-Felder None statt eines falschen 1:1-Werts. Detail-Panel und E-Mail-Template zeigen den EUR-Wert jetzt in Klammern hinter dem bestehenden USD-Wert.</w:t>
+      </w:r>
+    </w:p>
+    <w:p>
+      <w:r>
+        <w:t>Verifikation: synthetisch (Umrechnung + Regressionscheck ohne Kurs), DB-Migration + Insert/Read-Roundtrip, Migration zusaetzlich gegen eine Kopie der echten Produktions-DB (bestehende Zeilen bleiben lesbar, neue Spalten NULL), Textbaustein-Logik fuer beide Anzeigestellen.</w:t>
+      </w:r>
+    </w:p>
+    <w:p>
+      <w:pPr>
+        <w:pStyle w:val="Heading3"/>
+      </w:pPr>
+      <w:r>
+        <w:t>Nachtrag (2026-07-23): Liquiditätszonen-Grafik in App-Detail-Panel UND E-Mail</w:t>
+      </w:r>
+    </w:p>
+    <w:p>
+      <w:r>
+        <w:t>Nutzer-Wunsch: 'Berührungen'/Datum im Risikofaktor-Text waren nicht selbsterklärend, zusätzlich sollte eine kleine Grafik mit konkreten Zahlen/Einheiten sowohl in der App als auch in der E-Mail erscheinen (bisher waren E-Mails reiner Text, keine Bilder).</w:t>
+      </w:r>
+    </w:p>
+    <w:p>
+      <w:r>
+        <w:t>Ein gemeinsamer Renderer fuer beide Stellen (ui/liquidity_chart.py::render_liquiditaetszonen_chart()) - nutzt matplotlib.figure.Figure direkt (wie ui/charts.py, nicht pyplot), damit sowohl aus dem Tk-Main-Thread (App) als auch aus einem Scheduler-Hintergrund-Thread (E-Mail-Versand) sicher aufrufbar. Baut aus demselben liquiditaetszonen-Fakt ein kompaktes PNG mit aktuellem Kurs und naechster Buy-/Sell-Side-Zone, inkl. Preis+Einheit, Abstand in %, Beruehrungen und Datum DIREKT als Text im Bild. Farbkonvention: blau gestrichelt = aktive Buy-Side-Zone, orange durchgezogen = aktive Sell-Side-Zone, blassgrau gepunktet = bereits gefegte Zone.</w:t>
+      </w:r>
+    </w:p>
+    <w:p>
+      <w:r>
+        <w:t>E-Mail: api/email_notify.py::send_notification_email() bekommt einen neuen optionalen Parameter inline_image_png - None (Default) belaesst jeden bestehenden Aufrufer unveraendert bei reiner text/plain-Mail (kein Regressionsrisiko). Mit PNG wird eine multipart/related-Mail gebaut (Text- + HTML-Alternative plus eingebettetes Inline-Bild via Content-ID). scheduler/background.py::_notify_hebel_signal() liest den Fakt aus facts_json, holt den aktuellen EUR-Preis frisch aus der DB und uebergibt das gerenderte PNG. App: ui/hebel_view.py bettet dieselbe Grafik direkt im Text-Detail-Panel ein (image_create(), PhotoImage-Referenz gehalten gegen Tkinters Garbage-Collection).</w:t>
+      </w:r>
+    </w:p>
+    <w:p>
+      <w:r>
+        <w:t>Verifikation: Chart-Renderer visuell geprueft (mehrere Beispiele); E-Mail-MIME-Struktur synthetisch geprueft (multipart/related korrekt, Regressionscheck fuer den bestehenden reinen Text-Pfad); echter Tk-Smoke-Test (reale HebelView-Instanz, reale SQLite-DB) bestaetigt die Einbettung inkl. Regressionscheck ohne Fakt; Scheduler-Glue-Logik isoliert nachgestellt und verifiziert.</w:t>
       </w:r>
     </w:p>
     <w:sectPr>

</xml_diff>

<commit_message>
Signal-Detail-Panels: visuelle Hervorhebung statt reinem Fließtext
Alle drei Signal-Detail-Panels (Hebel/Spot-Familie/Marktscan) uebergaben
ihren strukturierten Text (Abschnitts-Ueberschriften, Risikofaktor-Marker)
bisher unformatiert an tk.Text (Nutzer-Fund: "Text und GUI ist alles
schwarz weiss"). Neues gemeinsames ui/detail_panel.py erkennt bekannte
Zeilenmuster per Pattern-Matching und taggt sie (fett+Akzentfarbe fuer
Abschnitts-Kopfzeilen, fett fuer Unter-Kopfzeilen/Warnungen, Farbe fuer die
▲/●/▼-Risikofaktor-Zeilen passend zur bestehenden positiv/neutral/negativ-
Palette) - ohne die Zeilen-Bau-Logik in den drei Views selbst anzufassen.

Co-Authored-By: Claude Sonnet 5 <noreply@anthropic.com>
</commit_message>
<xml_diff>
--- a/Basisinfos/Regelwerksmanual.docx
+++ b/Basisinfos/Regelwerksmanual.docx
@@ -14394,6 +14394,34 @@
     <w:p>
       <w:r>
         <w:t>Verifikation: Chart-Renderer visuell geprueft (mehrere Beispiele); E-Mail-MIME-Struktur synthetisch geprueft (multipart/related korrekt, Regressionscheck fuer den bestehenden reinen Text-Pfad); echter Tk-Smoke-Test (reale HebelView-Instanz, reale SQLite-DB) bestaetigt die Einbettung inkl. Regressionscheck ohne Fakt; Scheduler-Glue-Logik isoliert nachgestellt und verifiziert.</w:t>
+      </w:r>
+    </w:p>
+    <w:p>
+      <w:pPr>
+        <w:pStyle w:val="Heading3"/>
+      </w:pPr>
+      <w:r>
+        <w:t>Nachtrag (2026-07-23): Hervorhebung in den Signal-Detail-Panels (Hebel/Spot-Familie/Marktscan)</w:t>
+      </w:r>
+    </w:p>
+    <w:p>
+      <w:r>
+        <w:t>Nutzer-Fund: 'Text und GUI ist alles schwarz weiss' - die drei Signal-Detail-Panels (ui/hebel_view.py, ui/signals_view.py, ui/marktscan_view.py) uebergaben ihre komplette Zeilen-Liste bisher als einen einzigen unformatierten Textblock an tk.Text, ohne jede Hervorhebung von Abschnitts-Ueberschriften, Unter-Ueberschriften, Warnungen oder den Risikofaktor-Markern.</w:t>
+      </w:r>
+    </w:p>
+    <w:p>
+      <w:r>
+        <w:t>Loesung: neues gemeinsames Modul ui/detail_panel.py - erkennt bekannte Zeilenmuster rein per Text-Pattern, keine Aenderung an den drei Zeilen-Bau-Funktionen selbst noetig. Abschnitts-Kopfzeilen werden fett, groesser und in einer neuen Akzentfarbe (theme.header_color(), Light #0056b3 / Dark #5b9bd5, eigener Palette-Eintrag statt select_bg) dargestellt. Unter-Ueberschriften werden fett gesetzt. Warnzeilen (mit Warnsymbol) werden fett plus Gefahrenfarbe. Die Risikofaktor-Zeilen (positiv/neutral/negativ-Marker) werden mit denselben Farben eingefaerbt, die im uebrigen Programm bereits fuer positiv/neutral/negativ-Marker verwendet werden - Konsistenz mit Portfolio-/Screener-Ansicht.</w:t>
+      </w:r>
+    </w:p>
+    <w:p>
+      <w:r>
+        <w:t>Die Liquiditaetszonen-Grafik (siehe vorheriger Nachtrag) bleibt davon unberuehrt - sie ist ein eigenstaendiges, bereits vollfarbiges PNG (matplotlib), komplett unabhaengig vom Text-Hervorhebungssystem.</w:t>
+      </w:r>
+    </w:p>
+    <w:p>
+      <w:r>
+        <w:t>Verifikation: Klassifikations-Heuristik pur an 17 synthetischen Testzeilen geprueft (alle bekannten Muster aus allen drei Dateien plus Negativ-Faelle wie eingerueckte Detailzeilen); echter Tk-Smoke-Test mit einer realen HebelView-Instanz (reale SQLite-DB, reales Signal mit 3 Risikofaktoren) bestaetigt korrekte Tag-Zuordnung UND korrekte Farbe/Fett-Schrift der Section-Header-Tags; Konstruktions-Smoke-Test fuer SignalsView/MarktscanView mit leerer Watchlist bestaetigt, dass die Verdrahtung in allen drei Dateien fehlerfrei greift.</w:t>
       </w:r>
     </w:p>
     <w:sectPr>

</xml_diff>

<commit_message>
Liquiditaetszonen-Grafik: statischer Erklaersatz fuer Beruehrungen/gefegt
Ergaenzt einen immer gleichen Erklaersatz direkt im Bild ("Beruehrungen =
fruehere Kursreaktionen an dieser Zone · gefegt = bereits durchbrochen (kein
akutes Warnsignal mehr) · ungefegt = noch aktiv (moeglicher Stop-Hunt vor
einer Bewegung)"). Bewusst keine signalspezifische Interpretation - das
bleibt Aufgabe der LLM in der eigenen Kurz-/Langbegruendung, sonst wuerde
eine zweite, nicht-neutrale Deutungsebene neben der KI entstehen und das
Stufe-1-Prinzip (reine Transparenz, kein Deckel) verletzen.

Co-Authored-By: Claude Sonnet 5 <noreply@anthropic.com>
</commit_message>
<xml_diff>
--- a/Basisinfos/Regelwerksmanual.docx
+++ b/Basisinfos/Regelwerksmanual.docx
@@ -14478,6 +14478,24 @@
     <w:p>
       <w:r>
         <w:t>Verifikation: liquiditaetszonen_fakt() synthetisch getestet (Kursverlauf korrekt eingebettet, 90-Punkte-Cap greift korrekt auf die neuesten Punkte, Regressionscheck ohne dates/closes liefert weiterhin kursverlauf=None bei unveraenderten Zonen-Feldern); beide Chart-Varianten (mit/ohne Kursverlauf) visuell geprueft; echter Tk-Smoke-Test mit realer HebelView-Instanz und Signal MIT eingebettetem Kursverlauf bestaetigt fehlerfreie Einbettung; volle Regressionssuite erneut gelaufen.</w:t>
+      </w:r>
+    </w:p>
+    <w:p>
+      <w:pPr>
+        <w:pStyle w:val="Heading3"/>
+      </w:pPr>
+      <w:r>
+        <w:t>Nachtrag (2026-07-23): statischer Erklärsatz in der Liquiditätszonen-Grafik</w:t>
+      </w:r>
+    </w:p>
+    <w:p>
+      <w:r>
+        <w:t>Ergaenzung um einen statischen, immer gleichen Erklaersatz direkt im Bild ('Beruehrungen = fruehere Kursreaktionen an dieser Zone · gefegt = bereits durchbrochen (kein akutes Warnsignal mehr) · ungefegt = noch aktiv (moeglicher Stop-Hunt vor einer Bewegung)') - erklaert nur die Begrifflichkeit, bewusst OHNE jede Signal-spezifische Wertung. Das uebernimmt weiterhin ausschliesslich die LLM in der eigenen Kurz-/Langbegruendung (siehe hebel_analyst.py Regel 17). Bleibt damit neutral im Sinne des Stufe-1-Designs (reine Transparenz, kein Deckel, keine zweite Interpretationsebene neben der KI).</w:t>
+      </w:r>
+    </w:p>
+    <w:p>
+      <w:r>
+        <w:t>Verifikation: in beiden Chart-Varianten (mit/ohne Kursverlauf) visuell geprueft (Zeilenumbruch, keine Ueberlappung), volle Regressionssuite erneut gelaufen.</w:t>
       </w:r>
     </w:p>
     <w:sectPr>

</xml_diff>

<commit_message>
Liquiditaetszonen-Grafik: Label-Ueberlappung bei engen Zonen behoben
Bei preislich eng beieinander liegenden Buy-/Sell-Side-Zonen und aktuellem
Kurs ueberlappte das "Aktueller Kurs"-Label mit dem Zonen-Label (beide
standen links, der vertikale Puffer reichte bei geringem Preisabstand nicht
mehr aus). Das Label steht jetzt rechts (raeumliche statt nur vertikale
Trennung von den links stehenden Zonen-Labels) und bleibt damit auch bei
sehr nahe beieinander liegenden Preisen kollisionsfrei. Kursverlauf-Linie
zusaetzlich von 2.2px auf 1.4px verschlankt.

Co-Authored-By: Claude Sonnet 5 <noreply@anthropic.com>
</commit_message>
<xml_diff>
--- a/Basisinfos/Regelwerksmanual.docx
+++ b/Basisinfos/Regelwerksmanual.docx
@@ -14496,6 +14496,29 @@
     <w:p>
       <w:r>
         <w:t>Verifikation: in beiden Chart-Varianten (mit/ohne Kursverlauf) visuell geprueft (Zeilenumbruch, keine Ueberlappung), volle Regressionssuite erneut gelaufen.</w:t>
+      </w:r>
+    </w:p>
+    <w:p>
+      <w:pPr>
+        <w:pStyle w:val="Heading3"/>
+      </w:pPr>
+      <w:r>
+        <w:t>Nachtrag (2026-07-23): Layout-Fix bei eng beieinander liegenden Zonen</w:t>
+      </w:r>
+    </w:p>
+    <w:p>
+      <w:r>
+        <w:t>Echter Screenshot zeigte: bei preislich eng beieinander liegenden Zonen (Buy-Side/Sell-Side/aktueller Kurs) ueberlappte das 'Aktueller Kurs'-Label mit dem Zonen-Label, da beide links (x=0.2) standen und der vertikale Puffer bei geringem Preisabstand nicht mehr ausreichte.</w:t>
+      </w:r>
+    </w:p>
+    <w:p>
+      <w:r>
+        <w:t>Fix: das 'Aktueller Kurs'-Label steht jetzt rechts (ueber eine 'Blend'-Transform - x als Achsen-Bruchteil unabhaengig vom Datenbereich, y weiterhin am echten Kurswert), die Zonen-Labels bleiben links - raeumliche statt nur vertikale Trennung, funktioniert auch bei sehr nahe beieinander liegenden Preisen. Zusaetzlich die Kursverlauf-Linie von 2.2px auf 1.4px verschlankt (Nutzer-Wunsch).</w:t>
+      </w:r>
+    </w:p>
+    <w:p>
+      <w:r>
+        <w:t>Verifikation: beide Szenarien (eng beieinander liegende Zonen wie im Screenshot, sowie gut getrennte Zonen als Regressionscheck) visuell geprueft, volle Regressionssuite erneut gelaufen.</w:t>
       </w:r>
     </w:p>
     <w:sectPr>

</xml_diff>

<commit_message>
Regime-Persistenz-Zaehlung + manueller Override als sichtbares GUI-Setting
Hebel-Risikofaktor "Regime-Konflikt"/"Regime-Ausrichtung" zaehlt jetzt, seit
wie vielen Tagen dasselbe regelbasierte Regime gilt (regime.py::
regime_persistenz_tage(), nutzt die bereits vorhandene hebel_signals-Historie,
keine neue Migration) und haengt bei einem Konflikt einen textlichen
BTC-Relativwert-Gegenhinweis an (schwache Korrelation/Tailwind mildert den
Text, nie die Einstufung). Der manuelle Regime-Override (RG-8) war bisher nur
per Hand in config.yaml editierbar - config.py::
set_regime_manueller_override() plus ein neues Combobox-Control im Regime-Tab
machen ihn jetzt sichtbar und bedienbar.

Nebenbei gefunden und gefixt: sowohl der Regime-Tab als auch die Remote-Karte
unterdrueckten bei aktivem Override den informativen regime_reason-Text
komplett statt ihn nur mit einem Warnhinweis zu ergaenzen.
</commit_message>
<xml_diff>
--- a/Basisinfos/Regelwerksmanual.docx
+++ b/Basisinfos/Regelwerksmanual.docx
@@ -9939,6 +9939,42 @@
       <w:pPr/>
       <w:r>
         <w:t>Verifiziert: 5 synthetische Tests (Migration additiv, None bei leerer DB, vollstaendiges dict, manueller Override, 29 Parameter aufgeloest) + 2 Tk-Smoke-Tests + echter Lauf gegen Produktions-DB-Kopie + visuelle Pruefung der Remote-Seite im Browser (inkl. Korrektur: Parameter-Gruppierung nach Kategorie war zunaechst fragmentiert, durch Sortierung in build_parameter_overview() behoben).</w:t>
+      </w:r>
+    </w:p>
+    <w:p>
+      <w:pPr/>
+      <w:r>
+        <w:t>Nachtrag (2026-07-26): Regime-Persistenz + manueller Override als GUI-Setting</w:t>
+      </w:r>
+    </w:p>
+    <w:p>
+      <w:pPr/>
+      <w:r>
+        <w:t>Regime-Persistenz (Hebel-Risikofaktor Regime-Konflikt/Regime-Ausrichtung): agent/krypto/regime.py::regime_persistenz_tage() zaehlt, seit wie vielen aufeinanderfolgenden Tagen (rueckwaerts ab heute) dasselbe REGELBASIERTE Regime gilt - nutzt dafuer die bereits seit 2026-07-14 als Nebenprodukt in hebel_signals.regime/regime_source/created_at befuellten Spalten (database/db.py::get_hebel_regime_tageshistorie()), keine neue Tabelle/Migration noetig. Bricht bei jedem Tag ab, dessen Regime abweicht ODER dessen regime_source == "manuell" ist. Nur aufgerufen, wenn regime_result.source == "regelbasiert" ist (agent/krypto/hebel_pipeline.py) - bei aktivem Override bleibt der Wert None (P-8, kein harter Block).</w:t>
+      </w:r>
+    </w:p>
+    <w:p>
+      <w:pPr/>
+      <w:r>
+        <w:t>BTC-Relativwert-Kopplung: bei einem Regime-Konflikt haengt compute_risikofaktoren_hebel() einen textlichen Gegen-Hinweis an, wenn der Coin schwach mit BTC korreliert (Korrelation &lt; 0,7) oder gerade spuerbaren Tailwind zeigt (Relativstaerke &gt; +3 Prozentpunkte fuer LONG / &lt; -3 fuer SHORT - dieselben Schwellenwerte wie in btc_relativwert.py selbst). Aendert NICHT die positiv/negativ-Einstufung, mildert den Konflikt nur textlich ab.</w:t>
+      </w:r>
+    </w:p>
+    <w:p>
+      <w:pPr/>
+      <w:r>
+        <w:t>Manueller Override als sichtbares GUI-Setting (vorher ein reines Uboot, nur per Hand in config.yaml editierbar): config.py::set_regime_manueller_override() schreibt den Top-Level-Skalar regime.manueller_override (RG-8) nach demselben Backup-/Schreib-/Reparse-/Rollback-Muster wie _update_watchlist_field(). Neues Combobox-Control im Regime-Tab (ui/regime_view.py) mit den 6 gueltigen Werten + Anwenden-Button, plus Hinweistext, dass die Regime-Persistenz-Zaehlung waehrend eines aktiven Overrides pausiert.</w:t>
+      </w:r>
+    </w:p>
+    <w:p>
+      <w:pPr/>
+      <w:r>
+        <w:t>Bugfix: vorher wurde bei aktivem Override die eigentlich informative regime_reason komplett durch einen generischen Hinweistext ersetzt (Desktop-Tab UND Remote-Karte) - jetzt wird der vollstaendige Text immer angezeigt, nur mit einem Warn-Praefix ergaenzt.</w:t>
+      </w:r>
+    </w:p>
+    <w:p>
+      <w:pPr/>
+      <w:r>
+        <w:t>Verifiziert: synthetische Tests (Persistenz-Zaehlung inkl. Bruch durch Regimewechsel/manuellen Override, erster Tageslauf), echter Config-Kopie-Test fuer set_regime_manueller_override() (inkl. Kommentar-Erhalt + Rollback bei ungueltigem Wert), Tk-Smoke-Test des kompletten Regime-Tabs inkl. Override-Anwenden-Flow, Compile-Check aller geaenderten Module.</w:t>
       </w:r>
     </w:p>
     <w:p>

</xml_diff>

<commit_message>
Makro-Kennzahl 'X von Y im Regime-Konflikt' im Regime-Tab + Remote-Karte
Neue Funktion regime_konflikt_uebersicht() zaehlt, wie viele der aktuell
aktiven Hebel-Kandidaten (juengstes offenes/nicht ueberholtes Signal je
Symbol+Richtung) dem aktuellen Regime widersprechen - reine Momentaufnahme
aus bereits vorhandenen Daten, bewusst ohne Backtest-Wartezeit umgesetzt
(kein neuer Deckel, nur ein beschreibender Fakt wie Fear&Greed/VIX). Macht
sichtbar, ob eine einzelne Konfidenz-Einschaetzung im Kontext des
Gesamtmarkts die Ausnahme oder die Regel ist.
</commit_message>
<xml_diff>
--- a/Basisinfos/Regelwerksmanual.docx
+++ b/Basisinfos/Regelwerksmanual.docx
@@ -9963,6 +9963,12 @@
       <w:pPr/>
       <w:r>
         <w:t>Manueller Override als sichtbares GUI-Setting (vorher ein reines Uboot, nur per Hand in config.yaml editierbar): config.py::set_regime_manueller_override() schreibt den Top-Level-Skalar regime.manueller_override (RG-8) nach demselben Backup-/Schreib-/Reparse-/Rollback-Muster wie _update_watchlist_field(). Neues Combobox-Control im Regime-Tab (ui/regime_view.py) mit den 6 gueltigen Werten + Anwenden-Button, plus Hinweistext, dass die Regime-Persistenz-Zaehlung waehrend eines aktiven Overrides pausiert.</w:t>
+      </w:r>
+    </w:p>
+    <w:p>
+      <w:pPr/>
+      <w:r>
+        <w:t>Makro-Kennzahl "X von Y im Regime-Konflikt" (2026-07-26): agent/krypto/regime.py::regime_konflikt_uebersicht() - reine Momentaufnahme ueber alle aktuell aktiven Hebel-Kandidaten (juengstes echtes Signal je (symbol, richtung) mit outcome_status in None/"offen", also weder aufgeloest noch ueberholt), gezaehlt gegen das aktuelle Regime (regime_konflikt_hebel(), dieselbe Bedingung wie der Hebel-Deckel selbst). Bewusst OHNE Backtest-Wartezeit umgesetzt: anders als die Risikofaktoren-Haeufungs-Regel ist das kein neuer Deckel/keine neue Vorhersage, sondern ein rein beschreibender Fakt - gleiches Prinzip wie Fear&amp;Greed oder VIX, sofort nutzbar ohne historische Fallzahlen. Sichtbar im Regime-Tab und in der Remote-Karte ("X von Y aktiven Kandidaten").</w:t>
       </w:r>
     </w:p>
     <w:p>

</xml_diff>

<commit_message>
Konfidenz-Kalibrierungskurve aus Backward-Tracking-Daten (Punkt 3)
Neue compute_konfidenz_kalibrierung() vergleicht je Konfidenz-Band
(niedrig/mittel/hoch, bestehende Schwellen aus risk_gate.py) die
durchschnittlich vorhergesagte Konfidenz mit der tatsaechlichen
Trefferquote bereits aufgeloester Signale - beantwortet ohne neue
Datenquelle, ob confidence_pct ueberhaupt kalibriert ist. Neue Remote-
Karte zeigt das Ergebnis je Assetklasse/Hebel, kein neuer Deckel.

Co-Authored-By: Claude Sonnet 5 <noreply@anthropic.com>
</commit_message>
<xml_diff>
--- a/Basisinfos/Regelwerksmanual.docx
+++ b/Basisinfos/Regelwerksmanual.docx
@@ -9981,6 +9981,12 @@
       <w:pPr/>
       <w:r>
         <w:t>Verifiziert: synthetische Tests (Persistenz-Zaehlung inkl. Bruch durch Regimewechsel/manuellen Override, erster Tageslauf), echter Config-Kopie-Test fuer set_regime_manueller_override() (inkl. Kommentar-Erhalt + Rollback bei ungueltigem Wert), Tk-Smoke-Test des kompletten Regime-Tabs inkl. Override-Anwenden-Flow, Compile-Check aller geaenderten Module.</w:t>
+      </w:r>
+    </w:p>
+    <w:p>
+      <w:pPr/>
+      <w:r>
+        <w:t>Nachtrag (2026-07-26): Konfidenz-Kalibrierungskurve (dritter der drei urspruenglich vorgeschlagenen Bausteine, hier als Punkt 3 bewusst zuerst umgesetzt). agent/krypto/backward_tracking.py::compute_konfidenz_kalibrierung() beantwortet die Kernfrage der 2026er-LLM-Forecasting-Recherche dieser Session - haelt confidence_pct ueberhaupt, was es verspricht - komplett aus bereits vorhandenen Daten, ohne neue externe Datenquelle. Gruppiert alle bereits aufgeloesten Signale (_RESOLVED_OUTCOMES, gleiche Menge wie compute_provider_performance()) nach Konfidenz-Band (niedrig/mittel/hoch, dieselben Grenzen wie risk_gate.py::KONFIDENZ_SCHWELLE_NIEDRIG/HOCH, keine neu erfundenen Baender) und vergleicht je Band die durchschnittlich vorhergesagte Konfidenz mit der tatsaechlichen Trefferquote. Tier-Aufschluesselung identisch zu compute_provider_performance() (Spot optional nach Assetklasse, Hebel gesondert). Mindeststichprobe wiederverwendet _MIN_SAMPLE_FUER_AUSSAGE = 15. Neue Remote-Karte Konfidenz-Kalibrierung zeigt je Band vorhergesagt vs. tatsaechlich, grosse Abweichungen (&gt;=15 Prozentpunkte, rein optische Hervorhebung, kein neuer Deckel) orange markiert. Backtest-first gilt hier nicht (rein beschreibender Fakt, kein neuer Deckel/keine neue Vorhersage-Regel). Reale Datenlage (Desktop-DB-Kopie geprueft): aktuell 0 aufgeloeste Signale mit confidence_pct - Desktop-DB ist seit 2026-07-10 keine Live-Quelle mehr, echte Pruefung erst gegen einen aktuellen Notebook-Export moeglich. Verifiziert: synthetische Tests (Bucketing, Liquidation als Fehlschlag, Watchlist-Assetklassen-Variante, Ausschluss offener/confidence-loser Signale), End-to-End-Wiring-Test remote/status.py, Compile-Check aller geaenderten Module.</w:t>
       </w:r>
     </w:p>
     <w:p>

</xml_diff>

<commit_message>
Deribit-Optionsmarkt-Anreicherung fuer Hebel-Signale (Punkt 2, BTC/ETH)
DVOL + naeherungsweiser Options-Skew (Deribit, oeffentliche Endpunkte) als
Cross-Check-Fakt gegen die eigene confidence_pct des Modells - Widerspruch
aeussert sich ueber das bereits bestehende gegenargument-Feld, kein neuer
deterministischer Risikofaktor. Scope bewusst BTC/ETH-only: SOL/XRP-Options-
maerkte sind laut Live-Check aktuell inaktiv, trotz gelisteter Waehrung.

Co-Authored-By: Claude Sonnet 5 <noreply@anthropic.com>
</commit_message>
<xml_diff>
--- a/Basisinfos/Regelwerksmanual.docx
+++ b/Basisinfos/Regelwerksmanual.docx
@@ -9987,6 +9987,12 @@
       <w:pPr/>
       <w:r>
         <w:t>Nachtrag (2026-07-26): Konfidenz-Kalibrierungskurve (dritter der drei urspruenglich vorgeschlagenen Bausteine, hier als Punkt 3 bewusst zuerst umgesetzt). agent/krypto/backward_tracking.py::compute_konfidenz_kalibrierung() beantwortet die Kernfrage der 2026er-LLM-Forecasting-Recherche dieser Session - haelt confidence_pct ueberhaupt, was es verspricht - komplett aus bereits vorhandenen Daten, ohne neue externe Datenquelle. Gruppiert alle bereits aufgeloesten Signale (_RESOLVED_OUTCOMES, gleiche Menge wie compute_provider_performance()) nach Konfidenz-Band (niedrig/mittel/hoch, dieselben Grenzen wie risk_gate.py::KONFIDENZ_SCHWELLE_NIEDRIG/HOCH, keine neu erfundenen Baender) und vergleicht je Band die durchschnittlich vorhergesagte Konfidenz mit der tatsaechlichen Trefferquote. Tier-Aufschluesselung identisch zu compute_provider_performance() (Spot optional nach Assetklasse, Hebel gesondert). Mindeststichprobe wiederverwendet _MIN_SAMPLE_FUER_AUSSAGE = 15. Neue Remote-Karte Konfidenz-Kalibrierung zeigt je Band vorhergesagt vs. tatsaechlich, grosse Abweichungen (&gt;=15 Prozentpunkte, rein optische Hervorhebung, kein neuer Deckel) orange markiert. Backtest-first gilt hier nicht (rein beschreibender Fakt, kein neuer Deckel/keine neue Vorhersage-Regel). Reale Datenlage (Desktop-DB-Kopie geprueft): aktuell 0 aufgeloeste Signale mit confidence_pct - Desktop-DB ist seit 2026-07-10 keine Live-Quelle mehr, echte Pruefung erst gegen einen aktuellen Notebook-Export moeglich. Verifiziert: synthetische Tests (Bucketing, Liquidation als Fehlschlag, Watchlist-Assetklassen-Variante, Ausschluss offener/confidence-loser Signale), End-to-End-Wiring-Test remote/status.py, Compile-Check aller geaenderten Module.</w:t>
+      </w:r>
+    </w:p>
+    <w:p>
+      <w:pPr/>
+      <w:r>
+        <w:t>Nachtrag (2026-07-26): Deribit-Optionsmarkt-Anreicherung (Punkt 2 des Regime-Persistenz-Folge-Vorschlags, BTC/ETH, letzter der drei urspruenglich vorgeschlagenen Bausteine). api/deribit.py liest zwei oeffentliche Deribit-Endpunkte (kein API-Key, kein dokumentiertes Rate-Limit) - get_volatility_index() (DVOL, marktimplizite 30-Tage-Volatilitaet) und get_options_skew() (naeherungsweiser Risk-Reversal aus dem naechstgelegenen Verfallstermin, feste Moneyness-Ziele +-15% statt echtem 25-Delta - ein 25-Delta-Wert braeuchte pro Strike einen eigenen ticker()-Call, ~20-30 zusaetzliche Anfragen je Abruf, daher bewusst als Naeherung dokumentiert). Scope-Entscheidung live verifiziert: obwohl Deribits get_currencies auch SOL/XRP/MATIC/LINK/AVAX/ADA/BNB/BCH listet, ergab ein echter Live-Check null aktive Options-Instrumente fuer SOL/XRP - Punkt 2 bleibt daher BTC/ETH-only (aktuell nur BTC verdrahtet). Warum das gerade fuer BTC selbst sinnvoll ist: bei einem BTC-Signal ist der Optionsmarkt eine direkte, marktgepreiste Einschaetzung des exakt gehandelten Assets, nicht nur ein genereller Cross-Asset-Kontext wie bei anderen Coins. agent/krypto/optionsmarkt.py::optionsmarkt_fakt() uebersetzt die Rohwerte in einen Fakt fuer build_hebel_facts() (mirrort btc_relativwert_fakt(), bewusst KEINE hart kategorisierten DVOL-Baender - anders als VIX_BANDS gibt es keine vergleichbar etablierte DVOL-Skala, der Rohwert wird direkt genannt). fetch_optionsmarkt_fakt() ist der einzige Einstiegspunkt fuer hebel_pipeline.py - Live-Fetch bei jedem Hebel-Signal-Lauf, bewusst OHNE eigene Caching-Tabelle/Scheduler-Job (Hebel-Signale entstehen selten genug, kein dokumentiertes Rate-Limit - gleiches Muster wie anticyclic.py::assess() fuer die Kraken-Funding-Rate), faengt Netzwerkfehler selbst ab (P-8). Verwendung ausschliesslich als Cross-Check-Fakt, KEIN neuer deterministischer Risikofaktor: SYSTEM_PROMPT Regel 21 in hebel_analyst.py weist das Modell an, den Fakt gegen die eigene confidence_pct zu pruefen und einen Widerspruch in gegenargument zu benennen (bereits existierendes, angezeigtes Feld). config.yaml: neue Sektion deribit_optionsmarkt (aktiv: true). remote/server.py: deribit zu API_HEALTH_GROUPS ergaenzt. Verifiziert: synthetisch (optionsmarkt_fakt() mit/ohne DVOL/Skew, Call-/Put-Skew/symmetrisch-Wertung, aktiv:false-Toggle), echter Live-Abruf gegen die reale Deribit-API (BTC DVOL ca. 37.3%, echter Put-Skew ca. -9.0pp beobachtet), Compile-/Import-Check der gesamten Aufrufkette inkl. main.py/scheduler/background.py/budget_allocator.py.</w:t>
       </w:r>
     </w:p>
     <w:p>

</xml_diff>

<commit_message>
Z.ai-Gegenpruefungslogik: Konsistenz-Check Hard Facts vs. eigene Begruendung (Hebel-only, Phase 1 rein beobachtend)
Z.ai wird aus der automatischen LLM-Fallback-Kette geloest und prueft
stattdessen unabhaengig, ob die eigene Kurzbegruendung des Primaer-Modells
den harten, deterministischen Fakten widerspricht - live gegen Bias/Anker-
Effekte kalibriert (Sykophantie, fehlender Kontext, Antizyklik,
Persona-Framing verworfen wegen Latenz ohne Erkennungsvorteil). Der Call
laeuft in einem echten Hintergrund-Thread mit eigener DB-Verbindung, um die
zuvor behobene E-Mail-Latenz-Regression nicht erneut einzufuehren.
extract_notebook_diagnose.py um die neuen Felder/eine Aggregat-Sektion
ergaenzt und gegen die Produktions-DB verifiziert.

Co-Authored-By: Claude Sonnet 5 <noreply@anthropic.com>
</commit_message>
<xml_diff>
--- a/Basisinfos/Regelwerksmanual.docx
+++ b/Basisinfos/Regelwerksmanual.docx
@@ -14573,6 +14573,182 @@
     <w:p>
       <w:r>
         <w:t>Verifikation: beide Szenarien (eng beieinander liegende Zonen wie im Screenshot, sowie gut getrennte Zonen als Regressionscheck) visuell geprueft, volle Regressionssuite erneut gelaufen.</w:t>
+      </w:r>
+    </w:p>
+    <w:p>
+      <w:pPr>
+        <w:pStyle w:val="Heading3"/>
+      </w:pPr>
+      <w:r>
+        <w:t>Nachtrag (2026-07-26): Z.ai-Gegenpruefungslogik - unabhaengiger Konsistenz-Check (Hard Facts vs. eigene Begruendung), Hebel-only, rein beobachtend</w:t>
+      </w:r>
+    </w:p>
+    <w:p>
+      <w:pPr/>
+      <w:r>
+        <w:t>Nutzer-Idee: Z.ai (bisher Teil der automatischen Fallback-Kette in budget_allocator.py, aber praktisch selten genutzt, da Mistral/Groq/Gemini meist ausreichen) aus dieser Rolle loesen und stattdessen fuer eine kleine, dedizierte zweite Aufgabe verwenden - eine unabhaengige Gegenpruefung, ob die vom Primaer-Modell selbst gelieferte Kurzbegruendung (short_reasoning) den harten, deterministisch berechneten Fakten widerspricht.</w:t>
+      </w:r>
+    </w:p>
+    <w:p>
+      <w:pPr>
+        <w:pStyle w:val="Heading4"/>
+      </w:pPr>
+      <w:r>
+        <w:t>Design-Grundsatz: keine zweite Handelsentscheidung, keine externe 'Meinung'</w:t>
+      </w:r>
+    </w:p>
+    <w:p>
+      <w:pPr/>
+      <w:r>
+        <w:t>Der Nutzer schlug zunaechst vor, Z.ai zusaetzlich zu den Hard Facts auch sein eigenes 'Wissen' (z.B. Nachrichtenlage, 'neuer Investor bei Asset X') einbeziehen zu lassen, um der teils deterministisch wirkenden Antwortqualitaet mehr Tiefe zu geben. Nach Rueckfrage/Abwaegung: verworfen wegen Halluzinations-Risiko (Z.ai hat keinen echten, aktuellen Nachrichtenzugriff, wuerde also plausibel klingende, aber ggf. erfundene 'Fakten' einbringen). Stattdessen umgesetzt: ein reiner Konsistenz-Check zwischen der eigenen Begruendung des Primaer-Modells und den bereits vorhandenen harten Fakten - Z.ai bekommt keine Rolle als zweiter Entscheider, sondern rein als Pruefinstanz fuer innere Widerspruchsfreiheit. Diese Umformulierung wurde vom Nutzer ausdruecklich bestaetigt ('trifft es genau'), mit der zusaetzlichen Vorgabe, bekannte LLM-Bias-/Anker-Probleme von vornherein einzukalkulieren.</w:t>
+      </w:r>
+    </w:p>
+    <w:p>
+      <w:pPr>
+        <w:pStyle w:val="Heading4"/>
+      </w:pPr>
+      <w:r>
+        <w:t>Live-Kalibrierung gegen die echte Z.ai-API (nicht nur angenommen)</w:t>
+      </w:r>
+    </w:p>
+    <w:p>
+      <w:pPr>
+        <w:pStyle w:val="ListNumber"/>
+      </w:pPr>
+      <w:r>
+        <w:t>response_format={"type": "json_object"} ist Pflicht - ohne dieses Feld verpackt Z.ai die Antwort gelegentlich in Markdown-Codefences statt reinem JSON (Parse-Fehler in 1 von 3 Testlaeufen ohne das Feld, danach 3/3 sauber mit dem Feld).</w:t>
+      </w:r>
+    </w:p>
+    <w:p>
+      <w:pPr>
+        <w:pStyle w:val="ListNumber"/>
+      </w:pPr>
+      <w:r>
+        <w:t>Sykophantie-/Ueberzeugungs-Bias getestet: ein bewusst ueberzeugend formuliert, aber inhaltlich falscher Begruendungstext wurde trotzdem korrekt als Widerspruch erkannt.</w:t>
+      </w:r>
+    </w:p>
+    <w:p>
+      <w:pPr>
+        <w:pStyle w:val="ListNumber"/>
+      </w:pPr>
+      <w:r>
+        <w:t>Fehlender-Kontext-Fehlalarm getestet: ein Begruendungstext mit Bezug auf Informationen ausserhalb der gegebenen Fakten wurde korrekt NICHT als Widerspruch gewertet.</w:t>
+      </w:r>
+    </w:p>
+    <w:p>
+      <w:pPr>
+        <w:pStyle w:val="ListNumber"/>
+      </w:pPr>
+      <w:r>
+        <w:t>Antizyklik-Vertraeglichkeit getestet: ein Begruendungstext, der gegenlaeufige Fakten offen benennt und bewusst dagegen argumentiert (Kernprinzip der projekteigenen Antizyklisch-Regeln), wurde korrekt als konsistent gewertet.</w:t>
+      </w:r>
+    </w:p>
+    <w:p>
+      <w:pPr>
+        <w:pStyle w:val="ListNumber"/>
+      </w:pPr>
+      <w:r>
+        <w:t>Persona-Framing verworfen: eine Testvariante mit expliziter 'Risikomanager mit Fokus auf Selbstueberschaetzung'-Rolle lieferte in beiden Testfaellen (sauber/ueberzogen) IDENTISCHE Urteile wie die neutrale Formulierung, war aber messbar langsamer (47-50s vs. 26-35s) - kein Erkennungsvorteil, echter Latenzverlust. Entscheidung: neutrale Rahmung ohne Persona.</w:t>
+      </w:r>
+    </w:p>
+    <w:p>
+      <w:pPr>
+        <w:pStyle w:val="ListNumber"/>
+      </w:pPr>
+      <w:r>
+        <w:t>Kein im Prompt eingebettetes Beispiel - bewusst zur Vermeidung des bereits dokumentierten Anker-Kollaps-Fehlers (Regel 22/13, siehe Nachtrag 2026-07-24 'Gates-Kalibrierung').</w:t>
+      </w:r>
+    </w:p>
+    <w:p>
+      <w:pPr/>
+      <w:r>
+        <w:t>Typische Antwortzeit: 12-25s (eine reichere Faktenmenge kostet live verifiziert keine zusaetzliche Zeit gegenueber einer minimalen Menge).</w:t>
+      </w:r>
+    </w:p>
+    <w:p>
+      <w:pPr>
+        <w:pStyle w:val="Heading4"/>
+      </w:pPr>
+      <w:r>
+        <w:t>Architektur-Falle erkannt und korrigiert: echte Entkopplung statt blosser Umordnung</w:t>
+      </w:r>
+    </w:p>
+    <w:p>
+      <w:pPr/>
+      <w:r>
+        <w:t>Erster Entwurf platzierte den Z.ai-Call synchron innerhalb von generate_hebel_signal(), nach dem DB-Insert, aber noch vor return signal. Bei genauerer Pruefung (ausgeloest durch Nutzer-Hinweis auf den Z.ai-Timeout): der on_signal_ready-E-Mail-Callback (budget_allocator.py, siehe project_email_latenz_fix_batch_notification.md) feuert erst, NACHDEM generate_hebel_signal() tatsaechlich zurueckkehrt - eine Platzierung 'nach dem Insert, aber noch in der Funktion' haette die Rueckgabe der Funktion und damit den E-Mail-Versand um bis zu 150s (api/zai.py::REQUEST_TIMEOUT_SECONDS) verzoegert und genau die Latenz-Regression wieder eingefuehrt, die dieser Fix bereits einmal behoben hatte. Korrektur: echte Entkopplung ueber einen Hintergrund-Thread (threading.Thread(daemon=True)) mit eigener, frisch geoeffneter DB-Verbindung (db.get_connection() - sqlite3-Verbindungen sind nicht Thread-sicher teilbar, analog zum bestehenden ThreadPoolExecutor-Muster aus dem yfinance-Fix). generate_hebel_signal() kehrt jetzt exakt so schnell zurueck wie vor dieser Aenderung; die Konsistenzpruefung und der DB-Update laufen vollstaendig asynchron danach ab, begrenzt nur durch Z.ais eigenen 150s-Timeout.</w:t>
+      </w:r>
+    </w:p>
+    <w:p>
+      <w:pPr>
+        <w:pStyle w:val="Heading4"/>
+      </w:pPr>
+      <w:r>
+        <w:t>Umsetzung</w:t>
+      </w:r>
+    </w:p>
+    <w:p>
+      <w:pPr>
+        <w:pStyle w:val="ListBullet"/>
+      </w:pPr>
+      <w:r>
+        <w:t>agent/krypto/gegenpruefung.py (neu): baue_fakten() (schmale Faktenmenge: symbol/richtung/action/confidence_pct/rsi/trend/regime/funding-Vorzeichen/technische Konfluenz/Optionsmarkt-Skew), pruefe_konsistenz() (P-8, faengt Netzwerkfehler und ungueltige Antworten ab, gibt None zurueck statt zu werfen).</w:t>
+      </w:r>
+    </w:p>
+    <w:p>
+      <w:pPr>
+        <w:pStyle w:val="ListBullet"/>
+      </w:pPr>
+      <w:r>
+        <w:t>database/models.py + database/db.py: zwei neue Felder auf HebelSignal (zai_gegenpruefung_urteil, zai_gegenpruefung_kurzbegruendung), additive Migration, neue Funktion update_hebel_signal_zai_gegenpruefung() (Post-Insert-Update, da der Wert erst nach dem asynchronen Z.ai-Call vorliegt).</w:t>
+      </w:r>
+    </w:p>
+    <w:p>
+      <w:pPr>
+        <w:pStyle w:val="ListBullet"/>
+      </w:pPr>
+      <w:r>
+        <w:t>agent/krypto/hebel_pipeline.py: _zai_gegenpruefung_im_hintergrund() (Hintergrund-Thread-Ziel, eigene DB-Verbindung, P-8 doppelt abgesichert), Dispatch am Ende von generate_hebel_signal() nur wenn zai_client is not None.</w:t>
+      </w:r>
+    </w:p>
+    <w:p>
+      <w:pPr>
+        <w:pStyle w:val="ListBullet"/>
+      </w:pPr>
+      <w:r>
+        <w:t>agent/krypto/budget_allocator.py: Z.ai aus allen 3 automatischen Fallback-Ketten (Hebel-Kandidaten, Marktscan-Writeup, Spot-Rotation) entfernt, stattdessen als zai_client-Parameter an generate_hebel_signal() durchgereicht (Mistral- und Gemini-Zweig). Die bestehende Z.ai-Budget-Tracking-Maschinerie (zai_taegliches_budget etc.) ist dadurch vestigial (meldet dauerhaft 0/False fuer die Primaer-Generierung) - bewusst nicht entfernt, um diese Aenderung im Scope zu halten (dokumentierter, niedrig priorisierter loser Faden).</w:t>
+      </w:r>
+    </w:p>
+    <w:p>
+      <w:pPr>
+        <w:pStyle w:val="Heading4"/>
+      </w:pPr>
+      <w:r>
+        <w:t>Phase 1 (aktueller Stand): rein beobachtend</w:t>
+      </w:r>
+    </w:p>
+    <w:p>
+      <w:pPr/>
+      <w:r>
+        <w:t>urteil/kurzbegruendung werden gespeichert, aber nicht als Risikofaktor angezeigt, nicht als Gate verwendet, beeinflussen action/richtung/confidence_pct in keiner Weise (siehe feedback_llm_synthese_kein_deterministischer_override). Ob ein Gate jemals sinnvoll waere, haengt davon ab, ob sich diese Gegenpruefung ueber Zeit als tatsaechlich treffsicher erweist (Nutzer-Position: 'eher zu bezweifeln, es sei denn die Gegenpruefung ist so erfolgreich, dass dies tatsaechlich als Modell dienen kann').</w:t>
+      </w:r>
+    </w:p>
+    <w:p>
+      <w:pPr/>
+      <w:r>
+        <w:t>Scope v1: nur Hebel (analog zur Deribit-Optionsmarkt-Anreicherung).</w:t>
+      </w:r>
+    </w:p>
+    <w:p>
+      <w:pPr/>
+      <w:r>
+        <w:t>Verifiziert: Compile-Check, voller Import-Regressionscheck (main.py, scheduler/background.py, budget_allocator.py, hebel_pipeline.py), additive DB-Migration gegen echte Produktions-DB angewendet, End-to-End-Synthesetest (echter DB-Insert, simulierter langsamer Z.ai-Call via Hintergrund-Thread, Dispatch bestaetigt nicht-blockierend in &lt;1ms, DB-Update nach Thread-Abschluss verifiziert).</w:t>
+      </w:r>
+    </w:p>
+    <w:p>
+      <w:pPr/>
+      <w:r>
+        <w:t>Notebook-Analyse ergaenzt (extract_notebook_diagnose.py): zai_gegenpruefung_urteil/zai_gegenpruefung_kurzbegruendung zu _HEBEL_SIGNAL_SPALTEN ergaenzt sowie neue Aggregat-Sektion zai_gegenpruefung_verlauf (Zaehlung konsistent/widerspruch samt Begleitwerten fuer spaetere Korrelation mit dem tatsaechlichen Signal-Ausgang, analog zum Deribit-Cross-Check) - echter Lauf gegen die Produktions-DB bestaetigt (aktuell 0 Eintraege, da das Feature gerade erst gebaut wurde).</w:t>
       </w:r>
     </w:p>
     <w:sectPr>

</xml_diff>

<commit_message>
Z.ai-Gegenpruefung um unabhaengigen Richtungs-Abgleich erweitert + sichtbar in App/E-Mail
Zweiter, unabhaengiger Z.ai-Call (leite_eigene_richtung) neben dem
bestehenden Text-vs-Fakten-Konsistenz-Check: prueft per objektiven Fakten
(ohne richtung/action/confidence_pct, um Anker-/Echo-Effekte zu vermeiden),
ob Z.ai unabhaengig zur selben Richtung wie das Primaer-Modell kommt.
Uebereinstimmung wird deterministisch in Python verglichen, nicht vom LLM
selbst beurteilt. Beide Ergebnisse jetzt sichtbar in App-Detail-Panel und
Hebel-E-Mail (format_zai_gegenpruefung_lines). Bei der Gelegenheit: Fazit-
Zeile unterstreicht jetzt nur noch das Wort "Fazit:", nicht mehr die ganze
Zeile.

Co-Authored-By: Claude Sonnet 5 <noreply@anthropic.com>
</commit_message>
<xml_diff>
--- a/Basisinfos/Regelwerksmanual.docx
+++ b/Basisinfos/Regelwerksmanual.docx
@@ -13319,16 +13319,7 @@
         <w:pStyle w:val="ListBullet"/>
       </w:pPr>
       <w:r>
-        <w:t>Bugfix 1 (Duplikate über Seitengrenzen): derselbe Symbol-Eintrag</w:t>
-      </w:r>
-      <w:r>
-        <w:t xml:space="preserve"> tauchte teils auf mehreren Paginierungsseiten gleichzeitig auf (bis zu 53</w:t>
-      </w:r>
-      <w:r>
-        <w:t xml:space="preserve"> Duplikate bei total_count=3238 gemessen). Erster Fix: Deduplizierung</w:t>
-      </w:r>
-      <w:r>
-        <w:t xml:space="preserve"> per Symbol beim Sammeln - reichte allein NICHT aus (siehe Bugfix 2/3).</w:t>
+        <w:t xml:space="preserve">Bugfix 1 (Duplikate über Seitengrenzen): derselbe Symbol-Eintrag tauchte teils auf mehreren Paginierungsseiten gleichzeitig auf (bis zu 53 Duplikate bei total_count=3238 gemessen). Erster Fix: Deduplizierung per Symbol beim Sammeln - reichte allein NICHT aus (siehe Bugfix 2/3).</w:t>
       </w:r>
     </w:p>
     <w:p>
@@ -13336,25 +13327,7 @@
         <w:pStyle w:val="ListBullet"/>
       </w:pPr>
       <w:r>
-        <w:t>Bugfix 2 (verworfen, aber dokumentiert): die Vermutung, das</w:t>
-      </w:r>
-      <w:r>
-        <w:t xml:space="preserve"> ursprüngliche Abbruchkriterium page_number * page_size &gt;= total_count</w:t>
-      </w:r>
-      <w:r>
-        <w:t xml:space="preserve"> sei die Ursache (da total_count selbst instabil ist), führte zu einem</w:t>
-      </w:r>
-      <w:r>
-        <w:t xml:space="preserve"> Ersatz-Abbruchkriterium len(page_data) &lt; page_size. Live-Test zeigte:</w:t>
-      </w:r>
-      <w:r>
-        <w:t xml:space="preserve"> das machte es NICHT robuster, sondern schlimmer (163/173/211 Einträge</w:t>
-      </w:r>
-      <w:r>
-        <w:t xml:space="preserve"> über 6 Wiederholungen, teils fehlte real ZINC/SXR8/WTI komplett) - auch</w:t>
-      </w:r>
-      <w:r>
-        <w:t xml:space="preserve"> NICHT-letzte Seiten kamen serverseitig manchmal unvollständig zurück.</w:t>
+        <w:t xml:space="preserve">Bugfix 2 (verworfen, aber dokumentiert): die Vermutung, das ursprüngliche Abbruchkriterium page_number * page_size &gt;= total_count sei die Ursache (da total_count selbst instabil ist), führte zu einem Ersatz-Abbruchkriterium len(page_data) &lt; page_size. Live-Test zeigte: das machte es NICHT robuster, sondern schlimmer (163/173/211 Einträge über 6 Wiederholungen, teils fehlte real ZINC/SXR8/WTI komplett) - auch NICHT-letzte Seiten kamen serverseitig manchmal unvollständig zurück.</w:t>
       </w:r>
     </w:p>
     <w:p>
@@ -13362,46 +13335,7 @@
         <w:pStyle w:val="ListBullet"/>
       </w:pPr>
       <w:r>
-        <w:t>Bugfix 3 (tatsächliche Lösung): das Problem war die MEHRSEITIGE</w:t>
-      </w:r>
-      <w:r>
-        <w:t xml:space="preserve"> Paginierung selbst - der Datensatz verschiebt sich offenbar leicht</w:t>
-      </w:r>
-      <w:r>
-        <w:t xml:space="preserve"> zwischen einzelnen Roundtrips (Ursache serverseitig unbekannt). Live</w:t>
-      </w:r>
-      <w:r>
-        <w:t xml:space="preserve"> bestätigt: ein EINZELNER Request mit page_size=10000 (deutlich über dem</w:t>
-      </w:r>
-      <w:r>
-        <w:t xml:space="preserve"> aktuellen total_count=3238) liefert den kompletten Datensatz in einer</w:t>
-      </w:r>
-      <w:r>
-        <w:t xml:space="preserve"> Antwort - 6/6 Wiederholungen exakt stabil (3238 Einträge, 3185 eindeutige</w:t>
-      </w:r>
-      <w:r>
-        <w:t xml:space="preserve"> Symbole, alle 211 realen ETF/ETC/Metal-Symbole). Die Dedup-Notwendigkeit</w:t>
-      </w:r>
-      <w:r>
-        <w:t xml:space="preserve"> aus Bugfix 1 bleibt (der Datensatz selbst enthält echte Symbol-Kollisionen,</w:t>
-      </w:r>
-      <w:r>
-        <w:t xml:space="preserve"> ca. 53 Stück, keine Paginierungs-Artefakte) - die while-Schleife bleibt</w:t>
-      </w:r>
-      <w:r>
-        <w:t xml:space="preserve"> nur noch als Sicherheitsnetz für ein zukünftiges Wachstum über 10.000</w:t>
-      </w:r>
-      <w:r>
-        <w:t xml:space="preserve"> Einträge hinaus im Code, wird im Normalfall aber nie ein zweites Mal</w:t>
-      </w:r>
-      <w:r>
-        <w:t xml:space="preserve"> durchlaufen. Lektion: bei unzuverlässigen Paginierungs-APIs mit</w:t>
-      </w:r>
-      <w:r>
-        <w:t xml:space="preserve"> überschaubarer Gesamtgröße ist "alles in einer Anfrage mit großzügigem</w:t>
-      </w:r>
-      <w:r>
-        <w:t xml:space="preserve"> page_size" robuster als Mehrseiten-Konsistenz-Reparaturen.</w:t>
+        <w:t xml:space="preserve">Bugfix 3 (tatsächliche Lösung): das Problem war die MEHRSEITIGE Paginierung selbst - der Datensatz verschiebt sich offenbar leicht zwischen einzelnen Roundtrips (Ursache serverseitig unbekannt). Live bestätigt: ein EINZELNER Request mit page_size=10000 (deutlich über dem aktuellen total_count=3238) liefert den kompletten Datensatz in einer Antwort - 6/6 Wiederholungen exakt stabil (3238 Einträge, 3185 eindeutige Symbole, alle 211 realen ETF/ETC/Metal-Symbole). Die Dedup-Notwendigkeit aus Bugfix 1 bleibt (der Datensatz selbst enthält echte Symbol-Kollisionen, ca. 53 Stück, keine Paginierungs-Artefakte) - die while-Schleife bleibt nur noch als Sicherheitsnetz für ein zukünftiges Wachstum über 10.000 Einträge hinaus im Code, wird im Normalfall aber nie ein zweites Mal durchlaufen. Lektion: bei unzuverlässigen Paginierungs-APIs mit überschaubarer Gesamtgröße ist "alles in einer Anfrage mit großzügigem page_size" robuster als Mehrseiten-Konsistenz-Reparaturen.</w:t>
       </w:r>
     </w:p>
     <w:p>
@@ -14749,6 +14683,142 @@
       <w:pPr/>
       <w:r>
         <w:t>Notebook-Analyse ergaenzt (extract_notebook_diagnose.py): zai_gegenpruefung_urteil/zai_gegenpruefung_kurzbegruendung zu _HEBEL_SIGNAL_SPALTEN ergaenzt sowie neue Aggregat-Sektion zai_gegenpruefung_verlauf (Zaehlung konsistent/widerspruch samt Begleitwerten fuer spaetere Korrelation mit dem tatsaechlichen Signal-Ausgang, analog zum Deribit-Cross-Check) - echter Lauf gegen die Produktions-DB bestaetigt (aktuell 0 Eintraege, da das Feature gerade erst gebaut wurde).</w:t>
+      </w:r>
+    </w:p>
+    <w:p>
+      <w:pPr>
+        <w:pStyle w:val="Heading3"/>
+      </w:pPr>
+      <w:r>
+        <w:t xml:space="preserve">Nachtrag (2026-07-26, später): Z.ai-Gegenprüfung um unabhängigen Richtungs-Abgleich erweitert + sichtbar in App/E-Mail</w:t>
+      </w:r>
+    </w:p>
+    <w:p>
+      <w:pPr/>
+      <w:r>
+        <w:t xml:space="preserve">Erweitert die obige Gegenprüfungslogik direkt am selben Tag, ausgelöst durch eine Rückfrage des Nutzers, wo das Z.ai-Urteil im E-Mail-Text überhaupt zu sehen sei (bisher: nirgends, Phase 1 war bewusst rein beobachtend, nur in der DB gespeichert). Bei der Gelegenheit stellte sich heraus, dass der Nutzer sich an eine frühere Absprache erinnerte, die von der tatsächlich umgesetzten abwich - direkter Transkript-Abgleich (nicht nur Erinnerung) bestätigte: was tatsächlich vereinbart und mit "trifft es genau" bestätigt wurde, war ein reiner Text-vs-Fakten-Konsistenz-Check (siehe oben) - was der Nutzer jetzt zusätzlich wollte, war ein echtes JA/NEIN, ob Z.ai unabhängig zur selben Richtung (LONG/SHORT) kommt wie das Primär-Modell. Nutzer-Entscheidung nach kurzer Abwägung: </w:t>
+      </w:r>
+      <w:r>
+        <w:rPr>
+          <w:b/>
+        </w:rPr>
+        <w:t xml:space="preserve">beide Prüfungen als Paket</w:t>
+      </w:r>
+      <w:r>
+        <w:t xml:space="preserve">, nicht als Ersatz füreinander.</w:t>
+      </w:r>
+    </w:p>
+    <w:p>
+      <w:pPr>
+        <w:pStyle w:val="Heading4"/>
+      </w:pPr>
+      <w:r>
+        <w:t xml:space="preserve">Zwei getrennte Z.ai-Calls, bewusst NICHT ein kombinierter Call</w:t>
+      </w:r>
+    </w:p>
+    <w:p>
+      <w:pPr/>
+      <w:r>
+        <w:t xml:space="preserve">Der naheliegende erste Entwurf (ein Call, der beides zugleich beantwortet) wurde vor jeder Code-Zeile verworfen: baue_fakten() enthält bereits richtung/action/confidence_pct als Fakt. Würde dieselbe Faktenmenge auch für die Richtungsableitung verwendet, bekäme Z.ai die gesuchte Antwort praktisch vorgegeben (Echo-/Anker-Effekt) - der zweite Check wäre wertlos, da er keine wirklich unabhängige zweite Meinung mehr wäre. Lösung: ein zweiter, schmalerer Fakten-Baustein baue_objektive_fakten() (identisch zu baue_fakten(), aber OHNE richtung/action/confidence_pct), nur für den neuen Call leite_eigene_richtung() verwendet. Die eigentliche Übereinstimmungs-Prüfung (uebereinstimmung = "ja"|"nein") wird NICHT vom LLM selbst beurteilt, sondern deterministisch in Python berechnet (Vergleich eigene_richtung == primaer_richtung) - robuster als eine dritte Frage an ein LLM, ob es "übereinstimmt". NEUTRAL zählt wie jede andere Abweichung als "nein" (keine Sonderbehandlung, Nutzer-Entscheidung).</w:t>
+      </w:r>
+    </w:p>
+    <w:p>
+      <w:pPr>
+        <w:pStyle w:val="Heading4"/>
+      </w:pPr>
+      <w:r>
+        <w:t xml:space="preserve">Live-Kalibrierung: echte, nicht temperaturbedingte Antwort-Varianz gefunden</w:t>
+      </w:r>
+    </w:p>
+    <w:p>
+      <w:pPr/>
+      <w:r>
+        <w:t xml:space="preserve">Wiederholte identische Grenzfall-Faktensets (bearisher Trend + überverkaufter RSI als Gegen-Indikator) ergaben bei temperature=0.2 5/6 SHORT zu 1/6 NEUTRAL, bei temperature=0.0 4/6 SHORT zu 2/6 NEUTRAL - die Varianz verschwindet bei Temperatur 0 NICHT, ist also keine Sampling-Eigenart, sondern echte Modell-Unsicherheit beim Abwägen widersprüchlicher Signale. Per AskUserQuestion mit drei Optionen zur Entscheidung vorgelegt (Prompt nachschärfen / Rauschen akzeptieren / Frage anders stellen) - </w:t>
+      </w:r>
+      <w:r>
+        <w:rPr>
+          <w:b/>
+        </w:rPr>
+        <w:t xml:space="preserve">Nutzer-Entscheidung: Rauschen akzeptieren, keine Prompt-Nachschärfung</w:t>
+      </w:r>
+      <w:r>
+        <w:t xml:space="preserve">, ausdrücklich unter Verweis auf die bereits dokumentierte Anker-Kollaps-Gefahr bei übermäßig spezifizierten Prompts (Regel 22/13, siehe Nachtrag 2026-07-24 "Gates-Kalibrierung"). Die beobachtete Inkonsistenz wird als Teil dessen behandelt, was über Zeit beobachtet werden soll, statt weg-konstruiert zu werden.</w:t>
+      </w:r>
+    </w:p>
+    <w:p>
+      <w:pPr>
+        <w:pStyle w:val="Heading4"/>
+      </w:pPr>
+      <w:r>
+        <w:t xml:space="preserve">Umsetzung</w:t>
+      </w:r>
+    </w:p>
+    <w:p>
+      <w:pPr>
+        <w:pStyle w:val="ListBullet"/>
+      </w:pPr>
+      <w:r>
+        <w:t xml:space="preserve">agent/krypto/gegenpruefung.py: baue_objektive_fakten(), SYSTEM_PROMPT_RICHTUNG, leite_eigene_richtung() (P-8, validiert eigene_richtung gegen {LONG, SHORT, NEUTRAL}).</w:t>
+      </w:r>
+    </w:p>
+    <w:p>
+      <w:pPr>
+        <w:pStyle w:val="ListBullet"/>
+      </w:pPr>
+      <w:r>
+        <w:t xml:space="preserve">database/models.py + database/db.py: drei neue HebelSignal-Felder (zai_eigene_richtung, zai_uebereinstimmung, zai_richtung_kurzbegruendung), additive Migration gegen die echte Produktions-DB angewendet und verifiziert. update_hebel_signal_zai_gegenpruefung() um die drei Parameter erweitert - Docstring warnt jetzt explizit davor, die Funktion zweimal pro Datensatz aufzurufen (würde den ersten Aufruf durch die Default-None-Werte des zweiten stillschweigend überschreiben).</w:t>
+      </w:r>
+    </w:p>
+    <w:p>
+      <w:pPr>
+        <w:pStyle w:val="ListBullet"/>
+      </w:pPr>
+      <w:r>
+        <w:t xml:space="preserve">agent/krypto/hebel_pipeline.py: _zai_gegenpruefung_im_hintergrund() führt beide Z.ai-Calls sequenziell im selben Hintergrund-Thread aus, berechnet uebereinstimmung deterministisch, schreibt alle 5 Felder in EINEM db.update_...()-Aufruf (verhindert das oben genannte Überschreiben bei Teilfehlschlägen - nur wenn BEIDE Calls fehlschlagen, entfällt der Update komplett).</w:t>
+      </w:r>
+    </w:p>
+    <w:p>
+      <w:pPr>
+        <w:pStyle w:val="ListBullet"/>
+      </w:pPr>
+      <w:r>
+        <w:t xml:space="preserve">ui/formatting.py: format_zai_gegenpruefung_lines() (zwei Zeilen, gleiche ▲/▼-Symbolik wie Risikofaktoren, farbig aber NICHT fett - Abstufung Abschnitts-Header &gt; Fazit &gt; Risikofaktoren/Z.ai bleibt erhalten). Bei der Gelegenheit zusätzlicher, unabhängiger Nutzer-Wunsch umgesetzt: bei der Fazit-Zeile ist jetzt nur noch das Wort "Fazit:" unterstrichen, nicht mehr die ganze Zeile (_split_fazit_label(), zwei HTML-Spans für die E-Mail, zwei Tk-Tags mit Bereichs-Split für die App - Tk mischt Font-Eigenschaften überlappender Tags nicht, daher zwei vollständig eigene Font-Objekte statt eines gemeinsamen).</w:t>
+      </w:r>
+    </w:p>
+    <w:p>
+      <w:pPr>
+        <w:pStyle w:val="ListBullet"/>
+      </w:pPr>
+      <w:r>
+        <w:t xml:space="preserve">ui/detail_panel.py: neue fazit_label_*-Tags (fett+unterstrichen), nach den bestehenden fazit_*-Tags (fett only) konfiguriert - später konfigurierte Tags gewinnen bei Tk für überlappende Zeichenbereiche.</w:t>
+      </w:r>
+    </w:p>
+    <w:p>
+      <w:pPr>
+        <w:pStyle w:val="ListBullet"/>
+      </w:pPr>
+      <w:r>
+        <w:t xml:space="preserve">ui/hebel_view.py: format_zai_gegenpruefung_lines()-Aufruf direkt nach dem bestehenden Fazit-Block im Detail-Panel.</w:t>
+      </w:r>
+    </w:p>
+    <w:p>
+      <w:pPr>
+        <w:pStyle w:val="ListBullet"/>
+      </w:pPr>
+      <w:r>
+        <w:t xml:space="preserve">scheduler/background.py: neue _formatiere_zai_gegenpruefung() (eigene Kopie für den E-Mail-Textkontext, analog _formatiere_fazit()), nur in _notify_hebel_signal() verdrahtet (Signal/Spot hat diese Felder nicht).</w:t>
+      </w:r>
+    </w:p>
+    <w:p>
+      <w:pPr/>
+      <w:r>
+        <w:t xml:space="preserve">Verifiziert: Compile-Check + Import-Regression (ui.hebel_view, scheduler.background, main); synthetischer Test aller 3 E-Mail-Textbau-Fälle (beide Felder gesetzt, nur Konsistenz-Check gesetzt, beide leer); Tk-Smoke-Test von render_detail_text() mit Fazit- und Z.ai-Zeilen gemischt (bestätigt: Fazit bekommt fazit_positiv + fazit_label_positiv nur über "Fazit:", Z.ai-Zeilen bekommen risk_negativ/risk_positiv über die ganze Zeile, keine Fett-Formatierung); HTML-Rendering (render_detail_html()) mit derselben Zeilenmischung geprüft (Fazit-Split in zwei Spans, Z.ai-Zeilen ein Span, keine Unterstreichung).</w:t>
+      </w:r>
+    </w:p>
+    <w:p>
+      <w:pPr/>
+      <w:r>
+        <w:t xml:space="preserve">Scope bleibt Hebel-only (v1-Entscheidung unverändert). Phase 1 (rein beobachtend, kein Gate) gilt unverändert auch für den neuen Richtungs-Abgleich.</w:t>
       </w:r>
     </w:p>
     <w:sectPr>

</xml_diff>

<commit_message>
GUI-Zeitstempel-Fix: format_zeitpunkt_lokal() aus scheduler/background.py in ui/formatting.py verschoben, 11 GUI-Stellen umgestellt
Nutzer-Fund per Screenshot-Vergleich (GUI-Zeitstempel vs. E-Mail-Ankunftszeit):
BTC-SHORT stand in der Hebel-Liste mit "15:14", die E-Mail kam um "17:14" an -
sah wie eine 2-Stunden-Verzoegerung aus. War keine: derselbe Bug wie der
bereits gefixte E-Mail-Fund vom 2026-07-21, nur an 11 anderen Stellen
(ui/app.py, ui/hebel_view.py x4, ui/signals_view.py x4,
ui/letzte_bewertung.py, ui/regime_view.py) - die GUI zeigte weiterhin den
rohen UTC-Zeitstempel ohne Umrechnung auf lokale Zeit.

format_zeitpunkt_lokal() jetzt im gemeinsamen, Tk-freien ui/formatting.py
(wie bereits format_fazit_lines()/format_zai_gegenpruefung_lines()) statt nur
in scheduler/background.py - GUI und E-Mail koennen dadurch nicht mehr
auseinanderlaufen, da nur noch eine Implementierung existiert.

Co-Authored-By: Claude Sonnet 5 <noreply@anthropic.com>
</commit_message>
<xml_diff>
--- a/Basisinfos/Regelwerksmanual.docx
+++ b/Basisinfos/Regelwerksmanual.docx
@@ -14930,6 +14930,54 @@
       <w:pPr/>
       <w:r>
         <w:t xml:space="preserve">Noch offen (Notebook-Deployment): der Notebook-Diagnose-Export vom 26.07. abends zeigte, dass der 24/7-Produktivserver zum Zeitpunkt des Screenshot-Funds noch auf dem Code-Stand VOR dem Richtungs-Abgleich lief (keine zai_eigene_richtung/zai_uebereinstimmung-Werte in den exportierten Rohdaten) - erst nach Pull+Neustart am Notebook greifen sowohl der Richtungs-Abgleich als auch dieser E-Mail-Fix dort live. Zusätzlich wurde extract_notebook_diagnose.py in dieser Runde NICHT um die 3 neuen Spalten erweitert - die zai_gegenpruefung_verlauf-Aggregatsektion zeigt bis dahin weiterhin nur den Konsistenz-Check, nicht den Richtungs-Abgleich (loser Faden, niedrige Priorität, siehe Memory).</w:t>
+      </w:r>
+    </w:p>
+    <w:p>
+      <w:pPr>
+        <w:pStyle w:val="Heading3"/>
+      </w:pPr>
+      <w:r>
+        <w:t xml:space="preserve">Nachtrag (2026-07-26, zum Abschluss dieses Tages): GUI zeigte Zeitstempel systemweit roh in UTC statt lokal - derselbe Fehler wie beim E-Mail-Fix vom 2026-07-21, nur an 11 anderen Stellen</w:t>
+      </w:r>
+    </w:p>
+    <w:p>
+      <w:pPr/>
+      <w:r>
+        <w:t xml:space="preserve">Nutzer verglich einen Screenshot des Hebel-Tabs mit der zugehörigen E-Mail: BTC-SHORT stand in der GUI-Liste mit "2026-07-26 15:14", die E-Mail kam aber laut Posteingang um "17:14" an - auf den ersten Blick wie eine 2-Stunden-Verzögerung. War keine: exakt derselbe Fund wie im Nachtrag vom 2026-07-21 ("Delta Berechnung/LLM-Abfrage"), nur diesmal zwischen GUI und E-Mail statt zwischen Berechnung und Versand.</w:t>
+      </w:r>
+    </w:p>
+    <w:p>
+      <w:pPr>
+        <w:pStyle w:val="Heading4"/>
+      </w:pPr>
+      <w:r>
+        <w:t xml:space="preserve">Root Cause</w:t>
+      </w:r>
+    </w:p>
+    <w:p>
+      <w:pPr/>
+      <w:r>
+        <w:t xml:space="preserve">Der 2026-07-21-Fix (_formatiere_zeitpunkt_lokal(), konvertiert UTC auf die lokale Systemzeitzone via astimezone()) lebte ausschließlich in scheduler/background.py und wurde nur für den E-Mail-Text verwendet. Die App-GUI hatte ihr eigenes, nie synchronisiertes Muster (created_at[:16].replace("T", " "), ROH, ohne Umrechnung) an 11 Stellen in 5 Dateien: ui/app.py, ui/hebel_view.py (4x), ui/signals_view.py (4x), ui/letzte_bewertung.py, ui/regime_view.py. Jede Liste/jedes Detail-Panel/jeder Historie-Dialog zeigte also weiterhin die rohe UTC-Zeit - bei CEST (UTC+2) optisch immer exakt 2 Stunden "zu früh".</w:t>
+      </w:r>
+    </w:p>
+    <w:p>
+      <w:pPr>
+        <w:pStyle w:val="Heading4"/>
+      </w:pPr>
+      <w:r>
+        <w:t xml:space="preserve">Fix: eine gemeinsame Funktion statt zwei getrennter Kopien</w:t>
+      </w:r>
+    </w:p>
+    <w:p>
+      <w:pPr/>
+      <w:r>
+        <w:t xml:space="preserve">_formatiere_zeitpunkt_lokal() nach ui/formatting.py::format_zeitpunkt_lokal() verschoben (dieses Modul ist bereits das etablierte, Tk-freie Gemeinsamkeits-Modul zwischen App und E-Mail, siehe format_zai_gegenpruefung_lines()/format_fazit_lines() weiter oben). scheduler/background.py importiert die Funktion jetzt von dort (Re-Export unter dem alten Namen, alle bestehenden Aufrufstellen unverändert). Alle 11 GUI-Stellen auf format_zeitpunkt_lokal() umgestellt - dadurch können GUI und E-Mail nicht mehr auseinanderlaufen, weil es nur noch EINE Implementierung gibt statt zweier potenziell divergierender Kopien.</w:t>
+      </w:r>
+    </w:p>
+    <w:p>
+      <w:pPr/>
+      <w:r>
+        <w:t xml:space="preserve">Verifiziert: Compile-Check + Import-Regression aller 7 geänderten Dateien; direkter Funktionstest gegen den echten BTC-Zeitstempel aus dem Vorfall (2026-07-26T15:14:07+00:00 -&gt; 2026-07-26 17:14, exakt die E-Mail-Ankunftszeit aus dem Nutzer-Screenshot) sowie Randfälle (None, leerer String, ungültiges Format). Kein Tk-Smoke-Test nötig - reine Funktionsaufruf-Substitution mit identischer Signatur je Stelle.</w:t>
       </w:r>
     </w:p>
     <w:sectPr>

</xml_diff>

<commit_message>
extract_notebook_diagnose.py: Z.ai-Richtungs-Abgleich-Spalten in Export nachgezogen
_zai_gegenpruefung_verlauf() und _HEBEL_SIGNAL_SPALTEN kannten die 3 neuen
Spalten (zai_eigene_richtung, zai_uebereinstimmung, zai_richtung_kurzbegruendung)
aus dem heutigen Richtungs-Abgleich-Feature nicht - der Export zeigte deshalb
keine Richtungs-Daten, obwohl am Notebook bereits Z.ai-Abfragen gelaufen sein
koennten. Zusaetzlicher Fund: der alte WHERE-Filter (nur auf
zai_gegenpruefung_urteil) haette jeden Datensatz verschluckt, bei dem NUR der
Richtungs-Call gelang. Filter auf ODER umgestellt, neue Aggregat-Felder
ergaenzt. Synthetisch mit 4 Szenarien verifiziert.

Co-Authored-By: Claude Sonnet 5 <noreply@anthropic.com>
</commit_message>
<xml_diff>
--- a/Basisinfos/Regelwerksmanual.docx
+++ b/Basisinfos/Regelwerksmanual.docx
@@ -14978,6 +14978,60 @@
       <w:pPr/>
       <w:r>
         <w:t xml:space="preserve">Verifiziert: Compile-Check + Import-Regression aller 7 geänderten Dateien; direkter Funktionstest gegen den echten BTC-Zeitstempel aus dem Vorfall (2026-07-26T15:14:07+00:00 -&gt; 2026-07-26 17:14, exakt die E-Mail-Ankunftszeit aus dem Nutzer-Screenshot) sowie Randfälle (None, leerer String, ungültiges Format). Kein Tk-Smoke-Test nötig - reine Funktionsaufruf-Substitution mit identischer Signatur je Stelle.</w:t>
+      </w:r>
+    </w:p>
+    <w:p>
+      <w:pPr>
+        <w:pStyle w:val="Heading3"/>
+      </w:pPr>
+      <w:r>
+        <w:t xml:space="preserve">Nachtrag (2026-07-26, Abschluss): extract_notebook_diagnose.py verschluckte teilweise erfolgreiche Z.ai-Richtungs-Calls</w:t>
+      </w:r>
+    </w:p>
+    <w:p>
+      <w:pPr/>
+      <w:r>
+        <w:t xml:space="preserve">Nutzer wollte eine echte Gegenüberstellung LLM 1 (Mistral, Primär-Richtung) vs. LLM 2 (Z.ai, unabhängige Richtungsableitung) und wies zurecht darauf hin, dass Z.ai-Abfragen bereits gelaufen waren - die vorherige Einschätzung ("keine Daten vorhanden") war unvollständig recherchiert.</w:t>
+      </w:r>
+    </w:p>
+    <w:p>
+      <w:pPr>
+        <w:pStyle w:val="Heading4"/>
+      </w:pPr>
+      <w:r>
+        <w:t xml:space="preserve">Root Cause</w:t>
+      </w:r>
+    </w:p>
+    <w:p>
+      <w:pPr/>
+      <w:r>
+        <w:t xml:space="preserve">_zai_gegenpruefung_verlauf() in extract_notebook_diagnose.py wurde beim Bau des zweiten Z.ai-Calls (Richtungs-Abgleich, siehe voriger Nachtrag) nicht mit erweitert: weder SELECT-Spaltenliste noch _HEBEL_SIGNAL_SPALTEN kannten zai_eigene_richtung/zai_uebereinstimmung/zai_richtung_kurzbegruendung. Schlimmer als reines Fehlen: der WHERE-Filter (zai_gegenpruefung_urteil IS NOT NULL) hätte jeden Datensatz, bei dem NUR der Richtungs-Call gelang (Konsistenz-Call fehlgeschlagen), komplett aus der Aggregation verschwinden lassen, obwohl er echte Z.ai-Ergebnisse enthält.</w:t>
+      </w:r>
+    </w:p>
+    <w:p>
+      <w:pPr>
+        <w:pStyle w:val="Heading4"/>
+      </w:pPr>
+      <w:r>
+        <w:t xml:space="preserve">Fix</w:t>
+      </w:r>
+    </w:p>
+    <w:p>
+      <w:pPr/>
+      <w:r>
+        <w:t xml:space="preserve">_HEBEL_SIGNAL_SPALTEN um die 3 neuen Spalten erweitert. WHERE-Filter in _zai_gegenpruefung_verlauf() auf ODER umgestellt (zai_gegenpruefung_urteil IS NOT NULL OR zai_eigene_richtung IS NOT NULL), neue Aggregat-Felder anzahl_richtung_gesamt/anzahl_uebereinstimmung/anzahl_abweichung ergänzt, symmetrisch zu den bestehenden Konsistenz-Feldern.</w:t>
+      </w:r>
+    </w:p>
+    <w:p>
+      <w:pPr/>
+      <w:r>
+        <w:t xml:space="preserve">Verifiziert: Compile-Check; synthetischer Test mit 4 Szenarien (kein Z.ai-Call, nur Konsistenz-Call, nur Richtungs-Call, beide Calls mit Abweichung) - bestätigt insbesondere, dass der zuvor verschluckte "nur Richtungs-Call gelang"-Fall jetzt korrekt erfasst wird.</w:t>
+      </w:r>
+    </w:p>
+    <w:p>
+      <w:pPr/>
+      <w:r>
+        <w:t xml:space="preserve">Nächster Schritt (Nutzer-Aktion erforderlich): extract_notebook_diagnose.py muss am Notebook (nicht Desktop) mit dem aktuellen Code-Stand erneut laufen und der Export nach Google Drive synchronisiert werden, damit die eigentlich gewünschte LLM1-vs-Z.ai-Gegenüberstellung überhaupt möglich wird.</w:t>
       </w:r>
     </w:p>
     <w:sectPr>

</xml_diff>

<commit_message>
Retail-Konsens komplett aus Hebel-top_gruende verbannt (deterministisch statt nur Prompt)
Erste echte LLM1-vs-Z.ai-Gegenueberstellung ergab 0/12 Uebereinstimmung. Analyse
zeigte: der gestern (f4e9c0e) gefixte Antizyklisch-Loophole wurde am Folgetag in
4 von 5 geprueften Signalen erneut verletzt, teils sogar unter dem korrekten
Label selbst - Regel 8 war nur eine Prompt-Anweisung, keine Code-Pruefung.
Retail-/Long-Konten-Positionierung wird bei Hebel bereits korrekt als
Risikofaktor (Abschnitt 3) bewertet; als top_gruende-Grund war sie strukturell
ein Non-Sequitur (Positionierung sagt etwas ueber Squeeze-Risiko, nicht ueber
Kursrichtung).

- antizyklisch aus TOP_GRUENDE_KATEGORIEN entfernt (hebel_analyst.py)
- neue filtere_retail_konsens_top_gruende() in post_check_hebel() (hebel_risk_gate.py)

Co-Authored-By: Claude Sonnet 5 <noreply@anthropic.com>
</commit_message>
<xml_diff>
--- a/Basisinfos/Regelwerksmanual.docx
+++ b/Basisinfos/Regelwerksmanual.docx
@@ -15032,6 +15032,310 @@
       <w:pPr/>
       <w:r>
         <w:t xml:space="preserve">Nächster Schritt (Nutzer-Aktion erforderlich): extract_notebook_diagnose.py muss am Notebook (nicht Desktop) mit dem aktuellen Code-Stand erneut laufen und der Export nach Google Drive synchronisiert werden, damit die eigentlich gewünschte LLM1-vs-Z.ai-Gegenüberstellung überhaupt möglich wird.</w:t>
+      </w:r>
+    </w:p>
+    <w:p>
+      <w:pPr>
+        <w:pStyle w:val="Heading3"/>
+      </w:pPr>
+      <w:r>
+        <w:t>Nachtrag (2026-07-26, Folgetag): Retail-Konsens ("antizyklisch") wird bei Hebel nie wieder in top_gruende zugelassen - deterministisch statt nur per Prompt</w:t>
+      </w:r>
+    </w:p>
+    <w:p>
+      <w:r>
+        <w:t>Nach der ersten echten LLM1-vs-Z.ai-Gegenueberstellung (0 von 12 Faellen mit</w:t>
+      </w:r>
+    </w:p>
+    <w:p>
+      <w:r>
+        <w:t>Uebereinstimmung, Z.ai sagte in keinem einzigen Fall LONG obwohl Mistral 11 von</w:t>
+      </w:r>
+    </w:p>
+    <w:p>
+      <w:r>
+        <w:t>12 Mal LONG waehlte) verlangte der Nutzer eine tiefere Analyse - mit der</w:t>
+      </w:r>
+    </w:p>
+    <w:p>
+      <w:r>
+        <w:t>korrekten Einordnung, dass der bestehende "antizyklisch"-Mechanismus zwei</w:t>
+      </w:r>
+    </w:p>
+    <w:p>
+      <w:r>
+        <w:t>voellig unterschiedliche Dinge verwechselt: AZ-4 (Boden-Akkumulation) gilt</w:t>
+      </w:r>
+    </w:p>
+    <w:p>
+      <w:r>
+        <w:t>bewusst nur Spot, nur BTC/ETH/SOL, gebunden an eine objektiv geschaetzte</w:t>
+      </w:r>
+    </w:p>
+    <w:p>
+      <w:r>
+        <w:t>Bodenzielzone - bei Hebel gibt es dafuer keine fachliche Rechtfertigung, hier</w:t>
+      </w:r>
+    </w:p>
+    <w:p>
+      <w:r>
+        <w:t>muss eine echte Long-Chance aus echter technischer Bestaetigung hervorgehen</w:t>
+      </w:r>
+    </w:p>
+    <w:p>
+      <w:r>
+        <w:t>(MACD/EMA-Struktur/RSI/Konfluenz), nicht aus Positionierungsdaten.</w:t>
+      </w:r>
+    </w:p>
+    <w:p>
+      <w:pPr>
+        <w:pStyle w:val="Heading4"/>
+      </w:pPr>
+      <w:r>
+        <w:t>Root Cause (echter Fund, nicht nur Konzeptfrage)</w:t>
+      </w:r>
+    </w:p>
+    <w:p>
+      <w:r>
+        <w:t>Der Vortag (Commit f4e9c0e, 2026-07-25) hatte bereits eine Regel-Luecke bei</w:t>
+      </w:r>
+    </w:p>
+    <w:p>
+      <w:r>
+        <w:t>genau diesem Thema gefixt (Retail-Konsens durfte nicht unter anderem</w:t>
+      </w:r>
+    </w:p>
+    <w:p>
+      <w:r>
+        <w:t>Kategorie-Label verkleidet werden). Trotzdem verletzten 4 von 5 am Folgetag</w:t>
+      </w:r>
+    </w:p>
+    <w:p>
+      <w:r>
+        <w:t>geprueften echten Hebel-Signalen (ONDO/INJ/BTC/TAO, alle Baer-Regime) dieselbe</w:t>
+      </w:r>
+    </w:p>
+    <w:p>
+      <w:r>
+        <w:t>Regel erneut - teils sogar unter dem korrekten Label antizyklisch selbst,</w:t>
+      </w:r>
+    </w:p>
+    <w:p>
+      <w:r>
+        <w:t>nicht nur ueber die Umbenennungs-Luecke. Log-Analyse bestaetigte: das Notebook</w:t>
+      </w:r>
+    </w:p>
+    <w:p>
+      <w:r>
+        <w:t>lief zwischen Fix-Commit und den betroffenen Signalen mehrfach neu (mehrere</w:t>
+      </w:r>
+    </w:p>
+    <w:p>
+      <w:r>
+        <w:t>Remote-Steuer-Seite-gestartet-Log-Zeilen dazwischen) - kein Deployment-Verzug,</w:t>
+      </w:r>
+    </w:p>
+    <w:p>
+      <w:r>
+        <w:t>sondern eine strukturelle Luecke: Regel 8 war ausschliesslich eine</w:t>
+      </w:r>
+    </w:p>
+    <w:p>
+      <w:r>
+        <w:t>Prompt-Anweisung, keine Code-Pruefung des tatsaechlichen text-Inhalts. Der</w:t>
+      </w:r>
+    </w:p>
+    <w:p>
+      <w:r>
+        <w:t>bereits vorhandene, korrekte deterministische Risikofaktor</w:t>
+      </w:r>
+    </w:p>
+    <w:p>
+      <w:r>
+        <w:t>(compute_risikofaktoren_hebel(), Abschnitt 3) klassifiziert denselben Rohwert</w:t>
+      </w:r>
+    </w:p>
+    <w:p>
+      <w:r>
+        <w:t>(long_konten_anteil_prozent) schon laengst richtig (negativ bei extremer</w:t>
+      </w:r>
+    </w:p>
+    <w:p>
+      <w:r>
+        <w:t>gleichgerichteter Mehrheit, neutral bei moderater, positiv nur bei echter</w:t>
+      </w:r>
+    </w:p>
+    <w:p>
+      <w:r>
+        <w:t>Gegenrichtung) - das Modell durfte denselben Wert in Abschnitt 1 (top_gruende)</w:t>
+      </w:r>
+    </w:p>
+    <w:p>
+      <w:r>
+        <w:t>trotzdem gegenteilig interpretieren, ein interner Widerspruch im selben</w:t>
+      </w:r>
+    </w:p>
+    <w:p>
+      <w:r>
+        <w:t>Signal.</w:t>
+      </w:r>
+    </w:p>
+    <w:p>
+      <w:pPr>
+        <w:pStyle w:val="Heading4"/>
+      </w:pPr>
+      <w:r>
+        <w:t>Fix</w:t>
+      </w:r>
+    </w:p>
+    <w:p>
+      <w:pPr>
+        <w:pStyle w:val="ListBullet"/>
+      </w:pPr>
+      <w:r>
+        <w:t>agent/krypto/hebel_analyst.py: antizyklisch komplett aus TOP_GRUENDE_KATEGORIEN entfernt (nur noch technisch/fundamental/makro/risiko) - das alte Label wird jetzt schon von der Schema-Validierung (_validate_hebel()) abgelehnt. Regel 8 neu gefasst: Retail-/Long-Konten-Positionierung gehoert grundsaetzlich nicht in top_gruende, weder stuetzend noch neutral, da sie bereits vollstaendig in Abschnitt 3 bewertet wird.</w:t>
+      </w:r>
+    </w:p>
+    <w:p>
+      <w:pPr>
+        <w:pStyle w:val="ListBullet"/>
+      </w:pPr>
+      <w:r>
+        <w:t>agent/krypto/hebel_risk_gate.py: neue Funktion filtere_retail_konsens_top_gruende() - entfernt jeden top_gruende-Eintrag, dessen Text auf Retail-/Long-/Short-Konten-Positionierung oder Long-Short-Ratio verweist, unabhaengig von Kategorie-Label. Angewendet ganz am Anfang von post_check_hebel(), bevor irgendeine andere Deckel-Logik greift. Lenient wie bei der Tranchen-Validierung: fehlende Rangplaetze sind unschaedlich, kein Retry/HALTEN-Fallback noetig.</w:t>
+      </w:r>
+    </w:p>
+    <w:p>
+      <w:r>
+        <w:t>Retail-/Long-Konten-Daten bleiben unveraendert als Fakt UND als Risikofaktor</w:t>
+      </w:r>
+    </w:p>
+    <w:p>
+      <w:r>
+        <w:t>(Abschnitt 3) vorhanden - nur die Verwendung als eigenstaendiger Grund in</w:t>
+      </w:r>
+    </w:p>
+    <w:p>
+      <w:r>
+        <w:t>Abschnitt 1 ist jetzt beidseitig (Prompt UND Code) ausgeschlossen.</w:t>
+      </w:r>
+    </w:p>
+    <w:p>
+      <w:pPr>
+        <w:pStyle w:val="Heading4"/>
+      </w:pPr>
+      <w:r>
+        <w:t>Warum das eine echte fachliche Verbesserung ist, nicht nur andere Zahlen</w:t>
+      </w:r>
+    </w:p>
+    <w:p>
+      <w:r>
+        <w:t>"Long-Konten-Anteil zeigt Raum fuer Erholung" ist ein Non-Sequitur:</w:t>
+      </w:r>
+    </w:p>
+    <w:p>
+      <w:r>
+        <w:t>Positionierungsdaten sagen etwas ueber Squeeze-/Liquidations-Risiko einer</w:t>
+      </w:r>
+    </w:p>
+    <w:p>
+      <w:r>
+        <w:t>bereits gehebelten Crowd aus, nicht darueber, ob der Kurs steigen sollte. Die</w:t>
+      </w:r>
+    </w:p>
+    <w:p>
+      <w:r>
+        <w:t>interne Konsistenz zwischen Abschnitt 1 und Abschnitt 3 desselben Signals war</w:t>
+      </w:r>
+    </w:p>
+    <w:p>
+      <w:r>
+        <w:t>vorher nicht gegeben (derselbe Rohwert wurde an zwei Stellen gegensaetzlich</w:t>
+      </w:r>
+    </w:p>
+    <w:p>
+      <w:r>
+        <w:t>gewertet) - das ist eine Korrektheits-, keine Geschmacksfrage. Die</w:t>
+      </w:r>
+    </w:p>
+    <w:p>
+      <w:r>
+        <w:t>quantitative Wirkung auf die reale Trefferquote (aktuell 9,4%, CRV -0,54) muss</w:t>
+      </w:r>
+    </w:p>
+    <w:p>
+      <w:r>
+        <w:t>trotzdem erst durch Beobachtung bestaetigt werden, nicht nur logisch</w:t>
+      </w:r>
+    </w:p>
+    <w:p>
+      <w:r>
+        <w:t>angenommen. Als Nebenbefund notiert, noch nicht geprueft: die</w:t>
+      </w:r>
+    </w:p>
+    <w:p>
+      <w:r>
+        <w:t>Makro-Analogie-Formulierungen ("gemischt, aber teilweise positiv") wirkten in</w:t>
+      </w:r>
+    </w:p>
+    <w:p>
+      <w:r>
+        <w:t>denselben Beispielen aehnlich beliebig verwendbar - moeglicher</w:t>
+      </w:r>
+    </w:p>
+    <w:p>
+      <w:r>
+        <w:t>Geschwister-Fall fuer eine spaetere Runde.</w:t>
+      </w:r>
+    </w:p>
+    <w:p>
+      <w:r>
+        <w:rPr>
+          <w:b/>
+        </w:rPr>
+        <w:t>Verifiziert:</w:t>
+      </w:r>
+      <w:r>
+        <w:t xml:space="preserve"> Compile-/Import-Regressionscheck aller 4 betroffenen Module</w:t>
+      </w:r>
+    </w:p>
+    <w:p>
+      <w:r>
+        <w:t>(hebel_analyst, hebel_risk_gate, hebel_pipeline, scheduler.background).</w:t>
+      </w:r>
+    </w:p>
+    <w:p>
+      <w:r>
+        <w:t>Synthetischer Test mit den 4 echten Verstoss-Faellen (ONDO/INJ/BTC/TAO, exakte</w:t>
+      </w:r>
+    </w:p>
+    <w:p>
+      <w:r>
+        <w:t>Formulierungen aus dem Notebook-Export) - alle korrekt entfernt; legitime</w:t>
+      </w:r>
+    </w:p>
+    <w:p>
+      <w:r>
+        <w:t>technische/Risiko-Gruende bleiben unveraendert; Randfaelle (None/leere Liste/</w:t>
+      </w:r>
+    </w:p>
+    <w:p>
+      <w:r>
+        <w:t>fehlendes text-Feld) sowie weitere Formulierungsvarianten (Retail-Bias/</w:t>
+      </w:r>
+    </w:p>
+    <w:p>
+      <w:r>
+        <w:t>Short-Konten-Anteil/Long-Short-Ratio) ebenfalls abgedeckt. _validate_hebel()</w:t>
+      </w:r>
+    </w:p>
+    <w:p>
+      <w:r>
+        <w:t>lehnt das alte antizyklisch-Label jetzt korrekt mit AnalystResponseInvalid ab,</w:t>
+      </w:r>
+    </w:p>
+    <w:p>
+      <w:r>
+        <w:t>ein gueltiger 4-Kategorien-Fall wird weiterhin akzeptiert.</w:t>
       </w:r>
     </w:p>
     <w:sectPr>

</xml_diff>

<commit_message>
Z.ai-Konsistenz-Check: Positions-Richtung bei TEILVERKAUF/SCHLIESSEN nicht mehr als Widerspruch werten
Echter HYPE-Fund: Z.ai meldete "widerspruch", weil die Begruendung fuer einen
TEILVERKAUF einer offenen LONG-Position baerisch war - fachlich korrekt (das
ist der Grund fuer den Teilverkauf), aber Z.ai las richtung=LONG naiv als
"Text muss bullisch sein". SYSTEM_PROMPT erklaert jetzt, dass richtung bei
TEILVERKAUF/SCHLIESSEN/HEBEL_SENKEN die abzubauende Position beschreibt, nicht
die Markteinschaetzung.

Eigener Regressions-Bug beim ersten Entwurf live gegen die echte Z.ai-API
entdeckt (zu weite Formulierung schloss HALTEN faelschlich mit ein, kippte
einen echten KAIA-Widerspruchsfall) - sofort korrigiert und erneut per
Live-A/B-Test gegen beide realen Faelle verifiziert.

Co-Authored-By: Claude Sonnet 5 <noreply@anthropic.com>
</commit_message>
<xml_diff>
--- a/Basisinfos/Regelwerksmanual.docx
+++ b/Basisinfos/Regelwerksmanual.docx
@@ -15336,6 +15336,83 @@
     <w:p>
       <w:r>
         <w:t>ein gueltiger 4-Kategorien-Fall wird weiterhin akzeptiert.</w:t>
+      </w:r>
+    </w:p>
+    <w:p>
+      <w:pPr>
+        <w:pStyle w:val="Heading3"/>
+      </w:pPr>
+      <w:r>
+        <w:t>Nachtrag (2026-07-26, gleicher Tag): Z.ai-Konsistenz-Check verwechselte Positions-Richtung mit Markteinschaetzung (echter HYPE-Fund)</w:t>
+      </w:r>
+    </w:p>
+    <w:p>
+      <w:r>
+        <w:t>Nutzer zeigte einen echten Screenshot (HYPE, TEILVERKAUF einer offenen LONG-Position): Z.ai-Konsistenz-Check meldete "widerspruch - Text spricht von Abwaertsbewegung bei LONG-Signal", obwohl das Signal fachlich korrekt war.</w:t>
+      </w:r>
+    </w:p>
+    <w:p>
+      <w:pPr>
+        <w:pStyle w:val="Heading4"/>
+      </w:pPr>
+      <w:r>
+        <w:t>Root Cause</w:t>
+      </w:r>
+    </w:p>
+    <w:p>
+      <w:r>
+        <w:t>Bei action TEILVERKAUF/SCHLIESSEN (Kontrathese-Uebersetzung) beschreibt richtung die BESTEHENDE Position, die abgebaut wird - NICHT Mistrals eigene Markteinschaetzung (die steht separat in kontrathese_llm_richtung). Eine baerische Begruendung fuer den Teilverkauf einer LONG-Position ist fachlich korrekt (genau deshalb verkauft man teilweise), aber gegenpruefung.py::pruefe_konsistenz() gibt Z.ai richtung+action roh mit, ohne diese Semantik zu erklaeren - Z.ai las richtung=LONG naiv als "Text soll bullisch sein" und wertete die korrekte baerische Rechtfertigung als Widerspruch.</w:t>
+      </w:r>
+    </w:p>
+    <w:p>
+      <w:r>
+        <w:t>Haeufigkeit geprueft: von 8 "widerspruch"-Urteilen desselben Tages war NUR dieser eine (HYPE, kontrathese_zu_position=1) betroffen - die anderen 7 sind echte, unabhaengige Text-vs-Fakten-Widersprueche bei regulaeren HALTEN-Signalen (kein offener Positions-Bezug), korrekt erkannt.</w:t>
+      </w:r>
+    </w:p>
+    <w:p>
+      <w:pPr>
+        <w:pStyle w:val="Heading4"/>
+      </w:pPr>
+      <w:r>
+        <w:t>Fix + eigener Fund waehrend der Umsetzung</w:t>
+      </w:r>
+    </w:p>
+    <w:p>
+      <w:r>
+        <w:t>SYSTEM_PROMPT in agent/krypto/gegenpruefung.py ergaenzt: bei action TEILVERKAUF/SCHLIESSEN/HEBEL_SENKEN beschreibt richtung die bestehende Position, gegenlaeufige Begruendung ist dort konsistent; bei ALLEN anderen Aktionen (insbesondere HALTEN) bleibt richtung die Markteinschaetzung, normale Widerspruchspruefung gilt weiter.</w:t>
+      </w:r>
+    </w:p>
+    <w:p>
+      <w:r>
+        <w:rPr>
+          <w:b/>
+        </w:rPr>
+        <w:t>Erster Entwurf hatte einen echten Regressions-Bug</w:t>
+      </w:r>
+      <w:r>
+        <w:t>, live gegen die echte Z.ai-API entdeckt: eine zu weit gefasste erste Formulierung ("bei HALTEN/HEBEL_SENKEN ist beides moeglich") kippte einen ECHTEN, unabhaengig bestehenden Widerspruchsfall (KAIA, HALTEN, richtung=LONG bei durchgehend baerischem Text, KEIN offener Positions-Bezug) von "widerspruch" (3/3 mit altem Prompt) auf faelschlich "konsistent" (3/3 mit erstem Entwurf) - HALTEN wurde faelschlich in die Ausnahme mit hineingezogen. Sofort korrigiert: Ausnahme gilt nur noch fuer TEILVERKAUF/SCHLIESSEN/HEBEL_SENKEN, HALTEN explizit wieder ausgeschlossen.</w:t>
+      </w:r>
+    </w:p>
+    <w:p>
+      <w:r>
+        <w:rPr>
+          <w:b/>
+        </w:rPr>
+        <w:t>Verifiziert:</w:t>
+      </w:r>
+      <w:r>
+        <w:t xml:space="preserve"> echter Live-A/B-Test gegen die echte Z.ai-API (kein synthetischer Mock) mit den exakten Fakten/Texten beider realer Faelle - HYPE (TEILVERKAUF) bleibt nach dem Fix 3/3 "konsistent", KAIA (HALTEN) kehrt nach der Korrektur 3/3 zu "widerspruch" zurueck (identisch zum Alt-Prompt-Verhalten). Compile-/Import-Regressionscheck.</w:t>
+      </w:r>
+    </w:p>
+    <w:p>
+      <w:r>
+        <w:rPr>
+          <w:b/>
+        </w:rPr>
+        <w:t>Lehre (uebergreifend mit dem Antizyklisch-Fund vom selben Tag):</w:t>
+      </w:r>
+      <w:r>
+        <w:t xml:space="preserve"> auch eine gezielte, klein wirkende Prompt-Praezisierung kann unbeabsichtigt eine bestehende, korrekte Erkennung in einer ANDEREN Aktionsklasse aufweichen - ein Live-A/B-Test gegen einen bekannten POSITIVEN Referenzfall (hier: KAIA) ist deshalb genauso wichtig wie der Test gegen den eigentlichen Zielfall.</w:t>
       </w:r>
     </w:p>
     <w:sectPr>

</xml_diff>

<commit_message>
Hebel-Pruefung-Toggle bei bereits gequeueten Kandidaten wirkungslos (KAITO-Fund)
get_pending_hebel_candidates() prueft den Toggle bisher nicht erneut bei der
Selektion bereits gespeicherter status='neu'-Zeilen (nur die Neu-Erfassung in
hebel_screening.py war geschuetzt) - identisches Bugmuster wie beim
CANTON-Fund vom 2026-07-20. Fix: LEFT JOIN asset_hebel_settings +
COALESCE(hebel_pruefung_erlaubt, 1)=1, behebt Signal-Erzeugung UND
GUI-Warteliste gleichzeitig (beide nutzen dieselbe Funktion).
</commit_message>
<xml_diff>
--- a/Basisinfos/Regelwerksmanual.docx
+++ b/Basisinfos/Regelwerksmanual.docx
@@ -15540,6 +15540,93 @@
       </w:r>
       <w:r>
         <w:t xml:space="preserve"> Compile-/Import-Regressionscheck (8 geaenderte Dateien + 4 Hebel-Module als Regressionscheck). DB-Migration + Idempotenz gegen isolierte Temp-DB. baue_fakten() mit/ohne richtung (Keyword-Aufruf). Echter Live-Test von _zai_konsistenz_im_hintergrund() gegen die echte Z.ai-API (isolierte Temp-DB, korrekt erkannter Widerspruch). _formatiere_zai_gegenpruefung() mit Signal-artigem Stub (kein AttributeError, korrekt nur Konsistenz-Zeile) UND Hebel-artigem Stub (Regressionscheck, Richtungsteil weiterhin korrekt). format_zai_gegenpruefung_lines() Spot-Aufruf (nur 1 Zeile). Kein manueller Button einbezogen - gleiche Einschraenkung besteht bereits fuer Hebel.</w:t>
+      </w:r>
+    </w:p>
+    <w:p>
+      <w:pPr>
+        <w:pStyle w:val="Heading3"/>
+      </w:pPr>
+      <w:r>
+        <w:t>Nachtrag (2026-07-27): Hebel-Pruefung-Toggle bei bereits gequeueten Kandidaten wirkungslos (KAITO-Fund)</w:t>
+      </w:r>
+    </w:p>
+    <w:p>
+      <w:r>
+        <w:t>Nutzer-Meldung: KAITO steht in der Watchlist unter Status "Beobachtung", der per-Asset Hebel-Pruefung-Toggle (asset_hebel_settings, siehe #268/2026-07-19) ist fuer KAITO AUS - trotzdem wurde KAITO weiterhin ueber den Hebel-Pfad gefuehrt und erhielt neue Signale.</w:t>
+      </w:r>
+    </w:p>
+    <w:p>
+      <w:pPr>
+        <w:pStyle w:val="Heading4"/>
+      </w:pPr>
+      <w:r>
+        <w:t>Ursache</w:t>
+      </w:r>
+    </w:p>
+    <w:p>
+      <w:r>
+        <w:t>Der Toggle wird korrekt an GENAU EINER Stelle geprueft: agent/krypto/hebel_screening.py::run_hebel_screening() filtert krypto_assets VOR dem OI-Abruf/Scoring - ein Symbol mit Toggle AUS erzeugt also ab dem Moment der Umschaltung keine NEUEN hebel_triggers-Zeilen mehr.</w:t>
+      </w:r>
+    </w:p>
+    <w:p>
+      <w:r>
+        <w:t>Bereits VOR der Umschaltung angelegte Zeilen (status='neu', bleiben laut Info-Leichen-Verfall (#306-#310, 2026-07-25) bis zu hebel_kandidat_verfall_stunden = 48h gueltig) wurden davon NICHT erfasst: database/db.py::get_pending_hebel_candidates() - die gemeinsame Lese-Funktion, die SOWOHL agent/krypto/budget_allocator.py (Tier-1-Kandidatenauswahl, Zeile 384) ALS AUCH ui/hebel_view.py (Zeile 189, "Kandidat wartet auf Analyse"-Warteliste) verwendet - selektierte weiterhin ALLE status='neu'-Zeilen unabhaengig vom aktuellen Toggle-Zustand. Ein Toggle-Wechsel wirkte dadurch erst nach Ablauf des 48h-Verfallsfensters der zu diesem Zeitpunkt bereits gequeueten Kandidaten.</w:t>
+      </w:r>
+    </w:p>
+    <w:p>
+      <w:r>
+        <w:t>Strukturell identisch zu einem bereits behobenen Bugmuster: der CANTON-Fund (2026-07-20) bei get_symbole_mit_ueberschrittener_oi_schwelle() - dort exakt dieselbe fehlende Pruefung an einer ANDEREN Lese-Stelle. Beide Faelle: der Toggle wird bei der NEU-Erfassung korrekt geprueft, aber nicht erneut bei der spaeteren Selektion/Anzeige bereits gespeicherter Zeilen.</w:t>
+      </w:r>
+    </w:p>
+    <w:p>
+      <w:pPr>
+        <w:pStyle w:val="Heading4"/>
+      </w:pPr>
+      <w:r>
+        <w:t>Fix</w:t>
+      </w:r>
+    </w:p>
+    <w:p>
+      <w:r>
+        <w:t>database/db.py::get_pending_hebel_candidates(): LEFT JOIN asset_hebel_settings s ON s.symbol = t.symbol + AND COALESCE(s.hebel_pruefung_erlaubt, 1) = 1 in der WHERE-Klausel ergaenzt - identisches Muster wie beim CANTON-Fix. COALESCE(..., 1), da Symbole ohne Eintrag in asset_hebel_settings per Default erlaubt sind (siehe get_hebel_pruefung_erlaubt()).</w:t>
+      </w:r>
+    </w:p>
+    <w:p>
+      <w:r>
+        <w:rPr>
+          <w:b/>
+        </w:rPr>
+        <w:t>Positiver Nebeneffekt:</w:t>
+      </w:r>
+      <w:r>
+        <w:t xml:space="preserve"> da ui/hebel_view.py dieselbe Funktion fuer die Warteliste nutzt, verschwindet ein toggle-ausgeschalteter Kandidat dadurch automatisch auch aus der GUI-Anzeige - kein zusaetzlicher Patch an der UI-Stelle noetig, einmaliger Fix an der gemeinsamen Lese-Funktion behebt Signal-Erzeugung UND Anzeige gleichzeitig.</w:t>
+      </w:r>
+    </w:p>
+    <w:p>
+      <w:r>
+        <w:rPr>
+          <w:b/>
+        </w:rPr>
+        <w:t>Bewusst unveraendert:</w:t>
+      </w:r>
+      <w:r>
+        <w:t xml:space="preserve"> die zweite, unabhaengige Hebel-Kandidatenquelle - bereits offene Positionen (budget_allocator.py::_offene_positionen_als_kandidaten(), #130, 2026-07-19) - umgeht den Toggle weiterhin ABSICHTLICH (bestehende offene Positionen muessen weiter verwaltbar bleiben, auch wenn die Neu-Pruefung fuer dieses Symbol deaktiviert wurde).</w:t>
+      </w:r>
+    </w:p>
+    <w:p>
+      <w:r>
+        <w:t>Geprueft, ob eine Schwesterfunktion dasselbe Luecken-Muster hat: get_pending_marktscan_kaufkandidaten() (Docstring verweist zum Vergleich auf get_pending_hebel_candidates()) betrifft Marktscan/Spot-Kandidaten - dort existiert kein Hebel-Pruefung-Toggle-Konzept, kein Fix noetig.</w:t>
+      </w:r>
+    </w:p>
+    <w:p>
+      <w:r>
+        <w:rPr>
+          <w:b/>
+        </w:rPr>
+        <w:t>Verifiziert:</w:t>
+      </w:r>
+      <w:r>
+        <w:t xml:space="preserve"> synthetischer Test gegen isolierte In-Memory-DB - 3 Kandidaten (KAITO Toggle AUS, ETH kein Toggle-Eintrag = Default AN, SOL Toggle explizit AN), get_pending_hebel_candidates() schliesst KAITO korrekt aus, ETH+SOL korrekt enthalten, Sortierung nach score_gesamt DESC bleibt intakt. Compile-/Import-Regressionscheck: database/db.py, agent/krypto/budget_allocator.py, ui/hebel_view.py.</w:t>
       </w:r>
     </w:p>
     <w:sectPr>

</xml_diff>

<commit_message>
Hebel-Detail: offene Position bei HALTEN anzeigen + LLM-Budget-Anzeige nach Groq/Z.ai-Umbau bereinigt
- ui/hebel_view.py: HALTEN auf Symbol mit offener Position zeigt jetzt deren
  aktuellen Stand (Hebel/Eigenkapital/Liquidationspreis) in Abschnitt 1,
  E-Mail-Politik "HALTEN nie" bleibt unveraendert.
- agent/krypto/budget_allocator.py + config.yaml: tote Z.ai-Budget-
  Buchhaltung entfernt (Z.ai ist seit dem Gegenpruefungs-Umbau kein
  primaerer Analyst mehr, der Wert wurde nie mehr abgefragt).
- database/db.py + remote/status.py + remote/server.py: echte Z.ai-
  Gegenpruefungs-Last (1x Spot/2x Hebel) neu als informative Kennzahl ohne
  Tagesdeckel sichtbar; Groq zeigt bei Fehlschlag jetzt neutral "nur
  manuell" statt irrefuehrendem Rot (seit 2026-07-26 kein automatischer
  Anbieter mehr).
</commit_message>
<xml_diff>
--- a/Basisinfos/Regelwerksmanual.docx
+++ b/Basisinfos/Regelwerksmanual.docx
@@ -15627,6 +15627,237 @@
       </w:r>
       <w:r>
         <w:t xml:space="preserve"> synthetischer Test gegen isolierte In-Memory-DB - 3 Kandidaten (KAITO Toggle AUS, ETH kein Toggle-Eintrag = Default AN, SOL Toggle explizit AN), get_pending_hebel_candidates() schliesst KAITO korrekt aus, ETH+SOL korrekt enthalten, Sortierung nach score_gesamt DESC bleibt intakt. Compile-/Import-Regressionscheck: database/db.py, agent/krypto/budget_allocator.py, ui/hebel_view.py.</w:t>
+      </w:r>
+    </w:p>
+    <w:p>
+      <w:pPr>
+        <w:pStyle w:val="Heading3"/>
+      </w:pPr>
+      <w:r>
+        <w:t>Nachtrag (2026-07-27): HALTEN auf Symbol mit offener Hebel-Position zeigt jetzt deren aktuellen Stand (Abschnitt 1)</w:t>
+      </w:r>
+    </w:p>
+    <w:p>
+      <w:r>
+        <w:t>Nutzer-Nachfrage anhand eines Screenshots (VIRTUAL LONG HALTEN): Abschnitt 1 ("MATHEMATISCH BERECHNET") im Hebel-Detail-Panel blieb bei HALTEN immer leer.</w:t>
+      </w:r>
+    </w:p>
+    <w:p>
+      <w:pPr>
+        <w:pStyle w:val="Heading4"/>
+      </w:pPr>
+      <w:r>
+        <w:t>Einordnung</w:t>
+      </w:r>
+    </w:p>
+    <w:p>
+      <w:r>
+        <w:t>Kein Bug im bisherigen Sinne - Abschnitt 1 zeigt bewusst NUR deterministisch berechnete Werte, die aus einer Positionsveraenderung entstehen (Hebel final, Liquidationspreis, Eigenkapitalbedarf/-nachschuss), siehe die urspruengliche 3-Abschnitte-Entscheidung vom 2026-07-19 (AVAX-Fund). HALTEN veraendert nichts, also gibt es dafuer folgerichtig nichts zu berechnen. Bei VIRTUAL im Screenshot kommt hinzu: keine offene Position auf VIRTUAL vorhanden.</w:t>
+      </w:r>
+    </w:p>
+    <w:p>
+      <w:r>
+        <w:rPr>
+          <w:b/>
+        </w:rPr>
+        <w:t>Aber:</w:t>
+      </w:r>
+      <w:r>
+        <w:t xml:space="preserve"> bei einem Symbol MIT offener Position (im Screenshot: HYPE) ist der aktuelle Stand dieser Position (Hebel, Eigenkapital, geschaetzter Liquidationspreis - alles echte, im letzten Positions-Sync berechnete Werte, siehe hebel_positions/importer/bitpanda_margin_positions.py) eine legitime Ergaenzung fuer Abschnitt 1 - er wird nur bisher nicht angezeigt, weil _render_signal() keinen Zugriff auf die offenen Positionen hatte.</w:t>
+      </w:r>
+    </w:p>
+    <w:p>
+      <w:r>
+        <w:t>Nutzer-Entscheidung: E-Mail-Politik "HALTEN nie" bleibt unveraendert (siehe _notify_hebel_signal()/_notify_spot_signal(), scheduler/background.py, beide pruefen signal.action == "HALTEN" als fruehen Return - unabhaengig von offener Position, das war schon immer so). Nur die GUI-Anzeige wird nachgezogen.</w:t>
+      </w:r>
+    </w:p>
+    <w:p>
+      <w:pPr>
+        <w:pStyle w:val="Heading4"/>
+      </w:pPr>
+      <w:r>
+        <w:t>Umsetzung</w:t>
+      </w:r>
+    </w:p>
+    <w:p>
+      <w:r>
+        <w:t>ui/hebel_view.py:</w:t>
+      </w:r>
+    </w:p>
+    <w:p>
+      <w:pPr>
+        <w:pStyle w:val="ListBullet"/>
+      </w:pPr>
+      <w:r>
+        <w:t>Neues Instanzfeld self._offene_positionen: dict[(symbol, richtung), HebelPosition], in refresh() direkt nach dem bereits vorhandenen db.get_open_hebel_positions()-Aufruf befuellt (kein neuer DB-Zugriff - refresh() hatte die Positionsliste bereits fuer das separate "Offene Hebel-Positionen"-Panel geladen, wird jetzt zusaetzlich fuer die Signal-Detail-Anzeige indiziert).</w:t>
+      </w:r>
+    </w:p>
+    <w:p>
+      <w:pPr>
+        <w:pStyle w:val="ListBullet"/>
+      </w:pPr>
+      <w:r>
+        <w:t>_render_signal(): neuer Block am Ende von Abschnitt 1, NUR wenn signal.action == "HALTEN" UND ein Eintrag fuer (signal.symbol, signal.richtung) in self._offene_positionen existiert - zeigt Hebel, Eigenkapital, Eroeffnungsdatum und (falls vorhanden) den geschaetzten Liquidationspreis der bestehenden Position. Bewusst als "(Stand letzter Sync)" gekennzeichnet, um klarzustellen: das ist NICHT neu fuer dieses HALTEN-Signal berechnet, sondern der zuletzt synchronisierte Positions-Zustand (identisch mit der Zahl im "Offene Hebel-Positionen"-Panel).</w:t>
+      </w:r>
+    </w:p>
+    <w:p>
+      <w:r>
+        <w:rPr>
+          <w:b/>
+        </w:rPr>
+        <w:t>Bewusst NICHT angefasst:</w:t>
+      </w:r>
+    </w:p>
+    <w:p>
+      <w:pPr>
+        <w:pStyle w:val="ListBullet"/>
+      </w:pPr>
+      <w:r>
+        <w:t>scheduler/background.py's E-Mail-Guards (action == "HALTEN" -&gt; return) - Nutzer-Entscheidung, "HALTEN nie" bleibt unveraendert.</w:t>
+      </w:r>
+    </w:p>
+    <w:p>
+      <w:pPr>
+        <w:pStyle w:val="ListBullet"/>
+      </w:pPr>
+      <w:r>
+        <w:t>ui/signals_view.py (Spot) - Spot kennt keine Hebel-Positionen/Liquidationspreise, dieses Thema betrifft ausschliesslich ui/hebel_view.py.</w:t>
+      </w:r>
+    </w:p>
+    <w:p>
+      <w:r>
+        <w:rPr>
+          <w:b/>
+        </w:rPr>
+        <w:t>Verifiziert:</w:t>
+      </w:r>
+      <w:r>
+        <w:t xml:space="preserve"> Tk-Smoke-Test (isolierte Temp-DB, kein sichtbares Fenster) mit 3 Faellen: (1) HALTEN OHNE offene Position (VIRTUAL) - Abschnitt 1 bleibt wie zuvor ohne Positions-Zeile (Regression). (2) HALTEN MIT offener Position (HYPE) - neue Zeile korrekt mit Hebel/Eigenkapital/Datum/Liquidationspreis. (3) ERÖFFNEN (LINK) - bestehende hebel_final-Anzeige unveraendert, keine faelschliche Positions-Zeile. Compile-/Import-Regressionscheck ui/hebel_view.py.</w:t>
+      </w:r>
+    </w:p>
+    <w:p>
+      <w:pPr>
+        <w:pStyle w:val="Heading3"/>
+      </w:pPr>
+      <w:r>
+        <w:t>Nachtrag (2026-07-27): LLM-Budget-Anzeige/-Zaehlung nach Groq-Entfernung + Z.ai-Gegenpruefungs-Umbau nachgezogen</w:t>
+      </w:r>
+    </w:p>
+    <w:p>
+      <w:r>
+        <w:t>Nutzer-Nachfrage anhand von zwei Remote-Steuer-Seite-Screenshots: "LLM-Budget heute (Krypto)" und "API-Status: LLM-Anbieter" pruefen, ob nach den juengsten Aenderungen (Groq aus der automatischen Kette entfernt, Z.ai macht pro Hebel-Signal 2 zusaetzliche Abfragen) etwas angepasst werden sollte.</w:t>
+      </w:r>
+    </w:p>
+    <w:p>
+      <w:pPr>
+        <w:pStyle w:val="Heading4"/>
+      </w:pPr>
+      <w:r>
+        <w:t>Fund 1: Z.ai-Budget-Buchhaltung war seit dem Gegenpruefungs-Umbau toter Code</w:t>
+      </w:r>
+    </w:p>
+    <w:p>
+      <w:r>
+        <w:t>agent/krypto/budget_allocator.py hatte seit 2026-07-26 (Commit, in dem Z.ai von einer primaeren Analyst-Fallback-Stufe zur dedizierten Gegenpruefungslogik umgebaut wurde) noch die komplette alte Budget-Buchhaltung dafuer (zai_taegliches_budget in config.yaml, tages_verbraucht["zai"], tages_budget["zai"], AllocationResult.zai_calls_verbraucht/zai_budget_erschoepft) - konnte aber strukturell nie mehr &gt; 0 werden, weil Z.ai in KEINER calls-Liste der 3 Tiers mehr auftaucht (bereits im damaligen Modul-Docstring als "bewusst nicht entfernt, kein funktionaler Schaden" dokumentiert). Gleichzeitig wurde die ECHTE Z.ai-Last durch die Gegenpruefung (1 Aufruf/Spot-Signal, 2 Aufrufe/Hebel-Signal - Konsistenz-Check UND Richtungs-Abgleich sind zwei unabhaengige Calls) nirgends gezaehlt oder angezeigt.</w:t>
+      </w:r>
+    </w:p>
+    <w:p>
+      <w:r>
+        <w:rPr>
+          <w:b/>
+        </w:rPr>
+        <w:t>Fix:</w:t>
+      </w:r>
+    </w:p>
+    <w:p>
+      <w:pPr>
+        <w:pStyle w:val="ListBullet"/>
+      </w:pPr>
+      <w:r>
+        <w:t>database/db.py: neue count_zai_gegenpruefung_calls_today() - zaehlt echte Z.ai-Gegenpruefungs-Aufrufe seit Mitternacht UTC (Spot-Konsistenz + Hebel-Konsistenz + Hebel-Richtung, jeweils separat gezaehlt, da unabhaengig scheitern koennen). REIN INFORMATIV, kein Tagesdeckel (Z.ai hat laut Nutzer-Vorgabe keinen, nur den 120/Min-Rate-Limiter im Client selbst).</w:t>
+      </w:r>
+    </w:p>
+    <w:p>
+      <w:pPr>
+        <w:pStyle w:val="ListBullet"/>
+      </w:pPr>
+      <w:r>
+        <w:t>remote/status.py::_get_budget_heute(): neues Feld zai_gegenpruefung_heute, bewusst NICHT in verbraucht_gesamt/gesamt eingerechnet (Z.ai ist kein primaerer Analyst mehr, keine Ressourcen-Konkurrenz zum B-Tagesbudget) - gleiche Trennung wie bei multi_asset_heute.</w:t>
+      </w:r>
+    </w:p>
+    <w:p>
+      <w:pPr>
+        <w:pStyle w:val="ListBullet"/>
+      </w:pPr>
+      <w:r>
+        <w:t>remote/server.py: neue Zeile "Z.ai-Gegenpruefung heute (Konsistenz+Richtung, kein Tagesdeckel)" in der LLM-Budget-Karte.</w:t>
+      </w:r>
+    </w:p>
+    <w:p>
+      <w:pPr>
+        <w:pStyle w:val="ListBullet"/>
+      </w:pPr>
+      <w:r>
+        <w:t>agent/krypto/budget_allocator.py: die tote Zai-Budget-Buchhaltung komplett entfernt (AllocationResult-Felder, tages_verbraucht/tages_budget-Eintraege, beide elif provider_name == "zai":-Zweige in _mit_fallback_chain()), Modul-Docstring + zwei weitere stale Kommentarstellen ("Mistral-&gt;Groq-&gt;Gemini-&gt;Zai-Kaskade") korrigiert.</w:t>
+      </w:r>
+    </w:p>
+    <w:p>
+      <w:pPr>
+        <w:pStyle w:val="ListBullet"/>
+      </w:pPr>
+      <w:r>
+        <w:t>scheduler/background.py: Log-Zeile um die toten Zai-Werte gekuerzt.</w:t>
+      </w:r>
+    </w:p>
+    <w:p>
+      <w:pPr>
+        <w:pStyle w:val="ListBullet"/>
+      </w:pPr>
+      <w:r>
+        <w:t>Basisinfos/config.yaml: zai_taegliches_budget-Schluessel entfernt, gemini_taegliches_budget-Kommentar korrigiert ("dritte" -&gt; "zweite und aktuell letzte Fallback-Stufe" - die Kette ist seit der Groq-Entfernung nur noch 2-stufig: Mistral -&gt; Gemini).</w:t>
+      </w:r>
+    </w:p>
+    <w:p>
+      <w:pPr>
+        <w:pStyle w:val="Heading4"/>
+      </w:pPr>
+      <w:r>
+        <w:t>Fund 2: Groq-Eintrag im API-Status zeigte irrefuehrend rot</w:t>
+      </w:r>
+    </w:p>
+    <w:p>
+      <w:r>
+        <w:t>Groq wurde bereits am 2026-07-26 bewusst aus der automatischen Kette entfernt (Commit "Groq aus automatischer Signal-Kette entfernt, Client bleibt fuer manuelle Tests" - siehe project_groq_entfernung_2026-07-26.md), bleibt aber fuer manuelle Einzelklicks nutzbar. Die "API-Status: LLM-Anbieter"-Karte zeigte dafuer weiterhin rot "Fehler (vor 3 Tagen)" - technisch korrekt (letzter tatsaechlicher Call schlug fehl/liegt lange zurueck), aber irrefuehrend: rot suggeriert "hier ist etwas kaputt, das repariert werden muss", nicht "wird absichtlich nicht mehr automatisch aufgerufen".</w:t>
+      </w:r>
+    </w:p>
+    <w:p>
+      <w:r>
+        <w:rPr>
+          <w:b/>
+        </w:rPr>
+        <w:t>Fix:</w:t>
+      </w:r>
+      <w:r>
+        <w:t xml:space="preserve"> remote/server.py::renderApiHealthGroup() - neues MANUAL_ONLY_SOURCES-Set (aktuell nur "groq"). Bei status === "fehler" UND manueller Quelle: neutrales Grau ("nur manuell · letzter Test vor Xd fehlgeschlagen") statt Rot. Ein ECHTER Erfolg (status === "ok") bleibt weiterhin gruen "OK (vor X)" - eine erfolgreiche manuelle Pruefung ist weiterhin eine gute Nachricht.</w:t>
+      </w:r>
+    </w:p>
+    <w:p>
+      <w:pPr>
+        <w:pStyle w:val="Heading4"/>
+      </w:pPr>
+      <w:r>
+        <w:t>Nebenbefund (kein Fix, nur geprueft): groq_exhaustion_schwelle_fehlschlaege ist NICHT tot - wird weiterhin von agent/kategorie_synthese.py verwendet (eigenstaendiger taeglicher Job, der Groq unabhaengig vom Budget-Allocator in seiner eigenen Fallback-Kette nutzt) - bewusst unveraendert gelassen.</w:t>
+      </w:r>
+    </w:p>
+    <w:p>
+      <w:r>
+        <w:rPr>
+          <w:b/>
+        </w:rPr>
+        <w:t>Verifiziert:</w:t>
+      </w:r>
+      <w:r>
+        <w:t xml:space="preserve"> count_zai_gegenpruefung_calls_today() synthetisch (3 Signale: 1 Spot-Konsistenz, 1 Hebel mit beiden Zai-Calls, 1 Hebel nur mit Konsistenz -&gt; korrekt 1+2+1=4). _get_budget_heute()-Integration End-to-End (Config/Watchlist gemockt). AllocationResult-Felder korrekt bereinigt. run_budget_allocator() Smoke-Test (aktiv=False fruehzeitiger Return, aktiv=True mit leerer Watchlist) laeuft ohne Fehler. YAML-Parse-Check config.yaml. Compile-/Import-Regressionscheck aller 6 geaenderten Python-Dateien.</w:t>
       </w:r>
     </w:p>
     <w:sectPr>

</xml_diff>

<commit_message>
Mindestziel/MFE-Tracking: unabhaengige Erfolgsmessung neben Take-Profit
Min/Max-Kurszone + Zeitschaetzung stehen sofort bei Signal-Erstellung fest
(GUI+E-Mail, neben der bestehenden Take-Profit-Zone). Ob die Mindestziel-
Schwelle tatsaechlich getroffen wurde (Maximum Favorable Excursion), kann
erst nachtraeglich per Backward-Tracking ermittelt werden - laeuft parallel
zur bestehenden TP/SL-Aufloesung mit, ohne deren Gates zu veraendern. Neue
Richtungstreffer-Quote-Karte auf der Remote-Seite, neue Felder im
NB-Analyseskript.

Co-Authored-By: Claude Sonnet 5 <noreply@anthropic.com>
</commit_message>
<xml_diff>
--- a/Basisinfos/Regelwerksmanual.docx
+++ b/Basisinfos/Regelwerksmanual.docx
@@ -15858,6 +15858,117 @@
       </w:r>
       <w:r>
         <w:t xml:space="preserve"> count_zai_gegenpruefung_calls_today() synthetisch (3 Signale: 1 Spot-Konsistenz, 1 Hebel mit beiden Zai-Calls, 1 Hebel nur mit Konsistenz -&gt; korrekt 1+2+1=4). _get_budget_heute()-Integration End-to-End (Config/Watchlist gemockt). AllocationResult-Felder korrekt bereinigt. run_budget_allocator() Smoke-Test (aktiv=False fruehzeitiger Return, aktiv=True mit leerer Watchlist) laeuft ohne Fehler. YAML-Parse-Check config.yaml. Compile-/Import-Regressionscheck aller 6 geaenderten Python-Dateien.</w:t>
+      </w:r>
+    </w:p>
+    <w:p>
+      <w:pPr>
+        <w:pStyle w:val="Heading3"/>
+      </w:pPr>
+      <w:r>
+        <w:t>Nachtrag (2026-07-27): Mindestziel/MFE-Tracking - unabhaengige Erfolgsmessung neben Take-Profit</w:t>
+      </w:r>
+    </w:p>
+    <w:p>
+      <w:r>
+        <w:t>Ausloeser: Nutzer bat um eine Experten-Bewertung der Performance-Messung (Backward-Tracking, siehe Kap. 9/16) - Ergebnis: solide Grundlage (R-Multiple, Kalibrierungskurve, Forward-statt-Backtest-Methodik), aber die bestehende Trefferquote misst nur "wurde exakt die Take-Profit-Zone getroffen", nicht "war die Richtung wenigstens zeitweise richtig". Nach Nutzer-Rueckfrage klar in zwei Ebenen getrennt.</w:t>
+      </w:r>
+    </w:p>
+    <w:p>
+      <w:pPr>
+        <w:pStyle w:val="Heading4"/>
+      </w:pPr>
+      <w:r>
+        <w:t>Ebene 1: sofort bei Signal-Erstellung (rein arithmetisch, kein Backward-Tracking noetig)</w:t>
+      </w:r>
+    </w:p>
+    <w:p>
+      <w:r>
+        <w:t>Neue Felder mindestziel_usd/mindestziel_zeitraum_tage_geschaetzt auf signals/hebel_signals, berechnet in agent/krypto/pipeline.py/hebel_pipeline.py direkt vor dem Signal()/HebelSignal()-Konstruktoraufruf, ueber neue Funktionen in backward_tracking.py:</w:t>
+      </w:r>
+    </w:p>
+    <w:p>
+      <w:pPr>
+        <w:pStyle w:val="ListBullet"/>
+      </w:pPr>
+      <w:r>
+        <w:t>mindestziel_preis(entry_mid, risiko_distanz, richtungstreffer_mindest_crv, ist_short): Min-Kurs = Entry + 1x Risikodistanz (dieselbe Distanz wie der Stop-Loss, nur in die guenstige Richtung) - CRV-Schwelle konfigurierbar (backward_tracking.richtungstreffer_mindest_crv, Default 1.0, bewusst niedriger als CRV_MINIMUM=2.0 der bestehenden Take-Profit-Vorgabe). Bei Hebel richtungsabhaengig (SHORT spiegelt die Distanz unter den Entry). Take-Profit (bereits vorhanden) ist das Max-Ziel-Gegenstueck.</w:t>
+      </w:r>
+    </w:p>
+    <w:p>
+      <w:pPr>
+        <w:pStyle w:val="ListBullet"/>
+      </w:pPr>
+      <w:r>
+        <w:t>schaetze_mindestziel_zeitraum_tage(ziel_preis, entry_mid, ohlc_rows): rechnerisch ANGENOMMENE Anzahl Tage bis zum Mindestziel = Kursdistanz / durchschnittliche Tages-High-Low-Spanne der letzten 14 bereits gehandelten Tage vor Signal-Erstellung (Random-Walk-Annahme). Kein Versprechen, kann verfehlt werden - explizit so gekennzeichnet in GUI/E-Mail.</w:t>
+      </w:r>
+    </w:p>
+    <w:p>
+      <w:pPr>
+        <w:pStyle w:val="Heading4"/>
+      </w:pPr>
+      <w:r>
+        <w:t>Ebene 2: erst nachtraeglich per Backward-Tracking (kann naturgemaess erst nach Zeitablauf feststehen)</w:t>
+      </w:r>
+    </w:p>
+    <w:p>
+      <w:r>
+        <w:t>outcome_max_realisiertes_crv (Maximum Favorable Excursion - hoechstes je erreichtes guenstiges CRV, richtungsabhaengig) + outcome_mindestziel_erreicht_am (Datum des ersten Treffers). Laeuft PARALLEL zur bestehenden TP/SL/Liquidation-Aufloesung in check_signal_outcome()/check_hebel_signal_outcome() mit, veraendert deren Ergebnis NICHT (Mindestbeobachtung/Zonen-Reaffirmation-Gates bleiben unberuehrt) - auch ein spaeter per Stop-Loss/Ueberholt/Abgelaufen aufgeloestes Signal bekommt seinen tatsaechlichen Zwischenhoehepunkt persistiert. Neue Aggregationsfunktion compute_richtungstreffer_quote() (breiter gefasst als compute_win_rate_fact() - zaehlt auch spaeter ueberholte/abgelaufene Signale mit, wenn sie zwischenzeitlich in die richtige Richtung liefen), zeigt "Ø Tage bis Mindestziel" nur bei n&gt;=15 als empirisch belastbar an.</w:t>
+      </w:r>
+    </w:p>
+    <w:p>
+      <w:pPr>
+        <w:pStyle w:val="Heading4"/>
+      </w:pPr>
+      <w:r>
+        <w:t>Anzeige</w:t>
+      </w:r>
+    </w:p>
+    <w:p>
+      <w:pPr>
+        <w:pStyle w:val="ListBullet"/>
+      </w:pPr>
+      <w:r>
+        <w:t>GUI (ui/signals_view.py/ui/hebel_view.py): Mindestziel-Zeile direkt neben der bestehenden Take-Profit-Zeile im Detail-Panel.</w:t>
+      </w:r>
+    </w:p>
+    <w:p>
+      <w:pPr>
+        <w:pStyle w:val="ListBullet"/>
+      </w:pPr>
+      <w:r>
+        <w:t>E-Mail (scheduler/background.py): neue _formatiere_mindestziel()-Helper-Funktion, in allen 3 E-Mail-Buildern (Spot/Hebel/Multi-Asset) verdrahtet.</w:t>
+      </w:r>
+    </w:p>
+    <w:p>
+      <w:pPr>
+        <w:pStyle w:val="ListBullet"/>
+      </w:pPr>
+      <w:r>
+        <w:t>Remote-Steuer-Seite (remote/status.py/server.py): neue Karte "Richtungstreffer-Quote (Mindestziel/MFE)".</w:t>
+      </w:r>
+    </w:p>
+    <w:p>
+      <w:pPr>
+        <w:pStyle w:val="ListBullet"/>
+      </w:pPr>
+      <w:r>
+        <w:t>extract_notebook_diagnose.py: alle 4 neuen Felder in den Export-Spaltenlisten fuer Spot- und Hebel-Signale aufgenommen.</w:t>
+      </w:r>
+    </w:p>
+    <w:p>
+      <w:r>
+        <w:t>Bewusst NICHT umgesetzt: LLM-Prompt-Wiring (Werte existieren zwar zum LLM-Erzeugungszeitpunkt, aber eine Rueckkopplung waere eine eigene Verhaltensaenderung), Positions-Lifecycle-Tracking, EUR-Variante von mindestziel_usd.</w:t>
+      </w:r>
+    </w:p>
+    <w:p>
+      <w:r>
+        <w:rPr>
+          <w:b/>
+        </w:rPr>
+        <w:t>Verifiziert:</w:t>
+      </w:r>
+      <w:r>
+        <w:t xml:space="preserve"> synthetische Tests (Spot LONG mit Zwischenhoehepunkt ueber Mindestziel, der dann bis zum Stop-Loss reversiert - outcome_status bleibt korrekt stop_loss_erreicht, MFE-Werte werden trotzdem korrekt persistiert; Hebel SHORT-Szenario richtungsabhaengig; MFE persistiert auch beim Ueberholt-Pfad). Compile-/Import-Regressionscheck aller 11 geaenderten Python-Dateien (models.py, db.py, backward_tracking.py, hebel_backward_tracking.py, pipeline.py, hebel_pipeline.py, signals_view.py, hebel_view.py, background.py, status.py, server.py, extract_notebook_diagnose.py).</w:t>
       </w:r>
     </w:p>
     <w:sectPr>

</xml_diff>

<commit_message>
Hebel-Positions-Close: Kredit-Rueckzahlung als zusaetzliches Vollstaendig-Signal
Bei einer gehebelten Position deckt sell_qty strukturell nur den
eigenkapital-realisierenden Teil der Menge ab, der Rest wird direkt zur
Kredit-Rueckzahlung verwendet - die reine Mengen-Toleranz aus dem NEAR-Fix
erkannte einen echten Vollverkauf deshalb praktisch nie (HYPE blieb mit
1/3 des urspruenglichen Eigenkapitals faelschlich "offen"). Neues Skript
fix_stuck_hebel_positions.py fuer die Korrektur bereits haengengebliebener
Positionen (Trockenlauf per Default, Notebook-Produktiv-DB).

Co-Authored-By: Claude Sonnet 5 <noreply@anthropic.com>
</commit_message>
<xml_diff>
--- a/Basisinfos/Regelwerksmanual.docx
+++ b/Basisinfos/Regelwerksmanual.docx
@@ -15969,6 +15969,68 @@
       </w:r>
       <w:r>
         <w:t xml:space="preserve"> synthetische Tests (Spot LONG mit Zwischenhoehepunkt ueber Mindestziel, der dann bis zum Stop-Loss reversiert - outcome_status bleibt korrekt stop_loss_erreicht, MFE-Werte werden trotzdem korrekt persistiert; Hebel SHORT-Szenario richtungsabhaengig; MFE persistiert auch beim Ueberholt-Pfad). Compile-/Import-Regressionscheck aller 11 geaenderten Python-Dateien (models.py, db.py, backward_tracking.py, hebel_backward_tracking.py, pipeline.py, hebel_pipeline.py, signals_view.py, hebel_view.py, background.py, status.py, server.py, extract_notebook_diagnose.py).</w:t>
+      </w:r>
+    </w:p>
+    <w:p>
+      <w:pPr>
+        <w:pStyle w:val="Heading3"/>
+      </w:pPr>
+      <w:r>
+        <w:t>Nachtrag (2026-07-27): HYPE-Hebel-Position blieb trotz Vollverkauf "offen" - Kredit-Rueckzahlung als zusaetzliches Signal</w:t>
+      </w:r>
+    </w:p>
+    <w:p>
+      <w:r>
+        <w:t>Nutzer-Fund: eine auf Bitpanda VOLLSTAENDIG geschlossene 3x-Hebel-Position (HYPE) blieb in der App mit reduziertem Eigenkapital (100 -&gt; 67,14 EUR, exakt 1/3) als "offen" haengen - das Gegenteil des NEAR-Bugs vom 26.07. (dort wurde ein echter Teilverkauf faelschlich als Vollverkauf gewertet und verschwand komplett).</w:t>
+      </w:r>
+    </w:p>
+    <w:p>
+      <w:r>
+        <w:rPr>
+          <w:b/>
+        </w:rPr>
+        <w:t>Root Cause:</w:t>
+      </w:r>
+      <w:r>
+        <w:t xml:space="preserve"> die am 26.07. eingefuehrte Mengen-Toleranz (sell_qty &gt;= running_qty * 0,995) erkennt einen Vollverkauf einer GEHEBELTEN Position strukturell fast nie zuverlaessig - sell_qty deckt nur den eigenkapital-realisierenden Teil der Menge ab, der Rest (bei 3x Hebel: 2/3) wird direkt zur Kredit-Rueckzahlung verwendet, taucht also nie im "sell"-Leg auf.</w:t>
+      </w:r>
+    </w:p>
+    <w:p>
+      <w:r>
+        <w:rPr>
+          <w:b/>
+        </w:rPr>
+        <w:t>Fix:</w:t>
+      </w:r>
+      <w:r>
+        <w:t xml:space="preserve"> importer/bitpanda_margin_positions.py::reconstruct_margin_positions() - zweites, unabhaengiges Vollstaendig-Signal: wird beim Close-Ereignis der GESAMTE verbleibende Kredit zurueckgezahlt (gleiche 99,5%-Toleranz), gilt das unabhaengig von sell_qty als Vollverkauf. Nutzt e["borrow"] (bisher nur fuer "open"-Ereignisse verwendet, negativ = Rueckzahlung). Reine ODER-Erweiterung, kann echte Teilverkaeufe nicht neu falsch klassifizieren (eine Teil-Reduktion zahlt den Kredit strukturell nur proportional, nie vollstaendig zurueck).</w:t>
+      </w:r>
+    </w:p>
+    <w:p>
+      <w:r>
+        <w:t>Neuer optionaler debug_symbols-Parameter (print-basiert, kein Verhaltenseinfluss) fuer den vollstaendigen Ereignis-/Entscheidungs-Trace inkl. Roh-Tags - bleibt fuer kuenftige aehnliche Faelle im Code.</w:t>
+      </w:r>
+    </w:p>
+    <w:p>
+      <w:r>
+        <w:rPr>
+          <w:b/>
+        </w:rPr>
+        <w:t>Korrektur der bereits haengengebliebenen Zeile:</w:t>
+      </w:r>
+      <w:r>
+        <w:t xml:space="preserve"> neues Skript fix_stuck_hebel_positions.py (Projekt-Root) - rekonstruiert alle aktuell "offen" gefuehrten Positionen komplett neu aus der vollen Bitpanda-Historie (existing=None, schliesst Drift aus), zeigt Alt-vs-Neu-Vergleich, schreibt nur mit explizitem --apply-Flag. Muss auf dem Notebook laufen (echter API-Key + echte Produktiv-DB).</w:t>
+      </w:r>
+    </w:p>
+    <w:p>
+      <w:r>
+        <w:rPr>
+          <w:b/>
+        </w:rPr>
+        <w:t>Verifiziert:</w:t>
+      </w:r>
+      <w:r>
+        <w:t xml:space="preserve"> synthetisch (3x-Hebel-Vollclose mit sell_qty bei nur 1/3 der Menge aber 100% Kredit-Rueckzahlung -&gt; jetzt korrekt geschlossen; Gegentest echter Teilverkauf ohne Kredit-Rueckzahlung bleibt korrekt Teilverkauf). Compile-/Import-Regressionscheck.</w:t>
       </w:r>
     </w:p>
     <w:sectPr>

</xml_diff>

<commit_message>
Regelwerksmanual: HYPE-Fix Runde-2-Korrektur dokumentieren (repay-Tag statt borrow, sell_value-Signal)
Co-Authored-By: Claude Sonnet 5 <noreply@anthropic.com>
</commit_message>
<xml_diff>
--- a/Basisinfos/Regelwerksmanual.docx
+++ b/Basisinfos/Regelwerksmanual.docx
@@ -16031,6 +16031,39 @@
       </w:r>
       <w:r>
         <w:t xml:space="preserve"> synthetisch (3x-Hebel-Vollclose mit sell_qty bei nur 1/3 der Menge aber 100% Kredit-Rueckzahlung -&gt; jetzt korrekt geschlossen; Gegentest echter Teilverkauf ohne Kredit-Rueckzahlung bleibt korrekt Teilverkauf). Compile-/Import-Regressionscheck.</w:t>
+      </w:r>
+    </w:p>
+    <w:p>
+      <w:pPr>
+        <w:pStyle w:val="Heading3"/>
+      </w:pPr>
+      <w:r>
+        <w:t>Nachtrag (2026-07-27, gleicher Tag): HYPE-Fix Runde 2 - "borrow"-Tag-Theorie war falsch, echte Ursache ist "repay"-Tag + sell_value</w:t>
+      </w:r>
+    </w:p>
+    <w:p>
+      <w:r>
+        <w:t>Der obige Fix (Runde 1) beruhte auf einer plausiblen, aber FALSCHEN Annahme: dass Bitpanda die Kredit-Rueckzahlung mit einem "borrow"-Tag versieht (analog zum OPEN-Ereignis). Der Nutzer bestand zurecht auf einer Pruefung an echten, unverarbeiteten Rohdaten, nachdem mehrere Notebook-KI-Zusammenfassungen widerspruechliche/erfundene Ergebnisse lieferten ("es gibt keinen Teilverkauf - die Position ist ZU"). Erst eine per &gt; datei.txt-Redirect direkt in Notepad geoeffnete Rohausgabe von fix_stuck_hebel_positions.py lieferte vertrauenswuerdige Daten.</w:t>
+      </w:r>
+    </w:p>
+    <w:p>
+      <w:r>
+        <w:t>Echte Root Cause: Bitpanda taggt die HYPE-Rueckzahlung mit "margin_trading.repay", nicht "borrow" - der Runde-1-Fix hat dieses Tag nie erkannt. Zusaetzlich ist die Rueckzahlung hier kein separates Leg, sondern im Verkaufserloes (sell_value) der Close-Transaktion enthalten: sell_qty deckte nur 66,4% der offenen Menge (Gebuehren + Kredittilgungsanteil verwaessern die Krypto-MENGE), aber sell_value deckte exakt 100% von running_borrow (400,00 EUR Erloes = 400,00 EUR Kredit).</w:t>
+      </w:r>
+    </w:p>
+    <w:p>
+      <w:r>
+        <w:t>Fix (Runde 2): drittes, unabhaengiges Signal in reconstruct_margin_positions() - deckt der Verkaufserloes (sell_value) mindestens 99,5% des verbleibenden Kredits (running_borrow), gilt das unabhaengig von sell_qty UND vom "borrow"-Tag als Vollverkauf. Der Runde-1-Fix (borrow-Tag-Signal) bleibt zusaetzlich bestehen fuer Faelle mit echtem separaten Rueckzahlungs-Leg.</w:t>
+      </w:r>
+    </w:p>
+    <w:p>
+      <w:r>
+        <w:t>Verifiziert: alle Runde-1-Tests weiterhin gruen (kein Regressionsverlust); neuer Test mit den EXAKTEN echten HYPE-Rohdaten (OPEN buy_value=600/buy_qty=11,58535869/borrow=400; CLOSE sell_value=400/sell_qty=7,69619853, Tags margin_trading.close+margin_trading.repay) liefert sell_value/running_borrow=1,0000 =&gt; ist_vollstaendiger_verkauf=True. Compile-/Import-Regressionscheck OK.</w:t>
+      </w:r>
+    </w:p>
+    <w:p>
+      <w:r>
+        <w:t>Commit 6c92103.</w:t>
       </w:r>
     </w:p>
     <w:sectPr>

</xml_diff>

<commit_message>
Regelwerksmanual + Spezifikation: JIT-Historie-Nachladen/EUR-Ableitung dokumentieren
Nachtrag-Abschnitt (Regelwerksmanual.md/.docx) zum LINK-Vorfall, JIT-
Mechanismus, Kontingent-Finanzierung, COALESCE-Fix und der deterministischen
EUR-Ableitung. Spezifikation.md: CoinGecko-Kontingent-Absatz um den bisher
nicht erfassten /global-Call ergaenzt.

Co-Authored-By: Claude Sonnet 5 <noreply@anthropic.com>
</commit_message>
<xml_diff>
--- a/Basisinfos/Regelwerksmanual.docx
+++ b/Basisinfos/Regelwerksmanual.docx
@@ -16064,6 +16064,162 @@
     <w:p>
       <w:r>
         <w:t>Commit 6c92103.</w:t>
+      </w:r>
+    </w:p>
+    <w:p>
+      <w:pPr>
+        <w:pStyle w:val="Heading3"/>
+      </w:pPr>
+      <w:r>
+        <w:t>Nachtrag (2026-07-27, gleicher Tag): JIT-Historie-Nachladen + deterministische EUR-Ableitung - echter LINK-Vorfall</w:t>
+      </w:r>
+    </w:p>
+    <w:p>
+      <w:pPr/>
+      <w:r>
+        <w:t>Nutzer meldete ein LINK-Hebel-Signal (LONG, ERÖFFNEN) mit Entry-Zone 6,81-6,91 EUR, waehrend der Live-Kurs bereits bei 7,7 EUR stand - die Take-Profit-Zone (7,80-7,90 EUR) lag praktisch auf dem aktuellen Kurs. Vom Nutzer explizit als "make or break"-Thema eingestuft, mit der Vorgabe, die eigentliche Ursache zu beheben statt nur ein Symptom (z.B. ein deterministisches Veto-Gate) zu kaschieren - ein Gate haette die ohnehin knappe Signal-Frequenz weiter reduziert, ohne das Grundproblem zu loesen.</w:t>
+      </w:r>
+    </w:p>
+    <w:p>
+      <w:pPr/>
+      <w:r>
+        <w:rPr>
+          <w:b/>
+        </w:rPr>
+        <w:t>Root Cause</w:t>
+      </w:r>
+      <w:r>
+        <w:t xml:space="preserve"> (per Live-Diagnose an echten Notebook-Daten gefunden): die technische Analyse (RSI/MACD/EMA/ATR/Support-Resistance), aus der Entry-/Stop-Loss-/Take-Profit-Zonen abgeleitet werden, basiert auf price_history (CoinGecko)/price_history_ohlc (Kraken) - beide werden nur alle 24h per Scheduler-Job aktualisiert. Der separate Live-Ticker (price_cache, 15-Min-Takt) war die ganze Zeit korrekt - nur die technische Basis konnte bis zu 24h alt sein. Fachlich bewertet (Nutzer-Vorgabe): eine feste 15-Min-Sequenz mit erst nach 6h+ sichtbarem Kurs-Gap ist fuer eine Entry-/Exit-Berechnung unbrauchbar.</w:t>
+      </w:r>
+    </w:p>
+    <w:p>
+      <w:pPr/>
+      <w:r>
+        <w:rPr>
+          <w:b/>
+        </w:rPr>
+        <w:t>Zweiter, unabhaengiger Befund:</w:t>
+      </w:r>
+      <w:r>
+        <w:t xml:space="preserve"> die EUR-Werte fuer Entry/Stop-Loss/Take-Profit/Halte-Kriterium/Positionsgroesse kamen bisher direkt und ungeprueft aus der eigenen eur_von/eur_bis-Antwort des LLM, nicht aus einer deterministischen Umrechnung - obwohl der Nutzer in EUR auf Bitpanda handelt ("mir nutzt ein USD Stop Loss oder Schwelle nichts").</w:t>
+      </w:r>
+    </w:p>
+    <w:p>
+      <w:pPr>
+        <w:pStyle w:val="Heading4"/>
+      </w:pPr>
+      <w:r>
+        <w:t>Fix 1: JIT-Historie-Nachladen (Hebel + Spot, Krypto-only)</w:t>
+      </w:r>
+    </w:p>
+    <w:p>
+      <w:pPr/>
+      <w:r>
+        <w:t>Neue Funktion agent/krypto/pipeline.py::jit_refresh_asset_historie(conn, asset, coingecko_client, kraken_client) - laedt fuer GENAU EIN Asset die juengste Tages-/OHLC-Historie unmittelbar VOR der eigentlichen Signal-Generierung nach (USD-only), statt auf den naechsten 24h-Batch zu warten. Eingebaut an den zwei echten Signal-Erzeugungsstellen: hebel_pipeline.py::generate_hebel_signal() und pipeline.py::generate_signal() (Spot) - bewusst NICHT in _load_closes_and_ohlc() selbst (7 Aufrufstellen, u.a. der 15-Min-Screening-Loop ueber alle Kandidaten sowie BTC/ETH-Kontextladungen - dort haette das Kontingent vervielfacht statt nur um die Anzahl echter Signal-Ereignisse gewachsen).</w:t>
+      </w:r>
+    </w:p>
+    <w:p>
+      <w:pPr/>
+      <w:r>
+        <w:rPr>
+          <w:b/>
+        </w:rPr>
+        <w:t>Burst-Schutz</w:t>
+      </w:r>
+      <w:r>
+        <w:t xml:space="preserve"> (JIT_REFRESH_MIN_ABSTAND_MINUTEN = 60, Python-Konstante): verhindert Mehrfach-Anfragen INNERHALB eines 15-Min-Allocator-Zyklus - normale Wiederholungen (Hebel-Cooldown 3,5h, Spot-Kern-Cooldown 8h) liegen weit darueber. Merkt sich bewusst den Versuchszeitpunkt (Erfolg ODER Fehlschlag), nicht einen Erfolgs-Zeitstempel - sonst wuerde ein echter CoinGecko-Ausfall bei jedem folgenden Signal-Versuch erneut einen aussichtslosen Call ausloesen (analog zum 07-23-Staleness-Watchdog-Vorfall, 390 blockierte Signale in einer Nacht). Zusaetzlich prueft CoinGeckoClient.in_cooldown() (neu) einen aktiven 429-Backoff. P-10: ein Fehlschlag darf die Signal-Erzeugung nicht kippen. Not-Aus per config.yaml: datenquellen.marktdaten.jit_historie_refresh_aktiv (Default true).</w:t>
+      </w:r>
+    </w:p>
+    <w:p>
+      <w:pPr/>
+      <w:r>
+        <w:rPr>
+          <w:b/>
+        </w:rPr>
+        <w:t>Kontingent-Finanzierung (Voraussetzung):</w:t>
+      </w:r>
+      <w:r>
+        <w:t xml:space="preserve"> _update_macro_snapshot() rief bisher bei JEDER Signal-Generierung ungecacht /global (BTC-Dominanz) ab. Jetzt: hoechstens 1x pro UTC-Tag, der bestehende COALESCE-Upsert in upsert_macro_snapshot() behaelt den Tageswert automatisch bei. Spart genau so viele Calls, wie das JIT-Nachladen zusaetzlich kostet - netto quotenneutral.</w:t>
+      </w:r>
+    </w:p>
+    <w:p>
+      <w:pPr/>
+      <w:r>
+        <w:rPr>
+          <w:b/>
+        </w:rPr>
+        <w:t>Blocker-Fix (Voraussetzung):</w:t>
+      </w:r>
+      <w:r>
+        <w:t xml:space="preserve"> database/db.py::upsert_price_history_points() schrieb bisher direkt statt mit COALESCE - ein USD-only-Nachladen haette die EUR-Historie (fuer ui/charts.py, vom Nutzer ausdruecklich als zu erhalten eingefordert) mit NULL ueberschrieben. Behebt zugleich einen bereits bestehenden, unabhaengigen Bug: ein fehlgeschlagener EUR-Abruf im taeglichen Job loeschte schon vorher echte EUR-Werte.</w:t>
+      </w:r>
+    </w:p>
+    <w:p>
+      <w:pPr/>
+      <w:r>
+        <w:t>api/history.py::backfill_history() und api/kraken_history.py::backfill_ohlc() haben dafuer einen neuen currencies-Parameter (Default weiterhin beide Waehrungen - die taeglichen Scheduler-Jobs sind dadurch unveraendert).</w:t>
+      </w:r>
+    </w:p>
+    <w:p>
+      <w:pPr>
+        <w:pStyle w:val="Heading4"/>
+      </w:pPr>
+      <w:r>
+        <w:t>Fix 2: Deterministische EUR-Ableitung (Hebel + Spot + Hedge)</w:t>
+      </w:r>
+    </w:p>
+    <w:p>
+      <w:pPr/>
+      <w:r>
+        <w:t>Neuer Helper agent/krypto/pipeline.py::eur_aus_usd(usd_wert, eur_usd_fx_rate) - identisches Muster wie das bereits produktive liquidationspreis_geschätzt_eur in hebel_risk_gate.py::post_check_hebel(). Ersetzt die bisherige entry.get("eur_von")-artige Weitergabe fuer Entry/Stop-Loss/Take-Profit/Halte-Kriterium-Zielpreis/Positionsgroesse in hebel_pipeline.py, pipeline.py (Spot) und agent/hedge/pipeline.py. _validate_hebel() und das LLM-Schema/der Prompt bleiben bewusst unangetastet - das Modell darf weiterhin eur_von/eur_bis liefern, es fliesst nur nicht mehr in die finale Signal-Struktur. Beobachtungs-Log log_eur_abweichungen() vergleicht optional die LLM-eigene EUR-Zahl mit dem abgeleiteten Wert (&gt;2% Abweichung -&gt; logger.info()), rein informativ.</w:t>
+      </w:r>
+    </w:p>
+    <w:p>
+      <w:pPr/>
+      <w:r>
+        <w:rPr>
+          <w:b/>
+        </w:rPr>
+        <w:t>Nebenfund</w:t>
+      </w:r>
+      <w:r>
+        <w:t xml:space="preserve"> in agent/hedge/pipeline.py::_post_check_hedge(): die Budget-Kappung und der Bull-Wahrscheinlichkeits-Deckel leiteten ihren eigenen fx-Rate-Fallback bisher aus den LLM-eigenen usd/eur-Positionsgroessen-Werten ab, bevorzugt vor dem echten eur_usd_fx_rate - jetzt ausschliesslich eur_aus_usd() mit dem echten Kurs.</w:t>
+      </w:r>
+    </w:p>
+    <w:p>
+      <w:pPr/>
+      <w:r>
+        <w:rPr>
+          <w:b/>
+        </w:rPr>
+        <w:t>Bewusst NICHT mitgezogen:</w:t>
+      </w:r>
+      <w:r>
+        <w:t xml:space="preserve"> agent/aktien/pipeline.py, agent/rohstoff/pipeline.py, agent/themen_etf/pipeline.py - gleicher EUR-Bug, aber keine lokal berechnete eur_usd_fx_rate und ein strukturell anderes, yfinance-basiertes Frische-Profil (Quotrix-Handelsfenster Mo-Fr 07:30-23:00 CET, bereits eigene 5-Tage-Toleranz) - eigene Folge-Runde vorgesehen.</w:t>
+      </w:r>
+    </w:p>
+    <w:p>
+      <w:pPr/>
+      <w:r>
+        <w:rPr>
+          <w:b/>
+        </w:rPr>
+        <w:t>Verifiziert:</w:t>
+      </w:r>
+      <w:r>
+        <w:t xml:space="preserve"> COALESCE-Erhalt der EUR-Historie bei einem USD-only-Upsert (inkl. Regressionstest fuer einen echten EUR-Update); Burst-Schutz (Erst-/Zweit-Versuch, Ablauf der Sperrfrist, unabhaengige Symbole); /global-Tages-Cache (genau 1 CoinGecko-Call bei zwei Aufrufen am selben Tag); eur_aus_usd()-Unit-Tests; End-to-End-Reproduktion des LINK-Vorfalls mit Fake-CoinGecko/Kraken-Clients (genau 1 CoinGecko-Call, ausschliesslich "usd", frischer Kurs danach sichtbar, kein weiterer Call innerhalb der Sperrfrist); Graceful-Degradation (beide Clients werfen -&gt; keine Exception; fehlende coingecko_id -&gt; kein Call); Config-Schalter aus -&gt; kein Call; _post_check_hedge() nutzt nachweislich den echten eur_usd_fx_rate statt der LLM-Eigenangabe; statischer Regressions-Grep bestaetigt keine verbliebenen rohen entry.get("eur_von")-Vorkommen in den drei geaenderten Dateien; Compile-/Import-Regressionscheck ueber alle 7 geaenderten Module und alle bekannten Konsumenten OK.</w:t>
+      </w:r>
+    </w:p>
+    <w:p>
+      <w:pPr/>
+      <w:r>
+        <w:rPr>
+          <w:b/>
+        </w:rPr>
+        <w:t>Ausstehend:</w:t>
+      </w:r>
+      <w:r>
+        <w:t xml:space="preserve"> echter Notebook-Lauf (Nutzer) - CoinGecko-Monatskontingent in der ersten Woche gegenchecken, ein echtes Signal stichprobenartig nachrechnen (entry_eur_von × fx_rate == entry_usd_von), EUR-Chart-Durchgaengigkeit bestaetigen.</w:t>
       </w:r>
     </w:p>
     <w:sectPr>

</xml_diff>

<commit_message>
Regelwerksmanual: Grundsatzfix Teil 2 dokumentieren (Aktien/Rohstoffe/Themen-ETF)
Neuer Nachtrag-Abschnitt direkt nach dem LINK-Vorfall-Eintrag: Rohstoff-
Skalierungsbug als Hauptfund, EUR-Ableitung-Begruendung (kein neuer Helfer
noetig), OHLC-Label-Fix + Migrationsskript-Hinweis, JIT-Nachladen-Mechanismus.
.md und .docx synchron gehalten.

Co-Authored-By: Claude Sonnet 5 <noreply@anthropic.com>
</commit_message>
<xml_diff>
--- a/Basisinfos/Regelwerksmanual.docx
+++ b/Basisinfos/Regelwerksmanual.docx
@@ -16220,6 +16220,193 @@
       </w:r>
       <w:r>
         <w:t xml:space="preserve"> echter Notebook-Lauf (Nutzer) - CoinGecko-Monatskontingent in der ersten Woche gegenchecken, ein echtes Signal stichprobenartig nachrechnen (entry_eur_von × fx_rate == entry_usd_von), EUR-Chart-Durchgaengigkeit bestaetigen.</w:t>
+      </w:r>
+    </w:p>
+    <w:p>
+      <w:pPr>
+        <w:pStyle w:val="Heading3"/>
+      </w:pPr>
+      <w:r>
+        <w:t>Nachtrag (2026-07-27, gleicher Tag, Folge): Grundsatzfix Teil 2 - derselbe</w:t>
+      </w:r>
+    </w:p>
+    <w:p>
+      <w:r>
+        <w:t>JIT-/EUR-Fix fuer Aktien/Rohstoffe/Themen-ETF + ein unabhaengiger, schwerer Rohstoff-Skalierungsbug</w:t>
+      </w:r>
+    </w:p>
+    <w:p>
+      <w:r>
+        <w:t>Der Nutzer stellte nach dem LINK-Fix explizit klar: "der Fix ist ein Grundsatzfix, Link war nur der Ausloeser" - und fragte, ob fuer die drei verbliebenen, yfinance-basierten Pipelines (Aktien, Rohstoffe, Themen-ETF) noch etwas fehlt. Vertiefte Recherche (Explore- + Plan-Agent, alle Kernbefunde selbst im Code nachverifiziert) ergab ein praeziseres, teils anderes Bild als bei Krypto - vier Einzelfunde:</w:t>
+      </w:r>
+    </w:p>
+    <w:p>
+      <w:r>
+        <w:rPr>
+          <w:b/>
+        </w:rPr>
+        <w:t>1. EUR-Bug identisch vorhanden, aber KEIN neuer Ableitungs-Helfer noetig.</w:t>
+      </w:r>
+      <w:r>
+        <w:t xml:space="preserve"> Die vom 07-27-Nachtrag oben als "eigene Folge-Runde vorgesehen" markierte Luecke (`entry.get("eur_von")` etc., unveraendert in allen drei Pipelines) existierte tatsaechlich - aber `agent/hedge/pipeline.py` beweist bereits live, dass das bestehende `eur_aus_usd()` fuer EUR-native UND USD-native Instrumente gleichermassen korrekt ist (Regel 4 aller Analyst-Prompts: "berechne den prozentualen Abstand EINMAL in USD und wende ihn auf EUR gleichermassen an" - algebraisch unabhaengig von der Herkunftsrichtung des USD-Preises, siehe Verifikation unten). Kein neuer, richtungsbewusster Helfer noetig - 1:1 dasselbe Muster (`eur_aus_usd()`/`log_eur_abweichungen()`) wie bei Hedge/Spot/Hebel uebernommen.</w:t>
+      </w:r>
+    </w:p>
+    <w:p>
+      <w:r>
+        <w:rPr>
+          <w:b/>
+        </w:rPr>
+        <w:t>2. Ein unabhaengiger, deutlich schwererer Fund bei der Vertiefung:</w:t>
+      </w:r>
+      <w:r>
+        <w:t xml:space="preserve"> `api/yfinance_history.py::get_full_ohlc_history(ticker, symbol, currency)` speichert OHLC-Rohwerte OHNE Waehrungsumrechnung unter dem uebergebenen `currency`-Label - alle drei Pipelines uebergaben dafuer hartkodiert `"USD"`, unabhaengig von der tatsaechlichen Notierungswaehrung. Zwei Faelle unterschiedlichen Schweregrads: - </w:t>
+      </w:r>
+      <w:r>
+        <w:rPr>
+          <w:b/>
+        </w:rPr>
+        <w:t>Aktien/Themen-ETF:</w:t>
+      </w:r>
+      <w:r>
+        <w:t xml:space="preserve"> reines Label-Problem (Zahlen korrekt, nur die Waehrungsspalte bei EUR-nativen Tickern falsch beschriftet). Aktuell folgenlos fuer Aktien (nur USD-native VST/PLTR in der Watchlist), aber bereits aktiv falsch fuer alle 5 Themen-ETF-Symbole (VVMX/X136/EXH3/CEBS/ ISOC, alle `.DE`/`.BE`, EUR-nativ). - </w:t>
+      </w:r>
+      <w:r>
+        <w:rPr>
+          <w:b/>
+        </w:rPr>
+        <w:t>Rohstoffe - ein echter, aktiver Zahlenfehler, kein Label-Problem:</w:t>
+      </w:r>
+      <w:r>
+        <w:t xml:space="preserve"> `agent/rohstoff/pipeline.py::_ensure_ohlc_backfilled()` laedt/speichert die OHLC-Historie vom liquiden Futures-Kontrakt (GC=F/SI=F/HG=F/NG=F, USD, Groessenordnung ~4000 fuer Gold). `_rescale_ohlc_zum_etc_kurs()` (siehe Docstring vom 07-18, Rohstoff-Pipeline Phase 2) skaliert diese Reihe auf die tatsaechliche ETC-Preisebene (~18-20 USD) herunter - aber bisher NUR im Arbeitsspeicher, nie zurueck in die DB geschrieben. Direkt verifiziert: `agent/krypto/backward_tracking.py::check_signal_outcome()` (keine Assetklassen-Filterung) las genau diese unskalierte, gespeicherte Reihe und verglich sie gegen `take_profit_usd_von`/`stop_loss_usd_von` auf ETC- Preisebene (~18-20) - ein Futures-High von ~4000 erfuellt `high &gt;= ~20` praktisch immer sofort. Das liess Rohstoff-KAUFEN/NACHKAUFEN-Signale seit Einfuehrung der Pipeline vermutlich fast immer sofort faelschlich als `take_profit_erreicht` aufloesen - korrumpiert nicht nur die Anzeige, sondern via `compute_win_rate_fact()` auch die `historische_erfolgsquote`, die als Fakt in jedes kuenftige Rohstoff-Signal zurueckfliesst (LLM bewertet seine eigene, durch den Bug verzerrte Erfolgsbilanz). </w:t>
+      </w:r>
+      <w:r>
+        <w:rPr>
+          <w:b/>
+        </w:rPr>
+        <w:t>Der mit Abstand wichtigste Einzelfund dieser Runde.</w:t>
+      </w:r>
+    </w:p>
+    <w:p>
+      <w:r>
+        <w:rPr>
+          <w:b/>
+        </w:rPr>
+        <w:t>3. Staleness strukturell schlechter als der urspruengliche Krypto-Zustand:</w:t>
+      </w:r>
+      <w:r>
+        <w:t xml:space="preserve"> Rohstoffe und Themen-ETF hatten GAR KEINEN Scheduler-Job (Aktien immerhin einen taeglichen 24h-Job seit 07-19) - Historie wurde ausschliesslich beim Signal-Lauf selbst nachgeladen, und nur nach Ueberschreiten der 5-Tage- Schwelle. Bis zu 5 statt 1 Tag, ohne jeden autonomen Auffrisch-Mechanismus.</w:t>
+      </w:r>
+    </w:p>
+    <w:p>
+      <w:r>
+        <w:rPr>
+          <w:b/>
+        </w:rPr>
+        <w:t>4. Kein CoinGecko-Kontingent-Analogon noetig:</w:t>
+      </w:r>
+      <w:r>
+        <w:t xml:space="preserve"> yfinance dokumentiert keinerlei Monats-/Rate-Limit in diesem Codebase (nur Timeout-Guards). Der Krypto-Fix hatte einen eigenen "Schritt 0" (`/global`-Deckelung), um das JIT-Nachladen kontingent-neutral zu finanzieren - hier bewusst nicht nachgebaut, da nicht noetig.</w:t>
+      </w:r>
+    </w:p>
+    <w:p>
+      <w:pPr>
+        <w:pStyle w:val="Heading4"/>
+      </w:pPr>
+      <w:r>
+        <w:t>Commit 1: Rohstoff-Skalierung tatsaechlich persistieren (hoechste Prioritaet)</w:t>
+      </w:r>
+    </w:p>
+    <w:p>
+      <w:r>
+        <w:t>`agent/rohstoff/pipeline.py::generate_signal()`: nach `_rescale_ohlc_zum_etc_kurs()` einen `db.upsert_ohlc_points(conn, ohlc_history)`-Schreibvorgang ergaenzt. Bewusste Verhaltensaenderung, kein reiner Nebeneffekt: der Skalierungsfaktor (`etc_preis_usd / closes[-1]`) aendert sich bei jedem Lauf leicht mit dem aktuellen Futures/ETC-Verhaeltnis - jeder Schreibvorgang ueberschreibt die GESAMTE historische Reihe mit dem jeweils neuesten Verhaeltnis. Erwuenscht (haelt die Reihe konsistent zum aktuell bekannten Faktor), aber nicht zeilenweise idempotent - hier explizit dokumentiert, damit niemand spaeter einen Bug vermutet.</w:t>
+      </w:r>
+    </w:p>
+    <w:p>
+      <w:pPr>
+        <w:pStyle w:val="Heading4"/>
+      </w:pPr>
+      <w:r>
+        <w:t>Commit 2: Deterministische EUR-Ableitung (alle drei Pipelines)</w:t>
+      </w:r>
+    </w:p>
+    <w:p>
+      <w:r>
+        <w:t>`eur_aus_usd()`/`log_eur_abweichungen()` (aus `agent/krypto/pipeline.py`) 1:1 wie bei Hedge/Spot/Hebel eingebaut: `eur_usd_fx_rate` aus dem Live-EURCV- Snapshot abgeleitet, alle 7 betroffenen Felder (`position_size_eur`, `entry_eur_von/bis`, `stop_loss_eur_von/bis`, `take_profit_eur_von/bis`, `halte_kriterium_ziel_preis_eur`) von der rohen LLM-Antwort auf die deterministische Ableitung umgestellt. `agent/aktien/pipeline.py` zusaetzlich: neues Gate-Problem `price_snap.price_usd is None`, falls ein kuenftiges EUR-natives Aktien-Asset ohne echten `eur_usd_fx_rate` sauber scheitern soll statt still weiterzulaufen. Analyst-Prompts/Schema bewusst unveraendert - das LLM darf weiter `eur_von`/`eur_bis` liefern, nur nicht mehr uebernommen.</w:t>
+      </w:r>
+    </w:p>
+    <w:p>
+      <w:pPr>
+        <w:pStyle w:val="Heading4"/>
+      </w:pPr>
+      <w:r>
+        <w:t>Commit 3: OHLC-Waehrungslabel Aktien/Themen-ETF + Migration</w:t>
+      </w:r>
+    </w:p>
+    <w:p>
+      <w:r>
+        <w:t>Neue Funktion `api/yfinance_client.py::resolve_native_currency(yfinance_symbol)` - billiger `fast_info.get("currency")`-Call (kein `.history()`), P-10-sicher (`None` bei Fehlschlag, Aufrufer faellt auf `"USD"` zurueck). `agent/aktien/pipeline.py` und `agent/themen_etf/pipeline.py` bekamen je einen `_resolve_asset_currency(asset)`-Helper sowie einen um `currency` parametrisierten `_ensure_ohlc_backfilled()`/`_load_ohlc()`. Themen-ETFs SPY-Benchmarkserie bleibt hartkodiert `"USD"` (SPY ist echt USD-nativ). Rohstoffe bewusst NICHT parametrisiert - Futures sind genuin USD, das ist kein Label- sondern ein reines Skalierungsproblem (siehe Commit 1).</w:t>
+      </w:r>
+    </w:p>
+    <w:p>
+      <w:r>
+        <w:t xml:space="preserve">Einmaliges Migrationsskript `migrate_themen_etf_ohlc_currency.py` (Projekt-Root, Dry-Run per Default, `--apply` fuer echtes Schreiben) relabelt die 5 betroffenen Themen-ETF-Symbole (VVMX/X136/EXH3/CEBS/ISOC) von `currency='USD'` auf `'EUR'`. Sicher wegen `PRIMARY KEY (symbol, currency, date)` und keiner bereits existierenden `'EUR'`-Kollision (verifiziert). Kein Blocker, falls nicht sofort ausgefuehrt - die 5-Tage-Staleness-Schwelle wuerde die falsch beschrifteten Zeilen ohnehin binnen 5 Tagen durch den korrigierten Code selbst heilen. </w:t>
+      </w:r>
+      <w:r>
+        <w:rPr>
+          <w:b/>
+        </w:rPr>
+        <w:t>Muss vom Nutzer auf dem Notebook (echte Produktions-DB) ausgefuehrt werden, NIE auf dem Desktop</w:t>
+      </w:r>
+      <w:r>
+        <w:t xml:space="preserve"> - analog zum `fix_stuck_hebel_positions.py`-Workflow vom HYPE-Fix.</w:t>
+      </w:r>
+    </w:p>
+    <w:p>
+      <w:pPr>
+        <w:pStyle w:val="Heading4"/>
+      </w:pPr>
+      <w:r>
+        <w:t>Commit 4: JIT-Nachladen fuer alle drei Pipelines + Config</w:t>
+      </w:r>
+    </w:p>
+    <w:p>
+      <w:r>
+        <w:t>Neue Funktion `jit_refresh_ohlc()` in jeder der drei Pipeline-Dateien (eigener, unabhaengiger Burst-Schutz-Dict pro Datei - Symbole ueberschneiden sich nicht zwischen Assetklassen), gleiches attempt-based 60-Minuten-Muster wie beim Krypto-Fix. Aufrufstellen jeweils direkt vor dem bestehenden `_ensure_ohlc_backfilled()` in `generate_signal()` (`agent/multi_asset_batch.py` ruft `generate_signal()` ohnehin auf, ist also automatisch mitabgedeckt). Rohstoff-Besonderheit: der JIT-Aufruf laedt ueber `SYMBOL_ZU_FUTURES_TICKER[asset.symbol]` mit `currency="USD"` und laeuft VOR `_ensure_ohlc_backfilled()`/`_rescale_ohlc_zum_etc_kurs()`, damit die frisch geladene Futures-Reihe auch reskaliert+persistiert wird (Commit 1). Eigener, neuer Config-Schalter `datenquellen.marktdaten_wertpapiere.jit_historie_ refresh_aktiv` (bewusst getrennt von Kryptos `datenquellen.marktdaten.*` - reiner operativer Not-Aus gegen einen yfinance-Ausfall, KEINE Kontingent-Finanzierung wie bei Krypto, da yfinance keine dokumentierte Quote kennt).</w:t>
+      </w:r>
+    </w:p>
+    <w:p>
+      <w:pPr>
+        <w:pStyle w:val="Heading4"/>
+      </w:pPr>
+      <w:r>
+        <w:t>Explizit NICHT Teil dieser Runde</w:t>
+      </w:r>
+    </w:p>
+    <w:p>
+      <w:r>
+        <w:t>Kein neuer richtungsbewusster/bidirektionaler Umrechnungs-Helfer (algebraisch/ live durch Hedge bereits bewiesen unnoetig); keine CoinGecko-Analogie- Kontingent-Finanzierung (yfinance hat keine dokumentierte Quote); `post_ check()`s fehlende `current_price`/`atr_value`/`dates`/`closes`-Kwargs bei Aktien/Rohstoff/Themen-ETF/Hedge (verifiziert folgenlos, gated durch `richtungswende is None`, eigenes kuenftiges Ticket falls je ausgeweitet); JIT- Nachladen fuer die Themen-ETF-SPY-Benchmarkserie (niedrige Prioritaet, rein informativer Fakt); Migration bereits gespeicherter Aktien-OHLC-Zeilen (aktuell keine EUR-native Aktie in der Watchlist, nichts zu migrieren).</w:t>
+      </w:r>
+    </w:p>
+    <w:p>
+      <w:r>
+        <w:rPr>
+          <w:b/>
+        </w:rPr>
+        <w:t>Verifiziert (synthetisch, In-Memory-SQLite, keine Produktions-DB beruehrt):</w:t>
+      </w:r>
+      <w:r>
+        <w:t xml:space="preserve"> Rohstoff-Skalierungs-Regressionstest (persistierte Reihe liegt nach dem Fix auf ETC-Skala statt Futures-Skala; `check_signal_outcome()` loest ein `take_profit_usd_von=20.0`-Signal NACH dem Fix nicht mehr sofort auf, OHNE Fix beweisbar schon); EUR-Ableitung-Identitaetstest (`eur_aus_usd()` numerisch identisch zur unabhaengig nachgerechneten Regel-4-Formel, inkl. Graceful-Degradation bei fehlendem `usd_wert`/`fx_rate`); OHLC-Label- Migrationstest (nach UPDATE liefert `get_ohlc_history(..., "EUR")` die migrierten Zeilen, `"USD"` liefert nichts mehr; `ui/charts.py:: KRAKEN_PAIR_MAP` bestaetigt frei von allen 5 Themen-ETF-Symbolen); JIT- Burst-Schutz (zwei Aufrufe kurz hintereinander -&gt; genau 1 echter Abruf, nach Ablauf des 60-Min.-Fensters wieder erlaubt); Graceful-Degradation (fehlendes `yfinance_symbol`, werfender Fake-Client, Config-Schalter aus - je kein Fehler, kein Abruf); statischer Regressions-Grep (keine verbliebenen rohen `entry.get("eur_von")`-Vorkommen ausserhalb der bewusst beibehaltenen Beobachtungs-Vergleiche in `log_eur_abweichungen()`); Compile-/Import- Regressionscheck ueber alle 6 geaenderten Module UND alle bekannten Konsumenten (`agent/multi_asset_batch.py`, `scheduler/background.py`, `ui/charts.py`, `remote/status.py`, `remote/server.py`) OK.</w:t>
+      </w:r>
+    </w:p>
+    <w:p>
+      <w:r>
+        <w:rPr>
+          <w:b/>
+        </w:rPr>
+        <w:t>Ausstehend:</w:t>
+      </w:r>
+      <w:r>
+        <w:t xml:space="preserve"> echter Notebook-Lauf (Nutzer) - ein Rohstoff-Signal nach dem Fix beobachten, ob `outcome_status` nicht mehr sofort `take_profit_erreicht` wird; `historische_erfolgsquote` fuer Rohstoffe nach einigen Tagen erneut gegenchecken (sollte sich strukturell veraendern, da die bisherige Quote auf dem Skalierungsbug beruhte); Migrationsskript `migrate_themen_etf_ohlc_ currency.py --apply` auf dem Notebook ausfuehren.</w:t>
       </w:r>
     </w:p>
     <w:sectPr>

</xml_diff>

<commit_message>
Regelwerksmanual: NEAR-Signal-Review dokumentieren (Mindestziel-EUR + CRV-Klarstellung)
Nachtrag direkt nach dem Grundsatzfix-Teil-2-Eintrag: Mindestziel-EUR-Luecke
als Fund + Fix, sowie die zurueckgezogene CRV-Diskrepanz als Lehre (2-Dezimal-
Rundung bei engen Hebel-Stops im 1-5-EUR-Bereich verzerrt eine manuelle
Rueckrechnung aus der Zone). .md und .docx synchron gehalten.

Co-Authored-By: Claude Sonnet 5 <noreply@anthropic.com>
</commit_message>
<xml_diff>
--- a/Basisinfos/Regelwerksmanual.docx
+++ b/Basisinfos/Regelwerksmanual.docx
@@ -16407,6 +16407,63 @@
       </w:r>
       <w:r>
         <w:t xml:space="preserve"> echter Notebook-Lauf (Nutzer) - ein Rohstoff-Signal nach dem Fix beobachten, ob `outcome_status` nicht mehr sofort `take_profit_erreicht` wird; `historische_erfolgsquote` fuer Rohstoffe nach einigen Tagen erneut gegenchecken (sollte sich strukturell veraendern, da die bisherige Quote auf dem Skalierungsbug beruhte); Migrationsskript `migrate_themen_etf_ohlc_ currency.py --apply` auf dem Notebook ausfuehren.</w:t>
+      </w:r>
+    </w:p>
+    <w:p>
+      <w:pPr>
+        <w:pStyle w:val="Heading3"/>
+      </w:pPr>
+      <w:r>
+        <w:t>Nachtrag (2026-07-27, gleicher Tag, Folge): NEAR-Hebel-Signal-Review -</w:t>
+      </w:r>
+    </w:p>
+    <w:p>
+      <w:r>
+        <w:t>Mindestziel-EUR-Luecke gefunden und geschlossen</w:t>
+      </w:r>
+    </w:p>
+    <w:p>
+      <w:r>
+        <w:t>Nutzer bat um eine Konsistenzpruefung eines konkreten NEAR-LONG-Hebel-Signals gegen den frisch gepushten Grundsatzfix (EUR/USD-Umrechnung, Ablaufkette). Zwei Punkte geprueft:</w:t>
+      </w:r>
+    </w:p>
+    <w:p>
+      <w:r>
+        <w:t xml:space="preserve">1. </w:t>
+      </w:r>
+      <w:r>
+        <w:rPr>
+          <w:b/>
+        </w:rPr>
+        <w:t>Bestaetigt, echt: Mindestziel hatte nie eine EUR-Ableitung.</w:t>
+      </w:r>
+      <w:r>
+        <w:t xml:space="preserve"> Anders als Entry/Stop-Loss/Take-Profit/Halte-Kriterium/Liquidationspreis/ Eigenkapitalbedarf (alle laengst deterministisch in EUR via `eur_aus_usd()`) zeigte `_formatiere_mindestziel()` (`scheduler/background.py`) das Mindestziel nur in USD - `HebelSignal`/`Signal` hatten schlicht kein `mindestziel_eur`-Feld (Luecke seit Einfuehrung des Mindestziel/MFE- Feature am selben Tag). Gefixt: neues additives Feld `mindestziel_eur` in beiden Dataclasses (`database/models.py`), additive Migration (dieselbe Migrationsfunktion wie `mindestziel_usd`, `database/db.py`), Ableitung via `eur_aus_usd(mindestziel_usd_wert, eur_usd_fx_rate)` in `agent/krypto/ pipeline.py`/`hebel_pipeline.py`, Anzeige nachgezogen in E-Mail (`scheduler/background.py::_formatiere_mindestziel()`) UND beiden App-Detail-Panels (`ui/hebel_view.py`, `ui/signals_view.py` - vorher ebenfalls USD-only, derselbe Fund), sowie im Diagnose-Export (`extract_notebook_diagnose.py`).</w:t>
+      </w:r>
+    </w:p>
+    <w:p>
+      <w:r>
+        <w:t xml:space="preserve">2. </w:t>
+      </w:r>
+      <w:r>
+        <w:rPr>
+          <w:b/>
+        </w:rPr>
+        <w:t>Zurueckgezogen: vermeintliche CRV-Diskrepanz war ein eigener Rechenfehler, kein Systemfehler.</w:t>
+      </w:r>
+      <w:r>
+        <w:t xml:space="preserve"> Erster Verdacht: der gedruckte CRV-Wert (2,79) liess sich aus der gedruckten EUR-Entry/Stop-Loss/Take-Profit-Zone nicht nachrechnen (~3,57 statt 2,79). Code-Pruefung (`hebel_risk_gate.py:: post_check_hebel()`, Zeilen ~994-1010) zeigt: `entry`/`stop_loss`/ `take_profit` werden einmal aus der LLM-Antwort gelesen und danach nie veraendert - CRV, `sl_abstand_relativ` UND die spaetere EUR-Ableitung (`hebel_pipeline.py`) lesen beweisbar dieselben, unveraenderten USD- Rohwerte. Ursache der scheinbaren Diskrepanz: `format_money()` (`ui/formatting.py`) rundet ab `|Wert| ≥ 1` auf 2 Nachkommastellen - bei NEAR (~1,6 EUR, ~2-3% Stop-Loss-Abstand) reicht diese Rundung aus, um beim Zurueckrechnen aus den ANGEZEIGTEN Zonenwerten einen CRV zwischen ~2,56 und ~5,40 zu ergeben, obwohl intern nur EIN exakter Wert (2,79) existiert. Kein Fix noetig - Lehre: bei engen Hebel-Stops (Coins im 1-5-EUR-Bereich) ist der gedruckte CRV/SL-Abstand-Wert selbst massgeblich, eine manuelle Nachrechnung aus der 2-Dezimal-EUR-Zone ist bei kleinen Stop-Distanzen nicht zuverlaessig moeglich.</w:t>
+      </w:r>
+    </w:p>
+    <w:p>
+      <w:r>
+        <w:rPr>
+          <w:b/>
+        </w:rPr>
+        <w:t>Verifiziert:</w:t>
+      </w:r>
+      <w:r>
+        <w:t xml:space="preserve"> synthetischer Migrations-/Rundtrip-Test (`mindestziel_eur` in beiden Tabellen, `eur_aus_usd()`-Identitaet, Insert+Read fuer Signal UND HebelSignal, E-Mail-Zeile zeigt EUR, Graceful-Degradation ohne `mindestziel_eur`); Compile-/Import-Regressionscheck ueber alle 8 geaenderten Module + bekannte Konsumenten.</w:t>
       </w:r>
     </w:p>
     <w:sectPr>

</xml_diff>

<commit_message>
Z.ai-Gegenpruefung auf alle 6 Signal-Pipelines ausgeweitet
Konsistenz-Check und unabhaengiger Richtungs-Abgleich liefen bisher nur bei
Krypto-Hebel vollstaendig, Krypto-Spot nur teilweise (kein Richtungs-Abgleich,
kein E-Mail-Wartemechanismus) und Aktien/Rohstoffe/Themen-ETF/Hedge gar nicht.
Gemeinsame Thread-Funktion + Action-zu-Richtung-Mapping nach
agent/krypto/gegenpruefung.py verschoben/ergaenzt, additive DB-Schema-
Angleichung (Signal bekommt die 3 Felder, die HebelSignal schon hatte),
zai_client durch die Multi-Asset-Batch-Kette durchgereicht, E-Mail-Re-Fetch
statt Hebel-artigem Wartemechanismus fuer den taeglichen Batch. Hedge-
Richtung wird deterministisch invertiert (KAUFEN = baerische Gesamtmarkt-
erwartung, nicht bullisch auf das Hedge-Instrument selbst).

Co-Authored-By: Claude Sonnet 5 <noreply@anthropic.com>
</commit_message>
<xml_diff>
--- a/Basisinfos/Regelwerksmanual.docx
+++ b/Basisinfos/Regelwerksmanual.docx
@@ -16464,6 +16464,1094 @@
       </w:r>
       <w:r>
         <w:t xml:space="preserve"> synthetischer Migrations-/Rundtrip-Test (`mindestziel_eur` in beiden Tabellen, `eur_aus_usd()`-Identitaet, Insert+Read fuer Signal UND HebelSignal, E-Mail-Zeile zeigt EUR, Graceful-Degradation ohne `mindestziel_eur`); Compile-/Import-Regressionscheck ueber alle 8 geaenderten Module + bekannte Konsumenten.</w:t>
+      </w:r>
+    </w:p>
+    <w:p>
+      <w:pPr>
+        <w:pStyle w:val="Heading3"/>
+      </w:pPr>
+      <w:r>
+        <w:t>Nachtrag (2026-07-27): Z.ai-Gegenpruefung auf alle 6 Signal-Pipelines ausgeweitet (Konsistenz-Check UND Richtungs-Abgleich)</w:t>
+      </w:r>
+    </w:p>
+    <w:p>
+      <w:r>
+        <w:rPr>
+          <w:b w:val="0"/>
+        </w:rPr>
+        <w:t xml:space="preserve">Auslöser: Prüfung eines echten ALGO-Spot-Signals ("wo ist hier ZAI?"). Analyse ergab eine gewachsene, asymmetrische Teil-Umsetzung: Krypto-Hebel hatte beide Z.ai-Calls (Konsistenz-Check + unabhängiger Richtungs-Abgleich) plus einen E-Mail-Wartemechanismus; Krypto-Spot nur den Konsistenz-Check ohne Wartemechanismus (Z.ai-Ergebnis kam strukturell fast nie rechtzeitig in die E-Mail); Aktien/Rohstoffe/Themen-ETF/Hedge hatten gar keine Z.ai-Integration. Nutzer-Vorgabe: </w:t>
+      </w:r>
+      <w:r>
+        <w:rPr>
+          <w:b/>
+        </w:rPr>
+        <w:t>"soll vom Grundprinzip bei allen Assets ident funktionieren"</w:t>
+      </w:r>
+      <w:r>
+        <w:rPr>
+          <w:b w:val="0"/>
+        </w:rPr>
+        <w:t xml:space="preserve"> - beide Z.ai-Calls für alle 6 Pipelines.</w:t>
+      </w:r>
+    </w:p>
+    <w:p>
+      <w:pPr>
+        <w:pStyle w:val="Heading4"/>
+      </w:pPr>
+      <w:r>
+        <w:t>Bestätigt vor der Umsetzung: Fakten sind bereits 1:1 kompatibel</w:t>
+      </w:r>
+    </w:p>
+    <w:p>
+      <w:r>
+        <w:rPr>
+          <w:rFonts w:ascii="Consolas" w:hAnsi="Consolas"/>
+          <w:b w:val="0"/>
+        </w:rPr>
+        <w:t>baue_fakten()</w:t>
+      </w:r>
+      <w:r>
+        <w:rPr>
+          <w:b w:val="0"/>
+        </w:rPr>
+        <w:t>/</w:t>
+      </w:r>
+      <w:r>
+        <w:rPr>
+          <w:rFonts w:ascii="Consolas" w:hAnsi="Consolas"/>
+          <w:b w:val="0"/>
+        </w:rPr>
+        <w:t>baue_objektive_fakten()</w:t>
+      </w:r>
+      <w:r>
+        <w:rPr>
+          <w:b w:val="0"/>
+        </w:rPr>
+        <w:t xml:space="preserve"> (</w:t>
+      </w:r>
+      <w:r>
+        <w:rPr>
+          <w:rFonts w:ascii="Consolas" w:hAnsi="Consolas"/>
+          <w:b w:val="0"/>
+        </w:rPr>
+        <w:t>agent/krypto/gegenpruefung.py</w:t>
+      </w:r>
+      <w:r>
+        <w:rPr>
+          <w:b w:val="0"/>
+        </w:rPr>
+        <w:t>) waren bereits asset-neutral - alle Krypto-exklusiven Parameter (</w:t>
+      </w:r>
+      <w:r>
+        <w:rPr>
+          <w:rFonts w:ascii="Consolas" w:hAnsi="Consolas"/>
+          <w:b w:val="0"/>
+        </w:rPr>
+        <w:t>funding_rate_stunde</w:t>
+      </w:r>
+      <w:r>
+        <w:rPr>
+          <w:b w:val="0"/>
+        </w:rPr>
+        <w:t xml:space="preserve">, </w:t>
+      </w:r>
+      <w:r>
+        <w:rPr>
+          <w:rFonts w:ascii="Consolas" w:hAnsi="Consolas"/>
+          <w:b w:val="0"/>
+        </w:rPr>
+        <w:t>optionsmarkt_skew</w:t>
+      </w:r>
+      <w:r>
+        <w:rPr>
+          <w:b w:val="0"/>
+        </w:rPr>
+        <w:t xml:space="preserve">) sind optional und werden bei </w:t>
+      </w:r>
+      <w:r>
+        <w:rPr>
+          <w:rFonts w:ascii="Consolas" w:hAnsi="Consolas"/>
+          <w:b w:val="0"/>
+        </w:rPr>
+        <w:t>None</w:t>
+      </w:r>
+      <w:r>
+        <w:rPr>
+          <w:b w:val="0"/>
+        </w:rPr>
+        <w:t xml:space="preserve"> einfach aus dem Fakten-Dict weggelassen, kein Fake-Wert nötig.</w:t>
+      </w:r>
+    </w:p>
+    <w:p>
+      <w:pPr>
+        <w:pStyle w:val="Heading4"/>
+      </w:pPr>
+      <w:r>
+        <w:t>Zwei technische Lücken geschlossen</w:t>
+      </w:r>
+    </w:p>
+    <w:p>
+      <w:pPr>
+        <w:pStyle w:val="ListBullet"/>
+      </w:pPr>
+      <w:r>
+        <w:rPr>
+          <w:b/>
+        </w:rPr>
+        <w:t>DB-Schema-Asymmetrie:</w:t>
+      </w:r>
+      <w:r>
+        <w:rPr>
+          <w:b w:val="0"/>
+        </w:rPr>
+        <w:t xml:space="preserve"> </w:t>
+      </w:r>
+      <w:r>
+        <w:rPr>
+          <w:rFonts w:ascii="Consolas" w:hAnsi="Consolas"/>
+          <w:b w:val="0"/>
+        </w:rPr>
+        <w:t>hebel_signals</w:t>
+      </w:r>
+      <w:r>
+        <w:rPr>
+          <w:b w:val="0"/>
+        </w:rPr>
+        <w:t xml:space="preserve"> hatte bereits alle 5 Z.ai-Spalten, </w:t>
+      </w:r>
+      <w:r>
+        <w:rPr>
+          <w:rFonts w:ascii="Consolas" w:hAnsi="Consolas"/>
+          <w:b w:val="0"/>
+        </w:rPr>
+        <w:t>signals</w:t>
+      </w:r>
+      <w:r>
+        <w:rPr>
+          <w:b w:val="0"/>
+        </w:rPr>
+        <w:t xml:space="preserve"> (gemeinsam für Krypto-Spot/Aktien/Rohstoffe/ Themen-ETF/Hedge) nur die 2 Konsistenz-Check-Spalten. Additive Migration: </w:t>
+      </w:r>
+      <w:r>
+        <w:rPr>
+          <w:rFonts w:ascii="Consolas" w:hAnsi="Consolas"/>
+          <w:b w:val="0"/>
+        </w:rPr>
+        <w:t>_ZAI_GEGENPRUEFUNG_SPOT_NEW_COLUMNS</w:t>
+      </w:r>
+      <w:r>
+        <w:rPr>
+          <w:b w:val="0"/>
+        </w:rPr>
+        <w:t xml:space="preserve"> (</w:t>
+      </w:r>
+      <w:r>
+        <w:rPr>
+          <w:rFonts w:ascii="Consolas" w:hAnsi="Consolas"/>
+          <w:b w:val="0"/>
+        </w:rPr>
+        <w:t>database/db.py</w:t>
+      </w:r>
+      <w:r>
+        <w:rPr>
+          <w:b w:val="0"/>
+        </w:rPr>
+        <w:t xml:space="preserve">) um </w:t>
+      </w:r>
+      <w:r>
+        <w:rPr>
+          <w:rFonts w:ascii="Consolas" w:hAnsi="Consolas"/>
+          <w:b w:val="0"/>
+        </w:rPr>
+        <w:t>zai_eigene_richtung</w:t>
+      </w:r>
+      <w:r>
+        <w:rPr>
+          <w:b w:val="0"/>
+        </w:rPr>
+        <w:t>/</w:t>
+      </w:r>
+      <w:r>
+        <w:rPr>
+          <w:rFonts w:ascii="Consolas" w:hAnsi="Consolas"/>
+          <w:b w:val="0"/>
+        </w:rPr>
+        <w:t>zai_uebereinstimmung</w:t>
+      </w:r>
+      <w:r>
+        <w:rPr>
+          <w:b w:val="0"/>
+        </w:rPr>
+        <w:t>/</w:t>
+      </w:r>
+      <w:r>
+        <w:rPr>
+          <w:rFonts w:ascii="Consolas" w:hAnsi="Consolas"/>
+          <w:b w:val="0"/>
+        </w:rPr>
+        <w:t>zai_richtung_kurzbegruendung</w:t>
+      </w:r>
+      <w:r>
+        <w:rPr>
+          <w:b w:val="0"/>
+        </w:rPr>
+        <w:t xml:space="preserve"> erweitert; </w:t>
+      </w:r>
+      <w:r>
+        <w:rPr>
+          <w:rFonts w:ascii="Consolas" w:hAnsi="Consolas"/>
+          <w:b w:val="0"/>
+        </w:rPr>
+        <w:t>update_signal_zai_gegenpruefung()</w:t>
+      </w:r>
+      <w:r>
+        <w:rPr>
+          <w:b w:val="0"/>
+        </w:rPr>
+        <w:t xml:space="preserve"> auf dieselbe 5-Parameter- Signatur wie </w:t>
+      </w:r>
+      <w:r>
+        <w:rPr>
+          <w:rFonts w:ascii="Consolas" w:hAnsi="Consolas"/>
+          <w:b w:val="0"/>
+        </w:rPr>
+        <w:t>update_hebel_signal_zai_gegenpruefung()</w:t>
+      </w:r>
+      <w:r>
+        <w:rPr>
+          <w:b w:val="0"/>
+        </w:rPr>
+        <w:t xml:space="preserve"> gebracht (3 neue Parameter mit </w:t>
+      </w:r>
+      <w:r>
+        <w:rPr>
+          <w:rFonts w:ascii="Consolas" w:hAnsi="Consolas"/>
+          <w:b w:val="0"/>
+        </w:rPr>
+        <w:t>None</w:t>
+      </w:r>
+      <w:r>
+        <w:rPr>
+          <w:b w:val="0"/>
+        </w:rPr>
+        <w:t xml:space="preserve">-Default, bestehende 4-Parameter-Aufrufer bleiben kompatibel); </w:t>
+      </w:r>
+      <w:r>
+        <w:rPr>
+          <w:rFonts w:ascii="Consolas" w:hAnsi="Consolas"/>
+          <w:b w:val="0"/>
+        </w:rPr>
+        <w:t>Signal</w:t>
+      </w:r>
+      <w:r>
+        <w:rPr>
+          <w:b w:val="0"/>
+        </w:rPr>
+        <w:t>-Dataclass (</w:t>
+      </w:r>
+      <w:r>
+        <w:rPr>
+          <w:rFonts w:ascii="Consolas" w:hAnsi="Consolas"/>
+          <w:b w:val="0"/>
+        </w:rPr>
+        <w:t>database/models.py</w:t>
+      </w:r>
+      <w:r>
+        <w:rPr>
+          <w:b w:val="0"/>
+        </w:rPr>
+        <w:t xml:space="preserve">) um die 3 Felder erweitert (1:1 wie </w:t>
+      </w:r>
+      <w:r>
+        <w:rPr>
+          <w:rFonts w:ascii="Consolas" w:hAnsi="Consolas"/>
+          <w:b w:val="0"/>
+        </w:rPr>
+        <w:t>HebelSignal</w:t>
+      </w:r>
+      <w:r>
+        <w:rPr>
+          <w:b w:val="0"/>
+        </w:rPr>
+        <w:t xml:space="preserve">). 2. </w:t>
+      </w:r>
+      <w:r>
+        <w:rPr>
+          <w:b/>
+        </w:rPr>
+        <w:t xml:space="preserve">4 Pipelines ohne </w:t>
+      </w:r>
+      <w:r>
+        <w:rPr>
+          <w:rFonts w:ascii="Consolas" w:hAnsi="Consolas"/>
+          <w:b/>
+        </w:rPr>
+        <w:t>zai_client</w:t>
+      </w:r>
+      <w:r>
+        <w:rPr>
+          <w:b/>
+        </w:rPr>
+        <w:t>-Parameter und ohne Plumbing:</w:t>
+      </w:r>
+      <w:r>
+        <w:rPr>
+          <w:b w:val="0"/>
+        </w:rPr>
+        <w:t xml:space="preserve"> kein </w:t>
+      </w:r>
+      <w:r>
+        <w:rPr>
+          <w:rFonts w:ascii="Consolas" w:hAnsi="Consolas"/>
+          <w:b w:val="0"/>
+        </w:rPr>
+        <w:t>generate_signal()</w:t>
+      </w:r>
+      <w:r>
+        <w:rPr>
+          <w:b w:val="0"/>
+        </w:rPr>
+        <w:t xml:space="preserve"> von Aktien/Rohstoffe/Themen-ETF/Hedge kannte </w:t>
+      </w:r>
+      <w:r>
+        <w:rPr>
+          <w:rFonts w:ascii="Consolas" w:hAnsi="Consolas"/>
+          <w:b w:val="0"/>
+        </w:rPr>
+        <w:t>zai_client</w:t>
+      </w:r>
+      <w:r>
+        <w:rPr>
+          <w:b w:val="0"/>
+        </w:rPr>
+        <w:t>; die Multi-Asset-Batch-Kette (</w:t>
+      </w:r>
+      <w:r>
+        <w:rPr>
+          <w:rFonts w:ascii="Consolas" w:hAnsi="Consolas"/>
+          <w:b w:val="0"/>
+        </w:rPr>
+        <w:t>main.py</w:t>
+      </w:r>
+      <w:r>
+        <w:rPr>
+          <w:b w:val="0"/>
+        </w:rPr>
+        <w:t xml:space="preserve"> → </w:t>
+      </w:r>
+      <w:r>
+        <w:rPr>
+          <w:rFonts w:ascii="Consolas" w:hAnsi="Consolas"/>
+          <w:b w:val="0"/>
+        </w:rPr>
+        <w:t>build_scheduler()</w:t>
+      </w:r>
+      <w:r>
+        <w:rPr>
+          <w:b w:val="0"/>
+        </w:rPr>
+        <w:t xml:space="preserve"> → </w:t>
+      </w:r>
+      <w:r>
+        <w:rPr>
+          <w:rFonts w:ascii="Consolas" w:hAnsi="Consolas"/>
+          <w:b w:val="0"/>
+        </w:rPr>
+        <w:t>multi_asset_batch_job()</w:t>
+      </w:r>
+      <w:r>
+        <w:rPr>
+          <w:b w:val="0"/>
+        </w:rPr>
+        <w:t xml:space="preserve"> → </w:t>
+      </w:r>
+      <w:r>
+        <w:rPr>
+          <w:rFonts w:ascii="Consolas" w:hAnsi="Consolas"/>
+          <w:b w:val="0"/>
+        </w:rPr>
+        <w:t>run_multi_asset_batch()</w:t>
+      </w:r>
+      <w:r>
+        <w:rPr>
+          <w:b w:val="0"/>
+        </w:rPr>
+        <w:t xml:space="preserve">) reichte </w:t>
+      </w:r>
+      <w:r>
+        <w:rPr>
+          <w:rFonts w:ascii="Consolas" w:hAnsi="Consolas"/>
+          <w:b w:val="0"/>
+        </w:rPr>
+        <w:t>zai_client</w:t>
+      </w:r>
+      <w:r>
+        <w:rPr>
+          <w:b w:val="0"/>
+        </w:rPr>
+        <w:t xml:space="preserve"> nirgends durch, obwohl er in </w:t>
+      </w:r>
+      <w:r>
+        <w:rPr>
+          <w:rFonts w:ascii="Consolas" w:hAnsi="Consolas"/>
+          <w:b w:val="0"/>
+        </w:rPr>
+        <w:t>build_scheduler()</w:t>
+      </w:r>
+      <w:r>
+        <w:rPr>
+          <w:b w:val="0"/>
+        </w:rPr>
+        <w:t xml:space="preserve"> bereits im Scope war (wird dort schon an </w:t>
+      </w:r>
+      <w:r>
+        <w:rPr>
+          <w:rFonts w:ascii="Consolas" w:hAnsi="Consolas"/>
+          <w:b w:val="0"/>
+        </w:rPr>
+        <w:t>hebel_screening_job</w:t>
+      </w:r>
+      <w:r>
+        <w:rPr>
+          <w:b w:val="0"/>
+        </w:rPr>
+        <w:t xml:space="preserve"> durchgereicht).</w:t>
+      </w:r>
+    </w:p>
+    <w:p>
+      <w:pPr>
+        <w:pStyle w:val="Heading4"/>
+      </w:pPr>
+      <w:r>
+        <w:t>Gemeinsame Logik statt Duplikation (`agent/krypto/gegenpruefung.py`)</w:t>
+      </w:r>
+    </w:p>
+    <w:p>
+      <w:r>
+        <w:rPr>
+          <w:rFonts w:ascii="Consolas" w:hAnsi="Consolas"/>
+          <w:b w:val="0"/>
+        </w:rPr>
+        <w:t>hebel_pipeline.py::_zai_gegenpruefung_im_hintergrund()</w:t>
+      </w:r>
+      <w:r>
+        <w:rPr>
+          <w:b w:val="0"/>
+        </w:rPr>
+        <w:t xml:space="preserve"> (die Thread-Funktion, die beide Z.ai-Calls sequentiell ausführt und EIN kombiniertes DB-Update schreibt) wurde nach </w:t>
+      </w:r>
+      <w:r>
+        <w:rPr>
+          <w:rFonts w:ascii="Consolas" w:hAnsi="Consolas"/>
+          <w:b w:val="0"/>
+        </w:rPr>
+        <w:t>gegenpruefung.py</w:t>
+      </w:r>
+      <w:r>
+        <w:rPr>
+          <w:b w:val="0"/>
+        </w:rPr>
+        <w:t xml:space="preserve"> verschoben und in </w:t>
+      </w:r>
+      <w:r>
+        <w:rPr>
+          <w:rFonts w:ascii="Consolas" w:hAnsi="Consolas"/>
+          <w:b w:val="0"/>
+        </w:rPr>
+        <w:t>fuehre_beide_calls_im_hintergrund()</w:t>
+      </w:r>
+      <w:r>
+        <w:rPr>
+          <w:b w:val="0"/>
+        </w:rPr>
+        <w:t xml:space="preserve"> umbenannt - parametrisiert über </w:t>
+      </w:r>
+      <w:r>
+        <w:rPr>
+          <w:rFonts w:ascii="Consolas" w:hAnsi="Consolas"/>
+          <w:b w:val="0"/>
+        </w:rPr>
+        <w:t>update_fn</w:t>
+      </w:r>
+      <w:r>
+        <w:rPr>
+          <w:b w:val="0"/>
+        </w:rPr>
+        <w:t xml:space="preserve"> (entweder </w:t>
+      </w:r>
+      <w:r>
+        <w:rPr>
+          <w:rFonts w:ascii="Consolas" w:hAnsi="Consolas"/>
+          <w:b w:val="0"/>
+        </w:rPr>
+        <w:t>db.update_hebel_signal_zai_gegenpruefung</w:t>
+      </w:r>
+      <w:r>
+        <w:rPr>
+          <w:b w:val="0"/>
+        </w:rPr>
+        <w:t xml:space="preserve"> oder das neu erweiterte </w:t>
+      </w:r>
+      <w:r>
+        <w:rPr>
+          <w:rFonts w:ascii="Consolas" w:hAnsi="Consolas"/>
+          <w:b w:val="0"/>
+        </w:rPr>
+        <w:t>db.update_signal_zai_gegenpruefung</w:t>
+      </w:r>
+      <w:r>
+        <w:rPr>
+          <w:b w:val="0"/>
+        </w:rPr>
+        <w:t>, seit deren Angleichung identische Signatur). Von allen 6 Pipelines wiederverwendet statt sechsmal dupliziert.</w:t>
+      </w:r>
+    </w:p>
+    <w:p>
+      <w:r>
+        <w:rPr>
+          <w:b w:val="0"/>
+        </w:rPr>
+        <w:t xml:space="preserve">Neue Funktion </w:t>
+      </w:r>
+      <w:r>
+        <w:rPr>
+          <w:rFonts w:ascii="Consolas" w:hAnsi="Consolas"/>
+          <w:b w:val="0"/>
+        </w:rPr>
+        <w:t>richtung_aus_action(action, ist_hedge_invertiert=False)</w:t>
+      </w:r>
+      <w:r>
+        <w:rPr>
+          <w:b w:val="0"/>
+        </w:rPr>
+        <w:t xml:space="preserve">: die Spot-family (alle außer Hebel) hat kein echtes </w:t>
+      </w:r>
+      <w:r>
+        <w:rPr>
+          <w:rFonts w:ascii="Consolas" w:hAnsi="Consolas"/>
+          <w:b w:val="0"/>
+        </w:rPr>
+        <w:t>richtung</w:t>
+      </w:r>
+      <w:r>
+        <w:rPr>
+          <w:b w:val="0"/>
+        </w:rPr>
+        <w:t xml:space="preserve">-Feld (LONG/SHORT), nur Action-Verben. Deterministisches Mapping: </w:t>
+      </w:r>
+      <w:r>
+        <w:rPr>
+          <w:rFonts w:ascii="Consolas" w:hAnsi="Consolas"/>
+          <w:b w:val="0"/>
+        </w:rPr>
+        <w:t>KAUFEN</w:t>
+      </w:r>
+      <w:r>
+        <w:rPr>
+          <w:b w:val="0"/>
+        </w:rPr>
+        <w:t>/</w:t>
+      </w:r>
+      <w:r>
+        <w:rPr>
+          <w:rFonts w:ascii="Consolas" w:hAnsi="Consolas"/>
+          <w:b w:val="0"/>
+        </w:rPr>
+        <w:t>NACHKAUFEN</w:t>
+      </w:r>
+      <w:r>
+        <w:rPr>
+          <w:b w:val="0"/>
+        </w:rPr>
+        <w:t xml:space="preserve"> → </w:t>
+      </w:r>
+      <w:r>
+        <w:rPr>
+          <w:rFonts w:ascii="Consolas" w:hAnsi="Consolas"/>
+          <w:b w:val="0"/>
+        </w:rPr>
+        <w:t>LONG</w:t>
+      </w:r>
+      <w:r>
+        <w:rPr>
+          <w:b w:val="0"/>
+        </w:rPr>
+        <w:t xml:space="preserve">, </w:t>
+      </w:r>
+      <w:r>
+        <w:rPr>
+          <w:rFonts w:ascii="Consolas" w:hAnsi="Consolas"/>
+          <w:b w:val="0"/>
+        </w:rPr>
+        <w:t>VERKAUFEN</w:t>
+      </w:r>
+      <w:r>
+        <w:rPr>
+          <w:b w:val="0"/>
+        </w:rPr>
+        <w:t>/</w:t>
+      </w:r>
+      <w:r>
+        <w:rPr>
+          <w:rFonts w:ascii="Consolas" w:hAnsi="Consolas"/>
+          <w:b w:val="0"/>
+        </w:rPr>
+        <w:t>TAUSCHEN</w:t>
+      </w:r>
+      <w:r>
+        <w:rPr>
+          <w:b w:val="0"/>
+        </w:rPr>
+        <w:t xml:space="preserve"> → </w:t>
+      </w:r>
+      <w:r>
+        <w:rPr>
+          <w:rFonts w:ascii="Consolas" w:hAnsi="Consolas"/>
+          <w:b w:val="0"/>
+        </w:rPr>
+        <w:t>SHORT</w:t>
+      </w:r>
+      <w:r>
+        <w:rPr>
+          <w:b w:val="0"/>
+        </w:rPr>
+        <w:t xml:space="preserve">, </w:t>
+      </w:r>
+      <w:r>
+        <w:rPr>
+          <w:rFonts w:ascii="Consolas" w:hAnsi="Consolas"/>
+          <w:b w:val="0"/>
+        </w:rPr>
+        <w:t>HALTEN</w:t>
+      </w:r>
+      <w:r>
+        <w:rPr>
+          <w:b w:val="0"/>
+        </w:rPr>
+        <w:t xml:space="preserve"> → </w:t>
+      </w:r>
+      <w:r>
+        <w:rPr>
+          <w:rFonts w:ascii="Consolas" w:hAnsi="Consolas"/>
+          <w:b w:val="0"/>
+        </w:rPr>
+        <w:t>None</w:t>
+      </w:r>
+      <w:r>
+        <w:rPr>
+          <w:b w:val="0"/>
+        </w:rPr>
+        <w:t xml:space="preserve"> (kein Vergleich, analog zu Hebel-Sonderfällen).</w:t>
+      </w:r>
+    </w:p>
+    <w:p>
+      <w:pPr>
+        <w:pStyle w:val="Heading4"/>
+      </w:pPr>
+      <w:r>
+        <w:t>Design-Entscheidung: Hedge-Invertierung (mit Nutzer abgestimmt)</w:t>
+      </w:r>
+    </w:p>
+    <w:p>
+      <w:r>
+        <w:rPr>
+          <w:b w:val="0"/>
+        </w:rPr>
+        <w:t xml:space="preserve">Hedge-Instrumente sind inverse Absicherungen - </w:t>
+      </w:r>
+      <w:r>
+        <w:rPr>
+          <w:rFonts w:ascii="Consolas" w:hAnsi="Consolas"/>
+          <w:b w:val="0"/>
+        </w:rPr>
+        <w:t>KAUFEN</w:t>
+      </w:r>
+      <w:r>
+        <w:rPr>
+          <w:b w:val="0"/>
+        </w:rPr>
+        <w:t xml:space="preserve"> (Hedge aufbauen) korreliert mit einer </w:t>
+      </w:r>
+      <w:r>
+        <w:rPr>
+          <w:b/>
+        </w:rPr>
+        <w:t>bärischen</w:t>
+      </w:r>
+      <w:r>
+        <w:rPr>
+          <w:b w:val="0"/>
+        </w:rPr>
+        <w:t xml:space="preserve"> Gesamtmarkterwartung, nicht mit einer bullischen Erwartung an das Hedge-Instrument selbst. Die an Call 2 übergebenen Fakten sind bei Hedge ohnehin nur Makro-/Regime-Fakten (keine Einzeltitel-Technikanalyse, siehe </w:t>
+      </w:r>
+      <w:r>
+        <w:rPr>
+          <w:rFonts w:ascii="Consolas" w:hAnsi="Consolas"/>
+          <w:b w:val="0"/>
+        </w:rPr>
+        <w:t>agent/hedge/pipeline.py</w:t>
+      </w:r>
+      <w:r>
+        <w:rPr>
+          <w:b w:val="0"/>
+        </w:rPr>
+        <w:t xml:space="preserve"> Modul-Docstring), Z.ais </w:t>
+      </w:r>
+      <w:r>
+        <w:rPr>
+          <w:rFonts w:ascii="Consolas" w:hAnsi="Consolas"/>
+          <w:b w:val="0"/>
+        </w:rPr>
+        <w:t>eigene_richtung</w:t>
+      </w:r>
+      <w:r>
+        <w:rPr>
+          <w:b w:val="0"/>
+        </w:rPr>
+        <w:t xml:space="preserve"> bedeutet dort faktisch "Einschätzung zum Gesamtmarkt". Entschieden: </w:t>
+      </w:r>
+      <w:r>
+        <w:rPr>
+          <w:b/>
+        </w:rPr>
+        <w:t>deterministische Invertierung in Python</w:t>
+      </w:r>
+      <w:r>
+        <w:rPr>
+          <w:b w:val="0"/>
+        </w:rPr>
+        <w:t xml:space="preserve"> (</w:t>
+      </w:r>
+      <w:r>
+        <w:rPr>
+          <w:rFonts w:ascii="Consolas" w:hAnsi="Consolas"/>
+          <w:b w:val="0"/>
+        </w:rPr>
+        <w:t>ist_hedge_invertiert=True</w:t>
+      </w:r>
+      <w:r>
+        <w:rPr>
+          <w:b w:val="0"/>
+        </w:rPr>
+        <w:t xml:space="preserve">, nur in </w:t>
+      </w:r>
+      <w:r>
+        <w:rPr>
+          <w:rFonts w:ascii="Consolas" w:hAnsi="Consolas"/>
+          <w:b w:val="0"/>
+        </w:rPr>
+        <w:t>agent/hedge/pipeline.py</w:t>
+      </w:r>
+      <w:r>
+        <w:rPr>
+          <w:b w:val="0"/>
+        </w:rPr>
+        <w:t xml:space="preserve"> gesetzt, dort IMMER </w:t>
+      </w:r>
+      <w:r>
+        <w:rPr>
+          <w:rFonts w:ascii="Consolas" w:hAnsi="Consolas"/>
+          <w:b w:val="0"/>
+        </w:rPr>
+        <w:t>True</w:t>
+      </w:r>
+      <w:r>
+        <w:rPr>
+          <w:b w:val="0"/>
+        </w:rPr>
+        <w:t xml:space="preserve"> - diese Pipeline verarbeitet ausschließlich Hedge-Instrumente, kein Symbol-Lookup nötig), KEIN neuer Fakt/Prompt-Zweig für Z.ai (Nutzer erwog auch "Z.ai die Funktion des Assets erklären" als Alternative - verworfen: die Invertierung ist hier ein einzelnes, fest verdrahtetes Boolean, keine wartungsbedürftige neue Regel; ein Prompt-Zweig hätte zusätzliches Fehlinterpretations-Risiko ins LLM-Urteil getragen, entgegen dem bestehenden Architekturprinzip, den eigentlichen Abgleich deterministisch in Python zu halten).</w:t>
+      </w:r>
+    </w:p>
+    <w:p>
+      <w:pPr>
+        <w:pStyle w:val="Heading4"/>
+      </w:pPr>
+      <w:r>
+        <w:t>Bestätigt (keine Änderung nötig): JA/NEIN ist bereits erzwungen</w:t>
+      </w:r>
+    </w:p>
+    <w:p>
+      <w:r>
+        <w:rPr>
+          <w:b w:val="0"/>
+        </w:rPr>
+        <w:t>Nutzer-Nachfrage, ob beim Richtungs-Abgleich "JA/NEIN-Entscheidungen erzwungen" werden sollen - Abgleich mit der ursprünglichen Absprache vom 2026-07-26 (Z.ai darf selbst LONG/SHORT/NEUTRAL antworten, Live-Test zeigte echte Modell-Unsicherheit bei Grenzfällen, Nutzer entschied damals explizit "Rauschen akzeptieren, keine Prompt-Nachschärfung"): das JA/NEIN ist bereits auf der Ebene des Vergleichsergebnisses (</w:t>
+      </w:r>
+      <w:r>
+        <w:rPr>
+          <w:rFonts w:ascii="Consolas" w:hAnsi="Consolas"/>
+          <w:b w:val="0"/>
+        </w:rPr>
+        <w:t>uebereinstimmung</w:t>
+      </w:r>
+      <w:r>
+        <w:rPr>
+          <w:b w:val="0"/>
+        </w:rPr>
+        <w:t>) erzwungen - NEUTRAL zählt deterministisch als "nein", nie als "unklar". Keine Prompt-Änderung nötig, weder bei Hebel noch bei der Erweiterung.</w:t>
+      </w:r>
+    </w:p>
+    <w:p>
+      <w:pPr>
+        <w:pStyle w:val="Heading4"/>
+      </w:pPr>
+      <w:r>
+        <w:t>E-Mail: Re-Fetch statt Hebel-artigem Wartemechanismus</w:t>
+      </w:r>
+    </w:p>
+    <w:p>
+      <w:r>
+        <w:rPr>
+          <w:b w:val="0"/>
+        </w:rPr>
+        <w:t>Für Multi-Asset-Batch bewusst KEIN Poll-Wait-Mechanismus wie bei Hebel (</w:t>
+      </w:r>
+      <w:r>
+        <w:rPr>
+          <w:rFonts w:ascii="Consolas" w:hAnsi="Consolas"/>
+          <w:b w:val="0"/>
+        </w:rPr>
+        <w:t>_sende_hebel_email_mit_zai_wartezeit()</w:t>
+      </w:r>
+      <w:r>
+        <w:rPr>
+          <w:b w:val="0"/>
+        </w:rPr>
+        <w:t xml:space="preserve">): die Batch-Schleife verarbeitet bis zu 13 Assets sequentiell, bevor die E-Mail-Benachrichtigung überhaupt beginnt - für die meisten Signale ist die Z.ai-Hintergrundprüfung durch diese Restlaufzeit bereits fertig. Stattdessen in </w:t>
+      </w:r>
+      <w:r>
+        <w:rPr>
+          <w:rFonts w:ascii="Consolas" w:hAnsi="Consolas"/>
+          <w:b w:val="0"/>
+        </w:rPr>
+        <w:t>scheduler/background.py::multi_asset_batch_job()</w:t>
+      </w:r>
+      <w:r>
+        <w:rPr>
+          <w:b w:val="0"/>
+        </w:rPr>
+        <w:t xml:space="preserve"> ein günstiger Re-Fetch per </w:t>
+      </w:r>
+      <w:r>
+        <w:rPr>
+          <w:rFonts w:ascii="Consolas" w:hAnsi="Consolas"/>
+          <w:b w:val="0"/>
+        </w:rPr>
+        <w:t>db.get_signal_by_id()</w:t>
+      </w:r>
+      <w:r>
+        <w:rPr>
+          <w:b w:val="0"/>
+        </w:rPr>
+        <w:t xml:space="preserve"> direkt vor </w:t>
+      </w:r>
+      <w:r>
+        <w:rPr>
+          <w:rFonts w:ascii="Consolas" w:hAnsi="Consolas"/>
+          <w:b w:val="0"/>
+        </w:rPr>
+        <w:t>_notify_multi_asset_signal()</w:t>
+      </w:r>
+      <w:r>
+        <w:rPr>
+          <w:b w:val="0"/>
+        </w:rPr>
+        <w:t xml:space="preserve"> - fehlschlagender Re-Fetch verhindert die E-Mail nicht (Fallback aufs ursprüngliche Objekt).</w:t>
+      </w:r>
+    </w:p>
+    <w:p>
+      <w:pPr>
+        <w:pStyle w:val="Heading4"/>
+      </w:pPr>
+      <w:r>
+        <w:t>Bewusst unverändert: manueller "Signal berechnen"-Button</w:t>
+      </w:r>
+    </w:p>
+    <w:p>
+      <w:r>
+        <w:rPr>
+          <w:rFonts w:ascii="Consolas" w:hAnsi="Consolas"/>
+          <w:b w:val="0"/>
+        </w:rPr>
+        <w:t>ui/signals_view.py::_run_pipeline()</w:t>
+      </w:r>
+      <w:r>
+        <w:rPr>
+          <w:b w:val="0"/>
+        </w:rPr>
+        <w:t xml:space="preserve"> reicht </w:t>
+      </w:r>
+      <w:r>
+        <w:rPr>
+          <w:rFonts w:ascii="Consolas" w:hAnsi="Consolas"/>
+          <w:b w:val="0"/>
+        </w:rPr>
+        <w:t>zai_client</w:t>
+      </w:r>
+      <w:r>
+        <w:rPr>
+          <w:b w:val="0"/>
+        </w:rPr>
+        <w:t xml:space="preserve"> an KEINE der 6 Pipelines durch - das war bereits vor dieser Runde so (auch für Krypto-Hebel/ Spot), eine bestehende, bewusste Scope-Grenze. Sie jetzt nur für die 4 neuen Pipelines aufzubrechen hätte eine neue Asymmetrie geschaffen statt eine zu schließen - unverändert gelassen.</w:t>
+      </w:r>
+    </w:p>
+    <w:p>
+      <w:pPr>
+        <w:pStyle w:val="Heading4"/>
+      </w:pPr>
+      <w:r>
+        <w:t>Verifiziert</w:t>
+      </w:r>
+    </w:p>
+    <w:p>
+      <w:r>
+        <w:rPr>
+          <w:b w:val="0"/>
+        </w:rPr>
+        <w:t xml:space="preserve">Compile-/Import-Regressionscheck über alle 11 geänderten Module; additive Migration (frische + simulierte Alt-DB, erneuter Migrationslauf ohne Exception); </w:t>
+      </w:r>
+      <w:r>
+        <w:rPr>
+          <w:rFonts w:ascii="Consolas" w:hAnsi="Consolas"/>
+          <w:b w:val="0"/>
+        </w:rPr>
+        <w:t>update_signal_zai_gegenpruefung()</w:t>
+      </w:r>
+      <w:r>
+        <w:rPr>
+          <w:b w:val="0"/>
+        </w:rPr>
+        <w:t xml:space="preserve"> mit 4 UND 5 Positions- argumenten; </w:t>
+      </w:r>
+      <w:r>
+        <w:rPr>
+          <w:rFonts w:ascii="Consolas" w:hAnsi="Consolas"/>
+          <w:b w:val="0"/>
+        </w:rPr>
+        <w:t>Signal</w:t>
+      </w:r>
+      <w:r>
+        <w:rPr>
+          <w:b w:val="0"/>
+        </w:rPr>
+        <w:t xml:space="preserve">-Dataclass-Rundtrip für alle 3 neuen Felder; </w:t>
+      </w:r>
+      <w:r>
+        <w:rPr>
+          <w:rFonts w:ascii="Consolas" w:hAnsi="Consolas"/>
+          <w:b w:val="0"/>
+        </w:rPr>
+        <w:t>richtung_aus_action()</w:t>
+      </w:r>
+      <w:r>
+        <w:rPr>
+          <w:b w:val="0"/>
+        </w:rPr>
+        <w:t xml:space="preserve"> alle Kombinationen inkl. Hedge-Inversion (Regressions- schutz: </w:t>
+      </w:r>
+      <w:r>
+        <w:rPr>
+          <w:rFonts w:ascii="Consolas" w:hAnsi="Consolas"/>
+          <w:b w:val="0"/>
+        </w:rPr>
+        <w:t>KAUFEN</w:t>
+      </w:r>
+      <w:r>
+        <w:rPr>
+          <w:b w:val="0"/>
+        </w:rPr>
+        <w:t xml:space="preserve"> → </w:t>
+      </w:r>
+      <w:r>
+        <w:rPr>
+          <w:rFonts w:ascii="Consolas" w:hAnsi="Consolas"/>
+          <w:b w:val="0"/>
+        </w:rPr>
+        <w:t>SHORT</w:t>
+      </w:r>
+      <w:r>
+        <w:rPr>
+          <w:b w:val="0"/>
+        </w:rPr>
+        <w:t xml:space="preserve"> bei </w:t>
+      </w:r>
+      <w:r>
+        <w:rPr>
+          <w:rFonts w:ascii="Consolas" w:hAnsi="Consolas"/>
+          <w:b w:val="0"/>
+        </w:rPr>
+        <w:t>ist_hedge_invertiert=True</w:t>
+      </w:r>
+      <w:r>
+        <w:rPr>
+          <w:b w:val="0"/>
+        </w:rPr>
+        <w:t xml:space="preserve">); </w:t>
+      </w:r>
+      <w:r>
+        <w:rPr>
+          <w:rFonts w:ascii="Consolas" w:hAnsi="Consolas"/>
+          <w:b w:val="0"/>
+        </w:rPr>
+        <w:t>fuehre_beide_calls_im_hintergrund()</w:t>
+      </w:r>
+      <w:r>
+        <w:rPr>
+          <w:b w:val="0"/>
+        </w:rPr>
+        <w:t xml:space="preserve"> mit Mock-Client (genau EIN kombinierter Update-Aufruf, korrekte </w:t>
+      </w:r>
+      <w:r>
+        <w:rPr>
+          <w:rFonts w:ascii="Consolas" w:hAnsi="Consolas"/>
+          <w:b w:val="0"/>
+        </w:rPr>
+        <w:t>ja</w:t>
+      </w:r>
+      <w:r>
+        <w:rPr>
+          <w:b w:val="0"/>
+        </w:rPr>
+        <w:t>/</w:t>
+      </w:r>
+      <w:r>
+        <w:rPr>
+          <w:rFonts w:ascii="Consolas" w:hAnsi="Consolas"/>
+          <w:b w:val="0"/>
+        </w:rPr>
+        <w:t>nein</w:t>
+      </w:r>
+      <w:r>
+        <w:rPr>
+          <w:b w:val="0"/>
+        </w:rPr>
+        <w:t>-Berechnung, Call-1-Fehlschlag verhindert Call-2-Update nicht); Signatur-Regressionscheck aller 4 neuen Pipelines + der Plumbing-Kette (</w:t>
+      </w:r>
+      <w:r>
+        <w:rPr>
+          <w:rFonts w:ascii="Consolas" w:hAnsi="Consolas"/>
+          <w:b w:val="0"/>
+        </w:rPr>
+        <w:t>run_multi_asset_batch()</w:t>
+      </w:r>
+      <w:r>
+        <w:rPr>
+          <w:b w:val="0"/>
+        </w:rPr>
+        <w:t xml:space="preserve">, </w:t>
+      </w:r>
+      <w:r>
+        <w:rPr>
+          <w:rFonts w:ascii="Consolas" w:hAnsi="Consolas"/>
+          <w:b w:val="0"/>
+        </w:rPr>
+        <w:t>multi_asset_batch_job()</w:t>
+      </w:r>
+      <w:r>
+        <w:rPr>
+          <w:b w:val="0"/>
+        </w:rPr>
+        <w:t>). Echter Notebook-Lauf (nach Deploy) noch ausstehend, insbesondere für Hedge (dünnste Faktenbasis, höchstes Risiko für instabile Z.ai-Antworten).</w:t>
       </w:r>
     </w:p>
     <w:sectPr>

</xml_diff>

<commit_message>
Hebel-Tab: deaktivierte Symbole ohne offene Position ausblenden + Zeit-Switch
Die Haupt-Tabelle zeigte bisher weiterhin das letzte generierte Signal fuer
Symbole, deren Hebel-Pruefung-Toggle laengst deaktiviert wurde (der KAITO-Fix
vom selben Tag deckte nur die Warteliste ab). Fix ausschliesslich in
ui/hebel_view.py::refresh() - die geteilte DB-Funktion bleibt unveraendert,
da budget_allocator.py/hebel_backward_tracking.py/regime.py/hebel_analyst.py
das vollstaendige, toggle-unabhaengige Ergebnis brauchen. Offene Positionen
bleiben von beiden neuen Filtern (Toggle + Zeit-Switch) ausgenommen.

Zusaetzlich ein "2 Tage"/"Alle"-Anzeige-Switch (Default 2 Tage, session-only)
gegen allgemeine Alters-Unordnung in der Liste.

Co-Authored-By: Claude Sonnet 5 <noreply@anthropic.com>
</commit_message>
<xml_diff>
--- a/Basisinfos/Regelwerksmanual.docx
+++ b/Basisinfos/Regelwerksmanual.docx
@@ -17552,6 +17552,298 @@
           <w:b w:val="0"/>
         </w:rPr>
         <w:t>). Echter Notebook-Lauf (nach Deploy) noch ausstehend, insbesondere für Hedge (dünnste Faktenbasis, höchstes Risiko für instabile Z.ai-Antworten).</w:t>
+      </w:r>
+    </w:p>
+    <w:p>
+      <w:pPr>
+        <w:pStyle w:val="Heading3"/>
+      </w:pPr>
+      <w:r>
+        <w:t>Nachtrag (2026-07-27): Hebel-Tab-Anzeigefilter - deaktivierte Symbole ohne offene Position + Zeit-Switch</w:t>
+      </w:r>
+    </w:p>
+    <w:p>
+      <w:r>
+        <w:rPr>
+          <w:b w:val="0"/>
+        </w:rPr>
+        <w:t>Auslöser: Nutzer-Wunsch, deaktivierte Symbole (Hebel-Prüfung-Toggle aus) automatisch aus der Hebel-Tab-Liste zu entfernen. Der bereits am selben Tag gefixte KAITO-Fund (</w:t>
+      </w:r>
+      <w:r>
+        <w:rPr>
+          <w:rFonts w:ascii="Consolas" w:hAnsi="Consolas"/>
+          <w:b w:val="0"/>
+        </w:rPr>
+        <w:t>87f325b</w:t>
+      </w:r>
+      <w:r>
+        <w:rPr>
+          <w:b w:val="0"/>
+        </w:rPr>
+        <w:t>) deckte nur die Warteliste (</w:t>
+      </w:r>
+      <w:r>
+        <w:rPr>
+          <w:rFonts w:ascii="Consolas" w:hAnsi="Consolas"/>
+          <w:b w:val="0"/>
+        </w:rPr>
+        <w:t>get_pending_hebel_candidates()</w:t>
+      </w:r>
+      <w:r>
+        <w:rPr>
+          <w:b w:val="0"/>
+        </w:rPr>
+        <w:t>) ab - die Haupt-Tabelle zeigt zusätzlich das jeweils letzte generierte Signal je Symbol+Richtung (</w:t>
+      </w:r>
+      <w:r>
+        <w:rPr>
+          <w:rFonts w:ascii="Consolas" w:hAnsi="Consolas"/>
+          <w:b w:val="0"/>
+        </w:rPr>
+        <w:t>get_latest_hebel_signal_per_symbol_and_richtung()</w:t>
+      </w:r>
+      <w:r>
+        <w:rPr>
+          <w:b w:val="0"/>
+        </w:rPr>
+        <w:t>), das den Toggle gar nicht kennt. Ohne offene Position bleibt die letzte Zeile eines deaktivierten Symbols dadurch für immer stehen.</w:t>
+      </w:r>
+    </w:p>
+    <w:p>
+      <w:r>
+        <w:rPr>
+          <w:b/>
+        </w:rPr>
+        <w:t>Bewusst NICHT an der geteilten Funktion selbst gefixt:</w:t>
+      </w:r>
+      <w:r>
+        <w:rPr>
+          <w:b w:val="0"/>
+        </w:rPr>
+        <w:t xml:space="preserve"> </w:t>
+      </w:r>
+      <w:r>
+        <w:rPr>
+          <w:rFonts w:ascii="Consolas" w:hAnsi="Consolas"/>
+          <w:b w:val="0"/>
+        </w:rPr>
+        <w:t>get_latest_hebel_signal_per_symbol_and_richtung()</w:t>
+      </w:r>
+      <w:r>
+        <w:rPr>
+          <w:b w:val="0"/>
+        </w:rPr>
+        <w:t xml:space="preserve"> wird an 4 weiteren, echten Business-Logik-Stellen verwendet (</w:t>
+      </w:r>
+      <w:r>
+        <w:rPr>
+          <w:rFonts w:ascii="Consolas" w:hAnsi="Consolas"/>
+          <w:b w:val="0"/>
+        </w:rPr>
+        <w:t>budget_allocator.py</w:t>
+      </w:r>
+      <w:r>
+        <w:rPr>
+          <w:b w:val="0"/>
+        </w:rPr>
+        <w:t xml:space="preserve">-Cooldown- Prüfung, </w:t>
+      </w:r>
+      <w:r>
+        <w:rPr>
+          <w:rFonts w:ascii="Consolas" w:hAnsi="Consolas"/>
+          <w:b w:val="0"/>
+        </w:rPr>
+        <w:t>hebel_backward_tracking.py</w:t>
+      </w:r>
+      <w:r>
+        <w:rPr>
+          <w:b w:val="0"/>
+        </w:rPr>
+        <w:t xml:space="preserve">-Überholt-Erkennung, </w:t>
+      </w:r>
+      <w:r>
+        <w:rPr>
+          <w:rFonts w:ascii="Consolas" w:hAnsi="Consolas"/>
+          <w:b w:val="0"/>
+        </w:rPr>
+        <w:t>regime.py</w:t>
+      </w:r>
+      <w:r>
+        <w:rPr>
+          <w:b w:val="0"/>
+        </w:rPr>
+        <w:t xml:space="preserve">- Regime-Konflikt-Kennzahl, </w:t>
+      </w:r>
+      <w:r>
+        <w:rPr>
+          <w:rFonts w:ascii="Consolas" w:hAnsi="Consolas"/>
+          <w:b w:val="0"/>
+        </w:rPr>
+        <w:t>hebel_analyst.py</w:t>
+      </w:r>
+      <w:r>
+        <w:rPr>
+          <w:b w:val="0"/>
+        </w:rPr>
+        <w:t>-Wiederholungs-Erkennung) - alle vier brauchen das VOLLSTÄNDIGE, toggle-unabhängige Ergebnis. Eine Filterung an der geteilten Funktion hätte dort stillschweigend falsche Ergebnisse erzeugt (z.B. Überholt-Erkennung für ein deaktiviertes Symbol funktionslos).</w:t>
+      </w:r>
+    </w:p>
+    <w:p>
+      <w:r>
+        <w:rPr>
+          <w:b/>
+        </w:rPr>
+        <w:t xml:space="preserve">Fix, ausschließlich in </w:t>
+      </w:r>
+      <w:r>
+        <w:rPr>
+          <w:rFonts w:ascii="Consolas" w:hAnsi="Consolas"/>
+          <w:b/>
+        </w:rPr>
+        <w:t>ui/hebel_view.py::refresh()</w:t>
+      </w:r>
+      <w:r>
+        <w:rPr>
+          <w:b/>
+        </w:rPr>
+        <w:t>:</w:t>
+      </w:r>
+      <w:r>
+        <w:rPr>
+          <w:b w:val="0"/>
+        </w:rPr>
+        <w:t xml:space="preserve"> 1. Neue Bulk-Funktion </w:t>
+      </w:r>
+      <w:r>
+        <w:rPr>
+          <w:rFonts w:ascii="Consolas" w:hAnsi="Consolas"/>
+          <w:b w:val="0"/>
+        </w:rPr>
+        <w:t>database/db.py::get_hebel_pruefung_toggle_map()</w:t>
+      </w:r>
+      <w:r>
+        <w:rPr>
+          <w:b w:val="0"/>
+        </w:rPr>
+        <w:t xml:space="preserve"> - liest </w:t>
+      </w:r>
+      <w:r>
+        <w:rPr>
+          <w:rFonts w:ascii="Consolas" w:hAnsi="Consolas"/>
+          <w:b w:val="0"/>
+        </w:rPr>
+        <w:t>asset_hebel_settings</w:t>
+      </w:r>
+      <w:r>
+        <w:rPr>
+          <w:b w:val="0"/>
+        </w:rPr>
+        <w:t xml:space="preserve"> einmalig komplett statt N Einzelabfragen. 2. Zeilen-Filter beim Aufbau der Haupt-Tabelle: ein Signal wird ausgeblendet, wenn (a) der Toggle für dieses Symbol aus ist UND (b) keine offene Position für genau dieses Symbol+Richtung existiert (offene Positionen bleiben aus demselben Grund wie beim </w:t>
+      </w:r>
+      <w:r>
+        <w:rPr>
+          <w:rFonts w:ascii="Consolas" w:hAnsi="Consolas"/>
+          <w:b w:val="0"/>
+        </w:rPr>
+        <w:t>87f325b</w:t>
+      </w:r>
+      <w:r>
+        <w:rPr>
+          <w:b w:val="0"/>
+        </w:rPr>
+        <w:t xml:space="preserve">-Fix immer verwaltbar). 3. Zusätzlich ein Anzeige-Switch ("2 Tage"/"Alle", </w:t>
+      </w:r>
+      <w:r>
+        <w:rPr>
+          <w:rFonts w:ascii="Consolas" w:hAnsi="Consolas"/>
+          <w:b w:val="0"/>
+        </w:rPr>
+        <w:t>ttk.Radiobutton</w:t>
+      </w:r>
+      <w:r>
+        <w:rPr>
+          <w:b w:val="0"/>
+        </w:rPr>
+        <w:t xml:space="preserve">-Paar im Toolbar) - blendet Signale älter als 2 Tage aus, ebenfalls mit Ausnahme offener Positionen (deren aktueller Stand soll unabhängig vom Signal-Alter sichtbar bleiben). Session-only, keine Persistenz (Nutzer-Vorgabe: "keine Speicherung notwendig"), Standardwert bei jedem App-Start "2 Tage". 4. Kritische Reihenfolge-Feinheit: die </w:t>
+      </w:r>
+      <w:r>
+        <w:rPr>
+          <w:rFonts w:ascii="Consolas" w:hAnsi="Consolas"/>
+          <w:b w:val="0"/>
+        </w:rPr>
+        <w:t>covered</w:t>
+      </w:r>
+      <w:r>
+        <w:rPr>
+          <w:b w:val="0"/>
+        </w:rPr>
+        <w:t xml:space="preserve">-Menge (verhindert doppelte "Kandidat wartet auf Analyse"-Platzhalter für bereits echte Signale) wird weiterhin aus der VOLLSTÄNDIGEN, ungefilterten </w:t>
+      </w:r>
+      <w:r>
+        <w:rPr>
+          <w:rFonts w:ascii="Consolas" w:hAnsi="Consolas"/>
+          <w:b w:val="0"/>
+        </w:rPr>
+        <w:t>signals</w:t>
+      </w:r>
+      <w:r>
+        <w:rPr>
+          <w:b w:val="0"/>
+        </w:rPr>
+        <w:t>-Menge gebaut, VOR dem Anzeigefilter - sonst hätte ein ausgeblendetes Signal seinen Platz fälschlich wieder für einen Kandidaten-Platzhalter freigegeben.</w:t>
+      </w:r>
+    </w:p>
+    <w:p>
+      <w:r>
+        <w:rPr>
+          <w:b/>
+        </w:rPr>
+        <w:t>Verifiziert:</w:t>
+      </w:r>
+      <w:r>
+        <w:rPr>
+          <w:b w:val="0"/>
+        </w:rPr>
+        <w:t xml:space="preserve"> synthetischer Test mit 5 Szenarien (aktiv+frisch, deaktiviert ohne Position, deaktiviert MIT offener Position, aktiv aber 5 Tage alt ohne Position, aktiv 5 Tage altes Signal MIT offener Position) gegen beide Zeitfenster-Einstellungen - alle Kombinationen wie erwartet; echter Tk-Smoke-Test (</w:t>
+      </w:r>
+      <w:r>
+        <w:rPr>
+          <w:rFonts w:ascii="Consolas" w:hAnsi="Consolas"/>
+          <w:b w:val="0"/>
+        </w:rPr>
+        <w:t>HebelView()</w:t>
+      </w:r>
+      <w:r>
+        <w:rPr>
+          <w:b w:val="0"/>
+        </w:rPr>
+        <w:t xml:space="preserve">-Erstellung, Standardwert "2_tage" bestätigt, Umschalten auf "alle" + </w:t>
+      </w:r>
+      <w:r>
+        <w:rPr>
+          <w:rFonts w:ascii="Consolas" w:hAnsi="Consolas"/>
+          <w:b w:val="0"/>
+        </w:rPr>
+        <w:t>refresh()</w:t>
+      </w:r>
+      <w:r>
+        <w:rPr>
+          <w:b w:val="0"/>
+        </w:rPr>
+        <w:t xml:space="preserve"> ohne Absturz); Import-Regressionscheck für </w:t>
+      </w:r>
+      <w:r>
+        <w:rPr>
+          <w:rFonts w:ascii="Consolas" w:hAnsi="Consolas"/>
+          <w:b w:val="0"/>
+        </w:rPr>
+        <w:t>database/db.py</w:t>
+      </w:r>
+      <w:r>
+        <w:rPr>
+          <w:b w:val="0"/>
+        </w:rPr>
+        <w:t xml:space="preserve"> + alle 4 anderen Verbraucher der geteilten Funktion (unverändert, keine Regression).</w:t>
       </w:r>
     </w:p>
     <w:sectPr>

</xml_diff>

<commit_message>
Z.ai-Richtungs-Erfolgsquote: unabhaengig von Mistral gemessen
Neue compute_zai_richtung_performance() vergleicht Z.ais unabhaengige
Richtungs-Ableitung (Call 2) gegen die tatsaechliche Marktrichtung statt
gegen Mistrals Empfehlung - ausgeloest durch die Feststellung, dass
hebel_richtung_modus="nur_long" Mistrals LONG-Bias strukturell erklaert,
nicht als organische Strategie. Nutzt bereits aufgeloesten outcome_status,
kein neuer Kursabruf. Neue Remote-Karte + Notebook-Diagnose-Export.

Co-Authored-By: Claude Sonnet 5 <noreply@anthropic.com>
</commit_message>
<xml_diff>
--- a/Basisinfos/Regelwerksmanual.docx
+++ b/Basisinfos/Regelwerksmanual.docx
@@ -17844,6 +17844,1087 @@
           <w:b w:val="0"/>
         </w:rPr>
         <w:t xml:space="preserve"> + alle 4 anderen Verbraucher der geteilten Funktion (unverändert, keine Regression).</w:t>
+      </w:r>
+    </w:p>
+    <w:p>
+      <w:pPr>
+        <w:pStyle w:val="Heading3"/>
+      </w:pPr>
+      <w:r>
+        <w:t>Nachtrag (2026-07-27): Z.ai-Richtungs-Erfolgsquote - unabhängig von Mistrals Übereinstimmung gemessen</w:t>
+      </w:r>
+    </w:p>
+    <w:p>
+      <w:r>
+        <w:rPr>
+          <w:b/>
+        </w:rPr>
+        <w:t>Auslöser:</w:t>
+      </w:r>
+      <w:r>
+        <w:rPr>
+          <w:b w:val="0"/>
+        </w:rPr>
+        <w:t xml:space="preserve"> Analyse eines frischen Notebook-Exports zeigte, dass Z.ais unabhängige Richtungs-Ableitung (</w:t>
+      </w:r>
+      <w:r>
+        <w:rPr>
+          <w:rFonts w:ascii="Consolas" w:hAnsi="Consolas"/>
+          <w:b w:val="0"/>
+        </w:rPr>
+        <w:t>zai_eigene_richtung</w:t>
+      </w:r>
+      <w:r>
+        <w:rPr>
+          <w:b w:val="0"/>
+        </w:rPr>
+        <w:t xml:space="preserve">, Call 2) so gut wie nie mit Mistrals Hebel-Empfehlung übereinstimmte (57 LONG/2 SHORT bei Mistral vs. 0 LONG/29 SHORT/28 NEUTRAL bei Z.ai). Der Nutzer stellte dazu die entscheidende Rückfrage, ob Mistral wisse, "dass wir nur long können" - Prüfung von </w:t>
+      </w:r>
+      <w:r>
+        <w:rPr>
+          <w:rFonts w:ascii="Consolas" w:hAnsi="Consolas"/>
+          <w:b w:val="0"/>
+        </w:rPr>
+        <w:t>ui/settings.py</w:t>
+      </w:r>
+      <w:r>
+        <w:rPr>
+          <w:b w:val="0"/>
+        </w:rPr>
+        <w:t>/</w:t>
+      </w:r>
+      <w:r>
+        <w:rPr>
+          <w:rFonts w:ascii="Consolas" w:hAnsi="Consolas"/>
+          <w:b w:val="0"/>
+        </w:rPr>
+        <w:t>agent/krypto/budget_allocator.py</w:t>
+      </w:r>
+      <w:r>
+        <w:rPr>
+          <w:b w:val="0"/>
+        </w:rPr>
+        <w:t xml:space="preserve"> (Zeile ~383/388/435) bestätigte: die per-Gerät persistierte Einstellung </w:t>
+      </w:r>
+      <w:r>
+        <w:rPr>
+          <w:rFonts w:ascii="Consolas" w:hAnsi="Consolas"/>
+          <w:b w:val="0"/>
+        </w:rPr>
+        <w:t>hebel_richtung_modus</w:t>
+      </w:r>
+      <w:r>
+        <w:rPr>
+          <w:b w:val="0"/>
+        </w:rPr>
+        <w:t xml:space="preserve"> (</w:t>
+      </w:r>
+      <w:r>
+        <w:rPr>
+          <w:rFonts w:ascii="Consolas" w:hAnsi="Consolas"/>
+          <w:b w:val="0"/>
+        </w:rPr>
+        <w:t>data/settings.json</w:t>
+      </w:r>
+      <w:r>
+        <w:rPr>
+          <w:b w:val="0"/>
+        </w:rPr>
+        <w:t xml:space="preserve">, NICHT im Git, getrennt vom statischen </w:t>
+      </w:r>
+      <w:r>
+        <w:rPr>
+          <w:rFonts w:ascii="Consolas" w:hAnsi="Consolas"/>
+          <w:b w:val="0"/>
+        </w:rPr>
+        <w:t>Basisinfos/config.yaml</w:t>
+      </w:r>
+      <w:r>
+        <w:rPr>
+          <w:b w:val="0"/>
+        </w:rPr>
+        <w:t xml:space="preserve">-Wert </w:t>
+      </w:r>
+      <w:r>
+        <w:rPr>
+          <w:rFonts w:ascii="Consolas" w:hAnsi="Consolas"/>
+          <w:b w:val="0"/>
+        </w:rPr>
+        <w:t>hebel.nur_long</w:t>
+      </w:r>
+      <w:r>
+        <w:rPr>
+          <w:b w:val="0"/>
+        </w:rPr>
+        <w:t xml:space="preserve">) filtert SHORT-Kandidaten bereits VOR jedem LLM-Call heraus, wenn auf </w:t>
+      </w:r>
+      <w:r>
+        <w:rPr>
+          <w:rFonts w:ascii="Consolas" w:hAnsi="Consolas"/>
+          <w:b w:val="0"/>
+        </w:rPr>
+        <w:t>"nur_long"</w:t>
+      </w:r>
+      <w:r>
+        <w:rPr>
+          <w:b w:val="0"/>
+        </w:rPr>
+        <w:t xml:space="preserve"> gestellt - und der Nutzer bestätigte, dass genau das auf dem Notebook (der produktiven 24/7- Maschine) seit Einführung der Long/Short-Funktion (2026-07-15) der Fall ist, weil "1. bitpanda kann noch immer kein short" (weiterhin gültige Einschränkung, keine Änderung an </w:t>
+      </w:r>
+      <w:r>
+        <w:rPr>
+          <w:rFonts w:ascii="Consolas" w:hAnsi="Consolas"/>
+          <w:b w:val="0"/>
+        </w:rPr>
+        <w:t>hebel_richtung_modus</w:t>
+      </w:r>
+      <w:r>
+        <w:rPr>
+          <w:b w:val="0"/>
+        </w:rPr>
+        <w:t xml:space="preserve"> geplant). Die extreme LONG-Bias in den bisherigen Auswertungen ist also ein strukturelles Konfigurations- Artefakt, keine organische Strategie - der reine "Z.ai stimmt mit Mistral überein"-Vergleich (</w:t>
+      </w:r>
+      <w:r>
+        <w:rPr>
+          <w:rFonts w:ascii="Consolas" w:hAnsi="Consolas"/>
+          <w:b w:val="0"/>
+        </w:rPr>
+        <w:t>zai_uebereinstimmung</w:t>
+      </w:r>
+      <w:r>
+        <w:rPr>
+          <w:b w:val="0"/>
+        </w:rPr>
+        <w:t xml:space="preserve">, bestehend seit dem 2026-07-26er Nachtrag) sagt unter dieser Einschränkung wenig darüber aus, ob Z.ais eigene Richtungs-Einschätzung tatsächlich GUT ist. Nutzer-Auftrag: </w:t>
+      </w:r>
+      <w:r>
+        <w:rPr>
+          <w:b/>
+        </w:rPr>
+        <w:t>"2. ja ZAI unabhängig mit seinen unterschiedlichen Entscheidungen und deren Erfolgsquote messen"</w:t>
+      </w:r>
+      <w:r>
+        <w:rPr>
+          <w:b w:val="0"/>
+        </w:rPr>
+        <w:t xml:space="preserve"> - eine zu </w:t>
+      </w:r>
+      <w:r>
+        <w:rPr>
+          <w:rFonts w:ascii="Consolas" w:hAnsi="Consolas"/>
+          <w:b w:val="0"/>
+        </w:rPr>
+        <w:t>compute_provider_performance()</w:t>
+      </w:r>
+      <w:r>
+        <w:rPr>
+          <w:b w:val="0"/>
+        </w:rPr>
+        <w:t>/</w:t>
+      </w:r>
+      <w:r>
+        <w:rPr>
+          <w:rFonts w:ascii="Consolas" w:hAnsi="Consolas"/>
+          <w:b w:val="0"/>
+        </w:rPr>
+        <w:t>compute_win_rate_fact()</w:t>
+      </w:r>
+      <w:r>
+        <w:rPr>
+          <w:b w:val="0"/>
+        </w:rPr>
+        <w:t xml:space="preserve"> analoge, aber von Mistrals Bias unabhängige Kennzahl.</w:t>
+      </w:r>
+    </w:p>
+    <w:p>
+      <w:pPr>
+        <w:pStyle w:val="Heading4"/>
+      </w:pPr>
+      <w:r>
+        <w:t>Kein neuer Kursabruf nötig - Wiederverwendung des bereits aufgelösten Outcomes</w:t>
+      </w:r>
+    </w:p>
+    <w:p>
+      <w:r>
+        <w:rPr>
+          <w:rFonts w:ascii="Consolas" w:hAnsi="Consolas"/>
+          <w:b w:val="0"/>
+        </w:rPr>
+        <w:t>check_signal_outcome()</w:t>
+      </w:r>
+      <w:r>
+        <w:rPr>
+          <w:b w:val="0"/>
+        </w:rPr>
+        <w:t>/</w:t>
+      </w:r>
+      <w:r>
+        <w:rPr>
+          <w:rFonts w:ascii="Consolas" w:hAnsi="Consolas"/>
+          <w:b w:val="0"/>
+        </w:rPr>
+        <w:t>check_hebel_signal_outcome()</w:t>
+      </w:r>
+      <w:r>
+        <w:rPr>
+          <w:b w:val="0"/>
+        </w:rPr>
+        <w:t xml:space="preserve"> lösen Take-Profit/ Stop-Loss bereits RICHTUNGS-KORREKT orientiert auf (LONG: TP oberhalb/SL unterhalb des Entrys, SHORT: umgekehrt, siehe </w:t>
+      </w:r>
+      <w:r>
+        <w:rPr>
+          <w:rFonts w:ascii="Consolas" w:hAnsi="Consolas"/>
+          <w:b w:val="0"/>
+        </w:rPr>
+        <w:t>hebel_backward_tracking.py</w:t>
+      </w:r>
+      <w:r>
+        <w:rPr>
+          <w:b w:val="0"/>
+        </w:rPr>
+        <w:t xml:space="preserve"> Zeile ~146-206). Damit lässt sich die TATSÄCHLICHE Marktrichtung aus dem bereits gespeicherten </w:t>
+      </w:r>
+      <w:r>
+        <w:rPr>
+          <w:rFonts w:ascii="Consolas" w:hAnsi="Consolas"/>
+          <w:b w:val="0"/>
+        </w:rPr>
+        <w:t>outcome_status</w:t>
+      </w:r>
+      <w:r>
+        <w:rPr>
+          <w:b w:val="0"/>
+        </w:rPr>
+        <w:t xml:space="preserve"> ableiten, ohne selbst nochmal OHLC- Daten zu lesen:</w:t>
+      </w:r>
+    </w:p>
+    <w:p>
+      <w:pPr>
+        <w:pStyle w:val="ListBullet"/>
+      </w:pPr>
+      <w:r>
+        <w:rPr>
+          <w:rFonts w:ascii="Consolas" w:hAnsi="Consolas"/>
+          <w:b w:val="0"/>
+        </w:rPr>
+        <w:t>primaer_richtung</w:t>
+      </w:r>
+      <w:r>
+        <w:rPr>
+          <w:b w:val="0"/>
+        </w:rPr>
+        <w:t xml:space="preserve">=LONG + </w:t>
+      </w:r>
+      <w:r>
+        <w:rPr>
+          <w:rFonts w:ascii="Consolas" w:hAnsi="Consolas"/>
+          <w:b w:val="0"/>
+        </w:rPr>
+        <w:t>take_profit_erreicht</w:t>
+      </w:r>
+      <w:r>
+        <w:rPr>
+          <w:b w:val="0"/>
+        </w:rPr>
+        <w:t xml:space="preserve"> → Kurs stieg → Markt war LONG - </w:t>
+      </w:r>
+      <w:r>
+        <w:rPr>
+          <w:rFonts w:ascii="Consolas" w:hAnsi="Consolas"/>
+          <w:b w:val="0"/>
+        </w:rPr>
+        <w:t>primaer_richtung</w:t>
+      </w:r>
+      <w:r>
+        <w:rPr>
+          <w:b w:val="0"/>
+        </w:rPr>
+        <w:t xml:space="preserve">=LONG + </w:t>
+      </w:r>
+      <w:r>
+        <w:rPr>
+          <w:rFonts w:ascii="Consolas" w:hAnsi="Consolas"/>
+          <w:b w:val="0"/>
+        </w:rPr>
+        <w:t>stop_loss_erreicht</w:t>
+      </w:r>
+      <w:r>
+        <w:rPr>
+          <w:b w:val="0"/>
+        </w:rPr>
+        <w:t>/</w:t>
+      </w:r>
+      <w:r>
+        <w:rPr>
+          <w:rFonts w:ascii="Consolas" w:hAnsi="Consolas"/>
+          <w:b w:val="0"/>
+        </w:rPr>
+        <w:t>liquidation_wahrscheinlich</w:t>
+      </w:r>
+      <w:r>
+        <w:rPr>
+          <w:b w:val="0"/>
+        </w:rPr>
+        <w:t xml:space="preserve"> → Kurs fiel → Markt war SHORT - </w:t>
+      </w:r>
+      <w:r>
+        <w:rPr>
+          <w:rFonts w:ascii="Consolas" w:hAnsi="Consolas"/>
+          <w:b w:val="0"/>
+        </w:rPr>
+        <w:t>primaer_richtung</w:t>
+      </w:r>
+      <w:r>
+        <w:rPr>
+          <w:b w:val="0"/>
+        </w:rPr>
+        <w:t xml:space="preserve">=SHORT + </w:t>
+      </w:r>
+      <w:r>
+        <w:rPr>
+          <w:rFonts w:ascii="Consolas" w:hAnsi="Consolas"/>
+          <w:b w:val="0"/>
+        </w:rPr>
+        <w:t>take_profit_erreicht</w:t>
+      </w:r>
+      <w:r>
+        <w:rPr>
+          <w:b w:val="0"/>
+        </w:rPr>
+        <w:t xml:space="preserve"> → Kurs fiel → Markt war SHORT - </w:t>
+      </w:r>
+      <w:r>
+        <w:rPr>
+          <w:rFonts w:ascii="Consolas" w:hAnsi="Consolas"/>
+          <w:b w:val="0"/>
+        </w:rPr>
+        <w:t>primaer_richtung</w:t>
+      </w:r>
+      <w:r>
+        <w:rPr>
+          <w:b w:val="0"/>
+        </w:rPr>
+        <w:t xml:space="preserve">=SHORT + </w:t>
+      </w:r>
+      <w:r>
+        <w:rPr>
+          <w:rFonts w:ascii="Consolas" w:hAnsi="Consolas"/>
+          <w:b w:val="0"/>
+        </w:rPr>
+        <w:t>stop_loss_erreicht</w:t>
+      </w:r>
+      <w:r>
+        <w:rPr>
+          <w:b w:val="0"/>
+        </w:rPr>
+        <w:t>/</w:t>
+      </w:r>
+      <w:r>
+        <w:rPr>
+          <w:rFonts w:ascii="Consolas" w:hAnsi="Consolas"/>
+          <w:b w:val="0"/>
+        </w:rPr>
+        <w:t>liquidation_wahrscheinlich</w:t>
+      </w:r>
+      <w:r>
+        <w:rPr>
+          <w:b w:val="0"/>
+        </w:rPr>
+        <w:t xml:space="preserve"> → Kurs stieg → Markt war LONG</w:t>
+      </w:r>
+    </w:p>
+    <w:p>
+      <w:r>
+        <w:rPr>
+          <w:b w:val="0"/>
+        </w:rPr>
+        <w:t xml:space="preserve">Neue reine Funktion </w:t>
+      </w:r>
+      <w:r>
+        <w:rPr>
+          <w:rFonts w:ascii="Consolas" w:hAnsi="Consolas"/>
+          <w:b w:val="0"/>
+        </w:rPr>
+        <w:t>agent/krypto/gegenpruefung.py</w:t>
+      </w:r>
+      <w:r>
+        <w:rPr>
+          <w:b w:val="0"/>
+        </w:rPr>
+        <w:t xml:space="preserve">-Nachbar </w:t>
+      </w:r>
+      <w:r>
+        <w:rPr>
+          <w:rFonts w:ascii="Consolas" w:hAnsi="Consolas"/>
+          <w:b w:val="0"/>
+        </w:rPr>
+        <w:t>agent/krypto/backward_tracking.py::bewerte_zai_richtung(primaer_richtung, outcome_status, zai_eigene_richtung)</w:t>
+      </w:r>
+      <w:r>
+        <w:rPr>
+          <w:b w:val="0"/>
+        </w:rPr>
+        <w:t xml:space="preserve"> vergleicht </w:t>
+      </w:r>
+      <w:r>
+        <w:rPr>
+          <w:rFonts w:ascii="Consolas" w:hAnsi="Consolas"/>
+          <w:b w:val="0"/>
+        </w:rPr>
+        <w:t>zai_eigene_richtung</w:t>
+      </w:r>
+      <w:r>
+        <w:rPr>
+          <w:b w:val="0"/>
+        </w:rPr>
+        <w:t xml:space="preserve"> gegen diese abgeleitete tatsächliche Richtung - "treffer"/"fehlschlag", oder </w:t>
+      </w:r>
+      <w:r>
+        <w:rPr>
+          <w:rFonts w:ascii="Consolas" w:hAnsi="Consolas"/>
+          <w:b w:val="0"/>
+        </w:rPr>
+        <w:t>None</w:t>
+      </w:r>
+      <w:r>
+        <w:rPr>
+          <w:b w:val="0"/>
+        </w:rPr>
+        <w:t xml:space="preserve"> wenn kein Vergleich möglich ist (Z.ai NEUTRAL, oder </w:t>
+      </w:r>
+      <w:r>
+        <w:rPr>
+          <w:rFonts w:ascii="Consolas" w:hAnsi="Consolas"/>
+          <w:b w:val="0"/>
+        </w:rPr>
+        <w:t>outcome_status</w:t>
+      </w:r>
+      <w:r>
+        <w:rPr>
+          <w:b w:val="0"/>
+        </w:rPr>
+        <w:t xml:space="preserve"> außerhalb der aufgelösten Zustände).</w:t>
+      </w:r>
+    </w:p>
+    <w:p>
+      <w:pPr>
+        <w:pStyle w:val="Heading4"/>
+      </w:pPr>
+      <w:r>
+        <w:t>NEUTRAL-Behandlung - Nutzer-Entscheidung</w:t>
+      </w:r>
+    </w:p>
+    <w:p>
+      <w:r>
+        <w:rPr>
+          <w:b w:val="0"/>
+        </w:rPr>
+        <w:t xml:space="preserve">Z.ai-NEUTRAL-Urteile fließen NICHT in die Trefferquote ein (weder als Treffer noch als Fehlschlag), sondern werden separat als </w:t>
+      </w:r>
+      <w:r>
+        <w:rPr>
+          <w:rFonts w:ascii="Consolas" w:hAnsi="Consolas"/>
+          <w:b w:val="0"/>
+        </w:rPr>
+        <w:t>neutral_bei_klarer_bewegung</w:t>
+      </w:r>
+      <w:r>
+        <w:rPr>
+          <w:b w:val="0"/>
+        </w:rPr>
+        <w:t xml:space="preserve"> gezählt. Nutzer-Begründung, explizit erfragt und bestätigt: </w:t>
+      </w:r>
+      <w:r>
+        <w:rPr>
+          <w:b/>
+        </w:rPr>
+        <w:t>"würde ich neutral zählen eher nein - denn wir messen es auch nicht oder?"</w:t>
+      </w:r>
+      <w:r>
+        <w:rPr>
+          <w:b w:val="0"/>
+        </w:rPr>
+        <w:t xml:space="preserve"> - analog dazu, dass Mistrals eigenes HALTEN/NEUTRAL ebenfalls nicht in </w:t>
+      </w:r>
+      <w:r>
+        <w:rPr>
+          <w:rFonts w:ascii="Consolas" w:hAnsi="Consolas"/>
+          <w:b w:val="0"/>
+        </w:rPr>
+        <w:t>compute_provider_performance()</w:t>
+      </w:r>
+      <w:r>
+        <w:rPr>
+          <w:b w:val="0"/>
+        </w:rPr>
+        <w:t>/</w:t>
+      </w:r>
+      <w:r>
+        <w:rPr>
+          <w:rFonts w:ascii="Consolas" w:hAnsi="Consolas"/>
+          <w:b w:val="0"/>
+        </w:rPr>
+        <w:t>compute_win_rate_fact()</w:t>
+      </w:r>
+      <w:r>
+        <w:rPr>
+          <w:b w:val="0"/>
+        </w:rPr>
+        <w:t xml:space="preserve"> einfließt.</w:t>
+      </w:r>
+    </w:p>
+    <w:p>
+      <w:pPr>
+        <w:pStyle w:val="Heading4"/>
+      </w:pPr>
+      <w:r>
+        <w:t>Scope - alle 6 Pipelines, mit einer bekannten Einschränkung bei Spot</w:t>
+      </w:r>
+    </w:p>
+    <w:p>
+      <w:r>
+        <w:rPr>
+          <w:b w:val="0"/>
+        </w:rPr>
+        <w:t xml:space="preserve">Nutzer-Vorgabe: </w:t>
+      </w:r>
+      <w:r>
+        <w:rPr>
+          <w:b/>
+        </w:rPr>
+        <w:t>"Scope sollte analog für alle Assets und Assetklassen angewendet werden - jedenfalls spot"</w:t>
+      </w:r>
+      <w:r>
+        <w:rPr>
+          <w:b w:val="0"/>
+        </w:rPr>
+        <w:t xml:space="preserve">, mit der Annahme "kaufen bevor es steigt also long, verkaufen bevor es fällt also short" (bestätigt als korrekte Grundannahme). Neue Aggregat-Funktion </w:t>
+      </w:r>
+      <w:r>
+        <w:rPr>
+          <w:rFonts w:ascii="Consolas" w:hAnsi="Consolas"/>
+          <w:b w:val="0"/>
+        </w:rPr>
+        <w:t>compute_zai_richtung_performance(conn, watchlist=None)</w:t>
+      </w:r>
+      <w:r>
+        <w:rPr>
+          <w:b w:val="0"/>
+        </w:rPr>
+        <w:t xml:space="preserve"> deckt beide Tabellen ab:</w:t>
+      </w:r>
+    </w:p>
+    <w:p>
+      <w:pPr>
+        <w:pStyle w:val="ListBullet"/>
+      </w:pPr>
+      <w:r>
+        <w:rPr>
+          <w:b/>
+        </w:rPr>
+        <w:t>Hebel</w:t>
+      </w:r>
+      <w:r>
+        <w:rPr>
+          <w:b w:val="0"/>
+        </w:rPr>
+        <w:t xml:space="preserve"> (</w:t>
+      </w:r>
+      <w:r>
+        <w:rPr>
+          <w:rFonts w:ascii="Consolas" w:hAnsi="Consolas"/>
+          <w:b w:val="0"/>
+        </w:rPr>
+        <w:t>hebel_signals</w:t>
+      </w:r>
+      <w:r>
+        <w:rPr>
+          <w:b w:val="0"/>
+        </w:rPr>
+        <w:t xml:space="preserve">): echtes </w:t>
+      </w:r>
+      <w:r>
+        <w:rPr>
+          <w:rFonts w:ascii="Consolas" w:hAnsi="Consolas"/>
+          <w:b w:val="0"/>
+        </w:rPr>
+        <w:t>richtung</w:t>
+      </w:r>
+      <w:r>
+        <w:rPr>
+          <w:b w:val="0"/>
+        </w:rPr>
+        <w:t xml:space="preserve">-Feld, volle Abdeckung - </w:t>
+      </w:r>
+      <w:r>
+        <w:rPr>
+          <w:rFonts w:ascii="Consolas" w:hAnsi="Consolas"/>
+          <w:b w:val="0"/>
+        </w:rPr>
+        <w:t>check_hebel_signal_outcome()</w:t>
+      </w:r>
+      <w:r>
+        <w:rPr>
+          <w:b w:val="0"/>
+        </w:rPr>
+        <w:t xml:space="preserve"> löst BEIDE Richtungen korrekt auf. - </w:t>
+      </w:r>
+      <w:r>
+        <w:rPr>
+          <w:b/>
+        </w:rPr>
+        <w:t>Spot-family</w:t>
+      </w:r>
+      <w:r>
+        <w:rPr>
+          <w:b w:val="0"/>
+        </w:rPr>
+        <w:t xml:space="preserve"> (</w:t>
+      </w:r>
+      <w:r>
+        <w:rPr>
+          <w:rFonts w:ascii="Consolas" w:hAnsi="Consolas"/>
+          <w:b w:val="0"/>
+        </w:rPr>
+        <w:t>signals</w:t>
+      </w:r>
+      <w:r>
+        <w:rPr>
+          <w:b w:val="0"/>
+        </w:rPr>
+        <w:t xml:space="preserve">, Krypto-Spot/Aktien/Rohstoffe/Themen-ETF/Hedge): </w:t>
+      </w:r>
+      <w:r>
+        <w:rPr>
+          <w:rFonts w:ascii="Consolas" w:hAnsi="Consolas"/>
+          <w:b w:val="0"/>
+        </w:rPr>
+        <w:t>primaer_richtung</w:t>
+      </w:r>
+      <w:r>
+        <w:rPr>
+          <w:b w:val="0"/>
+        </w:rPr>
+        <w:t xml:space="preserve"> wird über das bereits bestehende </w:t>
+      </w:r>
+      <w:r>
+        <w:rPr>
+          <w:rFonts w:ascii="Consolas" w:hAnsi="Consolas"/>
+          <w:b w:val="0"/>
+        </w:rPr>
+        <w:t>agent/krypto/gegenpruefung.py::richtung_aus_action()</w:t>
+      </w:r>
+      <w:r>
+        <w:rPr>
+          <w:b w:val="0"/>
+        </w:rPr>
+        <w:t xml:space="preserve"> aus </w:t>
+      </w:r>
+      <w:r>
+        <w:rPr>
+          <w:rFonts w:ascii="Consolas" w:hAnsi="Consolas"/>
+          <w:b w:val="0"/>
+        </w:rPr>
+        <w:t>action</w:t>
+      </w:r>
+      <w:r>
+        <w:rPr>
+          <w:b w:val="0"/>
+        </w:rPr>
+        <w:t xml:space="preserve"> abgeleitet (identische Ableitung wie für </w:t>
+      </w:r>
+      <w:r>
+        <w:rPr>
+          <w:rFonts w:ascii="Consolas" w:hAnsi="Consolas"/>
+          <w:b w:val="0"/>
+        </w:rPr>
+        <w:t>zai_uebereinstimmung</w:t>
+      </w:r>
+      <w:r>
+        <w:rPr>
+          <w:b w:val="0"/>
+        </w:rPr>
+        <w:t xml:space="preserve"> bereits verwendet) - inklusive der Hedge-Invertierung (</w:t>
+      </w:r>
+      <w:r>
+        <w:rPr>
+          <w:rFonts w:ascii="Consolas" w:hAnsi="Consolas"/>
+          <w:b w:val="0"/>
+        </w:rPr>
+        <w:t>ist_hedge_invertiert=True</w:t>
+      </w:r>
+      <w:r>
+        <w:rPr>
+          <w:b w:val="0"/>
+        </w:rPr>
+        <w:t xml:space="preserve"> für Symbole aus </w:t>
+      </w:r>
+      <w:r>
+        <w:rPr>
+          <w:rFonts w:ascii="Consolas" w:hAnsi="Consolas"/>
+          <w:b w:val="0"/>
+        </w:rPr>
+        <w:t>agent.hedge.pipeline.SYMBOL_ZU_HEBEL_FAKTOR</w:t>
+      </w:r>
+      <w:r>
+        <w:rPr>
+          <w:b w:val="0"/>
+        </w:rPr>
+        <w:t>: KAUFEN = Hedge aufbauen = bärische Gesamtmarkterwartung → SHORT-Erwartung an das Instrument selbst).</w:t>
+      </w:r>
+    </w:p>
+    <w:p>
+      <w:r>
+        <w:rPr>
+          <w:b/>
+        </w:rPr>
+        <w:t>Bekannte Lücke, transparent an den Nutzer kommuniziert statt stillschweigend übergangen:</w:t>
+      </w:r>
+      <w:r>
+        <w:rPr>
+          <w:b w:val="0"/>
+        </w:rPr>
+        <w:t xml:space="preserve"> </w:t>
+      </w:r>
+      <w:r>
+        <w:rPr>
+          <w:rFonts w:ascii="Consolas" w:hAnsi="Consolas"/>
+          <w:b w:val="0"/>
+        </w:rPr>
+        <w:t>backward_tracking.py::_TRACKABLE_ACTIONS = {"KAUFEN", "NACHKAUFEN"}</w:t>
+      </w:r>
+      <w:r>
+        <w:rPr>
+          <w:b w:val="0"/>
+        </w:rPr>
+        <w:t xml:space="preserve"> - nur die KAUFEN-Seite der Spot-family wird von </w:t>
+      </w:r>
+      <w:r>
+        <w:rPr>
+          <w:rFonts w:ascii="Consolas" w:hAnsi="Consolas"/>
+          <w:b w:val="0"/>
+        </w:rPr>
+        <w:t>check_signal_outcome()</w:t>
+      </w:r>
+      <w:r>
+        <w:rPr>
+          <w:b w:val="0"/>
+        </w:rPr>
+        <w:t xml:space="preserve"> überhaupt outcome-aufgelöst, VERKAUFEN/TAUSCHEN (die SHORT-Seite) liefern strukturell NIE </w:t>
+      </w:r>
+      <w:r>
+        <w:rPr>
+          <w:rFonts w:ascii="Consolas" w:hAnsi="Consolas"/>
+          <w:b w:val="0"/>
+        </w:rPr>
+        <w:t>take_profit_erreicht</w:t>
+      </w:r>
+      <w:r>
+        <w:rPr>
+          <w:b w:val="0"/>
+        </w:rPr>
+        <w:t xml:space="preserve">/ </w:t>
+      </w:r>
+      <w:r>
+        <w:rPr>
+          <w:rFonts w:ascii="Consolas" w:hAnsi="Consolas"/>
+          <w:b w:val="0"/>
+        </w:rPr>
+        <w:t>stop_loss_erreicht</w:t>
+      </w:r>
+      <w:r>
+        <w:rPr>
+          <w:b w:val="0"/>
+        </w:rPr>
+        <w:t xml:space="preserve"> und tauchen deshalb in dieser Kennzahl praktisch nicht auf, bis ein eigenes Sell-Side-Backward-Tracking existiert (nicht Teil dieser Runde). Bei Hebel gilt diese Einschränkung NICHT.</w:t>
+      </w:r>
+    </w:p>
+    <w:p>
+      <w:pPr>
+        <w:pStyle w:val="Heading4"/>
+      </w:pPr>
+      <w:r>
+        <w:t>Anzeige + Export</w:t>
+      </w:r>
+    </w:p>
+    <w:p>
+      <w:pPr>
+        <w:pStyle w:val="ListBullet"/>
+      </w:pPr>
+      <w:r>
+        <w:rPr>
+          <w:rFonts w:ascii="Consolas" w:hAnsi="Consolas"/>
+          <w:b w:val="0"/>
+        </w:rPr>
+        <w:t>remote/status.py</w:t>
+      </w:r>
+      <w:r>
+        <w:rPr>
+          <w:b w:val="0"/>
+        </w:rPr>
+        <w:t xml:space="preserve">: neues Feld </w:t>
+      </w:r>
+      <w:r>
+        <w:rPr>
+          <w:rFonts w:ascii="Consolas" w:hAnsi="Consolas"/>
+          <w:b w:val="0"/>
+        </w:rPr>
+        <w:t>zai_richtung_performance</w:t>
+      </w:r>
+      <w:r>
+        <w:rPr>
+          <w:b w:val="0"/>
+        </w:rPr>
+        <w:t xml:space="preserve"> (</w:t>
+      </w:r>
+      <w:r>
+        <w:rPr>
+          <w:rFonts w:ascii="Consolas" w:hAnsi="Consolas"/>
+          <w:b w:val="0"/>
+        </w:rPr>
+        <w:t>_get_zai_richtung_performance()</w:t>
+      </w:r>
+      <w:r>
+        <w:rPr>
+          <w:b w:val="0"/>
+        </w:rPr>
+        <w:t xml:space="preserve">, gleicher Lesezugriffs-Stil wie </w:t>
+      </w:r>
+      <w:r>
+        <w:rPr>
+          <w:rFonts w:ascii="Consolas" w:hAnsi="Consolas"/>
+          <w:b w:val="0"/>
+        </w:rPr>
+        <w:t>_get_provider_performance()</w:t>
+      </w:r>
+      <w:r>
+        <w:rPr>
+          <w:b w:val="0"/>
+        </w:rPr>
+        <w:t xml:space="preserve">). - </w:t>
+      </w:r>
+      <w:r>
+        <w:rPr>
+          <w:rFonts w:ascii="Consolas" w:hAnsi="Consolas"/>
+          <w:b w:val="0"/>
+        </w:rPr>
+        <w:t>remote/server.py</w:t>
+      </w:r>
+      <w:r>
+        <w:rPr>
+          <w:b w:val="0"/>
+        </w:rPr>
+        <w:t xml:space="preserve">: neue Karte "Z.ai-Richtungs-Erfolgsquote (unabhängig von Mistral)" - Tiers Hebel + Spot-family nach Assetklasse (analog </w:t>
+      </w:r>
+      <w:r>
+        <w:rPr>
+          <w:rFonts w:ascii="Consolas" w:hAnsi="Consolas"/>
+          <w:b w:val="0"/>
+        </w:rPr>
+        <w:t>SPOT_ASSETKLASSEN</w:t>
+      </w:r>
+      <w:r>
+        <w:rPr>
+          <w:b w:val="0"/>
+        </w:rPr>
+        <w:t xml:space="preserve">), zeigt </w:t>
+      </w:r>
+      <w:r>
+        <w:rPr>
+          <w:rFonts w:ascii="Consolas" w:hAnsi="Consolas"/>
+          <w:b w:val="0"/>
+        </w:rPr>
+        <w:t>n</w:t>
+      </w:r>
+      <w:r>
+        <w:rPr>
+          <w:b w:val="0"/>
+        </w:rPr>
+        <w:t xml:space="preserve">, Trefferquote und NEUTRAL-Anzahl je Tier; leere Tiers bleiben sichtbar statt stillschweigend zu fehlen. - </w:t>
+      </w:r>
+      <w:r>
+        <w:rPr>
+          <w:rFonts w:ascii="Consolas" w:hAnsi="Consolas"/>
+          <w:b w:val="0"/>
+        </w:rPr>
+        <w:t>extract_notebook_diagnose.py</w:t>
+      </w:r>
+      <w:r>
+        <w:rPr>
+          <w:b w:val="0"/>
+        </w:rPr>
+        <w:t xml:space="preserve">: </w:t>
+      </w:r>
+      <w:r>
+        <w:rPr>
+          <w:rFonts w:ascii="Consolas" w:hAnsi="Consolas"/>
+          <w:b w:val="0"/>
+        </w:rPr>
+        <w:t>zai_richtung_performance</w:t>
+      </w:r>
+      <w:r>
+        <w:rPr>
+          <w:b w:val="0"/>
+        </w:rPr>
+        <w:t xml:space="preserve">-Feld ergänzt (Aggregat mitschicken statt nur Rohspalten, gleiches Prinzip wie </w:t>
+      </w:r>
+      <w:r>
+        <w:rPr>
+          <w:rFonts w:ascii="Consolas" w:hAnsi="Consolas"/>
+          <w:b w:val="0"/>
+        </w:rPr>
+        <w:t>provider_performance</w:t>
+      </w:r>
+      <w:r>
+        <w:rPr>
+          <w:b w:val="0"/>
+        </w:rPr>
+        <w:t>/</w:t>
+      </w:r>
+      <w:r>
+        <w:rPr>
+          <w:rFonts w:ascii="Consolas" w:hAnsi="Consolas"/>
+          <w:b w:val="0"/>
+        </w:rPr>
+        <w:t>konfidenz_kalibrierung</w:t>
+      </w:r>
+      <w:r>
+        <w:rPr>
+          <w:b w:val="0"/>
+        </w:rPr>
+        <w:t>).</w:t>
+      </w:r>
+    </w:p>
+    <w:p>
+      <w:r>
+        <w:rPr>
+          <w:b/>
+        </w:rPr>
+        <w:t>Verifiziert:</w:t>
+      </w:r>
+      <w:r>
+        <w:rPr>
+          <w:b w:val="0"/>
+        </w:rPr>
+        <w:t xml:space="preserve"> 11 synthetische Fälle für </w:t>
+      </w:r>
+      <w:r>
+        <w:rPr>
+          <w:rFonts w:ascii="Consolas" w:hAnsi="Consolas"/>
+          <w:b w:val="0"/>
+        </w:rPr>
+        <w:t>bewerte_zai_richtung()</w:t>
+      </w:r>
+      <w:r>
+        <w:rPr>
+          <w:b w:val="0"/>
+        </w:rPr>
+        <w:t xml:space="preserve"> (alle LONG/SHORT × TP/SL/Liquidation-Kombinationen, NEUTRAL, </w:t>
+      </w:r>
+      <w:r>
+        <w:rPr>
+          <w:rFonts w:ascii="Consolas" w:hAnsi="Consolas"/>
+          <w:b w:val="0"/>
+        </w:rPr>
+        <w:t>None</w:t>
+      </w:r>
+      <w:r>
+        <w:rPr>
+          <w:b w:val="0"/>
+        </w:rPr>
+        <w:t xml:space="preserve">, nicht aufgelöster Status) + 8 End-to-End-Fälle für </w:t>
+      </w:r>
+      <w:r>
+        <w:rPr>
+          <w:rFonts w:ascii="Consolas" w:hAnsi="Consolas"/>
+          <w:b w:val="0"/>
+        </w:rPr>
+        <w:t>compute_zai_richtung_performance()</w:t>
+      </w:r>
+      <w:r>
+        <w:rPr>
+          <w:b w:val="0"/>
+        </w:rPr>
+        <w:t xml:space="preserve"> gegen eine In-Memory-SQLite-DB (Hebel Treffer/Fehlschlag/NEUTRAL/fehlendes Feld, Spot KAUFEN-Treffer, Spot HALTEN korrekt ausgeschlossen, Hedge- Invertierung korrekt angewendet) - alle 19 Checks bestanden. Import- Regressionscheck für alle 4 geänderten Module (</w:t>
+      </w:r>
+      <w:r>
+        <w:rPr>
+          <w:rFonts w:ascii="Consolas" w:hAnsi="Consolas"/>
+          <w:b w:val="0"/>
+        </w:rPr>
+        <w:t>backward_tracking.py</w:t>
+      </w:r>
+      <w:r>
+        <w:rPr>
+          <w:b w:val="0"/>
+        </w:rPr>
+        <w:t xml:space="preserve">, </w:t>
+      </w:r>
+      <w:r>
+        <w:rPr>
+          <w:rFonts w:ascii="Consolas" w:hAnsi="Consolas"/>
+          <w:b w:val="0"/>
+        </w:rPr>
+        <w:t>remote/status.py</w:t>
+      </w:r>
+      <w:r>
+        <w:rPr>
+          <w:b w:val="0"/>
+        </w:rPr>
+        <w:t xml:space="preserve">, </w:t>
+      </w:r>
+      <w:r>
+        <w:rPr>
+          <w:rFonts w:ascii="Consolas" w:hAnsi="Consolas"/>
+          <w:b w:val="0"/>
+        </w:rPr>
+        <w:t>remote/server.py</w:t>
+      </w:r>
+      <w:r>
+        <w:rPr>
+          <w:b w:val="0"/>
+        </w:rPr>
+        <w:t xml:space="preserve">, </w:t>
+      </w:r>
+      <w:r>
+        <w:rPr>
+          <w:rFonts w:ascii="Consolas" w:hAnsi="Consolas"/>
+          <w:b w:val="0"/>
+        </w:rPr>
+        <w:t>extract_notebook_diagnose.py</w:t>
+      </w:r>
+      <w:r>
+        <w:rPr>
+          <w:b w:val="0"/>
+        </w:rPr>
+        <w:t>) ohne Fehler.</w:t>
+      </w:r>
+    </w:p>
+    <w:p>
+      <w:r>
+        <w:rPr>
+          <w:b/>
+        </w:rPr>
+        <w:t>Bewusst NICHT Teil dieser Runde:</w:t>
+      </w:r>
+      <w:r>
+        <w:rPr>
+          <w:b w:val="0"/>
+        </w:rPr>
+        <w:t xml:space="preserve"> keine Änderung an </w:t>
+      </w:r>
+      <w:r>
+        <w:rPr>
+          <w:rFonts w:ascii="Consolas" w:hAnsi="Consolas"/>
+          <w:b w:val="0"/>
+        </w:rPr>
+        <w:t>hebel_richtung_modus</w:t>
+      </w:r>
+      <w:r>
+        <w:rPr>
+          <w:b w:val="0"/>
+        </w:rPr>
+        <w:t xml:space="preserve"> selbst (Bitpanda-Short-Einschränkung bleibt gültig); kein Sell-Side-Backward- Tracking für VERKAUFEN/TAUSCHEN (siehe Lücke oben); keine GUI-Integration außerhalb der Remote-Seite (gleiche Platzierung wie Provider-Performance/ Richtungstreffer-Quote, aus denen dieses Feature abgeleitet ist).</w:t>
       </w:r>
     </w:p>
     <w:sectPr>

</xml_diff>

<commit_message>
Z.ai-Erfolgsquote auf MFE-Basis + Sell-Side-Backward-Tracking fuer alle Assetklassen
Z.ai-Richtungs-Erfolgsquote nutzt jetzt wie Mistrals Richtungstreffer-Quote das
Maximum-Favorable-Excursion-Prinzip statt einer binaeren Take-Profit/Stop-Loss-Pruefung.

VERKAUFEN/TAUSCHEN erhalten erstmals eine deterministisch erzwungene, gespiegelte
Zielzone (Stop-Loss oberhalb, Take-Profit unterhalb der Entry-Zone) analog zur
bestehenden Hebel-Short-Logik: Regel 3/16-Erweiterung in 4 Spot-Analysten, CRV-Veto-
Spiegelung in risk_gate.py, ist_short-Zweig in check_signal_outcome() inkl. MFE-
Tracking, mindestziel_preis()-Aufruf korrigiert. Hedge bewusst ausgenommen (Regel 9
verlangt dort nie eine CRV-Mindestgrenze). Damit werden VERKAUFEN/TAUSCHEN-Signale in
allen Assetklassen erstmals zuverlaessig fuer Mistral- und Z.ai-Performance-Messung
trackbar.

Co-Authored-By: Claude Sonnet 5 <noreply@anthropic.com>
</commit_message>
<xml_diff>
--- a/Basisinfos/Regelwerksmanual.docx
+++ b/Basisinfos/Regelwerksmanual.docx
@@ -18925,6 +18925,1542 @@
           <w:b w:val="0"/>
         </w:rPr>
         <w:t xml:space="preserve"> selbst (Bitpanda-Short-Einschränkung bleibt gültig); kein Sell-Side-Backward- Tracking für VERKAUFEN/TAUSCHEN (siehe Lücke oben); keine GUI-Integration außerhalb der Remote-Seite (gleiche Platzierung wie Provider-Performance/ Richtungstreffer-Quote, aus denen dieses Feature abgeleitet ist).</w:t>
+      </w:r>
+    </w:p>
+    <w:p>
+      <w:pPr>
+        <w:pStyle w:val="Heading3"/>
+      </w:pPr>
+      <w:r>
+        <w:t>Nachtrag (2026-07-27, noch später): Punkt 3 - Z.ai-Erfolgsquote auf Richtungstreffer/MFE statt binärem TP/SL-outcome_status umgestellt</w:t>
+      </w:r>
+    </w:p>
+    <w:p>
+      <w:r>
+        <w:rPr>
+          <w:b/>
+        </w:rPr>
+        <w:t>Auslöser:</w:t>
+      </w:r>
+      <w:r>
+        <w:rPr>
+          <w:b w:val="0"/>
+        </w:rPr>
+        <w:t xml:space="preserve"> direkt nach dem Push der obigen Version stellte der Nutzer vier Anschlussfragen zum weiteren Optimierungsbedarf, von denen Punkt 3 die gerade gebaute Metrik selbst betraf: </w:t>
+      </w:r>
+      <w:r>
+        <w:rPr>
+          <w:b/>
+        </w:rPr>
+        <w:t>"wir haben als Erfolgsquote auch nicht mehr die Take Profit Zone ausgereizt"</w:t>
+      </w:r>
+      <w:r>
+        <w:rPr>
+          <w:b w:val="0"/>
+        </w:rPr>
+        <w:t xml:space="preserve"> - zurecht, die erste Version nutzte den binären </w:t>
+      </w:r>
+      <w:r>
+        <w:rPr>
+          <w:rFonts w:ascii="Consolas" w:hAnsi="Consolas"/>
+          <w:b w:val="0"/>
+        </w:rPr>
+        <w:t>outcome_status</w:t>
+      </w:r>
+      <w:r>
+        <w:rPr>
+          <w:b w:val="0"/>
+        </w:rPr>
+        <w:t xml:space="preserve"> (nur </w:t>
+      </w:r>
+      <w:r>
+        <w:rPr>
+          <w:rFonts w:ascii="Consolas" w:hAnsi="Consolas"/>
+          <w:b w:val="0"/>
+        </w:rPr>
+        <w:t>take_profit_erreicht</w:t>
+      </w:r>
+      <w:r>
+        <w:rPr>
+          <w:b w:val="0"/>
+        </w:rPr>
+        <w:t>/</w:t>
+      </w:r>
+      <w:r>
+        <w:rPr>
+          <w:rFonts w:ascii="Consolas" w:hAnsi="Consolas"/>
+          <w:b w:val="0"/>
+        </w:rPr>
+        <w:t>stop_loss_erreicht</w:t>
+      </w:r>
+      <w:r>
+        <w:rPr>
+          <w:b w:val="0"/>
+        </w:rPr>
+        <w:t xml:space="preserve">/ </w:t>
+      </w:r>
+      <w:r>
+        <w:rPr>
+          <w:rFonts w:ascii="Consolas" w:hAnsi="Consolas"/>
+          <w:b w:val="0"/>
+        </w:rPr>
+        <w:t>liquidation_wahrscheinlich</w:t>
+      </w:r>
+      <w:r>
+        <w:rPr>
+          <w:b w:val="0"/>
+        </w:rPr>
+        <w:t>), ein Signal, das nie eine der beiden Zonen erreicht (später überholt/abgelaufen), aber zwischenzeitlich klar in eine Richtung lief, wurde komplett übersehen - exakt dasselbe Problem, das die bestehende Richtungstreffer-Quote (</w:t>
+      </w:r>
+      <w:r>
+        <w:rPr>
+          <w:rFonts w:ascii="Consolas" w:hAnsi="Consolas"/>
+          <w:b w:val="0"/>
+        </w:rPr>
+        <w:t>compute_richtungstreffer_quote()</w:t>
+      </w:r>
+      <w:r>
+        <w:rPr>
+          <w:b w:val="0"/>
+        </w:rPr>
+        <w:t>, 2026-07-27 früher am selben Tag) bereits für Mistrals eigene Signale löst.</w:t>
+      </w:r>
+    </w:p>
+    <w:p>
+      <w:r>
+        <w:rPr>
+          <w:b/>
+        </w:rPr>
+        <w:t>Zusatzfrage des Nutzers, direkt beantwortet:</w:t>
+      </w:r>
+      <w:r>
+        <w:rPr>
+          <w:b w:val="0"/>
+        </w:rPr>
+        <w:t xml:space="preserve"> "ist das für Mistral Quote und Richtung bereits korrekt für alle Assets oder nicht?" - Antwort nach Code-Prüfung (</w:t>
+      </w:r>
+      <w:r>
+        <w:rPr>
+          <w:rFonts w:ascii="Consolas" w:hAnsi="Consolas"/>
+          <w:b w:val="0"/>
+        </w:rPr>
+        <w:t>run_backward_tracking()</w:t>
+      </w:r>
+      <w:r>
+        <w:rPr>
+          <w:b w:val="0"/>
+        </w:rPr>
+        <w:t xml:space="preserve"> Zeile ~382: </w:t>
+      </w:r>
+      <w:r>
+        <w:rPr>
+          <w:rFonts w:ascii="Consolas" w:hAnsi="Consolas"/>
+          <w:b w:val="0"/>
+        </w:rPr>
+        <w:t>SELECT id FROM signals WHERE outcome_status IS NULL OR outcome_status = 'offen'</w:t>
+      </w:r>
+      <w:r>
+        <w:rPr>
+          <w:b w:val="0"/>
+        </w:rPr>
+        <w:t xml:space="preserve"> - KEIN Assetklassen- oder Symbol-Filter):</w:t>
+      </w:r>
+    </w:p>
+    <w:p>
+      <w:pPr>
+        <w:pStyle w:val="ListBullet"/>
+      </w:pPr>
+      <w:r>
+        <w:rPr>
+          <w:b/>
+        </w:rPr>
+        <w:t>Datenberechnung</w:t>
+      </w:r>
+      <w:r>
+        <w:rPr>
+          <w:b w:val="0"/>
+        </w:rPr>
+        <w:t xml:space="preserve">: JA, vollständig korrekt für alle 6 Pipelines. </w:t>
+      </w:r>
+      <w:r>
+        <w:rPr>
+          <w:rFonts w:ascii="Consolas" w:hAnsi="Consolas"/>
+          <w:b w:val="0"/>
+        </w:rPr>
+        <w:t>check_signal_outcome()</w:t>
+      </w:r>
+      <w:r>
+        <w:rPr>
+          <w:b w:val="0"/>
+        </w:rPr>
+        <w:t>/</w:t>
+      </w:r>
+      <w:r>
+        <w:rPr>
+          <w:rFonts w:ascii="Consolas" w:hAnsi="Consolas"/>
+          <w:b w:val="0"/>
+        </w:rPr>
+        <w:t>check_hebel_signal_outcome()</w:t>
+      </w:r>
+      <w:r>
+        <w:rPr>
+          <w:b w:val="0"/>
+        </w:rPr>
+        <w:t xml:space="preserve"> laufen unverändert über die komplette geteilte </w:t>
+      </w:r>
+      <w:r>
+        <w:rPr>
+          <w:rFonts w:ascii="Consolas" w:hAnsi="Consolas"/>
+          <w:b w:val="0"/>
+        </w:rPr>
+        <w:t>signals</w:t>
+      </w:r>
+      <w:r>
+        <w:rPr>
+          <w:b w:val="0"/>
+        </w:rPr>
+        <w:t>/</w:t>
+      </w:r>
+      <w:r>
+        <w:rPr>
+          <w:rFonts w:ascii="Consolas" w:hAnsi="Consolas"/>
+          <w:b w:val="0"/>
+        </w:rPr>
+        <w:t>hebel_signals</w:t>
+      </w:r>
+      <w:r>
+        <w:rPr>
+          <w:b w:val="0"/>
+        </w:rPr>
+        <w:t xml:space="preserve">-Tabelle, unabhängig davon, welche Pipeline das Signal erzeugt hat - kein pipeline-spezifischer Sonderfall nötig, kein "vergessenes" Backfill. 2. </w:t>
+      </w:r>
+      <w:r>
+        <w:rPr>
+          <w:b/>
+        </w:rPr>
+        <w:t>Richtungskorrektheit</w:t>
+      </w:r>
+      <w:r>
+        <w:rPr>
+          <w:b w:val="0"/>
+        </w:rPr>
+        <w:t xml:space="preserve">: bei Hebel vollständig korrekt für BEIDE Richtungen (verifizierter Code, </w:t>
+      </w:r>
+      <w:r>
+        <w:rPr>
+          <w:rFonts w:ascii="Consolas" w:hAnsi="Consolas"/>
+          <w:b w:val="0"/>
+        </w:rPr>
+        <w:t>ist_short</w:t>
+      </w:r>
+      <w:r>
+        <w:rPr>
+          <w:b w:val="0"/>
+        </w:rPr>
+        <w:t xml:space="preserve">-Verzweigung sowohl in </w:t>
+      </w:r>
+      <w:r>
+        <w:rPr>
+          <w:rFonts w:ascii="Consolas" w:hAnsi="Consolas"/>
+          <w:b w:val="0"/>
+        </w:rPr>
+        <w:t>resolve()</w:t>
+      </w:r>
+      <w:r>
+        <w:rPr>
+          <w:b w:val="0"/>
+        </w:rPr>
+        <w:t xml:space="preserve"> als auch </w:t>
+      </w:r>
+      <w:r>
+        <w:rPr>
+          <w:rFonts w:ascii="Consolas" w:hAnsi="Consolas"/>
+          <w:b w:val="0"/>
+        </w:rPr>
+        <w:t>_erfasse_mfe()</w:t>
+      </w:r>
+      <w:r>
+        <w:rPr>
+          <w:b w:val="0"/>
+        </w:rPr>
+        <w:t>). Bei der Spot-family gilt dieselbe Lücke wie beim binären Outcome: NUR KAUFEN/NACHKAUFEN (</w:t>
+      </w:r>
+      <w:r>
+        <w:rPr>
+          <w:rFonts w:ascii="Consolas" w:hAnsi="Consolas"/>
+          <w:b w:val="0"/>
+        </w:rPr>
+        <w:t>_TRACKABLE_ACTIONS</w:t>
+      </w:r>
+      <w:r>
+        <w:rPr>
+          <w:b w:val="0"/>
+        </w:rPr>
+        <w:t xml:space="preserve">) werden je MFE-getrackt, VERKAUFEN/TAUSCHEN nie - dieselbe, bereits dokumentierte Lücke, keine neue. 3. </w:t>
+      </w:r>
+      <w:r>
+        <w:rPr>
+          <w:b/>
+        </w:rPr>
+        <w:t>Anzeige-Aufschlüsselung</w:t>
+      </w:r>
+      <w:r>
+        <w:rPr>
+          <w:b w:val="0"/>
+        </w:rPr>
+        <w:t xml:space="preserve">: </w:t>
+      </w:r>
+      <w:r>
+        <w:rPr>
+          <w:rFonts w:ascii="Consolas" w:hAnsi="Consolas"/>
+          <w:b w:val="0"/>
+        </w:rPr>
+        <w:t>compute_richtungstreffer_quote(conn, tier, ...)</w:t>
+      </w:r>
+      <w:r>
+        <w:rPr>
+          <w:b w:val="0"/>
+        </w:rPr>
+        <w:t xml:space="preserve"> bricht NICHT nach Assetklasse auf (anders als Provider-Performance/ Konfidenz-Kalibrierung) - poolt aktuell "spot" über Krypto-Spot/Aktien/ Rohstoffe/Themen-ETF/Hedge hinweg. Keine Korrektheitslücke, aber gröber als die anderen Karten - nicht Teil dieser Runde, da nicht explizit angefragt.</w:t>
+      </w:r>
+    </w:p>
+    <w:p>
+      <w:r>
+        <w:rPr>
+          <w:b/>
+        </w:rPr>
+        <w:t>Umsetzung:</w:t>
+      </w:r>
+      <w:r>
+        <w:rPr>
+          <w:b w:val="0"/>
+        </w:rPr>
+        <w:t xml:space="preserve"> </w:t>
+      </w:r>
+      <w:r>
+        <w:rPr>
+          <w:rFonts w:ascii="Consolas" w:hAnsi="Consolas"/>
+          <w:b w:val="0"/>
+        </w:rPr>
+        <w:t>bewerte_zai_richtung()</w:t>
+      </w:r>
+      <w:r>
+        <w:rPr>
+          <w:b w:val="0"/>
+        </w:rPr>
+        <w:t xml:space="preserve"> (Signatur geändert: </w:t>
+      </w:r>
+      <w:r>
+        <w:rPr>
+          <w:rFonts w:ascii="Consolas" w:hAnsi="Consolas"/>
+          <w:b w:val="0"/>
+        </w:rPr>
+        <w:t>outcome_status</w:t>
+      </w:r>
+      <w:r>
+        <w:rPr>
+          <w:b w:val="0"/>
+        </w:rPr>
+        <w:t xml:space="preserve"> → </w:t>
+      </w:r>
+      <w:r>
+        <w:rPr>
+          <w:rFonts w:ascii="Consolas" w:hAnsi="Consolas"/>
+          <w:b w:val="0"/>
+        </w:rPr>
+        <w:t>max_realisiertes_crv: float | None</w:t>
+      </w:r>
+      <w:r>
+        <w:rPr>
+          <w:b w:val="0"/>
+        </w:rPr>
+        <w:t xml:space="preserve"> + </w:t>
+      </w:r>
+      <w:r>
+        <w:rPr>
+          <w:rFonts w:ascii="Consolas" w:hAnsi="Consolas"/>
+          <w:b w:val="0"/>
+        </w:rPr>
+        <w:t>richtungstreffer_mindest_crv: float</w:t>
+      </w:r>
+      <w:r>
+        <w:rPr>
+          <w:b w:val="0"/>
+        </w:rPr>
+        <w:t xml:space="preserve">) nutzt jetzt </w:t>
+      </w:r>
+      <w:r>
+        <w:rPr>
+          <w:rFonts w:ascii="Consolas" w:hAnsi="Consolas"/>
+          <w:b w:val="0"/>
+        </w:rPr>
+        <w:t>outcome_max_realisiertes_crv</w:t>
+      </w:r>
+      <w:r>
+        <w:rPr>
+          <w:b w:val="0"/>
+        </w:rPr>
+        <w:t xml:space="preserve"> (bereits relativ zu </w:t>
+      </w:r>
+      <w:r>
+        <w:rPr>
+          <w:rFonts w:ascii="Consolas" w:hAnsi="Consolas"/>
+          <w:b w:val="0"/>
+        </w:rPr>
+        <w:t>primaer_richtung</w:t>
+      </w:r>
+      <w:r>
+        <w:rPr>
+          <w:b w:val="0"/>
+        </w:rPr>
+        <w:t xml:space="preserve"> berechnet) statt des binären Status: - </w:t>
+      </w:r>
+      <w:r>
+        <w:rPr>
+          <w:rFonts w:ascii="Consolas" w:hAnsi="Consolas"/>
+          <w:b w:val="0"/>
+        </w:rPr>
+        <w:t>max_realisiertes_crv &gt;= Schwelle</w:t>
+      </w:r>
+      <w:r>
+        <w:rPr>
+          <w:b w:val="0"/>
+        </w:rPr>
+        <w:t xml:space="preserve"> → Markt bestätigte </w:t>
+      </w:r>
+      <w:r>
+        <w:rPr>
+          <w:rFonts w:ascii="Consolas" w:hAnsi="Consolas"/>
+          <w:b w:val="0"/>
+        </w:rPr>
+        <w:t>primaer_richtung</w:t>
+      </w:r>
+      <w:r>
+        <w:rPr>
+          <w:b w:val="0"/>
+        </w:rPr>
+        <w:t xml:space="preserve">. - </w:t>
+      </w:r>
+      <w:r>
+        <w:rPr>
+          <w:rFonts w:ascii="Consolas" w:hAnsi="Consolas"/>
+          <w:b w:val="0"/>
+        </w:rPr>
+        <w:t>max_realisiertes_crv &lt;= -Schwelle</w:t>
+      </w:r>
+      <w:r>
+        <w:rPr>
+          <w:b w:val="0"/>
+        </w:rPr>
+        <w:t xml:space="preserve"> → Markt lief klar in die Gegenrichtung. - Dazwischen → neuer Rückgabewert </w:t>
+      </w:r>
+      <w:r>
+        <w:rPr>
+          <w:rFonts w:ascii="Consolas" w:hAnsi="Consolas"/>
+          <w:b w:val="0"/>
+        </w:rPr>
+        <w:t>ZAI_URTEIL_KEINE_KLARE_BEWEGUNG</w:t>
+      </w:r>
+      <w:r>
+        <w:rPr>
+          <w:b w:val="0"/>
+        </w:rPr>
+        <w:t xml:space="preserve"> (Markt hat sich nicht entscheidend genug bewegt, unabhängig von Z.ais Antwort - bewusst NICHT dasselbe wie NEUTRAL). - Z.ai=NEUTRAL (oder kein MFE-Wert vorhanden) → </w:t>
+      </w:r>
+      <w:r>
+        <w:rPr>
+          <w:rFonts w:ascii="Consolas" w:hAnsi="Consolas"/>
+          <w:b w:val="0"/>
+        </w:rPr>
+        <w:t>ZAI_URTEIL_NEUTRAL</w:t>
+      </w:r>
+      <w:r>
+        <w:rPr>
+          <w:b w:val="0"/>
+        </w:rPr>
+        <w:t>.</w:t>
+      </w:r>
+    </w:p>
+    <w:p>
+      <w:r>
+        <w:rPr>
+          <w:rFonts w:ascii="Consolas" w:hAnsi="Consolas"/>
+          <w:b w:val="0"/>
+        </w:rPr>
+        <w:t>compute_zai_richtung_performance()</w:t>
+      </w:r>
+      <w:r>
+        <w:rPr>
+          <w:b w:val="0"/>
+        </w:rPr>
+        <w:t xml:space="preserve"> bekommt einen neuen Parameter </w:t>
+      </w:r>
+      <w:r>
+        <w:rPr>
+          <w:rFonts w:ascii="Consolas" w:hAnsi="Consolas"/>
+          <w:b w:val="0"/>
+        </w:rPr>
+        <w:t>richtungstreffer_mindest_crv</w:t>
+      </w:r>
+      <w:r>
+        <w:rPr>
+          <w:b w:val="0"/>
+        </w:rPr>
+        <w:t xml:space="preserve"> (Default identisch zu </w:t>
+      </w:r>
+      <w:r>
+        <w:rPr>
+          <w:rFonts w:ascii="Consolas" w:hAnsi="Consolas"/>
+          <w:b w:val="0"/>
+        </w:rPr>
+        <w:t>compute_richtungstreffer_ quote()</w:t>
+      </w:r>
+      <w:r>
+        <w:rPr>
+          <w:b w:val="0"/>
+        </w:rPr>
+        <w:t xml:space="preserve">, config-Schlüssel </w:t>
+      </w:r>
+      <w:r>
+        <w:rPr>
+          <w:rFonts w:ascii="Consolas" w:hAnsi="Consolas"/>
+          <w:b w:val="0"/>
+        </w:rPr>
+        <w:t>backward_tracking.richtungstreffer_mindest_crv</w:t>
+      </w:r>
+      <w:r>
+        <w:rPr>
+          <w:b w:val="0"/>
+        </w:rPr>
+        <w:t xml:space="preserve">, aktuell 1.0) - </w:t>
+      </w:r>
+      <w:r>
+        <w:rPr>
+          <w:rFonts w:ascii="Consolas" w:hAnsi="Consolas"/>
+          <w:b w:val="0"/>
+        </w:rPr>
+        <w:t>remote/status.py::_get_zai_richtung_performance()</w:t>
+      </w:r>
+      <w:r>
+        <w:rPr>
+          <w:b w:val="0"/>
+        </w:rPr>
+        <w:t xml:space="preserve"> liest jetzt dieselbe config-Schwelle wie </w:t>
+      </w:r>
+      <w:r>
+        <w:rPr>
+          <w:rFonts w:ascii="Consolas" w:hAnsi="Consolas"/>
+          <w:b w:val="0"/>
+        </w:rPr>
+        <w:t>_get_richtungstreffer_quote()</w:t>
+      </w:r>
+      <w:r>
+        <w:rPr>
+          <w:b w:val="0"/>
+        </w:rPr>
+        <w:t xml:space="preserve">, damit beide Karten konsistent kalibriert sind. Rückgabe-Dict pro Tier jetzt mit vier statt zwei Zählern: </w:t>
+      </w:r>
+      <w:r>
+        <w:rPr>
+          <w:rFonts w:ascii="Consolas" w:hAnsi="Consolas"/>
+          <w:b w:val="0"/>
+        </w:rPr>
+        <w:t>treffer</w:t>
+      </w:r>
+      <w:r>
+        <w:rPr>
+          <w:b w:val="0"/>
+        </w:rPr>
+        <w:t>/</w:t>
+      </w:r>
+      <w:r>
+        <w:rPr>
+          <w:rFonts w:ascii="Consolas" w:hAnsi="Consolas"/>
+          <w:b w:val="0"/>
+        </w:rPr>
+        <w:t>fehlschlaege</w:t>
+      </w:r>
+      <w:r>
+        <w:rPr>
+          <w:b w:val="0"/>
+        </w:rPr>
+        <w:t>/</w:t>
+      </w:r>
+      <w:r>
+        <w:rPr>
+          <w:rFonts w:ascii="Consolas" w:hAnsi="Consolas"/>
+          <w:b w:val="0"/>
+        </w:rPr>
+        <w:t>neutral</w:t>
+      </w:r>
+      <w:r>
+        <w:rPr>
+          <w:b w:val="0"/>
+        </w:rPr>
+        <w:t>/</w:t>
+      </w:r>
+      <w:r>
+        <w:rPr>
+          <w:rFonts w:ascii="Consolas" w:hAnsi="Consolas"/>
+          <w:b w:val="0"/>
+        </w:rPr>
+        <w:t>keine_klare_marktbewegung</w:t>
+      </w:r>
+      <w:r>
+        <w:rPr>
+          <w:b w:val="0"/>
+        </w:rPr>
+        <w:t xml:space="preserve"> - </w:t>
+      </w:r>
+      <w:r>
+        <w:rPr>
+          <w:rFonts w:ascii="Consolas" w:hAnsi="Consolas"/>
+          <w:b w:val="0"/>
+        </w:rPr>
+        <w:t>anzahl_bewertet</w:t>
+      </w:r>
+      <w:r>
+        <w:rPr>
+          <w:b w:val="0"/>
+        </w:rPr>
+        <w:t xml:space="preserve"> (Basis der Trefferquote) zählt bewusst NUR treffer+ fehlschlaege, die anderen beiden würden sonst die Quote verwässern.</w:t>
+      </w:r>
+    </w:p>
+    <w:p>
+      <w:r>
+        <w:rPr>
+          <w:rFonts w:ascii="Consolas" w:hAnsi="Consolas"/>
+          <w:b w:val="0"/>
+        </w:rPr>
+        <w:t>remote/server.py</w:t>
+      </w:r>
+      <w:r>
+        <w:rPr>
+          <w:b w:val="0"/>
+        </w:rPr>
+        <w:t>: Kartentext + Render-Funktion angepasst (zeigt jetzt beide Nebenkategorien getrennt, z.B. "3x NEUTRAL, 2x keine klare Marktbewegung, nicht mitgezählt").</w:t>
+      </w:r>
+    </w:p>
+    <w:p>
+      <w:r>
+        <w:rPr>
+          <w:b/>
+        </w:rPr>
+        <w:t>Verifiziert:</w:t>
+      </w:r>
+      <w:r>
+        <w:rPr>
+          <w:b w:val="0"/>
+        </w:rPr>
+        <w:t xml:space="preserve"> 14 synthetische Randfälle für </w:t>
+      </w:r>
+      <w:r>
+        <w:rPr>
+          <w:rFonts w:ascii="Consolas" w:hAnsi="Consolas"/>
+          <w:b w:val="0"/>
+        </w:rPr>
+        <w:t>bewerte_zai_richtung()</w:t>
+      </w:r>
+      <w:r>
+        <w:rPr>
+          <w:b w:val="0"/>
+        </w:rPr>
+        <w:t xml:space="preserve"> (Schwellenwert exakt getroffen/knapp verfehlt, beide Richtungen, NEUTRAL, </w:t>
+      </w:r>
+      <w:r>
+        <w:rPr>
+          <w:rFonts w:ascii="Consolas" w:hAnsi="Consolas"/>
+          <w:b w:val="0"/>
+        </w:rPr>
+        <w:t>None</w:t>
+      </w:r>
+      <w:r>
+        <w:rPr>
+          <w:b w:val="0"/>
+        </w:rPr>
+        <w:t xml:space="preserve">, fehlender MFE-Wert, konfigurierbare Schwelle) + 8 End-to-End-Fälle für </w:t>
+      </w:r>
+      <w:r>
+        <w:rPr>
+          <w:rFonts w:ascii="Consolas" w:hAnsi="Consolas"/>
+          <w:b w:val="0"/>
+        </w:rPr>
+        <w:t>compute_zai_richtung_performance()</w:t>
+      </w:r>
+      <w:r>
+        <w:rPr>
+          <w:b w:val="0"/>
+        </w:rPr>
+        <w:t xml:space="preserve"> (inkl. Schwellenwert-Verschiebung end-to-end getestet: dieselben Rohdaten ergeben bei Schwelle=2.0 andere Buckets als bei Schwelle=1.0) + 2 Kontroll-Checks - alle 24 bestanden. Import-Regressionscheck für alle 4 betroffenen Module ohne Fehler.</w:t>
+      </w:r>
+    </w:p>
+    <w:p>
+      <w:r>
+        <w:rPr>
+          <w:b/>
+        </w:rPr>
+        <w:t>Offen, vom Nutzer selbst als mehrtägiges Thema angekündigt</w:t>
+      </w:r>
+      <w:r>
+        <w:rPr>
+          <w:b w:val="0"/>
+        </w:rPr>
+        <w:t xml:space="preserve"> ("das Thema wird uns noch einige Zeit und Tage beschäftigen"), NICHT Teil dieser Runde: - Was folgt daraus, wenn Z.ai über längere Zeit signifikant besser liegt als Mistral (Aufwertung von "rein beobachtend" zu einer echten zweiten Stimme)? - Zufalls-Trefferquote-Risiko: eine hohe SHORT-Trefferquote in einem anhaltenden Bär-Regime kann ohne Baseline-Vergleich (z.B. gegen "Regime- Richtung geraten") bedeutungslos sein - noch kein Baseline-Vergleich gebaut. - Generelle Frage nach präziserer Kalibrierung beider Z.ai-Calls (Konsistenz- Check UND Richtungs-Abgleich).</w:t>
+      </w:r>
+    </w:p>
+    <w:p>
+      <w:pPr>
+        <w:pStyle w:val="Heading3"/>
+      </w:pPr>
+      <w:r>
+        <w:t>Nachtrag (2026-07-27, Abschluss der Sitzung): Sell-Side-Backward-Tracking - VERKAUFEN/TAUSCHEN jetzt vollständig trackbar (Mistral UND Z.ai)</w:t>
+      </w:r>
+    </w:p>
+    <w:p>
+      <w:r>
+        <w:rPr>
+          <w:b/>
+        </w:rPr>
+        <w:t>Auslöser:</w:t>
+      </w:r>
+      <w:r>
+        <w:rPr>
+          <w:b w:val="0"/>
+        </w:rPr>
+        <w:t xml:space="preserve"> direkter Nutzer-Auftrag, nachdem die Z.ai-Richtungs-Erfolgsquote fertiggestellt war: </w:t>
+      </w:r>
+      <w:r>
+        <w:rPr>
+          <w:b/>
+        </w:rPr>
+        <w:t>"bitte bei spot, etc. auch auf sinkende short Kurse - also verkauf Tracken damit es vollständig ist für alle Assets - für ZAI und Mistral - falls noch nicht angepasst."</w:t>
+      </w:r>
+      <w:r>
+        <w:rPr>
+          <w:b w:val="0"/>
+        </w:rPr>
+        <w:t xml:space="preserve"> Recherche ergab: VERKAUFEN/TAUSCHEN- Signale bekamen zwar formal </w:t>
+      </w:r>
+      <w:r>
+        <w:rPr>
+          <w:rFonts w:ascii="Consolas" w:hAnsi="Consolas"/>
+          <w:b w:val="0"/>
+        </w:rPr>
+        <w:t>entry</w:t>
+      </w:r>
+      <w:r>
+        <w:rPr>
+          <w:b w:val="0"/>
+        </w:rPr>
+        <w:t>/</w:t>
+      </w:r>
+      <w:r>
+        <w:rPr>
+          <w:rFonts w:ascii="Consolas" w:hAnsi="Consolas"/>
+          <w:b w:val="0"/>
+        </w:rPr>
+        <w:t>stop_loss</w:t>
+      </w:r>
+      <w:r>
+        <w:rPr>
+          <w:b w:val="0"/>
+        </w:rPr>
+        <w:t>/</w:t>
+      </w:r>
+      <w:r>
+        <w:rPr>
+          <w:rFonts w:ascii="Consolas" w:hAnsi="Consolas"/>
+          <w:b w:val="0"/>
+        </w:rPr>
+        <w:t>take_profit</w:t>
+      </w:r>
+      <w:r>
+        <w:rPr>
+          <w:b w:val="0"/>
+        </w:rPr>
+        <w:t xml:space="preserve">-Zonen vom LLM, aber OHNE erzwungene Richtung - Regel 3 (Stop-Loss/CRV-Pflicht) galt bisher NUR für KAUFEN/NACHKAUFEN, Regel 16 (Zonen-Beispiele) war durchgehend bullisch formuliert. Ohne Fix wären die Zonen bei VERKAUFEN strukturell unzuverlässig orientiert gewesen - eine reine Python-Erweiterung von </w:t>
+      </w:r>
+      <w:r>
+        <w:rPr>
+          <w:rFonts w:ascii="Consolas" w:hAnsi="Consolas"/>
+          <w:b w:val="0"/>
+        </w:rPr>
+        <w:t>_TRACKABLE_ACTIONS</w:t>
+      </w:r>
+      <w:r>
+        <w:rPr>
+          <w:b w:val="0"/>
+        </w:rPr>
+        <w:t xml:space="preserve"> hätte mit Zonen gerechnet, die keine verlässliche bearische Struktur hatten. Nutzer-Vorgabe zur Lösung, nach kurzer Rückfrage bestätigt: </w:t>
+      </w:r>
+      <w:r>
+        <w:rPr>
+          <w:b/>
+        </w:rPr>
+        <w:t>"verkaufen sprich short Richtung muss aus dem Trading ebenfalls eine Zielzone haben welche dann umgekehrt funktioniert - also mathematisch deterministisch wie für die kauf - long positionen wie wir sie haben"</w:t>
+      </w:r>
+      <w:r>
+        <w:rPr>
+          <w:b w:val="0"/>
+        </w:rPr>
+        <w:t xml:space="preserve"> - identisches Muster wie bei Hebel-SHORT, nur auf Spot übertragen.</w:t>
+      </w:r>
+    </w:p>
+    <w:p>
+      <w:pPr>
+        <w:pStyle w:val="Heading4"/>
+      </w:pPr>
+      <w:r>
+        <w:t>Fünfteilige Umsetzung</w:t>
+      </w:r>
+    </w:p>
+    <w:p>
+      <w:pPr>
+        <w:pStyle w:val="ListBullet"/>
+      </w:pPr>
+      <w:r>
+        <w:rPr>
+          <w:b/>
+        </w:rPr>
+        <w:t>Regel 3 + Regel 16/13/12/11 (Zonen-Beispiel) gespiegelt</w:t>
+      </w:r>
+      <w:r>
+        <w:rPr>
+          <w:b w:val="0"/>
+        </w:rPr>
+        <w:t xml:space="preserve"> in </w:t>
+      </w:r>
+      <w:r>
+        <w:rPr>
+          <w:rFonts w:ascii="Consolas" w:hAnsi="Consolas"/>
+          <w:b w:val="0"/>
+        </w:rPr>
+        <w:t>agent/krypto/analyst.py</w:t>
+      </w:r>
+      <w:r>
+        <w:rPr>
+          <w:b w:val="0"/>
+        </w:rPr>
+        <w:t xml:space="preserve">, </w:t>
+      </w:r>
+      <w:r>
+        <w:rPr>
+          <w:rFonts w:ascii="Consolas" w:hAnsi="Consolas"/>
+          <w:b w:val="0"/>
+        </w:rPr>
+        <w:t>agent/aktien/analyst.py</w:t>
+      </w:r>
+      <w:r>
+        <w:rPr>
+          <w:b w:val="0"/>
+        </w:rPr>
+        <w:t xml:space="preserve">, </w:t>
+      </w:r>
+      <w:r>
+        <w:rPr>
+          <w:rFonts w:ascii="Consolas" w:hAnsi="Consolas"/>
+          <w:b w:val="0"/>
+        </w:rPr>
+        <w:t>agent/rohstoff/analyst.py</w:t>
+      </w:r>
+      <w:r>
+        <w:rPr>
+          <w:b w:val="0"/>
+        </w:rPr>
+        <w:t xml:space="preserve">, </w:t>
+      </w:r>
+      <w:r>
+        <w:rPr>
+          <w:rFonts w:ascii="Consolas" w:hAnsi="Consolas"/>
+          <w:b w:val="0"/>
+        </w:rPr>
+        <w:t>agent/themen_etf/analyst.py</w:t>
+      </w:r>
+      <w:r>
+        <w:rPr>
+          <w:b w:val="0"/>
+        </w:rPr>
+        <w:t xml:space="preserve"> (4 Dateien, NICHT Hedge - siehe Punkt 5): bei VERKAUFEN/TAUSCHEN ist Stop-Loss jetzt ebenfalls PFLICHT, CRV MUSS mindestens 2.0 betragen, gespiegelt gerechnet: </w:t>
+      </w:r>
+      <w:r>
+        <w:rPr>
+          <w:rFonts w:ascii="Consolas" w:hAnsi="Consolas"/>
+          <w:b w:val="0"/>
+        </w:rPr>
+        <w:t>(entry_mitte - take_profit.usd_bis) / (stop_loss.usd_bis - entry_mitte)</w:t>
+      </w:r>
+      <w:r>
+        <w:rPr>
+          <w:b w:val="0"/>
+        </w:rPr>
+        <w:t xml:space="preserve"> - Take-Profit-Zone muss vollständig UNTERHALB, Stop-Loss-Zone vollständig OBERHALB der Entry-Zone liegen. 2. </w:t>
+      </w:r>
+      <w:r>
+        <w:rPr>
+          <w:rFonts w:ascii="Consolas" w:hAnsi="Consolas"/>
+          <w:b/>
+        </w:rPr>
+        <w:t>agent/krypto/risk_gate.py::post_check()</w:t>
+      </w:r>
+      <w:r>
+        <w:rPr>
+          <w:b w:val="0"/>
+        </w:rPr>
+        <w:t xml:space="preserve">: neuer </w:t>
+      </w:r>
+      <w:r>
+        <w:rPr>
+          <w:rFonts w:ascii="Consolas" w:hAnsi="Consolas"/>
+          <w:b w:val="0"/>
+        </w:rPr>
+        <w:t>_SELL_ACTIONS</w:t>
+      </w:r>
+      <w:r>
+        <w:rPr>
+          <w:b w:val="0"/>
+        </w:rPr>
+        <w:t xml:space="preserve">-Block, identische Philosophie wie der bestehende </w:t>
+      </w:r>
+      <w:r>
+        <w:rPr>
+          <w:rFonts w:ascii="Consolas" w:hAnsi="Consolas"/>
+          <w:b w:val="0"/>
+        </w:rPr>
+        <w:t>_BUY_ACTIONS</w:t>
+      </w:r>
+      <w:r>
+        <w:rPr>
+          <w:b w:val="0"/>
+        </w:rPr>
+        <w:t xml:space="preserve">-CRV-Block, nur Zonen-Vorzeichen gedreht (konservativ: die jeweils NÄHERE Zonen-Grenze </w:t>
+      </w:r>
+      <w:r>
+        <w:rPr>
+          <w:rFonts w:ascii="Consolas" w:hAnsi="Consolas"/>
+          <w:b w:val="0"/>
+        </w:rPr>
+        <w:t>_bis</w:t>
+      </w:r>
+      <w:r>
+        <w:rPr>
+          <w:b w:val="0"/>
+        </w:rPr>
+        <w:t xml:space="preserve"> statt </w:t>
+      </w:r>
+      <w:r>
+        <w:rPr>
+          <w:rFonts w:ascii="Consolas" w:hAnsi="Consolas"/>
+          <w:b w:val="0"/>
+        </w:rPr>
+        <w:t>_von</w:t>
+      </w:r>
+      <w:r>
+        <w:rPr>
+          <w:b w:val="0"/>
+        </w:rPr>
+        <w:t xml:space="preserve">). </w:t>
+      </w:r>
+      <w:r>
+        <w:rPr>
+          <w:rFonts w:ascii="Consolas" w:hAnsi="Consolas"/>
+          <w:b w:val="0"/>
+        </w:rPr>
+        <w:t>crv is None</w:t>
+      </w:r>
+      <w:r>
+        <w:rPr>
+          <w:b w:val="0"/>
+        </w:rPr>
+        <w:t xml:space="preserve"> (z.B. Zonen falsch orientiert) fällt automatisch unter denselben Veto-auf-HALTEN-Zweig - keine separate Richtungsprüfung nötig, die Mathematik erzwingt sie implizit. Gilt für alle 4 Pipelines, die </w:t>
+      </w:r>
+      <w:r>
+        <w:rPr>
+          <w:rFonts w:ascii="Consolas" w:hAnsi="Consolas"/>
+          <w:b w:val="0"/>
+        </w:rPr>
+        <w:t>post_check()</w:t>
+      </w:r>
+      <w:r>
+        <w:rPr>
+          <w:b w:val="0"/>
+        </w:rPr>
+        <w:t xml:space="preserve"> teilen (Aktien/Rohstoffe/Themen-ETF reuse identisch, siehe deren Pipeline-Docstrings). 3. </w:t>
+      </w:r>
+      <w:r>
+        <w:rPr>
+          <w:rFonts w:ascii="Consolas" w:hAnsi="Consolas"/>
+          <w:b/>
+        </w:rPr>
+        <w:t>agent/krypto/backward_tracking.py::check_signal_outcome()</w:t>
+      </w:r>
+      <w:r>
+        <w:rPr>
+          <w:b w:val="0"/>
+        </w:rPr>
+        <w:t xml:space="preserve"> komplett überarbeitet: neue </w:t>
+      </w:r>
+      <w:r>
+        <w:rPr>
+          <w:rFonts w:ascii="Consolas" w:hAnsi="Consolas"/>
+          <w:b w:val="0"/>
+        </w:rPr>
+        <w:t>ist_short</w:t>
+      </w:r>
+      <w:r>
+        <w:rPr>
+          <w:b w:val="0"/>
+        </w:rPr>
+        <w:t xml:space="preserve">-Verzweigung (via </w:t>
+      </w:r>
+      <w:r>
+        <w:rPr>
+          <w:rFonts w:ascii="Consolas" w:hAnsi="Consolas"/>
+          <w:b w:val="0"/>
+        </w:rPr>
+        <w:t>agent.krypto.gegenpruefung.richtung_aus_action()</w:t>
+      </w:r>
+      <w:r>
+        <w:rPr>
+          <w:b w:val="0"/>
+        </w:rPr>
+        <w:t xml:space="preserve">, da </w:t>
+      </w:r>
+      <w:r>
+        <w:rPr>
+          <w:rFonts w:ascii="Consolas" w:hAnsi="Consolas"/>
+          <w:b w:val="0"/>
+        </w:rPr>
+        <w:t>Signal</w:t>
+      </w:r>
+      <w:r>
+        <w:rPr>
+          <w:b w:val="0"/>
+        </w:rPr>
+        <w:t xml:space="preserve"> - anders als </w:t>
+      </w:r>
+      <w:r>
+        <w:rPr>
+          <w:rFonts w:ascii="Consolas" w:hAnsi="Consolas"/>
+          <w:b w:val="0"/>
+        </w:rPr>
+        <w:t>HebelSignal</w:t>
+      </w:r>
+      <w:r>
+        <w:rPr>
+          <w:b w:val="0"/>
+        </w:rPr>
+        <w:t xml:space="preserve"> - kein natives </w:t>
+      </w:r>
+      <w:r>
+        <w:rPr>
+          <w:rFonts w:ascii="Consolas" w:hAnsi="Consolas"/>
+          <w:b w:val="0"/>
+        </w:rPr>
+        <w:t>richtung</w:t>
+      </w:r>
+      <w:r>
+        <w:rPr>
+          <w:b w:val="0"/>
+        </w:rPr>
+        <w:t>-Feld hat), spiegelt TP/SL- Treffer-Logik UND die MFE-Berechnung (</w:t>
+      </w:r>
+      <w:r>
+        <w:rPr>
+          <w:rFonts w:ascii="Consolas" w:hAnsi="Consolas"/>
+          <w:b w:val="0"/>
+        </w:rPr>
+        <w:t>_erfasse_mfe()</w:t>
+      </w:r>
+      <w:r>
+        <w:rPr>
+          <w:b w:val="0"/>
+        </w:rPr>
+        <w:t xml:space="preserve">) - direkter Mirror von </w:t>
+      </w:r>
+      <w:r>
+        <w:rPr>
+          <w:rFonts w:ascii="Consolas" w:hAnsi="Consolas"/>
+          <w:b w:val="0"/>
+        </w:rPr>
+        <w:t>hebel_backward_tracking.py::check_hebel_signal_outcome()</w:t>
+      </w:r>
+      <w:r>
+        <w:rPr>
+          <w:b w:val="0"/>
+        </w:rPr>
+        <w:t xml:space="preserve">s bereits bewährter SHORT-Logik. </w:t>
+      </w:r>
+      <w:r>
+        <w:rPr>
+          <w:rFonts w:ascii="Consolas" w:hAnsi="Consolas"/>
+          <w:b w:val="0"/>
+        </w:rPr>
+        <w:t>_TRACKABLE_ACTIONS</w:t>
+      </w:r>
+      <w:r>
+        <w:rPr>
+          <w:b w:val="0"/>
+        </w:rPr>
+        <w:t xml:space="preserve"> um </w:t>
+      </w:r>
+      <w:r>
+        <w:rPr>
+          <w:rFonts w:ascii="Consolas" w:hAnsi="Consolas"/>
+          <w:b w:val="0"/>
+        </w:rPr>
+        <w:t>VERKAUFEN</w:t>
+      </w:r>
+      <w:r>
+        <w:rPr>
+          <w:b w:val="0"/>
+        </w:rPr>
+        <w:t>/</w:t>
+      </w:r>
+      <w:r>
+        <w:rPr>
+          <w:rFonts w:ascii="Consolas" w:hAnsi="Consolas"/>
+          <w:b w:val="0"/>
+        </w:rPr>
+        <w:t>TAUSCHEN</w:t>
+      </w:r>
+      <w:r>
+        <w:rPr>
+          <w:b w:val="0"/>
+        </w:rPr>
+        <w:t xml:space="preserve"> erweitert (vorher nur </w:t>
+      </w:r>
+      <w:r>
+        <w:rPr>
+          <w:rFonts w:ascii="Consolas" w:hAnsi="Consolas"/>
+          <w:b w:val="0"/>
+        </w:rPr>
+        <w:t>KAUFEN</w:t>
+      </w:r>
+      <w:r>
+        <w:rPr>
+          <w:b w:val="0"/>
+        </w:rPr>
+        <w:t>/</w:t>
+      </w:r>
+      <w:r>
+        <w:rPr>
+          <w:rFonts w:ascii="Consolas" w:hAnsi="Consolas"/>
+          <w:b w:val="0"/>
+        </w:rPr>
+        <w:t>NACHKAUFEN</w:t>
+      </w:r>
+      <w:r>
+        <w:rPr>
+          <w:b w:val="0"/>
+        </w:rPr>
+        <w:t>). Hedge-Invertierung (</w:t>
+      </w:r>
+      <w:r>
+        <w:rPr>
+          <w:rFonts w:ascii="Consolas" w:hAnsi="Consolas"/>
+          <w:b w:val="0"/>
+        </w:rPr>
+        <w:t>ist_hedge_invertiert</w:t>
+      </w:r>
+      <w:r>
+        <w:rPr>
+          <w:b w:val="0"/>
+        </w:rPr>
+        <w:t xml:space="preserve">) ist hier NICHT relevant - die Zonen beschreiben immer die Kursbewegung des Instruments selbst, nicht die Gesamtmarkt- Interpretation (unabhängig von Punkt 5 unten). 4. </w:t>
+      </w:r>
+      <w:r>
+        <w:rPr>
+          <w:rFonts w:ascii="Consolas" w:hAnsi="Consolas"/>
+          <w:b/>
+        </w:rPr>
+        <w:t>agent/krypto/pipeline.py</w:t>
+      </w:r>
+      <w:r>
+        <w:rPr>
+          <w:b w:val="0"/>
+        </w:rPr>
+        <w:t xml:space="preserve">: </w:t>
+      </w:r>
+      <w:r>
+        <w:rPr>
+          <w:rFonts w:ascii="Consolas" w:hAnsi="Consolas"/>
+          <w:b w:val="0"/>
+        </w:rPr>
+        <w:t>mindestziel_preis()</w:t>
+      </w:r>
+      <w:r>
+        <w:rPr>
+          <w:b w:val="0"/>
+        </w:rPr>
+        <w:t xml:space="preserve">-Aufruf korrigiert - </w:t>
+      </w:r>
+      <w:r>
+        <w:rPr>
+          <w:rFonts w:ascii="Consolas" w:hAnsi="Consolas"/>
+          <w:b w:val="0"/>
+        </w:rPr>
+        <w:t>ist_short</w:t>
+      </w:r>
+      <w:r>
+        <w:rPr>
+          <w:b w:val="0"/>
+        </w:rPr>
+        <w:t xml:space="preserve"> wird jetzt aus </w:t>
+      </w:r>
+      <w:r>
+        <w:rPr>
+          <w:rFonts w:ascii="Consolas" w:hAnsi="Consolas"/>
+          <w:b w:val="0"/>
+        </w:rPr>
+        <w:t>richtung_aus_action()</w:t>
+      </w:r>
+      <w:r>
+        <w:rPr>
+          <w:b w:val="0"/>
+        </w:rPr>
+        <w:t xml:space="preserve"> abgeleitet, </w:t>
+      </w:r>
+      <w:r>
+        <w:rPr>
+          <w:rFonts w:ascii="Consolas" w:hAnsi="Consolas"/>
+          <w:b w:val="0"/>
+        </w:rPr>
+        <w:t>risiko_ distanz</w:t>
+      </w:r>
+      <w:r>
+        <w:rPr>
+          <w:b w:val="0"/>
+        </w:rPr>
+        <w:t xml:space="preserve"> entsprechend gespiegelt berechnet (vorher immer LONG-Annahme, hätte bei VERKAUFEN eine negative/falsche Distanz ergeben und </w:t>
+      </w:r>
+      <w:r>
+        <w:rPr>
+          <w:rFonts w:ascii="Consolas" w:hAnsi="Consolas"/>
+          <w:b w:val="0"/>
+        </w:rPr>
+        <w:t>None</w:t>
+      </w:r>
+      <w:r>
+        <w:rPr>
+          <w:b w:val="0"/>
+        </w:rPr>
+        <w:t xml:space="preserve"> geliefert). 5. </w:t>
+      </w:r>
+      <w:r>
+        <w:rPr>
+          <w:b/>
+        </w:rPr>
+        <w:t>Hedge bewusst AUSGENOMMEN</w:t>
+      </w:r>
+      <w:r>
+        <w:rPr>
+          <w:b w:val="0"/>
+        </w:rPr>
+        <w:t xml:space="preserve">: </w:t>
+      </w:r>
+      <w:r>
+        <w:rPr>
+          <w:rFonts w:ascii="Consolas" w:hAnsi="Consolas"/>
+          <w:b w:val="0"/>
+        </w:rPr>
+        <w:t>agent/hedge/analyst.py</w:t>
+      </w:r>
+      <w:r>
+        <w:rPr>
+          <w:b w:val="0"/>
+        </w:rPr>
+        <w:t xml:space="preserve"> hat laut eigener Regel 9 explizit KEINE CRV-Pflicht ("die Zonen sind informativer Kontext, keine harte Kauf-Voraussetzung") - das gilt unverändert für BEIDE Richtungen, kein neues Ungleichgewicht. </w:t>
+      </w:r>
+      <w:r>
+        <w:rPr>
+          <w:rFonts w:ascii="Consolas" w:hAnsi="Consolas"/>
+          <w:b w:val="0"/>
+        </w:rPr>
+        <w:t>agent/hedge/pipeline.py</w:t>
+      </w:r>
+      <w:r>
+        <w:rPr>
+          <w:b w:val="0"/>
+        </w:rPr>
+        <w:t xml:space="preserve"> ruft </w:t>
+      </w:r>
+      <w:r>
+        <w:rPr>
+          <w:rFonts w:ascii="Consolas" w:hAnsi="Consolas"/>
+          <w:b w:val="0"/>
+        </w:rPr>
+        <w:t>risk_gate.py::post_check()</w:t>
+      </w:r>
+      <w:r>
+        <w:rPr>
+          <w:b w:val="0"/>
+        </w:rPr>
+        <w:t xml:space="preserve"> ohnehin nicht auf (eigener Deterministik- Deckel). Hedge-VERKAUFEN-Signale werden trotzdem automatisch mitgetrackt, wenn ihre Zonen zufällig korrekt orientiert sind (</w:t>
+      </w:r>
+      <w:r>
+        <w:rPr>
+          <w:rFonts w:ascii="Consolas" w:hAnsi="Consolas"/>
+          <w:b w:val="0"/>
+        </w:rPr>
+        <w:t>check_signal_outcome()</w:t>
+      </w:r>
+      <w:r>
+        <w:rPr>
+          <w:b w:val="0"/>
+        </w:rPr>
+        <w:t xml:space="preserve"> ist pipeline-agnostisch) - nur ohne die erzwungene Garantie. 6. </w:t>
+      </w:r>
+      <w:r>
+        <w:rPr>
+          <w:rFonts w:ascii="Consolas" w:hAnsi="Consolas"/>
+          <w:b/>
+        </w:rPr>
+        <w:t>database/models.py</w:t>
+      </w:r>
+      <w:r>
+        <w:rPr>
+          <w:b w:val="0"/>
+        </w:rPr>
+        <w:t xml:space="preserve">: Docstring von </w:t>
+      </w:r>
+      <w:r>
+        <w:rPr>
+          <w:rFonts w:ascii="Consolas" w:hAnsi="Consolas"/>
+          <w:b w:val="0"/>
+        </w:rPr>
+        <w:t>outcome_max_realisiertes_crv</w:t>
+      </w:r>
+      <w:r>
+        <w:rPr>
+          <w:b w:val="0"/>
+        </w:rPr>
+        <w:t xml:space="preserve"> korrigiert (war "richtungsunabhängig für Spot immer 'steigend'" - inzwischen unwahr).</w:t>
+      </w:r>
+    </w:p>
+    <w:p>
+      <w:r>
+        <w:rPr>
+          <w:b/>
+        </w:rPr>
+        <w:t>Wichtige Konsequenz, die dem Nutzer bewusst ist:</w:t>
+      </w:r>
+      <w:r>
+        <w:rPr>
+          <w:b w:val="0"/>
+        </w:rPr>
+        <w:t xml:space="preserve"> die Formel oben verhält sich bei VERKAUFEN GENAUSO streng wie bei KAUFEN - eine VERKAUFEN-Empfehlung mit schlecht orientierten oder zu engen Zonen wird jetzt EBENFALLS auf HALTEN korrigiert, auch wenn die zugrunde liegende fundamentale These (Regel 7: langfristige These gebrochen) berechtigt wäre. Das ist eine bewusste Design-Entscheidung des Nutzers (mathematische Parität zu KAUFEN), keine versehentliche Nebenwirkung - wird beobachtet, ob das in der Praxis zu unerwünschten Vetos führt.</w:t>
+      </w:r>
+    </w:p>
+    <w:p>
+      <w:r>
+        <w:rPr>
+          <w:b/>
+        </w:rPr>
+        <w:t>Bekannte, unveränderte Lücke:</w:t>
+      </w:r>
+      <w:r>
+        <w:rPr>
+          <w:b w:val="0"/>
+        </w:rPr>
+        <w:t xml:space="preserve"> bereits bestehende VERKAUFEN/TAUSCHEN- Signale in der Produktions-DB (vor diesem Fix erzeugt) profitieren NICHT rückwirkend - ihre Zonen wurden ohne die neue Richtungs-Garantie erstellt und könnten falsch orientiert sein. Nur Signale NACH diesem Fix sind verlässlich trackbar.</w:t>
+      </w:r>
+    </w:p>
+    <w:p>
+      <w:r>
+        <w:rPr>
+          <w:b/>
+        </w:rPr>
+        <w:t>Verifiziert:</w:t>
+      </w:r>
+      <w:r>
+        <w:rPr>
+          <w:b w:val="0"/>
+        </w:rPr>
+        <w:t xml:space="preserve"> 15 synthetische Fälle (</w:t>
+      </w:r>
+      <w:r>
+        <w:rPr>
+          <w:rFonts w:ascii="Consolas" w:hAnsi="Consolas"/>
+          <w:b w:val="0"/>
+        </w:rPr>
+        <w:t>check_signal_outcome()</w:t>
+      </w:r>
+      <w:r>
+        <w:rPr>
+          <w:b w:val="0"/>
+        </w:rPr>
+        <w:t xml:space="preserve"> LONG- Regression, VERKAUFEN Take-Profit/Stop-Loss/MFE-ohne-Treffer, TAUSCHEN identisch zu VERKAUFEN, HALTEN weiterhin nicht trackbar, </w:t>
+      </w:r>
+      <w:r>
+        <w:rPr>
+          <w:rFonts w:ascii="Consolas" w:hAnsi="Consolas"/>
+          <w:b w:val="0"/>
+        </w:rPr>
+        <w:t>mindestziel_preis(ist_short=True)</w:t>
+      </w:r>
+      <w:r>
+        <w:rPr>
+          <w:b w:val="0"/>
+        </w:rPr>
+        <w:t xml:space="preserve"> gespiegelt, </w:t>
+      </w:r>
+      <w:r>
+        <w:rPr>
+          <w:rFonts w:ascii="Consolas" w:hAnsi="Consolas"/>
+          <w:b w:val="0"/>
+        </w:rPr>
+        <w:t>risk_gate.py::post_check()</w:t>
+      </w:r>
+      <w:r>
+        <w:rPr>
+          <w:b w:val="0"/>
+        </w:rPr>
+        <w:t xml:space="preserve"> CRV-Veto für VERKAUFEN/TAUSCHEN bei gutem/schlechtem CRV) - alle bestanden. Vollständiger Import-Regressionscheck über alle 4 geänderten Analyst-Dateien + </w:t>
+      </w:r>
+      <w:r>
+        <w:rPr>
+          <w:rFonts w:ascii="Consolas" w:hAnsi="Consolas"/>
+          <w:b w:val="0"/>
+        </w:rPr>
+        <w:t>risk_gate.py</w:t>
+      </w:r>
+      <w:r>
+        <w:rPr>
+          <w:b w:val="0"/>
+        </w:rPr>
+        <w:t xml:space="preserve"> + </w:t>
+      </w:r>
+      <w:r>
+        <w:rPr>
+          <w:rFonts w:ascii="Consolas" w:hAnsi="Consolas"/>
+          <w:b w:val="0"/>
+        </w:rPr>
+        <w:t>backward_tracking.py</w:t>
+      </w:r>
+      <w:r>
+        <w:rPr>
+          <w:b w:val="0"/>
+        </w:rPr>
+        <w:t xml:space="preserve"> + alle 5 Spot-family-Pipelines + </w:t>
+      </w:r>
+      <w:r>
+        <w:rPr>
+          <w:rFonts w:ascii="Consolas" w:hAnsi="Consolas"/>
+          <w:b w:val="0"/>
+        </w:rPr>
+        <w:t>scheduler/background.py</w:t>
+      </w:r>
+      <w:r>
+        <w:rPr>
+          <w:b w:val="0"/>
+        </w:rPr>
+        <w:t xml:space="preserve"> ohne Fehler.</w:t>
+      </w:r>
+    </w:p>
+    <w:p>
+      <w:r>
+        <w:rPr>
+          <w:b/>
+        </w:rPr>
+        <w:t>Automatischer Nebeneffekt, kein zusätzlicher Code nötig:</w:t>
+      </w:r>
+      <w:r>
+        <w:rPr>
+          <w:b w:val="0"/>
+        </w:rPr>
+        <w:t xml:space="preserve"> sowohl </w:t>
+      </w:r>
+      <w:r>
+        <w:rPr>
+          <w:rFonts w:ascii="Consolas" w:hAnsi="Consolas"/>
+          <w:b w:val="0"/>
+        </w:rPr>
+        <w:t>compute_provider_performance()</w:t>
+      </w:r>
+      <w:r>
+        <w:rPr>
+          <w:b w:val="0"/>
+        </w:rPr>
+        <w:t>/</w:t>
+      </w:r>
+      <w:r>
+        <w:rPr>
+          <w:rFonts w:ascii="Consolas" w:hAnsi="Consolas"/>
+          <w:b w:val="0"/>
+        </w:rPr>
+        <w:t>compute_win_rate_fact()</w:t>
+      </w:r>
+      <w:r>
+        <w:rPr>
+          <w:b w:val="0"/>
+        </w:rPr>
+        <w:t xml:space="preserve">/ </w:t>
+      </w:r>
+      <w:r>
+        <w:rPr>
+          <w:rFonts w:ascii="Consolas" w:hAnsi="Consolas"/>
+          <w:b w:val="0"/>
+        </w:rPr>
+        <w:t>compute_richtungstreffer_quote()</w:t>
+      </w:r>
+      <w:r>
+        <w:rPr>
+          <w:b w:val="0"/>
+        </w:rPr>
+        <w:t xml:space="preserve"> (Mistral) als auch </w:t>
+      </w:r>
+      <w:r>
+        <w:rPr>
+          <w:rFonts w:ascii="Consolas" w:hAnsi="Consolas"/>
+          <w:b w:val="0"/>
+        </w:rPr>
+        <w:t>compute_zai_richtung_performance()</w:t>
+      </w:r>
+      <w:r>
+        <w:rPr>
+          <w:b w:val="0"/>
+        </w:rPr>
+        <w:t xml:space="preserve"> (Z.ai, siehe vorheriger Nachtrag) lesen bereits aus denselben </w:t>
+      </w:r>
+      <w:r>
+        <w:rPr>
+          <w:rFonts w:ascii="Consolas" w:hAnsi="Consolas"/>
+          <w:b w:val="0"/>
+        </w:rPr>
+        <w:t>outcome_status</w:t>
+      </w:r>
+      <w:r>
+        <w:rPr>
+          <w:b w:val="0"/>
+        </w:rPr>
+        <w:t>/</w:t>
+      </w:r>
+      <w:r>
+        <w:rPr>
+          <w:rFonts w:ascii="Consolas" w:hAnsi="Consolas"/>
+          <w:b w:val="0"/>
+        </w:rPr>
+        <w:t>outcome_max_realisiertes_crv</w:t>
+      </w:r>
+      <w:r>
+        <w:rPr>
+          <w:b w:val="0"/>
+        </w:rPr>
+        <w:t>- Feldern - sobald neue VERKAUFEN/TAUSCHEN-Signale nach diesem Fix aufgelöst werden, erscheinen sie automatisch in allen bestehenden Auswertungskarten, ohne dass diese selbst angepasst werden mussten.</w:t>
+      </w:r>
+    </w:p>
+    <w:p>
+      <w:r>
+        <w:rPr>
+          <w:b/>
+        </w:rPr>
+        <w:t>Noch NICHT committet</w:t>
+      </w:r>
+      <w:r>
+        <w:rPr>
+          <w:b w:val="0"/>
+        </w:rPr>
+        <w:t xml:space="preserve"> - wartet auf Nutzer-Bestätigung.</w:t>
       </w:r>
     </w:p>
     <w:sectPr>

</xml_diff>

<commit_message>
Doku-Status auf Stufe 3 (committet/gepusht) nachziehen
Fakten_Entscheidungsmappe.md und Regelwerksmanual.md/.docx nannten die
Hebel-FOMC/CPI-Regel noch als "verifiziert, nicht committet" - war seit
7eac0ec ueberholt. Reine Statuskorrektur, kein Code betroffen.

Co-Authored-By: Claude Sonnet 5 <noreply@anthropic.com>
</commit_message>
<xml_diff>
--- a/Basisinfos/Regelwerksmanual.docx
+++ b/Basisinfos/Regelwerksmanual.docx
@@ -20686,13 +20686,23 @@
         <w:rPr>
           <w:b/>
         </w:rPr>
-        <w:t>Noch NICHT committet</w:t>
-      </w:r>
-      <w:r>
-        <w:rPr>
-          <w:b w:val="0"/>
-        </w:rPr>
-        <w:t xml:space="preserve"> - wartet auf Nutzer-Bestätigung.</w:t>
+        <w:t xml:space="preserve">Ergaenzung noch am selben Tag: </w:t>
+      </w:r>
+      <w:r>
+        <w:t>drittes Referenzdokument Basisinfos/Test_und_Verifikationsmethodik.md - Ausloeser war eine Nutzer-Rueckfrage ("was meinst du mit umgesetzt?"), die aufdeckte, dass der Status "erledigt" ohne feste Bedeutung missverstaendlich ist. Enthaelt ein 5-Stufen-Statusvokabular (Geschrieben/Verifiziert/Committet/Deployed/Im Betrieb bestaetigt - ab jetzt IMMER die konkrete Stufe nennen statt "erledigt"), 4 Aenderungsklassen mit Mindest-Testtiefe fuer synthetische Tests, sowie einen festen 8-Punkte-Kennzahlenkatalog fuer Notebook-Export-Analysen inkl. Vorher-Hypothese-Prinzip (vor jeder Verhaltensbeobachtung im Betrieb festhalten, was erwartet wird, statt die Beobachtung nachtraeglich passend zu interpretieren).</w:t>
+      </w:r>
+    </w:p>
+    <w:p>
+      <w:r>
+        <w:rPr>
+          <w:b/>
+        </w:rPr>
+        <w:t>Committet und gepusht (7eac0ec) - Stufe 3 des in diesem Nachtrag selbst eingefuehrten Statusvokabulars.</w:t>
+      </w:r>
+      <w:r>
+        <w:rPr>
+          <w:b w:val="0"/>
+        </w:rPr>
       </w:r>
     </w:p>
     <w:sectPr>

</xml_diff>

<commit_message>
Fear&Greed-Regel fuer Spot (Regel 29) + Z.ai-Fallback-Korrektur dokumentiert
Neue asymmetrische Fear&Greed-Regel in agent/krypto/analyst.py (extreme Angst
nur unterstuetzend + an zyklus_risiko gekoppelt, extreme Gier staerker
gewichtbar) - deckt den bisher toten regime.fear_greed-Fakt ab. Bewusst nur
Spot; Hebel-Variante wurde als Zeithorizont-Fehlpassung geprueft und verworfen
(dokumentiert in Fakten_Entscheidungsmappe.md).

Regelwerksmanual + Fakten_Entscheidungsmappe zusaetzlich um die Korrektur der
LLM-Fallback-Kette ergaenzt: Z.ai ist seit dem Gegenpruefungs-Umbau (26.07.)
kein Fallback fuer die Haupt-Signalgenerierung mehr (nur noch Mistral->Gemini),
sondern laeuft ausschliesslich als separate Gegenpruefung.

Co-Authored-By: Claude Sonnet 5 <noreply@anthropic.com>
</commit_message>
<xml_diff>
--- a/Basisinfos/Regelwerksmanual.docx
+++ b/Basisinfos/Regelwerksmanual.docx
@@ -20703,6 +20703,149 @@
         <w:rPr>
           <w:b w:val="0"/>
         </w:rPr>
+      </w:r>
+    </w:p>
+    <w:p>
+      <w:r>
+        <w:rPr>
+          <w:b/>
+        </w:rPr>
+        <w:t>Ergaenzung (2026-07-28, Punkt 2 der Prioritaetenliste): Fear&amp;Greed-Index.</w:t>
+      </w:r>
+      <w:r>
+        <w:t xml:space="preserve"> </w:t>
+      </w:r>
+      <w:r>
+        <w:rPr>
+          <w:rFonts w:ascii="Consolas" w:hAnsi="Consolas"/>
+        </w:rPr>
+        <w:t>regime.fear_greed.wert</w:t>
+      </w:r>
+      <w:r>
+        <w:t>/</w:t>
+      </w:r>
+      <w:r>
+        <w:rPr>
+          <w:rFonts w:ascii="Consolas" w:hAnsi="Consolas"/>
+        </w:rPr>
+        <w:t>einstufung</w:t>
+      </w:r>
+      <w:r>
+        <w:t xml:space="preserve"> war ein komplett toter Fakt (an </w:t>
+      </w:r>
+      <w:r>
+        <w:rPr>
+          <w:rFonts w:ascii="Consolas" w:hAnsi="Consolas"/>
+        </w:rPr>
+        <w:t>build_facts()</w:t>
+      </w:r>
+      <w:r>
+        <w:t xml:space="preserve"> geliefert, aber ohne Prompt-Regel bei Spot, ganz ohne Fakt-Uebergabe bei Hebel). Neue Regel 29 in </w:t>
+      </w:r>
+      <w:r>
+        <w:rPr>
+          <w:rFonts w:ascii="Consolas" w:hAnsi="Consolas"/>
+        </w:rPr>
+        <w:t>agent/krypto/analyst.py:: SYSTEM_PROMPT</w:t>
+      </w:r>
+      <w:r>
+        <w:t xml:space="preserve"> (vorherige Regel 29 "eigene_einschaetzung" zu Regel 30 verschoben, 3 Kreuzverweise korrigiert). Nutzer-Praezisierung machte die Regel bewusst ASYMMETRISCH statt eines einfachen Kontraindikators: im Baerenmarkt sind Angstphasen langanhaltend und alleine kein verlaesslicher Bodenindikator (Bodenbildung braucht zusaetzliche Bestaetigung, z.B. niedriges </w:t>
+      </w:r>
+      <w:r>
+        <w:rPr>
+          <w:rFonts w:ascii="Consolas" w:hAnsi="Consolas"/>
+        </w:rPr>
+        <w:t>zyklus_risiko</w:t>
+      </w:r>
+      <w:r>
+        <w:t xml:space="preserve">), waehrend Gier-Extreme historisch kuerzer und als Warnsignal fuer lokale Uebertreibung brauchbarer sind - darf staerker gewichtet werden, vor allem kombiniert mit hohem </w:t>
+      </w:r>
+      <w:r>
+        <w:rPr>
+          <w:rFonts w:ascii="Consolas" w:hAnsi="Consolas"/>
+        </w:rPr>
+        <w:t>zyklus_risiko</w:t>
+      </w:r>
+      <w:r>
+        <w:t>. Passt zum Grundsatz "Kontext liefern, Urteil nicht vorwegnehmen" und zur Zeithorizont-Frage (Spot = langfristige Zyklus-These).</w:t>
+      </w:r>
+    </w:p>
+    <w:p>
+      <w:r>
+        <w:rPr>
+          <w:b/>
+        </w:rPr>
+        <w:t>Bewusst NUR Spot, nicht Hebel (verworfene Variante B):</w:t>
+      </w:r>
+      <w:r>
+        <w:t xml:space="preserve"> eine analoge Hebel-Regel wurde geprueft und explizit NICHT umgesetzt (Muster siehe feedback_document_rejected_options) - die fuer Fear&amp;Greed relevante Unterscheidung Baerenmarkt-Angstphase-vs-Hype-Phase ist eine mehrwoechige/mehrmonatige Marktstruktur-Frage, unpassend fuer die typische Hebel-Haltedauer von Stunden bis wenigen Tagen (Zeithorizont-Fehlpassung, identisches Muster wie beim </w:t>
+      </w:r>
+      <w:r>
+        <w:rPr>
+          <w:rFonts w:ascii="Consolas" w:hAnsi="Consolas"/>
+        </w:rPr>
+        <w:t>historischer_makro_vergleich</w:t>
+      </w:r>
+      <w:r>
+        <w:t xml:space="preserve">-Befund, siehe Punkt 5 der Prioritaetenliste). Nutzer-Einschaetzung: "hier ist weniger mehr". Revisit-Bedingung: nur falls ein Backtest gegen echte </w:t>
+      </w:r>
+      <w:r>
+        <w:rPr>
+          <w:rFonts w:ascii="Consolas" w:hAnsi="Consolas"/>
+        </w:rPr>
+        <w:t>hebel_signals</w:t>
+      </w:r>
+      <w:r>
+        <w:t xml:space="preserve">-Outcomes einen eigenstaendigen Tages-Signalwert belegt - dann eigener neuer Fakt, keine Kopie von Regel 29. Vollstaendig dokumentiert in </w:t>
+      </w:r>
+      <w:r>
+        <w:rPr>
+          <w:rFonts w:ascii="Consolas" w:hAnsi="Consolas"/>
+        </w:rPr>
+        <w:t>Fakten_Entscheidungsmappe.md</w:t>
+      </w:r>
+      <w:r>
+        <w:t xml:space="preserve"> Abschnitt 5, Punkt 2.</w:t>
+      </w:r>
+    </w:p>
+    <w:p>
+      <w:r>
+        <w:rPr>
+          <w:b/>
+        </w:rPr>
+        <w:t>Token-Budget-Pruefung (Nutzer-Vorgabe, ab jetzt Standard fuer jede Regeländerung):</w:t>
+      </w:r>
+      <w:r>
+        <w:t xml:space="preserve"> Regel 29 ist mit ca. 150 Token ein vernachlaessigbarer Zuwachs. Wichtiger: waehrend dieser Pruefung stellte sich heraus, dass eine in dieser Sitzung zunaechst herangezogene Sorge - Z.ais 8K-Kontext-Drosselung koennte durch SYSTEM_PROMPT-Wachstum verschaerft werden - auf einer veralteten Memory-Notiz beruhte (Stand 2026-07-20, 4-stufige Kette Mistral-&gt;Groq-&gt;Gemini-&gt;Z.ai). Nutzer-Korrektur: "ZAI ist kein fallback mehr hat andere anwendung gefunden". Code-Verifikation (agent/krypto/ budget_allocator.py-Docstring + grep nach _client is not None) bestaetigt: die tatsaechliche Haupt-Fallback-Kette fuer Signal-Generierung ist seit dem Gegenpruefungs-Umbau (2026-07-26) nur noch </w:t>
+      </w:r>
+      <w:r>
+        <w:rPr>
+          <w:b/>
+        </w:rPr>
+        <w:t>Mistral -&gt; Gemini</w:t>
+      </w:r>
+      <w:r>
+        <w:t xml:space="preserve"> (kein Groq, kein Z.ai mehr). Z.ai laeuft seitdem ausschliesslich als separate Gegenpruefung mit eigenem schlanken Fakten-Satz und sieht den Haupt-SYSTEM_PROMPT nie - die urspruengliche Sorge war damit gegenstandslos, aus dem richtigen aktuellen Grund. </w:t>
+      </w:r>
+      <w:r>
+        <w:rPr>
+          <w:rFonts w:ascii="Consolas" w:hAnsi="Consolas"/>
+        </w:rPr>
+        <w:t>reference_llm_provider_recherche_ uebersicht.md</w:t>
+      </w:r>
+      <w:r>
+        <w:t xml:space="preserve"> entsprechend korrigiert (alte 4-stufige Kette als "historischer Stand" markiert, neue Kette + Einordnung fuer Prompt-Laengen-Diskussionen ergaenzt).</w:t>
+      </w:r>
+    </w:p>
+    <w:p>
+      <w:r>
+        <w:rPr>
+          <w:b/>
+        </w:rPr>
+        <w:t>Verifiziert:</w:t>
+      </w:r>
+      <w:r>
+        <w:t xml:space="preserve"> Modul-Import, Compile-Check, durchgaengige Regelnummerierung 1-30 ohne Luecke geprueft (Klasse 1).</w:t>
       </w:r>
     </w:p>
     <w:sectPr>

</xml_diff>

<commit_message>
Regime-Gewichtungsschema (regime_profil.gewicht_*) fuer Spot+Hebel nutzbar gemacht
Neue Prompt-Regel in agent/krypto/analyst.py (Regel 30) und
agent/krypto/hebel_analyst.py (Regel 23): das bereits vorhandene, aber bisher
komplett ungenutzte regimeabhaengige Gewichtungsschema (Technik/Fundamental/
Momentum/Makro je Marktregime, aus config.yaml) dient der KI ab jetzt als
Orientierung fuer die Schwerpunktsetzung in long_reasoning/top_gruende -
keine starre Formel, die eigene fachliche Einschaetzung bleibt massgeblich.

Bewusst fuer beide Pipelines identisch (anders als die Fear&Greed-Regel):
die Frage, welche Analyse-Linse im aktuellen Regime verlaesslicher ist, gilt
auch kurzfristig fuer Hebel-Trades.

Co-Authored-By: Claude Sonnet 5 <noreply@anthropic.com>
</commit_message>
<xml_diff>
--- a/Basisinfos/Regelwerksmanual.docx
+++ b/Basisinfos/Regelwerksmanual.docx
@@ -20846,6 +20846,143 @@
       </w:r>
       <w:r>
         <w:t xml:space="preserve"> Modul-Import, Compile-Check, durchgaengige Regelnummerierung 1-30 ohne Luecke geprueft (Klasse 1).</w:t>
+      </w:r>
+    </w:p>
+    <w:p>
+      <w:r>
+        <w:rPr>
+          <w:b/>
+        </w:rPr>
+        <w:t>Ergaenzung (2026-07-28, Punkt 3 der Prioritaetenliste): regime_profil. gewicht_*.</w:t>
+      </w:r>
+      <w:r>
+        <w:t xml:space="preserve"> </w:t>
+      </w:r>
+      <w:r>
+        <w:rPr>
+          <w:rFonts w:ascii="Consolas" w:hAnsi="Consolas"/>
+        </w:rPr>
+        <w:t>regime_profil.gewicht_technik</w:t>
+      </w:r>
+      <w:r>
+        <w:t>/</w:t>
+      </w:r>
+      <w:r>
+        <w:rPr>
+          <w:rFonts w:ascii="Consolas" w:hAnsi="Consolas"/>
+        </w:rPr>
+        <w:t>gewicht_fundamental</w:t>
+      </w:r>
+      <w:r>
+        <w:t xml:space="preserve">/ </w:t>
+      </w:r>
+      <w:r>
+        <w:rPr>
+          <w:rFonts w:ascii="Consolas" w:hAnsi="Consolas"/>
+        </w:rPr>
+        <w:t>gewicht_momentum</w:t>
+      </w:r>
+      <w:r>
+        <w:t>/</w:t>
+      </w:r>
+      <w:r>
+        <w:rPr>
+          <w:rFonts w:ascii="Consolas" w:hAnsi="Consolas"/>
+        </w:rPr>
+        <w:t>gewicht_kontext_makro</w:t>
+      </w:r>
+      <w:r>
+        <w:t xml:space="preserve"> war in BEIDEN Pipelines (Spot + Hebel) ein toter Fakt - das komplette </w:t>
+      </w:r>
+      <w:r>
+        <w:rPr>
+          <w:rFonts w:ascii="Consolas" w:hAnsi="Consolas"/>
+        </w:rPr>
+        <w:t>regime_profile</w:t>
+      </w:r>
+      <w:r>
+        <w:t xml:space="preserve">-Dict wird via </w:t>
+      </w:r>
+      <w:r>
+        <w:rPr>
+          <w:rFonts w:ascii="Consolas" w:hAnsi="Consolas"/>
+        </w:rPr>
+        <w:t>build_facts()</w:t>
+      </w:r>
+      <w:r>
+        <w:t>/</w:t>
+      </w:r>
+      <w:r>
+        <w:rPr>
+          <w:rFonts w:ascii="Consolas" w:hAnsi="Consolas"/>
+        </w:rPr>
+        <w:t>build_hebel_facts()</w:t>
+      </w:r>
+      <w:r>
+        <w:t xml:space="preserve"> an die LLM geliefert, aber keine Prompt-Regel referenzierte es (im Unterschied zu </w:t>
+      </w:r>
+      <w:r>
+        <w:rPr>
+          <w:rFonts w:ascii="Consolas" w:hAnsi="Consolas"/>
+        </w:rPr>
+        <w:t>min_konfidenz_prozent</w:t>
+      </w:r>
+      <w:r>
+        <w:t xml:space="preserve">/ </w:t>
+      </w:r>
+      <w:r>
+        <w:rPr>
+          <w:rFonts w:ascii="Consolas" w:hAnsi="Consolas"/>
+        </w:rPr>
+        <w:t>small_cap_budget_prozent</w:t>
+      </w:r>
+      <w:r>
+        <w:t xml:space="preserve"> aus demselben Profil, die bereits deterministisch im Gate bzw. Scoring genutzt werden, siehe agent/krypto/hebel_screening.py/ marktscan.py). Inhaltlich kein Nebensaechlichkeits-Fakt, sondern ein durchdachtes, regimeabhaengiges Gewichtungsschema aus Basisinfos/config.yaml (regime.profile) - z.B. krise_extrem: Technik 0.15/Fundamental 0.45/ Momentum 0.15/Makro 0.25; bulle: Technik 0.43/Fundamental 0.25/Momentum 0.17/Makro 0.15.</w:t>
+      </w:r>
+    </w:p>
+    <w:p>
+      <w:r>
+        <w:t xml:space="preserve">Neue Regel 30 in </w:t>
+      </w:r>
+      <w:r>
+        <w:rPr>
+          <w:rFonts w:ascii="Consolas" w:hAnsi="Consolas"/>
+        </w:rPr>
+        <w:t>agent/krypto/analyst.py</w:t>
+      </w:r>
+      <w:r>
+        <w:t xml:space="preserve"> (eigene_einschaetzung zu Regel 31 verschoben) und neue Regel 23 in </w:t>
+      </w:r>
+      <w:r>
+        <w:rPr>
+          <w:rFonts w:ascii="Consolas" w:hAnsi="Consolas"/>
+        </w:rPr>
+        <w:t>agent/krypto/hebel_analyst.py</w:t>
+      </w:r>
+      <w:r>
+        <w:t xml:space="preserve"> (eigene_einschaetzung zu Regel 24 verschoben, je 3 Kreuzverweise korrigiert): nutzt das Gewichtungsschema als ORIENTIERUNG dafuer, wie stark die KI technische/fundamentale/Momentum-/Makro-Aspekte in long_reasoning/ top_gruende gewichtet - ausdruecklich KEINE starre Formel oder Pflichtquote, die eigene Einschaetzung der konkreten Fakten bleibt massgeblich. Passt zum Grundsatz "Kontext liefern, Urteil nicht vorwegnehmen".</w:t>
+      </w:r>
+    </w:p>
+    <w:p>
+      <w:r>
+        <w:rPr>
+          <w:b/>
+        </w:rPr>
+        <w:t>Bewusst fuer BEIDE Pipelines</w:t>
+      </w:r>
+      <w:r>
+        <w:t xml:space="preserve"> (anders als Fear&amp;Greed, Punkt 2): die Frage "welche Analyse-Linse ist in diesem Regime verlaesslicher" gilt nicht nur langfristig - die Regime-Klassifikation selbst wird bei Hebel bereits intensiv genutzt (Regime-Konflikt-Deckel, Regime-Persistenz), die Zeithorizont-Frage spricht hier also nicht gegen eine gemeinsame Regel.</w:t>
+      </w:r>
+    </w:p>
+    <w:p>
+      <w:r>
+        <w:rPr>
+          <w:b/>
+        </w:rPr>
+        <w:t>Verifiziert:</w:t>
+      </w:r>
+      <w:r>
+        <w:t xml:space="preserve"> Modul-Import + Compile-Check beider Dateien, durchgaengige Regelnummerierung Spot 1-31 / Hebel 1-24 ohne Luecke geprueft (Klasse 1). Token-Budget-Check: ca. 150 Token je Datei, vernachlaessigbar.</w:t>
       </w:r>
     </w:p>
     <w:sectPr>

</xml_diff>

<commit_message>
Z.ai-429-Sturm + Krypto-Spot-E-Mail-Luecke behoben
Produktions-Vorfall: alle Z.ai-Infos fielen aus Hebel- UND Spot-Signal-E-Mails.
Root Cause 1 (Notebook-Log bestaetigt): Ausweitung der Z.ai-Gegenpruefung auf
alle 6 Pipelines ueberschritt Z.ais Concurrency-Limit=2 chronisch (210
429-Fehler). Fix: echtes Semaphore-Gate + begrenzter 429-Retry in ZaiClient.

Root Cause 2 (bei Rundum-Pruefung gefunden): Krypto-Spot hatte weder Hebels
Wartemechanismus noch Multi-Assets Re-Fetch fuer Z.ai-Ergebnisse vor dem
E-Mail-Versand. Fix: Hebels Wartefunktion zu einer generischen Funktion
verallgemeinert, neue Spot-Fassung ergaenzt. Dabei einen eigenen
cash_veto-Regressionsbug gefunden und vor Auslieferung gefixt.

Beide Fixes mit synthetischen Tests verifiziert (6 bzw. 7 Testfaelle) und in
Regelwerksmanual.md/.docx dokumentiert.

Co-Authored-By: Claude Sonnet 5 <noreply@anthropic.com>
</commit_message>
<xml_diff>
--- a/Basisinfos/Regelwerksmanual.docx
+++ b/Basisinfos/Regelwerksmanual.docx
@@ -21182,6 +21182,150 @@
       </w:r>
       <w:r>
         <w:t xml:space="preserve"> Klasse 2, 4 Testfaelle - T1 None-Input, T2 Positivfall (Destillation entfernt top_analoge/aktueller_monat/12-Monats-Wert korrekt), T3 Grenzfall (fehlende/None-Werte), T4 Kombinationsfall (Import-Konsistenz hebel_pipeline.py&lt;-&gt;makro_analog.py). Regressionscheck: Spot unveraendert, Regelnummerierung Hebel 1-24 ohne Luecke.</w:t>
+      </w:r>
+    </w:p>
+    <w:p>
+      <w:pPr>
+        <w:pStyle w:val="Heading3"/>
+      </w:pPr>
+      <w:r>
+        <w:t>Nachtrag (2026-07-28): HOTFIX - Z.ai-429-Sturm behoben (api/zai.py)</w:t>
+      </w:r>
+    </w:p>
+    <w:p>
+      <w:r>
+        <w:rPr>
+          <w:b/>
+        </w:rPr>
+        <w:t>Ausloeser:</w:t>
+      </w:r>
+      <w:r>
+        <w:t xml:space="preserve"> Nutzer-Meldung "alle Z.ai-Infos sind aus den E-Mails gefallen, Hebel UND Spot". Live-Test des Z.ai-API-Keys war unauffaellig (funktionierte einwandfrei), die DB (zai_gegenpruefung_verlauf im Notebook-Export) zeigte sogar durchgaengig frische Eintraege bis kurz vor Exportzeitpunkt - der Fehler lag also nicht am Key oder an Z.ai selbst, sondern irgendwo im Zusammenspiel.</w:t>
+      </w:r>
+    </w:p>
+    <w:p>
+      <w:r>
+        <w:rPr>
+          <w:b/>
+        </w:rPr>
+        <w:t>Root Cause (im Log-Auszug des Notebook-Exports eindeutig nachgewiesen):</w:t>
+      </w:r>
+      <w:r>
+        <w:t xml:space="preserve"> 210 Z.ai-bezogene Log-Zeilen in einem Zeitfenster, praktisch ausschliesslich "429 Client Error: Too Many Requests". api/zai.py dokumentiert selbst ein von Z.ai vorgegebenes Concurrency-Limit von 2 fuer GLM-4.5-Flash - der Client hatte aber bewusst KEINE eigene Drosselung (Nutzer-Entscheidung 2026-07-20, kalibriert fuer Hebel-only-Volumen, also niedrige Last). Seit der Ausweitung der Z.ai-Gegenpruefung auf alle 6 Signal-Pipelines (Commit 17b1c9b, 2026-07-27 - je 2 sequenzielle Calls pro Signal, ueber mehrere gleichzeitig laufende Batches) wurde das Concurrency-Limit chronisch ueberschritten - Calls scheiterten schlicht, statt nur langsamer zu sein (auch der schon vorhandene 60s-Wartemechanismus vor dem Hebel-E-Mail-Versand konnte das nicht kompensieren, wenn der Call selbst nie durchkam).</w:t>
+      </w:r>
+    </w:p>
+    <w:p>
+      <w:r>
+        <w:rPr>
+          <w:b/>
+        </w:rPr>
+        <w:t>Fix (api/zai.py, ZaiClient):</w:t>
+      </w:r>
+      <w:r>
+        <w:t xml:space="preserve"> 1. </w:t>
+      </w:r>
+      <w:r>
+        <w:rPr>
+          <w:b/>
+        </w:rPr>
+        <w:t>Echtes Concurrency-Gate:</w:t>
+      </w:r>
+      <w:r>
+        <w:t xml:space="preserve"> threading.Semaphore(MAX_CONCURRENT_REQUESTS=2)    als Instanzattribut - chat() wartet jetzt auf einen freien Slot, statt sofort    zu feuern und ggf. per 429 abgewiesen zu werden. Da main.py genau EINE    ZaiClient-Instanz erstellt und an alle 6 Pipelines durchreicht, wirkt das    Semaphore global ueber alle gleichzeitig laufenden Hintergrund-Threads. 2. </w:t>
+      </w:r>
+      <w:r>
+        <w:rPr>
+          <w:b/>
+        </w:rPr>
+        <w:t>429-Retry:</w:t>
+      </w:r>
+      <w:r>
+        <w:t xml:space="preserve"> bis zu RETRY_ON_429_MAX_VERSUCHE=2 zusaetzliche Versuche mit    steigender Wartezeit (RETRY_ON_429_BASIS_WARTEZEIT_SEKUNDEN=5.0 je Versuch),    respektiert einen Retry-After-Header falls vorhanden. Andere Fehler (Timeout,    5xx, Verbindungsfehler) werden NICHT wiederholt - bleibt P-8 (kein Hard-Fail,    Aufrufer faengt die Exception weiterhin ab). 3. RATE_LIMIT_PER_MINUTE (Gesamtvolumen/Minute) bleibt unveraendert bestehen -    andere Achse (Durchsatz vs. Gleichzeitigkeit), beide Mechanismen ergaenzen sich.</w:t>
+      </w:r>
+    </w:p>
+    <w:p>
+      <w:r>
+        <w:rPr>
+          <w:b/>
+        </w:rPr>
+        <w:t>Verifiziert (Klasse 2, 6 Testfaelle, alle mit gemocktem _session.post):</w:t>
+      </w:r>
+      <w:r>
+        <w:t xml:space="preserve"> T1 Concurrency-Gate (6 parallele Threads, max. gleichzeitig aktive Calls &lt;= 2), T2 429-Retry (429 dann 200 - Erfolg nach 1 Wiederholung), T3 Retry-After-Header wird respektiert, T4 Nicht-429-Fehler (500) wird NICHT wiederholt (1 Aufruf, sofortige Exception), T5 Regressionsfall (sofortiger 200-Erfolg, kein Retry-Sleep), T6 Retries ausgeschoepft (3 Versuche gesamt, dann Exception). Regressionscheck: main.py-Import weiterhin unveraendert funktionsfaehig.</w:t>
+      </w:r>
+    </w:p>
+    <w:p>
+      <w:pPr>
+        <w:pStyle w:val="Heading3"/>
+      </w:pPr>
+      <w:r>
+        <w:t>Nachtrag (2026-07-28): Krypto-Spot-Luecke im Z.ai-E-Mail-Versand geschlossen (scheduler/background.py)</w:t>
+      </w:r>
+    </w:p>
+    <w:p>
+      <w:r>
+        <w:rPr>
+          <w:b/>
+        </w:rPr>
+        <w:t>Ausloeser:</w:t>
+      </w:r>
+      <w:r>
+        <w:t xml:space="preserve"> Nutzer-Nachfrage nach dem 429-Hotfix oben: "hast du das fuer alle ZAI und eMail benachrichtigung beruecksichtigt?" - Rundum-Pruefung aller Z.ai- Aufrufstellen und E-Mail-Pfade ergab eine ZWEITE, vom Concurrency-Fix unabhaengige Luecke.</w:t>
+      </w:r>
+    </w:p>
+    <w:p>
+      <w:r>
+        <w:rPr>
+          <w:b/>
+        </w:rPr>
+        <w:t>Root Cause:</w:t>
+      </w:r>
+      <w:r>
+        <w:t xml:space="preserve"> generate_hebel_signal()/generate_signal() geben das Signal- Objekt zurueck, BEVOR der Z.ai-Hintergrund-Thread ueberhaupt fertig ist (siehe api/zai.py-Docstring). Fuer Hebel existierte deshalb bereits seit 2026-07-26 ein Wartemechanismus (_sende_hebel_email_mit_zai_wartezeit(), begrenztes Polling bis zu _ZAI_EMAIL_WARTE_MAX_SEKUNDEN), fuer Multi-Asset-Batch (Aktien/Rohstoffe/ Themen-ETF/Hedge) ein guenstiger Re-Fetch-by-ID direkt vor dem Versand (Commit 10 der Z.ai-6-Pipelines-Ausweitung). Krypto-Spot hatte WEDER von beidem - _on_signal_ready() rief _notify_spot_signal() in ihrem "spot:"-Zweig direkt mit dem In-Memory-Objekt auf, dessen Z.ai-Felder strukturell nie gesetzt sein konnten. Ein reiner Re-Fetch (wie bei Multi-Asset) haette hier NICHT geholfen, da Krypto-Spot pro Signal sofort benachrichtigt (E-Mail-Latenz-Fix), nicht erst am Ende eines mehrstuendigen Batches wie Multi-Asset - es brauchte echtes Warten wie bei Hebel.</w:t>
+      </w:r>
+    </w:p>
+    <w:p>
+      <w:r>
+        <w:rPr>
+          <w:b/>
+        </w:rPr>
+        <w:t>Fix:</w:t>
+      </w:r>
+      <w:r>
+        <w:t xml:space="preserve"> die bisher Hebel-spezifische _sende_hebel_email_mit_zai_wartezeit() wurde zu einer generischen, parametrisierten Funktion _sende_signal_email_mit_zai_wartezeit(ergebnis, watchlist, bitpanda_assets, conn_factory, required_actions, get_signal_by_id_fn, notify_fn) verallgemeinert (die Wartemechanik selbst ist asset-neutral - anders als z.B. der Retail-Konsens- Filter, der bewusst je Assetklasse dupliziert bleibt, weil dort inhaltliche Unterschiede bestehen). Zwei duenne Wrapper _sende_hebel_email_mit_zai_ wartezeit() (unveraendertes Verhalten, reiner Regressions-Checkpoint) und neu _sende_spot_email_mit_zai_wartezeit() rufen die generische Funktion mit ihren jeweiligen REQUIRED_*_ACTIONS/get_*_signal_by_id/_notify_*_signal auf. _on_signal_ready()s "spot:"-Zweig spawnt jetzt analog zum "hebel:"-Zweig einen eigenen Hintergrund-Thread mit Wartezeit (nur wenn zai_client is not None, sonst unveraendert direkter Aufruf).</w:t>
+      </w:r>
+    </w:p>
+    <w:p>
+      <w:r>
+        <w:rPr>
+          <w:b/>
+        </w:rPr>
+        <w:t>Selbst gefundener und selbst gefixter Regressions-Bug beim Verallgemeinern:</w:t>
+      </w:r>
+      <w:r>
+        <w:t xml:space="preserve"> die urspruengliche Fruehausstiegs-Pruefung fuer HALTEN/nicht-relevante Aktionen war in der Hebel-Fassung ein blanker return VOR jedem notify_fn-Aufruf (sicher fuer Hebel, da _notify_hebel_signal() denselben HALTEN-Guard ohnehin selbst hat). Fuer Spot waere das ein echter Fehler gewesen: _notify_spot_signal() prueft cash_veto UNABHAENGIG von der Aktion (auch bei HALTEN) - ein blanker Return haette die Cash-Veto-Warnmail fuer Spot-HALTEN-Signale mit cash_veto=True verschluckt. Gefixt, indem der Fruehausstieg notify_fn weiterhin aufruft (nur OHNE Wartezeit) statt komplett zu returnen.</w:t>
+      </w:r>
+    </w:p>
+    <w:p>
+      <w:r>
+        <w:rPr>
+          <w:b/>
+        </w:rPr>
+        <w:t>Rundum-Pruefung sonst ergebnislos (bewusst dokumentiert, damit klar ist, was geprueft wurde):</w:t>
+      </w:r>
+      <w:r>
+        <w:t xml:space="preserve"> agent/krypto/gegenpruefung.pys zwei Z.ai-Aufrufstellen (leite_eigene_richtung(), pruefe_konsistenz()) haben keine eigene Retry-Logik (einfaches try/except-return-None, P-8) - kein Konflikt mit dem neuen Retry im Client. Die manuellen "Signal berechnen"-Buttons (ui/signals_view.py:: _run_pipeline(), ui/hebel_view.py::_run_analysis()) loesen ueberhaupt keine E-Mail aus (nur GUI-Update) - koennen die Fixes also nicht umgehen.</w:t>
+      </w:r>
+    </w:p>
+    <w:p>
+      <w:r>
+        <w:rPr>
+          <w:b/>
+        </w:rPr>
+        <w:t>Verifiziert (Klasse 2, 7 Testfaelle, gemockte time.sleep/Signal-Objekte):</w:t>
+      </w:r>
+      <w:r>
+        <w:t xml:space="preserve"> T1 HALTEN (sofortiger notify_fn-Aufruf, kein Sleep), T2 Positivfall (Loop endet nach 1 Poll, sobald Z.ai-Urteil vorliegt, notify_fn bekommt das frische Signal), T3 conn_factory=None (kein Wartezeit-Pfad, Original-Signal durchgereicht), T4 Zeitlimit erreicht (volle 20 Polls, notify_fn trotzdem aufgerufen), T5 (KRITISCH) Spot-HALTEN mit cash_veto=True - notify_fn wird trotzdem aufgerufen, Cash-Veto- Warnung bleibt erhalten, T6/T7 Delegations-Regressionstests fuer beide duennen Wrapper. Regressionscheck: main.py/scheduler/background.py/agent/krypto/ gegenpruefung.py-Import weiterhin unveraendert funktionsfaehig.</w:t>
       </w:r>
     </w:p>
     <w:sectPr>

</xml_diff>

<commit_message>
DXY-Trend (Dollar-Index) fuer alle 6 Signal-Pipelines verdrahtet
Abschnitt 6 Punkt 1 der Fakten-Entscheidungsmappe: regime.dollar_index.wert/
.trend als neuer Fakt fuer Krypto Spot/Hebel, Aktien, Rohstoffe, Themen-ETF
und Hedge, analog zum bestehenden VIX-Muster. Datenschicht (RegimeResult,
determine_regime, MacroSnapshot-Migration) sowie das Fakt-Wiring in allen 6
Analyst-Dateien; Hebel hat kein VIX-Aequivalent und bekam eine eigenstaendige
neue Regel statt eines Anhaengsels an eine bestehende.

Co-Authored-By: Claude Sonnet 5 <noreply@anthropic.com>
</commit_message>
<xml_diff>
--- a/Basisinfos/Regelwerksmanual.docx
+++ b/Basisinfos/Regelwerksmanual.docx
@@ -21326,6 +21326,58 @@
       </w:r>
       <w:r>
         <w:t xml:space="preserve"> T1 HALTEN (sofortiger notify_fn-Aufruf, kein Sleep), T2 Positivfall (Loop endet nach 1 Poll, sobald Z.ai-Urteil vorliegt, notify_fn bekommt das frische Signal), T3 conn_factory=None (kein Wartezeit-Pfad, Original-Signal durchgereicht), T4 Zeitlimit erreicht (volle 20 Polls, notify_fn trotzdem aufgerufen), T5 (KRITISCH) Spot-HALTEN mit cash_veto=True - notify_fn wird trotzdem aufgerufen, Cash-Veto- Warnung bleibt erhalten, T6/T7 Delegations-Regressionstests fuer beide duennen Wrapper. Regressionscheck: main.py/scheduler/background.py/agent/krypto/ gegenpruefung.py-Import weiterhin unveraendert funktionsfaehig.</w:t>
+      </w:r>
+    </w:p>
+    <w:p>
+      <w:pPr>
+        <w:pStyle w:val="Heading3"/>
+      </w:pPr>
+      <w:r>
+        <w:t>Nachtrag (2026-07-28): DXY-Trend (Dollar-Index) fuer alle 6 Pipelines verdrahtet</w:t>
+      </w:r>
+    </w:p>
+    <w:p>
+      <w:r>
+        <w:rPr>
+          <w:b/>
+        </w:rPr>
+        <w:t>Kontext:</w:t>
+      </w:r>
+      <w:r>
+        <w:t xml:space="preserve"> Abschnitt 6 Punkt 1 der Fakten-Entscheidungsmappe. api/macro.py:: get_dollar_index_trend() existierte bereits (2026-07-20, fuer agent/kategorie_ thesen.py), war aber nie an die 6 Signal-Pipelines angebunden - nur indirekt und stark verzoegert ueber den monatlichen Makro-Analog-Cache. Nutzer bestaetigt: keine Gegenargumente gegen Gleichbehandlung aller 6 Pipelines (analog zum VIX-Vorbild).</w:t>
+      </w:r>
+    </w:p>
+    <w:p>
+      <w:r>
+        <w:rPr>
+          <w:b/>
+        </w:rPr>
+        <w:t>Datenschicht (bereits vorhanden aus Vorlaeufer-Session):</w:t>
+      </w:r>
+      <w:r>
+        <w:t xml:space="preserve"> RegimeResult.dollar_index_wert/dollar_index_trend (Trend bereits vorklassifiziert: "steigend"/"fallend"/"gleichbleibend"/"unbekannt", DOLLAR_INDEX_TREND_THRESHOLD_PCT = 1.5), gecacht ueber MacroSnapshot (1x/Tag, analog VIX), fliesst ueber compute_current_regime() (gemeinsame Funktion aller 6 Pipelines) automatisch durch.</w:t>
+      </w:r>
+    </w:p>
+    <w:p>
+      <w:r>
+        <w:rPr>
+          <w:b/>
+        </w:rPr>
+        <w:t>Fakt-Wiring (diese Runde):</w:t>
+      </w:r>
+      <w:r>
+        <w:t xml:space="preserve"> regime.dollar_index.wert/.trend in build_facts()/build_hebel_facts() aller 6 Analyst-Dateien ergaenzt (agent/ krypto/analyst.py, agent/krypto/hebel_analyst.py, agent/aktien/analyst.py, agent/rohstoff/analyst.py, agent/themen_etf/analyst.py, agent/hedge/ analyst.py). In den 5 Spot-family-Pipelines als Ergaenzung an die bestehende VIX-Regel angehaengt (identisches Makro-Kontext-Muster: "steigender" DXY korreliert historisch tendenziell negativ mit Krypto/hoeher-Beta-Assets, direkter preisbelastend bei USD-denominierten Rohstoffen, belastend fuer Auslandsumsaetze bei Aktien) - bewusst MINIMALER Zusatz-Tokenaufwand (ein Satz je Datei), kein eigener Regel-Absatz, da inhaltlich eng verwandt mit VIX. Hebel hat KEIN VIX-Aequivalent im Fakten-Dict - dort neue eigenstaendige Regel 24 (vor dem abschliessenden eigene_einschaetzung-Rueckblick, der auf 25 verschoben wurde).</w:t>
+      </w:r>
+    </w:p>
+    <w:p>
+      <w:r>
+        <w:rPr>
+          <w:b/>
+        </w:rPr>
+        <w:t>Verifiziert (Klasse 1):</w:t>
+      </w:r>
+      <w:r>
+        <w:t xml:space="preserve"> python -m py_compile + Import-Regressionscheck fuer alle 6 Analyst- + 6 Pipeline-Module, Regelnummerierung 1..N luecken-/ duplikatfrei in 5 von 6 Dateien bestaetigt (Ausnahme: agent/rohstoff/ analyst.py hat einen VORBESTEHENDEN, von dieser Aenderung unabhaengigen Nummerierungs-Doppler bei Regel 18/19 - separat als Task geflaggt, nicht Teil dieser Aenderung). Synthetischer Test: RegimeResult mit gesetzten dollar_index_wert/_trend-Werten instanziierbar. Reines, risikoarmes Fakten-Wiring nach bereits produktiv laufendem VIX-Muster, keine neue Berechnungslogik - kein hoeherer Testklassen-Aufwand noetig.</w:t>
       </w:r>
     </w:p>
     <w:sectPr>

</xml_diff>

<commit_message>
OI-Squeeze-Divergenz + Funding-Rate-Perzentil fuer Krypto Spot+Hebel
Abschnitt 6 Punkt 2+3 der Fakten-Entscheidungsmappe. Vor der Umsetzung
Mengenanalyse gegen die echte Desktop-DB: der Hebel-Pruefung-Toggle ist ein
reiner Opt-out (Default an fuer alle Krypto-Assets), 38 von 43 Watchlist-
Assets hatten bereits OI-/Funding-Historie - beide Fakten daher von Anfang
an fuer Spot UND Hebel gebaut statt nur fuer Hebel.

classify_squeeze_divergenz() vergleicht Open-Interest-Aenderung (neues
eigenes 72h-Fenster) mit der Kursaenderung (bestehendes 3-Tage-Fenster) und
klassifiziert in aufbau_bestaetigt/short_squeeze_verdacht/long_squeeze_
verdacht/abbau_deleveraging/neutral. funding_rate_percentile() folgt exakt
dem bestehenden atr_percentile()-Muster fuer ein Crowding-Signal.

Verifiziert mit 16 synthetischen Testfaellen (alle Divergenz-Faelle,
Perzentil-Grenzfaelle, DB-Wrapper-Filterung) + Regressionscheck.

Co-Authored-By: Claude Sonnet 5 <noreply@anthropic.com>
</commit_message>
<xml_diff>
--- a/Basisinfos/Regelwerksmanual.docx
+++ b/Basisinfos/Regelwerksmanual.docx
@@ -21378,6 +21378,80 @@
       </w:r>
       <w:r>
         <w:t xml:space="preserve"> python -m py_compile + Import-Regressionscheck fuer alle 6 Analyst- + 6 Pipeline-Module, Regelnummerierung 1..N luecken-/ duplikatfrei in 5 von 6 Dateien bestaetigt (Ausnahme: agent/rohstoff/ analyst.py hat einen VORBESTEHENDEN, von dieser Aenderung unabhaengigen Nummerierungs-Doppler bei Regel 18/19 - separat als Task geflaggt, nicht Teil dieser Aenderung). Synthetischer Test: RegimeResult mit gesetzten dollar_index_wert/_trend-Werten instanziierbar. Reines, risikoarmes Fakten-Wiring nach bereits produktiv laufendem VIX-Muster, keine neue Berechnungslogik - kein hoeherer Testklassen-Aufwand noetig.</w:t>
+      </w:r>
+    </w:p>
+    <w:p>
+      <w:pPr>
+        <w:pStyle w:val="Heading3"/>
+      </w:pPr>
+      <w:r>
+        <w:t>Nachtrag (2026-07-28): OI-Squeeze-Divergenz + Funding-Rate-Perzentil (Krypto Spot+Hebel)</w:t>
+      </w:r>
+    </w:p>
+    <w:p>
+      <w:r>
+        <w:rPr>
+          <w:b/>
+        </w:rPr>
+        <w:t>Kontext:</w:t>
+      </w:r>
+      <w:r>
+        <w:t xml:space="preserve"> Abschnitt 6 Punkt 2+3 der Fakten-Entscheidungsmappe. Vor der Umsetzung Mengenanalyse gegen die echte Desktop-DB durchgefuehrt (Nutzer- Vorgabe: "erst eine Mengenanalyse, dann entscheiden"), da unklar war, ob die Doku-Behauptung "Daten bereits vorhanden" auch fuer Krypto-Spot gilt (die zugrundeliegende open_interest_snapshot-Tabelle wird technisch nur ueber den Hebel-Screening-Job befuellt).</w:t>
+      </w:r>
+    </w:p>
+    <w:p>
+      <w:r>
+        <w:rPr>
+          <w:b/>
+        </w:rPr>
+        <w:t>Mengenanalyse-Fund:</w:t>
+      </w:r>
+      <w:r>
+        <w:t xml:space="preserve"> asset_hebel_settings (Hebel-Pruefung-Toggle) ist ein reiner OPT-OUT - Default True fuer ALLE Krypto-Assets (database/db.py:: get_hebel_pruefung_erlaubt()), Tabelle war zum Pruefzeitpunkt komplett leer. Von 43 Krypto-Watchlist-Assets hatten bereits 38 (88%) historische OI-/ Funding-Daten. Ergebnis: beide Fakten von Anfang an fuer Spot UND Hebel bauen, keine Zeitreihen-Infrastruktur fehlt real.</w:t>
+      </w:r>
+    </w:p>
+    <w:p>
+      <w:r>
+        <w:rPr>
+          <w:b/>
+        </w:rPr>
+        <w:t>OI-Squeeze-Divergenz:</w:t>
+      </w:r>
+      <w:r>
+        <w:t xml:space="preserve"> neue reine Funktion classify_squeeze_divergenz() (agent/krypto/hebel_screening.py) - vergleicht Open-Interest-Aenderung (compute_oi_change_pct(), NEUES eigenes Lookback-Fenster config.yaml krypto_oi_fakten.squeeze_oi_lookback_stunden=72, bewusst NICHT Hebels bestehendes 4h-Trendfolge-Fenster - zeitlich nicht vergleichbar mit einem mehrtaegigen Kursfenster) mit der Kursaenderung (bereits vorhandenes antizyklisch.kursaenderung_letzte_tage_prozent, 3-Tage-Fenster aus anticyclic.py). Vier Label: aufbau_bestaetigt (beide gleiche Richtung - frisches Kapital, robuster), short_squeeze_verdacht/long_squeeze_verdacht (gegenlaeufig - Zwangs-Ein-/Eindeckung, fragiler), abbau_deleveraging (beide fallend, normale Korrektur), plus neutral bei zu kleinen Aenderungen (squeeze_schwelle_prozent=1.0, [OFFEN] Platzhalter ohne Live-Kalibrierung).</w:t>
+      </w:r>
+    </w:p>
+    <w:p>
+      <w:r>
+        <w:rPr>
+          <w:b/>
+        </w:rPr>
+        <w:t>Funding-Rate-Perzentil:</w:t>
+      </w:r>
+      <w:r>
+        <w:t xml:space="preserve"> neue Funktion funding_rate_percentile() (indicators/calculations.py) exakt nach dem atr_percentile()-Muster (eigene MIN_FUNDING_PERZENTIL_PUNKTE=30-Konstante, bewusst NICHT dieselbe Funktion wiederverwendet, um deren ATR-spezifischen Docstring nicht zu verwaessern - reine 3-Zeilen-Logik). DB-Fetch-Wrapper hebel_screening.py::compute_funding_rate_percentile() liest die Kraken- Funding-Rate aus (redundant in allen 3 Boersen-Zeilen von open_interest_snapshot gespeichert, EINE Boerse als Quelle reicht), filtert None-Luecken.</w:t>
+      </w:r>
+    </w:p>
+    <w:p>
+      <w:r>
+        <w:rPr>
+          <w:b/>
+        </w:rPr>
+        <w:t>Wiring:</w:t>
+      </w:r>
+      <w:r>
+        <w:t xml:space="preserve"> beide Fakten in agent/krypto/pipeline.py/hebel_pipeline.py berechnet, als antizyklisch.squeeze_divergenz/.funding_rate_perzentil in analyst.py/hebel_analyst.py verdrahtet (neue Regel 31 Spot, Regel 25 Hebel - Funding-Rate-Perzentil bewusst als ANDERES Signal zur absoluten Funding-Kosten-Hoehe gerahmt, keine Duplizierung in key_risks).</w:t>
+      </w:r>
+    </w:p>
+    <w:p>
+      <w:r>
+        <w:rPr>
+          <w:b/>
+        </w:rPr>
+        <w:t>Verifiziert (Klasse 2, 16 synthetische Testfaelle):</w:t>
+      </w:r>
+      <w:r>
+        <w:t xml:space="preserve"> T1-T4 alle 4 Squeeze- Quadranten, T5-T6 neutral bei zu kleiner OI-/Kursaenderung, T7-T9 None- Propagierung, T10 Grenzfall (exakte Schwelle zaehlt nicht als neutral), T11 unavailable bei zu wenig Punkten, T12-T13 Perzentil bei Maximal-/Minimalwert (identische Formel wie atr_percentile(): (werte &lt; aktuell).sum()/len*100, Grenzwert selbst zaehlt nicht mit), T14 Grenzfall genau Mindestpunkte, T15-T16 DB-Wrapper mit None-Filterung. Regelnummerierung + Import-Regressionscheck ueber alle 6 betroffenen Module (pipeline.py, hebel_pipeline.py, analyst.py, hebel_analyst.py, hebel_screening.py, indicators/calculations.py) sowie main.py.</w:t>
       </w:r>
     </w:p>
     <w:sectPr>

</xml_diff>

<commit_message>
Nur-Long-Deckel: LLM-Output wurde nie gegen hebel_richtung_modus geprueft
Der bestehende Kandidaten-Filter in budget_allocator.py filtert nur die
Trigger-Richtung VOR dem LLM-Call - das LLM entscheidet die tatsaechliche
Richtung seiner Antwort aber frei und kennt hebel_richtung_modus selbst
nicht. Echter Vorfall: "Hebel ERÖFFNEN NEAR/TAO (SHORT)" trotz durchgehend
aktivem "Nur Long"-Schalter. Neuer deterministischer Veto in
post_check_hebel() faengt SHORT-ERÖFFNEN-Vorschlaege ohne bestehende
Position ab, laesst die bewusst erlaubte Kontrathese-Erkennung (SHORT
gegen offene LONG-Position) unangetastet.

Korrigiert zugleich eine fruehere Fehleinschaetzung im Regelwerksmanual
(27.07.-Nachtrag hatte den Kandidaten-Filter faelschlich als ausreichend
bewertet).
</commit_message>
<xml_diff>
--- a/Basisinfos/Regelwerksmanual.docx
+++ b/Basisinfos/Regelwerksmanual.docx
@@ -21452,6 +21452,354 @@
       </w:r>
       <w:r>
         <w:t xml:space="preserve"> T1-T4 alle 4 Squeeze- Quadranten, T5-T6 neutral bei zu kleiner OI-/Kursaenderung, T7-T9 None- Propagierung, T10 Grenzfall (exakte Schwelle zaehlt nicht als neutral), T11 unavailable bei zu wenig Punkten, T12-T13 Perzentil bei Maximal-/Minimalwert (identische Formel wie atr_percentile(): (werte &lt; aktuell).sum()/len*100, Grenzwert selbst zaehlt nicht mit), T14 Grenzfall genau Mindestpunkte, T15-T16 DB-Wrapper mit None-Filterung. Regelnummerierung + Import-Regressionscheck ueber alle 6 betroffenen Module (pipeline.py, hebel_pipeline.py, analyst.py, hebel_analyst.py, hebel_screening.py, indicators/calculations.py) sowie main.py.</w:t>
+      </w:r>
+    </w:p>
+    <w:p>
+      <w:pPr>
+        <w:pStyle w:val="Heading3"/>
+      </w:pPr>
+      <w:r>
+        <w:t>Nachtrag (2026-07-28): Nur-Long-Deckel — echter Bug, keine reine Konfigurationsfrage (NEAR/TAO SHORT ERÖFFNEN trotz aktivem nur_long)</w:t>
+      </w:r>
+    </w:p>
+    <w:p>
+      <w:pPr/>
+      <w:r>
+        <w:rPr>
+          <w:b/>
+        </w:rPr>
+        <w:t xml:space="preserve">Auslöser: </w:t>
+      </w:r>
+      <w:r>
+        <w:t>Nutzer meldete zwei tatsächlich verschickte E-Mails - "Hebel ERÖFFNEN NEAR (SHORT)" (28.07. 08:46 Uhr) und "Hebel ERÖFFNEN TAO (SHORT)" (28.07. 11:50 Uhr) - obwohl der "Nur Long"-Schalter (</w:t>
+      </w:r>
+      <w:r>
+        <w:rPr>
+          <w:rFonts w:ascii="Consolas" w:hAnsi="Consolas"/>
+        </w:rPr>
+        <w:t>ui/settings.py::hebel_richtung_modus</w:t>
+      </w:r>
+      <w:r>
+        <w:t>) auf dem Notebook durchgehend aktiv war. Log-Beweis direkt aus dem 72h-Fenster des Notebook-Exports:</w:t>
+      </w:r>
+    </w:p>
+    <w:p>
+      <w:pPr/>
+      <w:r>
+        <w:rPr>
+          <w:rFonts w:ascii="Consolas" w:hAnsi="Consolas"/>
+          <w:sz w:val="18"/>
+        </w:rPr>
+        <w:t>08:44:46 Budget-Allocator: Hebel 2/2 (Richtung=nur_long, ...)</w:t>
+        <w:br/>
+        <w:t>08:46:28 E-Mail gesendet: "Hebel ERÖFFNEN NEAR (SHORT)"</w:t>
+        <w:br/>
+        <w:t>11:47:39 Budget-Allocator: Hebel 3/3 (Richtung=nur_long, ...)</w:t>
+        <w:br/>
+        <w:t>11:50    E-Mail gesendet: "Hebel ERÖFFNEN TAO (SHORT)"</w:t>
+      </w:r>
+    </w:p>
+    <w:p>
+      <w:pPr/>
+      <w:r>
+        <w:t xml:space="preserve">Der Kandidaten-Filter lief korrekt (alle Kandidaten passierten </w:t>
+      </w:r>
+      <w:r>
+        <w:rPr>
+          <w:rFonts w:ascii="Consolas" w:hAnsi="Consolas"/>
+        </w:rPr>
+        <w:t>hebel_richtung_modus=="nur_long"</w:t>
+      </w:r>
+      <w:r>
+        <w:t>), trotzdem kam eine SHORT-Empfehlung durch.</w:t>
+      </w:r>
+    </w:p>
+    <w:p>
+      <w:pPr/>
+      <w:r>
+        <w:rPr>
+          <w:b/>
+        </w:rPr>
+        <w:t>Root Cause</w:t>
+      </w:r>
+    </w:p>
+    <w:p>
+      <w:pPr/>
+      <w:r>
+        <w:rPr>
+          <w:rFonts w:ascii="Consolas" w:hAnsi="Consolas"/>
+        </w:rPr>
+        <w:t>agent/krypto/budget_allocator.py</w:t>
+      </w:r>
+      <w:r>
+        <w:t xml:space="preserve"> (Zeile ~388/435) filtert </w:t>
+      </w:r>
+      <w:r>
+        <w:rPr>
+          <w:rFonts w:ascii="Consolas" w:hAnsi="Consolas"/>
+        </w:rPr>
+        <w:t>hebel_pending</w:t>
+      </w:r>
+      <w:r>
+        <w:t>/</w:t>
+      </w:r>
+      <w:r>
+        <w:rPr>
+          <w:rFonts w:ascii="Consolas" w:hAnsi="Consolas"/>
+        </w:rPr>
+        <w:t>offene_positionen_roh</w:t>
+      </w:r>
+      <w:r>
+        <w:t xml:space="preserve"> NUR nach </w:t>
+      </w:r>
+      <w:r>
+        <w:rPr>
+          <w:rFonts w:ascii="Consolas" w:hAnsi="Consolas"/>
+        </w:rPr>
+        <w:t>trigger.richtung</w:t>
+      </w:r>
+      <w:r>
+        <w:t xml:space="preserve"> - der Kandidaten-Klassifikation VOR dem LLM-Call (vergeben von </w:t>
+      </w:r>
+      <w:r>
+        <w:rPr>
+          <w:rFonts w:ascii="Consolas" w:hAnsi="Consolas"/>
+        </w:rPr>
+        <w:t>hebel_screening.py</w:t>
+      </w:r>
+      <w:r>
+        <w:t xml:space="preserve">'s Trigger-Discovery). Das LLM (Mistral/Gemini) entscheidet </w:t>
+      </w:r>
+      <w:r>
+        <w:rPr>
+          <w:rFonts w:ascii="Consolas" w:hAnsi="Consolas"/>
+        </w:rPr>
+        <w:t>parsed["richtung"]</w:t>
+      </w:r>
+      <w:r>
+        <w:t xml:space="preserve"> in seiner strukturierten Antwort aber KOMPLETT FREI (Schema </w:t>
+      </w:r>
+      <w:r>
+        <w:rPr>
+          <w:rFonts w:ascii="Consolas" w:hAnsi="Consolas"/>
+        </w:rPr>
+        <w:t>hebel_analyst.py</w:t>
+      </w:r>
+      <w:r>
+        <w:t xml:space="preserve"> Zeile 338: </w:t>
+      </w:r>
+      <w:r>
+        <w:rPr>
+          <w:rFonts w:ascii="Consolas" w:hAnsi="Consolas"/>
+        </w:rPr>
+        <w:t>"richtung": "LONG|SHORT"</w:t>
+      </w:r>
+      <w:r>
+        <w:t xml:space="preserve">) - </w:t>
+      </w:r>
+      <w:r>
+        <w:rPr>
+          <w:rFonts w:ascii="Consolas" w:hAnsi="Consolas"/>
+        </w:rPr>
+        <w:t>trigger.richtung</w:t>
+      </w:r>
+      <w:r>
+        <w:t xml:space="preserve"> wird ihm nur als EIN beschreibender Fakt mitgegeben (</w:t>
+      </w:r>
+      <w:r>
+        <w:rPr>
+          <w:rFonts w:ascii="Consolas" w:hAnsi="Consolas"/>
+        </w:rPr>
+        <w:t>regime.richtungs_konflikt_mit_trigger</w:t>
+      </w:r>
+      <w:r>
+        <w:t xml:space="preserve">), niemals als bindende Vorgabe, und </w:t>
+      </w:r>
+      <w:r>
+        <w:rPr>
+          <w:rFonts w:ascii="Consolas" w:hAnsi="Consolas"/>
+        </w:rPr>
+        <w:t>hebel_richtung_modus</w:t>
+      </w:r>
+      <w:r>
+        <w:t xml:space="preserve"> selbst ist dem Modell komplett unbekannt (kein Prompt-Hinweis irgendwo). </w:t>
+      </w:r>
+      <w:r>
+        <w:rPr>
+          <w:rFonts w:ascii="Consolas" w:hAnsi="Consolas"/>
+        </w:rPr>
+        <w:t>hebel_pipeline.py::generate_hebel_signal()</w:t>
+      </w:r>
+      <w:r>
+        <w:t xml:space="preserve"> übernimmt am Ende </w:t>
+      </w:r>
+      <w:r>
+        <w:rPr>
+          <w:rFonts w:ascii="Consolas" w:hAnsi="Consolas"/>
+        </w:rPr>
+        <w:t>richtung=corrected.get("richtung")</w:t>
+      </w:r>
+      <w:r>
+        <w:t xml:space="preserve"> 1:1 aus der LLM-Antwort in das persistierte/versendete HebelSignal - nichts prüft das danach nochmal gegen den Schalter.</w:t>
+      </w:r>
+    </w:p>
+    <w:p>
+      <w:pPr/>
+      <w:r>
+        <w:t xml:space="preserve">Klarstellung zu Mistral vs. Z.ai (Nutzer-Rückfrage): Mistral bekommt keine zwingende Richtungsvorgabe, sondern </w:t>
+      </w:r>
+      <w:r>
+        <w:rPr>
+          <w:rFonts w:ascii="Consolas" w:hAnsi="Consolas"/>
+        </w:rPr>
+        <w:t>trigger.richtung</w:t>
+      </w:r>
+      <w:r>
+        <w:t xml:space="preserve"> nur als EINEN von vielen Fakten (daher "kennt die Richtung indirekt"). Z.ai (</w:t>
+      </w:r>
+      <w:r>
+        <w:rPr>
+          <w:rFonts w:ascii="Consolas" w:hAnsi="Consolas"/>
+        </w:rPr>
+        <w:t>gegenpruefung.py::leite_eigene_richtung()</w:t>
+      </w:r>
+      <w:r>
+        <w:t xml:space="preserve">) bekommt dagegen ausschließlich objektive Marktfakten, kennt weder Mistrals Empfehlung noch </w:t>
+      </w:r>
+      <w:r>
+        <w:rPr>
+          <w:rFonts w:ascii="Consolas" w:hAnsi="Consolas"/>
+        </w:rPr>
+        <w:t>hebel_richtung_modus</w:t>
+      </w:r>
+      <w:r>
+        <w:t>, leitet komplett unabhängig eine eigene Richtung her (reiner Bestätigungs-/Widerspruchs-Abgleich) und läuft zudem asynchron in einem Hintergrund-Thread ERST NACHDEM das Signal bereits gespeichert und die E-Mail schon raus ist - kann also auch prinzipiell nichts mehr verhindern.</w:t>
+      </w:r>
+    </w:p>
+    <w:p>
+      <w:pPr/>
+      <w:r>
+        <w:t>Bezug zur bereits bestehenden Kontrathese-Erkennung (Nachtrag 2026-07-24): dort wird ein SHORT-Vorschlag GEGEN eine bestehende LONG-Position bewusst NICHT geblockt, sondern als Kontrathese behandelt. Der neue Nur-Long-Deckel darf diesen Fall nicht anfassen - beide NEAR/TAO-Fälle betrafen aber Symbole OHNE aktuell offene Position, also echte Fresh-ERÖFFNEN-Vorschläge ohne Kontrathese-Bezug.</w:t>
+      </w:r>
+    </w:p>
+    <w:p>
+      <w:pPr/>
+      <w:r>
+        <w:rPr>
+          <w:b/>
+        </w:rPr>
+        <w:t>Fix</w:t>
+      </w:r>
+    </w:p>
+    <w:p>
+      <w:pPr/>
+      <w:r>
+        <w:t xml:space="preserve">Neuer deterministischer Veto-Zweig in </w:t>
+      </w:r>
+      <w:r>
+        <w:rPr>
+          <w:rFonts w:ascii="Consolas" w:hAnsi="Consolas"/>
+        </w:rPr>
+        <w:t>agent/krypto/hebel_risk_gate.py::post_check_hebel()</w:t>
+      </w:r>
+      <w:r>
+        <w:t xml:space="preserve">, als eigener elif DIREKT NACH dem bestehenden Kontrathese-Zweig (greift also nur, wenn </w:t>
+      </w:r>
+      <w:r>
+        <w:rPr>
+          <w:rFonts w:ascii="Consolas" w:hAnsi="Consolas"/>
+        </w:rPr>
+        <w:t>position_aktuell is None</w:t>
+      </w:r>
+      <w:r>
+        <w:t>):</w:t>
+      </w:r>
+    </w:p>
+    <w:p>
+      <w:pPr/>
+      <w:r>
+        <w:rPr>
+          <w:rFonts w:ascii="Consolas" w:hAnsi="Consolas"/>
+          <w:sz w:val="18"/>
+        </w:rPr>
+        <w:t>elif (</w:t>
+        <w:br/>
+        <w:t xml:space="preserve">    hebel_richtung_modus == "nur_long"</w:t>
+        <w:br/>
+        <w:t xml:space="preserve">    and richtung == RICHTUNG_SHORT</w:t>
+        <w:br/>
+        <w:t xml:space="preserve">    and action == "ERÖFFNEN"</w:t>
+        <w:br/>
+        <w:t>):</w:t>
+        <w:br/>
+        <w:t xml:space="preserve">    risk_veto = True</w:t>
+        <w:br/>
+        <w:t xml:space="preserve">    risk_veto_reason = ...</w:t>
+        <w:br/>
+        <w:t xml:space="preserve">    action = "HALTEN"</w:t>
+      </w:r>
+    </w:p>
+    <w:p>
+      <w:pPr/>
+      <w:r>
+        <w:t xml:space="preserve">Neuer Parameter </w:t>
+      </w:r>
+      <w:r>
+        <w:rPr>
+          <w:rFonts w:ascii="Consolas" w:hAnsi="Consolas"/>
+        </w:rPr>
+        <w:t>hebel_richtung_modus: str | None = None</w:t>
+      </w:r>
+      <w:r>
+        <w:t xml:space="preserve"> (Default None = kein Veto, rückwärtskompatibel). </w:t>
+      </w:r>
+      <w:r>
+        <w:rPr>
+          <w:rFonts w:ascii="Consolas" w:hAnsi="Consolas"/>
+        </w:rPr>
+        <w:t>agent/krypto/hebel_pipeline.py::generate_hebel_signal()</w:t>
+      </w:r>
+      <w:r>
+        <w:t xml:space="preserve"> liest den aktuellen Wert direkt vor dem Aufruf und reicht ihn durch - identisches Muster wie budget_allocator.py's bereits bestehender Kandidaten-Filter, nur eben NACH statt VOR dem LLM-Call.</w:t>
+      </w:r>
+    </w:p>
+    <w:p>
+      <w:pPr/>
+      <w:r>
+        <w:rPr>
+          <w:b/>
+        </w:rPr>
+        <w:t>Korrektur einer früheren Fehleinschätzung</w:t>
+      </w:r>
+    </w:p>
+    <w:p>
+      <w:pPr/>
+      <w:r>
+        <w:t>Der Nachtrag vom 27.07. ("Z.ai-Richtungs-Erfolgsquote") wertete "57 LONG/2 SHORT bei Mistral" als Beleg dafür, dass der Kandidaten-Filter ausreicht, mit der expliziten Schlussfolgerung "keine Änderung an hebel_richtung_modus geplant". Die 2 SHORT-Fälle damals waren vermutlich bereits genau diese Lücke, nur nicht als solche erkannt.</w:t>
+      </w:r>
+    </w:p>
+    <w:p>
+      <w:pPr/>
+      <w:r>
+        <w:rPr>
+          <w:b/>
+        </w:rPr>
+        <w:t xml:space="preserve">Verifiziert (Klasse 2, synthetisch): </w:t>
+      </w:r>
+      <w:r>
+        <w:t>8 Checks gegen post_check_hebel(): SHORT ERÖFFNEN bei nur_long ohne Position → HALTEN + Veto-Reason gesetzt; LONG ERÖFFNEN bei nur_long → unverändert; SHORT ERÖFFNEN bei modus=beide → unverändert; kein hebel_richtung_modus übergeben (Default) → unverändertes Altverhalten; Kontrathese-Fall bleibt vom neuen Deckel UNBERÜHRT. Import-Regressionscheck über hebel_pipeline.py, hebel_risk_gate.py, budget_allocator.py, scheduler/background.py, main.py.</w:t>
+      </w:r>
+    </w:p>
+    <w:p>
+      <w:pPr/>
+      <w:r>
+        <w:rPr>
+          <w:b/>
+        </w:rPr>
+        <w:t xml:space="preserve">Bewusst NICHT Teil dieser Runde: </w:t>
+      </w:r>
+      <w:r>
+        <w:t>kein Prompt-Hinweis an Mistral/Gemini über hebel_richtung_modus (der deterministische Veto ist die garantierte Absicherung); keine Änderung an der Architektur-Frage data/settings.json (device-lokal) vs. config.yaml (git-synchronisiert) - separat zu entscheiden.</w:t>
       </w:r>
     </w:p>
     <w:sectPr>

</xml_diff>

<commit_message>
hebel_richtung_modus + E-Mail-Bitpanda-Filter von settings.json nach config.yaml migriert
Beide Schalter steuern reales Trading-/Benachrichtigungsverhalten auf dem
24/7-Notebook, lagen aber geraete-lokal + git-ignoriert in data/settings.json -
eine fehlende/kaputte Datei faellt stillschweigend auf den Code-Default
zurueck, ohne Log-Hinweis. Jetzt in Basisinfos/config.yaml, also
git-synchronisiert und versionskontrolliert. dark_mode bleibt bewusst
geraete-lokal (rein kosmetisch).

Co-Authored-By: Claude Sonnet 5 <noreply@anthropic.com>
</commit_message>
<xml_diff>
--- a/Basisinfos/Regelwerksmanual.docx
+++ b/Basisinfos/Regelwerksmanual.docx
@@ -21800,6 +21800,257 @@
       </w:r>
       <w:r>
         <w:t>kein Prompt-Hinweis an Mistral/Gemini über hebel_richtung_modus (der deterministische Veto ist die garantierte Absicherung); keine Änderung an der Architektur-Frage data/settings.json (device-lokal) vs. config.yaml (git-synchronisiert) - separat zu entscheiden.</w:t>
+      </w:r>
+    </w:p>
+    <w:p>
+      <w:pPr>
+        <w:pStyle w:val="Heading3"/>
+      </w:pPr>
+      <w:r>
+        <w:t>Nachtrag (2026-07-28, noch selber Tag): hebel_richtung_modus/E-Mail-Bitpanda-Filter von data/settings.json nach config.yaml migriert</w:t>
+      </w:r>
+    </w:p>
+    <w:p>
+      <w:pPr/>
+      <w:r>
+        <w:rPr>
+          <w:b/>
+        </w:rPr>
+        <w:t xml:space="preserve">Auslöser: </w:t>
+      </w:r>
+      <w:r>
+        <w:t>Nach dem Nur-Long-Deckel-Fix Nachfrage des Nutzers, ob die geräte-lokale Persistenz der beiden Schalter selbst noch ein Problem ist. Zwar war sie im diagnostizierten Vorfall NICHT die Ursache (der Notebook-Wert stand die ganze Zeit korrekt auf nur_long), aber ein latentes Risiko bleibt bestehen: eine kaputte/fehlende data/settings.json fällt STILLSCHWEIGEND auf den Code-Default "beide"/True zurück (kein Log-Hinweis), und die Datei ist bewusst git-ignoriert - toggelt der Nutzer den Schalter auf dem "falschen" Gerät, bleibt das unbemerkt. Entscheidung: migrieren, da selten umgestellt und Korrektheit hier wichtiger als Tempo.</w:t>
+      </w:r>
+    </w:p>
+    <w:p>
+      <w:pPr/>
+      <w:r>
+        <w:rPr>
+          <w:b/>
+        </w:rPr>
+        <w:t>Umsetzung:</w:t>
+      </w:r>
+    </w:p>
+    <w:p>
+      <w:pPr/>
+      <w:r>
+        <w:t xml:space="preserve">- </w:t>
+      </w:r>
+      <w:r>
+        <w:rPr>
+          <w:rFonts w:ascii="Consolas" w:hAnsi="Consolas"/>
+        </w:rPr>
+        <w:t>Basisinfos/config.yaml</w:t>
+      </w:r>
+      <w:r>
+        <w:t xml:space="preserve">: </w:t>
+      </w:r>
+      <w:r>
+        <w:rPr>
+          <w:rFonts w:ascii="Consolas" w:hAnsi="Consolas"/>
+        </w:rPr>
+        <w:t>budget_allocator.hebel_richtung_modus</w:t>
+      </w:r>
+      <w:r>
+        <w:t xml:space="preserve"> (Default nur_long, der tatsächliche Produktionswert) und </w:t>
+      </w:r>
+      <w:r>
+        <w:rPr>
+          <w:rFonts w:ascii="Consolas" w:hAnsi="Consolas"/>
+        </w:rPr>
+        <w:t>benachrichtigung.email.nur_bitpanda_gelistet</w:t>
+      </w:r>
+      <w:r>
+        <w:t xml:space="preserve"> (Default true) neu.</w:t>
+      </w:r>
+    </w:p>
+    <w:p>
+      <w:pPr/>
+      <w:r>
+        <w:t xml:space="preserve">- </w:t>
+      </w:r>
+      <w:r>
+        <w:rPr>
+          <w:rFonts w:ascii="Consolas" w:hAnsi="Consolas"/>
+        </w:rPr>
+        <w:t>config.py</w:t>
+      </w:r>
+      <w:r>
+        <w:t xml:space="preserve">: neue gemeinsame Schreibfunktion </w:t>
+      </w:r>
+      <w:r>
+        <w:rPr>
+          <w:rFonts w:ascii="Consolas" w:hAnsi="Consolas"/>
+        </w:rPr>
+        <w:t>_set_top_level_skalar()</w:t>
+      </w:r>
+      <w:r>
+        <w:t xml:space="preserve"> (identisches Backup-/Schreib-/Reparse-/Rollback-Muster wie </w:t>
+      </w:r>
+      <w:r>
+        <w:rPr>
+          <w:rFonts w:ascii="Consolas" w:hAnsi="Consolas"/>
+        </w:rPr>
+        <w:t>set_regime_manueller_override()</w:t>
+      </w:r>
+      <w:r>
+        <w:t xml:space="preserve">) + zwei dünne Wrapper </w:t>
+      </w:r>
+      <w:r>
+        <w:rPr>
+          <w:rFonts w:ascii="Consolas" w:hAnsi="Consolas"/>
+        </w:rPr>
+        <w:t>set_hebel_richtung_modus()</w:t>
+      </w:r>
+      <w:r>
+        <w:t>/</w:t>
+      </w:r>
+      <w:r>
+        <w:rPr>
+          <w:rFonts w:ascii="Consolas" w:hAnsi="Consolas"/>
+        </w:rPr>
+        <w:t>set_email_nur_bitpanda_gelistet()</w:t>
+      </w:r>
+      <w:r>
+        <w:t>.</w:t>
+      </w:r>
+    </w:p>
+    <w:p>
+      <w:pPr/>
+      <w:r>
+        <w:t xml:space="preserve">- </w:t>
+      </w:r>
+      <w:r>
+        <w:rPr>
+          <w:rFonts w:ascii="Consolas" w:hAnsi="Consolas"/>
+        </w:rPr>
+        <w:t>agent/krypto/budget_allocator.py</w:t>
+      </w:r>
+      <w:r>
+        <w:t>/</w:t>
+      </w:r>
+      <w:r>
+        <w:rPr>
+          <w:rFonts w:ascii="Consolas" w:hAnsi="Consolas"/>
+        </w:rPr>
+        <w:t>agent/krypto/hebel_pipeline.py</w:t>
+      </w:r>
+      <w:r>
+        <w:t xml:space="preserve">: lesen </w:t>
+      </w:r>
+      <w:r>
+        <w:rPr>
+          <w:rFonts w:ascii="Consolas" w:hAnsi="Consolas"/>
+        </w:rPr>
+        <w:t>hebel_richtung_modus</w:t>
+      </w:r>
+      <w:r>
+        <w:t xml:space="preserve"> jetzt aus dem ohnehin bereits geladenen </w:t>
+      </w:r>
+      <w:r>
+        <w:rPr>
+          <w:rFonts w:ascii="Consolas" w:hAnsi="Consolas"/>
+        </w:rPr>
+        <w:t>config_dict</w:t>
+      </w:r>
+      <w:r>
+        <w:t xml:space="preserve"> statt </w:t>
+      </w:r>
+      <w:r>
+        <w:rPr>
+          <w:rFonts w:ascii="Consolas" w:hAnsi="Consolas"/>
+        </w:rPr>
+        <w:t>ui_settings.load_settings()</w:t>
+      </w:r>
+      <w:r>
+        <w:t>.</w:t>
+      </w:r>
+    </w:p>
+    <w:p>
+      <w:pPr/>
+      <w:r>
+        <w:t xml:space="preserve">- </w:t>
+      </w:r>
+      <w:r>
+        <w:rPr>
+          <w:rFonts w:ascii="Consolas" w:hAnsi="Consolas"/>
+        </w:rPr>
+        <w:t>scheduler/background.py::_ist_email_relevantes_asset()</w:t>
+      </w:r>
+      <w:r>
+        <w:t xml:space="preserve">: liest </w:t>
+      </w:r>
+      <w:r>
+        <w:rPr>
+          <w:rFonts w:ascii="Consolas" w:hAnsi="Consolas"/>
+        </w:rPr>
+        <w:t>nur_bitpanda_gelistet</w:t>
+      </w:r>
+      <w:r>
+        <w:t xml:space="preserve"> jetzt aus </w:t>
+      </w:r>
+      <w:r>
+        <w:rPr>
+          <w:rFonts w:ascii="Consolas" w:hAnsi="Consolas"/>
+        </w:rPr>
+        <w:t>config.load_config()</w:t>
+      </w:r>
+      <w:r>
+        <w:t>.</w:t>
+      </w:r>
+    </w:p>
+    <w:p>
+      <w:pPr/>
+      <w:r>
+        <w:t xml:space="preserve">- </w:t>
+      </w:r>
+      <w:r>
+        <w:rPr>
+          <w:rFonts w:ascii="Consolas" w:hAnsi="Consolas"/>
+        </w:rPr>
+        <w:t>ui/settings.py</w:t>
+      </w:r>
+      <w:r>
+        <w:t>: _DEFAULTS auf dark_mode reduziert (einzige echte geräte-lokale GUI-Präferenz, die bewusst NICHT synchronisiert werden soll).</w:t>
+      </w:r>
+    </w:p>
+    <w:p>
+      <w:pPr/>
+      <w:r>
+        <w:t xml:space="preserve">- </w:t>
+      </w:r>
+      <w:r>
+        <w:rPr>
+          <w:rFonts w:ascii="Consolas" w:hAnsi="Consolas"/>
+        </w:rPr>
+        <w:t>ui/app.py</w:t>
+      </w:r>
+      <w:r>
+        <w:t>: beide Menü-Handler rufen jetzt die neuen config.py-Schreibfunktionen auf, mit Nutzer-Hinweis-Dialog ("wirkt erst nach Commit+Push+Pull") statt der bisherigen stillschweigenden Sofort-Wirkung.</w:t>
+      </w:r>
+    </w:p>
+    <w:p>
+      <w:pPr/>
+      <w:r>
+        <w:rPr>
+          <w:b/>
+        </w:rPr>
+        <w:t xml:space="preserve">Verifiziert: </w:t>
+      </w:r>
+      <w:r>
+        <w:t>9 synthetische Checks direkt gegen die echte config.yaml (vorher per Backup gesichert, garantiert wiederhergestellt) - Wertaenderung, Ruecksetzung, No-Op bei identischem Wert, ungültiger Wert wirft ValueError. Import-Regressionscheck über alle 7 geänderten Module inkl. ui/app.py und main.py.</w:t>
+      </w:r>
+    </w:p>
+    <w:p>
+      <w:pPr/>
+      <w:r>
+        <w:rPr>
+          <w:b/>
+        </w:rPr>
+        <w:t xml:space="preserve">Bewusst NICHT Teil dieser Runde: </w:t>
+      </w:r>
+      <w:r>
+        <w:t>keine Migration von dark_mode (bleibt bewusst geräte-lokal); keine generelle Überarbeitung des Musters für eventuelle zukünftige GUI-Schalter.</w:t>
       </w:r>
     </w:p>
     <w:sectPr>

</xml_diff>

<commit_message>
Multi-Asset-Batch: Cron/Cooldown-Mismatch gefixt (0-Signale-Bug)
cooldown_stunden_gehalten (24h) lag ueber beiden Abstaenden des 2x/Tag-Crons
(9,19 Uhr, 10h/14h) - dadurch wurde ein gehaltenes Asset praktisch nie wieder
faellig. Log-Beweis: nur 1 produktiver Lauf von ~15 Cron-Firings seit 07-26.
Auf 8h gesenkt (analog Krypto-Spot-Kern-Cooldown).

Co-Authored-By: Claude Sonnet 5 <noreply@anthropic.com>
</commit_message>
<xml_diff>
--- a/Basisinfos/Regelwerksmanual.docx
+++ b/Basisinfos/Regelwerksmanual.docx
@@ -22051,6 +22051,218 @@
       </w:r>
       <w:r>
         <w:t>keine Migration von dark_mode (bleibt bewusst geräte-lokal); keine generelle Überarbeitung des Musters für eventuelle zukünftige GUI-Schalter.</w:t>
+      </w:r>
+    </w:p>
+    <w:p>
+      <w:pPr>
+        <w:pStyle w:val="Heading3"/>
+      </w:pPr>
+      <w:r>
+        <w:t>Nachtrag (2026-07-28, frischer NB-Export): Multi-Asset-Batch Cron/Cooldown-Mismatch gefixt</w:t>
+      </w:r>
+    </w:p>
+    <w:p>
+      <w:pPr/>
+      <w:r>
+        <w:rPr>
+          <w:b/>
+        </w:rPr>
+        <w:t xml:space="preserve">Auslöser: </w:t>
+      </w:r>
+      <w:r>
+        <w:t xml:space="preserve">Nutzer meldete "aus dem Multiassets Bereich NULL Signale" - Analyse eines frischen </w:t>
+      </w:r>
+      <w:r>
+        <w:rPr>
+          <w:rFonts w:ascii="Consolas" w:hAnsi="Consolas"/>
+        </w:rPr>
+        <w:t>extract_notebook_diagnose.py</w:t>
+      </w:r>
+      <w:r>
+        <w:t xml:space="preserve">-Exports (22 MB, 07-28 19:36) plus </w:t>
+      </w:r>
+      <w:r>
+        <w:rPr>
+          <w:rFonts w:ascii="Consolas" w:hAnsi="Consolas"/>
+        </w:rPr>
+        <w:t>tradinginfotool.log</w:t>
+      </w:r>
+      <w:r>
+        <w:t xml:space="preserve"> bestätigte den Verdacht als echten, aktuellen Bug (nicht nur historisch/erledigt wie eine frühere Session vermutet hatte).</w:t>
+      </w:r>
+    </w:p>
+    <w:p>
+      <w:pPr/>
+      <w:r>
+        <w:rPr>
+          <w:b/>
+        </w:rPr>
+        <w:t xml:space="preserve">Root Cause: </w:t>
+      </w:r>
+      <w:r>
+        <w:rPr>
+          <w:rFonts w:ascii="Consolas" w:hAnsi="Consolas"/>
+        </w:rPr>
+        <w:t>MULTI_ASSET_BATCH_CRON_HOURS = "9,19"</w:t>
+      </w:r>
+      <w:r>
+        <w:t xml:space="preserve"> (</w:t>
+      </w:r>
+      <w:r>
+        <w:rPr>
+          <w:rFonts w:ascii="Consolas" w:hAnsi="Consolas"/>
+        </w:rPr>
+        <w:t>scheduler/background.py:98</w:t>
+      </w:r>
+      <w:r>
+        <w:t xml:space="preserve">, seit dem Quotrix-Handelsfenster-Fix 2026-07-20) lässt den Job 2x/Tag laufen, Abstand abwechselnd 10h (09→19 Uhr) und 14h (19→09 Uhr). </w:t>
+      </w:r>
+      <w:r>
+        <w:rPr>
+          <w:rFonts w:ascii="Consolas" w:hAnsi="Consolas"/>
+        </w:rPr>
+        <w:t>cooldown_stunden_gehalten</w:t>
+      </w:r>
+      <w:r>
+        <w:t xml:space="preserve"> stand aber auf 24 - über BEIDEN Abständen. Ein gehaltenes Asset, das um 09:00 verarbeitet wird, ist beim nächsten Lauf (10h später) UND beim übernächsten (14h später, 24h insgesamt) noch im Cooldown - erst der 3. Lauf (~24h nach dem 1.) verarbeitet es wieder. Log-Beweis: von 07-26 bis 07-28 (~15 Cron-Firings) gab es genau EINEN produktiven Lauf ("13 verarbeitet", 07-27 09:05), alle anderen zeigten "0 verarbeitet, 13 Cooldown-übersprungen".</w:t>
+      </w:r>
+    </w:p>
+    <w:p>
+      <w:pPr/>
+      <w:r>
+        <w:rPr>
+          <w:b/>
+        </w:rPr>
+        <w:t xml:space="preserve">Fix: </w:t>
+      </w:r>
+      <w:r>
+        <w:rPr>
+          <w:rFonts w:ascii="Consolas" w:hAnsi="Consolas"/>
+        </w:rPr>
+        <w:t>multi_asset_batch.cooldown_stunden_gehalten</w:t>
+      </w:r>
+      <w:r>
+        <w:t xml:space="preserve"> von 24 auf 8 gesenkt (</w:t>
+      </w:r>
+      <w:r>
+        <w:rPr>
+          <w:rFonts w:ascii="Consolas" w:hAnsi="Consolas"/>
+        </w:rPr>
+        <w:t>Basisinfos/config.yaml</w:t>
+      </w:r>
+      <w:r>
+        <w:t>) - liegt unter beiden Cron-Abständen (10h/14h), angelehnt an das bereits bestehende Krypto-Spot-"Kern"-Muster (</w:t>
+      </w:r>
+      <w:r>
+        <w:rPr>
+          <w:rFonts w:ascii="Consolas" w:hAnsi="Consolas"/>
+        </w:rPr>
+        <w:t>spot_cooldown_stunden_kern=8</w:t>
+      </w:r>
+      <w:r>
+        <w:t xml:space="preserve">). </w:t>
+      </w:r>
+      <w:r>
+        <w:rPr>
+          <w:rFonts w:ascii="Consolas" w:hAnsi="Consolas"/>
+        </w:rPr>
+        <w:t>cooldown_stunden_beobachtet</w:t>
+      </w:r>
+      <w:r>
+        <w:t xml:space="preserve"> (72h, reine Beobachtungs-Kandidaten alle 3 Tage) bewusst unverändert - eigenständiges, absichtliches Design, nicht Teil des Cron-Mismatches.</w:t>
+      </w:r>
+    </w:p>
+    <w:p>
+      <w:pPr/>
+      <w:r>
+        <w:rPr>
+          <w:b/>
+        </w:rPr>
+        <w:t xml:space="preserve">Verifiziert: </w:t>
+      </w:r>
+      <w:r>
+        <w:rPr>
+          <w:rFonts w:ascii="Consolas" w:hAnsi="Consolas"/>
+        </w:rPr>
+        <w:t>yaml.safe_load()</w:t>
+      </w:r>
+      <w:r>
+        <w:t xml:space="preserve"> gegen die geänderte </w:t>
+      </w:r>
+      <w:r>
+        <w:rPr>
+          <w:rFonts w:ascii="Consolas" w:hAnsi="Consolas"/>
+        </w:rPr>
+        <w:t>config.yaml</w:t>
+      </w:r>
+      <w:r>
+        <w:t xml:space="preserve"> - </w:t>
+      </w:r>
+      <w:r>
+        <w:rPr>
+          <w:rFonts w:ascii="Consolas" w:hAnsi="Consolas"/>
+        </w:rPr>
+        <w:t>multi_asset_batch.cooldown_stunden_gehalten == 8</w:t>
+      </w:r>
+      <w:r>
+        <w:t>.</w:t>
+      </w:r>
+    </w:p>
+    <w:p>
+      <w:pPr/>
+      <w:r>
+        <w:rPr>
+          <w:b/>
+        </w:rPr>
+        <w:t>Weitere Funde derselben Analyse (kein Bug, informativ):</w:t>
+      </w:r>
+    </w:p>
+    <w:p>
+      <w:pPr/>
+      <w:r>
+        <w:t>- "84%/93% Historie veraltet"-Muster bei Hebel-Gate-Vetos weiterhin bestätigt reine 07-23-Altlast (keine neuen Treffer seither).</w:t>
+      </w:r>
+    </w:p>
+    <w:p>
+      <w:pPr/>
+      <w:r>
+        <w:t>- Krypto-Hebel-Rückgang bei echten ERÖFFNEN-Signalen (18→10→8→4→3 an den letzten 5 Tagen) überwiegend durch CRV-Risk-Veto (CRV &lt; 2.0) erklärbar - Hebel-Screening findet weiterhin konstant 5-11 Kandidaten/15-Min-Zyklus, keine Erkennungslücke gefunden.</w:t>
+      </w:r>
+    </w:p>
+    <w:p>
+      <w:pPr/>
+      <w:r>
+        <w:t>- Krypto-Spot "massiver Rückgang" nicht bestätigt: 68 echte Signale am 07-28 (bis 19:36), alles reine Krypto-Symbole, normale Aktivität bis 10:33 UTC, danach Stille durch reguläre 8h/15h-Cooldown-Fenster erklärbar.</w:t>
+      </w:r>
+    </w:p>
+    <w:p>
+      <w:pPr/>
+      <w:r>
+        <w:rPr>
+          <w:b/>
+        </w:rPr>
+        <w:t xml:space="preserve">Bewusst NICHT Teil dieser Runde: </w:t>
+      </w:r>
+      <w:r>
+        <w:t xml:space="preserve">Z.ai-Antwortzeit/Wartemechanismus bei Hebel-E-Mails - Nutzer-Beobachtung (Screenshot, Hebel ERÖFFNEN ETH LONG, 07-28 19:37), dass das Fazit des 2. Z.ai-Calls (Richtungs-Abgleich, </w:t>
+      </w:r>
+      <w:r>
+        <w:rPr>
+          <w:rFonts w:ascii="Consolas" w:hAnsi="Consolas"/>
+        </w:rPr>
+        <w:t>zai_eigene_richtung</w:t>
+      </w:r>
+      <w:r>
+        <w:t>/</w:t>
+      </w:r>
+      <w:r>
+        <w:rPr>
+          <w:rFonts w:ascii="Consolas" w:hAnsi="Consolas"/>
+        </w:rPr>
+        <w:t>zai_uebereinstimmung</w:t>
+      </w:r>
+      <w:r>
+        <w:t>) in der E-Mail fehlte, obwohl der 1. Call (Konsistenz-Check) erschien - noch nicht untersucht.</w:t>
       </w:r>
     </w:p>
     <w:sectPr>

</xml_diff>

<commit_message>
Z.ai-E-Mail-Wartezeit auf 90s erhoeht (60s zu knapp fuer sequenzielle Calls)
Log-Auswertung von 8 echten Faellen zeigte 2 Zeitlimit-Ueberschreitungen
(VIRTUAL, NEAR) und mehrere knapp am alten 60s-Limit (48s/57s/60s). Beide
Z.ai-Calls laufen sequenziell und werden gemeinsam geschrieben - reicht die
Zeit nicht, fehlen beide Zeilen in der E-Mail, nicht nur die zweite.

Co-Authored-By: Claude Sonnet 5 <noreply@anthropic.com>
</commit_message>
<xml_diff>
--- a/Basisinfos/Regelwerksmanual.docx
+++ b/Basisinfos/Regelwerksmanual.docx
@@ -22263,6 +22263,164 @@
       </w:r>
       <w:r>
         <w:t>) in der E-Mail fehlte, obwohl der 1. Call (Konsistenz-Check) erschien - noch nicht untersucht.</w:t>
+      </w:r>
+    </w:p>
+    <w:p>
+      <w:pPr>
+        <w:pStyle w:val="Heading3"/>
+      </w:pPr>
+      <w:r>
+        <w:t>Nachtrag (2026-07-28, noch selber Tag): Z.ai-E-Mail-Wartezeit auf 90s erhöht (60s zu knapp)</w:t>
+      </w:r>
+    </w:p>
+    <w:p>
+      <w:pPr/>
+      <w:r>
+        <w:rPr>
+          <w:b/>
+        </w:rPr>
+        <w:t xml:space="preserve">Auslöser: </w:t>
+      </w:r>
+      <w:r>
+        <w:t>Nutzer-Auftrag "Z.ai-Wartezeit-Konstante lokalisieren und Call-2-Laufzeiten prüfen" - direkte Fortsetzung des zuvor vermerkten ETH-LONG-Screenshot-Funds.</w:t>
+      </w:r>
+    </w:p>
+    <w:p>
+      <w:pPr/>
+      <w:r>
+        <w:rPr>
+          <w:b/>
+        </w:rPr>
+        <w:t xml:space="preserve">Fund: </w:t>
+      </w:r>
+      <w:r>
+        <w:rPr>
+          <w:rFonts w:ascii="Consolas" w:hAnsi="Consolas"/>
+        </w:rPr>
+        <w:t>_ZAI_EMAIL_WARTE_MAX_SEKUNDEN = 60</w:t>
+      </w:r>
+      <w:r>
+        <w:t xml:space="preserve"> / </w:t>
+      </w:r>
+      <w:r>
+        <w:rPr>
+          <w:rFonts w:ascii="Consolas" w:hAnsi="Consolas"/>
+        </w:rPr>
+        <w:t>_ZAI_EMAIL_POLL_INTERVALL_SEKUNDEN = 3</w:t>
+      </w:r>
+      <w:r>
+        <w:t xml:space="preserve"> in </w:t>
+      </w:r>
+      <w:r>
+        <w:rPr>
+          <w:rFonts w:ascii="Consolas" w:hAnsi="Consolas"/>
+        </w:rPr>
+        <w:t>scheduler/background.py::_sende_signal_email_mit_zai_wartezeit()</w:t>
+      </w:r>
+      <w:r>
+        <w:t xml:space="preserve">. Beide Z.ai-Calls laufen SEQUENZIELL (Call 2 Richtungs-Abgleich startet erst nach Call 1 Konsistenz-Check, siehe </w:t>
+      </w:r>
+      <w:r>
+        <w:rPr>
+          <w:rFonts w:ascii="Consolas" w:hAnsi="Consolas"/>
+        </w:rPr>
+        <w:t>agent/krypto/gegenpruefung.py::fuehre_beide_calls_im_hintergrund()</w:t>
+      </w:r>
+      <w:r>
+        <w:t>) und werden GEMEINSAM in einem DB-Update geschrieben - kein Teilschreiben, die E-Mail bekommt entweder beide Z.ai-Zeilen oder keine.</w:t>
+      </w:r>
+    </w:p>
+    <w:p>
+      <w:pPr/>
+      <w:r>
+        <w:t>Log-Auswertung (</w:t>
+      </w:r>
+      <w:r>
+        <w:rPr>
+          <w:rFonts w:ascii="Consolas" w:hAnsi="Consolas"/>
+        </w:rPr>
+        <w:t>tradinginfotool.log</w:t>
+      </w:r>
+      <w:r>
+        <w:t>, 8 echte Fälle 07-26 bis 07-28): HYPE 48s/27s, LINK 42s, NEAR 42s/60s(genau am Limit)/60s(Zeitlimit, gescheitert), VIRTUAL 60s (Zeitlimit, gescheitert), TAO 57s. 2 von 8 Fällen (25%) liefen tatsächlich ins alte 60s-Limit, mehrere weitere lagen knapp darunter (48s/57s/60s) - die "typisch 12-25s je Call"-Doku-Annahme summiert sich sequenziell auf 24-50s im Normalfall, mit Ausreißern darüber.</w:t>
+      </w:r>
+    </w:p>
+    <w:p>
+      <w:pPr/>
+      <w:r>
+        <w:rPr>
+          <w:b/>
+        </w:rPr>
+        <w:t xml:space="preserve">Fix: </w:t>
+      </w:r>
+      <w:r>
+        <w:rPr>
+          <w:rFonts w:ascii="Consolas" w:hAnsi="Consolas"/>
+        </w:rPr>
+        <w:t>_ZAI_EMAIL_WARTE_MAX_SEKUNDEN</w:t>
+      </w:r>
+      <w:r>
+        <w:t xml:space="preserve"> von 60 auf 90 erhöht (Puffer über dem beobachteten Maximalwert 60s). Poll-Intervall (3s) unverändert.</w:t>
+      </w:r>
+    </w:p>
+    <w:p>
+      <w:pPr/>
+      <w:r>
+        <w:rPr>
+          <w:b/>
+        </w:rPr>
+        <w:t xml:space="preserve">Verifiziert: </w:t>
+      </w:r>
+      <w:r>
+        <w:t xml:space="preserve">Syntax-/Import-Check von </w:t>
+      </w:r>
+      <w:r>
+        <w:rPr>
+          <w:rFonts w:ascii="Consolas" w:hAnsi="Consolas"/>
+        </w:rPr>
+        <w:t>scheduler/background.py</w:t>
+      </w:r>
+      <w:r>
+        <w:t>.</w:t>
+      </w:r>
+    </w:p>
+    <w:p>
+      <w:pPr/>
+      <w:r>
+        <w:rPr>
+          <w:b/>
+        </w:rPr>
+        <w:t xml:space="preserve">Bewusst NICHT Teil dieser Runde: </w:t>
+      </w:r>
+      <w:r>
+        <w:t xml:space="preserve">die konkrete ETH-LONG-Mail (07-28 19:37) selbst konnte nicht direkt nachvollzogen werden - sie wurde nach dem letzten verfügbaren Log-Sync (19:36) verschickt, dafür gibt es keine Log-Zeile. Die Neukalibrierung stützt sich auf die 8 anderen, bereits geloggten Fälle. Keine Umstellung von sequenziell auf parallel (beide Calls gleichzeitig starten würde die Wartezeit auf </w:t>
+      </w:r>
+      <w:r>
+        <w:rPr>
+          <w:rFonts w:ascii="Consolas" w:hAnsi="Consolas"/>
+        </w:rPr>
+        <w:t>max(Call1, Call2)</w:t>
+      </w:r>
+      <w:r>
+        <w:t xml:space="preserve"> statt </w:t>
+      </w:r>
+      <w:r>
+        <w:rPr>
+          <w:rFonts w:ascii="Consolas" w:hAnsi="Consolas"/>
+        </w:rPr>
+        <w:t>Call1+Call2</w:t>
+      </w:r>
+      <w:r>
+        <w:t xml:space="preserve"> senken) - nicht angefragt, würde eine tiefere Änderung an </w:t>
+      </w:r>
+      <w:r>
+        <w:rPr>
+          <w:rFonts w:ascii="Consolas" w:hAnsi="Consolas"/>
+        </w:rPr>
+        <w:t>fuehre_beide_calls_im_hintergrund()</w:t>
+      </w:r>
+      <w:r>
+        <w:t xml:space="preserve"> erfordern.</w:t>
       </w:r>
     </w:p>
     <w:sectPr>

</xml_diff>

<commit_message>
Enge-Stop-Loss (Hebel): ATR-relativer SL-Richtwert statt Hard-Veto (Option D)
Neuer Fakt atr.relativ_prozent + weiche Prompt-Regel in hebel_analyst.py
Regel 6 (1,5x-Richtwert, kein Zwang), basierend auf Backtest von 61 aufgeloesten
Hebel-Trades (SL-Abstand <5% = 0-16,7% Win-Rate vs. 31,2% bei 5-10%). Bewusst
ohne Hard-Veto, um keine Signale zu verlieren. Neuer Fakt in
Fakten_Entscheidungsmappe.md katalogisiert (Frage-1/Frage-2-Raster),
Word-Pendants fuer Fakten_Entscheidungsmappe.md und
Test_und_Verifikationsmethodik.md ergaenzt.

Co-Authored-By: Claude Sonnet 5 <noreply@anthropic.com>
</commit_message>
<xml_diff>
--- a/Basisinfos/Regelwerksmanual.docx
+++ b/Basisinfos/Regelwerksmanual.docx
@@ -22932,6 +22932,837 @@
       </w:r>
       <w:r>
         <w:t>synthetische Tests fuer alle neuen Funktionen, Flask-Smoke-Test (Index-HTML + /api/status), SQL-Spaltenlisten-Syntaxcheck, echter Lauf gegen eine Kopie der Produktions-DB (Original nie direkt geoeffnet): 4 reale Spot- und 1 reales Hebel-Veto-HALTEN gefunden, davon 1 Hebel-Zeile mit vollstaendigen Zonen als echter Schatten-Kandidat; End-to-End-Lauf loeste eine echte historische Aktien/Cerebras-Zeile als Stop-Loss auf (Ø CRV -2,10) und die Hebel-Zeile als Abgelaufen - keine Abstuerze, kein Datenverlust.</w:t>
+      </w:r>
+    </w:p>
+    <w:p>
+      <w:pPr>
+        <w:pStyle w:val="Heading3"/>
+      </w:pPr>
+      <w:r>
+        <w:t>Nachtrag (2026-07-28): Punkt 0b - Wartezeit bis Mistral-Hebel-Signale als Stop-Loss/Richtungsverfehlung aufgelöst werden, PLUS Enge-Stop-Loss-Backtest jetzt ausreichend Stichprobe</w:t>
+      </w:r>
+    </w:p>
+    <w:p>
+      <w:pPr/>
+      <w:r>
+        <w:rPr>
+          <w:b/>
+        </w:rPr>
+        <w:t xml:space="preserve">Auslöser: </w:t>
+      </w:r>
+      <w:r>
+        <w:t>Nutzer-Auftrag im selben Analyseblock wie Punkt 0 (Z.ai-Fakten-Prüfung): "wie lange die Wartezeit war bis Mistral - als falsche Richtung bzw. hat Zielzone nicht erreicht gemessen wurde - als Experte". Analysiert gegen den frischesten Notebook-Export (28.07., 22:07 Uhr).</w:t>
+      </w:r>
+    </w:p>
+    <w:p>
+      <w:pPr/>
+      <w:r>
+        <w:rPr>
+          <w:b/>
+        </w:rPr>
+        <w:t xml:space="preserve">Methodischer Hinweis: </w:t>
+      </w:r>
+      <w:r>
+        <w:rPr>
+          <w:rFonts w:ascii="Consolas" w:hAnsi="Consolas"/>
+        </w:rPr>
+        <w:t>outcome_entschieden_am</w:t>
+      </w:r>
+      <w:r>
+        <w:t>/</w:t>
+      </w:r>
+      <w:r>
+        <w:rPr>
+          <w:rFonts w:ascii="Consolas" w:hAnsi="Consolas"/>
+        </w:rPr>
+        <w:t>outcome_geprueft_am</w:t>
+      </w:r>
+      <w:r>
+        <w:t xml:space="preserve"> sind reine Kalendertag-Strings (aus der Tages-OHLC-Zeile </w:t>
+      </w:r>
+      <w:r>
+        <w:rPr>
+          <w:rFonts w:ascii="Consolas" w:hAnsi="Consolas"/>
+        </w:rPr>
+        <w:t>row.date</w:t>
+      </w:r>
+      <w:r>
+        <w:t xml:space="preserve">), </w:t>
+      </w:r>
+      <w:r>
+        <w:rPr>
+          <w:rFonts w:ascii="Consolas" w:hAnsi="Consolas"/>
+        </w:rPr>
+        <w:t>created_at</w:t>
+      </w:r>
+      <w:r>
+        <w:t xml:space="preserve"> ist ein voller Zeitstempel - eine naive Sekunden-Differenz erzeugt bei Auflösung am Erstellungstag scheinbar negative Wartezeiten. Korrekt: auf Kalendertag-Basis rechnen.</w:t>
+      </w:r>
+    </w:p>
+    <w:p>
+      <w:pPr/>
+      <w:r>
+        <w:rPr>
+          <w:b/>
+        </w:rPr>
+        <w:t>Ergebnis (694 Mistral-Hebel-Signale):</w:t>
+      </w:r>
+    </w:p>
+    <w:tbl>
+      <w:tblPr>
+        <w:tblStyle w:val="LightGrid-Accent1"/>
+        <w:tblW w:type="auto" w:w="0"/>
+        <w:tblLook w:firstColumn="1" w:firstRow="1" w:lastColumn="0" w:lastRow="0" w:noHBand="0" w:noVBand="1" w:val="04A0"/>
+      </w:tblPr>
+      <w:tblGrid>
+        <w:gridCol w:w="2436"/>
+        <w:gridCol w:w="2436"/>
+        <w:gridCol w:w="2436"/>
+        <w:gridCol w:w="2436"/>
+      </w:tblGrid>
+      <w:tr>
+        <w:tc>
+          <w:tcPr>
+            <w:tcW w:type="dxa" w:w="2436"/>
+          </w:tcPr>
+          <w:p>
+            <w:r>
+              <w:t>Ausgang</w:t>
+            </w:r>
+          </w:p>
+        </w:tc>
+        <w:tc>
+          <w:tcPr>
+            <w:tcW w:type="dxa" w:w="2436"/>
+          </w:tcPr>
+          <w:p>
+            <w:r>
+              <w:t>n</w:t>
+            </w:r>
+          </w:p>
+        </w:tc>
+        <w:tc>
+          <w:tcPr>
+            <w:tcW w:type="dxa" w:w="2436"/>
+          </w:tcPr>
+          <w:p>
+            <w:r>
+              <w:t>Median</w:t>
+            </w:r>
+          </w:p>
+        </w:tc>
+        <w:tc>
+          <w:tcPr>
+            <w:tcW w:type="dxa" w:w="2436"/>
+          </w:tcPr>
+          <w:p>
+            <w:r>
+              <w:t>Mittelwert</w:t>
+            </w:r>
+          </w:p>
+        </w:tc>
+      </w:tr>
+      <w:tr>
+        <w:tc>
+          <w:tcPr>
+            <w:tcW w:type="dxa" w:w="2436"/>
+          </w:tcPr>
+          <w:p>
+            <w:r>
+              <w:t>Stop-Loss erreicht</w:t>
+            </w:r>
+          </w:p>
+        </w:tc>
+        <w:tc>
+          <w:tcPr>
+            <w:tcW w:type="dxa" w:w="2436"/>
+          </w:tcPr>
+          <w:p>
+            <w:r>
+              <w:t>50</w:t>
+            </w:r>
+          </w:p>
+        </w:tc>
+        <w:tc>
+          <w:tcPr>
+            <w:tcW w:type="dxa" w:w="2436"/>
+          </w:tcPr>
+          <w:p>
+            <w:r>
+              <w:t>1 Tag</w:t>
+            </w:r>
+          </w:p>
+        </w:tc>
+        <w:tc>
+          <w:tcPr>
+            <w:tcW w:type="dxa" w:w="2436"/>
+          </w:tcPr>
+          <w:p>
+            <w:r>
+              <w:t>1,60 Tage</w:t>
+            </w:r>
+          </w:p>
+        </w:tc>
+      </w:tr>
+      <w:tr>
+        <w:tc>
+          <w:tcPr>
+            <w:tcW w:type="dxa" w:w="2436"/>
+          </w:tcPr>
+          <w:p>
+            <w:r>
+              <w:t>Take-Profit erreicht</w:t>
+            </w:r>
+          </w:p>
+        </w:tc>
+        <w:tc>
+          <w:tcPr>
+            <w:tcW w:type="dxa" w:w="2436"/>
+          </w:tcPr>
+          <w:p>
+            <w:r>
+              <w:t>11</w:t>
+            </w:r>
+          </w:p>
+        </w:tc>
+        <w:tc>
+          <w:tcPr>
+            <w:tcW w:type="dxa" w:w="2436"/>
+          </w:tcPr>
+          <w:p>
+            <w:r>
+              <w:t>2 Tage</w:t>
+            </w:r>
+          </w:p>
+        </w:tc>
+        <w:tc>
+          <w:tcPr>
+            <w:tcW w:type="dxa" w:w="2436"/>
+          </w:tcPr>
+          <w:p>
+            <w:r>
+              <w:t>2,36 Tage</w:t>
+            </w:r>
+          </w:p>
+        </w:tc>
+      </w:tr>
+      <w:tr>
+        <w:tc>
+          <w:tcPr>
+            <w:tcW w:type="dxa" w:w="2436"/>
+          </w:tcPr>
+          <w:p>
+            <w:r>
+              <w:t>Richtungsverfehlung ohne SL</w:t>
+            </w:r>
+          </w:p>
+        </w:tc>
+        <w:tc>
+          <w:tcPr>
+            <w:tcW w:type="dxa" w:w="2436"/>
+          </w:tcPr>
+          <w:p>
+            <w:r>
+              <w:t>19</w:t>
+            </w:r>
+          </w:p>
+        </w:tc>
+        <w:tc>
+          <w:tcPr>
+            <w:tcW w:type="dxa" w:w="2436"/>
+          </w:tcPr>
+          <w:p>
+            <w:r>
+              <w:t>1 Tag</w:t>
+            </w:r>
+          </w:p>
+        </w:tc>
+        <w:tc>
+          <w:tcPr>
+            <w:tcW w:type="dxa" w:w="2436"/>
+          </w:tcPr>
+          <w:p>
+            <w:r>
+              <w:t>1,53 Tage</w:t>
+            </w:r>
+          </w:p>
+        </w:tc>
+      </w:tr>
+    </w:tbl>
+    <w:p>
+      <w:pPr/>
+      <w:r>
+        <w:rPr>
+          <w:b/>
+        </w:rPr>
+        <w:t xml:space="preserve">Einordnung: </w:t>
+      </w:r>
+      <w:r>
+        <w:t>Verluste lösen sich fast doppelt so schnell auf wie Gewinne (1 vs. 2 Tage Median) - die Messung wartet bei Fehlschlägen NICHT zu lange, sie schlägt eher zu früh zu. Die Hypothese "die Wartezeit selbst verzerrt das schlechte Mistral-Bild nach unten" ist damit entkräftet.</w:t>
+      </w:r>
+    </w:p>
+    <w:p>
+      <w:pPr/>
+      <w:r>
+        <w:rPr>
+          <w:b/>
+        </w:rPr>
+        <w:t xml:space="preserve">Direkter Anschluss an den Enge-Stop-Loss-Fund (22.07.): </w:t>
+      </w:r>
+      <w:r>
+        <w:t>von den 50 Stop-Loss-Fällen haben 39 (78%) einen SL-Abstand unter 5%, Ø aller 50 Fälle nur 3,5% - mitten in der damals identifizierten blinden Zone (2-5%), die der bestehende Risikofaktor mit seiner 2%-Schwelle verpasst. Diese engen Fälle lösen sich noch schneller auf (Median 1 Tag) als die wenigen mit weiterem SL (Median 2 Tage).</w:t>
+      </w:r>
+    </w:p>
+    <w:p>
+      <w:pPr/>
+      <w:r>
+        <w:rPr>
+          <w:b/>
+        </w:rPr>
+        <w:t>Backtest jetzt mit ausreichender Stichprobe (Wiedervorlage-Bedingung n≥15/Bucket aus dem 27.07.-Fund war bei n=5-11 noch nicht erfüllt, jetzt erfüllt):</w:t>
+      </w:r>
+    </w:p>
+    <w:tbl>
+      <w:tblPr>
+        <w:tblStyle w:val="LightGrid-Accent1"/>
+        <w:tblW w:type="auto" w:w="0"/>
+        <w:tblLook w:firstColumn="1" w:firstRow="1" w:lastColumn="0" w:lastRow="0" w:noHBand="0" w:noVBand="1" w:val="04A0"/>
+      </w:tblPr>
+      <w:tblGrid>
+        <w:gridCol w:w="2436"/>
+        <w:gridCol w:w="2436"/>
+        <w:gridCol w:w="2436"/>
+        <w:gridCol w:w="2436"/>
+      </w:tblGrid>
+      <w:tr>
+        <w:tc>
+          <w:tcPr>
+            <w:tcW w:type="dxa" w:w="2436"/>
+          </w:tcPr>
+          <w:p>
+            <w:r>
+              <w:t>SL-Abstand-Bucket</w:t>
+            </w:r>
+          </w:p>
+        </w:tc>
+        <w:tc>
+          <w:tcPr>
+            <w:tcW w:type="dxa" w:w="2436"/>
+          </w:tcPr>
+          <w:p>
+            <w:r>
+              <w:t>n</w:t>
+            </w:r>
+          </w:p>
+        </w:tc>
+        <w:tc>
+          <w:tcPr>
+            <w:tcW w:type="dxa" w:w="2436"/>
+          </w:tcPr>
+          <w:p>
+            <w:r>
+              <w:t>Win-Rate</w:t>
+            </w:r>
+          </w:p>
+        </w:tc>
+        <w:tc>
+          <w:tcPr>
+            <w:tcW w:type="dxa" w:w="2436"/>
+          </w:tcPr>
+          <w:p>
+            <w:r>
+              <w:t>Ø realisiertes CRV</w:t>
+            </w:r>
+          </w:p>
+        </w:tc>
+      </w:tr>
+      <w:tr>
+        <w:tc>
+          <w:tcPr>
+            <w:tcW w:type="dxa" w:w="2436"/>
+          </w:tcPr>
+          <w:p>
+            <w:r>
+              <w:t>&lt;2%</w:t>
+            </w:r>
+          </w:p>
+        </w:tc>
+        <w:tc>
+          <w:tcPr>
+            <w:tcW w:type="dxa" w:w="2436"/>
+          </w:tcPr>
+          <w:p>
+            <w:r>
+              <w:t>9</w:t>
+            </w:r>
+          </w:p>
+        </w:tc>
+        <w:tc>
+          <w:tcPr>
+            <w:tcW w:type="dxa" w:w="2436"/>
+          </w:tcPr>
+          <w:p>
+            <w:r>
+              <w:t>0,0%</w:t>
+            </w:r>
+          </w:p>
+        </w:tc>
+        <w:tc>
+          <w:tcPr>
+            <w:tcW w:type="dxa" w:w="2436"/>
+          </w:tcPr>
+          <w:p>
+            <w:r>
+              <w:t>-1,00</w:t>
+            </w:r>
+          </w:p>
+        </w:tc>
+      </w:tr>
+      <w:tr>
+        <w:tc>
+          <w:tcPr>
+            <w:tcW w:type="dxa" w:w="2436"/>
+          </w:tcPr>
+          <w:p>
+            <w:r>
+              <w:t>2-5%</w:t>
+            </w:r>
+          </w:p>
+        </w:tc>
+        <w:tc>
+          <w:tcPr>
+            <w:tcW w:type="dxa" w:w="2436"/>
+          </w:tcPr>
+          <w:p>
+            <w:r>
+              <w:t>36</w:t>
+            </w:r>
+          </w:p>
+        </w:tc>
+        <w:tc>
+          <w:tcPr>
+            <w:tcW w:type="dxa" w:w="2436"/>
+          </w:tcPr>
+          <w:p>
+            <w:r>
+              <w:t>16,7%</w:t>
+            </w:r>
+          </w:p>
+        </w:tc>
+        <w:tc>
+          <w:tcPr>
+            <w:tcW w:type="dxa" w:w="2436"/>
+          </w:tcPr>
+          <w:p>
+            <w:r>
+              <w:t>-0,41</w:t>
+            </w:r>
+          </w:p>
+        </w:tc>
+      </w:tr>
+      <w:tr>
+        <w:tc>
+          <w:tcPr>
+            <w:tcW w:type="dxa" w:w="2436"/>
+          </w:tcPr>
+          <w:p>
+            <w:r>
+              <w:t>5-10%</w:t>
+            </w:r>
+          </w:p>
+        </w:tc>
+        <w:tc>
+          <w:tcPr>
+            <w:tcW w:type="dxa" w:w="2436"/>
+          </w:tcPr>
+          <w:p>
+            <w:r>
+              <w:t>16</w:t>
+            </w:r>
+          </w:p>
+        </w:tc>
+        <w:tc>
+          <w:tcPr>
+            <w:tcW w:type="dxa" w:w="2436"/>
+          </w:tcPr>
+          <w:p>
+            <w:r>
+              <w:t>31,2%</w:t>
+            </w:r>
+          </w:p>
+        </w:tc>
+        <w:tc>
+          <w:tcPr>
+            <w:tcW w:type="dxa" w:w="2436"/>
+          </w:tcPr>
+          <w:p>
+            <w:r>
+              <w:t>+0,31</w:t>
+            </w:r>
+          </w:p>
+        </w:tc>
+      </w:tr>
+      <w:tr>
+        <w:tc>
+          <w:tcPr>
+            <w:tcW w:type="dxa" w:w="2436"/>
+          </w:tcPr>
+          <w:p>
+            <w:r>
+              <w:t>≥10%</w:t>
+            </w:r>
+          </w:p>
+        </w:tc>
+        <w:tc>
+          <w:tcPr>
+            <w:tcW w:type="dxa" w:w="2436"/>
+          </w:tcPr>
+          <w:p>
+            <w:r>
+              <w:t>0</w:t>
+            </w:r>
+          </w:p>
+        </w:tc>
+        <w:tc>
+          <w:tcPr>
+            <w:tcW w:type="dxa" w:w="2436"/>
+          </w:tcPr>
+          <w:p>
+            <w:r>
+              <w:t>-</w:t>
+            </w:r>
+          </w:p>
+        </w:tc>
+        <w:tc>
+          <w:tcPr>
+            <w:tcW w:type="dxa" w:w="2436"/>
+          </w:tcPr>
+          <w:p>
+            <w:r>
+              <w:t>-</w:t>
+            </w:r>
+          </w:p>
+        </w:tc>
+      </w:tr>
+    </w:tbl>
+    <w:p>
+      <w:pPr/>
+      <w:r>
+        <w:t xml:space="preserve">Monotoner Zusammenhang: je enger der Stop, desto schlechter Win-Rate/CRV. </w:t>
+      </w:r>
+      <w:r>
+        <w:rPr>
+          <w:rFonts w:ascii="Consolas" w:hAnsi="Consolas"/>
+        </w:rPr>
+        <w:t>2-5%</w:t>
+      </w:r>
+      <w:r>
+        <w:t xml:space="preserve"> (n=36) und </w:t>
+      </w:r>
+      <w:r>
+        <w:rPr>
+          <w:rFonts w:ascii="Consolas" w:hAnsi="Consolas"/>
+        </w:rPr>
+        <w:t>5-10%</w:t>
+      </w:r>
+      <w:r>
+        <w:t xml:space="preserve"> (n=16) sind jetzt beide über der n≥15-Schwelle - die 27.07. gesetzte Wiedervorlage-Bedingung ist damit erfüllt.</w:t>
+      </w:r>
+    </w:p>
+    <w:p>
+      <w:pPr/>
+      <w:r>
+        <w:rPr>
+          <w:b/>
+        </w:rPr>
+        <w:t>Diskutierte Lösungsoptionen (Entscheidung ausständig):</w:t>
+      </w:r>
+    </w:p>
+    <w:p>
+      <w:pPr/>
+      <w:r>
+        <w:t xml:space="preserve">- A (soft): </w:t>
+      </w:r>
+      <w:r>
+        <w:rPr>
+          <w:rFonts w:ascii="Consolas" w:hAnsi="Consolas"/>
+        </w:rPr>
+        <w:t>sl_abstand_eng_schwelle_relativ</w:t>
+      </w:r>
+      <w:r>
+        <w:t xml:space="preserve"> von 2% auf 5% anheben - rein informativ, kein Verhaltenszwang.</w:t>
+      </w:r>
+    </w:p>
+    <w:p>
+      <w:pPr/>
+      <w:r>
+        <w:t xml:space="preserve">- B (hart): neuer deterministischer Veto in </w:t>
+      </w:r>
+      <w:r>
+        <w:rPr>
+          <w:rFonts w:ascii="Consolas" w:hAnsi="Consolas"/>
+        </w:rPr>
+        <w:t>post_check_hebel()</w:t>
+      </w:r>
+      <w:r>
+        <w:t xml:space="preserve"> analog zur CRV-Pflicht - SL-Abstand &lt;5% erzwingt HALTEN. Würde durch das frisch gebaute Veto-Schatten-Tracking automatisch weiterbeobachtet.</w:t>
+      </w:r>
+    </w:p>
+    <w:p>
+      <w:pPr/>
+      <w:r>
+        <w:t>- C (mittel): Positionsgröße statt Hard-Veto skalieren (analog Konfidenz-Skalierung).</w:t>
+      </w:r>
+    </w:p>
+    <w:p>
+      <w:pPr/>
+      <w:r>
+        <w:t>- D (präziser, größerer Aufwand): Schwelle relativ zur Volatilität (ATR-Perzentil, bereits vorhanden) statt fixem Prozentsatz.</w:t>
+      </w:r>
+    </w:p>
+    <w:p>
+      <w:pPr>
+        <w:pStyle w:val="Heading3"/>
+      </w:pPr>
+      <w:r>
+        <w:t>Nachtrag (2026-07-28): Option D umgesetzt (Fakt + Prompt-Regel, bewusst OHNE Hard-Veto) - Root-Cause-Analyse vor Umsetzung</w:t>
+      </w:r>
+    </w:p>
+    <w:p>
+      <w:pPr/>
+      <w:r>
+        <w:rPr>
+          <w:b/>
+        </w:rPr>
+        <w:t xml:space="preserve">Root-Cause-Analyse: </w:t>
+      </w:r>
+      <w:r>
+        <w:t xml:space="preserve">kein Rechenfehler in der bestehenden CRV-/Zonen-Logik gefunden. Ursache ist eine Prompt-/Fakten-Lücke in </w:t>
+      </w:r>
+      <w:r>
+        <w:rPr>
+          <w:rFonts w:ascii="Consolas" w:hAnsi="Consolas"/>
+        </w:rPr>
+        <w:t>agent/krypto/hebel_analyst.py</w:t>
+      </w:r>
+      <w:r>
+        <w:t xml:space="preserve">: (1) Regel 6 verlangte nur Ableitung aus echten Referenzpunkten, ohne Mindestdistanz-Vorgabe; (2) </w:t>
+      </w:r>
+      <w:r>
+        <w:rPr>
+          <w:rFonts w:ascii="Consolas" w:hAnsi="Consolas"/>
+        </w:rPr>
+        <w:t>atr.wert</w:t>
+      </w:r>
+      <w:r>
+        <w:t xml:space="preserve"> wurde nur als absoluter Preis geliefert, das Modell musste die Umrechnung in Relation zum Kurs selbst vornehmen; (3) Nebenbefund: die ATR-Näherung fuer Nicht-Kraken-Symbole unterschätzt Volatilität strukturell.</w:t>
+      </w:r>
+    </w:p>
+    <w:p>
+      <w:pPr/>
+      <w:r>
+        <w:rPr>
+          <w:b/>
+        </w:rPr>
+        <w:t xml:space="preserve">Cross-Check-Empfehlung: </w:t>
+      </w:r>
+      <w:r>
+        <w:t>der bereits durchgeführte Backtest gegen reale Trade-Ausgänge ist der belastbarste Cross-Check. Zusätzlich empfohlen (nicht Teil dieser Runde): eigene Wilder-ATR-Implementierung gegen eine Referenzbibliothek (z. B. pandas-ta) gegenrechnen; Stichprobenvergleich gegen eine externe Chartquelle.</w:t>
+      </w:r>
+    </w:p>
+    <w:p>
+      <w:pPr/>
+      <w:r>
+        <w:rPr>
+          <w:b/>
+        </w:rPr>
+        <w:t xml:space="preserve">Entscheidung: D statt B. </w:t>
+      </w:r>
+      <w:r>
+        <w:t>B (harter 5%-Fixprozent-Veto) würde nur das Symptom kappen - ein fixer Cutoff ist für BTC in ruhiger Phase zu großzügig und für einen volatilen Altcoin in einer Squeeze-Phase weiterhin zu eng. D behebt die tatsächliche Ursache. Nutzer-Vorgabe: "safe genug ... dass wir keine Signale unötig wegschmeissen" - deshalb bewusst OHNE deterministischen Backstop-Veto in dieser Runde.</w:t>
+      </w:r>
+    </w:p>
+    <w:p>
+      <w:pPr/>
+      <w:r>
+        <w:rPr>
+          <w:b/>
+        </w:rPr>
+        <w:t>Umsetzung (`agent/krypto/hebel_analyst.py::build_hebel_facts()`):</w:t>
+      </w:r>
+    </w:p>
+    <w:p>
+      <w:pPr/>
+      <w:r>
+        <w:t xml:space="preserve">- Neuer Fakt </w:t>
+      </w:r>
+      <w:r>
+        <w:rPr>
+          <w:rFonts w:ascii="Consolas" w:hAnsi="Consolas"/>
+        </w:rPr>
+        <w:t>technische_analyse.atr.relativ_prozent</w:t>
+      </w:r>
+      <w:r>
+        <w:t xml:space="preserve"> = ATR-Wert / aktueller Kurs × 100 (gerundet auf 2 Nachkommastellen), </w:t>
+      </w:r>
+      <w:r>
+        <w:rPr>
+          <w:rFonts w:ascii="Consolas" w:hAnsi="Consolas"/>
+        </w:rPr>
+        <w:t>None</w:t>
+      </w:r>
+      <w:r>
+        <w:t xml:space="preserve"> wenn ATR oder Preis fehlt/0 ist.</w:t>
+      </w:r>
+    </w:p>
+    <w:p>
+      <w:pPr/>
+      <w:r>
+        <w:t xml:space="preserve">- Regel 6 um einen Richtwert erweitert: Stop-Loss-Abstand sollte in der Regel mindestens dem 1,5-fachen von </w:t>
+      </w:r>
+      <w:r>
+        <w:rPr>
+          <w:rFonts w:ascii="Consolas" w:hAnsi="Consolas"/>
+        </w:rPr>
+        <w:t>atr.relativ_prozent</w:t>
+      </w:r>
+      <w:r>
+        <w:t xml:space="preserve"> entsprechen, mit explizitem Hinweis auf den Backtest-Befund (SL&lt;5% = 0-16,7% Win-Rate, 5-10% = 31,2%). Ausdrücklich als RICHTWERT markiert (nicht wie das CRV-Minimum in Regel 5 eine harte Vorgabe) - begründetes Abweichen bei einem klar näheren Support/Widerstand/Fibonacci-Level ist erlaubt, muss aber in </w:t>
+      </w:r>
+      <w:r>
+        <w:rPr>
+          <w:rFonts w:ascii="Consolas" w:hAnsi="Consolas"/>
+        </w:rPr>
+        <w:t>short_reasoning</w:t>
+      </w:r>
+      <w:r>
+        <w:t xml:space="preserve"> explizit genannt werden.</w:t>
+      </w:r>
+    </w:p>
+    <w:p>
+      <w:pPr/>
+      <w:r>
+        <w:t xml:space="preserve">- Bewusst NICHT verändert: der bestehende "Enger Stop-Loss"-Risikofaktor in </w:t>
+      </w:r>
+      <w:r>
+        <w:rPr>
+          <w:rFonts w:ascii="Consolas" w:hAnsi="Consolas"/>
+        </w:rPr>
+        <w:t>hebel_risk_gate.py</w:t>
+      </w:r>
+      <w:r>
+        <w:t xml:space="preserve"> (weiterhin fixer 2%-Schwellenwert, rein informativ).</w:t>
+      </w:r>
+    </w:p>
+    <w:p>
+      <w:pPr/>
+      <w:r>
+        <w:rPr>
+          <w:b/>
+        </w:rPr>
+        <w:t xml:space="preserve">Verifiziert: </w:t>
+      </w:r>
+      <w:r>
+        <w:t xml:space="preserve">Import-Regressionscheck, isolierter Test der neuen Berechnung inkl. Edge Cases (ATR/Preis </w:t>
+      </w:r>
+      <w:r>
+        <w:rPr>
+          <w:rFonts w:ascii="Consolas" w:hAnsi="Consolas"/>
+        </w:rPr>
+        <w:t>None</w:t>
+      </w:r>
+      <w:r>
+        <w:t>, Preis 0 - kein Crash).</w:t>
+      </w:r>
+    </w:p>
+    <w:p>
+      <w:pPr/>
+      <w:r>
+        <w:rPr>
+          <w:b/>
+        </w:rPr>
+        <w:t xml:space="preserve">Bewusst NICHT Teil dieser Runde: </w:t>
+      </w:r>
+      <w:r>
+        <w:t>kein harter Veto (Option B verworfen); keine Änderung an Spot-family-Analysten; kein Cross-Check gegen externe ATR-Referenzbibliothek.</w:t>
+      </w:r>
+    </w:p>
+    <w:p>
+      <w:pPr/>
+      <w:r>
+        <w:rPr>
+          <w:b/>
+        </w:rPr>
+        <w:t xml:space="preserve">Ergänzende Dokumentation: </w:t>
+      </w:r>
+      <w:r>
+        <w:t xml:space="preserve">die volle WARUM-Ebene (Problem/Root-Cause/Optionen/Erwartete Wirkung/Messplan) sowie das laufende Backtest-Protokoll wurden ab diesem Fund in zwei neue eigenständige Dateien ausgelagert: </w:t>
+      </w:r>
+      <w:r>
+        <w:rPr>
+          <w:rFonts w:ascii="Consolas" w:hAnsi="Consolas"/>
+        </w:rPr>
+        <w:t>Basisinfos/Strukturierte_Bewertung.md</w:t>
+      </w:r>
+      <w:r>
+        <w:t xml:space="preserve"> (Entscheidungsjournal) und </w:t>
+      </w:r>
+      <w:r>
+        <w:rPr>
+          <w:rFonts w:ascii="Consolas" w:hAnsi="Consolas"/>
+        </w:rPr>
+        <w:t>Basisinfos/Notebook_Analyse_laufend.md</w:t>
+      </w:r>
+      <w:r>
+        <w:t xml:space="preserve"> (laufendes NB-Analyse-Protokoll) - beide ohne .docx-Pendant, analog </w:t>
+      </w:r>
+      <w:r>
+        <w:rPr>
+          <w:rFonts w:ascii="Consolas" w:hAnsi="Consolas"/>
+        </w:rPr>
+        <w:t>Fakten_Entscheidungsmappe.md</w:t>
+      </w:r>
+      <w:r>
+        <w:t>/</w:t>
+      </w:r>
+      <w:r>
+        <w:rPr>
+          <w:rFonts w:ascii="Consolas" w:hAnsi="Consolas"/>
+        </w:rPr>
+        <w:t>Test_und_Verifikationsmethodik.md</w:t>
+      </w:r>
+      <w:r>
+        <w:t>.</w:t>
+      </w:r>
+    </w:p>
+    <w:p>
+      <w:pPr/>
+      <w:r>
+        <w:rPr>
+          <w:b/>
+        </w:rPr>
+        <w:t xml:space="preserve">Doku-Zuordnung (korrigiert, 2026-07-28): </w:t>
+      </w:r>
+      <w:r>
+        <w:t xml:space="preserve">der neue Fakt </w:t>
+      </w:r>
+      <w:r>
+        <w:rPr>
+          <w:rFonts w:ascii="Consolas" w:hAnsi="Consolas"/>
+        </w:rPr>
+        <w:t>atr.relativ_prozent</w:t>
+      </w:r>
+      <w:r>
+        <w:t xml:space="preserve"> ist in </w:t>
+      </w:r>
+      <w:r>
+        <w:rPr>
+          <w:rFonts w:ascii="Consolas" w:hAnsi="Consolas"/>
+        </w:rPr>
+        <w:t>Basisinfos/Fakten_Entscheidungsmappe.md</w:t>
+      </w:r>
+      <w:r>
+        <w:t xml:space="preserve"> katalogisiert (Abschnitt 4.2, plus neuer Asymmetrie-Punkt 6 in Abschnitt 3.3 zur offenen Spot-Frage) - das ist der bestehende, richtige Ort fuer Fakt-Entscheidungen (Frage-1/Frage-2-Raster), nicht eine neue Datei. Zwei zunaechst neu angelegte Dateien (Strukturierte_Bewertung.md, Notebook_Analyse_laufend.md) wurden wieder entfernt, nachdem sich herausstellte, dass sie bestehende Dokumente duplizieren - siehe project_enge_stop_loss_backtest_und_massnahmen.md (Memory) fuer den Backtest selbst.</w:t>
       </w:r>
     </w:p>
     <w:sectPr>

</xml_diff>

<commit_message>
Hebel: Eigenkapital-Richtwert (weicher Deckel) fuer Positionsgroesse
RM-1-Risikoformel zielt auf festes Verlustrisiko (1% Portfolio), nicht auf
gedeckeltes Eigenkapital - bei engem Stop-Loss/niedrigem Hebel ergab das
Eigenkapitalbedarfe weit ueber der Nutzer-Praxis (Fund: Median ~1.100 EUR,
Ausreisser bis 41.000 EUR, ueblich 100-300 EUR).

Neuer Config-Wert risiko.hebel.eigenkapital_richtwert_eur (Default 500)
skaliert die Positionsgroesse in post_check_hebel() proportional herunter,
sobald der Richtwert ueberschritten wird - Hebel/Zonen/These bleiben
unveraendert, kein Veto. Neues Transparenz-Feld eigenkapital_deckel_hinweis
(DB, GUI, E-Mail, Export). Bewusst als "Gummi-Parameter" behandelt, der bei
wachsendem Vertrauen in die System-Kalibrierung anzupassen ist.

Co-Authored-By: Claude Sonnet 5 <noreply@anthropic.com>
</commit_message>
<xml_diff>
--- a/Basisinfos/Regelwerksmanual.docx
+++ b/Basisinfos/Regelwerksmanual.docx
@@ -23763,6 +23763,137 @@
       </w:r>
       <w:r>
         <w:t xml:space="preserve"> katalogisiert (Abschnitt 4.2, plus neuer Asymmetrie-Punkt 6 in Abschnitt 3.3 zur offenen Spot-Frage) - das ist der bestehende, richtige Ort fuer Fakt-Entscheidungen (Frage-1/Frage-2-Raster), nicht eine neue Datei. Zwei zunaechst neu angelegte Dateien (Strukturierte_Bewertung.md, Notebook_Analyse_laufend.md) wurden wieder entfernt, nachdem sich herausstellte, dass sie bestehende Dokumente duplizieren - siehe project_enge_stop_loss_backtest_und_massnahmen.md (Memory) fuer den Backtest selbst.</w:t>
+      </w:r>
+    </w:p>
+    <w:p>
+      <w:pPr>
+        <w:pStyle w:val="Heading2"/>
+      </w:pPr>
+      <w:r>
+        <w:t>Nachtrag (2026-07-29): Eigenkapital-Richtwert fuer Hebel-Positionsgroesse (weicher Deckel)</w:t>
+      </w:r>
+    </w:p>
+    <w:p>
+      <w:pPr/>
+      <w:r>
+        <w:rPr>
+          <w:b/>
+        </w:rPr>
+        <w:t xml:space="preserve">Ausloeser: </w:t>
+      </w:r>
+      <w:r>
+        <w:t>Bei der Diskussion des R-5.10-Konfidenz-Veto-Fundes pruefte der Nutzer konkret nach, welche Eigenkapitalbetraege die App aktuell fuer Hebel-Signale empfiehlt. Ergebnis (149 Signale): Median ~1.204 USD (~1.100 EUR), Spanne 290 bis 41.242 USD - weit ueber der tatsaechlichen Handelspraxis des Nutzers (100-300 EUR ueblich, max. 500 EUR normal, bis 1.000 EUR nur bei bewusster Sonderlage).</w:t>
+      </w:r>
+    </w:p>
+    <w:p>
+      <w:pPr/>
+      <w:r>
+        <w:rPr>
+          <w:b/>
+        </w:rPr>
+        <w:t xml:space="preserve">Wichtige Klarstellung: </w:t>
+      </w:r>
+      <w:r>
+        <w:t>diese Aenderung behebt NICHT das eigentliche Konfidenz-Kalibrierungsproblem (bleibt offen) und veraendert auch nicht Win-Rate/CRV/Liquidations-Klassifikation eines Signals - all das haengt nur von den Preiszonen ab, nicht von der Positionsgroesse. Reine Praxis-/Risikomanagement-Anpassung: die RM-1-Risikoformel (1% Portfolio-Verlustrisiko) zielt auf ein festes Verlustrisiko, nicht auf ein gedeckeltes Eigenkapital.</w:t>
+      </w:r>
+    </w:p>
+    <w:p>
+      <w:pPr/>
+      <w:r>
+        <w:rPr>
+          <w:b/>
+        </w:rPr>
+        <w:t>Umsetzung (`agent/krypto/hebel_risk_gate.py::post_check_hebel()`):</w:t>
+      </w:r>
+    </w:p>
+    <w:p>
+      <w:pPr/>
+      <w:r>
+        <w:t xml:space="preserve">- Neuer Config-Wert </w:t>
+      </w:r>
+      <w:r>
+        <w:rPr>
+          <w:rFonts w:ascii="Consolas" w:hAnsi="Consolas"/>
+        </w:rPr>
+        <w:t>risiko.hebel.eigenkapital_richtwert_eur</w:t>
+      </w:r>
+      <w:r>
+        <w:t xml:space="preserve"> (Default 500).</w:t>
+      </w:r>
+    </w:p>
+    <w:p>
+      <w:pPr/>
+      <w:r>
+        <w:t xml:space="preserve">- Wenn </w:t>
+      </w:r>
+      <w:r>
+        <w:rPr>
+          <w:rFonts w:ascii="Consolas" w:hAnsi="Consolas"/>
+        </w:rPr>
+        <w:t>eigenkapitalbedarf_eur</w:t>
+      </w:r>
+      <w:r>
+        <w:t xml:space="preserve"> diesen Wert ueberschreitet, wird </w:t>
+      </w:r>
+      <w:r>
+        <w:rPr>
+          <w:rFonts w:ascii="Consolas" w:hAnsi="Consolas"/>
+        </w:rPr>
+        <w:t>positionsgroesse_usd</w:t>
+      </w:r>
+      <w:r>
+        <w:t xml:space="preserve"> proportional heruntergerechnet, bis der Richtwert genau erreicht ist. Hebel, Zonen und These bleiben unveraendert - die Empfehlung bleibt bestehen, nur die Positionsgroesse wird realistischer dimensioniert.</w:t>
+      </w:r>
+    </w:p>
+    <w:p>
+      <w:pPr/>
+      <w:r>
+        <w:t xml:space="preserve">- Bewusst KEIN Veto/harte Grenze. Neues Transparenz-Feld </w:t>
+      </w:r>
+      <w:r>
+        <w:rPr>
+          <w:rFonts w:ascii="Consolas" w:hAnsi="Consolas"/>
+        </w:rPr>
+        <w:t>eigenkapital_deckel_hinweis</w:t>
+      </w:r>
+      <w:r>
+        <w:t>.</w:t>
+      </w:r>
+    </w:p>
+    <w:p>
+      <w:pPr/>
+      <w:r>
+        <w:t>- Bewusst KEINE automatische Sonderfall-Erkennung fuer die vom Nutzer genannte Ausnahme (bis 1.000 EUR bei BTC-Absturz + hoher Rebound-Wahrscheinlichkeit) - das waere eine komplexe, wahrscheinlich unzuverlaessige Mustererkennung fuer eine Situation, die der Nutzer selbst besser erkennt und manuell entscheidet.</w:t>
+      </w:r>
+    </w:p>
+    <w:p>
+      <w:pPr/>
+      <w:r>
+        <w:t>- Nutzer-Vorgabe ausdruecklich als "Gummi-Parameter" verstanden: der Wert 500 EUR gilt nur, solange das System nicht besser kalibriert ist bzw. wesentliche Luecken bestehen - bei wachsendem Vertrauen anzupassen.</w:t>
+      </w:r>
+    </w:p>
+    <w:p>
+      <w:pPr/>
+      <w:r>
+        <w:rPr>
+          <w:b/>
+        </w:rPr>
+        <w:t xml:space="preserve">Verifiziert (synthetisch, Testklasse 3): </w:t>
+      </w:r>
+      <w:r>
+        <w:t>Migration frische DB + idempotent (PASS), Positivfall 3.035 EUR -&gt; 500 EUR gedeckelt (PASS), Negativfall kein Deckel bei 84 EUR (PASS), fehlender Config-Wert kein Crash (PASS), DB-Insert/Read-Roundtrip (PASS). Import-Regressionscheck aller 7 geaenderten Module bestanden.</w:t>
+      </w:r>
+    </w:p>
+    <w:p>
+      <w:pPr/>
+      <w:r>
+        <w:rPr>
+          <w:b/>
+        </w:rPr>
+        <w:t xml:space="preserve">Offen, separat zu besprechen: </w:t>
+      </w:r>
+      <w:r>
+        <w:t>die eigentliche Konfidenz-Kalibrierungsfrage - ist die mangelnde Vorhersagekraft der LLM-Konfidenz bei Hebel ein Fehler in unserem System, oder eine bekannte Grenze, mit der andere Trading-/Analyse-Plattformen anders umgehen? Vergleich noch ausstehend.</w:t>
       </w:r>
     </w:p>
     <w:sectPr>

</xml_diff>

<commit_message>
Risikofaktoren-Haeufung bei Hebel: Backtest abgeschlossen, kein Gate gebaut
Offener Folgepunkt vom 2026-07-23 geprueft (n=62 aufgeloeste Hebel-Signale,
Wiedervorlage-Schwelle n>=30-50 erreicht). Erster naiver Durchgang zeigte
scheinbar das Gegenteil der Hypothese (mehr negative Struktur-Faktoren =
bessere Ergebnisse), haelt aber der Tiefenpruefung nicht stand: Regime-
Konflikt ist fuer LONG im Baer-Regime eine Tautologie (54/54 negativ) und
nach Herausrechnen dieses Konfunds zerfaellt der Rest im Symbol-
Konzentrations-Check (schlechtester Bucket = 100% ein Symbol/KAIA).

Weder Hypothese noch scheinbare Umkehr sind robust belegt - kein
deterministischer Haeufungs-Deckel gebaut, kein Code geaendert. Punkt
geschlossen als "geprueft, kein belastbarer Zusammenhang gefunden".

Co-Authored-By: Claude Sonnet 5 <noreply@anthropic.com>
</commit_message>
<xml_diff>
--- a/Basisinfos/Regelwerksmanual.docx
+++ b/Basisinfos/Regelwerksmanual.docx
@@ -24100,6 +24100,108 @@
       </w:r>
       <w:r>
         <w:t xml:space="preserve"> am Notebook erneut laufen lassen + syncen, damit der naechste Export die feinere Aufschluesselung tatsaechlich enthaelt (Stufe 5, "im Betrieb bestaetigt", noch offen).</w:t>
+      </w:r>
+    </w:p>
+    <w:p>
+      <w:pPr>
+        <w:pStyle w:val="Heading2"/>
+      </w:pPr>
+      <w:r>
+        <w:t>Nachtrag (2026-07-29): Risikofaktoren-Häufung bei Hebel — Backtest durchgeführt, kein Gate gebaut</w:t>
+      </w:r>
+    </w:p>
+    <w:p>
+      <w:pPr/>
+      <w:r>
+        <w:rPr>
+          <w:b/>
+        </w:rPr>
+        <w:t xml:space="preserve">Ausloeser: </w:t>
+      </w:r>
+      <w:r>
+        <w:t>offener Folgepunkt vom 2026-07-23: "Regime-Konflikt"/"Technische Konfluenz"/"Alt-Coin-Marktphase"/"These-Regime-Widerspruch" werden bei Hebel-Signalen als unabhaengige Risikofaktor-Bulletpoints gelistet, obwohl sie teilweise korreliert sind - Wiedervorlage-Bedingung war n&gt;=30-50 aufgeloeste Hebel-Signale fuer einen Backtest.</w:t>
+      </w:r>
+    </w:p>
+    <w:p>
+      <w:pPr/>
+      <w:r>
+        <w:t xml:space="preserve">Datenlage: n=62 aufgeloeste Hebel-Signale mit </w:t>
+      </w:r>
+      <w:r>
+        <w:rPr>
+          <w:rFonts w:ascii="Consolas" w:hAnsi="Consolas"/>
+        </w:rPr>
+        <w:t>risikofaktoren_json</w:t>
+      </w:r>
+      <w:r>
+        <w:t>.</w:t>
+      </w:r>
+    </w:p>
+    <w:p>
+      <w:pPr/>
+      <w:r>
+        <w:rPr>
+          <w:b/>
+        </w:rPr>
+        <w:t>Erster Durchgang</w:t>
+      </w:r>
+      <w:r>
+        <w:t xml:space="preserve"> (naiv, Anzahl gleichzeitig negativer Struktur-Faktoren): zeigte scheinbar das GEGENTEIL der Ausgangs-Hypothese (&gt;=3 negative Faktoren schnitten mit 24,4% Win-Rate besser ab als &lt;3 mit 4,8%).</w:t>
+      </w:r>
+    </w:p>
+    <w:p>
+      <w:pPr/>
+      <w:r>
+        <w:rPr>
+          <w:b/>
+        </w:rPr>
+        <w:t>Vertiefung deckte zwei Konfundierungen auf:</w:t>
+      </w:r>
+    </w:p>
+    <w:p>
+      <w:pPr>
+        <w:pStyle w:val="ListNumber"/>
+      </w:pPr>
+      <w:r>
+        <w:rPr>
+          <w:rFonts w:ascii="Consolas" w:hAnsi="Consolas"/>
+        </w:rPr>
+        <w:t>Regime-Konflikt</w:t>
+      </w:r>
+      <w:r>
+        <w:t xml:space="preserve"> ist fuer LONG-Signale im anhaltenden Bär-Regime eine Tautologie (54/54 LONG-Signale "negativ", bei SHORT nie gebildet) - der Faktor traegt keine unabhaengige Information, sondern kodiert nur die Richtungswahl selbst.</w:t>
+      </w:r>
+    </w:p>
+    <w:p>
+      <w:pPr>
+        <w:pStyle w:val="ListNumber"/>
+      </w:pPr>
+      <w:r>
+        <w:t>Nach Herausrechnen dieses Konfunds (nur LONG, verbleibende 3 Faktoren) UND Anwendung des Symbol-Konzentrations-Checks zerfaellt auch dieser Rest: der scheinbar schlechteste Bucket (1 negativer Faktor, 0% WR) ist zu 100% ein einziges Symbol (KAIA, 8/8) - kein echtes Muster.</w:t>
+      </w:r>
+    </w:p>
+    <w:p>
+      <w:pPr/>
+      <w:r>
+        <w:rPr>
+          <w:b/>
+        </w:rPr>
+        <w:t xml:space="preserve">Fazit: </w:t>
+      </w:r>
+      <w:r>
+        <w:t>weder die urspruengliche Hypothese (mehr negative Faktoren = schlechter) noch ihre scheinbare Umkehr sind robust genug belegt. Einzig der groesste, diverseste Bucket (3 von 4 Faktoren negativ, n=29→16 nach Symbol-Bereinigung, 10 unterschiedliche Symbole) bleibt einigermassen belastbar mit 31-50% Win-Rate - deutlich ueber dem Hebel-Gesamtdurchschnitt.</w:t>
+      </w:r>
+    </w:p>
+    <w:p>
+      <w:pPr/>
+      <w:r>
+        <w:rPr>
+          <w:b/>
+        </w:rPr>
+        <w:t xml:space="preserve">Entscheidung: </w:t>
+      </w:r>
+      <w:r>
+        <w:t>kein deterministischer Häufungs-Deckel gebaut, kein Code geändert. Punkt gemäß eigener Wiedervorlage-Kriterien geschlossen als "geprüft, kein belastbarer Zusammenhang gefunden".</w:t>
       </w:r>
     </w:p>
     <w:sectPr>

</xml_diff>

<commit_message>
Hebel-Regelwerk Stufe 1: Regel-13-Widerspruch aufgeloest (Ausnahme fuer Regime-Konflikt/Alt-Skepsis)
Regel 13 hielt die Konfidenz bei einem einzelnen Schwachpunkt systematisch
ueber 75%, obwohl Regel 2 (Regime-Konflikt) und Regel 16 (btc_season/
baer_flucht-Alt-Skepsis) genau fuer diese zwei Faktoren explizit eine
Daempfung verlangen - in einem persistenten Baer-Regime ist Regime-Konflikt
bei LONG praktisch immer der einzige Schwachpunkt, wodurch die Konfidenz nie
unter 75% fiel. Neue Ausnahme-Klausel in Regel 13 benennt beide Faelle
namentlich. Teil des 4-Stufen-Justierungsplans aus dem Regelwerk-Audit
(Stufe 0: Eigenkapital-Deckel-Fix bereits gepusht).

Co-Authored-By: Claude Sonnet 5 <noreply@anthropic.com>
</commit_message>
<xml_diff>
--- a/Basisinfos/Regelwerksmanual.docx
+++ b/Basisinfos/Regelwerksmanual.docx
@@ -24394,6 +24394,113 @@
       </w:r>
       <w:r>
         <w:t>T1 FX-Kurs vorhanden, ueber Richtwert -&gt; Deckel greift (Regression) - PASS. T2 FX-Kurs fehlt (None) -&gt; sichtbarer Warn-Hinweis statt stillem Ausfall - PASS. T3 FX-Kurs=0 (falsy) -&gt; gleiches Verhalten wie None - PASS. T4 FX-Kurs fehlt + kein Richtwert konfiguriert -&gt; kein Crash, kein Hinweis - PASS. Import-Regressionscheck aller betroffenen Module - PASS. Gesamturteil: verifiziert (Stufe 2).</w:t>
+      </w:r>
+    </w:p>
+    <w:p>
+      <w:pPr>
+        <w:pStyle w:val="Heading3"/>
+      </w:pPr>
+      <w:r>
+        <w:t>Stufe 1 umgesetzt: Regel-13-Widerspruch im Mistral-Prompt aufgeloest</w:t>
+      </w:r>
+    </w:p>
+    <w:p>
+      <w:pPr/>
+      <w:r>
+        <w:rPr>
+          <w:b/>
+        </w:rPr>
+        <w:t xml:space="preserve">Fund: </w:t>
+      </w:r>
+      <w:r>
+        <w:t>Regel 13 (</w:t>
+      </w:r>
+      <w:r>
+        <w:rPr>
+          <w:rFonts w:ascii="Consolas" w:hAnsi="Consolas"/>
+        </w:rPr>
+        <w:t>hebel_analyst.py::SYSTEM_PROMPT</w:t>
+      </w:r>
+      <w:r>
+        <w:t xml:space="preserve">) schreibt vor, dass ein EINZELNER isolierter Schwachpunkt im </w:t>
+      </w:r>
+      <w:r>
+        <w:rPr>
+          <w:rFonts w:ascii="Consolas" w:hAnsi="Consolas"/>
+        </w:rPr>
+        <w:t>gegenargument</w:t>
+      </w:r>
+      <w:r>
+        <w:t xml:space="preserve"> (z.B. gemischte Konfluenz, knappes CRV) die Konfidenz nur moderat daempfen darf, niemals unter 75%. Regel 2 und Regel 16 verlangen aber ausdruecklich, dass genau EIN Faktor - Regime-Konflikt (</w:t>
+      </w:r>
+      <w:r>
+        <w:rPr>
+          <w:rFonts w:ascii="Consolas" w:hAnsi="Consolas"/>
+        </w:rPr>
+        <w:t>regime.richtungs_konflikt_mit_trigger</w:t>
+      </w:r>
+      <w:r>
+        <w:t>) bzw. btc_season/baer_flucht-Alt-Skepsis bei Nicht-Core-Assets - Konfidenz UND Hebel-Vorschlag daempft, weil eine gehebelte Gegen-Trend-Position strukturell riskanter ist. In der Praxis (persistentes Baer-Regime) ist Regime-Konflikt bei LONG-Signalen quasi immer vorhanden und quasi immer der EINZIGE Schwachpunkt - Regel 13 hielt die Konfidenz dadurch systematisch ueber 75%, obwohl Regel 2 genau das verhindern wollte.</w:t>
+      </w:r>
+    </w:p>
+    <w:p>
+      <w:pPr/>
+      <w:r>
+        <w:rPr>
+          <w:b/>
+        </w:rPr>
+        <w:t xml:space="preserve">Fix: </w:t>
+      </w:r>
+      <w:r>
+        <w:t xml:space="preserve">Regel 13 bekommt eine explizite AUSNAHME-Klausel: der in Regel 2 beschriebene Regime-Konflikt und die in Regel 16 beschriebene btc_season/baer_flucht-Alt-Skepsis sind KEINE generischen, mit gemischter Konfluenz/knappem CRV gleichwertige Einzel-Schwachpunkte, sondern die einzigen beiden Faelle, fuer die Regel 2 bzw. Regel 16 selbst schon eine Daempfung verlangen. Liegt einer dieser beiden Faelle vor, DARF die Konfidenz auch als einziger Schwachpunkt unter 75% fallen. Reiner Prompt-Wortlaut-Fix, keine Code-/Schema-Aenderung - kein anderer Codepfad haengt an der exakten 75%-Zahl (die Konstanten </w:t>
+      </w:r>
+      <w:r>
+        <w:rPr>
+          <w:rFonts w:ascii="Consolas" w:hAnsi="Consolas"/>
+        </w:rPr>
+        <w:t>KONFIDENZ_SCHWELLE_NIEDRIG</w:t>
+      </w:r>
+      <w:r>
+        <w:t>/</w:t>
+      </w:r>
+      <w:r>
+        <w:rPr>
+          <w:rFonts w:ascii="Consolas" w:hAnsi="Consolas"/>
+        </w:rPr>
+        <w:t>KONFIDENZ_SCHWELLE_HOCH</w:t>
+      </w:r>
+      <w:r>
+        <w:t xml:space="preserve"> in </w:t>
+      </w:r>
+      <w:r>
+        <w:rPr>
+          <w:rFonts w:ascii="Consolas" w:hAnsi="Consolas"/>
+        </w:rPr>
+        <w:t>risk_gate.py</w:t>
+      </w:r>
+      <w:r>
+        <w:t xml:space="preserve"> sind 55/70, unabhaengig davon).</w:t>
+      </w:r>
+    </w:p>
+    <w:p>
+      <w:pPr/>
+      <w:r>
+        <w:rPr>
+          <w:b/>
+        </w:rPr>
+        <w:t xml:space="preserve">Verifiziert (Testklasse 1, Prompt-only): </w:t>
+      </w:r>
+      <w:r>
+        <w:t xml:space="preserve">Import von </w:t>
+      </w:r>
+      <w:r>
+        <w:rPr>
+          <w:rFonts w:ascii="Consolas" w:hAnsi="Consolas"/>
+        </w:rPr>
+        <w:t>hebel_analyst.py</w:t>
+      </w:r>
+      <w:r>
+        <w:t xml:space="preserve"> - PASS. Regelnummerierung weiterhin fortlaufend 1-26 (keine Luecke/Dopplung) - PASS. Ausnahme-Klausel vorhanden und referenziert Regel 2/16 korrekt - PASS. Umlaute/Zeilenumbrueche im zusammengefuegten Prompt-Text korrekt (kein Mojibake, keine fehlenden/doppelten Leerzeichen an der Einfuegestelle) - PASS. Gesamturteil: verifiziert (Stufe 1).</w:t>
       </w:r>
     </w:p>
     <w:sectPr>

</xml_diff>

<commit_message>
Hebel-Regelwerk Stufe 2: konsolidierte Baseline-Vergleichs-Funktionsfamilie
Neue Funktionen compute_baseline_vergleich() und compute_zai_uebereinstimmung_
baseline() in backward_tracking.py beantworten die vom Nutzer aufgeworfene
Muenzwurf-Frage strukturell: Trefferquote je Tier jetzt mit Muenzwurf-Vergleich
(exakter Binomialtest), CRV-Breakeven-Vergleich (33,3% bei CRV_MINIMUM=2.0) und
regimenaivem Trendfolge-Vergleich fuer Hebel, sowie 3-Weg-Zufalls-Baseline fuer
die Z.ai-Uebereinstimmungsquote. Buendelt alle drei unabhaengig vorgeschlagenen
Audit-Loesungen zu einer Funktionsfamilie statt drei getrennter. Reine
Diagnose-Infrastruktur, noch nicht an GUI/E-Mail angebunden. Teil des
4-Stufen-Justierungsplans aus dem Regelwerk-Audit (Stufe 0+1 bereits committet).

Co-Authored-By: Claude Sonnet 5 <noreply@anthropic.com>
</commit_message>
<xml_diff>
--- a/Basisinfos/Regelwerksmanual.docx
+++ b/Basisinfos/Regelwerksmanual.docx
@@ -24501,6 +24501,164 @@
       </w:r>
       <w:r>
         <w:t xml:space="preserve"> - PASS. Regelnummerierung weiterhin fortlaufend 1-26 (keine Luecke/Dopplung) - PASS. Ausnahme-Klausel vorhanden und referenziert Regel 2/16 korrekt - PASS. Umlaute/Zeilenumbrueche im zusammengefuegten Prompt-Text korrekt (kein Mojibake, keine fehlenden/doppelten Leerzeichen an der Einfuegestelle) - PASS. Gesamturteil: verifiziert (Stufe 1).</w:t>
+      </w:r>
+    </w:p>
+    <w:p>
+      <w:pPr>
+        <w:pStyle w:val="Heading3"/>
+      </w:pPr>
+      <w:r>
+        <w:t>Stufe 2 umgesetzt: konsolidierte Baseline-Vergleichs-Funktionsfamilie</w:t>
+      </w:r>
+    </w:p>
+    <w:p>
+      <w:pPr/>
+      <w:r>
+        <w:rPr>
+          <w:b/>
+        </w:rPr>
+        <w:t xml:space="preserve">Fund: </w:t>
+      </w:r>
+      <w:r>
+        <w:t>alle drei Audit-Agenten fanden unabhaengig voneinander denselben Mangel - nirgends im Code existiert eine Antwort auf die vom Nutzer selbst aufgeworfene Frage ("kann ich nicht auch einfach eine Muenze werfen?"). Eine Trefferquote ohne Referenzgroesse (Muenzwurf, CRV-Pflichtgrenze, regimenaive Baseline, Z.ai-Zufallsuebereinstimmung) ist nicht interpretierbar.</w:t>
+      </w:r>
+    </w:p>
+    <w:p>
+      <w:pPr/>
+      <w:r>
+        <w:rPr>
+          <w:b/>
+        </w:rPr>
+        <w:t xml:space="preserve">Fix: </w:t>
+      </w:r>
+      <w:r>
+        <w:t xml:space="preserve">zwei neue Funktionen in </w:t>
+      </w:r>
+      <w:r>
+        <w:rPr>
+          <w:rFonts w:ascii="Consolas" w:hAnsi="Consolas"/>
+        </w:rPr>
+        <w:t>agent/krypto/backward_tracking.py</w:t>
+      </w:r>
+      <w:r>
+        <w:t xml:space="preserve"> (gebuendelt statt drei getrennter, wie von allen drei Audits vorgeschlagen):</w:t>
+      </w:r>
+    </w:p>
+    <w:p>
+      <w:pPr>
+        <w:pStyle w:val="ListBullet"/>
+      </w:pPr>
+      <w:r>
+        <w:rPr>
+          <w:rFonts w:ascii="Consolas" w:hAnsi="Consolas"/>
+        </w:rPr>
+        <w:t>compute_baseline_vergleich(conn, tier, erlaubte_symbole=None, crv_minimum=CRV_MINIMUM)</w:t>
+      </w:r>
+      <w:r>
+        <w:t>: Trefferquote je Tier (spot/hebel) plus (a) Muenzwurf-Vergleich (50%) mit exaktem zweiseitigem Binomialtest, (b) bei Hebel zusaetzlich CRV-Breakeven-Vergleich (</w:t>
+      </w:r>
+      <w:r>
+        <w:rPr>
+          <w:rFonts w:ascii="Consolas" w:hAnsi="Consolas"/>
+        </w:rPr>
+        <w:t>1/(1+crv_minimum)</w:t>
+      </w:r>
+      <w:r>
+        <w:t xml:space="preserve">, bei CRV_MINIMUM=2.0 also 33,3%), (c) bei Hebel zusaetzlich regimenaiver Vergleich (Trefferquote des </w:t>
+      </w:r>
+      <w:r>
+        <w:rPr>
+          <w:rFonts w:ascii="Consolas" w:hAnsi="Consolas"/>
+        </w:rPr>
+        <w:t>trigger_zweig='trendfolge'</w:t>
+      </w:r>
+      <w:r>
+        <w:t>-Teilsatzes - ein simpler Momentum-Trade OHNE LLM-Analyse als Referenz).</w:t>
+      </w:r>
+    </w:p>
+    <w:p>
+      <w:pPr>
+        <w:pStyle w:val="ListBullet"/>
+      </w:pPr>
+      <w:r>
+        <w:rPr>
+          <w:rFonts w:ascii="Consolas" w:hAnsi="Consolas"/>
+        </w:rPr>
+        <w:t>compute_zai_uebereinstimmung_baseline(conn, watchlist=None)</w:t>
+      </w:r>
+      <w:r>
+        <w:t xml:space="preserve">: die bislang nur ad-hoc in </w:t>
+      </w:r>
+      <w:r>
+        <w:rPr>
+          <w:rFonts w:ascii="Consolas" w:hAnsi="Consolas"/>
+        </w:rPr>
+        <w:t>extract_notebook_diagnose.py</w:t>
+      </w:r>
+      <w:r>
+        <w:t xml:space="preserve"> berechnete LLM1-vs-Z.ai-Uebereinstimmungsquote (</w:t>
+      </w:r>
+      <w:r>
+        <w:rPr>
+          <w:rFonts w:ascii="Consolas" w:hAnsi="Consolas"/>
+        </w:rPr>
+        <w:t>zai_uebereinstimmung</w:t>
+      </w:r>
+      <w:r>
+        <w:t xml:space="preserve">) gegen eine 3-Weg-Zufalls-Baseline (33,3% - </w:t>
+      </w:r>
+      <w:r>
+        <w:rPr>
+          <w:rFonts w:ascii="Consolas" w:hAnsi="Consolas"/>
+        </w:rPr>
+        <w:t>zai_eigene_richtung</w:t>
+      </w:r>
+      <w:r>
+        <w:t xml:space="preserve"> kann LONG/SHORT/NEUTRAL sein, die Primaer-Richtung ist binaer, ein zufaelliger 3-Weg-Tipp traefe sie im Schnitt in 1/3 der Faelle).</w:t>
+      </w:r>
+    </w:p>
+    <w:p>
+      <w:pPr>
+        <w:pStyle w:val="ListBullet"/>
+      </w:pPr>
+      <w:r>
+        <w:t xml:space="preserve">Gemeinsamer Helfer </w:t>
+      </w:r>
+      <w:r>
+        <w:rPr>
+          <w:rFonts w:ascii="Consolas" w:hAnsi="Consolas"/>
+        </w:rPr>
+        <w:t>_binomialtest_zweiseitig_p_wert(erfolge, n, p)</w:t>
+      </w:r>
+      <w:r>
+        <w:t xml:space="preserve">: exakter Test via </w:t>
+      </w:r>
+      <w:r>
+        <w:rPr>
+          <w:rFonts w:ascii="Consolas" w:hAnsi="Consolas"/>
+        </w:rPr>
+        <w:t>math.comb()</w:t>
+      </w:r>
+      <w:r>
+        <w:t>, BEWUSST ohne scipy (nicht in requirements.txt, nirgends sonst im Projekt verwendet - keine neue harte Abhaengigkeit fuer einen einzelnen Test).</w:t>
+      </w:r>
+    </w:p>
+    <w:p>
+      <w:pPr/>
+      <w:r>
+        <w:t>Reine Diagnose-/Leseinfrastruktur (kein Seiteneffekt, keine Aenderung an Gates/Prompt/E-Mail) - noch NICHT an GUI/Remote-Seite/E-Mail angebunden; folgt bei Bedarf separat.</w:t>
+      </w:r>
+    </w:p>
+    <w:p>
+      <w:pPr/>
+      <w:r>
+        <w:rPr>
+          <w:b/>
+        </w:rPr>
+        <w:t xml:space="preserve">Verifiziert (Testklasse 2): </w:t>
+      </w:r>
+      <w:r>
+        <w:t>Binomialtest-Helper (Grundeigenschaften: Symmetrie, n=0-&gt;None, korrekte Signifikanz bei starker Abweichung) - PASS. compute_baseline_vergleich() Hebel (63 synth. Signale, 17,5% WR, reproduziert echten Gruppe-A-Fund: Muenzwurf-Vergleich signifikant negativ, CRV-Breakeven 33,3% korrekt, Regime-Naiv-Vergleich ueber trigger_zweig='trendfolge') - PASS. compute_baseline_vergleich() Spot (kein CRV-/Regime-Vergleich, da kein trigger_zweig-Feld; Kleine-Stichprobe-Hinweis) - PASS. 0 Signale -&gt; None - PASS. compute_zai_uebereinstimmung_baseline() (3/63, reproduziert echten 4,8%-Fund, Zufalls-Baseline 33,3% korrekt) - PASS. keine Daten -&gt; leeres Dict, kein Crash - PASS. Echter Lauf gegen Kopie der lokalen Desktop-DB: kein Absturz, sauberer Leerfall (Desktop-Bestand aktuell zu klein/veraltet fuer inhaltliche Zahlen). Regressionscheck (Import aller abhaengigen Module) - PASS. Gesamturteil: verifiziert (Stufe 2).</w:t>
       </w:r>
     </w:p>
     <w:sectPr>

</xml_diff>

<commit_message>
Hebel-Regelwerk Stufe 3, Punkt 3: Regime-Konflikt als Kontext statt gezaehlter Bulletpoint
Regime-Konflikt/-Ausrichtung ist in einem anhaltenden Regime fuer praktisch
jedes Signal derselben Richtung vorhanden (87% der Faelle) und lieferte in der
Risikofaktoren-Liste kaum Unterscheidungskraft, zaehlte aber optisch gleich
viel wie echte Einzelfall-Faktoren (CRV-knapp, Retail-Konsens etc.). Neues
Feld Risikofaktor.ist_kontext markiert diesen Eintrag, beide Renderer (GUI +
E-Mail) zeigen ihn jetzt als eigene Kontext-Zeile ohne Symbol vor der
gezaehlten Liste. Rein anzeigerelevant, rueckwaertskompatibel, keine
Gate-/Prompt-Aenderung. Teil des 4-Stufen-Justierungsplans aus dem
Regelwerk-Audit (Stufe 0-2 bereits committet, Stufe 3 Punkt 1+2 in Evidenz
gehalten nach ausfuehrlichem Backtest gegen echte Signaldaten).

Co-Authored-By: Claude Sonnet 5 <noreply@anthropic.com>
</commit_message>
<xml_diff>
--- a/Basisinfos/Regelwerksmanual.docx
+++ b/Basisinfos/Regelwerksmanual.docx
@@ -24659,6 +24659,119 @@
       </w:r>
       <w:r>
         <w:t>Binomialtest-Helper (Grundeigenschaften: Symmetrie, n=0-&gt;None, korrekte Signifikanz bei starker Abweichung) - PASS. compute_baseline_vergleich() Hebel (63 synth. Signale, 17,5% WR, reproduziert echten Gruppe-A-Fund: Muenzwurf-Vergleich signifikant negativ, CRV-Breakeven 33,3% korrekt, Regime-Naiv-Vergleich ueber trigger_zweig='trendfolge') - PASS. compute_baseline_vergleich() Spot (kein CRV-/Regime-Vergleich, da kein trigger_zweig-Feld; Kleine-Stichprobe-Hinweis) - PASS. 0 Signale -&gt; None - PASS. compute_zai_uebereinstimmung_baseline() (3/63, reproduziert echten 4,8%-Fund, Zufalls-Baseline 33,3% korrekt) - PASS. keine Daten -&gt; leeres Dict, kein Crash - PASS. Echter Lauf gegen Kopie der lokalen Desktop-DB: kein Absturz, sauberer Leerfall (Desktop-Bestand aktuell zu klein/veraltet fuer inhaltliche Zahlen). Regressionscheck (Import aller abhaengigen Module) - PASS. Gesamturteil: verifiziert (Stufe 2).</w:t>
+      </w:r>
+    </w:p>
+    <w:p>
+      <w:pPr>
+        <w:pStyle w:val="Heading3"/>
+      </w:pPr>
+      <w:r>
+        <w:t>Stufe 3, Punkt 3 umgesetzt: Regime-Konflikt als Kontext statt gezaehlter Bulletpoint</w:t>
+      </w:r>
+    </w:p>
+    <w:p>
+      <w:pPr/>
+      <w:r>
+        <w:rPr>
+          <w:b/>
+        </w:rPr>
+        <w:t xml:space="preserve">Fund: </w:t>
+      </w:r>
+      <w:r>
+        <w:rPr>
+          <w:rFonts w:ascii="Consolas" w:hAnsi="Consolas"/>
+        </w:rPr>
+        <w:t>compute_risikofaktoren_hebel()</w:t>
+      </w:r>
+      <w:r>
+        <w:t xml:space="preserve"> listet Regime-Konflikt/-Ausrichtung als einen von mehreren gleichberechtigten ▲/▼/●-Bulletpoints in Abschnitt 3 ("Konklusion"). Da dieser Faktor in einem anhaltenden Regime fuer praktisch jedes Signal derselben Richtung vorhanden ist (87% aller Gruppe-A-Faelle), wirkt eine z.B. "3 rote Warnungen"-Wahrnehmung irrefuehrend, wenn eine davon kaum Unterscheidungskraft zwischen guten und schlechten Setups liefert.</w:t>
+      </w:r>
+    </w:p>
+    <w:p>
+      <w:pPr/>
+      <w:r>
+        <w:rPr>
+          <w:b/>
+        </w:rPr>
+        <w:t xml:space="preserve">Fix (rein anzeigerelevant, keine Gate-/Prompt-Aenderung): </w:t>
+      </w:r>
+      <w:r>
+        <w:t xml:space="preserve">neues optionales Feld </w:t>
+      </w:r>
+      <w:r>
+        <w:rPr>
+          <w:rFonts w:ascii="Consolas" w:hAnsi="Consolas"/>
+        </w:rPr>
+        <w:t>ist_kontext: bool = False</w:t>
+      </w:r>
+      <w:r>
+        <w:t xml:space="preserve"> auf der </w:t>
+      </w:r>
+      <w:r>
+        <w:rPr>
+          <w:rFonts w:ascii="Consolas" w:hAnsi="Consolas"/>
+        </w:rPr>
+        <w:t>Risikofaktor</w:t>
+      </w:r>
+      <w:r>
+        <w:t>-Dataclass (</w:t>
+      </w:r>
+      <w:r>
+        <w:rPr>
+          <w:rFonts w:ascii="Consolas" w:hAnsi="Consolas"/>
+        </w:rPr>
+        <w:t>hebel_risk_gate.py</w:t>
+      </w:r>
+      <w:r>
+        <w:t>), gesetzt fuer Regime-Konflikt/-Ausrichtung. Beide Renderer (</w:t>
+      </w:r>
+      <w:r>
+        <w:rPr>
+          <w:rFonts w:ascii="Consolas" w:hAnsi="Consolas"/>
+        </w:rPr>
+        <w:t>ui/formatting.py::format_risikofaktoren_lines()</w:t>
+      </w:r>
+      <w:r>
+        <w:t xml:space="preserve"> fuer GUI, </w:t>
+      </w:r>
+      <w:r>
+        <w:rPr>
+          <w:rFonts w:ascii="Consolas" w:hAnsi="Consolas"/>
+        </w:rPr>
+        <w:t>scheduler/background.py::_formatiere_risikofaktoren()</w:t>
+      </w:r>
+      <w:r>
+        <w:t xml:space="preserve"> fuer E-Mail) zeigen </w:t>
+      </w:r>
+      <w:r>
+        <w:rPr>
+          <w:rFonts w:ascii="Consolas" w:hAnsi="Consolas"/>
+        </w:rPr>
+        <w:t>ist_kontext=True</w:t>
+      </w:r>
+      <w:r>
+        <w:t>-Eintraege zuerst als eigene Kontext-Zeile ("--- ... ---") ohne ▲/▼/●-Symbol, getrennt von der gezaehlten negativ/neutral/positiv-Liste. Rueckwaertskompatibel (</w:t>
+      </w:r>
+      <w:r>
+        <w:rPr>
+          <w:rFonts w:ascii="Consolas" w:hAnsi="Consolas"/>
+        </w:rPr>
+        <w:t>.get("ist_kontext", False)</w:t>
+      </w:r>
+      <w:r>
+        <w:t>) - aeltere gespeicherte Signale ohne das Feld rendern identisch wie vorher.</w:t>
+      </w:r>
+    </w:p>
+    <w:p>
+      <w:pPr/>
+      <w:r>
+        <w:rPr>
+          <w:b/>
+        </w:rPr>
+        <w:t xml:space="preserve">Verifiziert (Testklasse 2): </w:t>
+      </w:r>
+      <w:r>
+        <w:t>Risikofaktor-Dataclass mit korrektem Default - PASS. compute_risikofaktoren_hebel() markiert Regime-Konflikt (LONG im baer-Regime) UND Regime-Ausrichtung (SHORT im baer-Regime) korrekt mit ist_kontext=True, alle anderen Faktoren False - PASS. format_risikofaktoren_lines(): Kontext-Zeile ohne Symbol zuerst, kein Duplikat in der Restliste - PASS. Rueckwaertskompatibilitaet: altes JSON ohne ist_kontext-Feld rendert identisch wie vorher - PASS. Leerfaelle (None/leer/[]) weiterhin robust - PASS. Regressionscheck (Import aller abhaengigen Module) - PASS. Gesamturteil: verifiziert (Stufe 3, Punkt 3).</w:t>
       </w:r>
     </w:p>
     <w:sectPr>

</xml_diff>

<commit_message>
Regelwerk-Audit Stufe 3, Punkt 4: Action-Bias-Korrektur (Regel 27)
Neue Regel 27 im Hebel-Prompt (Baustein A+C): symmetrische
Gruende-fuer/gegen-Pflicht + Premortem-Ueberlegung, HALTEN explizit
gleichwertig zu einer Empfehlung. Live gegen Mistral UND Gemini
getestet (n=5-Wiederholungen je Szenario) - Baseline zeigte in einem
mehrdeutigen Szenario einen echten Action-Bias (60% ERoeFFNEN trotz
schwacher Fakten), A+C korrigiert das vollstaendig ohne die
Selbstzweifel-Formulierung deterministisch an action/confidence_pct
zu binden (bewusst ohne Baustein B, um die bestehende Leitplanke
gegen deterministische Ueberschreibung von eigene_einschaetzung
nicht zu verletzen - A+C allein erzielt im Vergleich denselben Effekt
wie A+B+C).

Stufe 3 des Justierungsplans damit vollstaendig bearbeitet (Punkt 1+2
bewusst in Evidenz gehalten/vertagt, Punkt 3+4 umgesetzt).

Co-Authored-By: Claude Sonnet 5 <noreply@anthropic.com>
</commit_message>
<xml_diff>
--- a/Basisinfos/Regelwerksmanual.docx
+++ b/Basisinfos/Regelwerksmanual.docx
@@ -24772,6 +24772,143 @@
       </w:r>
       <w:r>
         <w:t>Risikofaktor-Dataclass mit korrektem Default - PASS. compute_risikofaktoren_hebel() markiert Regime-Konflikt (LONG im baer-Regime) UND Regime-Ausrichtung (SHORT im baer-Regime) korrekt mit ist_kontext=True, alle anderen Faktoren False - PASS. format_risikofaktoren_lines(): Kontext-Zeile ohne Symbol zuerst, kein Duplikat in der Restliste - PASS. Rueckwaertskompatibilitaet: altes JSON ohne ist_kontext-Feld rendert identisch wie vorher - PASS. Leerfaelle (None/leer/[]) weiterhin robust - PASS. Regressionscheck (Import aller abhaengigen Module) - PASS. Gesamturteil: verifiziert (Stufe 3, Punkt 3).</w:t>
+      </w:r>
+    </w:p>
+    <w:p>
+      <w:pPr>
+        <w:pStyle w:val="Heading3"/>
+      </w:pPr>
+      <w:r>
+        <w:t>Stufe 3, Punkt 4 umgesetzt: Action-Bias-Korrektur (Regel 27) - echter Live-Test gegen Mistral UND Gemini</w:t>
+      </w:r>
+    </w:p>
+    <w:p>
+      <w:pPr/>
+      <w:r>
+        <w:rPr>
+          <w:b/>
+        </w:rPr>
+        <w:t xml:space="preserve">Fund: </w:t>
+      </w:r>
+      <w:r>
+        <w:t xml:space="preserve">externe Recherche (Sycophancy-/Omission-Bias-Literatur, Analysis of Competing Hypotheses, Premortem-Technik) plus eigener Live-Test bestaetigten: eine Prompt-Struktur, die IMMER dieselbe aufwendige Begruendung verlangt (5 </w:t>
+      </w:r>
+      <w:r>
+        <w:rPr>
+          <w:rFonts w:ascii="Consolas" w:hAnsi="Consolas"/>
+        </w:rPr>
+        <w:t>top_gruende</w:t>
+      </w:r>
+      <w:r>
+        <w:t xml:space="preserve">, </w:t>
+      </w:r>
+      <w:r>
+        <w:rPr>
+          <w:rFonts w:ascii="Consolas" w:hAnsi="Consolas"/>
+        </w:rPr>
+        <w:t>key_risks</w:t>
+      </w:r>
+      <w:r>
+        <w:t xml:space="preserve">, </w:t>
+      </w:r>
+      <w:r>
+        <w:rPr>
+          <w:rFonts w:ascii="Consolas" w:hAnsi="Consolas"/>
+        </w:rPr>
+        <w:t>forecast</w:t>
+      </w:r>
+      <w:r>
+        <w:t xml:space="preserve">), egal welche Aktion gewaehlt wird, foerdert einen Action-Bias zugunsten von Empfehlungen. Live-Test (Mistral, n=5 Wiederholungen auf IDENTISCHEN, bewusst mehrdeutigen Fakten): die Baseline-Variante empfahl in Szenario 2 (Kontra/Squeeze, Retail-Extrem, schwache historische Trefferquote 18,2%) in 3 von 5 unabhaengigen Laeufen ERoeFFNEN - trotz im eigenen </w:t>
+      </w:r>
+      <w:r>
+        <w:rPr>
+          <w:rFonts w:ascii="Consolas" w:hAnsi="Consolas"/>
+        </w:rPr>
+        <w:t>gegenargument</w:t>
+      </w:r>
+      <w:r>
+        <w:t xml:space="preserve"> selbst benanntem Regime-Konflikt. Ein erster kleinerer Test hatte das faelschlich als "einmaligen Zufallstreffer" missverstanden (temperature=0.2 ist nicht deterministisch) - erst die Wiederholungsmessung zeigte, dass die Mehrheit der Baseline-Laeufe tatsaechlich ERoeFFNEN waehlte, kein Rauschen.</w:t>
+      </w:r>
+    </w:p>
+    <w:p>
+      <w:pPr/>
+      <w:r>
+        <w:rPr>
+          <w:b/>
+        </w:rPr>
+        <w:t xml:space="preserve">Wichtiger Zwischenfund: </w:t>
+      </w:r>
+      <w:r>
+        <w:t xml:space="preserve">die urspruenglich getestete Kombination aus 3 Bausteinen (A: symmetrische Gruende fuer/gegen, B: bindendes Selbstzweifel-Gate, C: Premortem-Ueberlegung) widersprach in Baustein B der bestehenden Leitplanke gegen deterministische Ueberschreibung von </w:t>
+      </w:r>
+      <w:r>
+        <w:rPr>
+          <w:rFonts w:ascii="Consolas" w:hAnsi="Consolas"/>
+        </w:rPr>
+        <w:t>eigene_einschaetzung</w:t>
+      </w:r>
+      <w:r>
+        <w:t>/Werturteil (siehe Memory feedback_llm_synthese_kein_deterministischer_override). Direkter Vergleich A+B+C gegen A+C (ohne bindendes Gate), je n=5 auf 2 Szenarien: A+C allein erreichte in BEIDEN Szenarien exakt dieselbe Aktionskorrektur (5/5 HALTEN) wie A+B+C - der bindende Zwang war fuer den beobachteten Effekt nicht noetig.</w:t>
+      </w:r>
+    </w:p>
+    <w:p>
+      <w:pPr/>
+      <w:r>
+        <w:rPr>
+          <w:b/>
+        </w:rPr>
+        <w:t xml:space="preserve">Fix: </w:t>
+      </w:r>
+      <w:r>
+        <w:t xml:space="preserve">neue Regel 27 in </w:t>
+      </w:r>
+      <w:r>
+        <w:rPr>
+          <w:rFonts w:ascii="Consolas" w:hAnsi="Consolas"/>
+        </w:rPr>
+        <w:t>hebel_analyst.py::SYSTEM_PROMPT</w:t>
+      </w:r>
+      <w:r>
+        <w:t xml:space="preserve"> - symmetrische Gruende-Pflicht (3 staerkste Argumente fuer JEDE Option) + Premortem-Frage (48h-Scheitern-Ueberlegung, fliesst in </w:t>
+      </w:r>
+      <w:r>
+        <w:rPr>
+          <w:rFonts w:ascii="Consolas" w:hAnsi="Consolas"/>
+        </w:rPr>
+        <w:t>eigene_einschaetzung</w:t>
+      </w:r>
+      <w:r>
+        <w:t xml:space="preserve"> ein) + explizite Gleichwertigkeit von HALTEN (auch bei bestehender Position). BEWUSST ohne deterministische Nachkorrektur von </w:t>
+      </w:r>
+      <w:r>
+        <w:rPr>
+          <w:rFonts w:ascii="Consolas" w:hAnsi="Consolas"/>
+        </w:rPr>
+        <w:t>action</w:t>
+      </w:r>
+      <w:r>
+        <w:t>/</w:t>
+      </w:r>
+      <w:r>
+        <w:rPr>
+          <w:rFonts w:ascii="Consolas" w:hAnsi="Consolas"/>
+        </w:rPr>
+        <w:t>confidence_pct</w:t>
+      </w:r>
+      <w:r>
+        <w:t xml:space="preserve"> - Regel 27 enthaelt eine explizite Abgrenzung zu Regel 26 dazu.</w:t>
+      </w:r>
+    </w:p>
+    <w:p>
+      <w:pPr/>
+      <w:r>
+        <w:rPr>
+          <w:b/>
+        </w:rPr>
+        <w:t xml:space="preserve">Verifiziert (Testklasse 1, Prompt-only + echte Live-Tests): </w:t>
+      </w:r>
+      <w:r>
+        <w:t>Betroffene Datei: agent/krypto/hebel_analyst.py. Aenderungsklasse 1. Live-Tests (echte API-Calls, Mistral + Gemini): 3 Basis-Szenarien (mehrdeutig/Regime-Konflikt, Kontra/Squeeze, klar regimekonform) je Baseline vs. A+B+C - PASS (kein Uebervorsichts-Nebeneffekt bei klar gutem Setup). Erweiterter Test: 5 Szenarien x 2 Provider (Mistral+Gemini) x 2 Varianten - kein Fall, in dem die modifizierte Variante ein klar gutes Setup zu HALTEN kippte. Wiederholungsmessung n=5 je Szenario (Mistral): Baseline zeigt echten Action-Bias (Szenario 2: 60% ERoeFFNEN trotz schwacher Fakten), A+B+C korrigiert konsistent auf 5/5 HALTEN in beiden Szenarien - PASS. A+C-vs-A+B+C-Vergleich (n=5 je Variante je Szenario): identische Aktionskorrektur (5/5 HALTEN in beiden Szenarien) OHNE bindendes Gate - PASS. Prompt-Integritaet: Regelnummerierung fortlaufend 1-27, kein Mojibake, Abgrenzung zu Regel 26 explizit im Text - PASS. Regressionscheck (Import aller abhaengigen Module) - PASS. Gesamturteil: verifiziert (Stufe 3, Punkt 4) - Stufe 3 damit vollstaendig bearbeitet (Punkt 1+2 bewusst in Evidenz gehalten/vertagt, Punkt 3+4 umgesetzt).</w:t>
       </w:r>
     </w:p>
     <w:sectPr>

</xml_diff>

<commit_message>
Regelwerksmanual: Detailverifikation Gates/Z.ai/E-Mail/Backtracking nach Neustart
Live-Integrationstest gegen DB-Kopie (echte Mistral-/Z.ai-/CoinGecko-APIs)
bestaetigt alle heutigen Aenderungen: ist_kontext-Rendering, Eigenkapital-
Deckel-Fix, Z.ai-Position-Swapping mit korrektem Single-DB-Update,
E-Mail-/GUI-Formatierung. Zusaetzlich frischer Notebook-Produktionsexport
bestaetigt Positions-Bias-Fix und Regel-27-Action-Bias-Korrektur laufen
live wie designt. Keine Bugs gefunden, kein Code-Aenderungsbedarf.

Co-Authored-By: Claude Sonnet 5 <noreply@anthropic.com>
</commit_message>
<xml_diff>
--- a/Basisinfos/Regelwerksmanual.docx
+++ b/Basisinfos/Regelwerksmanual.docx
@@ -25285,6 +25285,164 @@
       </w:r>
       <w:r>
         <w:t>keine der Beobachtungen ist von reinem Stichprobenrauschen unterscheidbar. Um r≈0,15 mit 80%-Power zuverlaessig zu erkennen, braucht es ca. n≈340; fuer den Bandunterschied aehnliche Groessenordnung. Die bisherige n≥50-Wiedervorlage-Schwelle fuer Stufe 3 Punkt 1 reicht fuer die Konfidenz-Kalibrierungsfrage spezifisch NICHT aus - dafuer braucht es mehrere Hundert aufgeloeste Mistral-Hebel-Signale. Kein Code-Aenderungsbedarf, reine Analyse-Erkenntnis.</w:t>
+      </w:r>
+    </w:p>
+    <w:p>
+      <w:pPr>
+        <w:pStyle w:val="Heading3"/>
+      </w:pPr>
+      <w:r>
+        <w:t>Nachtrag (2026-07-30): Detailverifikation aller heutigen Aenderungen - Gates, Z.ai, E-Mail/GUI, Backtracking Stufe 2</w:t>
+      </w:r>
+    </w:p>
+    <w:p>
+      <w:pPr/>
+      <w:r>
+        <w:rPr>
+          <w:b/>
+        </w:rPr>
+        <w:t xml:space="preserve">Anlass: </w:t>
+      </w:r>
+      <w:r>
+        <w:t>Nutzer-Wunsch, nach Neustart der App im Detail zu pruefen, ob Gates, E-Mail, Backtracking und die uebrigen heutigen Aenderungen (6 geaenderte Dateien) tatsaechlich korrekt funktionieren - nicht nur die Notebook-Datenanalyse allein.</w:t>
+      </w:r>
+    </w:p>
+    <w:p>
+      <w:pPr/>
+      <w:r>
+        <w:rPr>
+          <w:b/>
+        </w:rPr>
+        <w:t xml:space="preserve">Teil 1 - Live-Integrationstest gegen eine DB-Kopie (Desktop, echte APIs): </w:t>
+      </w:r>
+      <w:r>
+        <w:rPr>
+          <w:rFonts w:ascii="Consolas" w:hAnsi="Consolas"/>
+        </w:rPr>
+        <w:t>data/tradinginfotool.db</w:t>
+      </w:r>
+      <w:r>
+        <w:t xml:space="preserve"> in den Scratchpad kopiert, </w:t>
+      </w:r>
+      <w:r>
+        <w:rPr>
+          <w:rFonts w:ascii="Consolas" w:hAnsi="Consolas"/>
+        </w:rPr>
+        <w:t>db.DB_PATH</w:t>
+      </w:r>
+      <w:r>
+        <w:t xml:space="preserve"> VOR der ersten Verbindung ueberschrieben, </w:t>
+      </w:r>
+      <w:r>
+        <w:rPr>
+          <w:rFonts w:ascii="Consolas" w:hAnsi="Consolas"/>
+        </w:rPr>
+        <w:t>db.init_db()</w:t>
+      </w:r>
+      <w:r>
+        <w:t xml:space="preserve"> fuer die Migrationen nachgezogen, frischer Preis-Snapshot fuer BTC geholt. Echter Aufruf von </w:t>
+      </w:r>
+      <w:r>
+        <w:rPr>
+          <w:rFonts w:ascii="Consolas" w:hAnsi="Consolas"/>
+        </w:rPr>
+        <w:t>generate_hebel_signal()</w:t>
+      </w:r>
+      <w:r>
+        <w:t xml:space="preserve"> mit echten Mistral-/Z.ai-/CoinGecko-Clients.</w:t>
+      </w:r>
+    </w:p>
+    <w:p>
+      <w:pPr/>
+      <w:r>
+        <w:rPr>
+          <w:b/>
+        </w:rPr>
+        <w:t xml:space="preserve">Gates: </w:t>
+      </w:r>
+      <w:r>
+        <w:t>Signal lief komplett durch (gate_passed=True). ist_kontext korrekt NUR bei 'Regime-Konflikt' gesetzt, alle 9 uebrigen Risikofaktoren korrekt False. Stufe-0-Fix griff real: eigenkapital_deckel_hinweis = 'Eigenkapitalbedarf von 3516 EUR auf Richtwert 500 EUR reduziert' mit echtem EUR/USD-Kurs.</w:t>
+      </w:r>
+    </w:p>
+    <w:p>
+      <w:pPr/>
+      <w:r>
+        <w:rPr>
+          <w:b/>
+        </w:rPr>
+        <w:t xml:space="preserve">Z.ai: </w:t>
+      </w:r>
+      <w:r>
+        <w:t>Hintergrund-Thread lief mit 3 echten Calls (2x Position-Swap + 1x Konsistenz) durch, schrieb nach 54s GENAU EIN kombiniertes Update (urteil=widerspruch, eigene_richtung=SHORT, uebereinstimmung=nein).</w:t>
+      </w:r>
+    </w:p>
+    <w:p>
+      <w:pPr/>
+      <w:r>
+        <w:rPr>
+          <w:b/>
+        </w:rPr>
+        <w:t xml:space="preserve">E-Mail/GUI-Formatierung: </w:t>
+      </w:r>
+      <w:r>
+        <w:t>beide Renderer liefern identischen Inhalt - Kontext-Zeile zuerst ohne Symbol, danach negativ/neutral/positiv-gruppiert. (Zwei Fehler im ersten Testlauf-Versuch waren reine Bugs im eigenen Testskript, nicht im Produktivcode.)</w:t>
+      </w:r>
+    </w:p>
+    <w:p>
+      <w:pPr/>
+      <w:r>
+        <w:rPr>
+          <w:b/>
+        </w:rPr>
+        <w:t xml:space="preserve">Backtracking Stufe 2: </w:t>
+      </w:r>
+      <w:r>
+        <w:t>compute_zai_uebereinstimmung_baseline() lief korrekt (n=1, Binomialtest p=1,0). compute_baseline_vergleich() gab None zurueck - korrektes Verhalten bei 0 ausgewerteten Signalen in der Desktop-DB-Kopie (nur 8 hebel_signals-Zeilen, die eigentliche Handelshistorie liegt auf dem Notebook), kein Bug.</w:t>
+      </w:r>
+    </w:p>
+    <w:p>
+      <w:pPr/>
+      <w:r>
+        <w:rPr>
+          <w:b/>
+        </w:rPr>
+        <w:t xml:space="preserve">Teil 2 - Frischer Notebook-Export (30.07., 04:38 Uhr), unabhaengig von Teil 1: </w:t>
+      </w:r>
+    </w:p>
+    <w:p>
+      <w:pPr/>
+      <w:r>
+        <w:rPr>
+          <w:b/>
+        </w:rPr>
+        <w:t xml:space="preserve">Z.ai-Positions-Bias-Fix laeuft live: </w:t>
+      </w:r>
+      <w:r>
+        <w:t>seit Deploy (erster beobachteter Fall 29.07. 18:45 Uhr) zeigen 8 von 25 Eintraegen (32%) den neuen 'Positions-uneinheitlich'-Fallback auf NEUTRAL - genau das designte Verhalten, 0 Ausfaelle. Die durchgehend hohe Abweichungsrate ist der bereits bekannte Befund aus dem 27.07.-Quickcheck, keine neue Regression.</w:t>
+      </w:r>
+    </w:p>
+    <w:p>
+      <w:pPr/>
+      <w:r>
+        <w:rPr>
+          <w:b/>
+        </w:rPr>
+        <w:t xml:space="preserve">Regel-27-Action-Bias-Korrektur laeuft live: </w:t>
+      </w:r>
+      <w:r>
+        <w:t>29.07. 95% HALTEN, 30.07. bisher 100% HALTEN - konsistent mit der Fix-Absicht UND dem anhaltenden Baer-Regime-Konflikt, kein Hinweis auf einen neuen Bug. ist_kontext bestaetigt auch hier korrekt. Keine Auffaelligkeiten, keine neuen Job-Fehler.</w:t>
+      </w:r>
+    </w:p>
+    <w:p>
+      <w:pPr/>
+      <w:r>
+        <w:rPr>
+          <w:b/>
+        </w:rPr>
+        <w:t xml:space="preserve">Ergebnis: </w:t>
+      </w:r>
+      <w:r>
+        <w:t>alle 6 heute geaenderten Dateien doppelt verifiziert (echter Desktop-Livetest + echte Notebook-Produktionsdaten), keine Bugs gefunden. Kein Code-Aenderungsbedarf.</w:t>
       </w:r>
     </w:p>
     <w:sectPr>

</xml_diff>

<commit_message>
Mehrebenen-Erfolgsmessung: compute_sl_mfe_analyse() + Export-Vollstaendigkeits-Check
Neue Funktion trennt bei Stop-Loss-Faellen "Richtung war falsch" von
"Richtung war richtig, aber zu eng gestoppt" durch Verschneidung des
bereits getrackten MFE-Werts mit dem strikten Outcome - keine neue
Datenerhebung noetig. Erster Blick auf echte Daten (Hebel, n=23 mit
MFE-Daten von 57 SL-Faellen): 87% liefen zwischenzeitlich profitabel,
bestaetigt den Enge-Stop-Loss-Befund vom 28.07. aus neuem Blickwinkel.

Zusaetzlich: neue Methodik-Regel (Export-Vollstaendigkeits-Check vor
jeder neuen Fragestellung) in Test_und_Verifikationsmethodik.md, neue
_ohlc_aktualitaet_je_symbol()-Exportfunktion, sowie Korrektur mehrerer
veralteter "noch ausstehend"-Markierungen im Regelwerksmanual.

Co-Authored-By: Claude Sonnet 5 <noreply@anthropic.com>
</commit_message>
<xml_diff>
--- a/Basisinfos/Regelwerksmanual.docx
+++ b/Basisinfos/Regelwerksmanual.docx
@@ -17408,150 +17408,128 @@
         <w:rPr>
           <w:b w:val="0"/>
         </w:rPr>
-        <w:t xml:space="preserve">Compile-/Import-Regressionscheck über alle 11 geänderten Module; additive Migration (frische + simulierte Alt-DB, erneuter Migrationslauf ohne Exception); </w:t>
-      </w:r>
-      <w:r>
-        <w:rPr>
-          <w:rFonts w:ascii="Consolas" w:hAnsi="Consolas"/>
-          <w:b w:val="0"/>
-        </w:rPr>
-        <w:t>update_signal_zai_gegenpruefung()</w:t>
-      </w:r>
-      <w:r>
-        <w:rPr>
-          <w:b w:val="0"/>
-        </w:rPr>
-        <w:t xml:space="preserve"> mit 4 UND 5 Positions- argumenten; </w:t>
-      </w:r>
-      <w:r>
-        <w:rPr>
-          <w:rFonts w:ascii="Consolas" w:hAnsi="Consolas"/>
-          <w:b w:val="0"/>
-        </w:rPr>
-        <w:t>Signal</w:t>
-      </w:r>
-      <w:r>
-        <w:rPr>
-          <w:b w:val="0"/>
-        </w:rPr>
-        <w:t xml:space="preserve">-Dataclass-Rundtrip für alle 3 neuen Felder; </w:t>
-      </w:r>
-      <w:r>
-        <w:rPr>
-          <w:rFonts w:ascii="Consolas" w:hAnsi="Consolas"/>
-          <w:b w:val="0"/>
-        </w:rPr>
-        <w:t>richtung_aus_action()</w:t>
-      </w:r>
-      <w:r>
-        <w:rPr>
-          <w:b w:val="0"/>
-        </w:rPr>
-        <w:t xml:space="preserve"> alle Kombinationen inkl. Hedge-Inversion (Regressions- schutz: </w:t>
-      </w:r>
-      <w:r>
-        <w:rPr>
-          <w:rFonts w:ascii="Consolas" w:hAnsi="Consolas"/>
-          <w:b w:val="0"/>
-        </w:rPr>
-        <w:t>KAUFEN</w:t>
-      </w:r>
-      <w:r>
-        <w:rPr>
-          <w:b w:val="0"/>
-        </w:rPr>
-        <w:t xml:space="preserve"> → </w:t>
-      </w:r>
-      <w:r>
-        <w:rPr>
-          <w:rFonts w:ascii="Consolas" w:hAnsi="Consolas"/>
-          <w:b w:val="0"/>
-        </w:rPr>
-        <w:t>SHORT</w:t>
-      </w:r>
-      <w:r>
-        <w:rPr>
-          <w:b w:val="0"/>
-        </w:rPr>
-        <w:t xml:space="preserve"> bei </w:t>
-      </w:r>
-      <w:r>
-        <w:rPr>
-          <w:rFonts w:ascii="Consolas" w:hAnsi="Consolas"/>
-          <w:b w:val="0"/>
-        </w:rPr>
-        <w:t>ist_hedge_invertiert=True</w:t>
-      </w:r>
-      <w:r>
-        <w:rPr>
-          <w:b w:val="0"/>
-        </w:rPr>
-        <w:t xml:space="preserve">); </w:t>
-      </w:r>
-      <w:r>
-        <w:rPr>
-          <w:rFonts w:ascii="Consolas" w:hAnsi="Consolas"/>
-          <w:b w:val="0"/>
-        </w:rPr>
-        <w:t>fuehre_beide_calls_im_hintergrund()</w:t>
-      </w:r>
-      <w:r>
-        <w:rPr>
-          <w:b w:val="0"/>
-        </w:rPr>
-        <w:t xml:space="preserve"> mit Mock-Client (genau EIN kombinierter Update-Aufruf, korrekte </w:t>
-      </w:r>
-      <w:r>
-        <w:rPr>
-          <w:rFonts w:ascii="Consolas" w:hAnsi="Consolas"/>
-          <w:b w:val="0"/>
-        </w:rPr>
-        <w:t>ja</w:t>
-      </w:r>
-      <w:r>
-        <w:rPr>
-          <w:b w:val="0"/>
-        </w:rPr>
-        <w:t>/</w:t>
-      </w:r>
-      <w:r>
-        <w:rPr>
-          <w:rFonts w:ascii="Consolas" w:hAnsi="Consolas"/>
-          <w:b w:val="0"/>
-        </w:rPr>
-        <w:t>nein</w:t>
-      </w:r>
-      <w:r>
-        <w:rPr>
-          <w:b w:val="0"/>
-        </w:rPr>
-        <w:t>-Berechnung, Call-1-Fehlschlag verhindert Call-2-Update nicht); Signatur-Regressionscheck aller 4 neuen Pipelines + der Plumbing-Kette (</w:t>
-      </w:r>
-      <w:r>
-        <w:rPr>
-          <w:rFonts w:ascii="Consolas" w:hAnsi="Consolas"/>
-          <w:b w:val="0"/>
-        </w:rPr>
-        <w:t>run_multi_asset_batch()</w:t>
-      </w:r>
-      <w:r>
-        <w:rPr>
-          <w:b w:val="0"/>
-        </w:rPr>
-        <w:t xml:space="preserve">, </w:t>
-      </w:r>
-      <w:r>
-        <w:rPr>
-          <w:rFonts w:ascii="Consolas" w:hAnsi="Consolas"/>
-          <w:b w:val="0"/>
-        </w:rPr>
-        <w:t>multi_asset_batch_job()</w:t>
-      </w:r>
-      <w:r>
-        <w:rPr>
-          <w:b w:val="0"/>
-        </w:rPr>
-        <w:t>). Echter Notebook-Lauf (nach Deploy) noch ausstehend, insbesondere für Hedge (dünnste Faktenbasis, höchstes Risiko für instabile Z.ai-Antworten).</w:t>
+        <w:t>Compile-/Import-Regressionscheck über alle 11 geänderten Module; additive Migration (frische + simulierte Alt-DB, erneuter Migrationslauf ohne Exception); update_signal_zai_gegenpruefung() mit 4 UND 5 Positions- argumenten; Signal-Dataclass-Rundtrip für alle 3 neuen Felder; richtung_aus_action() alle Kombinationen inkl. Hedge-Inversion (Regressions- schutz: KAUFEN → SHORT bei ist_hedge_invertiert=True); fuehre_beide_calls_im_hintergrund() mit Mock-Client (genau EIN kombinierter Update-Aufruf, korrekte ja/nein-Berechnung, Call-1-Fehlschlag verhindert Call-2-Update nicht); Signatur-Regressionscheck aller 4 neuen Pipelines + der Plumbing-Kette (run_multi_asset_batch(), multi_asset_batch_job()). ERLEDIGT (2026-07-30): frischer Produktions-Export bestätigt Z.ai-Richtung für alle 4 neuen Pipelines (Aktien n=1, Rohstoffe n=1, Themen-ETF n=3, Hedge n=2 - DBPK/3QSS). Hedge-Inversion mit einem echten action=VERKAUFEN-Fall bestätigt (zai_eigene_richtung=SHORT korrekt als Abweichung gegen die invertierte Erwartung LONG gewertet). Aktien/Rohstoffe mit n=1 noch zu dünn für eine Trefferquoten-Aussage, aber die Grund-Verdrahtung funktioniert nachweislich in allen 4 Pipelines.</w:t>
+      </w:r>
+      <w:r>
+        <w:rPr>
+          <w:rFonts w:ascii="Consolas" w:hAnsi="Consolas"/>
+          <w:b w:val="0"/>
+        </w:rPr>
+      </w:r>
+      <w:r>
+        <w:rPr>
+          <w:b w:val="0"/>
+        </w:rPr>
+      </w:r>
+      <w:r>
+        <w:rPr>
+          <w:rFonts w:ascii="Consolas" w:hAnsi="Consolas"/>
+          <w:b w:val="0"/>
+        </w:rPr>
+      </w:r>
+      <w:r>
+        <w:rPr>
+          <w:b w:val="0"/>
+        </w:rPr>
+      </w:r>
+      <w:r>
+        <w:rPr>
+          <w:rFonts w:ascii="Consolas" w:hAnsi="Consolas"/>
+          <w:b w:val="0"/>
+        </w:rPr>
+      </w:r>
+      <w:r>
+        <w:rPr>
+          <w:b w:val="0"/>
+        </w:rPr>
+      </w:r>
+      <w:r>
+        <w:rPr>
+          <w:rFonts w:ascii="Consolas" w:hAnsi="Consolas"/>
+          <w:b w:val="0"/>
+        </w:rPr>
+      </w:r>
+      <w:r>
+        <w:rPr>
+          <w:b w:val="0"/>
+        </w:rPr>
+      </w:r>
+      <w:r>
+        <w:rPr>
+          <w:rFonts w:ascii="Consolas" w:hAnsi="Consolas"/>
+          <w:b w:val="0"/>
+        </w:rPr>
+      </w:r>
+      <w:r>
+        <w:rPr>
+          <w:b w:val="0"/>
+        </w:rPr>
+      </w:r>
+      <w:r>
+        <w:rPr>
+          <w:rFonts w:ascii="Consolas" w:hAnsi="Consolas"/>
+          <w:b w:val="0"/>
+        </w:rPr>
+      </w:r>
+      <w:r>
+        <w:rPr>
+          <w:b w:val="0"/>
+        </w:rPr>
+      </w:r>
+      <w:r>
+        <w:rPr>
+          <w:rFonts w:ascii="Consolas" w:hAnsi="Consolas"/>
+          <w:b w:val="0"/>
+        </w:rPr>
+      </w:r>
+      <w:r>
+        <w:rPr>
+          <w:b w:val="0"/>
+        </w:rPr>
+      </w:r>
+      <w:r>
+        <w:rPr>
+          <w:rFonts w:ascii="Consolas" w:hAnsi="Consolas"/>
+          <w:b w:val="0"/>
+        </w:rPr>
+      </w:r>
+      <w:r>
+        <w:rPr>
+          <w:b w:val="0"/>
+        </w:rPr>
+      </w:r>
+      <w:r>
+        <w:rPr>
+          <w:rFonts w:ascii="Consolas" w:hAnsi="Consolas"/>
+          <w:b w:val="0"/>
+        </w:rPr>
+      </w:r>
+      <w:r>
+        <w:rPr>
+          <w:b w:val="0"/>
+        </w:rPr>
+      </w:r>
+      <w:r>
+        <w:rPr>
+          <w:rFonts w:ascii="Consolas" w:hAnsi="Consolas"/>
+          <w:b w:val="0"/>
+        </w:rPr>
+      </w:r>
+      <w:r>
+        <w:rPr>
+          <w:b w:val="0"/>
+        </w:rPr>
+      </w:r>
+      <w:r>
+        <w:rPr>
+          <w:rFonts w:ascii="Consolas" w:hAnsi="Consolas"/>
+          <w:b w:val="0"/>
+        </w:rPr>
+      </w:r>
+      <w:r>
+        <w:rPr>
+          <w:b w:val="0"/>
+        </w:rPr>
       </w:r>
     </w:p>
     <w:p>
@@ -23890,11 +23868,9 @@
         <w:rPr>
           <w:b/>
         </w:rPr>
-        <w:t xml:space="preserve">Offen, separat zu besprechen: </w:t>
-      </w:r>
-      <w:r>
-        <w:t>die eigentliche Konfidenz-Kalibrierungsfrage - ist die mangelnde Vorhersagekraft der LLM-Konfidenz bei Hebel ein Fehler in unserem System, oder eine bekannte Grenze, mit der andere Trading-/Analyse-Plattformen anders umgehen? Vergleich noch ausstehend.</w:t>
-      </w:r>
+        <w:t>ERLEDIGT, siehe unten - die eigentliche Konfidenz-Kalibrierungsfrage - ist die mangelnde Vorhersagekraft der LLM-Konfidenz bei Hebel ein Fehler in unserem System, oder eine bekannte Grenze, mit der andere Trading-/Analyse-Plattformen anders umgehen? ERLEDIGT (29.07., später am selben Tag): per externer Fachliteratur-Recherche beantwortet (LLM-Konfidenz-Kalibrierung, CRV/Reward-Risk als Prädiktor + Positionsgrößen-Normen, Risikofaktoren-Aggregation + Backtest-Overfitting-Fallstricke) - Grundlage für die nachgeschärfte n&gt;=50-Regel in Test_und_Verifikationsmethodik.md.</w:t>
+      </w:r>
+      <w:r/>
     </w:p>
     <w:p>
       <w:pPr>
@@ -25443,6 +25419,104 @@
       </w:r>
       <w:r>
         <w:t>alle 6 heute geaenderten Dateien doppelt verifiziert (echter Desktop-Livetest + echte Notebook-Produktionsdaten), keine Bugs gefunden. Kein Code-Aenderungsbedarf.</w:t>
+      </w:r>
+    </w:p>
+    <w:p>
+      <w:pPr>
+        <w:pStyle w:val="Heading3"/>
+      </w:pPr>
+      <w:r>
+        <w:t>Nachtrag (2026-07-30): compute_sl_mfe_analyse() - Mehrebenen-Erfolgsmessung</w:t>
+      </w:r>
+    </w:p>
+    <w:p>
+      <w:pPr/>
+      <w:r>
+        <w:rPr>
+          <w:b/>
+        </w:rPr>
+        <w:t xml:space="preserve">Anlass: </w:t>
+      </w:r>
+      <w:r>
+        <w:t>Nutzer-Frage "wie pruefen wir Erfolgsquoten auf mehreren Ebenen" - Verschneidung bereits vorhandener Felder (</w:t>
+      </w:r>
+      <w:r>
+        <w:rPr>
+          <w:rFonts w:ascii="Consolas" w:hAnsi="Consolas"/>
+        </w:rPr>
+        <w:t>outcome_max_realisiertes_crv</w:t>
+      </w:r>
+      <w:r>
+        <w:t xml:space="preserve">/MFE, </w:t>
+      </w:r>
+      <w:r>
+        <w:rPr>
+          <w:rFonts w:ascii="Consolas" w:hAnsi="Consolas"/>
+        </w:rPr>
+        <w:t>outcome_mindestziel_erreicht_am</w:t>
+      </w:r>
+      <w:r>
+        <w:t>) gegen den strikten outcome_status, OHNE neue Daten zu erheben. Volle Methodik-Begruendung siehe Test_und_Verifikationsmethodik.md Abschnitt 2.6.</w:t>
+      </w:r>
+    </w:p>
+    <w:p>
+      <w:pPr/>
+      <w:r>
+        <w:rPr>
+          <w:b/>
+        </w:rPr>
+        <w:t xml:space="preserve">Neue Funktion `compute_sl_mfe_analyse(conn, tier, erlaubte_symbole=None)`: </w:t>
+      </w:r>
+      <w:r>
+        <w:t>fuer alle Signale mit outcome_status == stop_loss_erreicht, welcher Anteil zeigt trotzdem einen positiven MFE-Wert (Kurs lief zwischenzeitlich profitabel, bevor er zurückdrehte und den Stop auslöste)? Trennt "Richtung war falsch" von "Richtung war richtig, aber zu eng gestoppt".</w:t>
+      </w:r>
+    </w:p>
+    <w:p>
+      <w:pPr/>
+      <w:r>
+        <w:rPr>
+          <w:b/>
+        </w:rPr>
+        <w:t xml:space="preserve">Rückgabe: </w:t>
+      </w:r>
+      <w:r>
+        <w:t>anzahl_sl_gesamt, anzahl_mit_mfe_daten, anzahl_mit_positivem_mfe/quote_positiver_mfe_trotz_stop_pct (Kern-Kennzahl), anzahl_mindestziel_vor_stop_erreicht, anzahl_distinkte_symbole_bei_positivem_mfe/haeufigstes_symbol_anteil_pct (Symbol-Konzentrations-Check), hinweis. None bei 0 Stop-Loss-Fällen.</w:t>
+      </w:r>
+    </w:p>
+    <w:p>
+      <w:pPr/>
+      <w:r>
+        <w:rPr>
+          <w:b/>
+        </w:rPr>
+        <w:t xml:space="preserve">Erster Blick auf echte Daten (30.07., frischer NB-Export, Hebel): </w:t>
+      </w:r>
+      <w:r>
+        <w:t>von 57 SL-Fällen haben 23 MFE-Daten, davon 20 (87%) mit positivem MFE - 9 davon erreichten sogar das Mindestziel vor dem Stop. Bestätigt aus einem neuen Blickwinkel den bereits behobenen Enge-Stop-Loss-Befund vom 28.07. Konzentrations-Hinweis: SUI stellt 3 der 9 Mindestziel-Fälle (33%) - über der 20-25%-Schwelle.</w:t>
+      </w:r>
+    </w:p>
+    <w:p>
+      <w:pPr/>
+      <w:r>
+        <w:rPr>
+          <w:b/>
+        </w:rPr>
+        <w:t xml:space="preserve">Verifiziert (synthetisch, Testklasse 1): </w:t>
+      </w:r>
+      <w:r>
+        <w:t>T1 gemischte Fälle - PASS. T2 leerer Datensatz -&gt; None - PASS. T3 Konzentrations-Warnung greift korrekt - PASS. T4 erlaubte_symbole-Filter - PASS. T5 tier=spot liest korrekt signals-Tabelle - PASS. Zusätzlich gegen echte DB-Kopie ausgeführt (0 SL-Fälle dort, korrektes None-Verhalten bestätigt).</w:t>
+      </w:r>
+    </w:p>
+    <w:p>
+      <w:pPr/>
+      <w:r>
+        <w:rPr>
+          <w:b/>
+        </w:rPr>
+        <w:t>Dokumentiert</w:t>
+      </w:r>
+      <w:r>
+        <w:t xml:space="preserve"> in Regelwerksmanual.md/.docx + Test_und_Verifikationsmethodik.md/.docx. Reine Lesefunktion, noch nicht an GUI/Remote-Seite/E-Mail angebunden.</w:t>
       </w:r>
     </w:p>
     <w:sectPr>

</xml_diff>

<commit_message>
Krypto-Relativwert-Bausteine (Task #422) abgeschlossen + Kontrollgruppen-Plausibilitaetspruefung als Methodik-Standard
Mehrtaegige Beobachtung (5 Tage) gegen frischen Notebook-Export geprueft:
alle 3 Bausteine (BTC-Relativwert, ATR-Perzentil, Signal-Stabilitaet)
bestaetigt. Die anfangs verdaechtig wirkende ATR-Perzentil-Pinnung bei
BTC/ETH/Majors erklaert sich durch fehlendes Volatilitaetsereignis im
Beobachtungsfenster (Kontrollgruppen-Vergleich gegen die bereits bekannte
Altcoin-Rally-Gruppe), kein Bug.

Test_und_Verifikationsmethodik.md: zwei neue Abschnitte - 2.2a (mehrtaegige
Beobachtung vor Vollabschluss neuer Bausteine als Standard-Praxis) und 2.7
(Kontrollgruppen-Plausibilitaetspruefung bei scheinbar eingefrorenen
Kennzahlen, bevor ein konstanter Wert als Bug eingestuft wird).

Co-Authored-By: Claude Sonnet 5 <noreply@anthropic.com>
</commit_message>
<xml_diff>
--- a/Basisinfos/Regelwerksmanual.docx
+++ b/Basisinfos/Regelwerksmanual.docx
@@ -25517,6 +25517,83 @@
       </w:r>
       <w:r>
         <w:t xml:space="preserve"> in Regelwerksmanual.md/.docx + Test_und_Verifikationsmethodik.md/.docx. Reine Lesefunktion, noch nicht an GUI/Remote-Seite/E-Mail angebunden.</w:t>
+      </w:r>
+    </w:p>
+    <w:p>
+      <w:pPr>
+        <w:pStyle w:val="Heading3"/>
+      </w:pPr>
+      <w:r>
+        <w:t>Nachtrag (2026-07-30): Krypto-Relativwert-Bausteine (Baustein 1-3, urspruenglich 2026-07-25) - mehrtaegige Beobachtung abgeschlossen</w:t>
+      </w:r>
+    </w:p>
+    <w:p>
+      <w:pPr/>
+      <w:r>
+        <w:rPr>
+          <w:b/>
+        </w:rPr>
+        <w:t xml:space="preserve">Kontext: </w:t>
+      </w:r>
+      <w:r>
+        <w:t>die drei Krypto-Relativwert-Bausteine (Signal-Stabilitaet, Volatilitaets-/ATR-Perzentil, BTC-Relativwert) wurden am 2026-07-25 implementiert und synthetisch verifiziert (Commits f4e9c0e/ac8975d), aber laut urspruenglicher Design-Entscheidung 3 bewusst nicht als vollstaendig abgeschlossen markiert - eine mehrtaegige Beobachtung im echten Betrieb war Voraussetzung, bevor die Kalibrierung als bestaetigt gilt.</w:t>
+      </w:r>
+    </w:p>
+    <w:p>
+      <w:pPr/>
+      <w:r>
+        <w:rPr>
+          <w:b/>
+        </w:rPr>
+        <w:t>Nach 5 realen Produktionstagen (25.-30.07.) gegen einen frischen Notebook-Export geprueft:</w:t>
+      </w:r>
+    </w:p>
+    <w:p>
+      <w:pPr/>
+      <w:r>
+        <w:rPr>
+          <w:b/>
+        </w:rPr>
+        <w:t xml:space="preserve">Baustein 1 (BTC-Relativwert): </w:t>
+      </w:r>
+      <w:r>
+        <w:t>Korrelationswerte je Symbol plausibel und differenziert (TAO 0,63-0,66, KAIA 0,56-0,59, VIRTUAL 0,57, ONDO 0,29-0,30, KAITO 0,22-0,25, NEAR 0,29-0,31, INJ 0,39, HYPE 0,48) - keine Ausreisser.</w:t>
+      </w:r>
+    </w:p>
+    <w:p>
+      <w:pPr/>
+      <w:r>
+        <w:rPr>
+          <w:b/>
+        </w:rPr>
+        <w:t xml:space="preserve">Baustein 3 (Signal-Stabilitaet): </w:t>
+      </w:r>
+      <w:r>
+        <w:t>144 positiv / 142 negativ ueber 308 Signale seit Deploy - gesunde, nicht-entartete Verteilung.</w:t>
+      </w:r>
+    </w:p>
+    <w:p>
+      <w:pPr/>
+      <w:r>
+        <w:rPr>
+          <w:b/>
+        </w:rPr>
+        <w:t xml:space="preserve">Baustein 2 (Volatilitaets-/ATR-Perzentil), interessanteste Beobachtung: </w:t>
+      </w:r>
+      <w:r>
+        <w:t>BTC/ETH/LINK/TAO/VIRTUAL/HYPE/INJ blieben ueber alle 5 Tage nahe einem festen Wert (BTC durchgehend 0, HYPE durchgehend 57, INJ durchgehend 10), waehrend KAIA (0-&gt;12), KAITO (72-&gt;98), NEAR (16-&gt;19) und ONDO (15-&gt;21) im selben Zeitraum deutliche Bewegung zeigten. Zunaechst wie ein Fehler wirkend, aber durch Kontrollgruppen-Vergleich erklaert: die beweglichen Symbole sind exakt die bereits anderweitig dokumentierte Altcoin-Rally-Gruppe - echte Volatilitaetsereignisse bei diesen Coins, waehrend BTC/ETH/Majors im selben Fenster ruhig blieben. Ein langsam geglaetteter (Wilder-ATR) Perzentilrang bleibt bei fehlendem Ereignis ueber 5 Tage erwartbar konstant - kein Bug.</w:t>
+      </w:r>
+    </w:p>
+    <w:p>
+      <w:pPr/>
+      <w:r>
+        <w:rPr>
+          <w:b/>
+        </w:rPr>
+        <w:t xml:space="preserve">Ergebnis: </w:t>
+      </w:r>
+      <w:r>
+        <w:t>kein Code-Aenderungsbedarf, alle 3 Bausteine bestaetigt. Krypto-Relativwert-Bausteine damit vollstaendig abgeschlossen (Design-Entscheidung 3 erfuellt). Methodik der Kontrollgruppen-Plausibilitaetspruefung jetzt auch in Test_und_Verifikationsmethodik.md Abschnitt 2.7 verankert.</w:t>
       </w:r>
     </w:p>
     <w:sectPr>

</xml_diff>

<commit_message>
Z.ai-Gegenpruefung fehlte in Multi-Asset-Batch-E-Mails + App-Detailpanel-Richtungsabgleich
Nutzer-Fund am echten 3QSS-Signal: _notify_multi_asset_signal() (Aktien/
Rohstoffe/Themen-ETF/Hedge) rief _formatiere_zai_gegenpruefung() nie auf,
obwohl die DB-Felder seit der Z.ai-Ausweitung (17b1c9b) korrekt befuellt
werden. Zusaetzlich fehlte die Regime-Kopfzeile analog zu Spot/Hebel.

Zweiter Fund bei derselben Gelegenheit: ui/signals_view.py uebergab fuer
den Richtungs-Abgleich weiterhin feste None-Werte mit einem seit 17b1c9b
veralteten Kommentar ("Spot kennt kein richtung-Konzept") - betraf Spot
UND alle 4 Multi-Asset-Pipelines im App-Detailpanel.

Beide Stellen wurden per git log/git show verifiziert: reine Nachzieh-
Luecken aus Commit 17b1c9b, keine bewusst stehen gelassenen Entscheidungen.

Co-Authored-By: Claude Sonnet 5 <noreply@anthropic.com>
</commit_message>
<xml_diff>
--- a/Basisinfos/Regelwerksmanual.docx
+++ b/Basisinfos/Regelwerksmanual.docx
@@ -26469,6 +26469,281 @@
       <w:pPr/>
       <w:r>
         <w:t>Dokumentiert in Regelwerksmanual.md/.docx + Test_und_Verifikationsmethodik.md/.docx (neuer Fallbeispiel-Eintrag zu Abschnitt 2.5) + Memory. Noch NICHT committet/gepusht.</w:t>
+      </w:r>
+    </w:p>
+    <w:p>
+      <w:pPr>
+        <w:pStyle w:val="Heading2"/>
+      </w:pPr>
+      <w:r>
+        <w:t>Nachtrag (2026-07-30): BUGFIX - Z.ai-Gegenprüfung fehlte in allen Multi-Asset-Batch-E-Mails</w:t>
+      </w:r>
+    </w:p>
+    <w:p>
+      <w:pPr/>
+      <w:r>
+        <w:rPr>
+          <w:b/>
+        </w:rPr>
+        <w:t xml:space="preserve">Auslöser: </w:t>
+      </w:r>
+      <w:r>
+        <w:t>Nutzer-Fund an einem echten, bereits versendeten Produktions-Signal (3QSS NACHKAUFEN, Hedge, 30.07. 09:05) - die E-Mail enthielt keinerlei Z.ai-Abschnitt, obwohl die Z.ai-Ausweitung auf alle 6 Signal-Pipelines bereits am 27.07. abgeschlossen wurde.</w:t>
+      </w:r>
+    </w:p>
+    <w:p>
+      <w:pPr/>
+      <w:r>
+        <w:rPr>
+          <w:b/>
+        </w:rPr>
+        <w:t xml:space="preserve">Root Cause: </w:t>
+      </w:r>
+      <w:r>
+        <w:t>die Z.ai-Daten waren für dieses Signal korrekt in der DB vorhanden (</w:t>
+      </w:r>
+      <w:r>
+        <w:rPr>
+          <w:rFonts w:ascii="Consolas" w:hAnsi="Consolas"/>
+        </w:rPr>
+        <w:t>zai_eigene_richtung=SHORT</w:t>
+      </w:r>
+      <w:r>
+        <w:t xml:space="preserve">, </w:t>
+      </w:r>
+      <w:r>
+        <w:rPr>
+          <w:rFonts w:ascii="Consolas" w:hAnsi="Consolas"/>
+        </w:rPr>
+        <w:t>zai_uebereinstimmung=ja</w:t>
+      </w:r>
+      <w:r>
+        <w:t xml:space="preserve">, </w:t>
+      </w:r>
+      <w:r>
+        <w:rPr>
+          <w:rFonts w:ascii="Consolas" w:hAnsi="Consolas"/>
+        </w:rPr>
+        <w:t>zai_gegenpruefung_urteil=konsistent</w:t>
+      </w:r>
+      <w:r>
+        <w:t xml:space="preserve">, inkl. Kurzbegründungstext) - das Problem lag ausschließlich in </w:t>
+      </w:r>
+      <w:r>
+        <w:rPr>
+          <w:rFonts w:ascii="Consolas" w:hAnsi="Consolas"/>
+        </w:rPr>
+        <w:t>scheduler/background.py::_notify_multi_asset_signal()</w:t>
+      </w:r>
+      <w:r>
+        <w:t xml:space="preserve"> (die E-Mail-Funktion für ALLE VIER Multi-Asset-Batch-Pipelines: Aktien/Rohstoffe/Themen-ETF/Hedge, nicht nur Hedge): diese Funktion rief </w:t>
+      </w:r>
+      <w:r>
+        <w:rPr>
+          <w:rFonts w:ascii="Consolas" w:hAnsi="Consolas"/>
+        </w:rPr>
+        <w:t>_formatiere_zai_gegenpruefung(signal)</w:t>
+      </w:r>
+      <w:r>
+        <w:t xml:space="preserve"> nie auf und fügte den Text nie in den E-Mail-Body ein - anders als </w:t>
+      </w:r>
+      <w:r>
+        <w:rPr>
+          <w:rFonts w:ascii="Consolas" w:hAnsi="Consolas"/>
+        </w:rPr>
+        <w:t>_notify_spot_signal()</w:t>
+      </w:r>
+      <w:r>
+        <w:t xml:space="preserve"> (Krypto-Spot) und </w:t>
+      </w:r>
+      <w:r>
+        <w:rPr>
+          <w:rFonts w:ascii="Consolas" w:hAnsi="Consolas"/>
+        </w:rPr>
+        <w:t>_notify_hebel_signal()</w:t>
+      </w:r>
+      <w:r>
+        <w:t xml:space="preserve"> (Hebel), die das von Anfang an korrekt tun. Die Plumbing-Seite (Commits 1-10 der Z.ai-Ausweitung) war vollständig korrekt - inklusive Re-Fetch der frischen Z.ai-Felder aus der DB vor dem E-Mail-Versand - nur der finale Text-Rendering-Schritt in der E-Mail-Vorlage selbst fehlte.</w:t>
+      </w:r>
+    </w:p>
+    <w:p>
+      <w:pPr/>
+      <w:r>
+        <w:rPr>
+          <w:b/>
+        </w:rPr>
+        <w:t xml:space="preserve">Fix: </w:t>
+      </w:r>
+      <w:r>
+        <w:t xml:space="preserve">in </w:t>
+      </w:r>
+      <w:r>
+        <w:rPr>
+          <w:rFonts w:ascii="Consolas" w:hAnsi="Consolas"/>
+        </w:rPr>
+        <w:t>_notify_multi_asset_signal()</w:t>
+      </w:r>
+      <w:r>
+        <w:t xml:space="preserve"> (Zeile ~1833) </w:t>
+      </w:r>
+      <w:r>
+        <w:rPr>
+          <w:rFonts w:ascii="Consolas" w:hAnsi="Consolas"/>
+        </w:rPr>
+        <w:t>zai_text = _formatiere_zai_gegenpruefung(signal)</w:t>
+      </w:r>
+      <w:r>
+        <w:t xml:space="preserve"> ergänzt und ans Ende des Body-Strings angehängt (</w:t>
+      </w:r>
+      <w:r>
+        <w:rPr>
+          <w:rFonts w:ascii="Consolas" w:hAnsi="Consolas"/>
+        </w:rPr>
+        <w:t>+ (f"\n\n{zai_text}" if zai_text else "")</w:t>
+      </w:r>
+      <w:r>
+        <w:t xml:space="preserve">) - exakt analog zu </w:t>
+      </w:r>
+      <w:r>
+        <w:rPr>
+          <w:rFonts w:ascii="Consolas" w:hAnsi="Consolas"/>
+        </w:rPr>
+        <w:t>_notify_spot_signal()</w:t>
+      </w:r>
+      <w:r>
+        <w:t xml:space="preserve">. Bei derselben Gelegenheit fiel eine zweite, kleinere Inkonsistenz auf: die "Regime: ..."-Zeile am Kopf der E-Mail existierte ebenfalls nur bei Spot/Hebel, nicht bei Multi-Asset-Batch - </w:t>
+      </w:r>
+      <w:r>
+        <w:rPr>
+          <w:rFonts w:ascii="Consolas" w:hAnsi="Consolas"/>
+        </w:rPr>
+        <w:t>signal.regime</w:t>
+      </w:r>
+      <w:r>
+        <w:t xml:space="preserve"> wird aber in allen 4 Pipelines korrekt befüllt (verifiziert per Grep), daher ebenfalls ergänzt.</w:t>
+      </w:r>
+    </w:p>
+    <w:p>
+      <w:pPr/>
+      <w:r>
+        <w:rPr>
+          <w:b/>
+        </w:rPr>
+        <w:t xml:space="preserve">Zweiter, verwandter Fund bei derselben Gelegenheit: </w:t>
+      </w:r>
+      <w:r>
+        <w:rPr>
+          <w:rFonts w:ascii="Consolas" w:hAnsi="Consolas"/>
+        </w:rPr>
+        <w:t>ui/signals_view.py</w:t>
+      </w:r>
+      <w:r>
+        <w:t xml:space="preserve"> (Detail-Panel im App-Signale-Tab, verwendet für Krypto-Spot UND alle 4 Multi-Asset-Pipelines) übergab an </w:t>
+      </w:r>
+      <w:r>
+        <w:rPr>
+          <w:rFonts w:ascii="Consolas" w:hAnsi="Consolas"/>
+        </w:rPr>
+        <w:t>format_zai_gegenpruefung_lines()</w:t>
+      </w:r>
+      <w:r>
+        <w:t xml:space="preserve"> für die drei Richtungs-Abgleich-Parameter fest </w:t>
+      </w:r>
+      <w:r>
+        <w:rPr>
+          <w:rFonts w:ascii="Consolas" w:hAnsi="Consolas"/>
+        </w:rPr>
+        <w:t>None, None, None</w:t>
+      </w:r>
+      <w:r>
+        <w:t xml:space="preserve">, mit dem Kommentar "Signal/Spot hat kein richtung-Feld". Root-Cause-Analyse per </w:t>
+      </w:r>
+      <w:r>
+        <w:rPr>
+          <w:rFonts w:ascii="Consolas" w:hAnsi="Consolas"/>
+        </w:rPr>
+        <w:t>git log</w:t>
+      </w:r>
+      <w:r>
+        <w:t>/</w:t>
+      </w:r>
+      <w:r>
+        <w:rPr>
+          <w:rFonts w:ascii="Consolas" w:hAnsi="Consolas"/>
+        </w:rPr>
+        <w:t>git show</w:t>
+      </w:r>
+      <w:r>
+        <w:t xml:space="preserve"> ergab: dieser Kommentar stammte aus Commit 48e303f (27.07., 03:35 Uhr) und war zu dem Zeitpunkt eine BEWUSSTE Entscheidung (Commit-Message: "Bewusst NUR der Konsistenz-Check ... Spot kennt kein richtung/LONG-SHORT-Konzept"). Nur 17 Stunden später hat Commit 17b1c9b (27.07., 20:41 Uhr, die Z.ai-Ausweitung auf alle 6 Pipelines) genau diese Prämisse aufgehoben - </w:t>
+      </w:r>
+      <w:r>
+        <w:rPr>
+          <w:rFonts w:ascii="Consolas" w:hAnsi="Consolas"/>
+        </w:rPr>
+        <w:t>richtung_aus_action()</w:t>
+      </w:r>
+      <w:r>
+        <w:t xml:space="preserve"> leitet seitdem ein LONG/SHORT-Konzept aus der </w:t>
+      </w:r>
+      <w:r>
+        <w:rPr>
+          <w:rFonts w:ascii="Consolas" w:hAnsi="Consolas"/>
+        </w:rPr>
+        <w:t>action</w:t>
+      </w:r>
+      <w:r>
+        <w:t xml:space="preserve"> ab, und die </w:t>
+      </w:r>
+      <w:r>
+        <w:rPr>
+          <w:rFonts w:ascii="Consolas" w:hAnsi="Consolas"/>
+        </w:rPr>
+        <w:t>Signal</w:t>
+      </w:r>
+      <w:r>
+        <w:t xml:space="preserve">-Dataclass bekam die 3 Richtungs-Felder. Der Diff von 17b1c9b zeigt: </w:t>
+      </w:r>
+      <w:r>
+        <w:rPr>
+          <w:rFonts w:ascii="Consolas" w:hAnsi="Consolas"/>
+        </w:rPr>
+        <w:t>ui/signals_view.py</w:t>
+      </w:r>
+      <w:r>
+        <w:t xml:space="preserve"> wurde dabei NICHT angefasst - die veraltete Einschränkung blieb stehen, obwohl ihre Begründung durch denselben Commit hinfällig wurde. Ergebnis: der Konsistenz-Check wurde im App-Detailpanel korrekt angezeigt, der Richtungs-Abgleich dagegen NIE - weder für Spot noch für die 4 Multi-Asset-Pipelines. Fix: die drei </w:t>
+      </w:r>
+      <w:r>
+        <w:rPr>
+          <w:rFonts w:ascii="Consolas" w:hAnsi="Consolas"/>
+        </w:rPr>
+        <w:t>signal.zai_*</w:t>
+      </w:r>
+      <w:r>
+        <w:t>-Felder werden jetzt tatsächlich durchgereicht.</w:t>
+      </w:r>
+    </w:p>
+    <w:p>
+      <w:pPr/>
+      <w:r>
+        <w:t xml:space="preserve">Verifikation: </w:t>
+      </w:r>
+      <w:r>
+        <w:rPr>
+          <w:rFonts w:ascii="Consolas" w:hAnsi="Consolas"/>
+        </w:rPr>
+        <w:t>py_compile</w:t>
+      </w:r>
+      <w:r>
+        <w:t xml:space="preserve"> beide Dateien fehlerfrei, synthetischer Mock-Test bestätigt nicht-leeren </w:t>
+      </w:r>
+      <w:r>
+        <w:rPr>
+          <w:rFonts w:ascii="Consolas" w:hAnsi="Consolas"/>
+        </w:rPr>
+        <w:t>zai_text</w:t>
+      </w:r>
+      <w:r>
+        <w:t>. Echter Notebook-Lauf (nächstes reales Multi-Asset-Signal) noch ausständig. Dokumentiert in Regelwerksmanual.md/.docx + Memory.</w:t>
       </w:r>
     </w:p>
     <w:sectPr>

</xml_diff>